<commit_message>
Memory #1-new: fill What's Next, tidy pending list
pending.txt: What's Next gains three items
(Settings gear symmetry, counters edit in log,
Shopping List highlighting and tiles); the five-piece
Parked bullet dissolved; the subtitle item re-homed
to publishing.md; two items deleted; header brought
to #1-new. pending.docx rebuilt and machine-checked
(548 words each side, zero mismatches).
CLAUDE.md: quiet files now "quiet until needed," changes noted
in the hand-off for one session. build-history.md: #69 badge-reorder,
My Week fix and reminder checklist recorded; the #1-new section added.
Delete two Siri files.
</commit_message>
<xml_diff>
--- a/docs/pending.docx
+++ b/docs/pending.docx
@@ -4,9 +4,7 @@
   <w:body>
     <w:p>
       <w:pPr>
-        <w:pStyle w:val="Title"/>
-        <w:spacing w:after="240"/>
-        <w:jc w:val="center"/>
+        <w:pStyle w:val="Heading1"/>
       </w:pPr>
       <w:r>
         <w:t xml:space="preserve">A PLACE TO REMEMBER (badge: Memory) — PENDING WORK, plain-language list</w:t>
@@ -14,15 +12,15 @@
     </w:p>
     <w:p>
       <w:pPr>
-        <w:spacing w:after="160"/>
-      </w:pPr>
-      <w:r>
-        <w:t xml:space="preserve">Last updated: 2026-07-30 (session 0 — the transition carpentry: the project's files reshaped to mirror Mystery's, no app code touched. Memory's own chain begins next session at #1-new; bare session numbers below mean the old shared chain.)</w:t>
-      </w:r>
-    </w:p>
-    <w:p>
-      <w:pPr>
-        <w:spacing w:after="160"/>
+        <w:spacing w:after="200"/>
+      </w:pPr>
+      <w:r>
+        <w:t xml:space="preserve">Last updated: 2026-07-30 (#1-new — Memory's chain begins: "What's Next" filled with three items, and the list tidied — the five-piece Parked bullet dissolved, the subtitle item re-homed to publishing.md, two items deleted outright. Bare session numbers below mean the old shared chain.)</w:t>
+      </w:r>
+    </w:p>
+    <w:p>
+      <w:pPr>
+        <w:spacing w:after="200"/>
       </w:pPr>
       <w:r>
         <w:t xml:space="preserve">This is the "what's still left" list in everyday words. Nothing here is urgent. Finished work isn't tracked here — git history keeps the full record — so this list stays short.</w:t>
@@ -30,8 +28,8 @@
     </w:p>
     <w:p>
       <w:pPr>
-        <w:pStyle w:val="Heading1"/>
-        <w:spacing w:after="120" w:before="320"/>
+        <w:pStyle w:val="Heading2"/>
+        <w:spacing w:after="150" w:before="300"/>
       </w:pPr>
       <w:r>
         <w:t xml:space="preserve">WHAT'S NEXT</w:t>
@@ -39,8 +37,47 @@
     </w:p>
     <w:p>
       <w:pPr>
-        <w:pStyle w:val="Heading1"/>
-        <w:spacing w:after="120" w:before="320"/>
+        <w:pStyle w:val="ListParagraph"/>
+        <w:numPr>
+          <w:ilvl w:val="0"/>
+          <w:numId w:val="2"/>
+        </w:numPr>
+        <w:spacing w:after="120"/>
+      </w:pPr>
+      <w:r>
+        <w:t xml:space="preserve">Home screen: the Settings gear in symmetry with the logo (#1-new).</w:t>
+      </w:r>
+    </w:p>
+    <w:p>
+      <w:pPr>
+        <w:pStyle w:val="ListParagraph"/>
+        <w:numPr>
+          <w:ilvl w:val="0"/>
+          <w:numId w:val="2"/>
+        </w:numPr>
+        <w:spacing w:after="120"/>
+      </w:pPr>
+      <w:r>
+        <w:t xml:space="preserve">My Day / Pets Day: the counters don't need the log pop-up — editing can happen in the log itself (#1-new).</w:t>
+      </w:r>
+    </w:p>
+    <w:p>
+      <w:pPr>
+        <w:pStyle w:val="ListParagraph"/>
+        <w:numPr>
+          <w:ilvl w:val="0"/>
+          <w:numId w:val="2"/>
+        </w:numPr>
+        <w:spacing w:after="120"/>
+      </w:pPr>
+      <w:r>
+        <w:t xml:space="preserve">Shopping List: stop the highlighting in Shopping mode, and make the tiles thinner (#1-new).</w:t>
+      </w:r>
+    </w:p>
+    <w:p>
+      <w:pPr>
+        <w:pStyle w:val="Heading2"/>
+        <w:spacing w:after="150" w:before="300"/>
       </w:pPr>
       <w:r>
         <w:t xml:space="preserve">NEEDS A PHONE TEST (built, just not confirmed on the phone yet)</w:t>
@@ -48,8 +85,8 @@
     </w:p>
     <w:p>
       <w:pPr>
-        <w:pStyle w:val="Heading1"/>
-        <w:spacing w:after="120" w:before="320"/>
+        <w:pStyle w:val="Heading2"/>
+        <w:spacing w:after="150" w:before="300"/>
       </w:pPr>
       <w:r>
         <w:t xml:space="preserve">STILL BROKEN OR UNFINISHED (small bugs)</w:t>
@@ -70,34 +107,8 @@
     </w:p>
     <w:p>
       <w:pPr>
-        <w:pStyle w:val="ListParagraph"/>
-        <w:numPr>
-          <w:ilvl w:val="0"/>
-          <w:numId w:val="2"/>
-        </w:numPr>
-        <w:spacing w:after="120"/>
-      </w:pPr>
-      <w:r>
-        <w:t xml:space="preserve">My Week: marking a chore done from inside the app records today's date instead of the chore's own day. Minor.</w:t>
-      </w:r>
-    </w:p>
-    <w:p>
-      <w:pPr>
-        <w:pStyle w:val="ListParagraph"/>
-        <w:numPr>
-          <w:ilvl w:val="0"/>
-          <w:numId w:val="2"/>
-        </w:numPr>
-        <w:spacing w:after="120"/>
-      </w:pPr>
-      <w:r>
-        <w:t xml:space="preserve">Tapping a reminder lands on the right page (tested #55), but taking you to the exact item on that page is still not built. Minor.</w:t>
-      </w:r>
-    </w:p>
-    <w:p>
-      <w:pPr>
-        <w:pStyle w:val="Heading1"/>
-        <w:spacing w:after="120" w:before="320"/>
+        <w:pStyle w:val="Heading2"/>
+        <w:spacing w:after="150" w:before="300"/>
       </w:pPr>
       <w:r>
         <w:t xml:space="preserve">DECISIONS TO MAKE WHEN YOU'RE READY</w:t>
@@ -105,8 +116,21 @@
     </w:p>
     <w:p>
       <w:pPr>
-        <w:pStyle w:val="Heading1"/>
-        <w:spacing w:after="120" w:before="320"/>
+        <w:pStyle w:val="ListParagraph"/>
+        <w:numPr>
+          <w:ilvl w:val="0"/>
+          <w:numId w:val="2"/>
+        </w:numPr>
+        <w:spacing w:after="120"/>
+      </w:pPr>
+      <w:r>
+        <w:t xml:space="preserve">The dark startup flash (moved here from Parked, #1-new).</w:t>
+      </w:r>
+    </w:p>
+    <w:p>
+      <w:pPr>
+        <w:pStyle w:val="Heading2"/>
+        <w:spacing w:after="150" w:before="300"/>
       </w:pPr>
       <w:r>
         <w:t xml:space="preserve">NICE-TO-HAVE LATER (polish, low priority)</w:t>
@@ -140,60 +164,8 @@
     </w:p>
     <w:p>
       <w:pPr>
-        <w:pStyle w:val="ListParagraph"/>
-        <w:numPr>
-          <w:ilvl w:val="0"/>
-          <w:numId w:val="2"/>
-        </w:numPr>
-        <w:spacing w:after="120"/>
-      </w:pPr>
-      <w:r>
-        <w:t xml:space="preserve">(The app rename is DONE — #65.) The "Memory Assist" tagline still needs a home — the App Store subtitle field is empty and is one natural spot.</w:t>
-      </w:r>
-    </w:p>
-    <w:p>
-      <w:pPr>
-        <w:pStyle w:val="ListParagraph"/>
-        <w:numPr>
-          <w:ilvl w:val="0"/>
-          <w:numId w:val="2"/>
-        </w:numPr>
-        <w:spacing w:after="120"/>
-      </w:pPr>
-      <w:r>
-        <w:t xml:space="preserve">The Android icon pictures and the splash (startup) image still carry the old placeholder art — deliberately left for later when the main icon got the new face (#65).</w:t>
-      </w:r>
-    </w:p>
-    <w:p>
-      <w:pPr>
-        <w:pStyle w:val="ListParagraph"/>
-        <w:numPr>
-          <w:ilvl w:val="0"/>
-          <w:numId w:val="2"/>
-        </w:numPr>
-        <w:spacing w:after="120"/>
-      </w:pPr>
-      <w:r>
-        <w:t xml:space="preserve">Project Planner has reminder fields on screen, but they aren't connected to anything yet.</w:t>
-      </w:r>
-    </w:p>
-    <w:p>
-      <w:pPr>
-        <w:pStyle w:val="ListParagraph"/>
-        <w:numPr>
-          <w:ilvl w:val="0"/>
-          <w:numId w:val="2"/>
-        </w:numPr>
-        <w:spacing w:after="120"/>
-      </w:pPr>
-      <w:r>
-        <w:t xml:space="preserve">My Day / Pets: a Done tapped from the BANNER logs only the fire ("set") time. You want the entry to carry both times like the in-app logs do — the set time AND the time Done was actually tapped (#55).</w:t>
-      </w:r>
-    </w:p>
-    <w:p>
-      <w:pPr>
-        <w:pStyle w:val="Heading1"/>
-        <w:spacing w:after="120" w:before="320"/>
+        <w:pStyle w:val="Heading2"/>
+        <w:spacing w:after="150" w:before="300"/>
       </w:pPr>
       <w:r>
         <w:t xml:space="preserve">PARKED ON PURPOSE (bigger items, on hold for now)</w:t>
@@ -209,7 +181,7 @@
         <w:spacing w:after="120"/>
       </w:pPr>
       <w:r>
-        <w:t xml:space="preserve">Moved here from What's Next (your call, #55): the structured reminder test checklist; My Week's done-date recording; exact-item tap routing; the dark startup flash; Planner's unconnected reminder fields. (Retiring Colors.ts: DONE in #57.)</w:t>
+        <w:t xml:space="preserve">Tapping a reminder lands on the right page (tested #55), but taking you to the exact item on that page is still not built. (Moved here from Still broken, #1-new.)</w:t>
       </w:r>
     </w:p>
     <w:p>
@@ -262,11 +234,24 @@
       </w:pPr>
       <w:r>
         <w:t xml:space="preserve">Import files/documents into the Vault — PARKED (#69). The idea became "Vault pages" (paste text straight into a Vault item, no files) in the #68 roadmap; in #69 you started the talk-through, weren't ready, and parked the whole thing. The Vault stays as it is until you run into a real need. Not to be re-raised.</w:t>
+      </w:r>
+    </w:p>
+    <w:p>
+      <w:pPr>
+        <w:pStyle w:val="ListParagraph"/>
+        <w:numPr>
+          <w:ilvl w:val="0"/>
+          <w:numId w:val="2"/>
+        </w:numPr>
+        <w:spacing w:after="120"/>
+      </w:pPr>
+      <w:r>
+        <w:t xml:space="preserve">The Android icon pictures and the splash (startup) image still carry the old placeholder art — deliberately left for later when the main icon got the new face (#65). (Moved here from Nice-to-have, #1-new.)</w:t>
       </w:r>
     </w:p>
     <w:sectPr>
       <w:pgSz w:w="12240" w:h="15840" w:orient="portrait"/>
-      <w:pgMar w:top="1080" w:right="1260" w:bottom="1080" w:left="1260" w:header="708" w:footer="708" w:gutter="0"/>
+      <w:pgMar w:top="1440" w:right="1440" w:bottom="1440" w:left="1440" w:header="708" w:footer="708" w:gutter="0"/>
       <w:pgNumType/>
       <w:docGrid w:linePitch="360"/>
     </w:sectPr>
@@ -446,7 +431,7 @@
       <w:lvlText w:val="•"/>
       <w:lvlJc w:val="left"/>
       <w:pPr>
-        <w:ind w:left="504" w:hanging="288"/>
+        <w:ind w:left="720" w:hanging="360"/>
       </w:pPr>
     </w:lvl>
   </w:abstractNum>
@@ -471,8 +456,8 @@
     <w:rPrDefault>
       <w:rPr>
         <w:rFonts w:ascii="Calibri" w:cs="Calibri" w:eastAsia="Calibri" w:hAnsi="Calibri"/>
-        <w:sz w:val="28"/>
-        <w:szCs w:val="28"/>
+        <w:sz w:val="24"/>
+        <w:szCs w:val="24"/>
       </w:rPr>
     </w:rPrDefault>
     <w:pPrDefault/>
@@ -483,16 +468,29 @@
     <w:next w:val="Normal"/>
     <w:qFormat/>
     <w:rPr>
+      <w:sz w:val="56"/>
+      <w:szCs w:val="56"/>
+    </w:rPr>
+  </w:style>
+  <w:style w:type="paragraph" w:styleId="Heading1">
+    <w:name w:val="Heading 1"/>
+    <w:basedOn w:val="Normal"/>
+    <w:next w:val="Normal"/>
+    <w:qFormat/>
+    <w:pPr>
+      <w:spacing w:after="240"/>
+    </w:pPr>
+    <w:rPr>
       <w:rFonts w:ascii="Calibri" w:cs="Calibri" w:eastAsia="Calibri" w:hAnsi="Calibri"/>
       <w:b/>
       <w:bCs/>
-      <w:color w:val="1F3864"/>
-      <w:sz w:val="36"/>
-      <w:szCs w:val="36"/>
-    </w:rPr>
-  </w:style>
-  <w:style w:type="paragraph" w:styleId="Heading1">
-    <w:name w:val="Heading 1"/>
+      <w:color w:val="000000"/>
+      <w:sz w:val="32"/>
+      <w:szCs w:val="32"/>
+    </w:rPr>
+  </w:style>
+  <w:style w:type="paragraph" w:styleId="Heading2">
+    <w:name w:val="Heading 2"/>
     <w:basedOn w:val="Normal"/>
     <w:next w:val="Normal"/>
     <w:qFormat/>
@@ -500,20 +498,9 @@
       <w:rFonts w:ascii="Calibri" w:cs="Calibri" w:eastAsia="Calibri" w:hAnsi="Calibri"/>
       <w:b/>
       <w:bCs/>
-      <w:color w:val="1F3864"/>
-      <w:sz w:val="30"/>
-      <w:szCs w:val="30"/>
-    </w:rPr>
-  </w:style>
-  <w:style w:type="paragraph" w:styleId="Heading2">
-    <w:name w:val="Heading 2"/>
-    <w:basedOn w:val="Normal"/>
-    <w:next w:val="Normal"/>
-    <w:qFormat/>
-    <w:rPr>
-      <w:color w:val="2E74B5"/>
-      <w:sz w:val="26"/>
-      <w:szCs w:val="26"/>
+      <w:color w:val="000000"/>
+      <w:sz w:val="28"/>
+      <w:szCs w:val="28"/>
     </w:rPr>
   </w:style>
   <w:style w:type="paragraph" w:styleId="Heading3">

</xml_diff>

<commit_message>
#34-new - Memory, build pages — Weekly, Monthly, Quarterly, Yearly, One Time, Extended, Options, and the + Add popup.
</commit_message>
<xml_diff>
--- a/docs/pending.docx
+++ b/docs/pending.docx
@@ -24,7 +24,7 @@
           <w:rFonts w:ascii="Arial" w:hAnsi="Arial"/>
           <w:sz w:val="28"/>
         </w:rPr>
-        <w:t xml:space="preserve">Last updated: 2026-08-29 (#31-new)</w:t>
+        <w:t xml:space="preserve">Last updated: 2026-08-30 (#34-new)</w:t>
       </w:r>
     </w:p>
     <w:p>
@@ -289,43 +289,151 @@
           <w:rFonts w:ascii="Arial" w:hAnsi="Arial"/>
           <w:sz w:val="28"/>
         </w:rPr>
-        <w:t xml:space="preserve">   page. Not built. A build sheet is written first, and that sheet</w:t>
-      </w:r>
-    </w:p>
-    <w:p>
-      <w:pPr>
-        <w:spacing w:line="276" w:lineRule="auto"/>
-      </w:pPr>
-      <w:r>
-        <w:rPr>
-          <w:rFonts w:ascii="Arial" w:hAnsi="Arial"/>
-          <w:sz w:val="28"/>
-        </w:rPr>
-        <w:t xml:space="preserve">   is the next piece of work. Testing waits until the building is</w:t>
-      </w:r>
-    </w:p>
-    <w:p>
-      <w:pPr>
-        <w:spacing w:line="276" w:lineRule="auto"/>
-      </w:pPr>
-      <w:r>
-        <w:rPr>
-          <w:rFonts w:ascii="Arial" w:hAnsi="Arial"/>
-          <w:sz w:val="28"/>
-        </w:rPr>
-        <w:t xml:space="preserve">   done.</w:t>
-      </w:r>
-    </w:p>
-    <w:p>
-      <w:pPr>
-        <w:spacing w:line="276" w:lineRule="auto"/>
-      </w:pPr>
-      <w:r>
-        <w:rPr>
-          <w:rFonts w:ascii="Arial" w:hAnsi="Arial"/>
-          <w:sz w:val="28"/>
-        </w:rPr>
-        <w:t xml:space="preserve">2. THE 24-HOUR CLOCK. You keep leaving the time on the wrong AM or</w:t>
+        <w:t xml:space="preserve">   page. A six-month Look Ahead item lives on Quarterly, still</w:t>
+      </w:r>
+    </w:p>
+    <w:p>
+      <w:pPr>
+        <w:spacing w:line="276" w:lineRule="auto"/>
+      </w:pPr>
+      <w:r>
+        <w:rPr>
+          <w:rFonts w:ascii="Arial" w:hAnsi="Arial"/>
+          <w:sz w:val="28"/>
+        </w:rPr>
+        <w:t xml:space="preserve">   every six months. Options is the leftover Input list: holidays,</w:t>
+      </w:r>
+    </w:p>
+    <w:p>
+      <w:pPr>
+        <w:spacing w:line="276" w:lineRule="auto"/>
+      </w:pPr>
+      <w:r>
+        <w:rPr>
+          <w:rFonts w:ascii="Arial" w:hAnsi="Arial"/>
+          <w:sz w:val="28"/>
+        </w:rPr>
+        <w:t xml:space="preserve">   time zone, the float button, Skip, an extra tap on a shifted</w:t>
+      </w:r>
+    </w:p>
+    <w:p>
+      <w:pPr>
+        <w:spacing w:line="276" w:lineRule="auto"/>
+      </w:pPr>
+      <w:r>
+        <w:rPr>
+          <w:rFonts w:ascii="Arial" w:hAnsi="Arial"/>
+          <w:sz w:val="28"/>
+        </w:rPr>
+        <w:t xml:space="preserve">   day, calendar shading, a notes row, a second Thursday, and a</w:t>
+      </w:r>
+    </w:p>
+    <w:p>
+      <w:pPr>
+        <w:spacing w:line="276" w:lineRule="auto"/>
+      </w:pPr>
+      <w:r>
+        <w:rPr>
+          <w:rFonts w:ascii="Arial" w:hAnsi="Arial"/>
+          <w:sz w:val="28"/>
+        </w:rPr>
+        <w:t xml:space="preserve">   Wednesday after the 6th (#33-new). Daily through Options and the</w:t>
+      </w:r>
+    </w:p>
+    <w:p>
+      <w:pPr>
+        <w:spacing w:line="276" w:lineRule="auto"/>
+      </w:pPr>
+      <w:r>
+        <w:rPr>
+          <w:rFonts w:ascii="Arial" w:hAnsi="Arial"/>
+          <w:sz w:val="28"/>
+        </w:rPr>
+        <w:t xml:space="preserve">   + Add popup are built (#34-new). Project Planner, Orders, and</w:t>
+      </w:r>
+    </w:p>
+    <w:p>
+      <w:pPr>
+        <w:spacing w:line="276" w:lineRule="auto"/>
+      </w:pPr>
+      <w:r>
+        <w:rPr>
+          <w:rFonts w:ascii="Arial" w:hAnsi="Arial"/>
+          <w:sz w:val="28"/>
+        </w:rPr>
+        <w:t xml:space="preserve">   Watch List are off Home, same as Input (#34-new). Patrick</w:t>
+      </w:r>
+    </w:p>
+    <w:p>
+      <w:pPr>
+        <w:spacing w:line="276" w:lineRule="auto"/>
+      </w:pPr>
+      <w:r>
+        <w:rPr>
+          <w:rFonts w:ascii="Arial" w:hAnsi="Arial"/>
+          <w:sz w:val="28"/>
+        </w:rPr>
+        <w:t xml:space="preserve">   arranged the remaining tiles himself. Testing waits until you</w:t>
+      </w:r>
+    </w:p>
+    <w:p>
+      <w:pPr>
+        <w:spacing w:line="276" w:lineRule="auto"/>
+      </w:pPr>
+      <w:r>
+        <w:rPr>
+          <w:rFonts w:ascii="Arial" w:hAnsi="Arial"/>
+          <w:sz w:val="28"/>
+        </w:rPr>
+        <w:t xml:space="preserve">   have looked at the pages.</w:t>
+      </w:r>
+    </w:p>
+    <w:p>
+      <w:pPr>
+        <w:spacing w:line="276" w:lineRule="auto"/>
+      </w:pPr>
+      <w:r>
+        <w:rPr>
+          <w:rFonts w:ascii="Arial" w:hAnsi="Arial"/>
+          <w:sz w:val="28"/>
+        </w:rPr>
+        <w:t xml:space="preserve">2. TAKE THE OLD SCREENS OUT. The ones Home no longer opens. The</w:t>
+      </w:r>
+    </w:p>
+    <w:p>
+      <w:pPr>
+        <w:spacing w:line="276" w:lineRule="auto"/>
+      </w:pPr>
+      <w:r>
+        <w:rPr>
+          <w:rFonts w:ascii="Arial" w:hAnsi="Arial"/>
+          <w:sz w:val="28"/>
+        </w:rPr>
+        <w:t xml:space="preserve">   engine still reads the old lists, so those readers stay until</w:t>
+      </w:r>
+    </w:p>
+    <w:p>
+      <w:pPr>
+        <w:spacing w:line="276" w:lineRule="auto"/>
+      </w:pPr>
+      <w:r>
+        <w:rPr>
+          <w:rFonts w:ascii="Arial" w:hAnsi="Arial"/>
+          <w:sz w:val="28"/>
+        </w:rPr>
+        <w:t xml:space="preserve">   that is swapped (#34-new).</w:t>
+      </w:r>
+    </w:p>
+    <w:p>
+      <w:pPr>
+        <w:spacing w:line="276" w:lineRule="auto"/>
+      </w:pPr>
+      <w:r>
+        <w:rPr>
+          <w:rFonts w:ascii="Arial" w:hAnsi="Arial"/>
+          <w:sz w:val="28"/>
+        </w:rPr>
+        <w:t xml:space="preserve">3. THE 24-HOUR CLOCK. You keep leaving the time on the wrong AM or</w:t>
       </w:r>
     </w:p>
     <w:p>
@@ -397,7 +505,7 @@
           <w:rFonts w:ascii="Arial" w:hAnsi="Arial"/>
           <w:sz w:val="28"/>
         </w:rPr>
-        <w:t xml:space="preserve">3. LOOK AHEAD: change the tile format, and change or drop the</w:t>
+        <w:t xml:space="preserve">4. LOOK AHEAD: change the tile format, and change or drop the</w:t>
       </w:r>
     </w:p>
     <w:p>
@@ -421,7 +529,7 @@
           <w:rFonts w:ascii="Arial" w:hAnsi="Arial"/>
           <w:sz w:val="28"/>
         </w:rPr>
-        <w:t xml:space="preserve">4. TIMER: add a Stop (Pause) / Continue (Go) button to the tile,</w:t>
+        <w:t xml:space="preserve">5. TIMER: add a Stop (Pause) / Continue (Go) button to the tile,</w:t>
       </w:r>
     </w:p>
     <w:p>
@@ -1251,19 +1359,91 @@
           <w:rFonts w:ascii="Arial" w:hAnsi="Arial"/>
           <w:sz w:val="28"/>
         </w:rPr>
-        <w:t xml:space="preserve">   item, or a One Time for today. The other pages keep their own</w:t>
-      </w:r>
-    </w:p>
-    <w:p>
-      <w:pPr>
-        <w:spacing w:line="276" w:lineRule="auto"/>
-      </w:pPr>
-      <w:r>
-        <w:rPr>
-          <w:rFonts w:ascii="Arial" w:hAnsi="Arial"/>
-          <w:sz w:val="28"/>
-        </w:rPr>
-        <w:t xml:space="preserve">   adds, because on those the page is the whole meaning of Repeat.</w:t>
+        <w:t xml:space="preserve">   item, or a One Time for today. On One Time for today the</w:t>
+      </w:r>
+    </w:p>
+    <w:p>
+      <w:pPr>
+        <w:spacing w:line="276" w:lineRule="auto"/>
+      </w:pPr>
+      <w:r>
+        <w:rPr>
+          <w:rFonts w:ascii="Arial" w:hAnsi="Arial"/>
+          <w:sz w:val="28"/>
+        </w:rPr>
+        <w:t xml:space="preserve">   Reminders before chips are only 30 min., 1 hour, 2 hours, and</w:t>
+      </w:r>
+    </w:p>
+    <w:p>
+      <w:pPr>
+        <w:spacing w:line="276" w:lineRule="auto"/>
+      </w:pPr>
+      <w:r>
+        <w:rPr>
+          <w:rFonts w:ascii="Arial" w:hAnsi="Arial"/>
+          <w:sz w:val="28"/>
+        </w:rPr>
+        <w:t xml:space="preserve">   Time of (the item's own time). Save on that kind comes back on</w:t>
+      </w:r>
+    </w:p>
+    <w:p>
+      <w:pPr>
+        <w:spacing w:line="276" w:lineRule="auto"/>
+      </w:pPr>
+      <w:r>
+        <w:rPr>
+          <w:rFonts w:ascii="Arial" w:hAnsi="Arial"/>
+          <w:sz w:val="28"/>
+        </w:rPr>
+        <w:t xml:space="preserve">   To-Do, which has the Log, not Daily. A My Day banner now opens</w:t>
+      </w:r>
+    </w:p>
+    <w:p>
+      <w:pPr>
+        <w:spacing w:line="276" w:lineRule="auto"/>
+      </w:pPr>
+      <w:r>
+        <w:rPr>
+          <w:rFonts w:ascii="Arial" w:hAnsi="Arial"/>
+          <w:sz w:val="28"/>
+        </w:rPr>
+        <w:t xml:space="preserve">   Daily, not the old My Day page. Daily now shows My Day's log</w:t>
+      </w:r>
+    </w:p>
+    <w:p>
+      <w:pPr>
+        <w:spacing w:line="276" w:lineRule="auto"/>
+      </w:pPr>
+      <w:r>
+        <w:rPr>
+          <w:rFonts w:ascii="Arial" w:hAnsi="Arial"/>
+          <w:sz w:val="28"/>
+        </w:rPr>
+        <w:t xml:space="preserve">   (My Log, the same saved list). The My Day page is gone; an old</w:t>
+      </w:r>
+    </w:p>
+    <w:p>
+      <w:pPr>
+        <w:spacing w:line="276" w:lineRule="auto"/>
+      </w:pPr>
+      <w:r>
+        <w:rPr>
+          <w:rFonts w:ascii="Arial" w:hAnsi="Arial"/>
+          <w:sz w:val="28"/>
+        </w:rPr>
+        <w:t xml:space="preserve">   My Day link opens Daily. The other pages keep their</w:t>
+      </w:r>
+    </w:p>
+    <w:p>
+      <w:pPr>
+        <w:spacing w:line="276" w:lineRule="auto"/>
+      </w:pPr>
+      <w:r>
+        <w:rPr>
+          <w:rFonts w:ascii="Arial" w:hAnsi="Arial"/>
+          <w:sz w:val="28"/>
+        </w:rPr>
+        <w:t xml:space="preserve">   own adds, because on those the page is the whole meaning of Repeat.</w:t>
       </w:r>
     </w:p>
     <w:p>
@@ -1660,7 +1840,103 @@
           <w:rFonts w:ascii="Arial" w:hAnsi="Arial"/>
           <w:sz w:val="28"/>
         </w:rPr>
-        <w:t xml:space="preserve">1. #31-new — the record itself put right. The hand-off file went</w:t>
+        <w:t xml:space="preserve">1. #34-new — Weekly through Options and the + Add popup built.</w:t>
+      </w:r>
+    </w:p>
+    <w:p>
+      <w:pPr>
+        <w:spacing w:line="276" w:lineRule="auto"/>
+      </w:pPr>
+      <w:r>
+        <w:rPr>
+          <w:rFonts w:ascii="Arial" w:hAnsi="Arial"/>
+          <w:sz w:val="28"/>
+        </w:rPr>
+        <w:t xml:space="preserve">   Project Planner, Orders and Watch List off Home. Next is taking</w:t>
+      </w:r>
+    </w:p>
+    <w:p>
+      <w:pPr>
+        <w:spacing w:line="276" w:lineRule="auto"/>
+      </w:pPr>
+      <w:r>
+        <w:rPr>
+          <w:rFonts w:ascii="Arial" w:hAnsi="Arial"/>
+          <w:sz w:val="28"/>
+        </w:rPr>
+        <w:t xml:space="preserve">   the old screens out.</w:t>
+      </w:r>
+    </w:p>
+    <w:p>
+      <w:pPr>
+        <w:spacing w:line="276" w:lineRule="auto"/>
+      </w:pPr>
+      <w:r>
+        <w:rPr>
+          <w:rFonts w:ascii="Arial" w:hAnsi="Arial"/>
+          <w:sz w:val="28"/>
+        </w:rPr>
+        <w:t xml:space="preserve">2. #33-new — Daily built. Snooze, Done, hold-and-slide reorder, My</w:t>
+      </w:r>
+    </w:p>
+    <w:p>
+      <w:pPr>
+        <w:spacing w:line="276" w:lineRule="auto"/>
+      </w:pPr>
+      <w:r>
+        <w:rPr>
+          <w:rFonts w:ascii="Arial" w:hAnsi="Arial"/>
+          <w:sz w:val="28"/>
+        </w:rPr>
+        <w:t xml:space="preserve">   Log. The My Day page is gone. The sheet for Weekly through</w:t>
+      </w:r>
+    </w:p>
+    <w:p>
+      <w:pPr>
+        <w:spacing w:line="276" w:lineRule="auto"/>
+      </w:pPr>
+      <w:r>
+        <w:rPr>
+          <w:rFonts w:ascii="Arial" w:hAnsi="Arial"/>
+          <w:sz w:val="28"/>
+        </w:rPr>
+        <w:t xml:space="preserve">   Options was brought up to date with what Daily actually is.</w:t>
+      </w:r>
+    </w:p>
+    <w:p>
+      <w:pPr>
+        <w:spacing w:line="276" w:lineRule="auto"/>
+      </w:pPr>
+      <w:r>
+        <w:rPr>
+          <w:rFonts w:ascii="Arial" w:hAnsi="Arial"/>
+          <w:sz w:val="28"/>
+        </w:rPr>
+        <w:t xml:space="preserve">3. #32-new — the pages phase spec, and Daily's first job sheet.</w:t>
+      </w:r>
+    </w:p>
+    <w:p>
+      <w:pPr>
+        <w:spacing w:line="276" w:lineRule="auto"/>
+      </w:pPr>
+      <w:r>
+        <w:rPr>
+          <w:rFonts w:ascii="Arial" w:hAnsi="Arial"/>
+          <w:sz w:val="28"/>
+        </w:rPr>
+        <w:t xml:space="preserve">   Nothing was built.</w:t>
+      </w:r>
+    </w:p>
+    <w:p>
+      <w:pPr>
+        <w:spacing w:line="276" w:lineRule="auto"/>
+      </w:pPr>
+      <w:r>
+        <w:rPr>
+          <w:rFonts w:ascii="Arial" w:hAnsi="Arial"/>
+          <w:sz w:val="28"/>
+        </w:rPr>
+        <w:t xml:space="preserve">4. #31-new — the record itself put right. The hand-off file went</w:t>
       </w:r>
     </w:p>
     <w:p>
@@ -1756,7 +2032,7 @@
           <w:rFonts w:ascii="Arial" w:hAnsi="Arial"/>
           <w:sz w:val="28"/>
         </w:rPr>
-        <w:t xml:space="preserve">2. #30-new — the reminder pages named and shaped, and the one Input</w:t>
+        <w:t xml:space="preserve">5. #30-new — the reminder pages named and shaped, and the one Input</w:t>
       </w:r>
     </w:p>
     <w:p>
@@ -1780,7 +2056,7 @@
           <w:rFonts w:ascii="Arial" w:hAnsi="Arial"/>
           <w:sz w:val="28"/>
         </w:rPr>
-        <w:t xml:space="preserve">3. #28-new — the engine gained repeat groups, skip, and time zones</w:t>
+        <w:t xml:space="preserve">6. #28-new — the engine gained repeat groups, skip, and time zones</w:t>
       </w:r>
     </w:p>
     <w:p>
@@ -1804,7 +2080,7 @@
           <w:rFonts w:ascii="Arial" w:hAnsi="Arial"/>
           <w:sz w:val="28"/>
         </w:rPr>
-        <w:t xml:space="preserve">4. #27-new — all five reminder screens went onto the one machine,</w:t>
+        <w:t xml:space="preserve">7. #27-new — all five reminder screens went onto the one machine,</w:t>
       </w:r>
     </w:p>
     <w:p>
@@ -1864,7 +2140,7 @@
           <w:rFonts w:ascii="Arial" w:hAnsi="Arial"/>
           <w:sz w:val="28"/>
         </w:rPr>
-        <w:t xml:space="preserve">5. #26-new — the per-screen translators became one translator and a</w:t>
+        <w:t xml:space="preserve">8. #26-new — the per-screen translators became one translator and a</w:t>
       </w:r>
     </w:p>
     <w:p>
@@ -1888,7 +2164,7 @@
           <w:rFonts w:ascii="Arial" w:hAnsi="Arial"/>
           <w:sz w:val="28"/>
         </w:rPr>
-        <w:t xml:space="preserve">6. #24-new and #25-new — the first two translators, My Day and</w:t>
+        <w:t xml:space="preserve">9. #24-new and #25-new — the first two translators, My Day and</w:t>
       </w:r>
     </w:p>
     <w:p>
@@ -1924,79 +2200,79 @@
           <w:rFonts w:ascii="Arial" w:hAnsi="Arial"/>
           <w:sz w:val="28"/>
         </w:rPr>
-        <w:t xml:space="preserve">7. #23-new — the common shape and the two decision blocks built and</w:t>
-      </w:r>
-    </w:p>
-    <w:p>
-      <w:pPr>
-        <w:spacing w:line="276" w:lineRule="auto"/>
-      </w:pPr>
-      <w:r>
-        <w:rPr>
-          <w:rFonts w:ascii="Arial" w:hAnsi="Arial"/>
-          <w:sz w:val="28"/>
-        </w:rPr>
-        <w:t xml:space="preserve">   tested, with nothing in the app calling them yet.</w:t>
-      </w:r>
-    </w:p>
-    <w:p>
-      <w:pPr>
-        <w:spacing w:line="276" w:lineRule="auto"/>
-      </w:pPr>
-      <w:r>
-        <w:rPr>
-          <w:rFonts w:ascii="Arial" w:hAnsi="Arial"/>
-          <w:sz w:val="28"/>
-        </w:rPr>
-        <w:t xml:space="preserve">8. #22-new — the field names settled, and setting reminders two</w:t>
-      </w:r>
-    </w:p>
-    <w:p>
-      <w:pPr>
-        <w:spacing w:line="276" w:lineRule="auto"/>
-      </w:pPr>
-      <w:r>
-        <w:rPr>
-          <w:rFonts w:ascii="Arial" w:hAnsi="Arial"/>
-          <w:sz w:val="28"/>
-        </w:rPr>
-        <w:t xml:space="preserve">   deep reopened by you and closed at one.</w:t>
-      </w:r>
-    </w:p>
-    <w:p>
-      <w:pPr>
-        <w:spacing w:line="276" w:lineRule="auto"/>
-      </w:pPr>
-      <w:r>
-        <w:rPr>
-          <w:rFonts w:ascii="Arial" w:hAnsi="Arial"/>
-          <w:sz w:val="28"/>
-        </w:rPr>
-        <w:t xml:space="preserve">9. #21-new — the common shape settled on paper, all five screens</w:t>
-      </w:r>
-    </w:p>
-    <w:p>
-      <w:pPr>
-        <w:spacing w:line="276" w:lineRule="auto"/>
-      </w:pPr>
-      <w:r>
-        <w:rPr>
-          <w:rFonts w:ascii="Arial" w:hAnsi="Arial"/>
-          <w:sz w:val="28"/>
-        </w:rPr>
-        <w:t xml:space="preserve">   inside it.</w:t>
-      </w:r>
-    </w:p>
-    <w:p>
-      <w:pPr>
-        <w:spacing w:line="276" w:lineRule="auto"/>
-      </w:pPr>
-      <w:r>
-        <w:rPr>
-          <w:rFonts w:ascii="Arial" w:hAnsi="Arial"/>
-          <w:sz w:val="28"/>
-        </w:rPr>
-        <w:t xml:space="preserve">10. #20-new — My Week's Delay written down like the others, and the</w:t>
+        <w:t xml:space="preserve">10. #23-new — the common shape and the two decision blocks built and</w:t>
+      </w:r>
+    </w:p>
+    <w:p>
+      <w:pPr>
+        <w:spacing w:line="276" w:lineRule="auto"/>
+      </w:pPr>
+      <w:r>
+        <w:rPr>
+          <w:rFonts w:ascii="Arial" w:hAnsi="Arial"/>
+          <w:sz w:val="28"/>
+        </w:rPr>
+        <w:t xml:space="preserve">    tested, with nothing in the app calling them yet.</w:t>
+      </w:r>
+    </w:p>
+    <w:p>
+      <w:pPr>
+        <w:spacing w:line="276" w:lineRule="auto"/>
+      </w:pPr>
+      <w:r>
+        <w:rPr>
+          <w:rFonts w:ascii="Arial" w:hAnsi="Arial"/>
+          <w:sz w:val="28"/>
+        </w:rPr>
+        <w:t xml:space="preserve">11. #22-new — the field names settled, and setting reminders two</w:t>
+      </w:r>
+    </w:p>
+    <w:p>
+      <w:pPr>
+        <w:spacing w:line="276" w:lineRule="auto"/>
+      </w:pPr>
+      <w:r>
+        <w:rPr>
+          <w:rFonts w:ascii="Arial" w:hAnsi="Arial"/>
+          <w:sz w:val="28"/>
+        </w:rPr>
+        <w:t xml:space="preserve">    deep reopened by you and closed at one.</w:t>
+      </w:r>
+    </w:p>
+    <w:p>
+      <w:pPr>
+        <w:spacing w:line="276" w:lineRule="auto"/>
+      </w:pPr>
+      <w:r>
+        <w:rPr>
+          <w:rFonts w:ascii="Arial" w:hAnsi="Arial"/>
+          <w:sz w:val="28"/>
+        </w:rPr>
+        <w:t xml:space="preserve">12. #21-new — the common shape settled on paper, all five screens</w:t>
+      </w:r>
+    </w:p>
+    <w:p>
+      <w:pPr>
+        <w:spacing w:line="276" w:lineRule="auto"/>
+      </w:pPr>
+      <w:r>
+        <w:rPr>
+          <w:rFonts w:ascii="Arial" w:hAnsi="Arial"/>
+          <w:sz w:val="28"/>
+        </w:rPr>
+        <w:t xml:space="preserve">    inside it.</w:t>
+      </w:r>
+    </w:p>
+    <w:p>
+      <w:pPr>
+        <w:spacing w:line="276" w:lineRule="auto"/>
+      </w:pPr>
+      <w:r>
+        <w:rPr>
+          <w:rFonts w:ascii="Arial" w:hAnsi="Arial"/>
+          <w:sz w:val="28"/>
+        </w:rPr>
+        <w:t xml:space="preserve">13. #20-new — My Week's Delay written down like the others, and the</w:t>
       </w:r>
     </w:p>
     <w:p>
@@ -2020,7 +2296,7 @@
           <w:rFonts w:ascii="Arial" w:hAnsi="Arial"/>
           <w:sz w:val="28"/>
         </w:rPr>
-        <w:t xml:space="preserve">11. #19-new — your epiphany: one shape instead of six, the reminder</w:t>
+        <w:t xml:space="preserve">14. #19-new — your epiphany: one shape instead of six, the reminder</w:t>
       </w:r>
     </w:p>
     <w:p>
@@ -2044,7 +2320,7 @@
           <w:rFonts w:ascii="Arial" w:hAnsi="Arial"/>
           <w:sz w:val="28"/>
         </w:rPr>
-        <w:t xml:space="preserve">12. #18-new — the outsider's report checked. The answer was mend</w:t>
+        <w:t xml:space="preserve">15. #18-new — the outsider's report checked. The answer was mend</w:t>
       </w:r>
     </w:p>
     <w:p>
@@ -2080,7 +2356,7 @@
           <w:rFonts w:ascii="Arial" w:hAnsi="Arial"/>
           <w:sz w:val="28"/>
         </w:rPr>
-        <w:t xml:space="preserve">13. #15-new to #17-new — the failure pop-up and the missed-firing</w:t>
+        <w:t xml:space="preserve">16. #15-new to #17-new — the failure pop-up and the missed-firing</w:t>
       </w:r>
     </w:p>
     <w:p>
@@ -2116,7 +2392,7 @@
           <w:rFonts w:ascii="Arial" w:hAnsi="Arial"/>
           <w:sz w:val="28"/>
         </w:rPr>
-        <w:t xml:space="preserve">14. #13-new and #14-new — tapping a reminder lands on its own item</w:t>
+        <w:t xml:space="preserve">17. #13-new and #14-new — tapping a reminder lands on its own item</w:t>
       </w:r>
     </w:p>
     <w:p>
@@ -2140,7 +2416,7 @@
           <w:rFonts w:ascii="Arial" w:hAnsi="Arial"/>
           <w:sz w:val="28"/>
         </w:rPr>
-        <w:t xml:space="preserve">15. #12-new — the Scheduled Reminders screen, showing every</w:t>
+        <w:t xml:space="preserve">18. #12-new — the Scheduled Reminders screen, showing every</w:t>
       </w:r>
     </w:p>
     <w:p>
@@ -2164,7 +2440,7 @@
           <w:rFonts w:ascii="Arial" w:hAnsi="Arial"/>
           <w:sz w:val="28"/>
         </w:rPr>
-        <w:t xml:space="preserve">16. #6-new to #12-new — the scheduler built in eight steps, so one</w:t>
+        <w:t xml:space="preserve">19. #6-new to #12-new — the scheduler built in eight steps, so one</w:t>
       </w:r>
     </w:p>
     <w:p>
@@ -2188,7 +2464,7 @@
           <w:rFonts w:ascii="Arial" w:hAnsi="Arial"/>
           <w:sz w:val="28"/>
         </w:rPr>
-        <w:t xml:space="preserve">17. #4-new — the first notification fixes. Real, and kept, but not</w:t>
+        <w:t xml:space="preserve">20. #4-new — the first notification fixes. Real, and kept, but not</w:t>
       </w:r>
     </w:p>
     <w:p>

</xml_diff>

<commit_message>
#39-new. complete clean cutover recorded told connection cut code left idle.
</commit_message>
<xml_diff>
--- a/docs/pending.docx
+++ b/docs/pending.docx
@@ -24,7 +24,7 @@
           <w:rFonts w:ascii="Arial" w:hAnsi="Arial"/>
           <w:sz w:val="28"/>
         </w:rPr>
-        <w:t xml:space="preserve">Last updated: 2026-08-30 (#34-new)</w:t>
+        <w:t xml:space="preserve">Last updated: 2026-08-30 (#39-new)</w:t>
       </w:r>
     </w:p>
     <w:p>
@@ -229,283 +229,355 @@
           <w:rFonts w:ascii="Arial" w:hAnsi="Arial"/>
           <w:sz w:val="28"/>
         </w:rPr>
-        <w:t xml:space="preserve">1. THE REMINDER PAGES. Your own map from #30-new: Daily (My Day and</w:t>
-      </w:r>
-    </w:p>
-    <w:p>
-      <w:pPr>
-        <w:spacing w:line="276" w:lineRule="auto"/>
-      </w:pPr>
-      <w:r>
-        <w:rPr>
-          <w:rFonts w:ascii="Arial" w:hAnsi="Arial"/>
-          <w:sz w:val="28"/>
-        </w:rPr>
-        <w:t xml:space="preserve">   Pets together, and the day view of whatever else is due today),</w:t>
-      </w:r>
-    </w:p>
-    <w:p>
-      <w:pPr>
-        <w:spacing w:line="276" w:lineRule="auto"/>
-      </w:pPr>
-      <w:r>
-        <w:rPr>
-          <w:rFonts w:ascii="Arial" w:hAnsi="Arial"/>
-          <w:sz w:val="28"/>
-        </w:rPr>
-        <w:t xml:space="preserve">   Weekly, Monthly, Quarterly, Yearly (Look Ahead's repeats, split</w:t>
-      </w:r>
-    </w:p>
-    <w:p>
-      <w:pPr>
-        <w:spacing w:line="276" w:lineRule="auto"/>
-      </w:pPr>
-      <w:r>
-        <w:rPr>
-          <w:rFonts w:ascii="Arial" w:hAnsi="Arial"/>
-          <w:sz w:val="28"/>
-        </w:rPr>
-        <w:t xml:space="preserve">   by how often), One Time (a date, no repeat, with To-Do's</w:t>
-      </w:r>
-    </w:p>
-    <w:p>
-      <w:pPr>
-        <w:spacing w:line="276" w:lineRule="auto"/>
-      </w:pPr>
-      <w:r>
-        <w:rPr>
-          <w:rFonts w:ascii="Arial" w:hAnsi="Arial"/>
-          <w:sz w:val="28"/>
-        </w:rPr>
-        <w:t xml:space="preserve">   Reminders before), Extended (no date), and Options on its own</w:t>
-      </w:r>
-    </w:p>
-    <w:p>
-      <w:pPr>
-        <w:spacing w:line="276" w:lineRule="auto"/>
-      </w:pPr>
-      <w:r>
-        <w:rPr>
-          <w:rFonts w:ascii="Arial" w:hAnsi="Arial"/>
-          <w:sz w:val="28"/>
-        </w:rPr>
-        <w:t xml:space="preserve">   page. A six-month Look Ahead item lives on Quarterly, still</w:t>
-      </w:r>
-    </w:p>
-    <w:p>
-      <w:pPr>
-        <w:spacing w:line="276" w:lineRule="auto"/>
-      </w:pPr>
-      <w:r>
-        <w:rPr>
-          <w:rFonts w:ascii="Arial" w:hAnsi="Arial"/>
-          <w:sz w:val="28"/>
-        </w:rPr>
-        <w:t xml:space="preserve">   every six months. Options is the leftover Input list: holidays,</w:t>
-      </w:r>
-    </w:p>
-    <w:p>
-      <w:pPr>
-        <w:spacing w:line="276" w:lineRule="auto"/>
-      </w:pPr>
-      <w:r>
-        <w:rPr>
-          <w:rFonts w:ascii="Arial" w:hAnsi="Arial"/>
-          <w:sz w:val="28"/>
-        </w:rPr>
-        <w:t xml:space="preserve">   time zone, the float button, Skip, an extra tap on a shifted</w:t>
-      </w:r>
-    </w:p>
-    <w:p>
-      <w:pPr>
-        <w:spacing w:line="276" w:lineRule="auto"/>
-      </w:pPr>
-      <w:r>
-        <w:rPr>
-          <w:rFonts w:ascii="Arial" w:hAnsi="Arial"/>
-          <w:sz w:val="28"/>
-        </w:rPr>
-        <w:t xml:space="preserve">   day, calendar shading, a notes row, a second Thursday, and a</w:t>
-      </w:r>
-    </w:p>
-    <w:p>
-      <w:pPr>
-        <w:spacing w:line="276" w:lineRule="auto"/>
-      </w:pPr>
-      <w:r>
-        <w:rPr>
-          <w:rFonts w:ascii="Arial" w:hAnsi="Arial"/>
-          <w:sz w:val="28"/>
-        </w:rPr>
-        <w:t xml:space="preserve">   Wednesday after the 6th (#33-new). Daily through Options and the</w:t>
-      </w:r>
-    </w:p>
-    <w:p>
-      <w:pPr>
-        <w:spacing w:line="276" w:lineRule="auto"/>
-      </w:pPr>
-      <w:r>
-        <w:rPr>
-          <w:rFonts w:ascii="Arial" w:hAnsi="Arial"/>
-          <w:sz w:val="28"/>
-        </w:rPr>
-        <w:t xml:space="preserve">   + Add popup are built (#34-new). Project Planner, Orders, and</w:t>
-      </w:r>
-    </w:p>
-    <w:p>
-      <w:pPr>
-        <w:spacing w:line="276" w:lineRule="auto"/>
-      </w:pPr>
-      <w:r>
-        <w:rPr>
-          <w:rFonts w:ascii="Arial" w:hAnsi="Arial"/>
-          <w:sz w:val="28"/>
-        </w:rPr>
-        <w:t xml:space="preserve">   Watch List are off Home, same as Input (#34-new). Patrick</w:t>
-      </w:r>
-    </w:p>
-    <w:p>
-      <w:pPr>
-        <w:spacing w:line="276" w:lineRule="auto"/>
-      </w:pPr>
-      <w:r>
-        <w:rPr>
-          <w:rFonts w:ascii="Arial" w:hAnsi="Arial"/>
-          <w:sz w:val="28"/>
-        </w:rPr>
-        <w:t xml:space="preserve">   arranged the remaining tiles himself. Testing waits until you</w:t>
-      </w:r>
-    </w:p>
-    <w:p>
-      <w:pPr>
-        <w:spacing w:line="276" w:lineRule="auto"/>
-      </w:pPr>
-      <w:r>
-        <w:rPr>
-          <w:rFonts w:ascii="Arial" w:hAnsi="Arial"/>
-          <w:sz w:val="28"/>
-        </w:rPr>
-        <w:t xml:space="preserve">   have looked at the pages.</w:t>
-      </w:r>
-    </w:p>
-    <w:p>
-      <w:pPr>
-        <w:spacing w:line="276" w:lineRule="auto"/>
-      </w:pPr>
-      <w:r>
-        <w:rPr>
-          <w:rFonts w:ascii="Arial" w:hAnsi="Arial"/>
-          <w:sz w:val="28"/>
-        </w:rPr>
-        <w:t xml:space="preserve">2. TAKE THE OLD SCREENS OUT. The ones Home no longer opens. The</w:t>
-      </w:r>
-    </w:p>
-    <w:p>
-      <w:pPr>
-        <w:spacing w:line="276" w:lineRule="auto"/>
-      </w:pPr>
-      <w:r>
-        <w:rPr>
-          <w:rFonts w:ascii="Arial" w:hAnsi="Arial"/>
-          <w:sz w:val="28"/>
-        </w:rPr>
-        <w:t xml:space="preserve">   engine still reads the old lists, so those readers stay until</w:t>
-      </w:r>
-    </w:p>
-    <w:p>
-      <w:pPr>
-        <w:spacing w:line="276" w:lineRule="auto"/>
-      </w:pPr>
-      <w:r>
-        <w:rPr>
-          <w:rFonts w:ascii="Arial" w:hAnsi="Arial"/>
-          <w:sz w:val="28"/>
-        </w:rPr>
-        <w:t xml:space="preserve">   that is swapped (#34-new).</w:t>
-      </w:r>
-    </w:p>
-    <w:p>
-      <w:pPr>
-        <w:spacing w:line="276" w:lineRule="auto"/>
-      </w:pPr>
-      <w:r>
-        <w:rPr>
-          <w:rFonts w:ascii="Arial" w:hAnsi="Arial"/>
-          <w:sz w:val="28"/>
-        </w:rPr>
-        <w:t xml:space="preserve">3. THE 24-HOUR CLOCK. You keep leaving the time on the wrong AM or</w:t>
-      </w:r>
-    </w:p>
-    <w:p>
-      <w:pPr>
-        <w:spacing w:line="276" w:lineRule="auto"/>
-      </w:pPr>
-      <w:r>
-        <w:rPr>
-          <w:rFonts w:ascii="Arial" w:hAnsi="Arial"/>
-          <w:sz w:val="28"/>
-        </w:rPr>
-        <w:t xml:space="preserve">   PM, so the AM/PM spinner comes off and the hour reads 00 to 23.</w:t>
-      </w:r>
-    </w:p>
-    <w:p>
-      <w:pPr>
-        <w:spacing w:line="276" w:lineRule="auto"/>
-      </w:pPr>
-      <w:r>
-        <w:rPr>
-          <w:rFonts w:ascii="Arial" w:hAnsi="Arial"/>
-          <w:sz w:val="28"/>
-        </w:rPr>
-        <w:t xml:space="preserve">   Waits until after the building. The looking is done: the setter</w:t>
-      </w:r>
-    </w:p>
-    <w:p>
-      <w:pPr>
-        <w:spacing w:line="276" w:lineRule="auto"/>
-      </w:pPr>
-      <w:r>
-        <w:rPr>
-          <w:rFonts w:ascii="Arial" w:hAnsi="Arial"/>
-          <w:sz w:val="28"/>
-        </w:rPr>
-        <w:t xml:space="preserve">   is one file, the tiles are six copies of one small piece, and</w:t>
-      </w:r>
-    </w:p>
-    <w:p>
-      <w:pPr>
-        <w:spacing w:line="276" w:lineRule="auto"/>
-      </w:pPr>
-      <w:r>
-        <w:rPr>
-          <w:rFonts w:ascii="Arial" w:hAnsi="Arial"/>
-          <w:sz w:val="28"/>
-        </w:rPr>
-        <w:t xml:space="preserve">   the Scheduled Reminders screen has its own. Nothing has to be</w:t>
-      </w:r>
-    </w:p>
-    <w:p>
-      <w:pPr>
-        <w:spacing w:line="276" w:lineRule="auto"/>
-      </w:pPr>
-      <w:r>
-        <w:rPr>
-          <w:rFonts w:ascii="Arial" w:hAnsi="Arial"/>
-          <w:sz w:val="28"/>
-        </w:rPr>
-        <w:t xml:space="preserve">   worked out again.</w:t>
-      </w:r>
-    </w:p>
-    <w:p>
-      <w:pPr>
-        <w:spacing w:line="276" w:lineRule="auto"/>
-      </w:pPr>
-      <w:r>
-        <w:rPr>
-          <w:rFonts w:ascii="Arial" w:hAnsi="Arial"/>
-          <w:sz w:val="28"/>
-        </w:rPr>
-        <w:t xml:space="preserve">4. LOOK AHEAD: change the tile format, and change or drop the</w:t>
+        <w:t xml:space="preserve">1. THE REMINDER PAGES. Daily through Options are built. The one-store</w:t>
+      </w:r>
+    </w:p>
+    <w:p>
+      <w:pPr>
+        <w:spacing w:line="276" w:lineRule="auto"/>
+      </w:pPr>
+      <w:r>
+        <w:rPr>
+          <w:rFonts w:ascii="Arial" w:hAnsi="Arial"/>
+          <w:sz w:val="28"/>
+        </w:rPr>
+        <w:t xml:space="preserve">   cutover is in (#39-new): pages, banners and Siri write one list, the</w:t>
+      </w:r>
+    </w:p>
+    <w:p>
+      <w:pPr>
+        <w:spacing w:line="276" w:lineRule="auto"/>
+      </w:pPr>
+      <w:r>
+        <w:rPr>
+          <w:rFonts w:ascii="Arial" w:hAnsi="Arial"/>
+          <w:sz w:val="28"/>
+        </w:rPr>
+        <w:t xml:space="preserve">   scheduler reads it, and dual-write is gone. Options connecting is in</w:t>
+      </w:r>
+    </w:p>
+    <w:p>
+      <w:pPr>
+        <w:spacing w:line="276" w:lineRule="auto"/>
+      </w:pPr>
+      <w:r>
+        <w:rPr>
+          <w:rFonts w:ascii="Arial" w:hAnsi="Arial"/>
+          <w:sz w:val="28"/>
+        </w:rPr>
+        <w:t xml:space="preserve">   (#37-new): + OPT writes the cases that apply, Note is on New and</w:t>
+      </w:r>
+    </w:p>
+    <w:p>
+      <w:pPr>
+        <w:spacing w:line="276" w:lineRule="auto"/>
+      </w:pPr>
+      <w:r>
+        <w:rPr>
+          <w:rFonts w:ascii="Arial" w:hAnsi="Arial"/>
+          <w:sz w:val="28"/>
+        </w:rPr>
+        <w:t xml:space="preserve">   Edit, Skip is off Options. Weekly has holidays, time zone, and</w:t>
+      </w:r>
+    </w:p>
+    <w:p>
+      <w:pPr>
+        <w:spacing w:line="276" w:lineRule="auto"/>
+      </w:pPr>
+      <w:r>
+        <w:rPr>
+          <w:rFonts w:ascii="Arial" w:hAnsi="Arial"/>
+          <w:sz w:val="28"/>
+        </w:rPr>
+        <w:t xml:space="preserve">   calendar shading. Monthly, Quarterly, and Yearly add Float, extra</w:t>
+      </w:r>
+    </w:p>
+    <w:p>
+      <w:pPr>
+        <w:spacing w:line="276" w:lineRule="auto"/>
+      </w:pPr>
+      <w:r>
+        <w:rPr>
+          <w:rFonts w:ascii="Arial" w:hAnsi="Arial"/>
+          <w:sz w:val="28"/>
+        </w:rPr>
+        <w:t xml:space="preserve">   tap, a second Thursday, and a Wednesday after the 6th. One Time has</w:t>
+      </w:r>
+    </w:p>
+    <w:p>
+      <w:pPr>
+        <w:spacing w:line="276" w:lineRule="auto"/>
+      </w:pPr>
+      <w:r>
+        <w:rPr>
+          <w:rFonts w:ascii="Arial" w:hAnsi="Arial"/>
+          <w:sz w:val="28"/>
+        </w:rPr>
+        <w:t xml:space="preserve">   the same three as Weekly. Extended’s set is not gone through. Float</w:t>
+      </w:r>
+    </w:p>
+    <w:p>
+      <w:pPr>
+        <w:spacing w:line="276" w:lineRule="auto"/>
+      </w:pPr>
+      <w:r>
+        <w:rPr>
+          <w:rFonts w:ascii="Arial" w:hAnsi="Arial"/>
+          <w:sz w:val="28"/>
+        </w:rPr>
+        <w:t xml:space="preserve">   uses the last day that exists. Holidays use the US federal list,</w:t>
+      </w:r>
+    </w:p>
+    <w:p>
+      <w:pPr>
+        <w:spacing w:line="276" w:lineRule="auto"/>
+      </w:pPr>
+      <w:r>
+        <w:rPr>
+          <w:rFonts w:ascii="Arial" w:hAnsi="Arial"/>
+          <w:sz w:val="28"/>
+        </w:rPr>
+        <w:t xml:space="preserve">   before or after. The engine does not do holidays yet, and it does</w:t>
+      </w:r>
+    </w:p>
+    <w:p>
+      <w:pPr>
+        <w:spacing w:line="276" w:lineRule="auto"/>
+      </w:pPr>
+      <w:r>
+        <w:rPr>
+          <w:rFonts w:ascii="Arial" w:hAnsi="Arial"/>
+          <w:sz w:val="28"/>
+        </w:rPr>
+        <w:t xml:space="preserve">   not read the Options fields. The 31st keeping through a short month</w:t>
+      </w:r>
+    </w:p>
+    <w:p>
+      <w:pPr>
+        <w:spacing w:line="276" w:lineRule="auto"/>
+      </w:pPr>
+      <w:r>
+        <w:rPr>
+          <w:rFonts w:ascii="Arial" w:hAnsi="Arial"/>
+          <w:sz w:val="28"/>
+        </w:rPr>
+        <w:t xml:space="preserve">   is an automated-load case. The settled load is in</w:t>
+      </w:r>
+    </w:p>
+    <w:p>
+      <w:pPr>
+        <w:spacing w:line="276" w:lineRule="auto"/>
+      </w:pPr>
+      <w:r>
+        <w:rPr>
+          <w:rFonts w:ascii="Arial" w:hAnsi="Arial"/>
+          <w:sz w:val="28"/>
+        </w:rPr>
+        <w:t xml:space="preserve">   docs/automated-test-load.md. It waits until the remaining features</w:t>
+      </w:r>
+    </w:p>
+    <w:p>
+      <w:pPr>
+        <w:spacing w:line="276" w:lineRule="auto"/>
+      </w:pPr>
+      <w:r>
+        <w:rPr>
+          <w:rFonts w:ascii="Arial" w:hAnsi="Arial"/>
+          <w:sz w:val="28"/>
+        </w:rPr>
+        <w:t xml:space="preserve">   are in. He is living with the #37-new build on the phone. Look</w:t>
+      </w:r>
+    </w:p>
+    <w:p>
+      <w:pPr>
+        <w:spacing w:line="276" w:lineRule="auto"/>
+      </w:pPr>
+      <w:r>
+        <w:rPr>
+          <w:rFonts w:ascii="Arial" w:hAnsi="Arial"/>
+          <w:sz w:val="28"/>
+        </w:rPr>
+        <w:t xml:space="preserve">   Ahead's tile and Snooze, and the Timer's pause and log, are still</w:t>
+      </w:r>
+    </w:p>
+    <w:p>
+      <w:pPr>
+        <w:spacing w:line="276" w:lineRule="auto"/>
+      </w:pPr>
+      <w:r>
+        <w:rPr>
+          <w:rFonts w:ascii="Arial" w:hAnsi="Arial"/>
+          <w:sz w:val="28"/>
+        </w:rPr>
+        <w:t xml:space="preserve">   later jobs. Keep the repeat recipe unchanged, calculate shading</w:t>
+      </w:r>
+    </w:p>
+    <w:p>
+      <w:pPr>
+        <w:spacing w:line="276" w:lineRule="auto"/>
+      </w:pPr>
+      <w:r>
+        <w:rPr>
+          <w:rFonts w:ascii="Arial" w:hAnsi="Arial"/>
+          <w:sz w:val="28"/>
+        </w:rPr>
+        <w:t xml:space="preserve">   from the engine, and put Then or Next Day on the shifted banner</w:t>
+      </w:r>
+    </w:p>
+    <w:p>
+      <w:pPr>
+        <w:spacing w:line="276" w:lineRule="auto"/>
+      </w:pPr>
+      <w:r>
+        <w:rPr>
+          <w:rFonts w:ascii="Arial" w:hAnsi="Arial"/>
+          <w:sz w:val="28"/>
+        </w:rPr>
+        <w:t xml:space="preserve">   rather than the item. Before the Options-to-engine build, settle</w:t>
+      </w:r>
+    </w:p>
+    <w:p>
+      <w:pPr>
+        <w:spacing w:line="276" w:lineRule="auto"/>
+      </w:pPr>
+      <w:r>
+        <w:rPr>
+          <w:rFonts w:ascii="Arial" w:hAnsi="Arial"/>
+          <w:sz w:val="28"/>
+        </w:rPr>
+        <w:t xml:space="preserve">   what Float off means, whether the monthly patterns may coexist, the</w:t>
+      </w:r>
+    </w:p>
+    <w:p>
+      <w:pPr>
+        <w:spacing w:line="276" w:lineRule="auto"/>
+      </w:pPr>
+      <w:r>
+        <w:rPr>
+          <w:rFonts w:ascii="Arial" w:hAnsi="Arial"/>
+          <w:sz w:val="28"/>
+        </w:rPr>
+        <w:t xml:space="preserve">   order of holiday and missing-day moves, Extended's set, and what</w:t>
+      </w:r>
+    </w:p>
+    <w:p>
+      <w:pPr>
+        <w:spacing w:line="276" w:lineRule="auto"/>
+      </w:pPr>
+      <w:r>
+        <w:rPr>
+          <w:rFonts w:ascii="Arial" w:hAnsi="Arial"/>
+          <w:sz w:val="28"/>
+        </w:rPr>
+        <w:t xml:space="preserve">   Cancel does after + OPT has saved.</w:t>
+      </w:r>
+    </w:p>
+    <w:p>
+      <w:pPr>
+        <w:spacing w:line="276" w:lineRule="auto"/>
+      </w:pPr>
+      <w:r>
+        <w:rPr>
+          <w:rFonts w:ascii="Arial" w:hAnsi="Arial"/>
+          <w:sz w:val="28"/>
+        </w:rPr>
+        <w:t xml:space="preserve">2. HARDEN THE REMINDER ROAD BEFORE THE AUTOMATED LOAD (#38-new).</w:t>
+      </w:r>
+    </w:p>
+    <w:p>
+      <w:pPr>
+        <w:spacing w:line="276" w:lineRule="auto"/>
+      </w:pPr>
+      <w:r>
+        <w:rPr>
+          <w:rFonts w:ascii="Arial" w:hAnsi="Arial"/>
+          <w:sz w:val="28"/>
+        </w:rPr>
+        <w:t xml:space="preserve">   Five points remain: give Skip a real code instead of reading an</w:t>
+      </w:r>
+    </w:p>
+    <w:p>
+      <w:pPr>
+        <w:spacing w:line="276" w:lineRule="auto"/>
+      </w:pPr>
+      <w:r>
+        <w:rPr>
+          <w:rFonts w:ascii="Arial" w:hAnsi="Arial"/>
+          <w:sz w:val="28"/>
+        </w:rPr>
+        <w:t xml:space="preserve">   explanation; keep existing reminders when a saved list cannot be</w:t>
+      </w:r>
+    </w:p>
+    <w:p>
+      <w:pPr>
+        <w:spacing w:line="276" w:lineRule="auto"/>
+      </w:pPr>
+      <w:r>
+        <w:rPr>
+          <w:rFonts w:ascii="Arial" w:hAnsi="Arial"/>
+          <w:sz w:val="28"/>
+        </w:rPr>
+        <w:t xml:space="preserve">   read; run again when a change arrives during a run; replace stale</w:t>
+      </w:r>
+    </w:p>
+    <w:p>
+      <w:pPr>
+        <w:spacing w:line="276" w:lineRule="auto"/>
+      </w:pPr>
+      <w:r>
+        <w:rPr>
+          <w:rFonts w:ascii="Arial" w:hAnsi="Arial"/>
+          <w:sz w:val="28"/>
+        </w:rPr>
+        <w:t xml:space="preserve">   banner words and buttons; and secure a replacement before removing</w:t>
+      </w:r>
+    </w:p>
+    <w:p>
+      <w:pPr>
+        <w:spacing w:line="276" w:lineRule="auto"/>
+      </w:pPr>
+      <w:r>
+        <w:rPr>
+          <w:rFonts w:ascii="Arial" w:hAnsi="Arial"/>
+          <w:sz w:val="28"/>
+        </w:rPr>
+        <w:t xml:space="preserve">   the old reminder. The sixth point, the one-store cutover, landed at</w:t>
+      </w:r>
+    </w:p>
+    <w:p>
+      <w:pPr>
+        <w:spacing w:line="276" w:lineRule="auto"/>
+      </w:pPr>
+      <w:r>
+        <w:rPr>
+          <w:rFonts w:ascii="Arial" w:hAnsi="Arial"/>
+          <w:sz w:val="28"/>
+        </w:rPr>
+        <w:t xml:space="preserve">   #39-new. Each remaining point gets an automated test. The full</w:t>
+      </w:r>
+    </w:p>
+    <w:p>
+      <w:pPr>
+        <w:spacing w:line="276" w:lineRule="auto"/>
+      </w:pPr>
+      <w:r>
+        <w:rPr>
+          <w:rFonts w:ascii="Arial" w:hAnsi="Arial"/>
+          <w:sz w:val="28"/>
+        </w:rPr>
+        <w:t xml:space="preserve">   settled shape is in docs/automated-test-load.md.</w:t>
+      </w:r>
+    </w:p>
+    <w:p>
+      <w:pPr>
+        <w:spacing w:line="276" w:lineRule="auto"/>
+      </w:pPr>
+      <w:r>
+        <w:rPr>
+          <w:rFonts w:ascii="Arial" w:hAnsi="Arial"/>
+          <w:sz w:val="28"/>
+        </w:rPr>
+        <w:t xml:space="preserve">3. LOOK AHEAD: change the tile format, and change or drop the</w:t>
       </w:r>
     </w:p>
     <w:p>
@@ -529,7 +601,7 @@
           <w:rFonts w:ascii="Arial" w:hAnsi="Arial"/>
           <w:sz w:val="28"/>
         </w:rPr>
-        <w:t xml:space="preserve">5. TIMER: add a Stop (Pause) / Continue (Go) button to the tile,</w:t>
+        <w:t xml:space="preserve">4. TIMER: add a Stop (Pause) / Continue (Go) button to the tile,</w:t>
       </w:r>
     </w:p>
     <w:p>
@@ -674,67 +746,43 @@
           <w:rFonts w:ascii="Arial" w:hAnsi="Arial"/>
           <w:sz w:val="28"/>
         </w:rPr>
-        <w:t xml:space="preserve">2. EVERYTHING BUILT SINCE THE LAST PHONE LOAD IS UNPROVED. The</w:t>
-      </w:r>
-    </w:p>
-    <w:p>
-      <w:pPr>
-        <w:spacing w:line="276" w:lineRule="auto"/>
-      </w:pPr>
-      <w:r>
-        <w:rPr>
-          <w:rFonts w:ascii="Arial" w:hAnsi="Arial"/>
-          <w:sz w:val="28"/>
-        </w:rPr>
-        <w:t xml:space="preserve">   engine on your phone is from an earlier build. One reminder per</w:t>
-      </w:r>
-    </w:p>
-    <w:p>
-      <w:pPr>
-        <w:spacing w:line="276" w:lineRule="auto"/>
-      </w:pPr>
-      <w:r>
-        <w:rPr>
-          <w:rFonts w:ascii="Arial" w:hAnsi="Arial"/>
-          <w:sz w:val="28"/>
-        </w:rPr>
-        <w:t xml:space="preserve">   item instead of two, a ticked weekly chore staying quiet, the</w:t>
-      </w:r>
-    </w:p>
-    <w:p>
-      <w:pPr>
-        <w:spacing w:line="276" w:lineRule="auto"/>
-      </w:pPr>
-      <w:r>
-        <w:rPr>
-          <w:rFonts w:ascii="Arial" w:hAnsi="Arial"/>
-          <w:sz w:val="28"/>
-        </w:rPr>
-        <w:t xml:space="preserve">   eight o'clock To-Do banner gone, skip and time zones — none of</w:t>
-      </w:r>
-    </w:p>
-    <w:p>
-      <w:pPr>
-        <w:spacing w:line="276" w:lineRule="auto"/>
-      </w:pPr>
-      <w:r>
-        <w:rPr>
-          <w:rFonts w:ascii="Arial" w:hAnsi="Arial"/>
-          <w:sz w:val="28"/>
-        </w:rPr>
-        <w:t xml:space="preserve">   it has been on the phone. Nothing goes on until the reminder</w:t>
-      </w:r>
-    </w:p>
-    <w:p>
-      <w:pPr>
-        <w:spacing w:line="276" w:lineRule="auto"/>
-      </w:pPr>
-      <w:r>
-        <w:rPr>
-          <w:rFonts w:ascii="Arial" w:hAnsi="Arial"/>
-          <w:sz w:val="28"/>
-        </w:rPr>
-        <w:t xml:space="preserve">   work is whole, which was your own call.</w:t>
+        <w:t xml:space="preserve">2. EVERYTHING BUILT SINCE THE LAST PHONE LOAD IS UNPROVED. He is</w:t>
+      </w:r>
+    </w:p>
+    <w:p>
+      <w:pPr>
+        <w:spacing w:line="276" w:lineRule="auto"/>
+      </w:pPr>
+      <w:r>
+        <w:rPr>
+          <w:rFonts w:ascii="Arial" w:hAnsi="Arial"/>
+          <w:sz w:val="28"/>
+        </w:rPr>
+        <w:t xml:space="preserve">   loading this build now (#37-new) to live with it for a few weeks.</w:t>
+      </w:r>
+    </w:p>
+    <w:p>
+      <w:pPr>
+        <w:spacing w:line="276" w:lineRule="auto"/>
+      </w:pPr>
+      <w:r>
+        <w:rPr>
+          <w:rFonts w:ascii="Arial" w:hAnsi="Arial"/>
+          <w:sz w:val="28"/>
+        </w:rPr>
+        <w:t xml:space="preserve">   Holidays and Float do not yet change when a reminder fires. The</w:t>
+      </w:r>
+    </w:p>
+    <w:p>
+      <w:pPr>
+        <w:spacing w:line="276" w:lineRule="auto"/>
+      </w:pPr>
+      <w:r>
+        <w:rPr>
+          <w:rFonts w:ascii="Arial" w:hAnsi="Arial"/>
+          <w:sz w:val="28"/>
+        </w:rPr>
+        <w:t xml:space="preserve">   engine on the phone until this load was from an earlier build.</w:t>
       </w:r>
     </w:p>
     <w:p>
@@ -1022,103 +1070,67 @@
           <w:rFonts w:ascii="Arial" w:hAnsi="Arial"/>
           <w:sz w:val="28"/>
         </w:rPr>
-        <w:t xml:space="preserve">9. SIRI MARKS SOMETHING DONE WITHOUT TELLING THE MODULE. It writes</w:t>
-      </w:r>
-    </w:p>
-    <w:p>
-      <w:pPr>
-        <w:spacing w:line="276" w:lineRule="auto"/>
-      </w:pPr>
-      <w:r>
-        <w:rPr>
-          <w:rFonts w:ascii="Arial" w:hAnsi="Arial"/>
-          <w:sz w:val="28"/>
-        </w:rPr>
-        <w:t xml:space="preserve">   the item, writes the log, sends you to My Day — and nothing</w:t>
-      </w:r>
-    </w:p>
-    <w:p>
-      <w:pPr>
-        <w:spacing w:line="276" w:lineRule="auto"/>
-      </w:pPr>
-      <w:r>
-        <w:rPr>
-          <w:rFonts w:ascii="Arial" w:hAnsi="Arial"/>
-          <w:sz w:val="28"/>
-        </w:rPr>
-        <w:t xml:space="preserve">   re-works the reminders. It also leaves any snooze in place.</w:t>
-      </w:r>
-    </w:p>
-    <w:p>
-      <w:pPr>
-        <w:spacing w:line="276" w:lineRule="auto"/>
-      </w:pPr>
-      <w:r>
-        <w:rPr>
-          <w:rFonts w:ascii="Arial" w:hAnsi="Arial"/>
-          <w:sz w:val="28"/>
-        </w:rPr>
-        <w:t xml:space="preserve">10. RETIRING THE OLD READERS. The live run no longer calls them,</w:t>
-      </w:r>
-    </w:p>
-    <w:p>
-      <w:pPr>
-        <w:spacing w:line="276" w:lineRule="auto"/>
-      </w:pPr>
-      <w:r>
-        <w:rPr>
-          <w:rFonts w:ascii="Arial" w:hAnsi="Arial"/>
-          <w:sz w:val="28"/>
-        </w:rPr>
-        <w:t xml:space="preserve">    but they stay in the project until each replacement is proved</w:t>
-      </w:r>
-    </w:p>
-    <w:p>
-      <w:pPr>
-        <w:spacing w:line="276" w:lineRule="auto"/>
-      </w:pPr>
-      <w:r>
-        <w:rPr>
-          <w:rFonts w:ascii="Arial" w:hAnsi="Arial"/>
-          <w:sz w:val="28"/>
-        </w:rPr>
-        <w:t xml:space="preserve">    on the phone. That order is yours, from #19-new.</w:t>
-      </w:r>
-    </w:p>
-    <w:p>
-      <w:pPr>
-        <w:spacing w:line="276" w:lineRule="auto"/>
-      </w:pPr>
-      <w:r>
-        <w:rPr>
-          <w:rFonts w:ascii="Arial" w:hAnsi="Arial"/>
-          <w:sz w:val="28"/>
-        </w:rPr>
-        <w:t xml:space="preserve">11. THE MISSED-FIRING NOTICE COVERS MY DAY AND PETS ONLY. My Week,</w:t>
-      </w:r>
-    </w:p>
-    <w:p>
-      <w:pPr>
-        <w:spacing w:line="276" w:lineRule="auto"/>
-      </w:pPr>
-      <w:r>
-        <w:rPr>
-          <w:rFonts w:ascii="Arial" w:hAnsi="Arial"/>
-          <w:sz w:val="28"/>
-        </w:rPr>
-        <w:t xml:space="preserve">    Look Ahead and To-Do record no misses at all. Extending it to</w:t>
-      </w:r>
-    </w:p>
-    <w:p>
-      <w:pPr>
-        <w:spacing w:line="276" w:lineRule="auto"/>
-      </w:pPr>
-      <w:r>
-        <w:rPr>
-          <w:rFonts w:ascii="Arial" w:hAnsi="Arial"/>
-          <w:sz w:val="28"/>
-        </w:rPr>
-        <w:t xml:space="preserve">    those three is real work still to do.</w:t>
+        <w:t xml:space="preserve">9. RETIRING THE OLD READERS. The live run does not call them. They</w:t>
+      </w:r>
+    </w:p>
+    <w:p>
+      <w:pPr>
+        <w:spacing w:line="276" w:lineRule="auto"/>
+      </w:pPr>
+      <w:r>
+        <w:rPr>
+          <w:rFonts w:ascii="Arial" w:hAnsi="Arial"/>
+          <w:sz w:val="28"/>
+        </w:rPr>
+        <w:t xml:space="preserve">   stay in the project until each replacement is proved on the phone.</w:t>
+      </w:r>
+    </w:p>
+    <w:p>
+      <w:pPr>
+        <w:spacing w:line="276" w:lineRule="auto"/>
+      </w:pPr>
+      <w:r>
+        <w:rPr>
+          <w:rFonts w:ascii="Arial" w:hAnsi="Arial"/>
+          <w:sz w:val="28"/>
+        </w:rPr>
+        <w:t xml:space="preserve">   That order is yours, from #19-new, restated at #39-new.</w:t>
+      </w:r>
+    </w:p>
+    <w:p>
+      <w:pPr>
+        <w:spacing w:line="276" w:lineRule="auto"/>
+      </w:pPr>
+      <w:r>
+        <w:rPr>
+          <w:rFonts w:ascii="Arial" w:hAnsi="Arial"/>
+          <w:sz w:val="28"/>
+        </w:rPr>
+        <w:t xml:space="preserve">10. THE MISSED-FIRING NOTICE COVERS DAILY ITEMS ONLY. Weekly, Monthly,</w:t>
+      </w:r>
+    </w:p>
+    <w:p>
+      <w:pPr>
+        <w:spacing w:line="276" w:lineRule="auto"/>
+      </w:pPr>
+      <w:r>
+        <w:rPr>
+          <w:rFonts w:ascii="Arial" w:hAnsi="Arial"/>
+          <w:sz w:val="28"/>
+        </w:rPr>
+        <w:t xml:space="preserve">    Quarterly, Yearly and One Time record no misses at all. Extending</w:t>
+      </w:r>
+    </w:p>
+    <w:p>
+      <w:pPr>
+        <w:spacing w:line="276" w:lineRule="auto"/>
+      </w:pPr>
+      <w:r>
+        <w:rPr>
+          <w:rFonts w:ascii="Arial" w:hAnsi="Arial"/>
+          <w:sz w:val="28"/>
+        </w:rPr>
+        <w:t xml:space="preserve">    it is real work still to do.</w:t>
       </w:r>
     </w:p>
     <w:p>
@@ -1263,43 +1275,31 @@
           <w:rFonts w:ascii="Arial" w:hAnsi="Arial"/>
           <w:sz w:val="28"/>
         </w:rPr>
-        <w:t xml:space="preserve">2. + ADD OPENS FROM THE BUTTON THE PAGES ALREADY HAVE. It asks only</w:t>
-      </w:r>
-    </w:p>
-    <w:p>
-      <w:pPr>
-        <w:spacing w:line="276" w:lineRule="auto"/>
-      </w:pPr>
-      <w:r>
-        <w:rPr>
-          <w:rFonts w:ascii="Arial" w:hAnsi="Arial"/>
-          <w:sz w:val="28"/>
-        </w:rPr>
-        <w:t xml:space="preserve">   where the new item belongs; you fill in that page's own small</w:t>
-      </w:r>
-    </w:p>
-    <w:p>
-      <w:pPr>
-        <w:spacing w:line="276" w:lineRule="auto"/>
-      </w:pPr>
-      <w:r>
-        <w:rPr>
-          <w:rFonts w:ascii="Arial" w:hAnsi="Arial"/>
-          <w:sz w:val="28"/>
-        </w:rPr>
-        <w:t xml:space="preserve">   form, then you come back to where you were, with the page you</w:t>
-      </w:r>
-    </w:p>
-    <w:p>
-      <w:pPr>
-        <w:spacing w:line="276" w:lineRule="auto"/>
-      </w:pPr>
-      <w:r>
-        <w:rPr>
-          <w:rFonts w:ascii="Arial" w:hAnsi="Arial"/>
-          <w:sz w:val="28"/>
-        </w:rPr>
-        <w:t xml:space="preserve">   were on already chosen. No new control is added anywhere.</w:t>
+        <w:t xml:space="preserve">2. + ADD ON A PAGE GOES TO THAT PAGE'S OWN NEW. Where does it</w:t>
+      </w:r>
+    </w:p>
+    <w:p>
+      <w:pPr>
+        <w:spacing w:line="276" w:lineRule="auto"/>
+      </w:pPr>
+      <w:r>
+        <w:rPr>
+          <w:rFonts w:ascii="Arial" w:hAnsi="Arial"/>
+          <w:sz w:val="28"/>
+        </w:rPr>
+        <w:t xml:space="preserve">   belong? is only on Options, from + Screen. You do not set</w:t>
+      </w:r>
+    </w:p>
+    <w:p>
+      <w:pPr>
+        <w:spacing w:line="276" w:lineRule="auto"/>
+      </w:pPr>
+      <w:r>
+        <w:rPr>
+          <w:rFonts w:ascii="Arial" w:hAnsi="Arial"/>
+          <w:sz w:val="28"/>
+        </w:rPr>
+        <w:t xml:space="preserve">   another page from a different page (#36-new).</w:t>
       </w:r>
     </w:p>
     <w:p>
@@ -1395,7 +1395,7 @@
           <w:rFonts w:ascii="Arial" w:hAnsi="Arial"/>
           <w:sz w:val="28"/>
         </w:rPr>
-        <w:t xml:space="preserve">   To-Do, which has the Log, not Daily. A My Day banner now opens</w:t>
+        <w:t xml:space="preserve">   One Time, which has the Log, not Daily. A My Day banner now opens</w:t>
       </w:r>
     </w:p>
     <w:p>
@@ -1419,7 +1419,7 @@
           <w:rFonts w:ascii="Arial" w:hAnsi="Arial"/>
           <w:sz w:val="28"/>
         </w:rPr>
-        <w:t xml:space="preserve">   (My Log, the same saved list). The My Day page is gone; an old</w:t>
+        <w:t xml:space="preserve">   (Log, the same saved list). The My Day page is gone; an old</w:t>
       </w:r>
     </w:p>
     <w:p>
@@ -1840,7 +1840,247 @@
           <w:rFonts w:ascii="Arial" w:hAnsi="Arial"/>
           <w:sz w:val="28"/>
         </w:rPr>
-        <w:t xml:space="preserve">1. #34-new — Weekly through Options and the + Add popup built.</w:t>
+        <w:t xml:space="preserve">1. #39-new — the live one-store cutover. Pages, banners and Siri write</w:t>
+      </w:r>
+    </w:p>
+    <w:p>
+      <w:pPr>
+        <w:spacing w:line="276" w:lineRule="auto"/>
+      </w:pPr>
+      <w:r>
+        <w:rPr>
+          <w:rFonts w:ascii="Arial" w:hAnsi="Arial"/>
+          <w:sz w:val="28"/>
+        </w:rPr>
+        <w:t xml:space="preserve">   one list. The scheduler reads it. Dual-write is gone. Siri now</w:t>
+      </w:r>
+    </w:p>
+    <w:p>
+      <w:pPr>
+        <w:spacing w:line="276" w:lineRule="auto"/>
+      </w:pPr>
+      <w:r>
+        <w:rPr>
+          <w:rFonts w:ascii="Arial" w:hAnsi="Arial"/>
+          <w:sz w:val="28"/>
+        </w:rPr>
+        <w:t xml:space="preserve">   tells the module. Old reader files stay until the phone proof.</w:t>
+      </w:r>
+    </w:p>
+    <w:p>
+      <w:pPr>
+        <w:spacing w:line="276" w:lineRule="auto"/>
+      </w:pPr>
+      <w:r>
+        <w:rPr>
+          <w:rFonts w:ascii="Arial" w:hAnsi="Arial"/>
+          <w:sz w:val="28"/>
+        </w:rPr>
+        <w:t xml:space="preserve">2. #38-new — the engine and Options path read end to end. The core</w:t>
+      </w:r>
+    </w:p>
+    <w:p>
+      <w:pPr>
+        <w:spacing w:line="276" w:lineRule="auto"/>
+      </w:pPr>
+      <w:r>
+        <w:rPr>
+          <w:rFonts w:ascii="Arial" w:hAnsi="Arial"/>
+          <w:sz w:val="28"/>
+        </w:rPr>
+        <w:t xml:space="preserve">   remains one fixed road. The automated load, six hardening points,</w:t>
+      </w:r>
+    </w:p>
+    <w:p>
+      <w:pPr>
+        <w:spacing w:line="276" w:lineRule="auto"/>
+      </w:pPr>
+      <w:r>
+        <w:rPr>
+          <w:rFonts w:ascii="Arial" w:hAnsi="Arial"/>
+          <w:sz w:val="28"/>
+        </w:rPr>
+        <w:t xml:space="preserve">   Option mappings, and the clean one-store cutover with proof against</w:t>
+      </w:r>
+    </w:p>
+    <w:p>
+      <w:pPr>
+        <w:spacing w:line="276" w:lineRule="auto"/>
+      </w:pPr>
+      <w:r>
+        <w:rPr>
+          <w:rFonts w:ascii="Arial" w:hAnsi="Arial"/>
+          <w:sz w:val="28"/>
+        </w:rPr>
+        <w:t xml:space="preserve">   absent old stores are recorded. No code changed.</w:t>
+      </w:r>
+    </w:p>
+    <w:p>
+      <w:pPr>
+        <w:spacing w:line="276" w:lineRule="auto"/>
+      </w:pPr>
+      <w:r>
+        <w:rPr>
+          <w:rFonts w:ascii="Arial" w:hAnsi="Arial"/>
+          <w:sz w:val="28"/>
+        </w:rPr>
+        <w:t xml:space="preserve">3. #37-new — Options connecting: + OPT writes the cases that apply,</w:t>
+      </w:r>
+    </w:p>
+    <w:p>
+      <w:pPr>
+        <w:spacing w:line="276" w:lineRule="auto"/>
+      </w:pPr>
+      <w:r>
+        <w:rPr>
+          <w:rFonts w:ascii="Arial" w:hAnsi="Arial"/>
+          <w:sz w:val="28"/>
+        </w:rPr>
+        <w:t xml:space="preserve">   Note is on New and Edit, Skip is off Options. Per-kind sets are</w:t>
+      </w:r>
+    </w:p>
+    <w:p>
+      <w:pPr>
+        <w:spacing w:line="276" w:lineRule="auto"/>
+      </w:pPr>
+      <w:r>
+        <w:rPr>
+          <w:rFonts w:ascii="Arial" w:hAnsi="Arial"/>
+          <w:sz w:val="28"/>
+        </w:rPr>
+        <w:t xml:space="preserve">   in. Engine does not read the fields yet. He is loading the phone.</w:t>
+      </w:r>
+    </w:p>
+    <w:p>
+      <w:pPr>
+        <w:spacing w:line="276" w:lineRule="auto"/>
+      </w:pPr>
+      <w:r>
+        <w:rPr>
+          <w:rFonts w:ascii="Arial" w:hAnsi="Arial"/>
+          <w:sz w:val="28"/>
+        </w:rPr>
+        <w:t xml:space="preserve">4. #36-new — logs on Weekly, Monthly, Quarterly, Yearly, One Time,</w:t>
+      </w:r>
+    </w:p>
+    <w:p>
+      <w:pPr>
+        <w:spacing w:line="276" w:lineRule="auto"/>
+      </w:pPr>
+      <w:r>
+        <w:rPr>
+          <w:rFonts w:ascii="Arial" w:hAnsi="Arial"/>
+          <w:sz w:val="28"/>
+        </w:rPr>
+        <w:t xml:space="preserve">   and Extended. Weekly uses My Week's list; Monthly, Quarterly,</w:t>
+      </w:r>
+    </w:p>
+    <w:p>
+      <w:pPr>
+        <w:spacing w:line="276" w:lineRule="auto"/>
+      </w:pPr>
+      <w:r>
+        <w:rPr>
+          <w:rFonts w:ascii="Arial" w:hAnsi="Arial"/>
+          <w:sz w:val="28"/>
+        </w:rPr>
+        <w:t xml:space="preserve">   and Yearly share Look Ahead's; One Time and Extended each have</w:t>
+      </w:r>
+    </w:p>
+    <w:p>
+      <w:pPr>
+        <w:spacing w:line="276" w:lineRule="auto"/>
+      </w:pPr>
+      <w:r>
+        <w:rPr>
+          <w:rFonts w:ascii="Arial" w:hAnsi="Arial"/>
+          <w:sz w:val="28"/>
+        </w:rPr>
+        <w:t xml:space="preserve">   their own. They travel in the backup. The log title is Log, not</w:t>
+      </w:r>
+    </w:p>
+    <w:p>
+      <w:pPr>
+        <w:spacing w:line="276" w:lineRule="auto"/>
+      </w:pPr>
+      <w:r>
+        <w:rPr>
+          <w:rFonts w:ascii="Arial" w:hAnsi="Arial"/>
+          <w:sz w:val="28"/>
+        </w:rPr>
+        <w:t xml:space="preserve">   My Log. Home no longer warns when the stack is already empty.</w:t>
+      </w:r>
+    </w:p>
+    <w:p>
+      <w:pPr>
+        <w:spacing w:line="276" w:lineRule="auto"/>
+      </w:pPr>
+      <w:r>
+        <w:rPr>
+          <w:rFonts w:ascii="Arial" w:hAnsi="Arial"/>
+          <w:sz w:val="28"/>
+        </w:rPr>
+        <w:t xml:space="preserve">   The 24-hour box opens a four-digit spinner. AM/PM removal is</w:t>
+      </w:r>
+    </w:p>
+    <w:p>
+      <w:pPr>
+        <w:spacing w:line="276" w:lineRule="auto"/>
+      </w:pPr>
+      <w:r>
+        <w:rPr>
+          <w:rFonts w:ascii="Arial" w:hAnsi="Arial"/>
+          <w:sz w:val="28"/>
+        </w:rPr>
+        <w:t xml:space="preserve">   mitigated by that spinner and is not a separate job.</w:t>
+      </w:r>
+    </w:p>
+    <w:p>
+      <w:pPr>
+        <w:spacing w:line="276" w:lineRule="auto"/>
+      </w:pPr>
+      <w:r>
+        <w:rPr>
+          <w:rFonts w:ascii="Arial" w:hAnsi="Arial"/>
+          <w:sz w:val="28"/>
+        </w:rPr>
+        <w:t xml:space="preserve">5. #35-new — old screens out, including the `/myday` hop. Backup</w:t>
+      </w:r>
+    </w:p>
+    <w:p>
+      <w:pPr>
+        <w:spacing w:line="276" w:lineRule="auto"/>
+      </w:pPr>
+      <w:r>
+        <w:rPr>
+          <w:rFonts w:ascii="Arial" w:hAnsi="Arial"/>
+          <w:sz w:val="28"/>
+        </w:rPr>
+        <w:t xml:space="preserve">   copies the new list, not the old ones. Logs on the other new</w:t>
+      </w:r>
+    </w:p>
+    <w:p>
+      <w:pPr>
+        <w:spacing w:line="276" w:lineRule="auto"/>
+      </w:pPr>
+      <w:r>
+        <w:rPr>
+          <w:rFonts w:ascii="Arial" w:hAnsi="Arial"/>
+          <w:sz w:val="28"/>
+        </w:rPr>
+        <w:t xml:space="preserve">   pages are next.</w:t>
+      </w:r>
+    </w:p>
+    <w:p>
+      <w:pPr>
+        <w:spacing w:line="276" w:lineRule="auto"/>
+      </w:pPr>
+      <w:r>
+        <w:rPr>
+          <w:rFonts w:ascii="Arial" w:hAnsi="Arial"/>
+          <w:sz w:val="28"/>
+        </w:rPr>
+        <w:t xml:space="preserve">6. #34-new — Weekly through Options and the + Add popup built.</w:t>
       </w:r>
     </w:p>
     <w:p>
@@ -1876,7 +2116,7 @@
           <w:rFonts w:ascii="Arial" w:hAnsi="Arial"/>
           <w:sz w:val="28"/>
         </w:rPr>
-        <w:t xml:space="preserve">2. #33-new — Daily built. Snooze, Done, hold-and-slide reorder, My</w:t>
+        <w:t xml:space="preserve">7. #33-new — Daily built. Snooze, Done, hold-and-slide reorder, My</w:t>
       </w:r>
     </w:p>
     <w:p>
@@ -1912,7 +2152,7 @@
           <w:rFonts w:ascii="Arial" w:hAnsi="Arial"/>
           <w:sz w:val="28"/>
         </w:rPr>
-        <w:t xml:space="preserve">3. #32-new — the pages phase spec, and Daily's first job sheet.</w:t>
+        <w:t xml:space="preserve">8. #32-new — the pages phase spec, and Daily's first job sheet.</w:t>
       </w:r>
     </w:p>
     <w:p>
@@ -1936,7 +2176,7 @@
           <w:rFonts w:ascii="Arial" w:hAnsi="Arial"/>
           <w:sz w:val="28"/>
         </w:rPr>
-        <w:t xml:space="preserve">4. #31-new — the record itself put right. The hand-off file went</w:t>
+        <w:t xml:space="preserve">9. #31-new — the record itself put right. The hand-off file went</w:t>
       </w:r>
     </w:p>
     <w:p>
@@ -2032,7 +2272,7 @@
           <w:rFonts w:ascii="Arial" w:hAnsi="Arial"/>
           <w:sz w:val="28"/>
         </w:rPr>
-        <w:t xml:space="preserve">5. #30-new — the reminder pages named and shaped, and the one Input</w:t>
+        <w:t xml:space="preserve">10. #30-new — the reminder pages named and shaped, and the one Input</w:t>
       </w:r>
     </w:p>
     <w:p>
@@ -2056,7 +2296,7 @@
           <w:rFonts w:ascii="Arial" w:hAnsi="Arial"/>
           <w:sz w:val="28"/>
         </w:rPr>
-        <w:t xml:space="preserve">6. #28-new — the engine gained repeat groups, skip, and time zones</w:t>
+        <w:t xml:space="preserve">11. #28-new — the engine gained repeat groups, skip, and time zones</w:t>
       </w:r>
     </w:p>
     <w:p>
@@ -2080,7 +2320,7 @@
           <w:rFonts w:ascii="Arial" w:hAnsi="Arial"/>
           <w:sz w:val="28"/>
         </w:rPr>
-        <w:t xml:space="preserve">7. #27-new — all five reminder screens went onto the one machine,</w:t>
+        <w:t xml:space="preserve">12. #27-new — all five reminder screens went onto the one machine,</w:t>
       </w:r>
     </w:p>
     <w:p>
@@ -2140,7 +2380,7 @@
           <w:rFonts w:ascii="Arial" w:hAnsi="Arial"/>
           <w:sz w:val="28"/>
         </w:rPr>
-        <w:t xml:space="preserve">8. #26-new — the per-screen translators became one translator and a</w:t>
+        <w:t xml:space="preserve">13. #26-new — the per-screen translators became one translator and a</w:t>
       </w:r>
     </w:p>
     <w:p>
@@ -2164,7 +2404,7 @@
           <w:rFonts w:ascii="Arial" w:hAnsi="Arial"/>
           <w:sz w:val="28"/>
         </w:rPr>
-        <w:t xml:space="preserve">9. #24-new and #25-new — the first two translators, My Day and</w:t>
+        <w:t xml:space="preserve">14. #24-new and #25-new — the first two translators, My Day and</w:t>
       </w:r>
     </w:p>
     <w:p>
@@ -2200,7 +2440,7 @@
           <w:rFonts w:ascii="Arial" w:hAnsi="Arial"/>
           <w:sz w:val="28"/>
         </w:rPr>
-        <w:t xml:space="preserve">10. #23-new — the common shape and the two decision blocks built and</w:t>
+        <w:t xml:space="preserve">15. #23-new — the common shape and the two decision blocks built and</w:t>
       </w:r>
     </w:p>
     <w:p>
@@ -2224,7 +2464,7 @@
           <w:rFonts w:ascii="Arial" w:hAnsi="Arial"/>
           <w:sz w:val="28"/>
         </w:rPr>
-        <w:t xml:space="preserve">11. #22-new — the field names settled, and setting reminders two</w:t>
+        <w:t xml:space="preserve">16. #22-new — the field names settled, and setting reminders two</w:t>
       </w:r>
     </w:p>
     <w:p>
@@ -2248,7 +2488,7 @@
           <w:rFonts w:ascii="Arial" w:hAnsi="Arial"/>
           <w:sz w:val="28"/>
         </w:rPr>
-        <w:t xml:space="preserve">12. #21-new — the common shape settled on paper, all five screens</w:t>
+        <w:t xml:space="preserve">17. #21-new — the common shape settled on paper, all five screens</w:t>
       </w:r>
     </w:p>
     <w:p>
@@ -2272,7 +2512,7 @@
           <w:rFonts w:ascii="Arial" w:hAnsi="Arial"/>
           <w:sz w:val="28"/>
         </w:rPr>
-        <w:t xml:space="preserve">13. #20-new — My Week's Delay written down like the others, and the</w:t>
+        <w:t xml:space="preserve">18. #20-new — My Week's Delay written down like the others, and the</w:t>
       </w:r>
     </w:p>
     <w:p>
@@ -2296,7 +2536,7 @@
           <w:rFonts w:ascii="Arial" w:hAnsi="Arial"/>
           <w:sz w:val="28"/>
         </w:rPr>
-        <w:t xml:space="preserve">14. #19-new — your epiphany: one shape instead of six, the reminder</w:t>
+        <w:t xml:space="preserve">19. #19-new — your epiphany: one shape instead of six, the reminder</w:t>
       </w:r>
     </w:p>
     <w:p>
@@ -2320,7 +2560,7 @@
           <w:rFonts w:ascii="Arial" w:hAnsi="Arial"/>
           <w:sz w:val="28"/>
         </w:rPr>
-        <w:t xml:space="preserve">15. #18-new — the outsider's report checked. The answer was mend</w:t>
+        <w:t xml:space="preserve">20. #18-new — the outsider's report checked. The answer was mend</w:t>
       </w:r>
     </w:p>
     <w:p>
@@ -2356,7 +2596,7 @@
           <w:rFonts w:ascii="Arial" w:hAnsi="Arial"/>
           <w:sz w:val="28"/>
         </w:rPr>
-        <w:t xml:space="preserve">16. #15-new to #17-new — the failure pop-up and the missed-firing</w:t>
+        <w:t xml:space="preserve">21. #15-new to #17-new — the failure pop-up and the missed-firing</w:t>
       </w:r>
     </w:p>
     <w:p>
@@ -2392,7 +2632,7 @@
           <w:rFonts w:ascii="Arial" w:hAnsi="Arial"/>
           <w:sz w:val="28"/>
         </w:rPr>
-        <w:t xml:space="preserve">17. #13-new and #14-new — tapping a reminder lands on its own item</w:t>
+        <w:t xml:space="preserve">22. #13-new and #14-new — tapping a reminder lands on its own item</w:t>
       </w:r>
     </w:p>
     <w:p>
@@ -2416,7 +2656,7 @@
           <w:rFonts w:ascii="Arial" w:hAnsi="Arial"/>
           <w:sz w:val="28"/>
         </w:rPr>
-        <w:t xml:space="preserve">18. #12-new — the Scheduled Reminders screen, showing every</w:t>
+        <w:t xml:space="preserve">23. #12-new — the Scheduled Reminders screen, showing every</w:t>
       </w:r>
     </w:p>
     <w:p>
@@ -2440,7 +2680,7 @@
           <w:rFonts w:ascii="Arial" w:hAnsi="Arial"/>
           <w:sz w:val="28"/>
         </w:rPr>
-        <w:t xml:space="preserve">19. #6-new to #12-new — the scheduler built in eight steps, so one</w:t>
+        <w:t xml:space="preserve">24. #6-new to #12-new — the scheduler built in eight steps, so one</w:t>
       </w:r>
     </w:p>
     <w:p>
@@ -2464,7 +2704,7 @@
           <w:rFonts w:ascii="Arial" w:hAnsi="Arial"/>
           <w:sz w:val="28"/>
         </w:rPr>
-        <w:t xml:space="preserve">20. #4-new — the first notification fixes. Real, and kept, but not</w:t>
+        <w:t xml:space="preserve">25. #4-new — the first notification fixes. Real, and kept, but not</w:t>
       </w:r>
     </w:p>
     <w:p>

</xml_diff>

<commit_message>
40-new. Connecting Options to the engine, and the five remaining hardening points.
</commit_message>
<xml_diff>
--- a/docs/pending.docx
+++ b/docs/pending.docx
@@ -24,7 +24,7 @@
           <w:rFonts w:ascii="Arial" w:hAnsi="Arial"/>
           <w:sz w:val="28"/>
         </w:rPr>
-        <w:t xml:space="preserve">Last updated: 2026-08-30 (#39-new)</w:t>
+        <w:t xml:space="preserve">Last updated: 2026-08-30 (#40-new)</w:t>
       </w:r>
     </w:p>
     <w:p>
@@ -337,31 +337,43 @@
           <w:rFonts w:ascii="Arial" w:hAnsi="Arial"/>
           <w:sz w:val="28"/>
         </w:rPr>
-        <w:t xml:space="preserve">   before or after. The engine does not do holidays yet, and it does</w:t>
-      </w:r>
-    </w:p>
-    <w:p>
-      <w:pPr>
-        <w:spacing w:line="276" w:lineRule="auto"/>
-      </w:pPr>
-      <w:r>
-        <w:rPr>
-          <w:rFonts w:ascii="Arial" w:hAnsi="Arial"/>
-          <w:sz w:val="28"/>
-        </w:rPr>
-        <w:t xml:space="preserve">   not read the Options fields. The 31st keeping through a short month</w:t>
-      </w:r>
-    </w:p>
-    <w:p>
-      <w:pPr>
-        <w:spacing w:line="276" w:lineRule="auto"/>
-      </w:pPr>
-      <w:r>
-        <w:rPr>
-          <w:rFonts w:ascii="Arial" w:hAnsi="Arial"/>
-          <w:sz w:val="28"/>
-        </w:rPr>
-        <w:t xml:space="preserve">   is an automated-load case. The settled load is in</w:t>
+        <w:t xml:space="preserve">   before or after. The engine now reads a named time zone (#40-new).</w:t>
+      </w:r>
+    </w:p>
+    <w:p>
+      <w:pPr>
+        <w:spacing w:line="276" w:lineRule="auto"/>
+      </w:pPr>
+      <w:r>
+        <w:rPr>
+          <w:rFonts w:ascii="Arial" w:hAnsi="Arial"/>
+          <w:sz w:val="28"/>
+        </w:rPr>
+        <w:t xml:space="preserve">   It still does not do holidays, Float, the extra tap, a second</w:t>
+      </w:r>
+    </w:p>
+    <w:p>
+      <w:pPr>
+        <w:spacing w:line="276" w:lineRule="auto"/>
+      </w:pPr>
+      <w:r>
+        <w:rPr>
+          <w:rFonts w:ascii="Arial" w:hAnsi="Arial"/>
+          <w:sz w:val="28"/>
+        </w:rPr>
+        <w:t xml:space="preserve">   Thursday, or a Wednesday after the 6th. The 31st keeping through a</w:t>
+      </w:r>
+    </w:p>
+    <w:p>
+      <w:pPr>
+        <w:spacing w:line="276" w:lineRule="auto"/>
+      </w:pPr>
+      <w:r>
+        <w:rPr>
+          <w:rFonts w:ascii="Arial" w:hAnsi="Arial"/>
+          <w:sz w:val="28"/>
+        </w:rPr>
+        <w:t xml:space="preserve">   short month is an automated-load case. The settled load is in</w:t>
       </w:r>
     </w:p>
     <w:p>
@@ -433,151 +445,55 @@
           <w:rFonts w:ascii="Arial" w:hAnsi="Arial"/>
           <w:sz w:val="28"/>
         </w:rPr>
-        <w:t xml:space="preserve">   rather than the item. Before the Options-to-engine build, settle</w:t>
-      </w:r>
-    </w:p>
-    <w:p>
-      <w:pPr>
-        <w:spacing w:line="276" w:lineRule="auto"/>
-      </w:pPr>
-      <w:r>
-        <w:rPr>
-          <w:rFonts w:ascii="Arial" w:hAnsi="Arial"/>
-          <w:sz w:val="28"/>
-        </w:rPr>
-        <w:t xml:space="preserve">   what Float off means, whether the monthly patterns may coexist, the</w:t>
-      </w:r>
-    </w:p>
-    <w:p>
-      <w:pPr>
-        <w:spacing w:line="276" w:lineRule="auto"/>
-      </w:pPr>
-      <w:r>
-        <w:rPr>
-          <w:rFonts w:ascii="Arial" w:hAnsi="Arial"/>
-          <w:sz w:val="28"/>
-        </w:rPr>
-        <w:t xml:space="preserve">   order of holiday and missing-day moves, Extended's set, and what</w:t>
-      </w:r>
-    </w:p>
-    <w:p>
-      <w:pPr>
-        <w:spacing w:line="276" w:lineRule="auto"/>
-      </w:pPr>
-      <w:r>
-        <w:rPr>
-          <w:rFonts w:ascii="Arial" w:hAnsi="Arial"/>
-          <w:sz w:val="28"/>
-        </w:rPr>
-        <w:t xml:space="preserve">   Cancel does after + OPT has saved.</w:t>
-      </w:r>
-    </w:p>
-    <w:p>
-      <w:pPr>
-        <w:spacing w:line="276" w:lineRule="auto"/>
-      </w:pPr>
-      <w:r>
-        <w:rPr>
-          <w:rFonts w:ascii="Arial" w:hAnsi="Arial"/>
-          <w:sz w:val="28"/>
-        </w:rPr>
-        <w:t xml:space="preserve">2. HARDEN THE REMINDER ROAD BEFORE THE AUTOMATED LOAD (#38-new).</w:t>
-      </w:r>
-    </w:p>
-    <w:p>
-      <w:pPr>
-        <w:spacing w:line="276" w:lineRule="auto"/>
-      </w:pPr>
-      <w:r>
-        <w:rPr>
-          <w:rFonts w:ascii="Arial" w:hAnsi="Arial"/>
-          <w:sz w:val="28"/>
-        </w:rPr>
-        <w:t xml:space="preserve">   Five points remain: give Skip a real code instead of reading an</w:t>
-      </w:r>
-    </w:p>
-    <w:p>
-      <w:pPr>
-        <w:spacing w:line="276" w:lineRule="auto"/>
-      </w:pPr>
-      <w:r>
-        <w:rPr>
-          <w:rFonts w:ascii="Arial" w:hAnsi="Arial"/>
-          <w:sz w:val="28"/>
-        </w:rPr>
-        <w:t xml:space="preserve">   explanation; keep existing reminders when a saved list cannot be</w:t>
-      </w:r>
-    </w:p>
-    <w:p>
-      <w:pPr>
-        <w:spacing w:line="276" w:lineRule="auto"/>
-      </w:pPr>
-      <w:r>
-        <w:rPr>
-          <w:rFonts w:ascii="Arial" w:hAnsi="Arial"/>
-          <w:sz w:val="28"/>
-        </w:rPr>
-        <w:t xml:space="preserve">   read; run again when a change arrives during a run; replace stale</w:t>
-      </w:r>
-    </w:p>
-    <w:p>
-      <w:pPr>
-        <w:spacing w:line="276" w:lineRule="auto"/>
-      </w:pPr>
-      <w:r>
-        <w:rPr>
-          <w:rFonts w:ascii="Arial" w:hAnsi="Arial"/>
-          <w:sz w:val="28"/>
-        </w:rPr>
-        <w:t xml:space="preserve">   banner words and buttons; and secure a replacement before removing</w:t>
-      </w:r>
-    </w:p>
-    <w:p>
-      <w:pPr>
-        <w:spacing w:line="276" w:lineRule="auto"/>
-      </w:pPr>
-      <w:r>
-        <w:rPr>
-          <w:rFonts w:ascii="Arial" w:hAnsi="Arial"/>
-          <w:sz w:val="28"/>
-        </w:rPr>
-        <w:t xml:space="preserve">   the old reminder. The sixth point, the one-store cutover, landed at</w:t>
-      </w:r>
-    </w:p>
-    <w:p>
-      <w:pPr>
-        <w:spacing w:line="276" w:lineRule="auto"/>
-      </w:pPr>
-      <w:r>
-        <w:rPr>
-          <w:rFonts w:ascii="Arial" w:hAnsi="Arial"/>
-          <w:sz w:val="28"/>
-        </w:rPr>
-        <w:t xml:space="preserve">   #39-new. Each remaining point gets an automated test. The full</w:t>
-      </w:r>
-    </w:p>
-    <w:p>
-      <w:pPr>
-        <w:spacing w:line="276" w:lineRule="auto"/>
-      </w:pPr>
-      <w:r>
-        <w:rPr>
-          <w:rFonts w:ascii="Arial" w:hAnsi="Arial"/>
-          <w:sz w:val="28"/>
-        </w:rPr>
-        <w:t xml:space="preserve">   settled shape is in docs/automated-test-load.md.</w:t>
-      </w:r>
-    </w:p>
-    <w:p>
-      <w:pPr>
-        <w:spacing w:line="276" w:lineRule="auto"/>
-      </w:pPr>
-      <w:r>
-        <w:rPr>
-          <w:rFonts w:ascii="Arial" w:hAnsi="Arial"/>
-          <w:sz w:val="28"/>
-        </w:rPr>
-        <w:t xml:space="preserve">3. LOOK AHEAD: change the tile format, and change or drop the</w:t>
+        <w:t xml:space="preserve">   rather than the item. Before the rest of Options joins the engine,</w:t>
+      </w:r>
+    </w:p>
+    <w:p>
+      <w:pPr>
+        <w:spacing w:line="276" w:lineRule="auto"/>
+      </w:pPr>
+      <w:r>
+        <w:rPr>
+          <w:rFonts w:ascii="Arial" w:hAnsi="Arial"/>
+          <w:sz w:val="28"/>
+        </w:rPr>
+        <w:t xml:space="preserve">   settle what Float off means, whether the monthly patterns may</w:t>
+      </w:r>
+    </w:p>
+    <w:p>
+      <w:pPr>
+        <w:spacing w:line="276" w:lineRule="auto"/>
+      </w:pPr>
+      <w:r>
+        <w:rPr>
+          <w:rFonts w:ascii="Arial" w:hAnsi="Arial"/>
+          <w:sz w:val="28"/>
+        </w:rPr>
+        <w:t xml:space="preserve">   coexist, the order of holiday and missing-day moves, Extended's</w:t>
+      </w:r>
+    </w:p>
+    <w:p>
+      <w:pPr>
+        <w:spacing w:line="276" w:lineRule="auto"/>
+      </w:pPr>
+      <w:r>
+        <w:rPr>
+          <w:rFonts w:ascii="Arial" w:hAnsi="Arial"/>
+          <w:sz w:val="28"/>
+        </w:rPr>
+        <w:t xml:space="preserve">   set, and what Cancel does after + OPT has saved.</w:t>
+      </w:r>
+    </w:p>
+    <w:p>
+      <w:pPr>
+        <w:spacing w:line="276" w:lineRule="auto"/>
+      </w:pPr>
+      <w:r>
+        <w:rPr>
+          <w:rFonts w:ascii="Arial" w:hAnsi="Arial"/>
+          <w:sz w:val="28"/>
+        </w:rPr>
+        <w:t xml:space="preserve">2. LOOK AHEAD: change the tile format, and change or drop the</w:t>
       </w:r>
     </w:p>
     <w:p>
@@ -601,7 +517,7 @@
           <w:rFonts w:ascii="Arial" w:hAnsi="Arial"/>
           <w:sz w:val="28"/>
         </w:rPr>
-        <w:t xml:space="preserve">4. TIMER: add a Stop (Pause) / Continue (Go) button to the tile,</w:t>
+        <w:t xml:space="preserve">3. TIMER: add a Stop (Pause) / Continue (Go) button to the tile,</w:t>
       </w:r>
     </w:p>
     <w:p>
@@ -770,19 +686,31 @@
           <w:rFonts w:ascii="Arial" w:hAnsi="Arial"/>
           <w:sz w:val="28"/>
         </w:rPr>
-        <w:t xml:space="preserve">   Holidays and Float do not yet change when a reminder fires. The</w:t>
-      </w:r>
-    </w:p>
-    <w:p>
-      <w:pPr>
-        <w:spacing w:line="276" w:lineRule="auto"/>
-      </w:pPr>
-      <w:r>
-        <w:rPr>
-          <w:rFonts w:ascii="Arial" w:hAnsi="Arial"/>
-          <w:sz w:val="28"/>
-        </w:rPr>
-        <w:t xml:space="preserve">   engine on the phone until this load was from an earlier build.</w:t>
+        <w:t xml:space="preserve">   Time zone now reaches the engine. Holidays and Float do not yet</w:t>
+      </w:r>
+    </w:p>
+    <w:p>
+      <w:pPr>
+        <w:spacing w:line="276" w:lineRule="auto"/>
+      </w:pPr>
+      <w:r>
+        <w:rPr>
+          <w:rFonts w:ascii="Arial" w:hAnsi="Arial"/>
+          <w:sz w:val="28"/>
+        </w:rPr>
+        <w:t xml:space="preserve">   change when a reminder fires. The engine on the phone until this</w:t>
+      </w:r>
+    </w:p>
+    <w:p>
+      <w:pPr>
+        <w:spacing w:line="276" w:lineRule="auto"/>
+      </w:pPr>
+      <w:r>
+        <w:rPr>
+          <w:rFonts w:ascii="Arial" w:hAnsi="Arial"/>
+          <w:sz w:val="28"/>
+        </w:rPr>
+        <w:t xml:space="preserve">   load was from an earlier build.</w:t>
       </w:r>
     </w:p>
     <w:p>
@@ -1840,7 +1768,79 @@
           <w:rFonts w:ascii="Arial" w:hAnsi="Arial"/>
           <w:sz w:val="28"/>
         </w:rPr>
-        <w:t xml:space="preserve">1. #39-new — the live one-store cutover. Pages, banners and Siri write</w:t>
+        <w:t xml:space="preserve">1. #40-new — five hardening points, and time zone into the engine.</w:t>
+      </w:r>
+    </w:p>
+    <w:p>
+      <w:pPr>
+        <w:spacing w:line="276" w:lineRule="auto"/>
+      </w:pPr>
+      <w:r>
+        <w:rPr>
+          <w:rFonts w:ascii="Arial" w:hAnsi="Arial"/>
+          <w:sz w:val="28"/>
+        </w:rPr>
+        <w:t xml:space="preserve">   Skip is a bit, not an explanation. An unreadable list leaves held</w:t>
+      </w:r>
+    </w:p>
+    <w:p>
+      <w:pPr>
+        <w:spacing w:line="276" w:lineRule="auto"/>
+      </w:pPr>
+      <w:r>
+        <w:rPr>
+          <w:rFonts w:ascii="Arial" w:hAnsi="Arial"/>
+          <w:sz w:val="28"/>
+        </w:rPr>
+        <w:t xml:space="preserve">   reminders on the phone. A save during a run queues one rerun.</w:t>
+      </w:r>
+    </w:p>
+    <w:p>
+      <w:pPr>
+        <w:spacing w:line="276" w:lineRule="auto"/>
+      </w:pPr>
+      <w:r>
+        <w:rPr>
+          <w:rFonts w:ascii="Arial" w:hAnsi="Arial"/>
+          <w:sz w:val="28"/>
+        </w:rPr>
+        <w:t xml:space="preserve">   Banner words and buttons are compared. A replacement is created</w:t>
+      </w:r>
+    </w:p>
+    <w:p>
+      <w:pPr>
+        <w:spacing w:line="276" w:lineRule="auto"/>
+      </w:pPr>
+      <w:r>
+        <w:rPr>
+          <w:rFonts w:ascii="Arial" w:hAnsi="Arial"/>
+          <w:sz w:val="28"/>
+        </w:rPr>
+        <w:t xml:space="preserve">   before the old one is removed. A named time zone is read. The</w:t>
+      </w:r>
+    </w:p>
+    <w:p>
+      <w:pPr>
+        <w:spacing w:line="276" w:lineRule="auto"/>
+      </w:pPr>
+      <w:r>
+        <w:rPr>
+          <w:rFonts w:ascii="Arial" w:hAnsi="Arial"/>
+          <w:sz w:val="28"/>
+        </w:rPr>
+        <w:t xml:space="preserve">   other Options fields still wait.</w:t>
+      </w:r>
+    </w:p>
+    <w:p>
+      <w:pPr>
+        <w:spacing w:line="276" w:lineRule="auto"/>
+      </w:pPr>
+      <w:r>
+        <w:rPr>
+          <w:rFonts w:ascii="Arial" w:hAnsi="Arial"/>
+          <w:sz w:val="28"/>
+        </w:rPr>
+        <w:t xml:space="preserve">2. #39-new — the live one-store cutover. Pages, banners and Siri write</w:t>
       </w:r>
     </w:p>
     <w:p>
@@ -1876,7 +1876,7 @@
           <w:rFonts w:ascii="Arial" w:hAnsi="Arial"/>
           <w:sz w:val="28"/>
         </w:rPr>
-        <w:t xml:space="preserve">2. #38-new — the engine and Options path read end to end. The core</w:t>
+        <w:t xml:space="preserve">3. #38-new — the engine and Options path read end to end. The core</w:t>
       </w:r>
     </w:p>
     <w:p>
@@ -1924,7 +1924,7 @@
           <w:rFonts w:ascii="Arial" w:hAnsi="Arial"/>
           <w:sz w:val="28"/>
         </w:rPr>
-        <w:t xml:space="preserve">3. #37-new — Options connecting: + OPT writes the cases that apply,</w:t>
+        <w:t xml:space="preserve">4. #37-new — Options connecting: + OPT writes the cases that apply,</w:t>
       </w:r>
     </w:p>
     <w:p>
@@ -1960,7 +1960,7 @@
           <w:rFonts w:ascii="Arial" w:hAnsi="Arial"/>
           <w:sz w:val="28"/>
         </w:rPr>
-        <w:t xml:space="preserve">4. #36-new — logs on Weekly, Monthly, Quarterly, Yearly, One Time,</w:t>
+        <w:t xml:space="preserve">5. #36-new — logs on Weekly, Monthly, Quarterly, Yearly, One Time,</w:t>
       </w:r>
     </w:p>
     <w:p>
@@ -2044,7 +2044,7 @@
           <w:rFonts w:ascii="Arial" w:hAnsi="Arial"/>
           <w:sz w:val="28"/>
         </w:rPr>
-        <w:t xml:space="preserve">5. #35-new — old screens out, including the `/myday` hop. Backup</w:t>
+        <w:t xml:space="preserve">6. #35-new — old screens out, including the `/myday` hop. Backup</w:t>
       </w:r>
     </w:p>
     <w:p>
@@ -2080,7 +2080,7 @@
           <w:rFonts w:ascii="Arial" w:hAnsi="Arial"/>
           <w:sz w:val="28"/>
         </w:rPr>
-        <w:t xml:space="preserve">6. #34-new — Weekly through Options and the + Add popup built.</w:t>
+        <w:t xml:space="preserve">7. #34-new — Weekly through Options and the + Add popup built.</w:t>
       </w:r>
     </w:p>
     <w:p>
@@ -2116,7 +2116,7 @@
           <w:rFonts w:ascii="Arial" w:hAnsi="Arial"/>
           <w:sz w:val="28"/>
         </w:rPr>
-        <w:t xml:space="preserve">7. #33-new — Daily built. Snooze, Done, hold-and-slide reorder, My</w:t>
+        <w:t xml:space="preserve">8. #33-new — Daily built. Snooze, Done, hold-and-slide reorder, My</w:t>
       </w:r>
     </w:p>
     <w:p>
@@ -2152,7 +2152,7 @@
           <w:rFonts w:ascii="Arial" w:hAnsi="Arial"/>
           <w:sz w:val="28"/>
         </w:rPr>
-        <w:t xml:space="preserve">8. #32-new — the pages phase spec, and Daily's first job sheet.</w:t>
+        <w:t xml:space="preserve">9. #32-new — the pages phase spec, and Daily's first job sheet.</w:t>
       </w:r>
     </w:p>
     <w:p>
@@ -2176,7 +2176,7 @@
           <w:rFonts w:ascii="Arial" w:hAnsi="Arial"/>
           <w:sz w:val="28"/>
         </w:rPr>
-        <w:t xml:space="preserve">9. #31-new — the record itself put right. The hand-off file went</w:t>
+        <w:t xml:space="preserve">10. #31-new — the record itself put right. The hand-off file went</w:t>
       </w:r>
     </w:p>
     <w:p>
@@ -2272,7 +2272,7 @@
           <w:rFonts w:ascii="Arial" w:hAnsi="Arial"/>
           <w:sz w:val="28"/>
         </w:rPr>
-        <w:t xml:space="preserve">10. #30-new — the reminder pages named and shaped, and the one Input</w:t>
+        <w:t xml:space="preserve">11. #30-new — the reminder pages named and shaped, and the one Input</w:t>
       </w:r>
     </w:p>
     <w:p>
@@ -2296,7 +2296,7 @@
           <w:rFonts w:ascii="Arial" w:hAnsi="Arial"/>
           <w:sz w:val="28"/>
         </w:rPr>
-        <w:t xml:space="preserve">11. #28-new — the engine gained repeat groups, skip, and time zones</w:t>
+        <w:t xml:space="preserve">12. #28-new — the engine gained repeat groups, skip, and time zones</w:t>
       </w:r>
     </w:p>
     <w:p>
@@ -2320,7 +2320,7 @@
           <w:rFonts w:ascii="Arial" w:hAnsi="Arial"/>
           <w:sz w:val="28"/>
         </w:rPr>
-        <w:t xml:space="preserve">12. #27-new — all five reminder screens went onto the one machine,</w:t>
+        <w:t xml:space="preserve">13. #27-new — all five reminder screens went onto the one machine,</w:t>
       </w:r>
     </w:p>
     <w:p>
@@ -2380,7 +2380,7 @@
           <w:rFonts w:ascii="Arial" w:hAnsi="Arial"/>
           <w:sz w:val="28"/>
         </w:rPr>
-        <w:t xml:space="preserve">13. #26-new — the per-screen translators became one translator and a</w:t>
+        <w:t xml:space="preserve">14. #26-new — the per-screen translators became one translator and a</w:t>
       </w:r>
     </w:p>
     <w:p>
@@ -2404,7 +2404,7 @@
           <w:rFonts w:ascii="Arial" w:hAnsi="Arial"/>
           <w:sz w:val="28"/>
         </w:rPr>
-        <w:t xml:space="preserve">14. #24-new and #25-new — the first two translators, My Day and</w:t>
+        <w:t xml:space="preserve">15. #24-new and #25-new — the first two translators, My Day and</w:t>
       </w:r>
     </w:p>
     <w:p>
@@ -2440,7 +2440,7 @@
           <w:rFonts w:ascii="Arial" w:hAnsi="Arial"/>
           <w:sz w:val="28"/>
         </w:rPr>
-        <w:t xml:space="preserve">15. #23-new — the common shape and the two decision blocks built and</w:t>
+        <w:t xml:space="preserve">16. #23-new — the common shape and the two decision blocks built and</w:t>
       </w:r>
     </w:p>
     <w:p>
@@ -2464,7 +2464,7 @@
           <w:rFonts w:ascii="Arial" w:hAnsi="Arial"/>
           <w:sz w:val="28"/>
         </w:rPr>
-        <w:t xml:space="preserve">16. #22-new — the field names settled, and setting reminders two</w:t>
+        <w:t xml:space="preserve">17. #22-new — the field names settled, and setting reminders two</w:t>
       </w:r>
     </w:p>
     <w:p>
@@ -2488,7 +2488,7 @@
           <w:rFonts w:ascii="Arial" w:hAnsi="Arial"/>
           <w:sz w:val="28"/>
         </w:rPr>
-        <w:t xml:space="preserve">17. #21-new — the common shape settled on paper, all five screens</w:t>
+        <w:t xml:space="preserve">18. #21-new — the common shape settled on paper, all five screens</w:t>
       </w:r>
     </w:p>
     <w:p>
@@ -2512,7 +2512,7 @@
           <w:rFonts w:ascii="Arial" w:hAnsi="Arial"/>
           <w:sz w:val="28"/>
         </w:rPr>
-        <w:t xml:space="preserve">18. #20-new — My Week's Delay written down like the others, and the</w:t>
+        <w:t xml:space="preserve">19. #20-new — My Week's Delay written down like the others, and the</w:t>
       </w:r>
     </w:p>
     <w:p>
@@ -2536,7 +2536,7 @@
           <w:rFonts w:ascii="Arial" w:hAnsi="Arial"/>
           <w:sz w:val="28"/>
         </w:rPr>
-        <w:t xml:space="preserve">19. #19-new — your epiphany: one shape instead of six, the reminder</w:t>
+        <w:t xml:space="preserve">20. #19-new — your epiphany: one shape instead of six, the reminder</w:t>
       </w:r>
     </w:p>
     <w:p>
@@ -2560,7 +2560,7 @@
           <w:rFonts w:ascii="Arial" w:hAnsi="Arial"/>
           <w:sz w:val="28"/>
         </w:rPr>
-        <w:t xml:space="preserve">20. #18-new — the outsider's report checked. The answer was mend</w:t>
+        <w:t xml:space="preserve">21. #18-new — the outsider's report checked. The answer was mend</w:t>
       </w:r>
     </w:p>
     <w:p>
@@ -2596,7 +2596,7 @@
           <w:rFonts w:ascii="Arial" w:hAnsi="Arial"/>
           <w:sz w:val="28"/>
         </w:rPr>
-        <w:t xml:space="preserve">21. #15-new to #17-new — the failure pop-up and the missed-firing</w:t>
+        <w:t xml:space="preserve">22. #15-new to #17-new — the failure pop-up and the missed-firing</w:t>
       </w:r>
     </w:p>
     <w:p>
@@ -2632,7 +2632,7 @@
           <w:rFonts w:ascii="Arial" w:hAnsi="Arial"/>
           <w:sz w:val="28"/>
         </w:rPr>
-        <w:t xml:space="preserve">22. #13-new and #14-new — tapping a reminder lands on its own item</w:t>
+        <w:t xml:space="preserve">23. #13-new and #14-new — tapping a reminder lands on its own item</w:t>
       </w:r>
     </w:p>
     <w:p>
@@ -2656,7 +2656,7 @@
           <w:rFonts w:ascii="Arial" w:hAnsi="Arial"/>
           <w:sz w:val="28"/>
         </w:rPr>
-        <w:t xml:space="preserve">23. #12-new — the Scheduled Reminders screen, showing every</w:t>
+        <w:t xml:space="preserve">24. #12-new — the Scheduled Reminders screen, showing every</w:t>
       </w:r>
     </w:p>
     <w:p>
@@ -2680,7 +2680,7 @@
           <w:rFonts w:ascii="Arial" w:hAnsi="Arial"/>
           <w:sz w:val="28"/>
         </w:rPr>
-        <w:t xml:space="preserve">24. #6-new to #12-new — the scheduler built in eight steps, so one</w:t>
+        <w:t xml:space="preserve">25. #6-new to #12-new — the scheduler built in eight steps, so one</w:t>
       </w:r>
     </w:p>
     <w:p>
@@ -2704,7 +2704,7 @@
           <w:rFonts w:ascii="Arial" w:hAnsi="Arial"/>
           <w:sz w:val="28"/>
         </w:rPr>
-        <w:t xml:space="preserve">25. #4-new — the first notification fixes. Real, and kept, but not</w:t>
+        <w:t xml:space="preserve">26. #4-new — the first notification fixes. Real, and kept, but not</w:t>
       </w:r>
     </w:p>
     <w:p>

</xml_diff>

<commit_message>
44-new.  build & run auto tests 2 fails: C3, Q13
</commit_message>
<xml_diff>
--- a/docs/pending.docx
+++ b/docs/pending.docx
@@ -24,7 +24,7 @@
           <w:rFonts w:ascii="Arial" w:hAnsi="Arial"/>
           <w:sz w:val="28"/>
         </w:rPr>
-        <w:t xml:space="preserve">Last updated: 2026-08-31 (#43-new)</w:t>
+        <w:t xml:space="preserve">Last updated: 2026-08-31 (#44-new)</w:t>
       </w:r>
     </w:p>
     <w:p>
@@ -229,79 +229,271 @@
           <w:rFonts w:ascii="Arial" w:hAnsi="Arial"/>
           <w:sz w:val="28"/>
         </w:rPr>
-        <w:t xml:space="preserve">1. THE AUTOMATED LOAD. Next session: read</w:t>
-      </w:r>
-    </w:p>
-    <w:p>
-      <w:pPr>
-        <w:spacing w:line="276" w:lineRule="auto"/>
-      </w:pPr>
-      <w:r>
-        <w:rPr>
-          <w:rFonts w:ascii="Arial" w:hAnsi="Arial"/>
-          <w:sz w:val="28"/>
-        </w:rPr>
-        <w:t xml:space="preserve">   docs/build-sheet-automated-load.md and build. Read only the files</w:t>
-      </w:r>
-    </w:p>
-    <w:p>
-      <w:pPr>
-        <w:spacing w:line="276" w:lineRule="auto"/>
-      </w:pPr>
-      <w:r>
-        <w:rPr>
-          <w:rFonts w:ascii="Arial" w:hAnsi="Arial"/>
-          <w:sz w:val="28"/>
-        </w:rPr>
-        <w:t xml:space="preserve">   on that sheet's read list. Do not ask design questions. Simulator</w:t>
-      </w:r>
-    </w:p>
-    <w:p>
-      <w:pPr>
-        <w:spacing w:line="276" w:lineRule="auto"/>
-      </w:pPr>
-      <w:r>
-        <w:rPr>
-          <w:rFonts w:ascii="Arial" w:hAnsi="Arial"/>
-          <w:sz w:val="28"/>
-        </w:rPr>
-        <w:t xml:space="preserve">   first. The walk you follow is docs/test-load-sitting.md. Four</w:t>
-      </w:r>
-    </w:p>
-    <w:p>
-      <w:pPr>
-        <w:spacing w:line="276" w:lineRule="auto"/>
-      </w:pPr>
-      <w:r>
-        <w:rPr>
-          <w:rFonts w:ascii="Arial" w:hAnsi="Arial"/>
-          <w:sz w:val="28"/>
-        </w:rPr>
-        <w:t xml:space="preserve">   pieces, a Home tile, ceiling kept apart at fifty-six. The design</w:t>
-      </w:r>
-    </w:p>
-    <w:p>
-      <w:pPr>
-        <w:spacing w:line="276" w:lineRule="auto"/>
-      </w:pPr>
-      <w:r>
-        <w:rPr>
-          <w:rFonts w:ascii="Arial" w:hAnsi="Arial"/>
-          <w:sz w:val="28"/>
-        </w:rPr>
-        <w:t xml:space="preserve">   is not reopened.</w:t>
-      </w:r>
-    </w:p>
-    <w:p>
-      <w:pPr>
-        <w:spacing w:line="276" w:lineRule="auto"/>
-      </w:pPr>
-      <w:r>
-        <w:rPr>
-          <w:rFonts w:ascii="Arial" w:hAnsi="Arial"/>
-          <w:sz w:val="28"/>
-        </w:rPr>
-        <w:t xml:space="preserve">2. THE REMINDER PAGES. Daily through Options are built. The one-store</w:t>
+        <w:t xml:space="preserve">1. THE AUTOMATED LOAD. Built at #44-new. Simulator sitting done,</w:t>
+      </w:r>
+    </w:p>
+    <w:p>
+      <w:pPr>
+        <w:spacing w:line="276" w:lineRule="auto"/>
+      </w:pPr>
+      <w:r>
+        <w:rPr>
+          <w:rFonts w:ascii="Arial" w:hAnsi="Arial"/>
+          <w:sz w:val="28"/>
+        </w:rPr>
+        <w:t xml:space="preserve">   all six parts, including ceiling at fifty-six. Same walk on the</w:t>
+      </w:r>
+    </w:p>
+    <w:p>
+      <w:pPr>
+        <w:spacing w:line="276" w:lineRule="auto"/>
+      </w:pPr>
+      <w:r>
+        <w:rPr>
+          <w:rFonts w:ascii="Arial" w:hAnsi="Arial"/>
+          <w:sz w:val="28"/>
+        </w:rPr>
+        <w:t xml:space="preserve">   phone is not done. Four pieces, a Home tile. The design is not</w:t>
+      </w:r>
+    </w:p>
+    <w:p>
+      <w:pPr>
+        <w:spacing w:line="276" w:lineRule="auto"/>
+      </w:pPr>
+      <w:r>
+        <w:rPr>
+          <w:rFonts w:ascii="Arial" w:hAnsi="Arial"/>
+          <w:sz w:val="28"/>
+        </w:rPr>
+        <w:t xml:space="preserve">   reopened. The two engine Fails from that sitting are What's Next</w:t>
+      </w:r>
+    </w:p>
+    <w:p>
+      <w:pPr>
+        <w:spacing w:line="276" w:lineRule="auto"/>
+      </w:pPr>
+      <w:r>
+        <w:rPr>
+          <w:rFonts w:ascii="Arial" w:hAnsi="Arial"/>
+          <w:sz w:val="28"/>
+        </w:rPr>
+        <w:t xml:space="preserve">   2 and 3.</w:t>
+      </w:r>
+    </w:p>
+    <w:p>
+      <w:pPr>
+        <w:spacing w:line="276" w:lineRule="auto"/>
+      </w:pPr>
+      <w:r>
+        <w:rPr>
+          <w:rFonts w:ascii="Arial" w:hAnsi="Arial"/>
+          <w:sz w:val="28"/>
+        </w:rPr>
+        <w:t xml:space="preserve">2. EVERY DAILY ITEM ARMS FOR THE NEXT DAY. Including after Done.</w:t>
+      </w:r>
+    </w:p>
+    <w:p>
+      <w:pPr>
+        <w:spacing w:line="276" w:lineRule="auto"/>
+      </w:pPr>
+      <w:r>
+        <w:rPr>
+          <w:rFonts w:ascii="Arial" w:hAnsi="Arial"/>
+          <w:sz w:val="28"/>
+        </w:rPr>
+        <w:t xml:space="preserve">   Depth stays one: today's notice is gone, tomorrow's is the</w:t>
+      </w:r>
+    </w:p>
+    <w:p>
+      <w:pPr>
+        <w:spacing w:line="276" w:lineRule="auto"/>
+      </w:pPr>
+      <w:r>
+        <w:rPr>
+          <w:rFonts w:ascii="Arial" w:hAnsi="Arial"/>
+          <w:sz w:val="28"/>
+        </w:rPr>
+        <w:t xml:space="preserve">   armed date. The sitting's C3 Fail is that the engine does not</w:t>
+      </w:r>
+    </w:p>
+    <w:p>
+      <w:pPr>
+        <w:spacing w:line="276" w:lineRule="auto"/>
+      </w:pPr>
+      <w:r>
+        <w:rPr>
+          <w:rFonts w:ascii="Arial" w:hAnsi="Arial"/>
+          <w:sz w:val="28"/>
+        </w:rPr>
+        <w:t xml:space="preserve">   do this yet. Next session is #45-new, Memory's chain, not the</w:t>
+      </w:r>
+    </w:p>
+    <w:p>
+      <w:pPr>
+        <w:spacing w:line="276" w:lineRule="auto"/>
+      </w:pPr>
+      <w:r>
+        <w:rPr>
+          <w:rFonts w:ascii="Arial" w:hAnsi="Arial"/>
+          <w:sz w:val="28"/>
+        </w:rPr>
+        <w:t xml:space="preserve">   Reminder Engine stream (Patrick, #44-new).</w:t>
+      </w:r>
+    </w:p>
+    <w:p>
+      <w:pPr>
+        <w:spacing w:line="276" w:lineRule="auto"/>
+      </w:pPr>
+      <w:r>
+        <w:rPr>
+          <w:rFonts w:ascii="Arial" w:hAnsi="Arial"/>
+          <w:sz w:val="28"/>
+        </w:rPr>
+        <w:t xml:space="preserve">3. A NAMED ZONE DOES NOT MOVE THE FIRE. Sitting Q13: a One Time at</w:t>
+      </w:r>
+    </w:p>
+    <w:p>
+      <w:pPr>
+        <w:spacing w:line="276" w:lineRule="auto"/>
+      </w:pPr>
+      <w:r>
+        <w:rPr>
+          <w:rFonts w:ascii="Arial" w:hAnsi="Arial"/>
+          <w:sz w:val="28"/>
+        </w:rPr>
+        <w:t xml:space="preserve">   00:30 in Los Angeles queued at 00:30 on the phone’s clock, not</w:t>
+      </w:r>
+    </w:p>
+    <w:p>
+      <w:pPr>
+        <w:spacing w:line="276" w:lineRule="auto"/>
+      </w:pPr>
+      <w:r>
+        <w:rPr>
+          <w:rFonts w:ascii="Arial" w:hAnsi="Arial"/>
+          <w:sz w:val="28"/>
+        </w:rPr>
+        <w:t xml:space="preserve">   3:30, which is 00:30 in that zone on this phone. Same session as</w:t>
+      </w:r>
+    </w:p>
+    <w:p>
+      <w:pPr>
+        <w:spacing w:line="276" w:lineRule="auto"/>
+      </w:pPr>
+      <w:r>
+        <w:rPr>
+          <w:rFonts w:ascii="Arial" w:hAnsi="Arial"/>
+          <w:sz w:val="28"/>
+        </w:rPr>
+        <w:t xml:space="preserve">   What's Next 2 (#45-new).</w:t>
+      </w:r>
+    </w:p>
+    <w:p>
+      <w:pPr>
+        <w:spacing w:line="276" w:lineRule="auto"/>
+      </w:pPr>
+      <w:r>
+        <w:rPr>
+          <w:rFonts w:ascii="Arial" w:hAnsi="Arial"/>
+          <w:sz w:val="28"/>
+        </w:rPr>
+        <w:t xml:space="preserve">4. THE TWO TYPE-CHECK COMPLAINTS. The type checker reports two old</w:t>
+      </w:r>
+    </w:p>
+    <w:p>
+      <w:pPr>
+        <w:spacing w:line="276" w:lineRule="auto"/>
+      </w:pPr>
+      <w:r>
+        <w:rPr>
+          <w:rFonts w:ascii="Arial" w:hAnsi="Arial"/>
+          <w:sz w:val="28"/>
+        </w:rPr>
+        <w:t xml:space="preserve">   nits this sitting did not create and did not touch. In the</w:t>
+      </w:r>
+    </w:p>
+    <w:p>
+      <w:pPr>
+        <w:spacing w:line="276" w:lineRule="auto"/>
+      </w:pPr>
+      <w:r>
+        <w:rPr>
+          <w:rFonts w:ascii="Arial" w:hAnsi="Arial"/>
+          <w:sz w:val="28"/>
+        </w:rPr>
+        <w:t xml:space="preserve">   lead-moments file, a numbered day already confirmed present is still</w:t>
+      </w:r>
+    </w:p>
+    <w:p>
+      <w:pPr>
+        <w:spacing w:line="276" w:lineRule="auto"/>
+      </w:pPr>
+      <w:r>
+        <w:rPr>
+          <w:rFonts w:ascii="Arial" w:hAnsi="Arial"/>
+          <w:sz w:val="28"/>
+        </w:rPr>
+        <w:t xml:space="preserve">   treated as maybe missing inside a small inner function. In the</w:t>
+      </w:r>
+    </w:p>
+    <w:p>
+      <w:pPr>
+        <w:spacing w:line="276" w:lineRule="auto"/>
+      </w:pPr>
+      <w:r>
+        <w:rPr>
+          <w:rFonts w:ascii="Arial" w:hAnsi="Arial"/>
+          <w:sz w:val="28"/>
+        </w:rPr>
+        <w:t xml:space="preserve">   scheduler file, the day-roll wants completed to be always true or</w:t>
+      </w:r>
+    </w:p>
+    <w:p>
+      <w:pPr>
+        <w:spacing w:line="276" w:lineRule="auto"/>
+      </w:pPr>
+      <w:r>
+        <w:rPr>
+          <w:rFonts w:ascii="Arial" w:hAnsi="Arial"/>
+          <w:sz w:val="28"/>
+        </w:rPr>
+        <w:t xml:space="preserve">   false, while a saved item may omit it. Neither is a Mac-suite</w:t>
+      </w:r>
+    </w:p>
+    <w:p>
+      <w:pPr>
+        <w:spacing w:line="276" w:lineRule="auto"/>
+      </w:pPr>
+      <w:r>
+        <w:rPr>
+          <w:rFonts w:ascii="Arial" w:hAnsi="Arial"/>
+          <w:sz w:val="28"/>
+        </w:rPr>
+        <w:t xml:space="preserve">   failure. A small later job to clear them, without changing</w:t>
+      </w:r>
+    </w:p>
+    <w:p>
+      <w:pPr>
+        <w:spacing w:line="276" w:lineRule="auto"/>
+      </w:pPr>
+      <w:r>
+        <w:rPr>
+          <w:rFonts w:ascii="Arial" w:hAnsi="Arial"/>
+          <w:sz w:val="28"/>
+        </w:rPr>
+        <w:t xml:space="preserve">   reminder behaviour.</w:t>
+      </w:r>
+    </w:p>
+    <w:p>
+      <w:pPr>
+        <w:spacing w:line="276" w:lineRule="auto"/>
+      </w:pPr>
+      <w:r>
+        <w:rPr>
+          <w:rFonts w:ascii="Arial" w:hAnsi="Arial"/>
+          <w:sz w:val="28"/>
+        </w:rPr>
+        <w:t xml:space="preserve">5. THE REMINDER PAGES. Daily through Options are built. The one-store</w:t>
       </w:r>
     </w:p>
     <w:p>
@@ -1395,7 +1587,19 @@
           <w:rFonts w:ascii="Arial" w:hAnsi="Arial"/>
           <w:sz w:val="28"/>
         </w:rPr>
-        <w:t xml:space="preserve">   old two-days-ahead rule.</w:t>
+        <w:t xml:space="preserve">   old two-days-ahead rule. A Daily item still arms for tomorrow</w:t>
+      </w:r>
+    </w:p>
+    <w:p>
+      <w:pPr>
+        <w:spacing w:line="276" w:lineRule="auto"/>
+      </w:pPr>
+      <w:r>
+        <w:rPr>
+          <w:rFonts w:ascii="Arial" w:hAnsi="Arial"/>
+          <w:sz w:val="28"/>
+        </w:rPr>
+        <w:t xml:space="preserve">   after Done; that is still one reminder, not two (Patrick, #44-new).</w:t>
       </w:r>
     </w:p>
     <w:p>
@@ -1744,7 +1948,55 @@
           <w:rFonts w:ascii="Arial" w:hAnsi="Arial"/>
           <w:sz w:val="28"/>
         </w:rPr>
-        <w:t xml:space="preserve">1. #43-new — the automated-load job sheet and the sitting list.</w:t>
+        <w:t xml:space="preserve">1. #44-new — the automated load built, and the simulator sitting</w:t>
+      </w:r>
+    </w:p>
+    <w:p>
+      <w:pPr>
+        <w:spacing w:line="276" w:lineRule="auto"/>
+      </w:pPr>
+      <w:r>
+        <w:rPr>
+          <w:rFonts w:ascii="Arial" w:hAnsi="Arial"/>
+          <w:sz w:val="28"/>
+        </w:rPr>
+        <w:t xml:space="preserve">   finished. Two engine Fails (Daily after Done, named zone) go to</w:t>
+      </w:r>
+    </w:p>
+    <w:p>
+      <w:pPr>
+        <w:spacing w:line="276" w:lineRule="auto"/>
+      </w:pPr>
+      <w:r>
+        <w:rPr>
+          <w:rFonts w:ascii="Arial" w:hAnsi="Arial"/>
+          <w:sz w:val="28"/>
+        </w:rPr>
+        <w:t xml:space="preserve">   #45-new. Reminder Engine files not touched. 459 tests. Two old</w:t>
+      </w:r>
+    </w:p>
+    <w:p>
+      <w:pPr>
+        <w:spacing w:line="276" w:lineRule="auto"/>
+      </w:pPr>
+      <w:r>
+        <w:rPr>
+          <w:rFonts w:ascii="Arial" w:hAnsi="Arial"/>
+          <w:sz w:val="28"/>
+        </w:rPr>
+        <w:t xml:space="preserve">   type-check nits left for later.</w:t>
+      </w:r>
+    </w:p>
+    <w:p>
+      <w:pPr>
+        <w:spacing w:line="276" w:lineRule="auto"/>
+      </w:pPr>
+      <w:r>
+        <w:rPr>
+          <w:rFonts w:ascii="Arial" w:hAnsi="Arial"/>
+          <w:sz w:val="28"/>
+        </w:rPr>
+        <w:t xml:space="preserve">2. #43-new — the automated-load job sheet and the sitting list.</w:t>
       </w:r>
     </w:p>
     <w:p>
@@ -1792,7 +2044,7 @@
           <w:rFonts w:ascii="Arial" w:hAnsi="Arial"/>
           <w:sz w:val="28"/>
         </w:rPr>
-        <w:t xml:space="preserve">2. #42-new — the rest of Options into the engine. Calendar shading</w:t>
+        <w:t xml:space="preserve">3. #42-new — the rest of Options into the engine. Calendar shading</w:t>
       </w:r>
     </w:p>
     <w:p>
@@ -1876,7 +2128,7 @@
           <w:rFonts w:ascii="Arial" w:hAnsi="Arial"/>
           <w:sz w:val="28"/>
         </w:rPr>
-        <w:t xml:space="preserve">3. #41-new — five Options answers, holidays, monthly patterns, and</w:t>
+        <w:t xml:space="preserve">4. #41-new — five Options answers, holidays, monthly patterns, and</w:t>
       </w:r>
     </w:p>
     <w:p>
@@ -1936,7 +2188,7 @@
           <w:rFonts w:ascii="Arial" w:hAnsi="Arial"/>
           <w:sz w:val="28"/>
         </w:rPr>
-        <w:t xml:space="preserve">4. #40-new — five hardening points, and time zone into the engine.</w:t>
+        <w:t xml:space="preserve">5. #40-new — five hardening points, and time zone into the engine.</w:t>
       </w:r>
     </w:p>
     <w:p>
@@ -2008,7 +2260,7 @@
           <w:rFonts w:ascii="Arial" w:hAnsi="Arial"/>
           <w:sz w:val="28"/>
         </w:rPr>
-        <w:t xml:space="preserve">5. #39-new — the live one-store cutover. Pages, banners and Siri write</w:t>
+        <w:t xml:space="preserve">6. #39-new — the live one-store cutover. Pages, banners and Siri write</w:t>
       </w:r>
     </w:p>
     <w:p>
@@ -2044,7 +2296,7 @@
           <w:rFonts w:ascii="Arial" w:hAnsi="Arial"/>
           <w:sz w:val="28"/>
         </w:rPr>
-        <w:t xml:space="preserve">6. #38-new — the engine and Options path read end to end. The core</w:t>
+        <w:t xml:space="preserve">7. #38-new — the engine and Options path read end to end. The core</w:t>
       </w:r>
     </w:p>
     <w:p>
@@ -2092,7 +2344,7 @@
           <w:rFonts w:ascii="Arial" w:hAnsi="Arial"/>
           <w:sz w:val="28"/>
         </w:rPr>
-        <w:t xml:space="preserve">7. #37-new — Options connecting: + OPT writes the cases that apply,</w:t>
+        <w:t xml:space="preserve">8. #37-new — Options connecting: + OPT writes the cases that apply,</w:t>
       </w:r>
     </w:p>
     <w:p>
@@ -2128,7 +2380,7 @@
           <w:rFonts w:ascii="Arial" w:hAnsi="Arial"/>
           <w:sz w:val="28"/>
         </w:rPr>
-        <w:t xml:space="preserve">8. #36-new — logs on Weekly, Monthly, Quarterly, Yearly, One Time,</w:t>
+        <w:t xml:space="preserve">9. #36-new — logs on Weekly, Monthly, Quarterly, Yearly, One Time,</w:t>
       </w:r>
     </w:p>
     <w:p>
@@ -2212,7 +2464,7 @@
           <w:rFonts w:ascii="Arial" w:hAnsi="Arial"/>
           <w:sz w:val="28"/>
         </w:rPr>
-        <w:t xml:space="preserve">9. #35-new — old screens out, including the `/myday` hop. Backup</w:t>
+        <w:t xml:space="preserve">10. #35-new — old screens out, including the `/myday` hop. Backup</w:t>
       </w:r>
     </w:p>
     <w:p>
@@ -2248,7 +2500,7 @@
           <w:rFonts w:ascii="Arial" w:hAnsi="Arial"/>
           <w:sz w:val="28"/>
         </w:rPr>
-        <w:t xml:space="preserve">10. #34-new — Weekly through Options and the + Add popup built.</w:t>
+        <w:t xml:space="preserve">11. #34-new — Weekly through Options and the + Add popup built.</w:t>
       </w:r>
     </w:p>
     <w:p>
@@ -2284,7 +2536,7 @@
           <w:rFonts w:ascii="Arial" w:hAnsi="Arial"/>
           <w:sz w:val="28"/>
         </w:rPr>
-        <w:t xml:space="preserve">11. #33-new — Daily built. Snooze, Done, hold-and-slide reorder, My</w:t>
+        <w:t xml:space="preserve">12. #33-new — Daily built. Snooze, Done, hold-and-slide reorder, My</w:t>
       </w:r>
     </w:p>
     <w:p>
@@ -2320,7 +2572,7 @@
           <w:rFonts w:ascii="Arial" w:hAnsi="Arial"/>
           <w:sz w:val="28"/>
         </w:rPr>
-        <w:t xml:space="preserve">12. #32-new — the pages phase spec, and Daily's first job sheet.</w:t>
+        <w:t xml:space="preserve">13. #32-new — the pages phase spec, and Daily's first job sheet.</w:t>
       </w:r>
     </w:p>
     <w:p>
@@ -2344,7 +2596,7 @@
           <w:rFonts w:ascii="Arial" w:hAnsi="Arial"/>
           <w:sz w:val="28"/>
         </w:rPr>
-        <w:t xml:space="preserve">13. #31-new — the record itself put right. The hand-off file went</w:t>
+        <w:t xml:space="preserve">14. #31-new — the record itself put right. The hand-off file went</w:t>
       </w:r>
     </w:p>
     <w:p>
@@ -2440,7 +2692,7 @@
           <w:rFonts w:ascii="Arial" w:hAnsi="Arial"/>
           <w:sz w:val="28"/>
         </w:rPr>
-        <w:t xml:space="preserve">14. #30-new — the reminder pages named and shaped, and the one Input</w:t>
+        <w:t xml:space="preserve">15. #30-new — the reminder pages named and shaped, and the one Input</w:t>
       </w:r>
     </w:p>
     <w:p>
@@ -2464,7 +2716,7 @@
           <w:rFonts w:ascii="Arial" w:hAnsi="Arial"/>
           <w:sz w:val="28"/>
         </w:rPr>
-        <w:t xml:space="preserve">15. #28-new — the engine gained repeat groups, skip, and time zones</w:t>
+        <w:t xml:space="preserve">16. #28-new — the engine gained repeat groups, skip, and time zones</w:t>
       </w:r>
     </w:p>
     <w:p>
@@ -2488,7 +2740,7 @@
           <w:rFonts w:ascii="Arial" w:hAnsi="Arial"/>
           <w:sz w:val="28"/>
         </w:rPr>
-        <w:t xml:space="preserve">16. #27-new — all five reminder screens went onto the one machine,</w:t>
+        <w:t xml:space="preserve">17. #27-new — all five reminder screens went onto the one machine,</w:t>
       </w:r>
     </w:p>
     <w:p>
@@ -2548,7 +2800,7 @@
           <w:rFonts w:ascii="Arial" w:hAnsi="Arial"/>
           <w:sz w:val="28"/>
         </w:rPr>
-        <w:t xml:space="preserve">17. #26-new — the per-screen translators became one translator and a</w:t>
+        <w:t xml:space="preserve">18. #26-new — the per-screen translators became one translator and a</w:t>
       </w:r>
     </w:p>
     <w:p>
@@ -2572,7 +2824,7 @@
           <w:rFonts w:ascii="Arial" w:hAnsi="Arial"/>
           <w:sz w:val="28"/>
         </w:rPr>
-        <w:t xml:space="preserve">18. #24-new and #25-new — the first two translators, My Day and</w:t>
+        <w:t xml:space="preserve">19. #24-new and #25-new — the first two translators, My Day and</w:t>
       </w:r>
     </w:p>
     <w:p>
@@ -2608,7 +2860,7 @@
           <w:rFonts w:ascii="Arial" w:hAnsi="Arial"/>
           <w:sz w:val="28"/>
         </w:rPr>
-        <w:t xml:space="preserve">19. #23-new — the common shape and the two decision blocks built and</w:t>
+        <w:t xml:space="preserve">20. #23-new — the common shape and the two decision blocks built and</w:t>
       </w:r>
     </w:p>
     <w:p>
@@ -2632,7 +2884,7 @@
           <w:rFonts w:ascii="Arial" w:hAnsi="Arial"/>
           <w:sz w:val="28"/>
         </w:rPr>
-        <w:t xml:space="preserve">20. #22-new — the field names settled, and setting reminders two</w:t>
+        <w:t xml:space="preserve">21. #22-new — the field names settled, and setting reminders two</w:t>
       </w:r>
     </w:p>
     <w:p>
@@ -2656,7 +2908,7 @@
           <w:rFonts w:ascii="Arial" w:hAnsi="Arial"/>
           <w:sz w:val="28"/>
         </w:rPr>
-        <w:t xml:space="preserve">21. #21-new — the common shape settled on paper, all five screens</w:t>
+        <w:t xml:space="preserve">22. #21-new — the common shape settled on paper, all five screens</w:t>
       </w:r>
     </w:p>
     <w:p>
@@ -2680,7 +2932,7 @@
           <w:rFonts w:ascii="Arial" w:hAnsi="Arial"/>
           <w:sz w:val="28"/>
         </w:rPr>
-        <w:t xml:space="preserve">22. #20-new — My Week's Delay written down like the others, and the</w:t>
+        <w:t xml:space="preserve">23. #20-new — My Week's Delay written down like the others, and the</w:t>
       </w:r>
     </w:p>
     <w:p>
@@ -2704,7 +2956,7 @@
           <w:rFonts w:ascii="Arial" w:hAnsi="Arial"/>
           <w:sz w:val="28"/>
         </w:rPr>
-        <w:t xml:space="preserve">23. #19-new — your epiphany: one shape instead of six, the reminder</w:t>
+        <w:t xml:space="preserve">24. #19-new — your epiphany: one shape instead of six, the reminder</w:t>
       </w:r>
     </w:p>
     <w:p>
@@ -2728,7 +2980,7 @@
           <w:rFonts w:ascii="Arial" w:hAnsi="Arial"/>
           <w:sz w:val="28"/>
         </w:rPr>
-        <w:t xml:space="preserve">24. #18-new — the outsider's report checked. The answer was mend</w:t>
+        <w:t xml:space="preserve">25. #18-new — the outsider's report checked. The answer was mend</w:t>
       </w:r>
     </w:p>
     <w:p>
@@ -2764,7 +3016,7 @@
           <w:rFonts w:ascii="Arial" w:hAnsi="Arial"/>
           <w:sz w:val="28"/>
         </w:rPr>
-        <w:t xml:space="preserve">25. #15-new to #17-new — the failure pop-up and the missed-firing</w:t>
+        <w:t xml:space="preserve">26. #15-new to #17-new — the failure pop-up and the missed-firing</w:t>
       </w:r>
     </w:p>
     <w:p>
@@ -2800,7 +3052,7 @@
           <w:rFonts w:ascii="Arial" w:hAnsi="Arial"/>
           <w:sz w:val="28"/>
         </w:rPr>
-        <w:t xml:space="preserve">26. #13-new and #14-new — tapping a reminder lands on its own item</w:t>
+        <w:t xml:space="preserve">27. #13-new and #14-new — tapping a reminder lands on its own item</w:t>
       </w:r>
     </w:p>
     <w:p>
@@ -2824,7 +3076,7 @@
           <w:rFonts w:ascii="Arial" w:hAnsi="Arial"/>
           <w:sz w:val="28"/>
         </w:rPr>
-        <w:t xml:space="preserve">27. #12-new — the Scheduled Reminders screen, showing every</w:t>
+        <w:t xml:space="preserve">28. #12-new — the Scheduled Reminders screen, showing every</w:t>
       </w:r>
     </w:p>
     <w:p>
@@ -2848,7 +3100,7 @@
           <w:rFonts w:ascii="Arial" w:hAnsi="Arial"/>
           <w:sz w:val="28"/>
         </w:rPr>
-        <w:t xml:space="preserve">28. #6-new to #12-new — the scheduler built in eight steps, so one</w:t>
+        <w:t xml:space="preserve">29. #6-new to #12-new — the scheduler built in eight steps, so one</w:t>
       </w:r>
     </w:p>
     <w:p>
@@ -2872,7 +3124,7 @@
           <w:rFonts w:ascii="Arial" w:hAnsi="Arial"/>
           <w:sz w:val="28"/>
         </w:rPr>
-        <w:t xml:space="preserve">29. #4-new — the first notification fixes. Real, and kept, but not</w:t>
+        <w:t xml:space="preserve">30. #4-new — the first notification fixes. Real, and kept, but not</w:t>
       </w:r>
     </w:p>
     <w:p>

</xml_diff>

<commit_message>
1-Apps - Project docs & org improvement
</commit_message>
<xml_diff>
--- a/docs/pending.docx
+++ b/docs/pending.docx
@@ -24,7 +24,7 @@
           <w:rFonts w:ascii="Arial" w:hAnsi="Arial"/>
           <w:sz w:val="28"/>
         </w:rPr>
-        <w:t xml:space="preserve">Last updated: 2026-08-31 (#45-new)</w:t>
+        <w:t xml:space="preserve">Last updated: 2026-08-31 (App-Docs)</w:t>
       </w:r>
     </w:p>
     <w:p>
@@ -1143,6 +1143,54 @@
           <w:rFonts w:ascii="Arial" w:hAnsi="Arial"/>
           <w:sz w:val="28"/>
         </w:rPr>
+        <w:t xml:space="preserve">14. WORKING DOCUMENTS LIVE IN docs. History lives in docs-ref, and</w:t>
+      </w:r>
+    </w:p>
+    <w:p>
+      <w:pPr>
+        <w:spacing w:line="276" w:lineRule="auto"/>
+      </w:pPr>
+      <w:r>
+        <w:rPr>
+          <w:rFonts w:ascii="Arial" w:hAnsi="Arial"/>
+          <w:sz w:val="28"/>
+        </w:rPr>
+        <w:t xml:space="preserve">    the eleven build sheets are in docs-ref/build-sheets. The index</w:t>
+      </w:r>
+    </w:p>
+    <w:p>
+      <w:pPr>
+        <w:spacing w:line="276" w:lineRule="auto"/>
+      </w:pPr>
+      <w:r>
+        <w:rPr>
+          <w:rFonts w:ascii="Arial" w:hAnsi="Arial"/>
+          <w:sz w:val="28"/>
+        </w:rPr>
+        <w:t xml:space="preserve">    says which file is the home. He calls them working documents;</w:t>
+      </w:r>
+    </w:p>
+    <w:p>
+      <w:pPr>
+        <w:spacing w:line="276" w:lineRule="auto"/>
+      </w:pPr>
+      <w:r>
+        <w:rPr>
+          <w:rFonts w:ascii="Arial" w:hAnsi="Arial"/>
+          <w:sz w:val="28"/>
+        </w:rPr>
+        <w:t xml:space="preserve">    live desk means the same thing. (App-Docs, 2026-08-31)</w:t>
+      </w:r>
+    </w:p>
+    <w:p>
+      <w:pPr>
+        <w:spacing w:line="276" w:lineRule="auto"/>
+      </w:pPr>
+      <w:r>
+        <w:rPr>
+          <w:rFonts w:ascii="Arial" w:hAnsi="Arial"/>
+          <w:sz w:val="28"/>
+        </w:rPr>
         <w:t xml:space="preserve"/>
       </w:r>
     </w:p>
@@ -1228,7 +1276,55 @@
           <w:rFonts w:ascii="Arial" w:hAnsi="Arial"/>
           <w:sz w:val="28"/>
         </w:rPr>
-        <w:t xml:space="preserve">1. #45-new — the two engine Fails from the sitting: Daily after Done</w:t>
+        <w:t xml:space="preserve">1. App-Docs, 2026-08-31 — working documents stay in docs; history</w:t>
+      </w:r>
+    </w:p>
+    <w:p>
+      <w:pPr>
+        <w:spacing w:line="276" w:lineRule="auto"/>
+      </w:pPr>
+      <w:r>
+        <w:rPr>
+          <w:rFonts w:ascii="Arial" w:hAnsi="Arial"/>
+          <w:sz w:val="28"/>
+        </w:rPr>
+        <w:t xml:space="preserve">   and the eleven build sheets moved to docs-ref. Index tightened to</w:t>
+      </w:r>
+    </w:p>
+    <w:p>
+      <w:pPr>
+        <w:spacing w:line="276" w:lineRule="auto"/>
+      </w:pPr>
+      <w:r>
+        <w:rPr>
+          <w:rFonts w:ascii="Arial" w:hAnsi="Arial"/>
+          <w:sz w:val="28"/>
+        </w:rPr>
+        <w:t xml:space="preserve">   one line per file. Not a Memory chain session. Next Memory session</w:t>
+      </w:r>
+    </w:p>
+    <w:p>
+      <w:pPr>
+        <w:spacing w:line="276" w:lineRule="auto"/>
+      </w:pPr>
+      <w:r>
+        <w:rPr>
+          <w:rFonts w:ascii="Arial" w:hAnsi="Arial"/>
+          <w:sz w:val="28"/>
+        </w:rPr>
+        <w:t xml:space="preserve">   is still #46-new.</w:t>
+      </w:r>
+    </w:p>
+    <w:p>
+      <w:pPr>
+        <w:spacing w:line="276" w:lineRule="auto"/>
+      </w:pPr>
+      <w:r>
+        <w:rPr>
+          <w:rFonts w:ascii="Arial" w:hAnsi="Arial"/>
+          <w:sz w:val="28"/>
+        </w:rPr>
+        <w:t xml:space="preserve">2. #45-new — the two engine Fails from the sitting: Daily after Done</w:t>
       </w:r>
     </w:p>
     <w:p>
@@ -1336,7 +1432,7 @@
           <w:rFonts w:ascii="Arial" w:hAnsi="Arial"/>
           <w:sz w:val="28"/>
         </w:rPr>
-        <w:t xml:space="preserve">2. #44-new — the automated load built, and the simulator sitting</w:t>
+        <w:t xml:space="preserve">3. #44-new — the automated load built, and the simulator sitting</w:t>
       </w:r>
     </w:p>
     <w:p>
@@ -1384,7 +1480,7 @@
           <w:rFonts w:ascii="Arial" w:hAnsi="Arial"/>
           <w:sz w:val="28"/>
         </w:rPr>
-        <w:t xml:space="preserve">3. #43-new — the automated-load job sheet and the sitting list.</w:t>
+        <w:t xml:space="preserve">4. #43-new — the automated-load job sheet and the sitting list.</w:t>
       </w:r>
     </w:p>
     <w:p>
@@ -1432,7 +1528,7 @@
           <w:rFonts w:ascii="Arial" w:hAnsi="Arial"/>
           <w:sz w:val="28"/>
         </w:rPr>
-        <w:t xml:space="preserve">4. #42-new — the rest of Options into the engine. Calendar shading</w:t>
+        <w:t xml:space="preserve">5. #42-new — the rest of Options into the engine. Calendar shading</w:t>
       </w:r>
     </w:p>
     <w:p>
@@ -1516,7 +1612,7 @@
           <w:rFonts w:ascii="Arial" w:hAnsi="Arial"/>
           <w:sz w:val="28"/>
         </w:rPr>
-        <w:t xml:space="preserve">5. #41-new — five Options answers, holidays, monthly patterns, and</w:t>
+        <w:t xml:space="preserve">6. #41-new — five Options answers, holidays, monthly patterns, and</w:t>
       </w:r>
     </w:p>
     <w:p>
@@ -1576,7 +1672,7 @@
           <w:rFonts w:ascii="Arial" w:hAnsi="Arial"/>
           <w:sz w:val="28"/>
         </w:rPr>
-        <w:t xml:space="preserve">6. #40-new — five hardening points, and time zone into the engine.</w:t>
+        <w:t xml:space="preserve">7. #40-new — five hardening points, and time zone into the engine.</w:t>
       </w:r>
     </w:p>
     <w:p>
@@ -1648,7 +1744,7 @@
           <w:rFonts w:ascii="Arial" w:hAnsi="Arial"/>
           <w:sz w:val="28"/>
         </w:rPr>
-        <w:t xml:space="preserve">7. #39-new — the live one-store cutover. Pages, banners and Siri write</w:t>
+        <w:t xml:space="preserve">8. #39-new — the live one-store cutover. Pages, banners and Siri write</w:t>
       </w:r>
     </w:p>
     <w:p>
@@ -1684,7 +1780,7 @@
           <w:rFonts w:ascii="Arial" w:hAnsi="Arial"/>
           <w:sz w:val="28"/>
         </w:rPr>
-        <w:t xml:space="preserve">8. #38-new — the engine and Options path read end to end. The core</w:t>
+        <w:t xml:space="preserve">9. #38-new — the engine and Options path read end to end. The core</w:t>
       </w:r>
     </w:p>
     <w:p>
@@ -1732,7 +1828,7 @@
           <w:rFonts w:ascii="Arial" w:hAnsi="Arial"/>
           <w:sz w:val="28"/>
         </w:rPr>
-        <w:t xml:space="preserve">9. #37-new — Options connecting: + OPT writes the cases that apply,</w:t>
+        <w:t xml:space="preserve">10. #37-new — Options connecting: + OPT writes the cases that apply,</w:t>
       </w:r>
     </w:p>
     <w:p>
@@ -1768,7 +1864,7 @@
           <w:rFonts w:ascii="Arial" w:hAnsi="Arial"/>
           <w:sz w:val="28"/>
         </w:rPr>
-        <w:t xml:space="preserve">10. #36-new — logs on Weekly, Monthly, Quarterly, Yearly, One Time,</w:t>
+        <w:t xml:space="preserve">11. #36-new — logs on Weekly, Monthly, Quarterly, Yearly, One Time,</w:t>
       </w:r>
     </w:p>
     <w:p>
@@ -1852,7 +1948,7 @@
           <w:rFonts w:ascii="Arial" w:hAnsi="Arial"/>
           <w:sz w:val="28"/>
         </w:rPr>
-        <w:t xml:space="preserve">11. #35-new — old screens out, including the `/myday` hop. Backup</w:t>
+        <w:t xml:space="preserve">12. #35-new — old screens out, including the `/myday` hop. Backup</w:t>
       </w:r>
     </w:p>
     <w:p>
@@ -1888,7 +1984,7 @@
           <w:rFonts w:ascii="Arial" w:hAnsi="Arial"/>
           <w:sz w:val="28"/>
         </w:rPr>
-        <w:t xml:space="preserve">12. #34-new — Weekly through Options and the + Add popup built.</w:t>
+        <w:t xml:space="preserve">13. #34-new — Weekly through Options and the + Add popup built.</w:t>
       </w:r>
     </w:p>
     <w:p>
@@ -1924,7 +2020,7 @@
           <w:rFonts w:ascii="Arial" w:hAnsi="Arial"/>
           <w:sz w:val="28"/>
         </w:rPr>
-        <w:t xml:space="preserve">13. #33-new — Daily built. Snooze, Done, hold-and-slide reorder, My</w:t>
+        <w:t xml:space="preserve">14. #33-new — Daily built. Snooze, Done, hold-and-slide reorder, My</w:t>
       </w:r>
     </w:p>
     <w:p>
@@ -1960,7 +2056,7 @@
           <w:rFonts w:ascii="Arial" w:hAnsi="Arial"/>
           <w:sz w:val="28"/>
         </w:rPr>
-        <w:t xml:space="preserve">14. #32-new — the pages phase spec, and Daily's first job sheet.</w:t>
+        <w:t xml:space="preserve">15. #32-new — the pages phase spec, and Daily's first job sheet.</w:t>
       </w:r>
     </w:p>
     <w:p>
@@ -1984,7 +2080,7 @@
           <w:rFonts w:ascii="Arial" w:hAnsi="Arial"/>
           <w:sz w:val="28"/>
         </w:rPr>
-        <w:t xml:space="preserve">15. #31-new — the record itself put right. The hand-off file went</w:t>
+        <w:t xml:space="preserve">16. #31-new — the record itself put right. The hand-off file went</w:t>
       </w:r>
     </w:p>
     <w:p>
@@ -2080,7 +2176,7 @@
           <w:rFonts w:ascii="Arial" w:hAnsi="Arial"/>
           <w:sz w:val="28"/>
         </w:rPr>
-        <w:t xml:space="preserve">16. #30-new — the reminder pages named and shaped, and the one Input</w:t>
+        <w:t xml:space="preserve">17. #30-new — the reminder pages named and shaped, and the one Input</w:t>
       </w:r>
     </w:p>
     <w:p>
@@ -2104,7 +2200,7 @@
           <w:rFonts w:ascii="Arial" w:hAnsi="Arial"/>
           <w:sz w:val="28"/>
         </w:rPr>
-        <w:t xml:space="preserve">17. #28-new — the engine gained repeat groups, skip, and time zones</w:t>
+        <w:t xml:space="preserve">18. #28-new — the engine gained repeat groups, skip, and time zones</w:t>
       </w:r>
     </w:p>
     <w:p>
@@ -2128,7 +2224,7 @@
           <w:rFonts w:ascii="Arial" w:hAnsi="Arial"/>
           <w:sz w:val="28"/>
         </w:rPr>
-        <w:t xml:space="preserve">18. #27-new — all five reminder screens went onto the one machine,</w:t>
+        <w:t xml:space="preserve">19. #27-new — all five reminder screens went onto the one machine,</w:t>
       </w:r>
     </w:p>
     <w:p>
@@ -2188,7 +2284,7 @@
           <w:rFonts w:ascii="Arial" w:hAnsi="Arial"/>
           <w:sz w:val="28"/>
         </w:rPr>
-        <w:t xml:space="preserve">19. #26-new — the per-screen translators became one translator and a</w:t>
+        <w:t xml:space="preserve">20. #26-new — the per-screen translators became one translator and a</w:t>
       </w:r>
     </w:p>
     <w:p>
@@ -2212,7 +2308,7 @@
           <w:rFonts w:ascii="Arial" w:hAnsi="Arial"/>
           <w:sz w:val="28"/>
         </w:rPr>
-        <w:t xml:space="preserve">20. #24-new and #25-new — the first two translators, My Day and</w:t>
+        <w:t xml:space="preserve">21. #24-new and #25-new — the first two translators, My Day and</w:t>
       </w:r>
     </w:p>
     <w:p>
@@ -2248,7 +2344,7 @@
           <w:rFonts w:ascii="Arial" w:hAnsi="Arial"/>
           <w:sz w:val="28"/>
         </w:rPr>
-        <w:t xml:space="preserve">21. #23-new — the common shape and the two decision blocks built and</w:t>
+        <w:t xml:space="preserve">22. #23-new — the common shape and the two decision blocks built and</w:t>
       </w:r>
     </w:p>
     <w:p>
@@ -2272,7 +2368,7 @@
           <w:rFonts w:ascii="Arial" w:hAnsi="Arial"/>
           <w:sz w:val="28"/>
         </w:rPr>
-        <w:t xml:space="preserve">22. #22-new — the field names settled, and setting reminders two</w:t>
+        <w:t xml:space="preserve">23. #22-new — the field names settled, and setting reminders two</w:t>
       </w:r>
     </w:p>
     <w:p>
@@ -2296,7 +2392,7 @@
           <w:rFonts w:ascii="Arial" w:hAnsi="Arial"/>
           <w:sz w:val="28"/>
         </w:rPr>
-        <w:t xml:space="preserve">23. #21-new — the common shape settled on paper, all five screens</w:t>
+        <w:t xml:space="preserve">24. #21-new — the common shape settled on paper, all five screens</w:t>
       </w:r>
     </w:p>
     <w:p>
@@ -2320,7 +2416,7 @@
           <w:rFonts w:ascii="Arial" w:hAnsi="Arial"/>
           <w:sz w:val="28"/>
         </w:rPr>
-        <w:t xml:space="preserve">24. #20-new — My Week's Delay written down like the others, and the</w:t>
+        <w:t xml:space="preserve">25. #20-new — My Week's Delay written down like the others, and the</w:t>
       </w:r>
     </w:p>
     <w:p>
@@ -2344,7 +2440,7 @@
           <w:rFonts w:ascii="Arial" w:hAnsi="Arial"/>
           <w:sz w:val="28"/>
         </w:rPr>
-        <w:t xml:space="preserve">25. #19-new — your epiphany: one shape instead of six, the reminder</w:t>
+        <w:t xml:space="preserve">26. #19-new — your epiphany: one shape instead of six, the reminder</w:t>
       </w:r>
     </w:p>
     <w:p>
@@ -2368,7 +2464,7 @@
           <w:rFonts w:ascii="Arial" w:hAnsi="Arial"/>
           <w:sz w:val="28"/>
         </w:rPr>
-        <w:t xml:space="preserve">26. #18-new — the outsider's report checked. The answer was mend</w:t>
+        <w:t xml:space="preserve">27. #18-new — the outsider's report checked. The answer was mend</w:t>
       </w:r>
     </w:p>
     <w:p>
@@ -2404,7 +2500,7 @@
           <w:rFonts w:ascii="Arial" w:hAnsi="Arial"/>
           <w:sz w:val="28"/>
         </w:rPr>
-        <w:t xml:space="preserve">27. #15-new to #17-new — the failure pop-up and the missed-firing</w:t>
+        <w:t xml:space="preserve">28. #15-new to #17-new — the failure pop-up and the missed-firing</w:t>
       </w:r>
     </w:p>
     <w:p>
@@ -2440,7 +2536,7 @@
           <w:rFonts w:ascii="Arial" w:hAnsi="Arial"/>
           <w:sz w:val="28"/>
         </w:rPr>
-        <w:t xml:space="preserve">28. #13-new and #14-new — tapping a reminder lands on its own item</w:t>
+        <w:t xml:space="preserve">29. #13-new and #14-new — tapping a reminder lands on its own item</w:t>
       </w:r>
     </w:p>
     <w:p>
@@ -2464,7 +2560,7 @@
           <w:rFonts w:ascii="Arial" w:hAnsi="Arial"/>
           <w:sz w:val="28"/>
         </w:rPr>
-        <w:t xml:space="preserve">29. #12-new — the Scheduled Reminders screen, showing every</w:t>
+        <w:t xml:space="preserve">30. #12-new — the Scheduled Reminders screen, showing every</w:t>
       </w:r>
     </w:p>
     <w:p>
@@ -2488,7 +2584,7 @@
           <w:rFonts w:ascii="Arial" w:hAnsi="Arial"/>
           <w:sz w:val="28"/>
         </w:rPr>
-        <w:t xml:space="preserve">30. #6-new to #12-new — the scheduler built in eight steps, so one</w:t>
+        <w:t xml:space="preserve">31. #6-new to #12-new — the scheduler built in eight steps, so one</w:t>
       </w:r>
     </w:p>
     <w:p>
@@ -2512,7 +2608,7 @@
           <w:rFonts w:ascii="Arial" w:hAnsi="Arial"/>
           <w:sz w:val="28"/>
         </w:rPr>
-        <w:t xml:space="preserve">31. #4-new — the first notification fixes. Real, and kept, but not</w:t>
+        <w:t xml:space="preserve">32. #4-new — the first notification fixes. Real, and kept, but not</w:t>
       </w:r>
     </w:p>
     <w:p>

</xml_diff>

<commit_message>
48+49-new Add a calendar to Memory
</commit_message>
<xml_diff>
--- a/docs/pending.docx
+++ b/docs/pending.docx
@@ -24,7 +24,7 @@
           <w:rFonts w:ascii="Arial" w:hAnsi="Arial"/>
           <w:sz w:val="28"/>
         </w:rPr>
-        <w:t xml:space="preserve">Last updated: 2026-08-31 (App-Docs)</w:t>
+        <w:t xml:space="preserve">Last updated: 2026-09-01 (#49-new)</w:t>
       </w:r>
     </w:p>
     <w:p>
@@ -229,7 +229,19 @@
           <w:rFonts w:ascii="Arial" w:hAnsi="Arial"/>
           <w:sz w:val="28"/>
         </w:rPr>
-        <w:t xml:space="preserve">Nothing under this heading right now.</w:t>
+        <w:t xml:space="preserve">1. LOOK AT THE OTHER PAGES IN LANDSCAPE. The calendar is allowed</w:t>
+      </w:r>
+    </w:p>
+    <w:p>
+      <w:pPr>
+        <w:spacing w:line="276" w:lineRule="auto"/>
+      </w:pPr>
+      <w:r>
+        <w:rPr>
+          <w:rFonts w:ascii="Arial" w:hAnsi="Arial"/>
+          <w:sz w:val="28"/>
+        </w:rPr>
+        <w:t xml:space="preserve">   to turn; the rest still stay upright. He asked to see them too.</w:t>
       </w:r>
     </w:p>
     <w:p>
@@ -410,7 +422,43 @@
           <w:rFonts w:ascii="Arial" w:hAnsi="Arial"/>
           <w:sz w:val="28"/>
         </w:rPr>
-        <w:t xml:space="preserve">   recipe.</w:t>
+        <w:t xml:space="preserve">   recipe. #49-new added the Calendar page. The Options Calendar</w:t>
+      </w:r>
+    </w:p>
+    <w:p>
+      <w:pPr>
+        <w:spacing w:line="276" w:lineRule="auto"/>
+      </w:pPr>
+      <w:r>
+        <w:rPr>
+          <w:rFonts w:ascii="Arial" w:hAnsi="Arial"/>
+          <w:sz w:val="28"/>
+        </w:rPr>
+        <w:t xml:space="preserve">   shading row came out; the saved field stays. Landscape is allowed</w:t>
+      </w:r>
+    </w:p>
+    <w:p>
+      <w:pPr>
+        <w:spacing w:line="276" w:lineRule="auto"/>
+      </w:pPr>
+      <w:r>
+        <w:rPr>
+          <w:rFonts w:ascii="Arial" w:hAnsi="Arial"/>
+          <w:sz w:val="28"/>
+        </w:rPr>
+        <w:t xml:space="preserve">   on the calendar. A fresh simulator build is needed before a turn</w:t>
+      </w:r>
+    </w:p>
+    <w:p>
+      <w:pPr>
+        <w:spacing w:line="276" w:lineRule="auto"/>
+      </w:pPr>
+      <w:r>
+        <w:rPr>
+          <w:rFonts w:ascii="Arial" w:hAnsi="Arial"/>
+          <w:sz w:val="28"/>
+        </w:rPr>
+        <w:t xml:space="preserve">   will take.</w:t>
       </w:r>
     </w:p>
     <w:p>
@@ -1191,6 +1239,54 @@
           <w:rFonts w:ascii="Arial" w:hAnsi="Arial"/>
           <w:sz w:val="28"/>
         </w:rPr>
+        <w:t xml:space="preserve">15. THE CALENDAR PAGE SHOWS DATED ITEMS. No every-day Daily items,</w:t>
+      </w:r>
+    </w:p>
+    <w:p>
+      <w:pPr>
+        <w:spacing w:line="276" w:lineRule="auto"/>
+      </w:pPr>
+      <w:r>
+        <w:rPr>
+          <w:rFonts w:ascii="Arial" w:hAnsi="Arial"/>
+          <w:sz w:val="28"/>
+        </w:rPr>
+        <w:t xml:space="preserve">    no Extended. No Done or Snooze on the month or the day’s list.</w:t>
+      </w:r>
+    </w:p>
+    <w:p>
+      <w:pPr>
+        <w:spacing w:line="276" w:lineRule="auto"/>
+      </w:pPr>
+      <w:r>
+        <w:rPr>
+          <w:rFonts w:ascii="Arial" w:hAnsi="Arial"/>
+          <w:sz w:val="28"/>
+        </w:rPr>
+        <w:t xml:space="preserve">    Names in a day box are one line and scroll vertically. They</w:t>
+      </w:r>
+    </w:p>
+    <w:p>
+      <w:pPr>
+        <w:spacing w:line="276" w:lineRule="auto"/>
+      </w:pPr>
+      <w:r>
+        <w:rPr>
+          <w:rFonts w:ascii="Arial" w:hAnsi="Arial"/>
+          <w:sz w:val="28"/>
+        </w:rPr>
+        <w:t xml:space="preserve">    need landscape now. The calendar is allowed to turn.</w:t>
+      </w:r>
+    </w:p>
+    <w:p>
+      <w:pPr>
+        <w:spacing w:line="276" w:lineRule="auto"/>
+      </w:pPr>
+      <w:r>
+        <w:rPr>
+          <w:rFonts w:ascii="Arial" w:hAnsi="Arial"/>
+          <w:sz w:val="28"/>
+        </w:rPr>
         <w:t xml:space="preserve"/>
       </w:r>
     </w:p>
@@ -1276,7 +1372,187 @@
           <w:rFonts w:ascii="Arial" w:hAnsi="Arial"/>
           <w:sz w:val="28"/>
         </w:rPr>
-        <w:t xml:space="preserve">1. App-Docs, 2026-08-31 — working documents stay in docs; history</w:t>
+        <w:t xml:space="preserve">1. #49-new — calendar page built from the sheet. Options Calendar</w:t>
+      </w:r>
+    </w:p>
+    <w:p>
+      <w:pPr>
+        <w:spacing w:line="276" w:lineRule="auto"/>
+      </w:pPr>
+      <w:r>
+        <w:rPr>
+          <w:rFonts w:ascii="Arial" w:hAnsi="Arial"/>
+          <w:sz w:val="28"/>
+        </w:rPr>
+        <w:t xml:space="preserve">   shading row out; the saved field stays. Names in a day box scroll</w:t>
+      </w:r>
+    </w:p>
+    <w:p>
+      <w:pPr>
+        <w:spacing w:line="276" w:lineRule="auto"/>
+      </w:pPr>
+      <w:r>
+        <w:rPr>
+          <w:rFonts w:ascii="Arial" w:hAnsi="Arial"/>
+          <w:sz w:val="28"/>
+        </w:rPr>
+        <w:t xml:space="preserve">   vertically only. 460 tests. They need landscape now. Calendar is</w:t>
+      </w:r>
+    </w:p>
+    <w:p>
+      <w:pPr>
+        <w:spacing w:line="276" w:lineRule="auto"/>
+      </w:pPr>
+      <w:r>
+        <w:rPr>
+          <w:rFonts w:ascii="Arial" w:hAnsi="Arial"/>
+          <w:sz w:val="28"/>
+        </w:rPr>
+        <w:t xml:space="preserve">   allowed to turn; other pages still stay upright. Fresh simulator</w:t>
+      </w:r>
+    </w:p>
+    <w:p>
+      <w:pPr>
+        <w:spacing w:line="276" w:lineRule="auto"/>
+      </w:pPr>
+      <w:r>
+        <w:rPr>
+          <w:rFonts w:ascii="Arial" w:hAnsi="Arial"/>
+          <w:sz w:val="28"/>
+        </w:rPr>
+        <w:t xml:space="preserve">   build needed for a turn to take.</w:t>
+      </w:r>
+    </w:p>
+    <w:p>
+      <w:pPr>
+        <w:spacing w:line="276" w:lineRule="auto"/>
+      </w:pPr>
+      <w:r>
+        <w:rPr>
+          <w:rFonts w:ascii="Arial" w:hAnsi="Arial"/>
+          <w:sz w:val="28"/>
+        </w:rPr>
+        <w:t xml:space="preserve">2. #48-new — calendar build sheet written. No code.</w:t>
+      </w:r>
+    </w:p>
+    <w:p>
+      <w:pPr>
+        <w:spacing w:line="276" w:lineRule="auto"/>
+      </w:pPr>
+      <w:r>
+        <w:rPr>
+          <w:rFonts w:ascii="Arial" w:hAnsi="Arial"/>
+          <w:sz w:val="28"/>
+        </w:rPr>
+        <w:t xml:space="preserve">3. #47-new — selling description a good start and left. Features</w:t>
+      </w:r>
+    </w:p>
+    <w:p>
+      <w:pPr>
+        <w:spacing w:line="276" w:lineRule="auto"/>
+      </w:pPr>
+      <w:r>
+        <w:rPr>
+          <w:rFonts w:ascii="Arial" w:hAnsi="Arial"/>
+          <w:sz w:val="28"/>
+        </w:rPr>
+        <w:t xml:space="preserve">   file is the inventory. Comparables from what the app is, not</w:t>
+      </w:r>
+    </w:p>
+    <w:p>
+      <w:pPr>
+        <w:spacing w:line="276" w:lineRule="auto"/>
+      </w:pPr>
+      <w:r>
+        <w:rPr>
+          <w:rFonts w:ascii="Arial" w:hAnsi="Arial"/>
+          <w:sz w:val="28"/>
+        </w:rPr>
+        <w:t xml:space="preserve">   elderly apps: repeating reminders and personal tasks. Apple</w:t>
+      </w:r>
+    </w:p>
+    <w:p>
+      <w:pPr>
+        <w:spacing w:line="276" w:lineRule="auto"/>
+      </w:pPr>
+      <w:r>
+        <w:rPr>
+          <w:rFonts w:ascii="Arial" w:hAnsi="Arial"/>
+          <w:sz w:val="28"/>
+        </w:rPr>
+        <w:t xml:space="preserve">   Reminders is the free default; TickTick, Todoist, Things, and</w:t>
+      </w:r>
+    </w:p>
+    <w:p>
+      <w:pPr>
+        <w:spacing w:line="276" w:lineRule="auto"/>
+      </w:pPr>
+      <w:r>
+        <w:rPr>
+          <w:rFonts w:ascii="Arial" w:hAnsi="Arial"/>
+          <w:sz w:val="28"/>
+        </w:rPr>
+        <w:t xml:space="preserve">   Due exist because it is not enough. He opened Reminders: this</w:t>
+      </w:r>
+    </w:p>
+    <w:p>
+      <w:pPr>
+        <w:spacing w:line="276" w:lineRule="auto"/>
+      </w:pPr>
+      <w:r>
+        <w:rPr>
+          <w:rFonts w:ascii="Arial" w:hAnsi="Arial"/>
+          <w:sz w:val="28"/>
+        </w:rPr>
+        <w:t xml:space="preserve">   one does more, easier. No code.</w:t>
+      </w:r>
+    </w:p>
+    <w:p>
+      <w:pPr>
+        <w:spacing w:line="276" w:lineRule="auto"/>
+      </w:pPr>
+      <w:r>
+        <w:rPr>
+          <w:rFonts w:ascii="Arial" w:hAnsi="Arial"/>
+          <w:sz w:val="28"/>
+        </w:rPr>
+        <w:t xml:space="preserve">4. #46-new — selling description begun, publishing picture written.</w:t>
+      </w:r>
+    </w:p>
+    <w:p>
+      <w:pPr>
+        <w:spacing w:line="276" w:lineRule="auto"/>
+      </w:pPr>
+      <w:r>
+        <w:rPr>
+          <w:rFonts w:ascii="Arial" w:hAnsi="Arial"/>
+          <w:sz w:val="28"/>
+        </w:rPr>
+        <w:t xml:space="preserve">   The session dropped. The wrong-shelf comparables were corrected</w:t>
+      </w:r>
+    </w:p>
+    <w:p>
+      <w:pPr>
+        <w:spacing w:line="276" w:lineRule="auto"/>
+      </w:pPr>
+      <w:r>
+        <w:rPr>
+          <w:rFonts w:ascii="Arial" w:hAnsi="Arial"/>
+          <w:sz w:val="28"/>
+        </w:rPr>
+        <w:t xml:space="preserve">   at #47-new.</w:t>
+      </w:r>
+    </w:p>
+    <w:p>
+      <w:pPr>
+        <w:spacing w:line="276" w:lineRule="auto"/>
+      </w:pPr>
+      <w:r>
+        <w:rPr>
+          <w:rFonts w:ascii="Arial" w:hAnsi="Arial"/>
+          <w:sz w:val="28"/>
+        </w:rPr>
+        <w:t xml:space="preserve">5. App-Docs, 2026-08-31 — working documents stay in docs; history</w:t>
       </w:r>
     </w:p>
     <w:p>
@@ -1300,31 +1576,19 @@
           <w:rFonts w:ascii="Arial" w:hAnsi="Arial"/>
           <w:sz w:val="28"/>
         </w:rPr>
-        <w:t xml:space="preserve">   one line per file. Not a Memory chain session. Next Memory session</w:t>
-      </w:r>
-    </w:p>
-    <w:p>
-      <w:pPr>
-        <w:spacing w:line="276" w:lineRule="auto"/>
-      </w:pPr>
-      <w:r>
-        <w:rPr>
-          <w:rFonts w:ascii="Arial" w:hAnsi="Arial"/>
-          <w:sz w:val="28"/>
-        </w:rPr>
-        <w:t xml:space="preserve">   is still #46-new.</w:t>
-      </w:r>
-    </w:p>
-    <w:p>
-      <w:pPr>
-        <w:spacing w:line="276" w:lineRule="auto"/>
-      </w:pPr>
-      <w:r>
-        <w:rPr>
-          <w:rFonts w:ascii="Arial" w:hAnsi="Arial"/>
-          <w:sz w:val="28"/>
-        </w:rPr>
-        <w:t xml:space="preserve">2. #45-new — the two engine Fails from the sitting: Daily after Done</w:t>
+        <w:t xml:space="preserve">   one line per file. Not a Memory chain session.</w:t>
+      </w:r>
+    </w:p>
+    <w:p>
+      <w:pPr>
+        <w:spacing w:line="276" w:lineRule="auto"/>
+      </w:pPr>
+      <w:r>
+        <w:rPr>
+          <w:rFonts w:ascii="Arial" w:hAnsi="Arial"/>
+          <w:sz w:val="28"/>
+        </w:rPr>
+        <w:t xml:space="preserve">6. #45-new — the two engine Fails from the sitting: Daily after Done</w:t>
       </w:r>
     </w:p>
     <w:p>
@@ -1432,7 +1696,7 @@
           <w:rFonts w:ascii="Arial" w:hAnsi="Arial"/>
           <w:sz w:val="28"/>
         </w:rPr>
-        <w:t xml:space="preserve">3. #44-new — the automated load built, and the simulator sitting</w:t>
+        <w:t xml:space="preserve">7. #44-new — the automated load built, and the simulator sitting</w:t>
       </w:r>
     </w:p>
     <w:p>
@@ -1480,7 +1744,7 @@
           <w:rFonts w:ascii="Arial" w:hAnsi="Arial"/>
           <w:sz w:val="28"/>
         </w:rPr>
-        <w:t xml:space="preserve">4. #43-new — the automated-load job sheet and the sitting list.</w:t>
+        <w:t xml:space="preserve">8. #43-new — the automated-load job sheet and the sitting list.</w:t>
       </w:r>
     </w:p>
     <w:p>
@@ -1528,7 +1792,7 @@
           <w:rFonts w:ascii="Arial" w:hAnsi="Arial"/>
           <w:sz w:val="28"/>
         </w:rPr>
-        <w:t xml:space="preserve">5. #42-new — the rest of Options into the engine. Calendar shading</w:t>
+        <w:t xml:space="preserve">9. #42-new — the rest of Options into the engine. Calendar shading</w:t>
       </w:r>
     </w:p>
     <w:p>
@@ -1612,7 +1876,7 @@
           <w:rFonts w:ascii="Arial" w:hAnsi="Arial"/>
           <w:sz w:val="28"/>
         </w:rPr>
-        <w:t xml:space="preserve">6. #41-new — five Options answers, holidays, monthly patterns, and</w:t>
+        <w:t xml:space="preserve">10. #41-new — five Options answers, holidays, monthly patterns, and</w:t>
       </w:r>
     </w:p>
     <w:p>
@@ -1672,7 +1936,7 @@
           <w:rFonts w:ascii="Arial" w:hAnsi="Arial"/>
           <w:sz w:val="28"/>
         </w:rPr>
-        <w:t xml:space="preserve">7. #40-new — five hardening points, and time zone into the engine.</w:t>
+        <w:t xml:space="preserve">11. #40-new — five hardening points, and time zone into the engine.</w:t>
       </w:r>
     </w:p>
     <w:p>
@@ -1744,7 +2008,7 @@
           <w:rFonts w:ascii="Arial" w:hAnsi="Arial"/>
           <w:sz w:val="28"/>
         </w:rPr>
-        <w:t xml:space="preserve">8. #39-new — the live one-store cutover. Pages, banners and Siri write</w:t>
+        <w:t xml:space="preserve">12. #39-new — the live one-store cutover. Pages, banners and Siri write</w:t>
       </w:r>
     </w:p>
     <w:p>
@@ -1780,7 +2044,7 @@
           <w:rFonts w:ascii="Arial" w:hAnsi="Arial"/>
           <w:sz w:val="28"/>
         </w:rPr>
-        <w:t xml:space="preserve">9. #38-new — the engine and Options path read end to end. The core</w:t>
+        <w:t xml:space="preserve">13. #38-new — the engine and Options path read end to end. The core</w:t>
       </w:r>
     </w:p>
     <w:p>
@@ -1828,7 +2092,7 @@
           <w:rFonts w:ascii="Arial" w:hAnsi="Arial"/>
           <w:sz w:val="28"/>
         </w:rPr>
-        <w:t xml:space="preserve">10. #37-new — Options connecting: + OPT writes the cases that apply,</w:t>
+        <w:t xml:space="preserve">14. #37-new — Options connecting: + OPT writes the cases that apply,</w:t>
       </w:r>
     </w:p>
     <w:p>
@@ -1864,7 +2128,7 @@
           <w:rFonts w:ascii="Arial" w:hAnsi="Arial"/>
           <w:sz w:val="28"/>
         </w:rPr>
-        <w:t xml:space="preserve">11. #36-new — logs on Weekly, Monthly, Quarterly, Yearly, One Time,</w:t>
+        <w:t xml:space="preserve">15. #36-new — logs on Weekly, Monthly, Quarterly, Yearly, One Time,</w:t>
       </w:r>
     </w:p>
     <w:p>
@@ -1948,7 +2212,7 @@
           <w:rFonts w:ascii="Arial" w:hAnsi="Arial"/>
           <w:sz w:val="28"/>
         </w:rPr>
-        <w:t xml:space="preserve">12. #35-new — old screens out, including the `/myday` hop. Backup</w:t>
+        <w:t xml:space="preserve">16. #35-new — old screens out, including the `/myday` hop. Backup</w:t>
       </w:r>
     </w:p>
     <w:p>
@@ -1984,7 +2248,7 @@
           <w:rFonts w:ascii="Arial" w:hAnsi="Arial"/>
           <w:sz w:val="28"/>
         </w:rPr>
-        <w:t xml:space="preserve">13. #34-new — Weekly through Options and the + Add popup built.</w:t>
+        <w:t xml:space="preserve">17. #34-new — Weekly through Options and the + Add popup built.</w:t>
       </w:r>
     </w:p>
     <w:p>
@@ -2020,7 +2284,7 @@
           <w:rFonts w:ascii="Arial" w:hAnsi="Arial"/>
           <w:sz w:val="28"/>
         </w:rPr>
-        <w:t xml:space="preserve">14. #33-new — Daily built. Snooze, Done, hold-and-slide reorder, My</w:t>
+        <w:t xml:space="preserve">18. #33-new — Daily built. Snooze, Done, hold-and-slide reorder, My</w:t>
       </w:r>
     </w:p>
     <w:p>
@@ -2056,7 +2320,7 @@
           <w:rFonts w:ascii="Arial" w:hAnsi="Arial"/>
           <w:sz w:val="28"/>
         </w:rPr>
-        <w:t xml:space="preserve">15. #32-new — the pages phase spec, and Daily's first job sheet.</w:t>
+        <w:t xml:space="preserve">19. #32-new — the pages phase spec, and Daily's first job sheet.</w:t>
       </w:r>
     </w:p>
     <w:p>
@@ -2080,7 +2344,7 @@
           <w:rFonts w:ascii="Arial" w:hAnsi="Arial"/>
           <w:sz w:val="28"/>
         </w:rPr>
-        <w:t xml:space="preserve">16. #31-new — the record itself put right. The hand-off file went</w:t>
+        <w:t xml:space="preserve">20. #31-new — the record itself put right. The hand-off file went</w:t>
       </w:r>
     </w:p>
     <w:p>
@@ -2176,7 +2440,7 @@
           <w:rFonts w:ascii="Arial" w:hAnsi="Arial"/>
           <w:sz w:val="28"/>
         </w:rPr>
-        <w:t xml:space="preserve">17. #30-new — the reminder pages named and shaped, and the one Input</w:t>
+        <w:t xml:space="preserve">21. #30-new — the reminder pages named and shaped, and the one Input</w:t>
       </w:r>
     </w:p>
     <w:p>
@@ -2200,7 +2464,7 @@
           <w:rFonts w:ascii="Arial" w:hAnsi="Arial"/>
           <w:sz w:val="28"/>
         </w:rPr>
-        <w:t xml:space="preserve">18. #28-new — the engine gained repeat groups, skip, and time zones</w:t>
+        <w:t xml:space="preserve">22. #28-new — the engine gained repeat groups, skip, and time zones</w:t>
       </w:r>
     </w:p>
     <w:p>
@@ -2224,7 +2488,7 @@
           <w:rFonts w:ascii="Arial" w:hAnsi="Arial"/>
           <w:sz w:val="28"/>
         </w:rPr>
-        <w:t xml:space="preserve">19. #27-new — all five reminder screens went onto the one machine,</w:t>
+        <w:t xml:space="preserve">23. #27-new — all five reminder screens went onto the one machine,</w:t>
       </w:r>
     </w:p>
     <w:p>
@@ -2284,7 +2548,7 @@
           <w:rFonts w:ascii="Arial" w:hAnsi="Arial"/>
           <w:sz w:val="28"/>
         </w:rPr>
-        <w:t xml:space="preserve">20. #26-new — the per-screen translators became one translator and a</w:t>
+        <w:t xml:space="preserve">24. #26-new — the per-screen translators became one translator and a</w:t>
       </w:r>
     </w:p>
     <w:p>
@@ -2308,7 +2572,7 @@
           <w:rFonts w:ascii="Arial" w:hAnsi="Arial"/>
           <w:sz w:val="28"/>
         </w:rPr>
-        <w:t xml:space="preserve">21. #24-new and #25-new — the first two translators, My Day and</w:t>
+        <w:t xml:space="preserve">25. #24-new and #25-new — the first two translators, My Day and</w:t>
       </w:r>
     </w:p>
     <w:p>
@@ -2344,7 +2608,7 @@
           <w:rFonts w:ascii="Arial" w:hAnsi="Arial"/>
           <w:sz w:val="28"/>
         </w:rPr>
-        <w:t xml:space="preserve">22. #23-new — the common shape and the two decision blocks built and</w:t>
+        <w:t xml:space="preserve">26. #23-new — the common shape and the two decision blocks built and</w:t>
       </w:r>
     </w:p>
     <w:p>
@@ -2368,7 +2632,7 @@
           <w:rFonts w:ascii="Arial" w:hAnsi="Arial"/>
           <w:sz w:val="28"/>
         </w:rPr>
-        <w:t xml:space="preserve">23. #22-new — the field names settled, and setting reminders two</w:t>
+        <w:t xml:space="preserve">27. #22-new — the field names settled, and setting reminders two</w:t>
       </w:r>
     </w:p>
     <w:p>
@@ -2392,7 +2656,7 @@
           <w:rFonts w:ascii="Arial" w:hAnsi="Arial"/>
           <w:sz w:val="28"/>
         </w:rPr>
-        <w:t xml:space="preserve">24. #21-new — the common shape settled on paper, all five screens</w:t>
+        <w:t xml:space="preserve">28. #21-new — the common shape settled on paper, all five screens</w:t>
       </w:r>
     </w:p>
     <w:p>
@@ -2416,7 +2680,7 @@
           <w:rFonts w:ascii="Arial" w:hAnsi="Arial"/>
           <w:sz w:val="28"/>
         </w:rPr>
-        <w:t xml:space="preserve">25. #20-new — My Week's Delay written down like the others, and the</w:t>
+        <w:t xml:space="preserve">29. #20-new — My Week's Delay written down like the others, and the</w:t>
       </w:r>
     </w:p>
     <w:p>
@@ -2440,7 +2704,7 @@
           <w:rFonts w:ascii="Arial" w:hAnsi="Arial"/>
           <w:sz w:val="28"/>
         </w:rPr>
-        <w:t xml:space="preserve">26. #19-new — your epiphany: one shape instead of six, the reminder</w:t>
+        <w:t xml:space="preserve">30. #19-new — your epiphany: one shape instead of six, the reminder</w:t>
       </w:r>
     </w:p>
     <w:p>
@@ -2464,7 +2728,7 @@
           <w:rFonts w:ascii="Arial" w:hAnsi="Arial"/>
           <w:sz w:val="28"/>
         </w:rPr>
-        <w:t xml:space="preserve">27. #18-new — the outsider's report checked. The answer was mend</w:t>
+        <w:t xml:space="preserve">31. #18-new — the outsider's report checked. The answer was mend</w:t>
       </w:r>
     </w:p>
     <w:p>
@@ -2500,7 +2764,7 @@
           <w:rFonts w:ascii="Arial" w:hAnsi="Arial"/>
           <w:sz w:val="28"/>
         </w:rPr>
-        <w:t xml:space="preserve">28. #15-new to #17-new — the failure pop-up and the missed-firing</w:t>
+        <w:t xml:space="preserve">32. #15-new to #17-new — the failure pop-up and the missed-firing</w:t>
       </w:r>
     </w:p>
     <w:p>
@@ -2536,7 +2800,7 @@
           <w:rFonts w:ascii="Arial" w:hAnsi="Arial"/>
           <w:sz w:val="28"/>
         </w:rPr>
-        <w:t xml:space="preserve">29. #13-new and #14-new — tapping a reminder lands on its own item</w:t>
+        <w:t xml:space="preserve">33. #13-new and #14-new — tapping a reminder lands on its own item</w:t>
       </w:r>
     </w:p>
     <w:p>
@@ -2560,7 +2824,7 @@
           <w:rFonts w:ascii="Arial" w:hAnsi="Arial"/>
           <w:sz w:val="28"/>
         </w:rPr>
-        <w:t xml:space="preserve">30. #12-new — the Scheduled Reminders screen, showing every</w:t>
+        <w:t xml:space="preserve">34. #12-new — the Scheduled Reminders screen, showing every</w:t>
       </w:r>
     </w:p>
     <w:p>
@@ -2584,7 +2848,7 @@
           <w:rFonts w:ascii="Arial" w:hAnsi="Arial"/>
           <w:sz w:val="28"/>
         </w:rPr>
-        <w:t xml:space="preserve">31. #6-new to #12-new — the scheduler built in eight steps, so one</w:t>
+        <w:t xml:space="preserve">35. #6-new to #12-new — the scheduler built in eight steps, so one</w:t>
       </w:r>
     </w:p>
     <w:p>
@@ -2608,7 +2872,7 @@
           <w:rFonts w:ascii="Arial" w:hAnsi="Arial"/>
           <w:sz w:val="28"/>
         </w:rPr>
-        <w:t xml:space="preserve">32. #4-new — the first notification fixes. Real, and kept, but not</w:t>
+        <w:t xml:space="preserve">36. #4-new — the first notification fixes. Real, and kept, but not</w:t>
       </w:r>
     </w:p>
     <w:p>

</xml_diff>

<commit_message>
#51-new, Memory, change display features on various pages.
</commit_message>
<xml_diff>
--- a/docs/pending.docx
+++ b/docs/pending.docx
@@ -24,7 +24,7 @@
           <w:rFonts w:ascii="Arial" w:hAnsi="Arial"/>
           <w:sz w:val="28"/>
         </w:rPr>
-        <w:t xml:space="preserve">Last updated: 2026-09-01 (#49-new)</w:t>
+        <w:t xml:space="preserve">Last updated: 2026-09-01 (#51-new)</w:t>
       </w:r>
     </w:p>
     <w:p>
@@ -229,19 +229,19 @@
           <w:rFonts w:ascii="Arial" w:hAnsi="Arial"/>
           <w:sz w:val="28"/>
         </w:rPr>
-        <w:t xml:space="preserve">1. LOOK AT THE OTHER PAGES IN LANDSCAPE. The calendar is allowed</w:t>
-      </w:r>
-    </w:p>
-    <w:p>
-      <w:pPr>
-        <w:spacing w:line="276" w:lineRule="auto"/>
-      </w:pPr>
-      <w:r>
-        <w:rPr>
-          <w:rFonts w:ascii="Arial" w:hAnsi="Arial"/>
-          <w:sz w:val="28"/>
-        </w:rPr>
-        <w:t xml:space="preserve">   to turn; the rest still stay upright. He asked to see them too.</w:t>
+        <w:t xml:space="preserve">1. PATRICK LEADS. Pending 2 and 4 are not done. Display features,</w:t>
+      </w:r>
+    </w:p>
+    <w:p>
+      <w:pPr>
+        <w:spacing w:line="276" w:lineRule="auto"/>
+      </w:pPr>
+      <w:r>
+        <w:rPr>
+          <w:rFonts w:ascii="Arial" w:hAnsi="Arial"/>
+          <w:sz w:val="28"/>
+        </w:rPr>
+        <w:t xml:space="preserve">   if any, are not yet named.</w:t>
       </w:r>
     </w:p>
     <w:p>
@@ -434,31 +434,67 @@
           <w:rFonts w:ascii="Arial" w:hAnsi="Arial"/>
           <w:sz w:val="28"/>
         </w:rPr>
-        <w:t xml:space="preserve">   shading row came out; the saved field stays. Landscape is allowed</w:t>
-      </w:r>
-    </w:p>
-    <w:p>
-      <w:pPr>
-        <w:spacing w:line="276" w:lineRule="auto"/>
-      </w:pPr>
-      <w:r>
-        <w:rPr>
-          <w:rFonts w:ascii="Arial" w:hAnsi="Arial"/>
-          <w:sz w:val="28"/>
-        </w:rPr>
-        <w:t xml:space="preserve">   on the calendar. A fresh simulator build is needed before a turn</w:t>
-      </w:r>
-    </w:p>
-    <w:p>
-      <w:pPr>
-        <w:spacing w:line="276" w:lineRule="auto"/>
-      </w:pPr>
-      <w:r>
-        <w:rPr>
-          <w:rFonts w:ascii="Arial" w:hAnsi="Arial"/>
-          <w:sz w:val="28"/>
-        </w:rPr>
-        <w:t xml:space="preserve">   will take.</w:t>
+        <w:t xml:space="preserve">   shading row came out; the saved field stays. #50-new put landscape</w:t>
+      </w:r>
+    </w:p>
+    <w:p>
+      <w:pPr>
+        <w:spacing w:line="276" w:lineRule="auto"/>
+      </w:pPr>
+      <w:r>
+        <w:rPr>
+          <w:rFonts w:ascii="Arial" w:hAnsi="Arial"/>
+          <w:sz w:val="28"/>
+        </w:rPr>
+        <w:t xml:space="preserve">   on every page, including the ones that open from a page: optional</w:t>
+      </w:r>
+    </w:p>
+    <w:p>
+      <w:pPr>
+        <w:spacing w:line="276" w:lineRule="auto"/>
+      </w:pPr>
+      <w:r>
+        <w:rPr>
+          <w:rFonts w:ascii="Arial" w:hAnsi="Arial"/>
+          <w:sz w:val="28"/>
+        </w:rPr>
+        <w:t xml:space="preserve">   view, 0 and 90 only, header as the portrait row with the Bridge.</w:t>
+      </w:r>
+    </w:p>
+    <w:p>
+      <w:pPr>
+        <w:spacing w:line="276" w:lineRule="auto"/>
+      </w:pPr>
+      <w:r>
+        <w:rPr>
+          <w:rFonts w:ascii="Arial" w:hAnsi="Arial"/>
+          <w:sz w:val="28"/>
+        </w:rPr>
+        <w:t xml:space="preserve">   Header buttons turn in place so the words sit the right way up.</w:t>
+      </w:r>
+    </w:p>
+    <w:p>
+      <w:pPr>
+        <w:spacing w:line="276" w:lineRule="auto"/>
+      </w:pPr>
+      <w:r>
+        <w:rPr>
+          <w:rFonts w:ascii="Arial" w:hAnsi="Arial"/>
+          <w:sz w:val="28"/>
+        </w:rPr>
+        <w:t xml:space="preserve">   Calendar and landscape are not on the phone yet. The simulator</w:t>
+      </w:r>
+    </w:p>
+    <w:p>
+      <w:pPr>
+        <w:spacing w:line="276" w:lineRule="auto"/>
+      </w:pPr>
+      <w:r>
+        <w:rPr>
+          <w:rFonts w:ascii="Arial" w:hAnsi="Arial"/>
+          <w:sz w:val="28"/>
+        </w:rPr>
+        <w:t xml:space="preserve">   app was deleted so leftover sitting items are gone from that store.</w:t>
       </w:r>
     </w:p>
     <w:p>
@@ -1263,19 +1299,19 @@
           <w:rFonts w:ascii="Arial" w:hAnsi="Arial"/>
           <w:sz w:val="28"/>
         </w:rPr>
-        <w:t xml:space="preserve">    Names in a day box are one line and scroll vertically. They</w:t>
-      </w:r>
-    </w:p>
-    <w:p>
-      <w:pPr>
-        <w:spacing w:line="276" w:lineRule="auto"/>
-      </w:pPr>
-      <w:r>
-        <w:rPr>
-          <w:rFonts w:ascii="Arial" w:hAnsi="Arial"/>
-          <w:sz w:val="28"/>
-        </w:rPr>
-        <w:t xml:space="preserve">    need landscape now. The calendar is allowed to turn.</w:t>
+        <w:t xml:space="preserve">    Names in a day box are one line and scroll vertically.</w:t>
+      </w:r>
+    </w:p>
+    <w:p>
+      <w:pPr>
+        <w:spacing w:line="276" w:lineRule="auto"/>
+      </w:pPr>
+      <w:r>
+        <w:rPr>
+          <w:rFonts w:ascii="Arial" w:hAnsi="Arial"/>
+          <w:sz w:val="28"/>
+        </w:rPr>
+        <w:t xml:space="preserve">    Landscape is an optional view, 0 and 90 only, all pages.</w:t>
       </w:r>
     </w:p>
     <w:p>
@@ -1372,7 +1408,139 @@
           <w:rFonts w:ascii="Arial" w:hAnsi="Arial"/>
           <w:sz w:val="28"/>
         </w:rPr>
-        <w:t xml:space="preserve">1. #49-new — calendar page built from the sheet. Options Calendar</w:t>
+        <w:t xml:space="preserve">1. #51-new — display features: header buttons and the Home badge</w:t>
+      </w:r>
+    </w:p>
+    <w:p>
+      <w:pPr>
+        <w:spacing w:line="276" w:lineRule="auto"/>
+      </w:pPr>
+      <w:r>
+        <w:rPr>
+          <w:rFonts w:ascii="Arial" w:hAnsi="Arial"/>
+          <w:sz w:val="28"/>
+        </w:rPr>
+        <w:t xml:space="preserve">   face sit the right way up in landscape; Home's badges four across</w:t>
+      </w:r>
+    </w:p>
+    <w:p>
+      <w:pPr>
+        <w:spacing w:line="276" w:lineRule="auto"/>
+      </w:pPr>
+      <w:r>
+        <w:rPr>
+          <w:rFonts w:ascii="Arial" w:hAnsi="Arial"/>
+          <w:sz w:val="28"/>
+        </w:rPr>
+        <w:t xml:space="preserve">   and three down; Memory asks at start; Monthly / Quarterly /</w:t>
+      </w:r>
+    </w:p>
+    <w:p>
+      <w:pPr>
+        <w:spacing w:line="276" w:lineRule="auto"/>
+      </w:pPr>
+      <w:r>
+        <w:rPr>
+          <w:rFonts w:ascii="Arial" w:hAnsi="Arial"/>
+          <w:sz w:val="28"/>
+        </w:rPr>
+        <w:t xml:space="preserve">   Yearly banners name their own page; no snooze without a reminder;</w:t>
+      </w:r>
+    </w:p>
+    <w:p>
+      <w:pPr>
+        <w:spacing w:line="276" w:lineRule="auto"/>
+      </w:pPr>
+      <w:r>
+        <w:rPr>
+          <w:rFonts w:ascii="Arial" w:hAnsi="Arial"/>
+          <w:sz w:val="28"/>
+        </w:rPr>
+        <w:t xml:space="preserve">   the row button says Done? until a tap. Pending 2 and 4 checked,</w:t>
+      </w:r>
+    </w:p>
+    <w:p>
+      <w:pPr>
+        <w:spacing w:line="276" w:lineRule="auto"/>
+      </w:pPr>
+      <w:r>
+        <w:rPr>
+          <w:rFonts w:ascii="Arial" w:hAnsi="Arial"/>
+          <w:sz w:val="28"/>
+        </w:rPr>
+        <w:t xml:space="preserve">   not done. Phone not touched.</w:t>
+      </w:r>
+    </w:p>
+    <w:p>
+      <w:pPr>
+        <w:spacing w:line="276" w:lineRule="auto"/>
+      </w:pPr>
+      <w:r>
+        <w:rPr>
+          <w:rFonts w:ascii="Arial" w:hAnsi="Arial"/>
+          <w:sz w:val="28"/>
+        </w:rPr>
+        <w:t xml:space="preserve">2. #50-new — the other pages in landscape. Optional view, 0 and 90</w:t>
+      </w:r>
+    </w:p>
+    <w:p>
+      <w:pPr>
+        <w:spacing w:line="276" w:lineRule="auto"/>
+      </w:pPr>
+      <w:r>
+        <w:rPr>
+          <w:rFonts w:ascii="Arial" w:hAnsi="Arial"/>
+          <w:sz w:val="28"/>
+        </w:rPr>
+        <w:t xml:space="preserve">   only. Header stays the portrait row, Bridge with it, at the top</w:t>
+      </w:r>
+    </w:p>
+    <w:p>
+      <w:pPr>
+        <w:spacing w:line="276" w:lineRule="auto"/>
+      </w:pPr>
+      <w:r>
+        <w:rPr>
+          <w:rFonts w:ascii="Arial" w:hAnsi="Arial"/>
+          <w:sz w:val="28"/>
+        </w:rPr>
+        <w:t xml:space="preserve">   of the phone. Covers turn with the page. Calendar month grid not</w:t>
+      </w:r>
+    </w:p>
+    <w:p>
+      <w:pPr>
+        <w:spacing w:line="276" w:lineRule="auto"/>
+      </w:pPr>
+      <w:r>
+        <w:rPr>
+          <w:rFonts w:ascii="Arial" w:hAnsi="Arial"/>
+          <w:sz w:val="28"/>
+        </w:rPr>
+        <w:t xml:space="preserve">   rebuilt. Simulator still held leftover sitting items; he deleted</w:t>
+      </w:r>
+    </w:p>
+    <w:p>
+      <w:pPr>
+        <w:spacing w:line="276" w:lineRule="auto"/>
+      </w:pPr>
+      <w:r>
+        <w:rPr>
+          <w:rFonts w:ascii="Arial" w:hAnsi="Arial"/>
+          <w:sz w:val="28"/>
+        </w:rPr>
+        <w:t xml:space="preserve">   the Memory app there. Goal accomplished. Phone not touched.</w:t>
+      </w:r>
+    </w:p>
+    <w:p>
+      <w:pPr>
+        <w:spacing w:line="276" w:lineRule="auto"/>
+      </w:pPr>
+      <w:r>
+        <w:rPr>
+          <w:rFonts w:ascii="Arial" w:hAnsi="Arial"/>
+          <w:sz w:val="28"/>
+        </w:rPr>
+        <w:t xml:space="preserve">3. #49-new — calendar page built from the sheet. Options Calendar</w:t>
       </w:r>
     </w:p>
     <w:p>
@@ -1432,19 +1600,19 @@
           <w:rFonts w:ascii="Arial" w:hAnsi="Arial"/>
           <w:sz w:val="28"/>
         </w:rPr>
-        <w:t xml:space="preserve">2. #48-new — calendar build sheet written. No code.</w:t>
-      </w:r>
-    </w:p>
-    <w:p>
-      <w:pPr>
-        <w:spacing w:line="276" w:lineRule="auto"/>
-      </w:pPr>
-      <w:r>
-        <w:rPr>
-          <w:rFonts w:ascii="Arial" w:hAnsi="Arial"/>
-          <w:sz w:val="28"/>
-        </w:rPr>
-        <w:t xml:space="preserve">3. #47-new — selling description a good start and left. Features</w:t>
+        <w:t xml:space="preserve">4. #48-new — calendar build sheet written. No code.</w:t>
+      </w:r>
+    </w:p>
+    <w:p>
+      <w:pPr>
+        <w:spacing w:line="276" w:lineRule="auto"/>
+      </w:pPr>
+      <w:r>
+        <w:rPr>
+          <w:rFonts w:ascii="Arial" w:hAnsi="Arial"/>
+          <w:sz w:val="28"/>
+        </w:rPr>
+        <w:t xml:space="preserve">5. #47-new — selling description a good start and left. Features</w:t>
       </w:r>
     </w:p>
     <w:p>
@@ -1516,7 +1684,7 @@
           <w:rFonts w:ascii="Arial" w:hAnsi="Arial"/>
           <w:sz w:val="28"/>
         </w:rPr>
-        <w:t xml:space="preserve">4. #46-new — selling description begun, publishing picture written.</w:t>
+        <w:t xml:space="preserve">6. #46-new — selling description begun, publishing picture written.</w:t>
       </w:r>
     </w:p>
     <w:p>
@@ -1552,7 +1720,7 @@
           <w:rFonts w:ascii="Arial" w:hAnsi="Arial"/>
           <w:sz w:val="28"/>
         </w:rPr>
-        <w:t xml:space="preserve">5. App-Docs, 2026-08-31 — working documents stay in docs; history</w:t>
+        <w:t xml:space="preserve">7. App-Docs, 2026-08-31 — working documents stay in docs; history</w:t>
       </w:r>
     </w:p>
     <w:p>
@@ -1588,7 +1756,7 @@
           <w:rFonts w:ascii="Arial" w:hAnsi="Arial"/>
           <w:sz w:val="28"/>
         </w:rPr>
-        <w:t xml:space="preserve">6. #45-new — the two engine Fails from the sitting: Daily after Done</w:t>
+        <w:t xml:space="preserve">8. #45-new — the two engine Fails from the sitting: Daily after Done</w:t>
       </w:r>
     </w:p>
     <w:p>
@@ -1696,7 +1864,7 @@
           <w:rFonts w:ascii="Arial" w:hAnsi="Arial"/>
           <w:sz w:val="28"/>
         </w:rPr>
-        <w:t xml:space="preserve">7. #44-new — the automated load built, and the simulator sitting</w:t>
+        <w:t xml:space="preserve">9. #44-new — the automated load built, and the simulator sitting</w:t>
       </w:r>
     </w:p>
     <w:p>
@@ -1744,7 +1912,7 @@
           <w:rFonts w:ascii="Arial" w:hAnsi="Arial"/>
           <w:sz w:val="28"/>
         </w:rPr>
-        <w:t xml:space="preserve">8. #43-new — the automated-load job sheet and the sitting list.</w:t>
+        <w:t xml:space="preserve">10. #43-new — the automated-load job sheet and the sitting list.</w:t>
       </w:r>
     </w:p>
     <w:p>
@@ -1792,7 +1960,7 @@
           <w:rFonts w:ascii="Arial" w:hAnsi="Arial"/>
           <w:sz w:val="28"/>
         </w:rPr>
-        <w:t xml:space="preserve">9. #42-new — the rest of Options into the engine. Calendar shading</w:t>
+        <w:t xml:space="preserve">11. #42-new — the rest of Options into the engine. Calendar shading</w:t>
       </w:r>
     </w:p>
     <w:p>
@@ -1876,7 +2044,7 @@
           <w:rFonts w:ascii="Arial" w:hAnsi="Arial"/>
           <w:sz w:val="28"/>
         </w:rPr>
-        <w:t xml:space="preserve">10. #41-new — five Options answers, holidays, monthly patterns, and</w:t>
+        <w:t xml:space="preserve">12. #41-new — five Options answers, holidays, monthly patterns, and</w:t>
       </w:r>
     </w:p>
     <w:p>
@@ -1936,7 +2104,7 @@
           <w:rFonts w:ascii="Arial" w:hAnsi="Arial"/>
           <w:sz w:val="28"/>
         </w:rPr>
-        <w:t xml:space="preserve">11. #40-new — five hardening points, and time zone into the engine.</w:t>
+        <w:t xml:space="preserve">13. #40-new — five hardening points, and time zone into the engine.</w:t>
       </w:r>
     </w:p>
     <w:p>
@@ -2008,7 +2176,7 @@
           <w:rFonts w:ascii="Arial" w:hAnsi="Arial"/>
           <w:sz w:val="28"/>
         </w:rPr>
-        <w:t xml:space="preserve">12. #39-new — the live one-store cutover. Pages, banners and Siri write</w:t>
+        <w:t xml:space="preserve">14. #39-new — the live one-store cutover. Pages, banners and Siri write</w:t>
       </w:r>
     </w:p>
     <w:p>
@@ -2044,7 +2212,7 @@
           <w:rFonts w:ascii="Arial" w:hAnsi="Arial"/>
           <w:sz w:val="28"/>
         </w:rPr>
-        <w:t xml:space="preserve">13. #38-new — the engine and Options path read end to end. The core</w:t>
+        <w:t xml:space="preserve">15. #38-new — the engine and Options path read end to end. The core</w:t>
       </w:r>
     </w:p>
     <w:p>
@@ -2092,7 +2260,7 @@
           <w:rFonts w:ascii="Arial" w:hAnsi="Arial"/>
           <w:sz w:val="28"/>
         </w:rPr>
-        <w:t xml:space="preserve">14. #37-new — Options connecting: + OPT writes the cases that apply,</w:t>
+        <w:t xml:space="preserve">16. #37-new — Options connecting: + OPT writes the cases that apply,</w:t>
       </w:r>
     </w:p>
     <w:p>
@@ -2128,7 +2296,7 @@
           <w:rFonts w:ascii="Arial" w:hAnsi="Arial"/>
           <w:sz w:val="28"/>
         </w:rPr>
-        <w:t xml:space="preserve">15. #36-new — logs on Weekly, Monthly, Quarterly, Yearly, One Time,</w:t>
+        <w:t xml:space="preserve">17. #36-new — logs on Weekly, Monthly, Quarterly, Yearly, One Time,</w:t>
       </w:r>
     </w:p>
     <w:p>
@@ -2212,7 +2380,7 @@
           <w:rFonts w:ascii="Arial" w:hAnsi="Arial"/>
           <w:sz w:val="28"/>
         </w:rPr>
-        <w:t xml:space="preserve">16. #35-new — old screens out, including the `/myday` hop. Backup</w:t>
+        <w:t xml:space="preserve">18. #35-new — old screens out, including the `/myday` hop. Backup</w:t>
       </w:r>
     </w:p>
     <w:p>
@@ -2248,7 +2416,7 @@
           <w:rFonts w:ascii="Arial" w:hAnsi="Arial"/>
           <w:sz w:val="28"/>
         </w:rPr>
-        <w:t xml:space="preserve">17. #34-new — Weekly through Options and the + Add popup built.</w:t>
+        <w:t xml:space="preserve">19. #34-new — Weekly through Options and the + Add popup built.</w:t>
       </w:r>
     </w:p>
     <w:p>
@@ -2284,7 +2452,7 @@
           <w:rFonts w:ascii="Arial" w:hAnsi="Arial"/>
           <w:sz w:val="28"/>
         </w:rPr>
-        <w:t xml:space="preserve">18. #33-new — Daily built. Snooze, Done, hold-and-slide reorder, My</w:t>
+        <w:t xml:space="preserve">20. #33-new — Daily built. Snooze, Done, hold-and-slide reorder, My</w:t>
       </w:r>
     </w:p>
     <w:p>
@@ -2320,7 +2488,7 @@
           <w:rFonts w:ascii="Arial" w:hAnsi="Arial"/>
           <w:sz w:val="28"/>
         </w:rPr>
-        <w:t xml:space="preserve">19. #32-new — the pages phase spec, and Daily's first job sheet.</w:t>
+        <w:t xml:space="preserve">21. #32-new — the pages phase spec, and Daily's first job sheet.</w:t>
       </w:r>
     </w:p>
     <w:p>
@@ -2344,7 +2512,7 @@
           <w:rFonts w:ascii="Arial" w:hAnsi="Arial"/>
           <w:sz w:val="28"/>
         </w:rPr>
-        <w:t xml:space="preserve">20. #31-new — the record itself put right. The hand-off file went</w:t>
+        <w:t xml:space="preserve">22. #31-new — the record itself put right. The hand-off file went</w:t>
       </w:r>
     </w:p>
     <w:p>
@@ -2440,7 +2608,7 @@
           <w:rFonts w:ascii="Arial" w:hAnsi="Arial"/>
           <w:sz w:val="28"/>
         </w:rPr>
-        <w:t xml:space="preserve">21. #30-new — the reminder pages named and shaped, and the one Input</w:t>
+        <w:t xml:space="preserve">23. #30-new — the reminder pages named and shaped, and the one Input</w:t>
       </w:r>
     </w:p>
     <w:p>
@@ -2464,7 +2632,7 @@
           <w:rFonts w:ascii="Arial" w:hAnsi="Arial"/>
           <w:sz w:val="28"/>
         </w:rPr>
-        <w:t xml:space="preserve">22. #28-new — the engine gained repeat groups, skip, and time zones</w:t>
+        <w:t xml:space="preserve">24. #28-new — the engine gained repeat groups, skip, and time zones</w:t>
       </w:r>
     </w:p>
     <w:p>
@@ -2488,7 +2656,7 @@
           <w:rFonts w:ascii="Arial" w:hAnsi="Arial"/>
           <w:sz w:val="28"/>
         </w:rPr>
-        <w:t xml:space="preserve">23. #27-new — all five reminder screens went onto the one machine,</w:t>
+        <w:t xml:space="preserve">25. #27-new — all five reminder screens went onto the one machine,</w:t>
       </w:r>
     </w:p>
     <w:p>
@@ -2548,7 +2716,7 @@
           <w:rFonts w:ascii="Arial" w:hAnsi="Arial"/>
           <w:sz w:val="28"/>
         </w:rPr>
-        <w:t xml:space="preserve">24. #26-new — the per-screen translators became one translator and a</w:t>
+        <w:t xml:space="preserve">26. #26-new — the per-screen translators became one translator and a</w:t>
       </w:r>
     </w:p>
     <w:p>
@@ -2572,7 +2740,7 @@
           <w:rFonts w:ascii="Arial" w:hAnsi="Arial"/>
           <w:sz w:val="28"/>
         </w:rPr>
-        <w:t xml:space="preserve">25. #24-new and #25-new — the first two translators, My Day and</w:t>
+        <w:t xml:space="preserve">27. #24-new and #25-new — the first two translators, My Day and</w:t>
       </w:r>
     </w:p>
     <w:p>
@@ -2608,7 +2776,7 @@
           <w:rFonts w:ascii="Arial" w:hAnsi="Arial"/>
           <w:sz w:val="28"/>
         </w:rPr>
-        <w:t xml:space="preserve">26. #23-new — the common shape and the two decision blocks built and</w:t>
+        <w:t xml:space="preserve">28. #23-new — the common shape and the two decision blocks built and</w:t>
       </w:r>
     </w:p>
     <w:p>
@@ -2632,7 +2800,7 @@
           <w:rFonts w:ascii="Arial" w:hAnsi="Arial"/>
           <w:sz w:val="28"/>
         </w:rPr>
-        <w:t xml:space="preserve">27. #22-new — the field names settled, and setting reminders two</w:t>
+        <w:t xml:space="preserve">29. #22-new — the field names settled, and setting reminders two</w:t>
       </w:r>
     </w:p>
     <w:p>
@@ -2656,7 +2824,7 @@
           <w:rFonts w:ascii="Arial" w:hAnsi="Arial"/>
           <w:sz w:val="28"/>
         </w:rPr>
-        <w:t xml:space="preserve">28. #21-new — the common shape settled on paper, all five screens</w:t>
+        <w:t xml:space="preserve">30. #21-new — the common shape settled on paper, all five screens</w:t>
       </w:r>
     </w:p>
     <w:p>
@@ -2680,7 +2848,7 @@
           <w:rFonts w:ascii="Arial" w:hAnsi="Arial"/>
           <w:sz w:val="28"/>
         </w:rPr>
-        <w:t xml:space="preserve">29. #20-new — My Week's Delay written down like the others, and the</w:t>
+        <w:t xml:space="preserve">31. #20-new — My Week's Delay written down like the others, and the</w:t>
       </w:r>
     </w:p>
     <w:p>
@@ -2704,7 +2872,7 @@
           <w:rFonts w:ascii="Arial" w:hAnsi="Arial"/>
           <w:sz w:val="28"/>
         </w:rPr>
-        <w:t xml:space="preserve">30. #19-new — your epiphany: one shape instead of six, the reminder</w:t>
+        <w:t xml:space="preserve">32. #19-new — your epiphany: one shape instead of six, the reminder</w:t>
       </w:r>
     </w:p>
     <w:p>
@@ -2728,7 +2896,7 @@
           <w:rFonts w:ascii="Arial" w:hAnsi="Arial"/>
           <w:sz w:val="28"/>
         </w:rPr>
-        <w:t xml:space="preserve">31. #18-new — the outsider's report checked. The answer was mend</w:t>
+        <w:t xml:space="preserve">33. #18-new — the outsider's report checked. The answer was mend</w:t>
       </w:r>
     </w:p>
     <w:p>
@@ -2764,7 +2932,7 @@
           <w:rFonts w:ascii="Arial" w:hAnsi="Arial"/>
           <w:sz w:val="28"/>
         </w:rPr>
-        <w:t xml:space="preserve">32. #15-new to #17-new — the failure pop-up and the missed-firing</w:t>
+        <w:t xml:space="preserve">34. #15-new to #17-new — the failure pop-up and the missed-firing</w:t>
       </w:r>
     </w:p>
     <w:p>
@@ -2800,7 +2968,7 @@
           <w:rFonts w:ascii="Arial" w:hAnsi="Arial"/>
           <w:sz w:val="28"/>
         </w:rPr>
-        <w:t xml:space="preserve">33. #13-new and #14-new — tapping a reminder lands on its own item</w:t>
+        <w:t xml:space="preserve">35. #13-new and #14-new — tapping a reminder lands on its own item</w:t>
       </w:r>
     </w:p>
     <w:p>
@@ -2824,7 +2992,7 @@
           <w:rFonts w:ascii="Arial" w:hAnsi="Arial"/>
           <w:sz w:val="28"/>
         </w:rPr>
-        <w:t xml:space="preserve">34. #12-new — the Scheduled Reminders screen, showing every</w:t>
+        <w:t xml:space="preserve">36. #12-new — the Scheduled Reminders screen, showing every</w:t>
       </w:r>
     </w:p>
     <w:p>
@@ -2848,7 +3016,7 @@
           <w:rFonts w:ascii="Arial" w:hAnsi="Arial"/>
           <w:sz w:val="28"/>
         </w:rPr>
-        <w:t xml:space="preserve">35. #6-new to #12-new — the scheduler built in eight steps, so one</w:t>
+        <w:t xml:space="preserve">37. #6-new to #12-new — the scheduler built in eight steps, so one</w:t>
       </w:r>
     </w:p>
     <w:p>
@@ -2872,7 +3040,7 @@
           <w:rFonts w:ascii="Arial" w:hAnsi="Arial"/>
           <w:sz w:val="28"/>
         </w:rPr>
-        <w:t xml:space="preserve">36. #4-new — the first notification fixes. Real, and kept, but not</w:t>
+        <w:t xml:space="preserve">38. #4-new — the first notification fixes. Real, and kept, but not</w:t>
       </w:r>
     </w:p>
     <w:p>

</xml_diff>

<commit_message>
#52-new, Memory Fix the landscape to the correct to 90° counter-clockwise rotation. And new ideas & issues found.
</commit_message>
<xml_diff>
--- a/docs/pending.docx
+++ b/docs/pending.docx
@@ -24,7 +24,7 @@
           <w:rFonts w:ascii="Arial" w:hAnsi="Arial"/>
           <w:sz w:val="28"/>
         </w:rPr>
-        <w:t xml:space="preserve">Last updated: 2026-09-01 (#51-new)</w:t>
+        <w:t xml:space="preserve">Last updated: 2026-09-02 (#52-new)</w:t>
       </w:r>
     </w:p>
     <w:p>
@@ -229,19 +229,31 @@
           <w:rFonts w:ascii="Arial" w:hAnsi="Arial"/>
           <w:sz w:val="28"/>
         </w:rPr>
-        <w:t xml:space="preserve">1. PATRICK LEADS. Pending 2 and 4 are not done. Display features,</w:t>
-      </w:r>
-    </w:p>
-    <w:p>
-      <w:pPr>
-        <w:spacing w:line="276" w:lineRule="auto"/>
-      </w:pPr>
-      <w:r>
-        <w:rPr>
-          <w:rFonts w:ascii="Arial" w:hAnsi="Arial"/>
-          <w:sz w:val="28"/>
-        </w:rPr>
-        <w:t xml:space="preserve">   if any, are not yet named.</w:t>
+        <w:t xml:space="preserve">1. PATRICK LEADS. The next session is #53-new. Pending 4: the</w:t>
+      </w:r>
+    </w:p>
+    <w:p>
+      <w:pPr>
+        <w:spacing w:line="276" w:lineRule="auto"/>
+      </w:pPr>
+      <w:r>
+        <w:rPr>
+          <w:rFonts w:ascii="Arial" w:hAnsi="Arial"/>
+          <w:sz w:val="28"/>
+        </w:rPr>
+        <w:t xml:space="preserve">   missed-firing notice for Weekly, Monthly, Quarterly, Yearly,</w:t>
+      </w:r>
+    </w:p>
+    <w:p>
+      <w:pPr>
+        <w:spacing w:line="276" w:lineRule="auto"/>
+      </w:pPr>
+      <w:r>
+        <w:rPr>
+          <w:rFonts w:ascii="Arial" w:hAnsi="Arial"/>
+          <w:sz w:val="28"/>
+        </w:rPr>
+        <w:t xml:space="preserve">   and One Time. Pending 2 is not done.</w:t>
       </w:r>
     </w:p>
     <w:p>
@@ -326,31 +338,43 @@
           <w:rFonts w:ascii="Arial" w:hAnsi="Arial"/>
           <w:sz w:val="28"/>
         </w:rPr>
-        <w:t xml:space="preserve">1. EVERYTHING BUILT SINCE THE LAST PHONE LOAD. He loaded this build</w:t>
-      </w:r>
-    </w:p>
-    <w:p>
-      <w:pPr>
-        <w:spacing w:line="276" w:lineRule="auto"/>
-      </w:pPr>
-      <w:r>
-        <w:rPr>
-          <w:rFonts w:ascii="Arial" w:hAnsi="Arial"/>
-          <w:sz w:val="28"/>
-        </w:rPr>
-        <w:t xml:space="preserve">   at #45-new. The sitting Check was 23 passed, 0 failed. He is living</w:t>
-      </w:r>
-    </w:p>
-    <w:p>
-      <w:pPr>
-        <w:spacing w:line="276" w:lineRule="auto"/>
-      </w:pPr>
-      <w:r>
-        <w:rPr>
-          <w:rFonts w:ascii="Arial" w:hAnsi="Arial"/>
-          <w:sz w:val="28"/>
-        </w:rPr>
-        <w:t xml:space="preserve">   with it. Time zone, holidays, a second Thursday, a Wednesday after</w:t>
+        <w:t xml:space="preserve">1. EVERYTHING BUILT SINCE THE LAST PHONE LOAD. He loaded landscape</w:t>
+      </w:r>
+    </w:p>
+    <w:p>
+      <w:pPr>
+        <w:spacing w:line="276" w:lineRule="auto"/>
+      </w:pPr>
+      <w:r>
+        <w:rPr>
+          <w:rFonts w:ascii="Arial" w:hAnsi="Arial"/>
+          <w:sz w:val="28"/>
+        </w:rPr>
+        <w:t xml:space="preserve">   this sitting (#52-new): 90° counter-clockwise, headers on the</w:t>
+      </w:r>
+    </w:p>
+    <w:p>
+      <w:pPr>
+        <w:spacing w:line="276" w:lineRule="auto"/>
+      </w:pPr>
+      <w:r>
+        <w:rPr>
+          <w:rFonts w:ascii="Arial" w:hAnsi="Arial"/>
+          <w:sz w:val="28"/>
+        </w:rPr>
+        <w:t xml:space="preserve">   left. The Sit load is on the phone; he exported his real list</w:t>
+      </w:r>
+    </w:p>
+    <w:p>
+      <w:pPr>
+        <w:spacing w:line="276" w:lineRule="auto"/>
+      </w:pPr>
+      <w:r>
+        <w:rPr>
+          <w:rFonts w:ascii="Arial" w:hAnsi="Arial"/>
+          <w:sz w:val="28"/>
+        </w:rPr>
+        <w:t xml:space="preserve">   first. Time zone, holidays, a second Thursday, a Wednesday after</w:t>
       </w:r>
     </w:p>
     <w:p>
@@ -482,19 +506,7 @@
           <w:rFonts w:ascii="Arial" w:hAnsi="Arial"/>
           <w:sz w:val="28"/>
         </w:rPr>
-        <w:t xml:space="preserve">   Calendar and landscape are not on the phone yet. The simulator</w:t>
-      </w:r>
-    </w:p>
-    <w:p>
-      <w:pPr>
-        <w:spacing w:line="276" w:lineRule="auto"/>
-      </w:pPr>
-      <w:r>
-        <w:rPr>
-          <w:rFonts w:ascii="Arial" w:hAnsi="Arial"/>
-          <w:sz w:val="28"/>
-        </w:rPr>
-        <w:t xml:space="preserve">   app was deleted so leftover sitting items are gone from that store.</w:t>
+        <w:t xml:space="preserve">   Calendar and landscape are on the phone now.</w:t>
       </w:r>
     </w:p>
     <w:p>
@@ -590,7 +602,31 @@
           <w:rFonts w:ascii="Arial" w:hAnsi="Arial"/>
           <w:sz w:val="28"/>
         </w:rPr>
-        <w:t xml:space="preserve">   That order is yours, from #19-new, restated at #39-new.</w:t>
+        <w:t xml:space="preserve">   That order is yours, from #19-new, restated at #39-new. Memory Test</w:t>
+      </w:r>
+    </w:p>
+    <w:p>
+      <w:pPr>
+        <w:spacing w:line="276" w:lineRule="auto"/>
+      </w:pPr>
+      <w:r>
+        <w:rPr>
+          <w:rFonts w:ascii="Arial" w:hAnsi="Arial"/>
+          <w:sz w:val="28"/>
+        </w:rPr>
+        <w:t xml:space="preserve">   is temporary and coming out. Timer is isolated deliberately.</w:t>
+      </w:r>
+    </w:p>
+    <w:p>
+      <w:pPr>
+        <w:spacing w:line="276" w:lineRule="auto"/>
+      </w:pPr>
+      <w:r>
+        <w:rPr>
+          <w:rFonts w:ascii="Arial" w:hAnsi="Arial"/>
+          <w:sz w:val="28"/>
+        </w:rPr>
+        <w:t xml:space="preserve">   Neither is a reason to keep these files (Patrick, #51-new).</w:t>
       </w:r>
     </w:p>
     <w:p>
@@ -614,19 +650,643 @@
           <w:rFonts w:ascii="Arial" w:hAnsi="Arial"/>
           <w:sz w:val="28"/>
         </w:rPr>
-        <w:t xml:space="preserve">    Quarterly, Yearly and One Time record no misses at all. Extending</w:t>
-      </w:r>
-    </w:p>
-    <w:p>
-      <w:pPr>
-        <w:spacing w:line="276" w:lineRule="auto"/>
-      </w:pPr>
-      <w:r>
-        <w:rPr>
-          <w:rFonts w:ascii="Arial" w:hAnsi="Arial"/>
-          <w:sz w:val="28"/>
-        </w:rPr>
-        <w:t xml:space="preserve">    it is real work still to do.</w:t>
+        <w:t xml:space="preserve">    Quarterly, Yearly and One Time record no misses at all. They still</w:t>
+      </w:r>
+    </w:p>
+    <w:p>
+      <w:pPr>
+        <w:spacing w:line="276" w:lineRule="auto"/>
+      </w:pPr>
+      <w:r>
+        <w:rPr>
+          <w:rFonts w:ascii="Arial" w:hAnsi="Arial"/>
+          <w:sz w:val="28"/>
+        </w:rPr>
+        <w:t xml:space="preserve">    show on Daily on the day they fall, stay on their own page if that</w:t>
+      </w:r>
+    </w:p>
+    <w:p>
+      <w:pPr>
+        <w:spacing w:line="276" w:lineRule="auto"/>
+      </w:pPr>
+      <w:r>
+        <w:rPr>
+          <w:rFonts w:ascii="Arial" w:hAnsi="Arial"/>
+          <w:sz w:val="28"/>
+        </w:rPr>
+        <w:t xml:space="preserve">    day goes by without Done, and come back on Daily the next time that</w:t>
+      </w:r>
+    </w:p>
+    <w:p>
+      <w:pPr>
+        <w:spacing w:line="276" w:lineRule="auto"/>
+      </w:pPr>
+      <w:r>
+        <w:rPr>
+          <w:rFonts w:ascii="Arial" w:hAnsi="Arial"/>
+          <w:sz w:val="28"/>
+        </w:rPr>
+        <w:t xml:space="preserve">    kind of day comes round. One Time is the odd one: after that day</w:t>
+      </w:r>
+    </w:p>
+    <w:p>
+      <w:pPr>
+        <w:spacing w:line="276" w:lineRule="auto"/>
+      </w:pPr>
+      <w:r>
+        <w:rPr>
+          <w:rFonts w:ascii="Arial" w:hAnsi="Arial"/>
+          <w:sz w:val="28"/>
+        </w:rPr>
+        <w:t xml:space="preserve">    it stays on One Time, leaves Daily, and has no later occurrence to</w:t>
+      </w:r>
+    </w:p>
+    <w:p>
+      <w:pPr>
+        <w:spacing w:line="276" w:lineRule="auto"/>
+      </w:pPr>
+      <w:r>
+        <w:rPr>
+          <w:rFonts w:ascii="Arial" w:hAnsi="Arial"/>
+          <w:sz w:val="28"/>
+        </w:rPr>
+        <w:t xml:space="preserve">    arm. The opening pop-up does not tell you that you missed them.</w:t>
+      </w:r>
+    </w:p>
+    <w:p>
+      <w:pPr>
+        <w:spacing w:line="276" w:lineRule="auto"/>
+      </w:pPr>
+      <w:r>
+        <w:rPr>
+          <w:rFonts w:ascii="Arial" w:hAnsi="Arial"/>
+          <w:sz w:val="28"/>
+        </w:rPr>
+        <w:t xml:space="preserve">    Extending the telling is the next session (Patrick, #52-new). The</w:t>
+      </w:r>
+    </w:p>
+    <w:p>
+      <w:pPr>
+        <w:spacing w:line="276" w:lineRule="auto"/>
+      </w:pPr>
+      <w:r>
+        <w:rPr>
+          <w:rFonts w:ascii="Arial" w:hAnsi="Arial"/>
+          <w:sz w:val="28"/>
+        </w:rPr>
+        <w:t xml:space="preserve">    two halves of recovery on opening are already built.</w:t>
+      </w:r>
+    </w:p>
+    <w:p>
+      <w:pPr>
+        <w:spacing w:line="276" w:lineRule="auto"/>
+      </w:pPr>
+      <w:r>
+        <w:rPr>
+          <w:rFonts w:ascii="Arial" w:hAnsi="Arial"/>
+          <w:sz w:val="28"/>
+        </w:rPr>
+        <w:t xml:space="preserve">5. THE DATE PICKER IS MEANT TO TURN INACTIVE when a Wednesday</w:t>
+      </w:r>
+    </w:p>
+    <w:p>
+      <w:pPr>
+        <w:spacing w:line="276" w:lineRule="auto"/>
+      </w:pPr>
+      <w:r>
+        <w:rPr>
+          <w:rFonts w:ascii="Arial" w:hAnsi="Arial"/>
+          <w:sz w:val="28"/>
+        </w:rPr>
+        <w:t xml:space="preserve">    after the 6th is in use (Patrick, #52-new). Noted only; not</w:t>
+      </w:r>
+    </w:p>
+    <w:p>
+      <w:pPr>
+        <w:spacing w:line="276" w:lineRule="auto"/>
+      </w:pPr>
+      <w:r>
+        <w:rPr>
+          <w:rFonts w:ascii="Arial" w:hAnsi="Arial"/>
+          <w:sz w:val="28"/>
+        </w:rPr>
+        <w:t xml:space="preserve">    a job yet.</w:t>
+      </w:r>
+    </w:p>
+    <w:p>
+      <w:pPr>
+        <w:spacing w:line="276" w:lineRule="auto"/>
+      </w:pPr>
+      <w:r>
+        <w:rPr>
+          <w:rFonts w:ascii="Arial" w:hAnsi="Arial"/>
+          <w:sz w:val="28"/>
+        </w:rPr>
+        <w:t xml:space="preserve">6. ONE DRAWING OF THE LIST ROW, used by Daily and by Weekly</w:t>
+      </w:r>
+    </w:p>
+    <w:p>
+      <w:pPr>
+        <w:spacing w:line="276" w:lineRule="auto"/>
+      </w:pPr>
+      <w:r>
+        <w:rPr>
+          <w:rFonts w:ascii="Arial" w:hAnsi="Arial"/>
+          <w:sz w:val="28"/>
+        </w:rPr>
+        <w:t xml:space="preserve">    through Extended (Patrick, #52-new). Daily stays a view of</w:t>
+      </w:r>
+    </w:p>
+    <w:p>
+      <w:pPr>
+        <w:spacing w:line="276" w:lineRule="auto"/>
+      </w:pPr>
+      <w:r>
+        <w:rPr>
+          <w:rFonts w:ascii="Arial" w:hAnsi="Arial"/>
+          <w:sz w:val="28"/>
+        </w:rPr>
+        <w:t xml:space="preserve">    the day, with Done and Snooze on those items. Daily still has</w:t>
+      </w:r>
+    </w:p>
+    <w:p>
+      <w:pPr>
+        <w:spacing w:line="276" w:lineRule="auto"/>
+      </w:pPr>
+      <w:r>
+        <w:rPr>
+          <w:rFonts w:ascii="Arial" w:hAnsi="Arial"/>
+          <w:sz w:val="28"/>
+        </w:rPr>
+        <w:t xml:space="preserve">    its own add and its own Log. The row is shared so a later</w:t>
+      </w:r>
+    </w:p>
+    <w:p>
+      <w:pPr>
+        <w:spacing w:line="276" w:lineRule="auto"/>
+      </w:pPr>
+      <w:r>
+        <w:rPr>
+          <w:rFonts w:ascii="Arial" w:hAnsi="Arial"/>
+          <w:sz w:val="28"/>
+        </w:rPr>
+        <w:t xml:space="preserve">    change cannot land on one list and miss the other.</w:t>
+      </w:r>
+    </w:p>
+    <w:p>
+      <w:pPr>
+        <w:spacing w:line="276" w:lineRule="auto"/>
+      </w:pPr>
+      <w:r>
+        <w:rPr>
+          <w:rFonts w:ascii="Arial" w:hAnsi="Arial"/>
+          <w:sz w:val="28"/>
+        </w:rPr>
+        <w:t xml:space="preserve">7. A TAP ON A DAY IN THE CALENDAR brings up every item for that</w:t>
+      </w:r>
+    </w:p>
+    <w:p>
+      <w:pPr>
+        <w:spacing w:line="276" w:lineRule="auto"/>
+      </w:pPr>
+      <w:r>
+        <w:rPr>
+          <w:rFonts w:ascii="Arial" w:hAnsi="Arial"/>
+          <w:sz w:val="28"/>
+        </w:rPr>
+        <w:t xml:space="preserve">    day. Those items should show the 24-hour time they are</w:t>
+      </w:r>
+    </w:p>
+    <w:p>
+      <w:pPr>
+        <w:spacing w:line="276" w:lineRule="auto"/>
+      </w:pPr>
+      <w:r>
+        <w:rPr>
+          <w:rFonts w:ascii="Arial" w:hAnsi="Arial"/>
+          <w:sz w:val="28"/>
+        </w:rPr>
+        <w:t xml:space="preserve">    scheduled to fire (Patrick, #52-new). The list today shows</w:t>
+      </w:r>
+    </w:p>
+    <w:p>
+      <w:pPr>
+        <w:spacing w:line="276" w:lineRule="auto"/>
+      </w:pPr>
+      <w:r>
+        <w:rPr>
+          <w:rFonts w:ascii="Arial" w:hAnsi="Arial"/>
+          <w:sz w:val="28"/>
+        </w:rPr>
+        <w:t xml:space="preserve">    the name only.</w:t>
+      </w:r>
+    </w:p>
+    <w:p>
+      <w:pPr>
+        <w:spacing w:line="276" w:lineRule="auto"/>
+      </w:pPr>
+      <w:r>
+        <w:rPr>
+          <w:rFonts w:ascii="Arial" w:hAnsi="Arial"/>
+          <w:sz w:val="28"/>
+        </w:rPr>
+        <w:t xml:space="preserve">8. SCHEDULED REMINDERS STILL SAYS THE OLD PAGE NAMES: My Day,</w:t>
+      </w:r>
+    </w:p>
+    <w:p>
+      <w:pPr>
+        <w:spacing w:line="276" w:lineRule="auto"/>
+      </w:pPr>
+      <w:r>
+        <w:rPr>
+          <w:rFonts w:ascii="Arial" w:hAnsi="Arial"/>
+          <w:sz w:val="28"/>
+        </w:rPr>
+        <w:t xml:space="preserve">    My Week, Look Ahead, To-Do (Patrick, #52-new). Last sitting</w:t>
+      </w:r>
+    </w:p>
+    <w:p>
+      <w:pPr>
+        <w:spacing w:line="276" w:lineRule="auto"/>
+      </w:pPr>
+      <w:r>
+        <w:rPr>
+          <w:rFonts w:ascii="Arial" w:hAnsi="Arial"/>
+          <w:sz w:val="28"/>
+        </w:rPr>
+        <w:t xml:space="preserve">    the banners for Monthly, Quarterly, and Yearly were changed</w:t>
+      </w:r>
+    </w:p>
+    <w:p>
+      <w:pPr>
+        <w:spacing w:line="276" w:lineRule="auto"/>
+      </w:pPr>
+      <w:r>
+        <w:rPr>
+          <w:rFonts w:ascii="Arial" w:hAnsi="Arial"/>
+          <w:sz w:val="28"/>
+        </w:rPr>
+        <w:t xml:space="preserve">    to name their own page. This list did not get that change.</w:t>
+      </w:r>
+    </w:p>
+    <w:p>
+      <w:pPr>
+        <w:spacing w:line="276" w:lineRule="auto"/>
+      </w:pPr>
+      <w:r>
+        <w:rPr>
+          <w:rFonts w:ascii="Arial" w:hAnsi="Arial"/>
+          <w:sz w:val="28"/>
+        </w:rPr>
+        <w:t xml:space="preserve">    The rows should name Daily, Weekly, Monthly, Quarterly,</w:t>
+      </w:r>
+    </w:p>
+    <w:p>
+      <w:pPr>
+        <w:spacing w:line="276" w:lineRule="auto"/>
+      </w:pPr>
+      <w:r>
+        <w:rPr>
+          <w:rFonts w:ascii="Arial" w:hAnsi="Arial"/>
+          <w:sz w:val="28"/>
+        </w:rPr>
+        <w:t xml:space="preserve">    Yearly, and One Time.</w:t>
+      </w:r>
+    </w:p>
+    <w:p>
+      <w:pPr>
+        <w:spacing w:line="276" w:lineRule="auto"/>
+      </w:pPr>
+      <w:r>
+        <w:rPr>
+          <w:rFonts w:ascii="Arial" w:hAnsi="Arial"/>
+          <w:sz w:val="28"/>
+        </w:rPr>
+        <w:t xml:space="preserve">9. ALL THE SCREENS SHOULD WORK IN ANY ROTATION (Patrick,</w:t>
+      </w:r>
+    </w:p>
+    <w:p>
+      <w:pPr>
+        <w:spacing w:line="276" w:lineRule="auto"/>
+      </w:pPr>
+      <w:r>
+        <w:rPr>
+          <w:rFonts w:ascii="Arial" w:hAnsi="Arial"/>
+          <w:sz w:val="28"/>
+        </w:rPr>
+        <w:t xml:space="preserve">    #52-new). Today the turn is locked to 90° counter-clockwise,</w:t>
+      </w:r>
+    </w:p>
+    <w:p>
+      <w:pPr>
+        <w:spacing w:line="276" w:lineRule="auto"/>
+      </w:pPr>
+      <w:r>
+        <w:rPr>
+          <w:rFonts w:ascii="Arial" w:hAnsi="Arial"/>
+          <w:sz w:val="28"/>
+        </w:rPr>
+        <w:t xml:space="preserve">    headers on the left. This sitting that lock is good. The</w:t>
+      </w:r>
+    </w:p>
+    <w:p>
+      <w:pPr>
+        <w:spacing w:line="276" w:lineRule="auto"/>
+      </w:pPr>
+      <w:r>
+        <w:rPr>
+          <w:rFonts w:ascii="Arial" w:hAnsi="Arial"/>
+          <w:sz w:val="28"/>
+        </w:rPr>
+        <w:t xml:space="preserve">    note is to make every page work however the phone is held.</w:t>
+      </w:r>
+    </w:p>
+    <w:p>
+      <w:pPr>
+        <w:spacing w:line="276" w:lineRule="auto"/>
+      </w:pPr>
+      <w:r>
+        <w:rPr>
+          <w:rFonts w:ascii="Arial" w:hAnsi="Arial"/>
+          <w:sz w:val="28"/>
+        </w:rPr>
+        <w:t xml:space="preserve">10. ONE TIME SHOULD BE CALLED ONE TIME APPOINTMENT(S) (Patrick,</w:t>
+      </w:r>
+    </w:p>
+    <w:p>
+      <w:pPr>
+        <w:spacing w:line="276" w:lineRule="auto"/>
+      </w:pPr>
+      <w:r>
+        <w:rPr>
+          <w:rFonts w:ascii="Arial" w:hAnsi="Arial"/>
+          <w:sz w:val="28"/>
+        </w:rPr>
+        <w:t xml:space="preserve">    #52-new). There is no reminder at the set time: that is too</w:t>
+      </w:r>
+    </w:p>
+    <w:p>
+      <w:pPr>
+        <w:spacing w:line="276" w:lineRule="auto"/>
+      </w:pPr>
+      <w:r>
+        <w:rPr>
+          <w:rFonts w:ascii="Arial" w:hAnsi="Arial"/>
+          <w:sz w:val="28"/>
+        </w:rPr>
+        <w:t xml:space="preserve">    late; you are either there or you missed it. The chips before</w:t>
+      </w:r>
+    </w:p>
+    <w:p>
+      <w:pPr>
+        <w:spacing w:line="276" w:lineRule="auto"/>
+      </w:pPr>
+      <w:r>
+        <w:rPr>
+          <w:rFonts w:ascii="Arial" w:hAnsi="Arial"/>
+          <w:sz w:val="28"/>
+        </w:rPr>
+        <w:t xml:space="preserve">    are the reminders. Not a bug.</w:t>
+      </w:r>
+    </w:p>
+    <w:p>
+      <w:pPr>
+        <w:spacing w:line="276" w:lineRule="auto"/>
+      </w:pPr>
+      <w:r>
+        <w:rPr>
+          <w:rFonts w:ascii="Arial" w:hAnsi="Arial"/>
+          <w:sz w:val="28"/>
+        </w:rPr>
+        <w:t xml:space="preserve">11. A THOROUGH DESIGN SPEC FOR THE APP (Patrick, #52-new). This</w:t>
+      </w:r>
+    </w:p>
+    <w:p>
+      <w:pPr>
+        <w:spacing w:line="276" w:lineRule="auto"/>
+      </w:pPr>
+      <w:r>
+        <w:rPr>
+          <w:rFonts w:ascii="Arial" w:hAnsi="Arial"/>
+          <w:sz w:val="28"/>
+        </w:rPr>
+        <w:t xml:space="preserve">    sitting treated One Time's missing notice at the set time as</w:t>
+      </w:r>
+    </w:p>
+    <w:p>
+      <w:pPr>
+        <w:spacing w:line="276" w:lineRule="auto"/>
+      </w:pPr>
+      <w:r>
+        <w:rPr>
+          <w:rFonts w:ascii="Arial" w:hAnsi="Arial"/>
+          <w:sz w:val="28"/>
+        </w:rPr>
+        <w:t xml:space="preserve">    a bug. He had decided it that way. A spec would have said so.</w:t>
+      </w:r>
+    </w:p>
+    <w:p>
+      <w:pPr>
+        <w:spacing w:line="276" w:lineRule="auto"/>
+      </w:pPr>
+      <w:r>
+        <w:rPr>
+          <w:rFonts w:ascii="Arial" w:hAnsi="Arial"/>
+          <w:sz w:val="28"/>
+        </w:rPr>
+        <w:t xml:space="preserve">    Changing the name of One Time to One Time Appointment(s)</w:t>
+      </w:r>
+    </w:p>
+    <w:p>
+      <w:pPr>
+        <w:spacing w:line="276" w:lineRule="auto"/>
+      </w:pPr>
+      <w:r>
+        <w:rPr>
+          <w:rFonts w:ascii="Arial" w:hAnsi="Arial"/>
+          <w:sz w:val="28"/>
+        </w:rPr>
+        <w:t xml:space="preserve">    belongs in that spec.</w:t>
+      </w:r>
+    </w:p>
+    <w:p>
+      <w:pPr>
+        <w:spacing w:line="276" w:lineRule="auto"/>
+      </w:pPr>
+      <w:r>
+        <w:rPr>
+          <w:rFonts w:ascii="Arial" w:hAnsi="Arial"/>
+          <w:sz w:val="28"/>
+        </w:rPr>
+        <w:t xml:space="preserve">12. A USER GUIDE, from that spec or merely after it (Patrick,</w:t>
+      </w:r>
+    </w:p>
+    <w:p>
+      <w:pPr>
+        <w:spacing w:line="276" w:lineRule="auto"/>
+      </w:pPr>
+      <w:r>
+        <w:rPr>
+          <w:rFonts w:ascii="Arial" w:hAnsi="Arial"/>
+          <w:sz w:val="28"/>
+        </w:rPr>
+        <w:t xml:space="preserve">    #52-new). He needs to provide it on his website, and a way</w:t>
+      </w:r>
+    </w:p>
+    <w:p>
+      <w:pPr>
+        <w:spacing w:line="276" w:lineRule="auto"/>
+      </w:pPr>
+      <w:r>
+        <w:rPr>
+          <w:rFonts w:ascii="Arial" w:hAnsi="Arial"/>
+          <w:sz w:val="28"/>
+        </w:rPr>
+        <w:t xml:space="preserve">    in the app to find it or get it.</w:t>
+      </w:r>
+    </w:p>
+    <w:p>
+      <w:pPr>
+        <w:spacing w:line="276" w:lineRule="auto"/>
+      </w:pPr>
+      <w:r>
+        <w:rPr>
+          <w:rFonts w:ascii="Arial" w:hAnsi="Arial"/>
+          <w:sz w:val="28"/>
+        </w:rPr>
+        <w:t xml:space="preserve">13. A FEEDBACK BUTTON IN THE APP, similar to Mystery (Patrick,</w:t>
+      </w:r>
+    </w:p>
+    <w:p>
+      <w:pPr>
+        <w:spacing w:line="276" w:lineRule="auto"/>
+      </w:pPr>
+      <w:r>
+        <w:rPr>
+          <w:rFonts w:ascii="Arial" w:hAnsi="Arial"/>
+          <w:sz w:val="28"/>
+        </w:rPr>
+        <w:t xml:space="preserve">    #52-new). That is how the app lets you find or get the</w:t>
+      </w:r>
+    </w:p>
+    <w:p>
+      <w:pPr>
+        <w:spacing w:line="276" w:lineRule="auto"/>
+      </w:pPr>
+      <w:r>
+        <w:rPr>
+          <w:rFonts w:ascii="Arial" w:hAnsi="Arial"/>
+          <w:sz w:val="28"/>
+        </w:rPr>
+        <w:t xml:space="preserve">    User Guide.</w:t>
+      </w:r>
+    </w:p>
+    <w:p>
+      <w:pPr>
+        <w:spacing w:line="276" w:lineRule="auto"/>
+      </w:pPr>
+      <w:r>
+        <w:rPr>
+          <w:rFonts w:ascii="Arial" w:hAnsi="Arial"/>
+          <w:sz w:val="28"/>
+        </w:rPr>
+        <w:t xml:space="preserve">14. A PAGE, SPEC, OR FILE FOR WHAT TESTING HAS COVERED AND</w:t>
+      </w:r>
+    </w:p>
+    <w:p>
+      <w:pPr>
+        <w:spacing w:line="276" w:lineRule="auto"/>
+      </w:pPr>
+      <w:r>
+        <w:rPr>
+          <w:rFonts w:ascii="Arial" w:hAnsi="Arial"/>
+          <w:sz w:val="28"/>
+        </w:rPr>
+        <w:t xml:space="preserve">    WILL COVER (Patrick, #52-new). The during-build tests are</w:t>
+      </w:r>
+    </w:p>
+    <w:p>
+      <w:pPr>
+        <w:spacing w:line="276" w:lineRule="auto"/>
+      </w:pPr>
+      <w:r>
+        <w:rPr>
+          <w:rFonts w:ascii="Arial" w:hAnsi="Arial"/>
+          <w:sz w:val="28"/>
+        </w:rPr>
+        <w:t xml:space="preserve">    thrown away. The run is not kept.</w:t>
+      </w:r>
+    </w:p>
+    <w:p>
+      <w:pPr>
+        <w:spacing w:line="276" w:lineRule="auto"/>
+      </w:pPr>
+      <w:r>
+        <w:rPr>
+          <w:rFonts w:ascii="Arial" w:hAnsi="Arial"/>
+          <w:sz w:val="28"/>
+        </w:rPr>
+        <w:t xml:space="preserve">15. A HELPER TO GUIDE THE USER through where to set the</w:t>
+      </w:r>
+    </w:p>
+    <w:p>
+      <w:pPr>
+        <w:spacing w:line="276" w:lineRule="auto"/>
+      </w:pPr>
+      <w:r>
+        <w:rPr>
+          <w:rFonts w:ascii="Arial" w:hAnsi="Arial"/>
+          <w:sz w:val="28"/>
+        </w:rPr>
+        <w:t xml:space="preserve">    reminder (Patrick, #52-new). Pictured as decision-tree</w:t>
+      </w:r>
+    </w:p>
+    <w:p>
+      <w:pPr>
+        <w:spacing w:line="276" w:lineRule="auto"/>
+      </w:pPr>
+      <w:r>
+        <w:rPr>
+          <w:rFonts w:ascii="Arial" w:hAnsi="Arial"/>
+          <w:sz w:val="28"/>
+        </w:rPr>
+        <w:t xml:space="preserve">    stages. The worth is landing on the right page. How to set</w:t>
+      </w:r>
+    </w:p>
+    <w:p>
+      <w:pPr>
+        <w:spacing w:line="276" w:lineRule="auto"/>
+      </w:pPr>
+      <w:r>
+        <w:rPr>
+          <w:rFonts w:ascii="Arial" w:hAnsi="Arial"/>
+          <w:sz w:val="28"/>
+        </w:rPr>
+        <w:t xml:space="preserve">    it is the page itself. Fine-tune options belong in the User</w:t>
+      </w:r>
+    </w:p>
+    <w:p>
+      <w:pPr>
+        <w:spacing w:line="276" w:lineRule="auto"/>
+      </w:pPr>
+      <w:r>
+        <w:rPr>
+          <w:rFonts w:ascii="Arial" w:hAnsi="Arial"/>
+          <w:sz w:val="28"/>
+        </w:rPr>
+        <w:t xml:space="preserve">    Guide or on Options, not in the same helper. He said those</w:t>
+      </w:r>
+    </w:p>
+    <w:p>
+      <w:pPr>
+        <w:spacing w:line="276" w:lineRule="auto"/>
+      </w:pPr>
+      <w:r>
+        <w:rPr>
+          <w:rFonts w:ascii="Arial" w:hAnsi="Arial"/>
+          <w:sz w:val="28"/>
+        </w:rPr>
+        <w:t xml:space="preserve">    points were good.</w:t>
       </w:r>
     </w:p>
     <w:p>
@@ -843,6 +1503,42 @@
           <w:rFonts w:ascii="Arial" w:hAnsi="Arial"/>
           <w:sz w:val="28"/>
         </w:rPr>
+        <w:t xml:space="preserve">   There is no reminder at the set time: that is too late; you</w:t>
+      </w:r>
+    </w:p>
+    <w:p>
+      <w:pPr>
+        <w:spacing w:line="276" w:lineRule="auto"/>
+      </w:pPr>
+      <w:r>
+        <w:rPr>
+          <w:rFonts w:ascii="Arial" w:hAnsi="Arial"/>
+          <w:sz w:val="28"/>
+        </w:rPr>
+        <w:t xml:space="preserve">   are either there or you missed it (Patrick, #52-new). The page</w:t>
+      </w:r>
+    </w:p>
+    <w:p>
+      <w:pPr>
+        <w:spacing w:line="276" w:lineRule="auto"/>
+      </w:pPr>
+      <w:r>
+        <w:rPr>
+          <w:rFonts w:ascii="Arial" w:hAnsi="Arial"/>
+          <w:sz w:val="28"/>
+        </w:rPr>
+        <w:t xml:space="preserve">   should be called One Time Appointment(s).</w:t>
+      </w:r>
+    </w:p>
+    <w:p>
+      <w:pPr>
+        <w:spacing w:line="276" w:lineRule="auto"/>
+      </w:pPr>
+      <w:r>
+        <w:rPr>
+          <w:rFonts w:ascii="Arial" w:hAnsi="Arial"/>
+          <w:sz w:val="28"/>
+        </w:rPr>
         <w:t xml:space="preserve">4. DAILY'S OWN ADD IS ONLY ABOUT TODAY. Two kinds: an every-day</w:t>
       </w:r>
     </w:p>
@@ -1311,7 +2007,55 @@
           <w:rFonts w:ascii="Arial" w:hAnsi="Arial"/>
           <w:sz w:val="28"/>
         </w:rPr>
-        <w:t xml:space="preserve">    Landscape is an optional view, 0 and 90 only, all pages.</w:t>
+        <w:t xml:space="preserve">    Landscape is an optional view, 0 and 90° counter-clockwise</w:t>
+      </w:r>
+    </w:p>
+    <w:p>
+      <w:pPr>
+        <w:spacing w:line="276" w:lineRule="auto"/>
+      </w:pPr>
+      <w:r>
+        <w:rPr>
+          <w:rFonts w:ascii="Arial" w:hAnsi="Arial"/>
+          <w:sz w:val="28"/>
+        </w:rPr>
+        <w:t xml:space="preserve">    only, headers on the left, all pages.</w:t>
+      </w:r>
+    </w:p>
+    <w:p>
+      <w:pPr>
+        <w:spacing w:line="276" w:lineRule="auto"/>
+      </w:pPr>
+      <w:r>
+        <w:rPr>
+          <w:rFonts w:ascii="Arial" w:hAnsi="Arial"/>
+          <w:sz w:val="28"/>
+        </w:rPr>
+        <w:t xml:space="preserve">16. HAVING A GOOD IDEA LEADS TO OVERREACHING (Patrick, #52-new).</w:t>
+      </w:r>
+    </w:p>
+    <w:p>
+      <w:pPr>
+        <w:spacing w:line="276" w:lineRule="auto"/>
+      </w:pPr>
+      <w:r>
+        <w:rPr>
+          <w:rFonts w:ascii="Arial" w:hAnsi="Arial"/>
+          <w:sz w:val="28"/>
+        </w:rPr>
+        <w:t xml:space="preserve">    The feedback he needs is the trim: what part is worth it,</w:t>
+      </w:r>
+    </w:p>
+    <w:p>
+      <w:pPr>
+        <w:spacing w:line="276" w:lineRule="auto"/>
+      </w:pPr>
+      <w:r>
+        <w:rPr>
+          <w:rFonts w:ascii="Arial" w:hAnsi="Arial"/>
+          <w:sz w:val="28"/>
+        </w:rPr>
+        <w:t xml:space="preserve">    and what is more than is there.</w:t>
       </w:r>
     </w:p>
     <w:p>
@@ -1408,7 +2152,67 @@
           <w:rFonts w:ascii="Arial" w:hAnsi="Arial"/>
           <w:sz w:val="28"/>
         </w:rPr>
-        <w:t xml:space="preserve">1. #51-new — display features: header buttons and the Home badge</w:t>
+        <w:t xml:space="preserve">1. #52-new — landscape 90° counter-clockwise, headers on the left,</w:t>
+      </w:r>
+    </w:p>
+    <w:p>
+      <w:pPr>
+        <w:spacing w:line="276" w:lineRule="auto"/>
+      </w:pPr>
+      <w:r>
+        <w:rPr>
+          <w:rFonts w:ascii="Arial" w:hAnsi="Arial"/>
+          <w:sz w:val="28"/>
+        </w:rPr>
+        <w:t xml:space="preserve">   on the phone. Sit set: seven banners Wednesday on sim and phone.</w:t>
+      </w:r>
+    </w:p>
+    <w:p>
+      <w:pPr>
+        <w:spacing w:line="276" w:lineRule="auto"/>
+      </w:pPr>
+      <w:r>
+        <w:rPr>
+          <w:rFonts w:ascii="Arial" w:hAnsi="Arial"/>
+          <w:sz w:val="28"/>
+        </w:rPr>
+        <w:t xml:space="preserve">   No 9:20 by his decision. RFC eval written. Paperwork named:</w:t>
+      </w:r>
+    </w:p>
+    <w:p>
+      <w:pPr>
+        <w:spacing w:line="276" w:lineRule="auto"/>
+      </w:pPr>
+      <w:r>
+        <w:rPr>
+          <w:rFonts w:ascii="Arial" w:hAnsi="Arial"/>
+          <w:sz w:val="28"/>
+        </w:rPr>
+        <w:t xml:space="preserve">   spec, User Guide, website, Feedback, testing file, helper for</w:t>
+      </w:r>
+    </w:p>
+    <w:p>
+      <w:pPr>
+        <w:spacing w:line="276" w:lineRule="auto"/>
+      </w:pPr>
+      <w:r>
+        <w:rPr>
+          <w:rFonts w:ascii="Arial" w:hAnsi="Arial"/>
+          <w:sz w:val="28"/>
+        </w:rPr>
+        <w:t xml:space="preserve">   where. Next is Pending 4.</w:t>
+      </w:r>
+    </w:p>
+    <w:p>
+      <w:pPr>
+        <w:spacing w:line="276" w:lineRule="auto"/>
+      </w:pPr>
+      <w:r>
+        <w:rPr>
+          <w:rFonts w:ascii="Arial" w:hAnsi="Arial"/>
+          <w:sz w:val="28"/>
+        </w:rPr>
+        <w:t xml:space="preserve">2. #51-new — display features: header buttons and the Home badge</w:t>
       </w:r>
     </w:p>
     <w:p>
@@ -1480,7 +2284,7 @@
           <w:rFonts w:ascii="Arial" w:hAnsi="Arial"/>
           <w:sz w:val="28"/>
         </w:rPr>
-        <w:t xml:space="preserve">2. #50-new — the other pages in landscape. Optional view, 0 and 90</w:t>
+        <w:t xml:space="preserve">3. #50-new — the other pages in landscape. Optional view, 0 and 90</w:t>
       </w:r>
     </w:p>
     <w:p>
@@ -1540,7 +2344,7 @@
           <w:rFonts w:ascii="Arial" w:hAnsi="Arial"/>
           <w:sz w:val="28"/>
         </w:rPr>
-        <w:t xml:space="preserve">3. #49-new — calendar page built from the sheet. Options Calendar</w:t>
+        <w:t xml:space="preserve">4. #49-new — calendar page built from the sheet. Options Calendar</w:t>
       </w:r>
     </w:p>
     <w:p>
@@ -1600,19 +2404,19 @@
           <w:rFonts w:ascii="Arial" w:hAnsi="Arial"/>
           <w:sz w:val="28"/>
         </w:rPr>
-        <w:t xml:space="preserve">4. #48-new — calendar build sheet written. No code.</w:t>
-      </w:r>
-    </w:p>
-    <w:p>
-      <w:pPr>
-        <w:spacing w:line="276" w:lineRule="auto"/>
-      </w:pPr>
-      <w:r>
-        <w:rPr>
-          <w:rFonts w:ascii="Arial" w:hAnsi="Arial"/>
-          <w:sz w:val="28"/>
-        </w:rPr>
-        <w:t xml:space="preserve">5. #47-new — selling description a good start and left. Features</w:t>
+        <w:t xml:space="preserve">5. #48-new — calendar build sheet written. No code.</w:t>
+      </w:r>
+    </w:p>
+    <w:p>
+      <w:pPr>
+        <w:spacing w:line="276" w:lineRule="auto"/>
+      </w:pPr>
+      <w:r>
+        <w:rPr>
+          <w:rFonts w:ascii="Arial" w:hAnsi="Arial"/>
+          <w:sz w:val="28"/>
+        </w:rPr>
+        <w:t xml:space="preserve">6. #47-new — selling description a good start and left. Features</w:t>
       </w:r>
     </w:p>
     <w:p>
@@ -1684,7 +2488,7 @@
           <w:rFonts w:ascii="Arial" w:hAnsi="Arial"/>
           <w:sz w:val="28"/>
         </w:rPr>
-        <w:t xml:space="preserve">6. #46-new — selling description begun, publishing picture written.</w:t>
+        <w:t xml:space="preserve">7. #46-new — selling description begun, publishing picture written.</w:t>
       </w:r>
     </w:p>
     <w:p>
@@ -1720,7 +2524,7 @@
           <w:rFonts w:ascii="Arial" w:hAnsi="Arial"/>
           <w:sz w:val="28"/>
         </w:rPr>
-        <w:t xml:space="preserve">7. App-Docs, 2026-08-31 — working documents stay in docs; history</w:t>
+        <w:t xml:space="preserve">8. App-Docs, 2026-08-31 — working documents stay in docs; history</w:t>
       </w:r>
     </w:p>
     <w:p>
@@ -1756,7 +2560,7 @@
           <w:rFonts w:ascii="Arial" w:hAnsi="Arial"/>
           <w:sz w:val="28"/>
         </w:rPr>
-        <w:t xml:space="preserve">8. #45-new — the two engine Fails from the sitting: Daily after Done</w:t>
+        <w:t xml:space="preserve">9. #45-new — the two engine Fails from the sitting: Daily after Done</w:t>
       </w:r>
     </w:p>
     <w:p>
@@ -1864,7 +2668,7 @@
           <w:rFonts w:ascii="Arial" w:hAnsi="Arial"/>
           <w:sz w:val="28"/>
         </w:rPr>
-        <w:t xml:space="preserve">9. #44-new — the automated load built, and the simulator sitting</w:t>
+        <w:t xml:space="preserve">10. #44-new — the automated load built, and the simulator sitting</w:t>
       </w:r>
     </w:p>
     <w:p>
@@ -1912,7 +2716,7 @@
           <w:rFonts w:ascii="Arial" w:hAnsi="Arial"/>
           <w:sz w:val="28"/>
         </w:rPr>
-        <w:t xml:space="preserve">10. #43-new — the automated-load job sheet and the sitting list.</w:t>
+        <w:t xml:space="preserve">11. #43-new — the automated-load job sheet and the sitting list.</w:t>
       </w:r>
     </w:p>
     <w:p>

</xml_diff>

<commit_message>
#56-new, Memory,  Old page name refs fixed.
</commit_message>
<xml_diff>
--- a/docs/pending.docx
+++ b/docs/pending.docx
@@ -24,7 +24,7 @@
           <w:rFonts w:ascii="Arial" w:hAnsi="Arial"/>
           <w:sz w:val="28"/>
         </w:rPr>
-        <w:t xml:space="preserve">Last updated: 2026-09-02 (#52-new)</w:t>
+        <w:t xml:space="preserve">Last updated: 2026-09-03 (#56-new, session close)</w:t>
       </w:r>
     </w:p>
     <w:p>
@@ -229,31 +229,295 @@
           <w:rFonts w:ascii="Arial" w:hAnsi="Arial"/>
           <w:sz w:val="28"/>
         </w:rPr>
-        <w:t xml:space="preserve">1. PATRICK LEADS. The next session is #53-new. Pending 4: the</w:t>
-      </w:r>
-    </w:p>
-    <w:p>
-      <w:pPr>
-        <w:spacing w:line="276" w:lineRule="auto"/>
-      </w:pPr>
-      <w:r>
-        <w:rPr>
-          <w:rFonts w:ascii="Arial" w:hAnsi="Arial"/>
-          <w:sz w:val="28"/>
-        </w:rPr>
-        <w:t xml:space="preserve">   missed-firing notice for Weekly, Monthly, Quarterly, Yearly,</w:t>
-      </w:r>
-    </w:p>
-    <w:p>
-      <w:pPr>
-        <w:spacing w:line="276" w:lineRule="auto"/>
-      </w:pPr>
-      <w:r>
-        <w:rPr>
-          <w:rFonts w:ascii="Arial" w:hAnsi="Arial"/>
-          <w:sz w:val="28"/>
-        </w:rPr>
-        <w:t xml:space="preserve">   and One Time. Pending 2 is not done.</w:t>
+        <w:t xml:space="preserve">1. A HELPER TO GUIDE THE USER through where to set the</w:t>
+      </w:r>
+    </w:p>
+    <w:p>
+      <w:pPr>
+        <w:spacing w:line="276" w:lineRule="auto"/>
+      </w:pPr>
+      <w:r>
+        <w:rPr>
+          <w:rFonts w:ascii="Arial" w:hAnsi="Arial"/>
+          <w:sz w:val="28"/>
+        </w:rPr>
+        <w:t xml:space="preserve">   reminder (Patrick, #52-new). **Its own session or more** — not</w:t>
+      </w:r>
+    </w:p>
+    <w:p>
+      <w:pPr>
+        <w:spacing w:line="276" w:lineRule="auto"/>
+      </w:pPr>
+      <w:r>
+        <w:rPr>
+          <w:rFonts w:ascii="Arial" w:hAnsi="Arial"/>
+          <w:sz w:val="28"/>
+        </w:rPr>
+        <w:t xml:space="preserve">   squeezed beside other work (#56-new close). Pictured as decision-tree</w:t>
+      </w:r>
+    </w:p>
+    <w:p>
+      <w:pPr>
+        <w:spacing w:line="276" w:lineRule="auto"/>
+      </w:pPr>
+      <w:r>
+        <w:rPr>
+          <w:rFonts w:ascii="Arial" w:hAnsi="Arial"/>
+          <w:sz w:val="28"/>
+        </w:rPr>
+        <w:t xml:space="preserve">   stages. The worth is landing on the right page. How to set</w:t>
+      </w:r>
+    </w:p>
+    <w:p>
+      <w:pPr>
+        <w:spacing w:line="276" w:lineRule="auto"/>
+      </w:pPr>
+      <w:r>
+        <w:rPr>
+          <w:rFonts w:ascii="Arial" w:hAnsi="Arial"/>
+          <w:sz w:val="28"/>
+        </w:rPr>
+        <w:t xml:space="preserve">   it is the page itself. Fine-tune options belong in the User</w:t>
+      </w:r>
+    </w:p>
+    <w:p>
+      <w:pPr>
+        <w:spacing w:line="276" w:lineRule="auto"/>
+      </w:pPr>
+      <w:r>
+        <w:rPr>
+          <w:rFonts w:ascii="Arial" w:hAnsi="Arial"/>
+          <w:sz w:val="28"/>
+        </w:rPr>
+        <w:t xml:space="preserve">   Guide or on Options, not in the same helper. He said those</w:t>
+      </w:r>
+    </w:p>
+    <w:p>
+      <w:pPr>
+        <w:spacing w:line="276" w:lineRule="auto"/>
+      </w:pPr>
+      <w:r>
+        <w:rPr>
+          <w:rFonts w:ascii="Arial" w:hAnsi="Arial"/>
+          <w:sz w:val="28"/>
+        </w:rPr>
+        <w:t xml:space="preserve">   points were good. First question (#53-new): "Does this item</w:t>
+      </w:r>
+    </w:p>
+    <w:p>
+      <w:pPr>
+        <w:spacing w:line="276" w:lineRule="auto"/>
+      </w:pPr>
+      <w:r>
+        <w:rPr>
+          <w:rFonts w:ascii="Arial" w:hAnsi="Arial"/>
+          <w:sz w:val="28"/>
+        </w:rPr>
+        <w:t xml:space="preserve">   repeat?" Repeats goes to "Does this item occur every: Every</w:t>
+      </w:r>
+    </w:p>
+    <w:p>
+      <w:pPr>
+        <w:spacing w:line="276" w:lineRule="auto"/>
+      </w:pPr>
+      <w:r>
+        <w:rPr>
+          <w:rFonts w:ascii="Arial" w:hAnsi="Arial"/>
+          <w:sz w:val="28"/>
+        </w:rPr>
+        <w:t xml:space="preserve">   day, Week, Month, Quarter or Year?" Every day lands on Daily</w:t>
+      </w:r>
+    </w:p>
+    <w:p>
+      <w:pPr>
+        <w:spacing w:line="276" w:lineRule="auto"/>
+      </w:pPr>
+      <w:r>
+        <w:rPr>
+          <w:rFonts w:ascii="Arial" w:hAnsi="Arial"/>
+          <w:sz w:val="28"/>
+        </w:rPr>
+        <w:t xml:space="preserve">   add, Week on Weekly, Month on Monthly, Quarter on Quarterly,</w:t>
+      </w:r>
+    </w:p>
+    <w:p>
+      <w:pPr>
+        <w:spacing w:line="276" w:lineRule="auto"/>
+      </w:pPr>
+      <w:r>
+        <w:rPr>
+          <w:rFonts w:ascii="Arial" w:hAnsi="Arial"/>
+          <w:sz w:val="28"/>
+        </w:rPr>
+        <w:t xml:space="preserve">   Year on Yearly. Does not repeat goes to "Is that for today?".</w:t>
+      </w:r>
+    </w:p>
+    <w:p>
+      <w:pPr>
+        <w:spacing w:line="276" w:lineRule="auto"/>
+      </w:pPr>
+      <w:r>
+        <w:rPr>
+          <w:rFonts w:ascii="Arial" w:hAnsi="Arial"/>
+          <w:sz w:val="28"/>
+        </w:rPr>
+        <w:t xml:space="preserve">   Yes lands on Daily’s One Time for today add. No goes to</w:t>
+      </w:r>
+    </w:p>
+    <w:p>
+      <w:pPr>
+        <w:spacing w:line="276" w:lineRule="auto"/>
+      </w:pPr>
+      <w:r>
+        <w:rPr>
+          <w:rFonts w:ascii="Arial" w:hAnsi="Arial"/>
+          <w:sz w:val="28"/>
+        </w:rPr>
+        <w:t xml:space="preserve">   "Is this an occurrence that has a specific time and date,</w:t>
+      </w:r>
+    </w:p>
+    <w:p>
+      <w:pPr>
+        <w:spacing w:line="276" w:lineRule="auto"/>
+      </w:pPr>
+      <w:r>
+        <w:rPr>
+          <w:rFonts w:ascii="Arial" w:hAnsi="Arial"/>
+          <w:sz w:val="28"/>
+        </w:rPr>
+        <w:t xml:space="preserve">   like an appointment? Or is it the rare item with no deadline</w:t>
+      </w:r>
+    </w:p>
+    <w:p>
+      <w:pPr>
+        <w:spacing w:line="276" w:lineRule="auto"/>
+      </w:pPr>
+      <w:r>
+        <w:rPr>
+          <w:rFonts w:ascii="Arial" w:hAnsi="Arial"/>
+          <w:sz w:val="28"/>
+        </w:rPr>
+        <w:t xml:space="preserve">   or due date, like a Bucket List desire?" Appointment side</w:t>
+      </w:r>
+    </w:p>
+    <w:p>
+      <w:pPr>
+        <w:spacing w:line="276" w:lineRule="auto"/>
+      </w:pPr>
+      <w:r>
+        <w:rPr>
+          <w:rFonts w:ascii="Arial" w:hAnsi="Arial"/>
+          <w:sz w:val="28"/>
+        </w:rPr>
+        <w:t xml:space="preserve">   lands on Appointments add. Bucket List side lands on Bucket</w:t>
+      </w:r>
+    </w:p>
+    <w:p>
+      <w:pPr>
+        <w:spacing w:line="276" w:lineRule="auto"/>
+      </w:pPr>
+      <w:r>
+        <w:rPr>
+          <w:rFonts w:ascii="Arial" w:hAnsi="Arial"/>
+          <w:sz w:val="28"/>
+        </w:rPr>
+        <w:t xml:space="preserve">   List add. Each question offers the choices below it,</w:t>
+      </w:r>
+    </w:p>
+    <w:p>
+      <w:pPr>
+        <w:spacing w:line="276" w:lineRule="auto"/>
+      </w:pPr>
+      <w:r>
+        <w:rPr>
+          <w:rFonts w:ascii="Arial" w:hAnsi="Arial"/>
+          <w:sz w:val="28"/>
+        </w:rPr>
+        <w:t xml:space="preserve">   two or five. One question at a time, in one popup like + Add.</w:t>
+      </w:r>
+    </w:p>
+    <w:p>
+      <w:pPr>
+        <w:spacing w:line="276" w:lineRule="auto"/>
+      </w:pPr>
+      <w:r>
+        <w:rPr>
+          <w:rFonts w:ascii="Arial" w:hAnsi="Arial"/>
+          <w:sz w:val="28"/>
+        </w:rPr>
+        <w:t xml:space="preserve">   A tap replaces the question with the next. Cancel leaves you</w:t>
+      </w:r>
+    </w:p>
+    <w:p>
+      <w:pPr>
+        <w:spacing w:line="276" w:lineRule="auto"/>
+      </w:pPr>
+      <w:r>
+        <w:rPr>
+          <w:rFonts w:ascii="Arial" w:hAnsi="Arial"/>
+          <w:sz w:val="28"/>
+        </w:rPr>
+        <w:t xml:space="preserve">   on Home or the calendar. Two or three taps to a landing, and that</w:t>
+      </w:r>
+    </w:p>
+    <w:p>
+      <w:pPr>
+        <w:spacing w:line="276" w:lineRule="auto"/>
+      </w:pPr>
+      <w:r>
+        <w:rPr>
+          <w:rFonts w:ascii="Arial" w:hAnsi="Arial"/>
+          <w:sz w:val="28"/>
+        </w:rPr>
+        <w:t xml:space="preserve">   landing is that kind’s add, not the list. Direct way</w:t>
+      </w:r>
+    </w:p>
+    <w:p>
+      <w:pPr>
+        <w:spacing w:line="276" w:lineRule="auto"/>
+      </w:pPr>
+      <w:r>
+        <w:rPr>
+          <w:rFonts w:ascii="Arial" w:hAnsi="Arial"/>
+          <w:sz w:val="28"/>
+        </w:rPr>
+        <w:t xml:space="preserve">   in: a Where? button on Home. Not</w:t>
+      </w:r>
+    </w:p>
+    <w:p>
+      <w:pPr>
+        <w:spacing w:line="276" w:lineRule="auto"/>
+      </w:pPr>
+      <w:r>
+        <w:rPr>
+          <w:rFonts w:ascii="Arial" w:hAnsi="Arial"/>
+          <w:sz w:val="28"/>
+        </w:rPr>
+        <w:t xml:space="preserve">   on the pages. Calendar’s unused header button is also Where?</w:t>
+      </w:r>
+    </w:p>
+    <w:p>
+      <w:pPr>
+        <w:spacing w:line="276" w:lineRule="auto"/>
+      </w:pPr>
+      <w:r>
+        <w:rPr>
+          <w:rFonts w:ascii="Arial" w:hAnsi="Arial"/>
+          <w:sz w:val="28"/>
+        </w:rPr>
+        <w:t xml:space="preserve">   and opens the helper. The calendar day’s list has no + Add.</w:t>
+      </w:r>
+    </w:p>
+    <w:p>
+      <w:pPr>
+        <w:spacing w:line="276" w:lineRule="auto"/>
+      </w:pPr>
+      <w:r>
+        <w:rPr>
+          <w:rFonts w:ascii="Arial" w:hAnsi="Arial"/>
+          <w:sz w:val="28"/>
+        </w:rPr>
+        <w:t xml:space="preserve">   A calendar day does not ride into the add.</w:t>
       </w:r>
     </w:p>
     <w:p>
@@ -338,247 +602,103 @@
           <w:rFonts w:ascii="Arial" w:hAnsi="Arial"/>
           <w:sz w:val="28"/>
         </w:rPr>
-        <w:t xml:space="preserve">1. EVERYTHING BUILT SINCE THE LAST PHONE LOAD. He loaded landscape</w:t>
-      </w:r>
-    </w:p>
-    <w:p>
-      <w:pPr>
-        <w:spacing w:line="276" w:lineRule="auto"/>
-      </w:pPr>
-      <w:r>
-        <w:rPr>
-          <w:rFonts w:ascii="Arial" w:hAnsi="Arial"/>
-          <w:sz w:val="28"/>
-        </w:rPr>
-        <w:t xml:space="preserve">   this sitting (#52-new): 90° counter-clockwise, headers on the</w:t>
-      </w:r>
-    </w:p>
-    <w:p>
-      <w:pPr>
-        <w:spacing w:line="276" w:lineRule="auto"/>
-      </w:pPr>
-      <w:r>
-        <w:rPr>
-          <w:rFonts w:ascii="Arial" w:hAnsi="Arial"/>
-          <w:sz w:val="28"/>
-        </w:rPr>
-        <w:t xml:space="preserve">   left. The Sit load is on the phone; he exported his real list</w:t>
-      </w:r>
-    </w:p>
-    <w:p>
-      <w:pPr>
-        <w:spacing w:line="276" w:lineRule="auto"/>
-      </w:pPr>
-      <w:r>
-        <w:rPr>
-          <w:rFonts w:ascii="Arial" w:hAnsi="Arial"/>
-          <w:sz w:val="28"/>
-        </w:rPr>
-        <w:t xml:space="preserve">   first. Time zone, holidays, a second Thursday, a Wednesday after</w:t>
-      </w:r>
-    </w:p>
-    <w:p>
-      <w:pPr>
-        <w:spacing w:line="276" w:lineRule="auto"/>
-      </w:pPr>
-      <w:r>
-        <w:rPr>
-          <w:rFonts w:ascii="Arial" w:hAnsi="Arial"/>
-          <w:sz w:val="28"/>
-        </w:rPr>
-        <w:t xml:space="preserve">   the 6th, Then or Next Day on a shifted banner, and calendar shading</w:t>
-      </w:r>
-    </w:p>
-    <w:p>
-      <w:pPr>
-        <w:spacing w:line="276" w:lineRule="auto"/>
-      </w:pPr>
-      <w:r>
-        <w:rPr>
-          <w:rFonts w:ascii="Arial" w:hAnsi="Arial"/>
-          <w:sz w:val="28"/>
-        </w:rPr>
-        <w:t xml:space="preserve">   reach the engine. The Float row is out. Extended New and Edit are</w:t>
-      </w:r>
-    </w:p>
-    <w:p>
-      <w:pPr>
-        <w:spacing w:line="276" w:lineRule="auto"/>
-      </w:pPr>
-      <w:r>
-        <w:rPr>
-          <w:rFonts w:ascii="Arial" w:hAnsi="Arial"/>
-          <w:sz w:val="28"/>
-        </w:rPr>
-        <w:t xml:space="preserve">   name, optional note and Done. Cancel closes with no change,</w:t>
-      </w:r>
-    </w:p>
-    <w:p>
-      <w:pPr>
-        <w:spacing w:line="276" w:lineRule="auto"/>
-      </w:pPr>
-      <w:r>
-        <w:rPr>
-          <w:rFonts w:ascii="Arial" w:hAnsi="Arial"/>
-          <w:sz w:val="28"/>
-        </w:rPr>
-        <w:t xml:space="preserve">   including after + OPT. Daily’s every-day item and One Time for</w:t>
-      </w:r>
-    </w:p>
-    <w:p>
-      <w:pPr>
-        <w:spacing w:line="276" w:lineRule="auto"/>
-      </w:pPr>
-      <w:r>
-        <w:rPr>
-          <w:rFonts w:ascii="Arial" w:hAnsi="Arial"/>
-          <w:sz w:val="28"/>
-        </w:rPr>
-        <w:t xml:space="preserve">   today get only time zone. The extra tap saved on the item is not a</w:t>
-      </w:r>
-    </w:p>
-    <w:p>
-      <w:pPr>
-        <w:spacing w:line="276" w:lineRule="auto"/>
-      </w:pPr>
-      <w:r>
-        <w:rPr>
-          <w:rFonts w:ascii="Arial" w:hAnsi="Arial"/>
-          <w:sz w:val="28"/>
-        </w:rPr>
-        <w:t xml:space="preserve">   recipe. #49-new added the Calendar page. The Options Calendar</w:t>
-      </w:r>
-    </w:p>
-    <w:p>
-      <w:pPr>
-        <w:spacing w:line="276" w:lineRule="auto"/>
-      </w:pPr>
-      <w:r>
-        <w:rPr>
-          <w:rFonts w:ascii="Arial" w:hAnsi="Arial"/>
-          <w:sz w:val="28"/>
-        </w:rPr>
-        <w:t xml:space="preserve">   shading row came out; the saved field stays. #50-new put landscape</w:t>
-      </w:r>
-    </w:p>
-    <w:p>
-      <w:pPr>
-        <w:spacing w:line="276" w:lineRule="auto"/>
-      </w:pPr>
-      <w:r>
-        <w:rPr>
-          <w:rFonts w:ascii="Arial" w:hAnsi="Arial"/>
-          <w:sz w:val="28"/>
-        </w:rPr>
-        <w:t xml:space="preserve">   on every page, including the ones that open from a page: optional</w:t>
-      </w:r>
-    </w:p>
-    <w:p>
-      <w:pPr>
-        <w:spacing w:line="276" w:lineRule="auto"/>
-      </w:pPr>
-      <w:r>
-        <w:rPr>
-          <w:rFonts w:ascii="Arial" w:hAnsi="Arial"/>
-          <w:sz w:val="28"/>
-        </w:rPr>
-        <w:t xml:space="preserve">   view, 0 and 90 only, header as the portrait row with the Bridge.</w:t>
-      </w:r>
-    </w:p>
-    <w:p>
-      <w:pPr>
-        <w:spacing w:line="276" w:lineRule="auto"/>
-      </w:pPr>
-      <w:r>
-        <w:rPr>
-          <w:rFonts w:ascii="Arial" w:hAnsi="Arial"/>
-          <w:sz w:val="28"/>
-        </w:rPr>
-        <w:t xml:space="preserve">   Header buttons turn in place so the words sit the right way up.</w:t>
-      </w:r>
-    </w:p>
-    <w:p>
-      <w:pPr>
-        <w:spacing w:line="276" w:lineRule="auto"/>
-      </w:pPr>
-      <w:r>
-        <w:rPr>
-          <w:rFonts w:ascii="Arial" w:hAnsi="Arial"/>
-          <w:sz w:val="28"/>
-        </w:rPr>
-        <w:t xml:space="preserve">   Calendar and landscape are on the phone now.</w:t>
-      </w:r>
-    </w:p>
-    <w:p>
-      <w:pPr>
-        <w:spacing w:line="276" w:lineRule="auto"/>
-      </w:pPr>
-      <w:r>
-        <w:rPr>
-          <w:rFonts w:ascii="Arial" w:hAnsi="Arial"/>
-          <w:sz w:val="28"/>
-        </w:rPr>
-        <w:t xml:space="preserve">2. A FAILED DAILY CLEAR-OUT IS NEVER SPOKEN. The warning is written</w:t>
-      </w:r>
-    </w:p>
-    <w:p>
-      <w:pPr>
-        <w:spacing w:line="276" w:lineRule="auto"/>
-      </w:pPr>
-      <w:r>
-        <w:rPr>
-          <w:rFonts w:ascii="Arial" w:hAnsi="Arial"/>
-          <w:sz w:val="28"/>
-        </w:rPr>
-        <w:t xml:space="preserve">   down but filtered out before it reaches the pop-up, because it</w:t>
-      </w:r>
-    </w:p>
-    <w:p>
-      <w:pPr>
-        <w:spacing w:line="276" w:lineRule="auto"/>
-      </w:pPr>
-      <w:r>
-        <w:rPr>
-          <w:rFonts w:ascii="Arial" w:hAnsi="Arial"/>
-          <w:sz w:val="28"/>
-        </w:rPr>
-        <w:t xml:space="preserve">   was classed as harmless. It is not harmless — a failed clear-out</w:t>
-      </w:r>
-    </w:p>
-    <w:p>
-      <w:pPr>
-        <w:spacing w:line="276" w:lineRule="auto"/>
-      </w:pPr>
-      <w:r>
-        <w:rPr>
-          <w:rFonts w:ascii="Arial" w:hAnsi="Arial"/>
-          <w:sz w:val="28"/>
-        </w:rPr>
-        <w:t xml:space="preserve">   can cancel a reminder for something you never did. Your call at</w:t>
-      </w:r>
-    </w:p>
-    <w:p>
-      <w:pPr>
-        <w:spacing w:line="276" w:lineRule="auto"/>
-      </w:pPr>
-      <w:r>
-        <w:rPr>
-          <w:rFonts w:ascii="Arial" w:hAnsi="Arial"/>
-          <w:sz w:val="28"/>
-        </w:rPr>
-        <w:t xml:space="preserve">   #18-new was to leave it as it is.</w:t>
-      </w:r>
-    </w:p>
-    <w:p>
-      <w:pPr>
-        <w:spacing w:line="276" w:lineRule="auto"/>
-      </w:pPr>
-      <w:r>
-        <w:rPr>
-          <w:rFonts w:ascii="Arial" w:hAnsi="Arial"/>
-          <w:sz w:val="28"/>
-        </w:rPr>
-        <w:t xml:space="preserve">3. RETIRING THE OLD READERS. The live run does not call them. They</w:t>
+        <w:t xml:space="preserve">1. EVERYTHING BUILT SINCE THE LAST PHONE LOAD. Last load is the Sit</w:t>
+      </w:r>
+    </w:p>
+    <w:p>
+      <w:pPr>
+        <w:spacing w:line="276" w:lineRule="auto"/>
+      </w:pPr>
+      <w:r>
+        <w:rPr>
+          <w:rFonts w:ascii="Arial" w:hAnsi="Arial"/>
+          <w:sz w:val="28"/>
+        </w:rPr>
+        <w:t xml:space="preserve">   load with landscape (#52-new): 90° counter-clockwise, headers on</w:t>
+      </w:r>
+    </w:p>
+    <w:p>
+      <w:pPr>
+        <w:spacing w:line="276" w:lineRule="auto"/>
+      </w:pPr>
+      <w:r>
+        <w:rPr>
+          <w:rFonts w:ascii="Arial" w:hAnsi="Arial"/>
+          <w:sz w:val="28"/>
+        </w:rPr>
+        <w:t xml:space="preserve">   the left. He exported his real list first. Calendar and landscape</w:t>
+      </w:r>
+    </w:p>
+    <w:p>
+      <w:pPr>
+        <w:spacing w:line="276" w:lineRule="auto"/>
+      </w:pPr>
+      <w:r>
+        <w:rPr>
+          <w:rFonts w:ascii="Arial" w:hAnsi="Arial"/>
+          <w:sz w:val="28"/>
+        </w:rPr>
+        <w:t xml:space="preserve">   are on the phone. Built since then and not on the phone: the miss</w:t>
+      </w:r>
+    </w:p>
+    <w:p>
+      <w:pPr>
+        <w:spacing w:line="276" w:lineRule="auto"/>
+      </w:pPr>
+      <w:r>
+        <w:rPr>
+          <w:rFonts w:ascii="Arial" w:hAnsi="Arial"/>
+          <w:sz w:val="28"/>
+        </w:rPr>
+        <w:t xml:space="preserve">   notice for Weekly, Monthly, Quarterly, Yearly, and One Time</w:t>
+      </w:r>
+    </w:p>
+    <w:p>
+      <w:pPr>
+        <w:spacing w:line="276" w:lineRule="auto"/>
+      </w:pPr>
+      <w:r>
+        <w:rPr>
+          <w:rFonts w:ascii="Arial" w:hAnsi="Arial"/>
+          <w:sz w:val="28"/>
+        </w:rPr>
+        <w:t xml:space="preserve">   (#55-new, committed); Appointments and Bucket List on every live</w:t>
+      </w:r>
+    </w:p>
+    <w:p>
+      <w:pPr>
+        <w:spacing w:line="276" w:lineRule="auto"/>
+      </w:pPr>
+      <w:r>
+        <w:rPr>
+          <w:rFonts w:ascii="Arial" w:hAnsi="Arial"/>
+          <w:sz w:val="28"/>
+        </w:rPr>
+        <w:t xml:space="preserve">   screen (#56-new); a failed daily clear-out now spoken in the</w:t>
+      </w:r>
+    </w:p>
+    <w:p>
+      <w:pPr>
+        <w:spacing w:line="276" w:lineRule="auto"/>
+      </w:pPr>
+      <w:r>
+        <w:rPr>
+          <w:rFonts w:ascii="Arial" w:hAnsi="Arial"/>
+          <w:sz w:val="28"/>
+        </w:rPr>
+        <w:t xml:space="preserve">   opening pop-up (#56-new, Pending 2).</w:t>
+      </w:r>
+    </w:p>
+    <w:p>
+      <w:pPr>
+        <w:spacing w:line="276" w:lineRule="auto"/>
+      </w:pPr>
+      <w:r>
+        <w:rPr>
+          <w:rFonts w:ascii="Arial" w:hAnsi="Arial"/>
+          <w:sz w:val="28"/>
+        </w:rPr>
+        <w:t xml:space="preserve">2. RETIRING THE OLD READERS. The live run does not call them. They</w:t>
       </w:r>
     </w:p>
     <w:p>
@@ -638,115 +758,7 @@
           <w:rFonts w:ascii="Arial" w:hAnsi="Arial"/>
           <w:sz w:val="28"/>
         </w:rPr>
-        <w:t xml:space="preserve">4. THE MISSED-FIRING NOTICE COVERS DAILY ITEMS ONLY. Weekly, Monthly,</w:t>
-      </w:r>
-    </w:p>
-    <w:p>
-      <w:pPr>
-        <w:spacing w:line="276" w:lineRule="auto"/>
-      </w:pPr>
-      <w:r>
-        <w:rPr>
-          <w:rFonts w:ascii="Arial" w:hAnsi="Arial"/>
-          <w:sz w:val="28"/>
-        </w:rPr>
-        <w:t xml:space="preserve">    Quarterly, Yearly and One Time record no misses at all. They still</w:t>
-      </w:r>
-    </w:p>
-    <w:p>
-      <w:pPr>
-        <w:spacing w:line="276" w:lineRule="auto"/>
-      </w:pPr>
-      <w:r>
-        <w:rPr>
-          <w:rFonts w:ascii="Arial" w:hAnsi="Arial"/>
-          <w:sz w:val="28"/>
-        </w:rPr>
-        <w:t xml:space="preserve">    show on Daily on the day they fall, stay on their own page if that</w:t>
-      </w:r>
-    </w:p>
-    <w:p>
-      <w:pPr>
-        <w:spacing w:line="276" w:lineRule="auto"/>
-      </w:pPr>
-      <w:r>
-        <w:rPr>
-          <w:rFonts w:ascii="Arial" w:hAnsi="Arial"/>
-          <w:sz w:val="28"/>
-        </w:rPr>
-        <w:t xml:space="preserve">    day goes by without Done, and come back on Daily the next time that</w:t>
-      </w:r>
-    </w:p>
-    <w:p>
-      <w:pPr>
-        <w:spacing w:line="276" w:lineRule="auto"/>
-      </w:pPr>
-      <w:r>
-        <w:rPr>
-          <w:rFonts w:ascii="Arial" w:hAnsi="Arial"/>
-          <w:sz w:val="28"/>
-        </w:rPr>
-        <w:t xml:space="preserve">    kind of day comes round. One Time is the odd one: after that day</w:t>
-      </w:r>
-    </w:p>
-    <w:p>
-      <w:pPr>
-        <w:spacing w:line="276" w:lineRule="auto"/>
-      </w:pPr>
-      <w:r>
-        <w:rPr>
-          <w:rFonts w:ascii="Arial" w:hAnsi="Arial"/>
-          <w:sz w:val="28"/>
-        </w:rPr>
-        <w:t xml:space="preserve">    it stays on One Time, leaves Daily, and has no later occurrence to</w:t>
-      </w:r>
-    </w:p>
-    <w:p>
-      <w:pPr>
-        <w:spacing w:line="276" w:lineRule="auto"/>
-      </w:pPr>
-      <w:r>
-        <w:rPr>
-          <w:rFonts w:ascii="Arial" w:hAnsi="Arial"/>
-          <w:sz w:val="28"/>
-        </w:rPr>
-        <w:t xml:space="preserve">    arm. The opening pop-up does not tell you that you missed them.</w:t>
-      </w:r>
-    </w:p>
-    <w:p>
-      <w:pPr>
-        <w:spacing w:line="276" w:lineRule="auto"/>
-      </w:pPr>
-      <w:r>
-        <w:rPr>
-          <w:rFonts w:ascii="Arial" w:hAnsi="Arial"/>
-          <w:sz w:val="28"/>
-        </w:rPr>
-        <w:t xml:space="preserve">    Extending the telling is the next session (Patrick, #52-new). The</w:t>
-      </w:r>
-    </w:p>
-    <w:p>
-      <w:pPr>
-        <w:spacing w:line="276" w:lineRule="auto"/>
-      </w:pPr>
-      <w:r>
-        <w:rPr>
-          <w:rFonts w:ascii="Arial" w:hAnsi="Arial"/>
-          <w:sz w:val="28"/>
-        </w:rPr>
-        <w:t xml:space="preserve">    two halves of recovery on opening are already built.</w:t>
-      </w:r>
-    </w:p>
-    <w:p>
-      <w:pPr>
-        <w:spacing w:line="276" w:lineRule="auto"/>
-      </w:pPr>
-      <w:r>
-        <w:rPr>
-          <w:rFonts w:ascii="Arial" w:hAnsi="Arial"/>
-          <w:sz w:val="28"/>
-        </w:rPr>
-        <w:t xml:space="preserve">5. THE DATE PICKER IS MEANT TO TURN INACTIVE when a Wednesday</w:t>
+        <w:t xml:space="preserve">3. THE DATE PICKER IS MEANT TO TURN INACTIVE when a Wednesday</w:t>
       </w:r>
     </w:p>
     <w:p>
@@ -782,67 +794,7 @@
           <w:rFonts w:ascii="Arial" w:hAnsi="Arial"/>
           <w:sz w:val="28"/>
         </w:rPr>
-        <w:t xml:space="preserve">6. ONE DRAWING OF THE LIST ROW, used by Daily and by Weekly</w:t>
-      </w:r>
-    </w:p>
-    <w:p>
-      <w:pPr>
-        <w:spacing w:line="276" w:lineRule="auto"/>
-      </w:pPr>
-      <w:r>
-        <w:rPr>
-          <w:rFonts w:ascii="Arial" w:hAnsi="Arial"/>
-          <w:sz w:val="28"/>
-        </w:rPr>
-        <w:t xml:space="preserve">    through Extended (Patrick, #52-new). Daily stays a view of</w:t>
-      </w:r>
-    </w:p>
-    <w:p>
-      <w:pPr>
-        <w:spacing w:line="276" w:lineRule="auto"/>
-      </w:pPr>
-      <w:r>
-        <w:rPr>
-          <w:rFonts w:ascii="Arial" w:hAnsi="Arial"/>
-          <w:sz w:val="28"/>
-        </w:rPr>
-        <w:t xml:space="preserve">    the day, with Done and Snooze on those items. Daily still has</w:t>
-      </w:r>
-    </w:p>
-    <w:p>
-      <w:pPr>
-        <w:spacing w:line="276" w:lineRule="auto"/>
-      </w:pPr>
-      <w:r>
-        <w:rPr>
-          <w:rFonts w:ascii="Arial" w:hAnsi="Arial"/>
-          <w:sz w:val="28"/>
-        </w:rPr>
-        <w:t xml:space="preserve">    its own add and its own Log. The row is shared so a later</w:t>
-      </w:r>
-    </w:p>
-    <w:p>
-      <w:pPr>
-        <w:spacing w:line="276" w:lineRule="auto"/>
-      </w:pPr>
-      <w:r>
-        <w:rPr>
-          <w:rFonts w:ascii="Arial" w:hAnsi="Arial"/>
-          <w:sz w:val="28"/>
-        </w:rPr>
-        <w:t xml:space="preserve">    change cannot land on one list and miss the other.</w:t>
-      </w:r>
-    </w:p>
-    <w:p>
-      <w:pPr>
-        <w:spacing w:line="276" w:lineRule="auto"/>
-      </w:pPr>
-      <w:r>
-        <w:rPr>
-          <w:rFonts w:ascii="Arial" w:hAnsi="Arial"/>
-          <w:sz w:val="28"/>
-        </w:rPr>
-        <w:t xml:space="preserve">7. A TAP ON A DAY IN THE CALENDAR brings up every item for that</w:t>
+        <w:t xml:space="preserve">4. A TAP ON A DAY IN THE CALENDAR brings up every item for that</w:t>
       </w:r>
     </w:p>
     <w:p>
@@ -878,91 +830,43 @@
           <w:rFonts w:ascii="Arial" w:hAnsi="Arial"/>
           <w:sz w:val="28"/>
         </w:rPr>
-        <w:t xml:space="preserve">    the name only.</w:t>
-      </w:r>
-    </w:p>
-    <w:p>
-      <w:pPr>
-        <w:spacing w:line="276" w:lineRule="auto"/>
-      </w:pPr>
-      <w:r>
-        <w:rPr>
-          <w:rFonts w:ascii="Arial" w:hAnsi="Arial"/>
-          <w:sz w:val="28"/>
-        </w:rPr>
-        <w:t xml:space="preserve">8. SCHEDULED REMINDERS STILL SAYS THE OLD PAGE NAMES: My Day,</w:t>
-      </w:r>
-    </w:p>
-    <w:p>
-      <w:pPr>
-        <w:spacing w:line="276" w:lineRule="auto"/>
-      </w:pPr>
-      <w:r>
-        <w:rPr>
-          <w:rFonts w:ascii="Arial" w:hAnsi="Arial"/>
-          <w:sz w:val="28"/>
-        </w:rPr>
-        <w:t xml:space="preserve">    My Week, Look Ahead, To-Do (Patrick, #52-new). Last sitting</w:t>
-      </w:r>
-    </w:p>
-    <w:p>
-      <w:pPr>
-        <w:spacing w:line="276" w:lineRule="auto"/>
-      </w:pPr>
-      <w:r>
-        <w:rPr>
-          <w:rFonts w:ascii="Arial" w:hAnsi="Arial"/>
-          <w:sz w:val="28"/>
-        </w:rPr>
-        <w:t xml:space="preserve">    the banners for Monthly, Quarterly, and Yearly were changed</w:t>
-      </w:r>
-    </w:p>
-    <w:p>
-      <w:pPr>
-        <w:spacing w:line="276" w:lineRule="auto"/>
-      </w:pPr>
-      <w:r>
-        <w:rPr>
-          <w:rFonts w:ascii="Arial" w:hAnsi="Arial"/>
-          <w:sz w:val="28"/>
-        </w:rPr>
-        <w:t xml:space="preserve">    to name their own page. This list did not get that change.</w:t>
-      </w:r>
-    </w:p>
-    <w:p>
-      <w:pPr>
-        <w:spacing w:line="276" w:lineRule="auto"/>
-      </w:pPr>
-      <w:r>
-        <w:rPr>
-          <w:rFonts w:ascii="Arial" w:hAnsi="Arial"/>
-          <w:sz w:val="28"/>
-        </w:rPr>
-        <w:t xml:space="preserve">    The rows should name Daily, Weekly, Monthly, Quarterly,</w:t>
-      </w:r>
-    </w:p>
-    <w:p>
-      <w:pPr>
-        <w:spacing w:line="276" w:lineRule="auto"/>
-      </w:pPr>
-      <w:r>
-        <w:rPr>
-          <w:rFonts w:ascii="Arial" w:hAnsi="Arial"/>
-          <w:sz w:val="28"/>
-        </w:rPr>
-        <w:t xml:space="preserve">    Yearly, and One Time.</w:t>
-      </w:r>
-    </w:p>
-    <w:p>
-      <w:pPr>
-        <w:spacing w:line="276" w:lineRule="auto"/>
-      </w:pPr>
-      <w:r>
-        <w:rPr>
-          <w:rFonts w:ascii="Arial" w:hAnsi="Arial"/>
-          <w:sz w:val="28"/>
-        </w:rPr>
-        <w:t xml:space="preserve">9. ALL THE SCREENS SHOULD WORK IN ANY ROTATION (Patrick,</w:t>
+        <w:t xml:space="preserve">    the name only. Sit tests are finished. **Own short session**</w:t>
+      </w:r>
+    </w:p>
+    <w:p>
+      <w:pPr>
+        <w:spacing w:line="276" w:lineRule="auto"/>
+      </w:pPr>
+      <w:r>
+        <w:rPr>
+          <w:rFonts w:ascii="Arial" w:hAnsi="Arial"/>
+          <w:sz w:val="28"/>
+        </w:rPr>
+        <w:t xml:space="preserve">    — not safe to compress (#56-new); no build sheet yet; settle</w:t>
+      </w:r>
+    </w:p>
+    <w:p>
+      <w:pPr>
+        <w:spacing w:line="276" w:lineRule="auto"/>
+      </w:pPr>
+      <w:r>
+        <w:rPr>
+          <w:rFonts w:ascii="Arial" w:hAnsi="Arial"/>
+          <w:sz w:val="28"/>
+        </w:rPr>
+        <w:t xml:space="preserve">    what "fire time" means before building.</w:t>
+      </w:r>
+    </w:p>
+    <w:p>
+      <w:pPr>
+        <w:spacing w:line="276" w:lineRule="auto"/>
+      </w:pPr>
+      <w:r>
+        <w:rPr>
+          <w:rFonts w:ascii="Arial" w:hAnsi="Arial"/>
+          <w:sz w:val="28"/>
+        </w:rPr>
+        <w:t xml:space="preserve">5. ALL THE SCREENS SHOULD WORK IN ANY ROTATION (Patrick,</w:t>
       </w:r>
     </w:p>
     <w:p>
@@ -986,7 +890,7 @@
           <w:rFonts w:ascii="Arial" w:hAnsi="Arial"/>
           <w:sz w:val="28"/>
         </w:rPr>
-        <w:t xml:space="preserve">    headers on the left. This sitting that lock is good. The</w:t>
+        <w:t xml:space="preserve">    headers on the left. At #52-new that lock is good. The</w:t>
       </w:r>
     </w:p>
     <w:p>
@@ -1010,55 +914,7 @@
           <w:rFonts w:ascii="Arial" w:hAnsi="Arial"/>
           <w:sz w:val="28"/>
         </w:rPr>
-        <w:t xml:space="preserve">10. ONE TIME SHOULD BE CALLED ONE TIME APPOINTMENT(S) (Patrick,</w:t>
-      </w:r>
-    </w:p>
-    <w:p>
-      <w:pPr>
-        <w:spacing w:line="276" w:lineRule="auto"/>
-      </w:pPr>
-      <w:r>
-        <w:rPr>
-          <w:rFonts w:ascii="Arial" w:hAnsi="Arial"/>
-          <w:sz w:val="28"/>
-        </w:rPr>
-        <w:t xml:space="preserve">    #52-new). There is no reminder at the set time: that is too</w:t>
-      </w:r>
-    </w:p>
-    <w:p>
-      <w:pPr>
-        <w:spacing w:line="276" w:lineRule="auto"/>
-      </w:pPr>
-      <w:r>
-        <w:rPr>
-          <w:rFonts w:ascii="Arial" w:hAnsi="Arial"/>
-          <w:sz w:val="28"/>
-        </w:rPr>
-        <w:t xml:space="preserve">    late; you are either there or you missed it. The chips before</w:t>
-      </w:r>
-    </w:p>
-    <w:p>
-      <w:pPr>
-        <w:spacing w:line="276" w:lineRule="auto"/>
-      </w:pPr>
-      <w:r>
-        <w:rPr>
-          <w:rFonts w:ascii="Arial" w:hAnsi="Arial"/>
-          <w:sz w:val="28"/>
-        </w:rPr>
-        <w:t xml:space="preserve">    are the reminders. Not a bug.</w:t>
-      </w:r>
-    </w:p>
-    <w:p>
-      <w:pPr>
-        <w:spacing w:line="276" w:lineRule="auto"/>
-      </w:pPr>
-      <w:r>
-        <w:rPr>
-          <w:rFonts w:ascii="Arial" w:hAnsi="Arial"/>
-          <w:sz w:val="28"/>
-        </w:rPr>
-        <w:t xml:space="preserve">11. A THOROUGH DESIGN SPEC FOR THE APP (Patrick, #52-new). This</w:t>
+        <w:t xml:space="preserve">6. A THOROUGH DESIGN SPEC FOR THE APP (Patrick, #52-new). This</w:t>
       </w:r>
     </w:p>
     <w:p>
@@ -1094,31 +950,31 @@
           <w:rFonts w:ascii="Arial" w:hAnsi="Arial"/>
           <w:sz w:val="28"/>
         </w:rPr>
-        <w:t xml:space="preserve">    Changing the name of One Time to One Time Appointment(s)</w:t>
-      </w:r>
-    </w:p>
-    <w:p>
-      <w:pPr>
-        <w:spacing w:line="276" w:lineRule="auto"/>
-      </w:pPr>
-      <w:r>
-        <w:rPr>
-          <w:rFonts w:ascii="Arial" w:hAnsi="Arial"/>
-          <w:sz w:val="28"/>
-        </w:rPr>
-        <w:t xml:space="preserve">    belongs in that spec.</w:t>
-      </w:r>
-    </w:p>
-    <w:p>
-      <w:pPr>
-        <w:spacing w:line="276" w:lineRule="auto"/>
-      </w:pPr>
-      <w:r>
-        <w:rPr>
-          <w:rFonts w:ascii="Arial" w:hAnsi="Arial"/>
-          <w:sz w:val="28"/>
-        </w:rPr>
-        <w:t xml:space="preserve">12. A USER GUIDE, from that spec or merely after it (Patrick,</w:t>
+        <w:t xml:space="preserve">    Changing the name of One Time to Appointments belongs in</w:t>
+      </w:r>
+    </w:p>
+    <w:p>
+      <w:pPr>
+        <w:spacing w:line="276" w:lineRule="auto"/>
+      </w:pPr>
+      <w:r>
+        <w:rPr>
+          <w:rFonts w:ascii="Arial" w:hAnsi="Arial"/>
+          <w:sz w:val="28"/>
+        </w:rPr>
+        <w:t xml:space="preserve">    that spec, and Extended to Bucket List.</w:t>
+      </w:r>
+    </w:p>
+    <w:p>
+      <w:pPr>
+        <w:spacing w:line="276" w:lineRule="auto"/>
+      </w:pPr>
+      <w:r>
+        <w:rPr>
+          <w:rFonts w:ascii="Arial" w:hAnsi="Arial"/>
+          <w:sz w:val="28"/>
+        </w:rPr>
+        <w:t xml:space="preserve">7. A USER GUIDE, from that spec or merely after it (Patrick,</w:t>
       </w:r>
     </w:p>
     <w:p>
@@ -1154,7 +1010,7 @@
           <w:rFonts w:ascii="Arial" w:hAnsi="Arial"/>
           <w:sz w:val="28"/>
         </w:rPr>
-        <w:t xml:space="preserve">13. A FEEDBACK BUTTON IN THE APP, similar to Mystery (Patrick,</w:t>
+        <w:t xml:space="preserve">8. A FEEDBACK BUTTON IN THE APP, similar to Mystery (Patrick,</w:t>
       </w:r>
     </w:p>
     <w:p>
@@ -1190,7 +1046,7 @@
           <w:rFonts w:ascii="Arial" w:hAnsi="Arial"/>
           <w:sz w:val="28"/>
         </w:rPr>
-        <w:t xml:space="preserve">14. A PAGE, SPEC, OR FILE FOR WHAT TESTING HAS COVERED AND</w:t>
+        <w:t xml:space="preserve">9. A PAGE, SPEC, OR FILE FOR WHAT TESTING HAS COVERED AND</w:t>
       </w:r>
     </w:p>
     <w:p>
@@ -1226,78 +1082,6 @@
           <w:rFonts w:ascii="Arial" w:hAnsi="Arial"/>
           <w:sz w:val="28"/>
         </w:rPr>
-        <w:t xml:space="preserve">15. A HELPER TO GUIDE THE USER through where to set the</w:t>
-      </w:r>
-    </w:p>
-    <w:p>
-      <w:pPr>
-        <w:spacing w:line="276" w:lineRule="auto"/>
-      </w:pPr>
-      <w:r>
-        <w:rPr>
-          <w:rFonts w:ascii="Arial" w:hAnsi="Arial"/>
-          <w:sz w:val="28"/>
-        </w:rPr>
-        <w:t xml:space="preserve">    reminder (Patrick, #52-new). Pictured as decision-tree</w:t>
-      </w:r>
-    </w:p>
-    <w:p>
-      <w:pPr>
-        <w:spacing w:line="276" w:lineRule="auto"/>
-      </w:pPr>
-      <w:r>
-        <w:rPr>
-          <w:rFonts w:ascii="Arial" w:hAnsi="Arial"/>
-          <w:sz w:val="28"/>
-        </w:rPr>
-        <w:t xml:space="preserve">    stages. The worth is landing on the right page. How to set</w:t>
-      </w:r>
-    </w:p>
-    <w:p>
-      <w:pPr>
-        <w:spacing w:line="276" w:lineRule="auto"/>
-      </w:pPr>
-      <w:r>
-        <w:rPr>
-          <w:rFonts w:ascii="Arial" w:hAnsi="Arial"/>
-          <w:sz w:val="28"/>
-        </w:rPr>
-        <w:t xml:space="preserve">    it is the page itself. Fine-tune options belong in the User</w:t>
-      </w:r>
-    </w:p>
-    <w:p>
-      <w:pPr>
-        <w:spacing w:line="276" w:lineRule="auto"/>
-      </w:pPr>
-      <w:r>
-        <w:rPr>
-          <w:rFonts w:ascii="Arial" w:hAnsi="Arial"/>
-          <w:sz w:val="28"/>
-        </w:rPr>
-        <w:t xml:space="preserve">    Guide or on Options, not in the same helper. He said those</w:t>
-      </w:r>
-    </w:p>
-    <w:p>
-      <w:pPr>
-        <w:spacing w:line="276" w:lineRule="auto"/>
-      </w:pPr>
-      <w:r>
-        <w:rPr>
-          <w:rFonts w:ascii="Arial" w:hAnsi="Arial"/>
-          <w:sz w:val="28"/>
-        </w:rPr>
-        <w:t xml:space="preserve">    points were good.</w:t>
-      </w:r>
-    </w:p>
-    <w:p>
-      <w:pPr>
-        <w:spacing w:line="276" w:lineRule="auto"/>
-      </w:pPr>
-      <w:r>
-        <w:rPr>
-          <w:rFonts w:ascii="Arial" w:hAnsi="Arial"/>
-          <w:sz w:val="28"/>
-        </w:rPr>
         <w:t xml:space="preserve"/>
       </w:r>
     </w:p>
@@ -1467,7 +1251,7 @@
           <w:rFonts w:ascii="Arial" w:hAnsi="Arial"/>
           <w:sz w:val="28"/>
         </w:rPr>
-        <w:t xml:space="preserve">3. ONE TIME CARRIES THE REMINDERS BEFORE CHIPS — 30 min., 1</w:t>
+        <w:t xml:space="preserve">3. APPOINTMENTS CARRIES THE REMINDERS BEFORE CHIPS — 30 min., 1</w:t>
       </w:r>
     </w:p>
     <w:p>
@@ -1527,7 +1311,7 @@
           <w:rFonts w:ascii="Arial" w:hAnsi="Arial"/>
           <w:sz w:val="28"/>
         </w:rPr>
-        <w:t xml:space="preserve">   should be called One Time Appointment(s).</w:t>
+        <w:t xml:space="preserve">   is called Appointments (#56-new; saved kind stays oneTime).</w:t>
       </w:r>
     </w:p>
     <w:p>
@@ -1587,7 +1371,7 @@
           <w:rFonts w:ascii="Arial" w:hAnsi="Arial"/>
           <w:sz w:val="28"/>
         </w:rPr>
-        <w:t xml:space="preserve">   One Time, which has the Log, not Daily. The other pages keep their</w:t>
+        <w:t xml:space="preserve">   Appointments, which has the Log, not Daily. The other pages keep their</w:t>
       </w:r>
     </w:p>
     <w:p>
@@ -1731,43 +1515,55 @@
           <w:rFonts w:ascii="Arial" w:hAnsi="Arial"/>
           <w:sz w:val="28"/>
         </w:rPr>
-        <w:t xml:space="preserve">8. AN EXTENDED ITEM AND A DAILY TICK ARE OPPOSITES. An Extended</w:t>
-      </w:r>
-    </w:p>
-    <w:p>
-      <w:pPr>
-        <w:spacing w:line="276" w:lineRule="auto"/>
-      </w:pPr>
-      <w:r>
-        <w:rPr>
-          <w:rFonts w:ascii="Arial" w:hAnsi="Arial"/>
-          <w:sz w:val="28"/>
-        </w:rPr>
-        <w:t xml:space="preserve">   item says a thing is not yet done and must survive the night.</w:t>
-      </w:r>
-    </w:p>
-    <w:p>
-      <w:pPr>
-        <w:spacing w:line="276" w:lineRule="auto"/>
-      </w:pPr>
-      <w:r>
-        <w:rPr>
-          <w:rFonts w:ascii="Arial" w:hAnsi="Arial"/>
-          <w:sz w:val="28"/>
-        </w:rPr>
-        <w:t xml:space="preserve">   The coffee-and-water sort says a thing was done today and is</w:t>
-      </w:r>
-    </w:p>
-    <w:p>
-      <w:pPr>
-        <w:spacing w:line="276" w:lineRule="auto"/>
-      </w:pPr>
-      <w:r>
-        <w:rPr>
-          <w:rFonts w:ascii="Arial" w:hAnsi="Arial"/>
-          <w:sz w:val="28"/>
-        </w:rPr>
-        <w:t xml:space="preserve">   meaningless the morning after. They must never be merged.</w:t>
+        <w:t xml:space="preserve">8. AN EXTENDED ITEM AND A DAILY TICK ARE OPPOSITES. A Bucket List</w:t>
+      </w:r>
+    </w:p>
+    <w:p>
+      <w:pPr>
+        <w:spacing w:line="276" w:lineRule="auto"/>
+      </w:pPr>
+      <w:r>
+        <w:rPr>
+          <w:rFonts w:ascii="Arial" w:hAnsi="Arial"/>
+          <w:sz w:val="28"/>
+        </w:rPr>
+        <w:t xml:space="preserve">   item (saved kind extended) says a thing is not yet done and must</w:t>
+      </w:r>
+    </w:p>
+    <w:p>
+      <w:pPr>
+        <w:spacing w:line="276" w:lineRule="auto"/>
+      </w:pPr>
+      <w:r>
+        <w:rPr>
+          <w:rFonts w:ascii="Arial" w:hAnsi="Arial"/>
+          <w:sz w:val="28"/>
+        </w:rPr>
+        <w:t xml:space="preserve">   survive the night. The coffee-and-water sort says a thing was</w:t>
+      </w:r>
+    </w:p>
+    <w:p>
+      <w:pPr>
+        <w:spacing w:line="276" w:lineRule="auto"/>
+      </w:pPr>
+      <w:r>
+        <w:rPr>
+          <w:rFonts w:ascii="Arial" w:hAnsi="Arial"/>
+          <w:sz w:val="28"/>
+        </w:rPr>
+        <w:t xml:space="preserve">   done today and is meaningless the morning after. They must never</w:t>
+      </w:r>
+    </w:p>
+    <w:p>
+      <w:pPr>
+        <w:spacing w:line="276" w:lineRule="auto"/>
+      </w:pPr>
+      <w:r>
+        <w:rPr>
+          <w:rFonts w:ascii="Arial" w:hAnsi="Arial"/>
+          <w:sz w:val="28"/>
+        </w:rPr>
+        <w:t xml:space="preserve">   be merged.</w:t>
       </w:r>
     </w:p>
     <w:p>
@@ -2152,7 +1948,187 @@
           <w:rFonts w:ascii="Arial" w:hAnsi="Arial"/>
           <w:sz w:val="28"/>
         </w:rPr>
-        <w:t xml:space="preserve">1. #52-new — landscape 90° counter-clockwise, headers on the left,</w:t>
+        <w:t xml:space="preserve">1. #56-new — Appointments and Bucket List on every live screen;</w:t>
+      </w:r>
+    </w:p>
+    <w:p>
+      <w:pPr>
+        <w:spacing w:line="276" w:lineRule="auto"/>
+      </w:pPr>
+      <w:r>
+        <w:rPr>
+          <w:rFonts w:ascii="Arial" w:hAnsi="Arial"/>
+          <w:sz w:val="28"/>
+        </w:rPr>
+        <w:t xml:space="preserve">   failed daily clear-out now spoken (Pending 2). Mac 489. He said</w:t>
+      </w:r>
+    </w:p>
+    <w:p>
+      <w:pPr>
+        <w:spacing w:line="276" w:lineRule="auto"/>
+      </w:pPr>
+      <w:r>
+        <w:rPr>
+          <w:rFonts w:ascii="Arial" w:hAnsi="Arial"/>
+          <w:sz w:val="28"/>
+        </w:rPr>
+        <w:t xml:space="preserve">   very good. Patrick committing at session close. Not on the phone.</w:t>
+      </w:r>
+    </w:p>
+    <w:p>
+      <w:pPr>
+        <w:spacing w:line="276" w:lineRule="auto"/>
+      </w:pPr>
+      <w:r>
+        <w:rPr>
+          <w:rFonts w:ascii="Arial" w:hAnsi="Arial"/>
+          <w:sz w:val="28"/>
+        </w:rPr>
+        <w:t xml:space="preserve">2. #55-new — missed-firing notice for Weekly, Monthly, Quarterly,</w:t>
+      </w:r>
+    </w:p>
+    <w:p>
+      <w:pPr>
+        <w:spacing w:line="276" w:lineRule="auto"/>
+      </w:pPr>
+      <w:r>
+        <w:rPr>
+          <w:rFonts w:ascii="Arial" w:hAnsi="Arial"/>
+          <w:sz w:val="28"/>
+        </w:rPr>
+        <w:t xml:space="preserve">   Yearly, and One Time as well as Daily; day-roll writes the miss.</w:t>
+      </w:r>
+    </w:p>
+    <w:p>
+      <w:pPr>
+        <w:spacing w:line="276" w:lineRule="auto"/>
+      </w:pPr>
+      <w:r>
+        <w:rPr>
+          <w:rFonts w:ascii="Arial" w:hAnsi="Arial"/>
+          <w:sz w:val="28"/>
+        </w:rPr>
+        <w:t xml:space="preserve">   Mac 487. He said the work is good. Committed (Patrick, #56-new).</w:t>
+      </w:r>
+    </w:p>
+    <w:p>
+      <w:pPr>
+        <w:spacing w:line="276" w:lineRule="auto"/>
+      </w:pPr>
+      <w:r>
+        <w:rPr>
+          <w:rFonts w:ascii="Arial" w:hAnsi="Arial"/>
+          <w:sz w:val="28"/>
+        </w:rPr>
+        <w:t xml:space="preserve">   Not on the phone.</w:t>
+      </w:r>
+    </w:p>
+    <w:p>
+      <w:pPr>
+        <w:spacing w:line="276" w:lineRule="auto"/>
+      </w:pPr>
+      <w:r>
+        <w:rPr>
+          <w:rFonts w:ascii="Arial" w:hAnsi="Arial"/>
+          <w:sz w:val="28"/>
+        </w:rPr>
+        <w:t xml:space="preserve">3. #53-new (2026-09-02) — Scheduled Reminders names Daily, Weekly,</w:t>
+      </w:r>
+    </w:p>
+    <w:p>
+      <w:pPr>
+        <w:spacing w:line="276" w:lineRule="auto"/>
+      </w:pPr>
+      <w:r>
+        <w:rPr>
+          <w:rFonts w:ascii="Arial" w:hAnsi="Arial"/>
+          <w:sz w:val="28"/>
+        </w:rPr>
+        <w:t xml:space="preserve">   Monthly, Quarterly, Yearly, and One Time; Monthly, Quarterly,</w:t>
+      </w:r>
+    </w:p>
+    <w:p>
+      <w:pPr>
+        <w:spacing w:line="276" w:lineRule="auto"/>
+      </w:pPr>
+      <w:r>
+        <w:rPr>
+          <w:rFonts w:ascii="Arial" w:hAnsi="Arial"/>
+          <w:sz w:val="28"/>
+        </w:rPr>
+        <w:t xml:space="preserve">   and Yearly from the banner heading. Siri still says My Day Item.</w:t>
+      </w:r>
+    </w:p>
+    <w:p>
+      <w:pPr>
+        <w:spacing w:line="276" w:lineRule="auto"/>
+      </w:pPr>
+      <w:r>
+        <w:rPr>
+          <w:rFonts w:ascii="Arial" w:hAnsi="Arial"/>
+          <w:sz w:val="28"/>
+        </w:rPr>
+        <w:t xml:space="preserve">4. #53-new (2026-09-02) — one list row for Daily through Extended</w:t>
+      </w:r>
+    </w:p>
+    <w:p>
+      <w:pPr>
+        <w:spacing w:line="276" w:lineRule="auto"/>
+      </w:pPr>
+      <w:r>
+        <w:rPr>
+          <w:rFonts w:ascii="Arial" w:hAnsi="Arial"/>
+          <w:sz w:val="28"/>
+        </w:rPr>
+        <w:t xml:space="preserve">   (`ReminderItemRow.tsx`). Daily still composes its name and Log.</w:t>
+      </w:r>
+    </w:p>
+    <w:p>
+      <w:pPr>
+        <w:spacing w:line="276" w:lineRule="auto"/>
+      </w:pPr>
+      <w:r>
+        <w:rPr>
+          <w:rFonts w:ascii="Arial" w:hAnsi="Arial"/>
+          <w:sz w:val="28"/>
+        </w:rPr>
+        <w:t xml:space="preserve">5. #54-new (2026-09-02) — Appointments and Bucket List: one list in</w:t>
+      </w:r>
+    </w:p>
+    <w:p>
+      <w:pPr>
+        <w:spacing w:line="276" w:lineRule="auto"/>
+      </w:pPr>
+      <w:r>
+        <w:rPr>
+          <w:rFonts w:ascii="Arial" w:hAnsi="Arial"/>
+          <w:sz w:val="28"/>
+        </w:rPr>
+        <w:t xml:space="preserve">   constants/page-names.ts; Scheduled Reminders reads it. Finished</w:t>
+      </w:r>
+    </w:p>
+    <w:p>
+      <w:pPr>
+        <w:spacing w:line="276" w:lineRule="auto"/>
+      </w:pPr>
+      <w:r>
+        <w:rPr>
+          <w:rFonts w:ascii="Arial" w:hAnsi="Arial"/>
+          <w:sz w:val="28"/>
+        </w:rPr>
+        <w:t xml:space="preserve">   at #56-new. Committed.</w:t>
+      </w:r>
+    </w:p>
+    <w:p>
+      <w:pPr>
+        <w:spacing w:line="276" w:lineRule="auto"/>
+      </w:pPr>
+      <w:r>
+        <w:rPr>
+          <w:rFonts w:ascii="Arial" w:hAnsi="Arial"/>
+          <w:sz w:val="28"/>
+        </w:rPr>
+        <w:t xml:space="preserve">6. #52-new — landscape 90° counter-clockwise, headers on the left,</w:t>
       </w:r>
     </w:p>
     <w:p>
@@ -2200,19 +2176,19 @@
           <w:rFonts w:ascii="Arial" w:hAnsi="Arial"/>
           <w:sz w:val="28"/>
         </w:rPr>
-        <w:t xml:space="preserve">   where. Next is Pending 4.</w:t>
-      </w:r>
-    </w:p>
-    <w:p>
-      <w:pPr>
-        <w:spacing w:line="276" w:lineRule="auto"/>
-      </w:pPr>
-      <w:r>
-        <w:rPr>
-          <w:rFonts w:ascii="Arial" w:hAnsi="Arial"/>
-          <w:sz w:val="28"/>
-        </w:rPr>
-        <w:t xml:space="preserve">2. #51-new — display features: header buttons and the Home badge</w:t>
+        <w:t xml:space="preserve">   where.</w:t>
+      </w:r>
+    </w:p>
+    <w:p>
+      <w:pPr>
+        <w:spacing w:line="276" w:lineRule="auto"/>
+      </w:pPr>
+      <w:r>
+        <w:rPr>
+          <w:rFonts w:ascii="Arial" w:hAnsi="Arial"/>
+          <w:sz w:val="28"/>
+        </w:rPr>
+        <w:t xml:space="preserve">7. #51-new — display features: header buttons and the Home badge</w:t>
       </w:r>
     </w:p>
     <w:p>
@@ -2284,7 +2260,7 @@
           <w:rFonts w:ascii="Arial" w:hAnsi="Arial"/>
           <w:sz w:val="28"/>
         </w:rPr>
-        <w:t xml:space="preserve">3. #50-new — the other pages in landscape. Optional view, 0 and 90</w:t>
+        <w:t xml:space="preserve">8. #50-new — the other pages in landscape. Optional view, 0 and 90</w:t>
       </w:r>
     </w:p>
     <w:p>
@@ -2344,7 +2320,7 @@
           <w:rFonts w:ascii="Arial" w:hAnsi="Arial"/>
           <w:sz w:val="28"/>
         </w:rPr>
-        <w:t xml:space="preserve">4. #49-new — calendar page built from the sheet. Options Calendar</w:t>
+        <w:t xml:space="preserve">9. #49-new — calendar page built from the sheet. Options Calendar</w:t>
       </w:r>
     </w:p>
     <w:p>
@@ -2404,19 +2380,19 @@
           <w:rFonts w:ascii="Arial" w:hAnsi="Arial"/>
           <w:sz w:val="28"/>
         </w:rPr>
-        <w:t xml:space="preserve">5. #48-new — calendar build sheet written. No code.</w:t>
-      </w:r>
-    </w:p>
-    <w:p>
-      <w:pPr>
-        <w:spacing w:line="276" w:lineRule="auto"/>
-      </w:pPr>
-      <w:r>
-        <w:rPr>
-          <w:rFonts w:ascii="Arial" w:hAnsi="Arial"/>
-          <w:sz w:val="28"/>
-        </w:rPr>
-        <w:t xml:space="preserve">6. #47-new — selling description a good start and left. Features</w:t>
+        <w:t xml:space="preserve">10. #48-new — calendar build sheet written. No code.</w:t>
+      </w:r>
+    </w:p>
+    <w:p>
+      <w:pPr>
+        <w:spacing w:line="276" w:lineRule="auto"/>
+      </w:pPr>
+      <w:r>
+        <w:rPr>
+          <w:rFonts w:ascii="Arial" w:hAnsi="Arial"/>
+          <w:sz w:val="28"/>
+        </w:rPr>
+        <w:t xml:space="preserve">11. #47-new — selling description a good start and left. Features</w:t>
       </w:r>
     </w:p>
     <w:p>
@@ -2488,7 +2464,7 @@
           <w:rFonts w:ascii="Arial" w:hAnsi="Arial"/>
           <w:sz w:val="28"/>
         </w:rPr>
-        <w:t xml:space="preserve">7. #46-new — selling description begun, publishing picture written.</w:t>
+        <w:t xml:space="preserve">12. #46-new — selling description begun, publishing picture written.</w:t>
       </w:r>
     </w:p>
     <w:p>
@@ -2524,7 +2500,7 @@
           <w:rFonts w:ascii="Arial" w:hAnsi="Arial"/>
           <w:sz w:val="28"/>
         </w:rPr>
-        <w:t xml:space="preserve">8. App-Docs, 2026-08-31 — working documents stay in docs; history</w:t>
+        <w:t xml:space="preserve">13. App-Docs, 2026-08-31 — working documents stay in docs; history</w:t>
       </w:r>
     </w:p>
     <w:p>
@@ -2560,7 +2536,7 @@
           <w:rFonts w:ascii="Arial" w:hAnsi="Arial"/>
           <w:sz w:val="28"/>
         </w:rPr>
-        <w:t xml:space="preserve">9. #45-new — the two engine Fails from the sitting: Daily after Done</w:t>
+        <w:t xml:space="preserve">14. #45-new — the two engine Fails from the sitting: Daily after Done</w:t>
       </w:r>
     </w:p>
     <w:p>
@@ -2668,7 +2644,7 @@
           <w:rFonts w:ascii="Arial" w:hAnsi="Arial"/>
           <w:sz w:val="28"/>
         </w:rPr>
-        <w:t xml:space="preserve">10. #44-new — the automated load built, and the simulator sitting</w:t>
+        <w:t xml:space="preserve">15. #44-new — the automated load built, and the simulator sitting</w:t>
       </w:r>
     </w:p>
     <w:p>
@@ -2716,7 +2692,7 @@
           <w:rFonts w:ascii="Arial" w:hAnsi="Arial"/>
           <w:sz w:val="28"/>
         </w:rPr>
-        <w:t xml:space="preserve">11. #43-new — the automated-load job sheet and the sitting list.</w:t>
+        <w:t xml:space="preserve">16. #43-new — the automated-load job sheet and the sitting list.</w:t>
       </w:r>
     </w:p>
     <w:p>
@@ -2764,7 +2740,7 @@
           <w:rFonts w:ascii="Arial" w:hAnsi="Arial"/>
           <w:sz w:val="28"/>
         </w:rPr>
-        <w:t xml:space="preserve">11. #42-new — the rest of Options into the engine. Calendar shading</w:t>
+        <w:t xml:space="preserve">17. #42-new — the rest of Options into the engine. Calendar shading</w:t>
       </w:r>
     </w:p>
     <w:p>
@@ -2848,7 +2824,7 @@
           <w:rFonts w:ascii="Arial" w:hAnsi="Arial"/>
           <w:sz w:val="28"/>
         </w:rPr>
-        <w:t xml:space="preserve">12. #41-new — five Options answers, holidays, monthly patterns, and</w:t>
+        <w:t xml:space="preserve">18. #41-new — five Options answers, holidays, monthly patterns, and</w:t>
       </w:r>
     </w:p>
     <w:p>
@@ -2908,7 +2884,7 @@
           <w:rFonts w:ascii="Arial" w:hAnsi="Arial"/>
           <w:sz w:val="28"/>
         </w:rPr>
-        <w:t xml:space="preserve">13. #40-new — five hardening points, and time zone into the engine.</w:t>
+        <w:t xml:space="preserve">19. #40-new — five hardening points, and time zone into the engine.</w:t>
       </w:r>
     </w:p>
     <w:p>
@@ -2980,7 +2956,7 @@
           <w:rFonts w:ascii="Arial" w:hAnsi="Arial"/>
           <w:sz w:val="28"/>
         </w:rPr>
-        <w:t xml:space="preserve">14. #39-new — the live one-store cutover. Pages, banners and Siri write</w:t>
+        <w:t xml:space="preserve">20. #39-new — the live one-store cutover. Pages, banners and Siri write</w:t>
       </w:r>
     </w:p>
     <w:p>
@@ -3016,7 +2992,7 @@
           <w:rFonts w:ascii="Arial" w:hAnsi="Arial"/>
           <w:sz w:val="28"/>
         </w:rPr>
-        <w:t xml:space="preserve">15. #38-new — the engine and Options path read end to end. The core</w:t>
+        <w:t xml:space="preserve">21. #38-new — the engine and Options path read end to end. The core</w:t>
       </w:r>
     </w:p>
     <w:p>
@@ -3064,7 +3040,7 @@
           <w:rFonts w:ascii="Arial" w:hAnsi="Arial"/>
           <w:sz w:val="28"/>
         </w:rPr>
-        <w:t xml:space="preserve">16. #37-new — Options connecting: + OPT writes the cases that apply,</w:t>
+        <w:t xml:space="preserve">22. #37-new — Options connecting: + OPT writes the cases that apply,</w:t>
       </w:r>
     </w:p>
     <w:p>
@@ -3100,7 +3076,7 @@
           <w:rFonts w:ascii="Arial" w:hAnsi="Arial"/>
           <w:sz w:val="28"/>
         </w:rPr>
-        <w:t xml:space="preserve">17. #36-new — logs on Weekly, Monthly, Quarterly, Yearly, One Time,</w:t>
+        <w:t xml:space="preserve">23. #36-new — logs on Weekly, Monthly, Quarterly, Yearly, One Time,</w:t>
       </w:r>
     </w:p>
     <w:p>
@@ -3184,7 +3160,7 @@
           <w:rFonts w:ascii="Arial" w:hAnsi="Arial"/>
           <w:sz w:val="28"/>
         </w:rPr>
-        <w:t xml:space="preserve">18. #35-new — old screens out, including the `/myday` hop. Backup</w:t>
+        <w:t xml:space="preserve">24. #35-new — old screens out, including the `/myday` hop. Backup</w:t>
       </w:r>
     </w:p>
     <w:p>
@@ -3220,7 +3196,7 @@
           <w:rFonts w:ascii="Arial" w:hAnsi="Arial"/>
           <w:sz w:val="28"/>
         </w:rPr>
-        <w:t xml:space="preserve">19. #34-new — Weekly through Options and the + Add popup built.</w:t>
+        <w:t xml:space="preserve">25. #34-new — Weekly through Options and the + Add popup built.</w:t>
       </w:r>
     </w:p>
     <w:p>
@@ -3256,7 +3232,7 @@
           <w:rFonts w:ascii="Arial" w:hAnsi="Arial"/>
           <w:sz w:val="28"/>
         </w:rPr>
-        <w:t xml:space="preserve">20. #33-new — Daily built. Snooze, Done, hold-and-slide reorder, My</w:t>
+        <w:t xml:space="preserve">26. #33-new — Daily built. Snooze, Done, hold-and-slide reorder, My</w:t>
       </w:r>
     </w:p>
     <w:p>
@@ -3292,7 +3268,7 @@
           <w:rFonts w:ascii="Arial" w:hAnsi="Arial"/>
           <w:sz w:val="28"/>
         </w:rPr>
-        <w:t xml:space="preserve">21. #32-new — the pages phase spec, and Daily's first job sheet.</w:t>
+        <w:t xml:space="preserve">27. #32-new — the pages phase spec, and Daily's first job sheet.</w:t>
       </w:r>
     </w:p>
     <w:p>
@@ -3316,7 +3292,7 @@
           <w:rFonts w:ascii="Arial" w:hAnsi="Arial"/>
           <w:sz w:val="28"/>
         </w:rPr>
-        <w:t xml:space="preserve">22. #31-new — the record itself put right. The hand-off file went</w:t>
+        <w:t xml:space="preserve">28. #31-new — the record itself put right. The hand-off file went</w:t>
       </w:r>
     </w:p>
     <w:p>
@@ -3412,7 +3388,7 @@
           <w:rFonts w:ascii="Arial" w:hAnsi="Arial"/>
           <w:sz w:val="28"/>
         </w:rPr>
-        <w:t xml:space="preserve">23. #30-new — the reminder pages named and shaped, and the one Input</w:t>
+        <w:t xml:space="preserve">29. #30-new — the reminder pages named and shaped, and the one Input</w:t>
       </w:r>
     </w:p>
     <w:p>
@@ -3436,7 +3412,7 @@
           <w:rFonts w:ascii="Arial" w:hAnsi="Arial"/>
           <w:sz w:val="28"/>
         </w:rPr>
-        <w:t xml:space="preserve">24. #28-new — the engine gained repeat groups, skip, and time zones</w:t>
+        <w:t xml:space="preserve">30. #28-new — the engine gained repeat groups, skip, and time zones</w:t>
       </w:r>
     </w:p>
     <w:p>
@@ -3460,7 +3436,7 @@
           <w:rFonts w:ascii="Arial" w:hAnsi="Arial"/>
           <w:sz w:val="28"/>
         </w:rPr>
-        <w:t xml:space="preserve">25. #27-new — all five reminder screens went onto the one machine,</w:t>
+        <w:t xml:space="preserve">31. #27-new — all five reminder screens went onto the one machine,</w:t>
       </w:r>
     </w:p>
     <w:p>
@@ -3520,7 +3496,7 @@
           <w:rFonts w:ascii="Arial" w:hAnsi="Arial"/>
           <w:sz w:val="28"/>
         </w:rPr>
-        <w:t xml:space="preserve">26. #26-new — the per-screen translators became one translator and a</w:t>
+        <w:t xml:space="preserve">32. #26-new — the per-screen translators became one translator and a</w:t>
       </w:r>
     </w:p>
     <w:p>
@@ -3544,7 +3520,7 @@
           <w:rFonts w:ascii="Arial" w:hAnsi="Arial"/>
           <w:sz w:val="28"/>
         </w:rPr>
-        <w:t xml:space="preserve">27. #24-new and #25-new — the first two translators, My Day and</w:t>
+        <w:t xml:space="preserve">33. #24-new and #25-new — the first two translators, My Day and</w:t>
       </w:r>
     </w:p>
     <w:p>
@@ -3580,7 +3556,7 @@
           <w:rFonts w:ascii="Arial" w:hAnsi="Arial"/>
           <w:sz w:val="28"/>
         </w:rPr>
-        <w:t xml:space="preserve">28. #23-new — the common shape and the two decision blocks built and</w:t>
+        <w:t xml:space="preserve">34. #23-new — the common shape and the two decision blocks built and</w:t>
       </w:r>
     </w:p>
     <w:p>
@@ -3604,7 +3580,7 @@
           <w:rFonts w:ascii="Arial" w:hAnsi="Arial"/>
           <w:sz w:val="28"/>
         </w:rPr>
-        <w:t xml:space="preserve">29. #22-new — the field names settled, and setting reminders two</w:t>
+        <w:t xml:space="preserve">35. #22-new — the field names settled, and setting reminders two</w:t>
       </w:r>
     </w:p>
     <w:p>
@@ -3628,7 +3604,7 @@
           <w:rFonts w:ascii="Arial" w:hAnsi="Arial"/>
           <w:sz w:val="28"/>
         </w:rPr>
-        <w:t xml:space="preserve">30. #21-new — the common shape settled on paper, all five screens</w:t>
+        <w:t xml:space="preserve">36. #21-new — the common shape settled on paper, all five screens</w:t>
       </w:r>
     </w:p>
     <w:p>
@@ -3652,7 +3628,7 @@
           <w:rFonts w:ascii="Arial" w:hAnsi="Arial"/>
           <w:sz w:val="28"/>
         </w:rPr>
-        <w:t xml:space="preserve">31. #20-new — My Week's Delay written down like the others, and the</w:t>
+        <w:t xml:space="preserve">37. #20-new — My Week's Delay written down like the others, and the</w:t>
       </w:r>
     </w:p>
     <w:p>
@@ -3676,7 +3652,7 @@
           <w:rFonts w:ascii="Arial" w:hAnsi="Arial"/>
           <w:sz w:val="28"/>
         </w:rPr>
-        <w:t xml:space="preserve">32. #19-new — your epiphany: one shape instead of six, the reminder</w:t>
+        <w:t xml:space="preserve">38. #19-new — your epiphany: one shape instead of six, the reminder</w:t>
       </w:r>
     </w:p>
     <w:p>
@@ -3700,7 +3676,7 @@
           <w:rFonts w:ascii="Arial" w:hAnsi="Arial"/>
           <w:sz w:val="28"/>
         </w:rPr>
-        <w:t xml:space="preserve">33. #18-new — the outsider's report checked. The answer was mend</w:t>
+        <w:t xml:space="preserve">39. #18-new — the outsider's report checked. The answer was mend</w:t>
       </w:r>
     </w:p>
     <w:p>
@@ -3736,7 +3712,7 @@
           <w:rFonts w:ascii="Arial" w:hAnsi="Arial"/>
           <w:sz w:val="28"/>
         </w:rPr>
-        <w:t xml:space="preserve">34. #15-new to #17-new — the failure pop-up and the missed-firing</w:t>
+        <w:t xml:space="preserve">40. #15-new to #17-new — the failure pop-up and the missed-firing</w:t>
       </w:r>
     </w:p>
     <w:p>
@@ -3772,7 +3748,7 @@
           <w:rFonts w:ascii="Arial" w:hAnsi="Arial"/>
           <w:sz w:val="28"/>
         </w:rPr>
-        <w:t xml:space="preserve">35. #13-new and #14-new — tapping a reminder lands on its own item</w:t>
+        <w:t xml:space="preserve">41. #13-new and #14-new — tapping a reminder lands on its own item</w:t>
       </w:r>
     </w:p>
     <w:p>
@@ -3796,7 +3772,7 @@
           <w:rFonts w:ascii="Arial" w:hAnsi="Arial"/>
           <w:sz w:val="28"/>
         </w:rPr>
-        <w:t xml:space="preserve">36. #12-new — the Scheduled Reminders screen, showing every</w:t>
+        <w:t xml:space="preserve">42. #12-new — the Scheduled Reminders screen, showing every</w:t>
       </w:r>
     </w:p>
     <w:p>
@@ -3820,7 +3796,7 @@
           <w:rFonts w:ascii="Arial" w:hAnsi="Arial"/>
           <w:sz w:val="28"/>
         </w:rPr>
-        <w:t xml:space="preserve">37. #6-new to #12-new — the scheduler built in eight steps, so one</w:t>
+        <w:t xml:space="preserve">43. #6-new to #12-new — the scheduler built in eight steps, so one</w:t>
       </w:r>
     </w:p>
     <w:p>
@@ -3844,7 +3820,7 @@
           <w:rFonts w:ascii="Arial" w:hAnsi="Arial"/>
           <w:sz w:val="28"/>
         </w:rPr>
-        <w:t xml:space="preserve">38. #4-new — the first notification fixes. Real, and kept, but not</w:t>
+        <w:t xml:space="preserve">44. #4-new — the first notification fixes. Real, and kept, but not</w:t>
       </w:r>
     </w:p>
     <w:p>

</xml_diff>

<commit_message>
#59-new, Memory, AM/PM popup, remove date & time pickers if not needed.
</commit_message>
<xml_diff>
--- a/docs/pending.docx
+++ b/docs/pending.docx
@@ -24,7 +24,7 @@
           <w:rFonts w:ascii="Arial" w:hAnsi="Arial"/>
           <w:sz w:val="28"/>
         </w:rPr>
-        <w:t xml:space="preserve">Last updated: 2026-09-03 (#56-new, session close)</w:t>
+        <w:t xml:space="preserve">Last updated: 2026-09-03 (#59-new, session close)</w:t>
       </w:r>
     </w:p>
     <w:p>
@@ -229,295 +229,31 @@
           <w:rFonts w:ascii="Arial" w:hAnsi="Arial"/>
           <w:sz w:val="28"/>
         </w:rPr>
-        <w:t xml:space="preserve">1. A HELPER TO GUIDE THE USER through where to set the</w:t>
-      </w:r>
-    </w:p>
-    <w:p>
-      <w:pPr>
-        <w:spacing w:line="276" w:lineRule="auto"/>
-      </w:pPr>
-      <w:r>
-        <w:rPr>
-          <w:rFonts w:ascii="Arial" w:hAnsi="Arial"/>
-          <w:sz w:val="28"/>
-        </w:rPr>
-        <w:t xml:space="preserve">   reminder (Patrick, #52-new). **Its own session or more** — not</w:t>
-      </w:r>
-    </w:p>
-    <w:p>
-      <w:pPr>
-        <w:spacing w:line="276" w:lineRule="auto"/>
-      </w:pPr>
-      <w:r>
-        <w:rPr>
-          <w:rFonts w:ascii="Arial" w:hAnsi="Arial"/>
-          <w:sz w:val="28"/>
-        </w:rPr>
-        <w:t xml:space="preserve">   squeezed beside other work (#56-new close). Pictured as decision-tree</w:t>
-      </w:r>
-    </w:p>
-    <w:p>
-      <w:pPr>
-        <w:spacing w:line="276" w:lineRule="auto"/>
-      </w:pPr>
-      <w:r>
-        <w:rPr>
-          <w:rFonts w:ascii="Arial" w:hAnsi="Arial"/>
-          <w:sz w:val="28"/>
-        </w:rPr>
-        <w:t xml:space="preserve">   stages. The worth is landing on the right page. How to set</w:t>
-      </w:r>
-    </w:p>
-    <w:p>
-      <w:pPr>
-        <w:spacing w:line="276" w:lineRule="auto"/>
-      </w:pPr>
-      <w:r>
-        <w:rPr>
-          <w:rFonts w:ascii="Arial" w:hAnsi="Arial"/>
-          <w:sz w:val="28"/>
-        </w:rPr>
-        <w:t xml:space="preserve">   it is the page itself. Fine-tune options belong in the User</w:t>
-      </w:r>
-    </w:p>
-    <w:p>
-      <w:pPr>
-        <w:spacing w:line="276" w:lineRule="auto"/>
-      </w:pPr>
-      <w:r>
-        <w:rPr>
-          <w:rFonts w:ascii="Arial" w:hAnsi="Arial"/>
-          <w:sz w:val="28"/>
-        </w:rPr>
-        <w:t xml:space="preserve">   Guide or on Options, not in the same helper. He said those</w:t>
-      </w:r>
-    </w:p>
-    <w:p>
-      <w:pPr>
-        <w:spacing w:line="276" w:lineRule="auto"/>
-      </w:pPr>
-      <w:r>
-        <w:rPr>
-          <w:rFonts w:ascii="Arial" w:hAnsi="Arial"/>
-          <w:sz w:val="28"/>
-        </w:rPr>
-        <w:t xml:space="preserve">   points were good. First question (#53-new): "Does this item</w:t>
-      </w:r>
-    </w:p>
-    <w:p>
-      <w:pPr>
-        <w:spacing w:line="276" w:lineRule="auto"/>
-      </w:pPr>
-      <w:r>
-        <w:rPr>
-          <w:rFonts w:ascii="Arial" w:hAnsi="Arial"/>
-          <w:sz w:val="28"/>
-        </w:rPr>
-        <w:t xml:space="preserve">   repeat?" Repeats goes to "Does this item occur every: Every</w:t>
-      </w:r>
-    </w:p>
-    <w:p>
-      <w:pPr>
-        <w:spacing w:line="276" w:lineRule="auto"/>
-      </w:pPr>
-      <w:r>
-        <w:rPr>
-          <w:rFonts w:ascii="Arial" w:hAnsi="Arial"/>
-          <w:sz w:val="28"/>
-        </w:rPr>
-        <w:t xml:space="preserve">   day, Week, Month, Quarter or Year?" Every day lands on Daily</w:t>
-      </w:r>
-    </w:p>
-    <w:p>
-      <w:pPr>
-        <w:spacing w:line="276" w:lineRule="auto"/>
-      </w:pPr>
-      <w:r>
-        <w:rPr>
-          <w:rFonts w:ascii="Arial" w:hAnsi="Arial"/>
-          <w:sz w:val="28"/>
-        </w:rPr>
-        <w:t xml:space="preserve">   add, Week on Weekly, Month on Monthly, Quarter on Quarterly,</w:t>
-      </w:r>
-    </w:p>
-    <w:p>
-      <w:pPr>
-        <w:spacing w:line="276" w:lineRule="auto"/>
-      </w:pPr>
-      <w:r>
-        <w:rPr>
-          <w:rFonts w:ascii="Arial" w:hAnsi="Arial"/>
-          <w:sz w:val="28"/>
-        </w:rPr>
-        <w:t xml:space="preserve">   Year on Yearly. Does not repeat goes to "Is that for today?".</w:t>
-      </w:r>
-    </w:p>
-    <w:p>
-      <w:pPr>
-        <w:spacing w:line="276" w:lineRule="auto"/>
-      </w:pPr>
-      <w:r>
-        <w:rPr>
-          <w:rFonts w:ascii="Arial" w:hAnsi="Arial"/>
-          <w:sz w:val="28"/>
-        </w:rPr>
-        <w:t xml:space="preserve">   Yes lands on Daily’s One Time for today add. No goes to</w:t>
-      </w:r>
-    </w:p>
-    <w:p>
-      <w:pPr>
-        <w:spacing w:line="276" w:lineRule="auto"/>
-      </w:pPr>
-      <w:r>
-        <w:rPr>
-          <w:rFonts w:ascii="Arial" w:hAnsi="Arial"/>
-          <w:sz w:val="28"/>
-        </w:rPr>
-        <w:t xml:space="preserve">   "Is this an occurrence that has a specific time and date,</w:t>
-      </w:r>
-    </w:p>
-    <w:p>
-      <w:pPr>
-        <w:spacing w:line="276" w:lineRule="auto"/>
-      </w:pPr>
-      <w:r>
-        <w:rPr>
-          <w:rFonts w:ascii="Arial" w:hAnsi="Arial"/>
-          <w:sz w:val="28"/>
-        </w:rPr>
-        <w:t xml:space="preserve">   like an appointment? Or is it the rare item with no deadline</w:t>
-      </w:r>
-    </w:p>
-    <w:p>
-      <w:pPr>
-        <w:spacing w:line="276" w:lineRule="auto"/>
-      </w:pPr>
-      <w:r>
-        <w:rPr>
-          <w:rFonts w:ascii="Arial" w:hAnsi="Arial"/>
-          <w:sz w:val="28"/>
-        </w:rPr>
-        <w:t xml:space="preserve">   or due date, like a Bucket List desire?" Appointment side</w:t>
-      </w:r>
-    </w:p>
-    <w:p>
-      <w:pPr>
-        <w:spacing w:line="276" w:lineRule="auto"/>
-      </w:pPr>
-      <w:r>
-        <w:rPr>
-          <w:rFonts w:ascii="Arial" w:hAnsi="Arial"/>
-          <w:sz w:val="28"/>
-        </w:rPr>
-        <w:t xml:space="preserve">   lands on Appointments add. Bucket List side lands on Bucket</w:t>
-      </w:r>
-    </w:p>
-    <w:p>
-      <w:pPr>
-        <w:spacing w:line="276" w:lineRule="auto"/>
-      </w:pPr>
-      <w:r>
-        <w:rPr>
-          <w:rFonts w:ascii="Arial" w:hAnsi="Arial"/>
-          <w:sz w:val="28"/>
-        </w:rPr>
-        <w:t xml:space="preserve">   List add. Each question offers the choices below it,</w:t>
-      </w:r>
-    </w:p>
-    <w:p>
-      <w:pPr>
-        <w:spacing w:line="276" w:lineRule="auto"/>
-      </w:pPr>
-      <w:r>
-        <w:rPr>
-          <w:rFonts w:ascii="Arial" w:hAnsi="Arial"/>
-          <w:sz w:val="28"/>
-        </w:rPr>
-        <w:t xml:space="preserve">   two or five. One question at a time, in one popup like + Add.</w:t>
-      </w:r>
-    </w:p>
-    <w:p>
-      <w:pPr>
-        <w:spacing w:line="276" w:lineRule="auto"/>
-      </w:pPr>
-      <w:r>
-        <w:rPr>
-          <w:rFonts w:ascii="Arial" w:hAnsi="Arial"/>
-          <w:sz w:val="28"/>
-        </w:rPr>
-        <w:t xml:space="preserve">   A tap replaces the question with the next. Cancel leaves you</w:t>
-      </w:r>
-    </w:p>
-    <w:p>
-      <w:pPr>
-        <w:spacing w:line="276" w:lineRule="auto"/>
-      </w:pPr>
-      <w:r>
-        <w:rPr>
-          <w:rFonts w:ascii="Arial" w:hAnsi="Arial"/>
-          <w:sz w:val="28"/>
-        </w:rPr>
-        <w:t xml:space="preserve">   on Home or the calendar. Two or three taps to a landing, and that</w:t>
-      </w:r>
-    </w:p>
-    <w:p>
-      <w:pPr>
-        <w:spacing w:line="276" w:lineRule="auto"/>
-      </w:pPr>
-      <w:r>
-        <w:rPr>
-          <w:rFonts w:ascii="Arial" w:hAnsi="Arial"/>
-          <w:sz w:val="28"/>
-        </w:rPr>
-        <w:t xml:space="preserve">   landing is that kind’s add, not the list. Direct way</w:t>
-      </w:r>
-    </w:p>
-    <w:p>
-      <w:pPr>
-        <w:spacing w:line="276" w:lineRule="auto"/>
-      </w:pPr>
-      <w:r>
-        <w:rPr>
-          <w:rFonts w:ascii="Arial" w:hAnsi="Arial"/>
-          <w:sz w:val="28"/>
-        </w:rPr>
-        <w:t xml:space="preserve">   in: a Where? button on Home. Not</w:t>
-      </w:r>
-    </w:p>
-    <w:p>
-      <w:pPr>
-        <w:spacing w:line="276" w:lineRule="auto"/>
-      </w:pPr>
-      <w:r>
-        <w:rPr>
-          <w:rFonts w:ascii="Arial" w:hAnsi="Arial"/>
-          <w:sz w:val="28"/>
-        </w:rPr>
-        <w:t xml:space="preserve">   on the pages. Calendar’s unused header button is also Where?</w:t>
-      </w:r>
-    </w:p>
-    <w:p>
-      <w:pPr>
-        <w:spacing w:line="276" w:lineRule="auto"/>
-      </w:pPr>
-      <w:r>
-        <w:rPr>
-          <w:rFonts w:ascii="Arial" w:hAnsi="Arial"/>
-          <w:sz w:val="28"/>
-        </w:rPr>
-        <w:t xml:space="preserve">   and opens the helper. The calendar day’s list has no + Add.</w:t>
-      </w:r>
-    </w:p>
-    <w:p>
-      <w:pPr>
-        <w:spacing w:line="276" w:lineRule="auto"/>
-      </w:pPr>
-      <w:r>
-        <w:rPr>
-          <w:rFonts w:ascii="Arial" w:hAnsi="Arial"/>
-          <w:sz w:val="28"/>
-        </w:rPr>
-        <w:t xml:space="preserve">   A calendar day does not ride into the add.</w:t>
+        <w:t xml:space="preserve">**Rotation: 0°, 90°, and 270°** (Patrick, end of #59-new). **180° out.**</w:t>
+      </w:r>
+    </w:p>
+    <w:p>
+      <w:pPr>
+        <w:spacing w:line="276" w:lineRule="auto"/>
+      </w:pPr>
+      <w:r>
+        <w:rPr>
+          <w:rFonts w:ascii="Arial" w:hAnsi="Arial"/>
+          <w:sz w:val="28"/>
+        </w:rPr>
+        <w:t xml:space="preserve">Headers stay with the **physical top of the phone**. Next session. Today:</w:t>
+      </w:r>
+    </w:p>
+    <w:p>
+      <w:pPr>
+        <w:spacing w:line="276" w:lineRule="auto"/>
+      </w:pPr>
+      <w:r>
+        <w:rPr>
+          <w:rFonts w:ascii="Arial" w:hAnsi="Arial"/>
+          <w:sz w:val="28"/>
+        </w:rPr>
+        <w:t xml:space="preserve">0° and 90° only (#52-new).</w:t>
       </w:r>
     </w:p>
     <w:p>
@@ -686,7 +422,55 @@
           <w:rFonts w:ascii="Arial" w:hAnsi="Arial"/>
           <w:sz w:val="28"/>
         </w:rPr>
-        <w:t xml:space="preserve">   opening pop-up (#56-new, Pending 2).</w:t>
+        <w:t xml:space="preserve">   opening pop-up (#56-new, Pending 2); the Where? helper from Home</w:t>
+      </w:r>
+    </w:p>
+    <w:p>
+      <w:pPr>
+        <w:spacing w:line="276" w:lineRule="auto"/>
+      </w:pPr>
+      <w:r>
+        <w:rPr>
+          <w:rFonts w:ascii="Arial" w:hAnsi="Arial"/>
+          <w:sz w:val="28"/>
+        </w:rPr>
+        <w:t xml:space="preserve">   and the calendar month (#58-new); all of #59-new — calendar day-list</w:t>
+      </w:r>
+    </w:p>
+    <w:p>
+      <w:pPr>
+        <w:spacing w:line="276" w:lineRule="auto"/>
+      </w:pPr>
+      <w:r>
+        <w:rPr>
+          <w:rFonts w:ascii="Arial" w:hAnsi="Arial"/>
+          <w:sz w:val="28"/>
+        </w:rPr>
+        <w:t xml:space="preserve">   fire time, date picker off for weekday patterns and One Time for</w:t>
+      </w:r>
+    </w:p>
+    <w:p>
+      <w:pPr>
+        <w:spacing w:line="276" w:lineRule="auto"/>
+      </w:pPr>
+      <w:r>
+        <w:rPr>
+          <w:rFonts w:ascii="Arial" w:hAnsi="Arial"/>
+          <w:sz w:val="28"/>
+        </w:rPr>
+        <w:t xml:space="preserve">   today, Daily every-day with no clock until Set time, AM/PM check on</w:t>
+      </w:r>
+    </w:p>
+    <w:p>
+      <w:pPr>
+        <w:spacing w:line="276" w:lineRule="auto"/>
+      </w:pPr>
+      <w:r>
+        <w:rPr>
+          <w:rFonts w:ascii="Arial" w:hAnsi="Arial"/>
+          <w:sz w:val="28"/>
+        </w:rPr>
+        <w:t xml:space="preserve">   Save (skipped when time set on 24-hour picker) — all of #59-new.</w:t>
       </w:r>
     </w:p>
     <w:p>
@@ -758,163 +542,43 @@
           <w:rFonts w:ascii="Arial" w:hAnsi="Arial"/>
           <w:sz w:val="28"/>
         </w:rPr>
-        <w:t xml:space="preserve">3. THE DATE PICKER IS MEANT TO TURN INACTIVE when a Wednesday</w:t>
-      </w:r>
-    </w:p>
-    <w:p>
-      <w:pPr>
-        <w:spacing w:line="276" w:lineRule="auto"/>
-      </w:pPr>
-      <w:r>
-        <w:rPr>
-          <w:rFonts w:ascii="Arial" w:hAnsi="Arial"/>
-          <w:sz w:val="28"/>
-        </w:rPr>
-        <w:t xml:space="preserve">    after the 6th is in use (Patrick, #52-new). Noted only; not</w:t>
-      </w:r>
-    </w:p>
-    <w:p>
-      <w:pPr>
-        <w:spacing w:line="276" w:lineRule="auto"/>
-      </w:pPr>
-      <w:r>
-        <w:rPr>
-          <w:rFonts w:ascii="Arial" w:hAnsi="Arial"/>
-          <w:sz w:val="28"/>
-        </w:rPr>
-        <w:t xml:space="preserve">    a job yet.</w:t>
-      </w:r>
-    </w:p>
-    <w:p>
-      <w:pPr>
-        <w:spacing w:line="276" w:lineRule="auto"/>
-      </w:pPr>
-      <w:r>
-        <w:rPr>
-          <w:rFonts w:ascii="Arial" w:hAnsi="Arial"/>
-          <w:sz w:val="28"/>
-        </w:rPr>
-        <w:t xml:space="preserve">4. A TAP ON A DAY IN THE CALENDAR brings up every item for that</w:t>
-      </w:r>
-    </w:p>
-    <w:p>
-      <w:pPr>
-        <w:spacing w:line="276" w:lineRule="auto"/>
-      </w:pPr>
-      <w:r>
-        <w:rPr>
-          <w:rFonts w:ascii="Arial" w:hAnsi="Arial"/>
-          <w:sz w:val="28"/>
-        </w:rPr>
-        <w:t xml:space="preserve">    day. Those items should show the 24-hour time they are</w:t>
-      </w:r>
-    </w:p>
-    <w:p>
-      <w:pPr>
-        <w:spacing w:line="276" w:lineRule="auto"/>
-      </w:pPr>
-      <w:r>
-        <w:rPr>
-          <w:rFonts w:ascii="Arial" w:hAnsi="Arial"/>
-          <w:sz w:val="28"/>
-        </w:rPr>
-        <w:t xml:space="preserve">    scheduled to fire (Patrick, #52-new). The list today shows</w:t>
-      </w:r>
-    </w:p>
-    <w:p>
-      <w:pPr>
-        <w:spacing w:line="276" w:lineRule="auto"/>
-      </w:pPr>
-      <w:r>
-        <w:rPr>
-          <w:rFonts w:ascii="Arial" w:hAnsi="Arial"/>
-          <w:sz w:val="28"/>
-        </w:rPr>
-        <w:t xml:space="preserve">    the name only. Sit tests are finished. **Own short session**</w:t>
-      </w:r>
-    </w:p>
-    <w:p>
-      <w:pPr>
-        <w:spacing w:line="276" w:lineRule="auto"/>
-      </w:pPr>
-      <w:r>
-        <w:rPr>
-          <w:rFonts w:ascii="Arial" w:hAnsi="Arial"/>
-          <w:sz w:val="28"/>
-        </w:rPr>
-        <w:t xml:space="preserve">    — not safe to compress (#56-new); no build sheet yet; settle</w:t>
-      </w:r>
-    </w:p>
-    <w:p>
-      <w:pPr>
-        <w:spacing w:line="276" w:lineRule="auto"/>
-      </w:pPr>
-      <w:r>
-        <w:rPr>
-          <w:rFonts w:ascii="Arial" w:hAnsi="Arial"/>
-          <w:sz w:val="28"/>
-        </w:rPr>
-        <w:t xml:space="preserve">    what "fire time" means before building.</w:t>
-      </w:r>
-    </w:p>
-    <w:p>
-      <w:pPr>
-        <w:spacing w:line="276" w:lineRule="auto"/>
-      </w:pPr>
-      <w:r>
-        <w:rPr>
-          <w:rFonts w:ascii="Arial" w:hAnsi="Arial"/>
-          <w:sz w:val="28"/>
-        </w:rPr>
-        <w:t xml:space="preserve">5. ALL THE SCREENS SHOULD WORK IN ANY ROTATION (Patrick,</w:t>
-      </w:r>
-    </w:p>
-    <w:p>
-      <w:pPr>
-        <w:spacing w:line="276" w:lineRule="auto"/>
-      </w:pPr>
-      <w:r>
-        <w:rPr>
-          <w:rFonts w:ascii="Arial" w:hAnsi="Arial"/>
-          <w:sz w:val="28"/>
-        </w:rPr>
-        <w:t xml:space="preserve">    #52-new). Today the turn is locked to 90° counter-clockwise,</w:t>
-      </w:r>
-    </w:p>
-    <w:p>
-      <w:pPr>
-        <w:spacing w:line="276" w:lineRule="auto"/>
-      </w:pPr>
-      <w:r>
-        <w:rPr>
-          <w:rFonts w:ascii="Arial" w:hAnsi="Arial"/>
-          <w:sz w:val="28"/>
-        </w:rPr>
-        <w:t xml:space="preserve">    headers on the left. At #52-new that lock is good. The</w:t>
-      </w:r>
-    </w:p>
-    <w:p>
-      <w:pPr>
-        <w:spacing w:line="276" w:lineRule="auto"/>
-      </w:pPr>
-      <w:r>
-        <w:rPr>
-          <w:rFonts w:ascii="Arial" w:hAnsi="Arial"/>
-          <w:sz w:val="28"/>
-        </w:rPr>
-        <w:t xml:space="preserve">    note is to make every page work however the phone is held.</w:t>
-      </w:r>
-    </w:p>
-    <w:p>
-      <w:pPr>
-        <w:spacing w:line="276" w:lineRule="auto"/>
-      </w:pPr>
-      <w:r>
-        <w:rPr>
-          <w:rFonts w:ascii="Arial" w:hAnsi="Arial"/>
-          <w:sz w:val="28"/>
-        </w:rPr>
-        <w:t xml:space="preserve">6. A THOROUGH DESIGN SPEC FOR THE APP (Patrick, #52-new). This</w:t>
+        <w:t xml:space="preserve">3. ROTATION: 0°, 90°, AND 270° (Patrick, end of #59-new). **180° out.**</w:t>
+      </w:r>
+    </w:p>
+    <w:p>
+      <w:pPr>
+        <w:spacing w:line="276" w:lineRule="auto"/>
+      </w:pPr>
+      <w:r>
+        <w:rPr>
+          <w:rFonts w:ascii="Arial" w:hAnsi="Arial"/>
+          <w:sz w:val="28"/>
+        </w:rPr>
+        <w:t xml:space="preserve">    Headers stay with the **physical top of the phone** in every allowed</w:t>
+      </w:r>
+    </w:p>
+    <w:p>
+      <w:pPr>
+        <w:spacing w:line="276" w:lineRule="auto"/>
+      </w:pPr>
+      <w:r>
+        <w:rPr>
+          <w:rFonts w:ascii="Arial" w:hAnsi="Arial"/>
+          <w:sz w:val="28"/>
+        </w:rPr>
+        <w:t xml:space="preserve">    turn. Next session. Today: 0° and 90° only (#52-new).</w:t>
+      </w:r>
+    </w:p>
+    <w:p>
+      <w:pPr>
+        <w:spacing w:line="276" w:lineRule="auto"/>
+      </w:pPr>
+      <w:r>
+        <w:rPr>
+          <w:rFonts w:ascii="Arial" w:hAnsi="Arial"/>
+          <w:sz w:val="28"/>
+        </w:rPr>
+        <w:t xml:space="preserve">4. A THOROUGH DESIGN SPEC FOR THE APP (Patrick, #52-new). This</w:t>
       </w:r>
     </w:p>
     <w:p>
@@ -974,7 +638,7 @@
           <w:rFonts w:ascii="Arial" w:hAnsi="Arial"/>
           <w:sz w:val="28"/>
         </w:rPr>
-        <w:t xml:space="preserve">7. A USER GUIDE, from that spec or merely after it (Patrick,</w:t>
+        <w:t xml:space="preserve">5. A USER GUIDE, from that spec or merely after it (Patrick,</w:t>
       </w:r>
     </w:p>
     <w:p>
@@ -1010,7 +674,7 @@
           <w:rFonts w:ascii="Arial" w:hAnsi="Arial"/>
           <w:sz w:val="28"/>
         </w:rPr>
-        <w:t xml:space="preserve">8. A FEEDBACK BUTTON IN THE APP, similar to Mystery (Patrick,</w:t>
+        <w:t xml:space="preserve">6. A FEEDBACK BUTTON IN THE APP, similar to Mystery (Patrick,</w:t>
       </w:r>
     </w:p>
     <w:p>
@@ -1046,7 +710,7 @@
           <w:rFonts w:ascii="Arial" w:hAnsi="Arial"/>
           <w:sz w:val="28"/>
         </w:rPr>
-        <w:t xml:space="preserve">9. A PAGE, SPEC, OR FILE FOR WHAT TESTING HAS COVERED AND</w:t>
+        <w:t xml:space="preserve">7. A PAGE, SPEC, OR FILE FOR WHAT TESTING HAS COVERED AND</w:t>
       </w:r>
     </w:p>
     <w:p>
@@ -1731,7 +1395,7 @@
           <w:rFonts w:ascii="Arial" w:hAnsi="Arial"/>
           <w:sz w:val="28"/>
         </w:rPr>
-        <w:t xml:space="preserve">    the eleven build sheets are in docs-ref/build-sheets. The index</w:t>
+        <w:t xml:space="preserve">    the twelve build sheets are in docs-ref/build-sheets. The index</w:t>
       </w:r>
     </w:p>
     <w:p>
@@ -1948,7 +1612,139 @@
           <w:rFonts w:ascii="Arial" w:hAnsi="Arial"/>
           <w:sz w:val="28"/>
         </w:rPr>
-        <w:t xml:space="preserve">1. #56-new — Appointments and Bucket List on every live screen;</w:t>
+        <w:t xml:space="preserve">1. #59-new — calendar day-list fire time (old Pending 4); useless</w:t>
+      </w:r>
+    </w:p>
+    <w:p>
+      <w:pPr>
+        <w:spacing w:line="276" w:lineRule="auto"/>
+      </w:pPr>
+      <w:r>
+        <w:rPr>
+          <w:rFonts w:ascii="Arial" w:hAnsi="Arial"/>
+          <w:sz w:val="28"/>
+        </w:rPr>
+        <w:t xml:space="preserve">   spinners removed; AM/PM popup on Save when time set on 12-hour row</w:t>
+      </w:r>
+    </w:p>
+    <w:p>
+      <w:pPr>
+        <w:spacing w:line="276" w:lineRule="auto"/>
+      </w:pPr>
+      <w:r>
+        <w:rPr>
+          <w:rFonts w:ascii="Arial" w:hAnsi="Arial"/>
+          <w:sz w:val="28"/>
+        </w:rPr>
+        <w:t xml:space="preserve">   only (24-hour box or digit spinner skips it). Patrick said excellent.</w:t>
+      </w:r>
+    </w:p>
+    <w:p>
+      <w:pPr>
+        <w:spacing w:line="276" w:lineRule="auto"/>
+      </w:pPr>
+      <w:r>
+        <w:rPr>
+          <w:rFonts w:ascii="Arial" w:hAnsi="Arial"/>
+          <w:sz w:val="28"/>
+        </w:rPr>
+        <w:t xml:space="preserve">   Mac 489. Not on the phone. Patrick is committing.</w:t>
+      </w:r>
+    </w:p>
+    <w:p>
+      <w:pPr>
+        <w:spacing w:line="276" w:lineRule="auto"/>
+      </w:pPr>
+      <w:r>
+        <w:rPr>
+          <w:rFonts w:ascii="Arial" w:hAnsi="Arial"/>
+          <w:sz w:val="28"/>
+        </w:rPr>
+        <w:t xml:space="preserve">2. #58-new — the Where? helper built from its sheet. 🧭 badge after</w:t>
+      </w:r>
+    </w:p>
+    <w:p>
+      <w:pPr>
+        <w:spacing w:line="276" w:lineRule="auto"/>
+      </w:pPr>
+      <w:r>
+        <w:rPr>
+          <w:rFonts w:ascii="Arial" w:hAnsi="Arial"/>
+          <w:sz w:val="28"/>
+        </w:rPr>
+        <w:t xml:space="preserve">   Daily, calendar month button, transparent `app/where.tsx`, eight</w:t>
+      </w:r>
+    </w:p>
+    <w:p>
+      <w:pPr>
+        <w:spacing w:line="276" w:lineRule="auto"/>
+      </w:pPr>
+      <w:r>
+        <w:rPr>
+          <w:rFonts w:ascii="Arial" w:hAnsi="Arial"/>
+          <w:sz w:val="28"/>
+        </w:rPr>
+        <w:t xml:space="preserve">   landings on existing New forms, `formContext: oneTimeForToday`</w:t>
+      </w:r>
+    </w:p>
+    <w:p>
+      <w:pPr>
+        <w:spacing w:line="276" w:lineRule="auto"/>
+      </w:pPr>
+      <w:r>
+        <w:rPr>
+          <w:rFonts w:ascii="Arial" w:hAnsi="Arial"/>
+          <w:sz w:val="28"/>
+        </w:rPr>
+        <w:t xml:space="preserve">   split from `returnTo`. Mac 489. Not on the phone. Committed (Patrick, #59-new).</w:t>
+      </w:r>
+    </w:p>
+    <w:p>
+      <w:pPr>
+        <w:spacing w:line="276" w:lineRule="auto"/>
+      </w:pPr>
+      <w:r>
+        <w:rPr>
+          <w:rFonts w:ascii="Arial" w:hAnsi="Arial"/>
+          <w:sz w:val="28"/>
+        </w:rPr>
+        <w:t xml:space="preserve">3. #57-new — the Where? helper settled and its self-contained build</w:t>
+      </w:r>
+    </w:p>
+    <w:p>
+      <w:pPr>
+        <w:spacing w:line="276" w:lineRule="auto"/>
+      </w:pPr>
+      <w:r>
+        <w:rPr>
+          <w:rFonts w:ascii="Arial" w:hAnsi="Arial"/>
+          <w:sz w:val="28"/>
+        </w:rPr>
+        <w:t xml:space="preserve">   sheet written. 🧭 badge after Daily, calendar button, and the</w:t>
+      </w:r>
+    </w:p>
+    <w:p>
+      <w:pPr>
+        <w:spacing w:line="276" w:lineRule="auto"/>
+      </w:pPr>
+      <w:r>
+        <w:rPr>
+          <w:rFonts w:ascii="Arial" w:hAnsi="Arial"/>
+          <w:sz w:val="28"/>
+        </w:rPr>
+        <w:t xml:space="preserve">   Cancel and Save journey decided. No code.</w:t>
+      </w:r>
+    </w:p>
+    <w:p>
+      <w:pPr>
+        <w:spacing w:line="276" w:lineRule="auto"/>
+      </w:pPr>
+      <w:r>
+        <w:rPr>
+          <w:rFonts w:ascii="Arial" w:hAnsi="Arial"/>
+          <w:sz w:val="28"/>
+        </w:rPr>
+        <w:t xml:space="preserve">4. #56-new — Appointments and Bucket List on every live screen;</w:t>
       </w:r>
     </w:p>
     <w:p>
@@ -1972,19 +1768,19 @@
           <w:rFonts w:ascii="Arial" w:hAnsi="Arial"/>
           <w:sz w:val="28"/>
         </w:rPr>
-        <w:t xml:space="preserve">   very good. Patrick committing at session close. Not on the phone.</w:t>
-      </w:r>
-    </w:p>
-    <w:p>
-      <w:pPr>
-        <w:spacing w:line="276" w:lineRule="auto"/>
-      </w:pPr>
-      <w:r>
-        <w:rPr>
-          <w:rFonts w:ascii="Arial" w:hAnsi="Arial"/>
-          <w:sz w:val="28"/>
-        </w:rPr>
-        <w:t xml:space="preserve">2. #55-new — missed-firing notice for Weekly, Monthly, Quarterly,</w:t>
+        <w:t xml:space="preserve">   very good. Committed (Patrick, #57-new). Not on the phone.</w:t>
+      </w:r>
+    </w:p>
+    <w:p>
+      <w:pPr>
+        <w:spacing w:line="276" w:lineRule="auto"/>
+      </w:pPr>
+      <w:r>
+        <w:rPr>
+          <w:rFonts w:ascii="Arial" w:hAnsi="Arial"/>
+          <w:sz w:val="28"/>
+        </w:rPr>
+        <w:t xml:space="preserve">5. #55-new — missed-firing notice for Weekly, Monthly, Quarterly,</w:t>
       </w:r>
     </w:p>
     <w:p>
@@ -2032,7 +1828,7 @@
           <w:rFonts w:ascii="Arial" w:hAnsi="Arial"/>
           <w:sz w:val="28"/>
         </w:rPr>
-        <w:t xml:space="preserve">3. #53-new (2026-09-02) — Scheduled Reminders names Daily, Weekly,</w:t>
+        <w:t xml:space="preserve">6. #53-new (2026-09-02) — Scheduled Reminders names Daily, Weekly,</w:t>
       </w:r>
     </w:p>
     <w:p>
@@ -2068,7 +1864,7 @@
           <w:rFonts w:ascii="Arial" w:hAnsi="Arial"/>
           <w:sz w:val="28"/>
         </w:rPr>
-        <w:t xml:space="preserve">4. #53-new (2026-09-02) — one list row for Daily through Extended</w:t>
+        <w:t xml:space="preserve">7. #53-new (2026-09-02) — one list row for Daily through Extended</w:t>
       </w:r>
     </w:p>
     <w:p>
@@ -2092,7 +1888,7 @@
           <w:rFonts w:ascii="Arial" w:hAnsi="Arial"/>
           <w:sz w:val="28"/>
         </w:rPr>
-        <w:t xml:space="preserve">5. #54-new (2026-09-02) — Appointments and Bucket List: one list in</w:t>
+        <w:t xml:space="preserve">8. #54-new (2026-09-02) — Appointments and Bucket List: one list in</w:t>
       </w:r>
     </w:p>
     <w:p>
@@ -2128,7 +1924,7 @@
           <w:rFonts w:ascii="Arial" w:hAnsi="Arial"/>
           <w:sz w:val="28"/>
         </w:rPr>
-        <w:t xml:space="preserve">6. #52-new — landscape 90° counter-clockwise, headers on the left,</w:t>
+        <w:t xml:space="preserve">9. #52-new — landscape 90° counter-clockwise, headers on the left,</w:t>
       </w:r>
     </w:p>
     <w:p>
@@ -2188,7 +1984,7 @@
           <w:rFonts w:ascii="Arial" w:hAnsi="Arial"/>
           <w:sz w:val="28"/>
         </w:rPr>
-        <w:t xml:space="preserve">7. #51-new — display features: header buttons and the Home badge</w:t>
+        <w:t xml:space="preserve">10. #51-new — display features: header buttons and the Home badge</w:t>
       </w:r>
     </w:p>
     <w:p>
@@ -2260,7 +2056,7 @@
           <w:rFonts w:ascii="Arial" w:hAnsi="Arial"/>
           <w:sz w:val="28"/>
         </w:rPr>
-        <w:t xml:space="preserve">8. #50-new — the other pages in landscape. Optional view, 0 and 90</w:t>
+        <w:t xml:space="preserve">11. #50-new — the other pages in landscape. Optional view, 0 and 90</w:t>
       </w:r>
     </w:p>
     <w:p>
@@ -2308,19 +2104,19 @@
           <w:rFonts w:ascii="Arial" w:hAnsi="Arial"/>
           <w:sz w:val="28"/>
         </w:rPr>
-        <w:t xml:space="preserve">   the Memory app there. Goal accomplished. Phone not touched.</w:t>
-      </w:r>
-    </w:p>
-    <w:p>
-      <w:pPr>
-        <w:spacing w:line="276" w:lineRule="auto"/>
-      </w:pPr>
-      <w:r>
-        <w:rPr>
-          <w:rFonts w:ascii="Arial" w:hAnsi="Arial"/>
-          <w:sz w:val="28"/>
-        </w:rPr>
-        <w:t xml:space="preserve">9. #49-new — calendar page built from the sheet. Options Calendar</w:t>
+        <w:t xml:space="preserve">   the Memory app there.    Goal accomplished. Phone not touched.</w:t>
+      </w:r>
+    </w:p>
+    <w:p>
+      <w:pPr>
+        <w:spacing w:line="276" w:lineRule="auto"/>
+      </w:pPr>
+      <w:r>
+        <w:rPr>
+          <w:rFonts w:ascii="Arial" w:hAnsi="Arial"/>
+          <w:sz w:val="28"/>
+        </w:rPr>
+        <w:t xml:space="preserve">12. #49-new — calendar page built from the sheet. Options Calendar</w:t>
       </w:r>
     </w:p>
     <w:p>
@@ -2380,19 +2176,19 @@
           <w:rFonts w:ascii="Arial" w:hAnsi="Arial"/>
           <w:sz w:val="28"/>
         </w:rPr>
-        <w:t xml:space="preserve">10. #48-new — calendar build sheet written. No code.</w:t>
-      </w:r>
-    </w:p>
-    <w:p>
-      <w:pPr>
-        <w:spacing w:line="276" w:lineRule="auto"/>
-      </w:pPr>
-      <w:r>
-        <w:rPr>
-          <w:rFonts w:ascii="Arial" w:hAnsi="Arial"/>
-          <w:sz w:val="28"/>
-        </w:rPr>
-        <w:t xml:space="preserve">11. #47-new — selling description a good start and left. Features</w:t>
+        <w:t xml:space="preserve">13. #48-new — calendar build sheet written. No code.</w:t>
+      </w:r>
+    </w:p>
+    <w:p>
+      <w:pPr>
+        <w:spacing w:line="276" w:lineRule="auto"/>
+      </w:pPr>
+      <w:r>
+        <w:rPr>
+          <w:rFonts w:ascii="Arial" w:hAnsi="Arial"/>
+          <w:sz w:val="28"/>
+        </w:rPr>
+        <w:t xml:space="preserve">14. #47-new — selling description a good start and left. Features</w:t>
       </w:r>
     </w:p>
     <w:p>
@@ -2464,7 +2260,7 @@
           <w:rFonts w:ascii="Arial" w:hAnsi="Arial"/>
           <w:sz w:val="28"/>
         </w:rPr>
-        <w:t xml:space="preserve">12. #46-new — selling description begun, publishing picture written.</w:t>
+        <w:t xml:space="preserve">15. #46-new — selling description begun, publishing picture written.</w:t>
       </w:r>
     </w:p>
     <w:p>
@@ -2500,7 +2296,7 @@
           <w:rFonts w:ascii="Arial" w:hAnsi="Arial"/>
           <w:sz w:val="28"/>
         </w:rPr>
-        <w:t xml:space="preserve">13. App-Docs, 2026-08-31 — working documents stay in docs; history</w:t>
+        <w:t xml:space="preserve">16. App-Docs, 2026-08-31 — working documents stay in docs; history</w:t>
       </w:r>
     </w:p>
     <w:p>
@@ -2536,7 +2332,7 @@
           <w:rFonts w:ascii="Arial" w:hAnsi="Arial"/>
           <w:sz w:val="28"/>
         </w:rPr>
-        <w:t xml:space="preserve">14. #45-new — the two engine Fails from the sitting: Daily after Done</w:t>
+        <w:t xml:space="preserve">17. #45-new — the two engine Fails from the sitting: Daily after Done</w:t>
       </w:r>
     </w:p>
     <w:p>
@@ -2644,7 +2440,7 @@
           <w:rFonts w:ascii="Arial" w:hAnsi="Arial"/>
           <w:sz w:val="28"/>
         </w:rPr>
-        <w:t xml:space="preserve">15. #44-new — the automated load built, and the simulator sitting</w:t>
+        <w:t xml:space="preserve">17. #44-new — the automated load built, and the simulator sitting</w:t>
       </w:r>
     </w:p>
     <w:p>
@@ -2692,7 +2488,7 @@
           <w:rFonts w:ascii="Arial" w:hAnsi="Arial"/>
           <w:sz w:val="28"/>
         </w:rPr>
-        <w:t xml:space="preserve">16. #43-new — the automated-load job sheet and the sitting list.</w:t>
+        <w:t xml:space="preserve">18. #43-new — the automated-load job sheet and the sitting list.</w:t>
       </w:r>
     </w:p>
     <w:p>
@@ -2740,7 +2536,7 @@
           <w:rFonts w:ascii="Arial" w:hAnsi="Arial"/>
           <w:sz w:val="28"/>
         </w:rPr>
-        <w:t xml:space="preserve">17. #42-new — the rest of Options into the engine. Calendar shading</w:t>
+        <w:t xml:space="preserve">19. #42-new — the rest of Options into the engine. Calendar shading</w:t>
       </w:r>
     </w:p>
     <w:p>
@@ -2824,7 +2620,7 @@
           <w:rFonts w:ascii="Arial" w:hAnsi="Arial"/>
           <w:sz w:val="28"/>
         </w:rPr>
-        <w:t xml:space="preserve">18. #41-new — five Options answers, holidays, monthly patterns, and</w:t>
+        <w:t xml:space="preserve">20. #41-new — five Options answers, holidays, monthly patterns, and</w:t>
       </w:r>
     </w:p>
     <w:p>
@@ -2884,7 +2680,7 @@
           <w:rFonts w:ascii="Arial" w:hAnsi="Arial"/>
           <w:sz w:val="28"/>
         </w:rPr>
-        <w:t xml:space="preserve">19. #40-new — five hardening points, and time zone into the engine.</w:t>
+        <w:t xml:space="preserve">21. #40-new — five hardening points, and time zone into the engine.</w:t>
       </w:r>
     </w:p>
     <w:p>
@@ -2956,7 +2752,7 @@
           <w:rFonts w:ascii="Arial" w:hAnsi="Arial"/>
           <w:sz w:val="28"/>
         </w:rPr>
-        <w:t xml:space="preserve">20. #39-new — the live one-store cutover. Pages, banners and Siri write</w:t>
+        <w:t xml:space="preserve">22. #39-new — the live one-store cutover. Pages, banners and Siri write</w:t>
       </w:r>
     </w:p>
     <w:p>
@@ -2992,7 +2788,7 @@
           <w:rFonts w:ascii="Arial" w:hAnsi="Arial"/>
           <w:sz w:val="28"/>
         </w:rPr>
-        <w:t xml:space="preserve">21. #38-new — the engine and Options path read end to end. The core</w:t>
+        <w:t xml:space="preserve">23. #38-new — the engine and Options path read end to end. The core</w:t>
       </w:r>
     </w:p>
     <w:p>
@@ -3040,7 +2836,7 @@
           <w:rFonts w:ascii="Arial" w:hAnsi="Arial"/>
           <w:sz w:val="28"/>
         </w:rPr>
-        <w:t xml:space="preserve">22. #37-new — Options connecting: + OPT writes the cases that apply,</w:t>
+        <w:t xml:space="preserve">24. #37-new — Options connecting: + OPT writes the cases that apply,</w:t>
       </w:r>
     </w:p>
     <w:p>
@@ -3076,7 +2872,7 @@
           <w:rFonts w:ascii="Arial" w:hAnsi="Arial"/>
           <w:sz w:val="28"/>
         </w:rPr>
-        <w:t xml:space="preserve">23. #36-new — logs on Weekly, Monthly, Quarterly, Yearly, One Time,</w:t>
+        <w:t xml:space="preserve">25. #36-new — logs on Weekly, Monthly, Quarterly, Yearly, One Time,</w:t>
       </w:r>
     </w:p>
     <w:p>
@@ -3160,7 +2956,7 @@
           <w:rFonts w:ascii="Arial" w:hAnsi="Arial"/>
           <w:sz w:val="28"/>
         </w:rPr>
-        <w:t xml:space="preserve">24. #35-new — old screens out, including the `/myday` hop. Backup</w:t>
+        <w:t xml:space="preserve">26. #35-new — old screens out, including the `/myday` hop. Backup</w:t>
       </w:r>
     </w:p>
     <w:p>
@@ -3196,7 +2992,7 @@
           <w:rFonts w:ascii="Arial" w:hAnsi="Arial"/>
           <w:sz w:val="28"/>
         </w:rPr>
-        <w:t xml:space="preserve">25. #34-new — Weekly through Options and the + Add popup built.</w:t>
+        <w:t xml:space="preserve">27. #34-new — Weekly through Options and the + Add popup built.</w:t>
       </w:r>
     </w:p>
     <w:p>
@@ -3232,7 +3028,7 @@
           <w:rFonts w:ascii="Arial" w:hAnsi="Arial"/>
           <w:sz w:val="28"/>
         </w:rPr>
-        <w:t xml:space="preserve">26. #33-new — Daily built. Snooze, Done, hold-and-slide reorder, My</w:t>
+        <w:t xml:space="preserve">28. #33-new — Daily built. Snooze, Done, hold-and-slide reorder, My</w:t>
       </w:r>
     </w:p>
     <w:p>
@@ -3268,7 +3064,7 @@
           <w:rFonts w:ascii="Arial" w:hAnsi="Arial"/>
           <w:sz w:val="28"/>
         </w:rPr>
-        <w:t xml:space="preserve">27. #32-new — the pages phase spec, and Daily's first job sheet.</w:t>
+        <w:t xml:space="preserve">29. #32-new — the pages phase spec, and Daily's first job sheet.</w:t>
       </w:r>
     </w:p>
     <w:p>
@@ -3292,7 +3088,7 @@
           <w:rFonts w:ascii="Arial" w:hAnsi="Arial"/>
           <w:sz w:val="28"/>
         </w:rPr>
-        <w:t xml:space="preserve">28. #31-new — the record itself put right. The hand-off file went</w:t>
+        <w:t xml:space="preserve">30. #31-new — the record itself put right. The hand-off file went</w:t>
       </w:r>
     </w:p>
     <w:p>
@@ -3388,7 +3184,7 @@
           <w:rFonts w:ascii="Arial" w:hAnsi="Arial"/>
           <w:sz w:val="28"/>
         </w:rPr>
-        <w:t xml:space="preserve">29. #30-new — the reminder pages named and shaped, and the one Input</w:t>
+        <w:t xml:space="preserve">31. #30-new — the reminder pages named and shaped, and the one Input</w:t>
       </w:r>
     </w:p>
     <w:p>
@@ -3412,7 +3208,7 @@
           <w:rFonts w:ascii="Arial" w:hAnsi="Arial"/>
           <w:sz w:val="28"/>
         </w:rPr>
-        <w:t xml:space="preserve">30. #28-new — the engine gained repeat groups, skip, and time zones</w:t>
+        <w:t xml:space="preserve">32. #28-new — the engine gained repeat groups, skip, and time zones</w:t>
       </w:r>
     </w:p>
     <w:p>
@@ -3436,7 +3232,7 @@
           <w:rFonts w:ascii="Arial" w:hAnsi="Arial"/>
           <w:sz w:val="28"/>
         </w:rPr>
-        <w:t xml:space="preserve">31. #27-new — all five reminder screens went onto the one machine,</w:t>
+        <w:t xml:space="preserve">33. #27-new — all five reminder screens went onto the one machine,</w:t>
       </w:r>
     </w:p>
     <w:p>
@@ -3496,7 +3292,7 @@
           <w:rFonts w:ascii="Arial" w:hAnsi="Arial"/>
           <w:sz w:val="28"/>
         </w:rPr>
-        <w:t xml:space="preserve">32. #26-new — the per-screen translators became one translator and a</w:t>
+        <w:t xml:space="preserve">34. #26-new — the per-screen translators became one translator and a</w:t>
       </w:r>
     </w:p>
     <w:p>
@@ -3520,7 +3316,7 @@
           <w:rFonts w:ascii="Arial" w:hAnsi="Arial"/>
           <w:sz w:val="28"/>
         </w:rPr>
-        <w:t xml:space="preserve">33. #24-new and #25-new — the first two translators, My Day and</w:t>
+        <w:t xml:space="preserve">35. #24-new and #25-new — the first two translators, My Day and</w:t>
       </w:r>
     </w:p>
     <w:p>
@@ -3556,7 +3352,7 @@
           <w:rFonts w:ascii="Arial" w:hAnsi="Arial"/>
           <w:sz w:val="28"/>
         </w:rPr>
-        <w:t xml:space="preserve">34. #23-new — the common shape and the two decision blocks built and</w:t>
+        <w:t xml:space="preserve">36. #23-new — the common shape and the two decision blocks built and</w:t>
       </w:r>
     </w:p>
     <w:p>
@@ -3580,7 +3376,7 @@
           <w:rFonts w:ascii="Arial" w:hAnsi="Arial"/>
           <w:sz w:val="28"/>
         </w:rPr>
-        <w:t xml:space="preserve">35. #22-new — the field names settled, and setting reminders two</w:t>
+        <w:t xml:space="preserve">37. #22-new — the field names settled, and setting reminders two</w:t>
       </w:r>
     </w:p>
     <w:p>
@@ -3604,7 +3400,7 @@
           <w:rFonts w:ascii="Arial" w:hAnsi="Arial"/>
           <w:sz w:val="28"/>
         </w:rPr>
-        <w:t xml:space="preserve">36. #21-new — the common shape settled on paper, all five screens</w:t>
+        <w:t xml:space="preserve">38. #21-new — the common shape settled on paper, all five screens</w:t>
       </w:r>
     </w:p>
     <w:p>
@@ -3628,7 +3424,7 @@
           <w:rFonts w:ascii="Arial" w:hAnsi="Arial"/>
           <w:sz w:val="28"/>
         </w:rPr>
-        <w:t xml:space="preserve">37. #20-new — My Week's Delay written down like the others, and the</w:t>
+        <w:t xml:space="preserve">39. #20-new — My Week's Delay written down like the others, and the</w:t>
       </w:r>
     </w:p>
     <w:p>
@@ -3652,7 +3448,7 @@
           <w:rFonts w:ascii="Arial" w:hAnsi="Arial"/>
           <w:sz w:val="28"/>
         </w:rPr>
-        <w:t xml:space="preserve">38. #19-new — your epiphany: one shape instead of six, the reminder</w:t>
+        <w:t xml:space="preserve">40. #19-new — your epiphany: one shape instead of six, the reminder</w:t>
       </w:r>
     </w:p>
     <w:p>
@@ -3676,7 +3472,7 @@
           <w:rFonts w:ascii="Arial" w:hAnsi="Arial"/>
           <w:sz w:val="28"/>
         </w:rPr>
-        <w:t xml:space="preserve">39. #18-new — the outsider's report checked. The answer was mend</w:t>
+        <w:t xml:space="preserve">41. #18-new — the outsider's report checked. The answer was mend</w:t>
       </w:r>
     </w:p>
     <w:p>
@@ -3712,7 +3508,7 @@
           <w:rFonts w:ascii="Arial" w:hAnsi="Arial"/>
           <w:sz w:val="28"/>
         </w:rPr>
-        <w:t xml:space="preserve">40. #15-new to #17-new — the failure pop-up and the missed-firing</w:t>
+        <w:t xml:space="preserve">42. #15-new to #17-new — the failure pop-up and the missed-firing</w:t>
       </w:r>
     </w:p>
     <w:p>
@@ -3748,7 +3544,7 @@
           <w:rFonts w:ascii="Arial" w:hAnsi="Arial"/>
           <w:sz w:val="28"/>
         </w:rPr>
-        <w:t xml:space="preserve">41. #13-new and #14-new — tapping a reminder lands on its own item</w:t>
+        <w:t xml:space="preserve">43. #13-new and #14-new — tapping a reminder lands on its own item</w:t>
       </w:r>
     </w:p>
     <w:p>
@@ -3772,7 +3568,7 @@
           <w:rFonts w:ascii="Arial" w:hAnsi="Arial"/>
           <w:sz w:val="28"/>
         </w:rPr>
-        <w:t xml:space="preserve">42. #12-new — the Scheduled Reminders screen, showing every</w:t>
+        <w:t xml:space="preserve">44. #12-new — the Scheduled Reminders screen, showing every</w:t>
       </w:r>
     </w:p>
     <w:p>
@@ -3796,7 +3592,7 @@
           <w:rFonts w:ascii="Arial" w:hAnsi="Arial"/>
           <w:sz w:val="28"/>
         </w:rPr>
-        <w:t xml:space="preserve">43. #6-new to #12-new — the scheduler built in eight steps, so one</w:t>
+        <w:t xml:space="preserve">45. #6-new to #12-new — the scheduler built in eight steps, so one</w:t>
       </w:r>
     </w:p>
     <w:p>
@@ -3820,7 +3616,7 @@
           <w:rFonts w:ascii="Arial" w:hAnsi="Arial"/>
           <w:sz w:val="28"/>
         </w:rPr>
-        <w:t xml:space="preserve">44. #4-new — the first notification fixes. Real, and kept, but not</w:t>
+        <w:t xml:space="preserve">46. #4-new — the first notification fixes. Real, and kept, but not</w:t>
       </w:r>
     </w:p>
     <w:p>

</xml_diff>

<commit_message>
#65-new, Memory, saved kinds and routes become  Appointments and Bucket List.
</commit_message>
<xml_diff>
--- a/docs/pending.docx
+++ b/docs/pending.docx
@@ -24,7 +24,7 @@
           <w:rFonts w:ascii="Arial" w:hAnsi="Arial"/>
           <w:sz w:val="28"/>
         </w:rPr>
-        <w:t xml:space="preserve">Last updated: 2026-09-03 (#59-new, session close)</w:t>
+        <w:t xml:space="preserve">Last updated: 2026-09-03 (#65-new)</w:t>
       </w:r>
     </w:p>
     <w:p>
@@ -229,31 +229,19 @@
           <w:rFonts w:ascii="Arial" w:hAnsi="Arial"/>
           <w:sz w:val="28"/>
         </w:rPr>
-        <w:t xml:space="preserve">**Rotation: 0°, 90°, and 270°** (Patrick, end of #59-new). **180° out.**</w:t>
-      </w:r>
-    </w:p>
-    <w:p>
-      <w:pPr>
-        <w:spacing w:line="276" w:lineRule="auto"/>
-      </w:pPr>
-      <w:r>
-        <w:rPr>
-          <w:rFonts w:ascii="Arial" w:hAnsi="Arial"/>
-          <w:sz w:val="28"/>
-        </w:rPr>
-        <w:t xml:space="preserve">Headers stay with the **physical top of the phone**. Next session. Today:</w:t>
-      </w:r>
-    </w:p>
-    <w:p>
-      <w:pPr>
-        <w:spacing w:line="276" w:lineRule="auto"/>
-      </w:pPr>
-      <w:r>
-        <w:rPr>
-          <w:rFonts w:ascii="Arial" w:hAnsi="Arial"/>
-          <w:sz w:val="28"/>
-        </w:rPr>
-        <w:t xml:space="preserve">0° and 90° only (#52-new).</w:t>
+        <w:t xml:space="preserve">PHONE LOAD WAITS until the scrub is finished. Paperwork is Pending</w:t>
+      </w:r>
+    </w:p>
+    <w:p>
+      <w:pPr>
+        <w:spacing w:line="276" w:lineRule="auto"/>
+      </w:pPr>
+      <w:r>
+        <w:rPr>
+          <w:rFonts w:ascii="Arial" w:hAnsi="Arial"/>
+          <w:sz w:val="28"/>
+        </w:rPr>
+        <w:t xml:space="preserve">2–5.</w:t>
       </w:r>
     </w:p>
     <w:p>
@@ -470,115 +458,79 @@
           <w:rFonts w:ascii="Arial" w:hAnsi="Arial"/>
           <w:sz w:val="28"/>
         </w:rPr>
-        <w:t xml:space="preserve">   Save (skipped when time set on 24-hour picker) — all of #59-new.</w:t>
-      </w:r>
-    </w:p>
-    <w:p>
-      <w:pPr>
-        <w:spacing w:line="276" w:lineRule="auto"/>
-      </w:pPr>
-      <w:r>
-        <w:rPr>
-          <w:rFonts w:ascii="Arial" w:hAnsi="Arial"/>
-          <w:sz w:val="28"/>
-        </w:rPr>
-        <w:t xml:space="preserve">2. RETIRING THE OLD READERS. The live run does not call them. They</w:t>
-      </w:r>
-    </w:p>
-    <w:p>
-      <w:pPr>
-        <w:spacing w:line="276" w:lineRule="auto"/>
-      </w:pPr>
-      <w:r>
-        <w:rPr>
-          <w:rFonts w:ascii="Arial" w:hAnsi="Arial"/>
-          <w:sz w:val="28"/>
-        </w:rPr>
-        <w:t xml:space="preserve">   stay in the project until each replacement is proved on the phone.</w:t>
-      </w:r>
-    </w:p>
-    <w:p>
-      <w:pPr>
-        <w:spacing w:line="276" w:lineRule="auto"/>
-      </w:pPr>
-      <w:r>
-        <w:rPr>
-          <w:rFonts w:ascii="Arial" w:hAnsi="Arial"/>
-          <w:sz w:val="28"/>
-        </w:rPr>
-        <w:t xml:space="preserve">   That order is yours, from #19-new, restated at #39-new. Memory Test</w:t>
-      </w:r>
-    </w:p>
-    <w:p>
-      <w:pPr>
-        <w:spacing w:line="276" w:lineRule="auto"/>
-      </w:pPr>
-      <w:r>
-        <w:rPr>
-          <w:rFonts w:ascii="Arial" w:hAnsi="Arial"/>
-          <w:sz w:val="28"/>
-        </w:rPr>
-        <w:t xml:space="preserve">   is temporary and coming out. Timer is isolated deliberately.</w:t>
-      </w:r>
-    </w:p>
-    <w:p>
-      <w:pPr>
-        <w:spacing w:line="276" w:lineRule="auto"/>
-      </w:pPr>
-      <w:r>
-        <w:rPr>
-          <w:rFonts w:ascii="Arial" w:hAnsi="Arial"/>
-          <w:sz w:val="28"/>
-        </w:rPr>
-        <w:t xml:space="preserve">   Neither is a reason to keep these files (Patrick, #51-new).</w:t>
-      </w:r>
-    </w:p>
-    <w:p>
-      <w:pPr>
-        <w:spacing w:line="276" w:lineRule="auto"/>
-      </w:pPr>
-      <w:r>
-        <w:rPr>
-          <w:rFonts w:ascii="Arial" w:hAnsi="Arial"/>
-          <w:sz w:val="28"/>
-        </w:rPr>
-        <w:t xml:space="preserve">3. ROTATION: 0°, 90°, AND 270° (Patrick, end of #59-new). **180° out.**</w:t>
-      </w:r>
-    </w:p>
-    <w:p>
-      <w:pPr>
-        <w:spacing w:line="276" w:lineRule="auto"/>
-      </w:pPr>
-      <w:r>
-        <w:rPr>
-          <w:rFonts w:ascii="Arial" w:hAnsi="Arial"/>
-          <w:sz w:val="28"/>
-        </w:rPr>
-        <w:t xml:space="preserve">    Headers stay with the **physical top of the phone** in every allowed</w:t>
-      </w:r>
-    </w:p>
-    <w:p>
-      <w:pPr>
-        <w:spacing w:line="276" w:lineRule="auto"/>
-      </w:pPr>
-      <w:r>
-        <w:rPr>
-          <w:rFonts w:ascii="Arial" w:hAnsi="Arial"/>
-          <w:sz w:val="28"/>
-        </w:rPr>
-        <w:t xml:space="preserve">    turn. Next session. Today: 0° and 90° only (#52-new).</w:t>
-      </w:r>
-    </w:p>
-    <w:p>
-      <w:pPr>
-        <w:spacing w:line="276" w:lineRule="auto"/>
-      </w:pPr>
-      <w:r>
-        <w:rPr>
-          <w:rFonts w:ascii="Arial" w:hAnsi="Arial"/>
-          <w:sz w:val="28"/>
-        </w:rPr>
-        <w:t xml:space="preserve">4. A THOROUGH DESIGN SPEC FOR THE APP (Patrick, #52-new). This</w:t>
+        <w:t xml:space="preserve">   Save (skipped when time set on 24-hour picker); current notification</w:t>
+      </w:r>
+    </w:p>
+    <w:p>
+      <w:pPr>
+        <w:spacing w:line="276" w:lineRule="auto"/>
+      </w:pPr>
+      <w:r>
+        <w:rPr>
+          <w:rFonts w:ascii="Arial" w:hAnsi="Arial"/>
+          <w:sz w:val="28"/>
+        </w:rPr>
+        <w:t xml:space="preserve">   names through the live road (#62-new); every page log under the</w:t>
+      </w:r>
+    </w:p>
+    <w:p>
+      <w:pPr>
+        <w:spacing w:line="276" w:lineRule="auto"/>
+      </w:pPr>
+      <w:r>
+        <w:rPr>
+          <w:rFonts w:ascii="Arial" w:hAnsi="Arial"/>
+          <w:sz w:val="28"/>
+        </w:rPr>
+        <w:t xml:space="preserve">   current page name (#63-new); Siri says Daily and Remember, and the</w:t>
+      </w:r>
+    </w:p>
+    <w:p>
+      <w:pPr>
+        <w:spacing w:line="276" w:lineRule="auto"/>
+      </w:pPr>
+      <w:r>
+        <w:rPr>
+          <w:rFonts w:ascii="Arial" w:hAnsi="Arial"/>
+          <w:sz w:val="28"/>
+        </w:rPr>
+        <w:t xml:space="preserve">   open-app leftover is out (#64-new); saved kinds and routes are</w:t>
+      </w:r>
+    </w:p>
+    <w:p>
+      <w:pPr>
+        <w:spacing w:line="276" w:lineRule="auto"/>
+      </w:pPr>
+      <w:r>
+        <w:rPr>
+          <w:rFonts w:ascii="Arial" w:hAnsi="Arial"/>
+          <w:sz w:val="28"/>
+        </w:rPr>
+        <w:t xml:space="preserve">   appointments and bucketlist (#65-new). Those later refinements do not</w:t>
+      </w:r>
+    </w:p>
+    <w:p>
+      <w:pPr>
+        <w:spacing w:line="276" w:lineRule="auto"/>
+      </w:pPr>
+      <w:r>
+        <w:rPr>
+          <w:rFonts w:ascii="Arial" w:hAnsi="Arial"/>
+          <w:sz w:val="28"/>
+        </w:rPr>
+        <w:t xml:space="preserve">   reset the replacement pages' phone proof.</w:t>
+      </w:r>
+    </w:p>
+    <w:p>
+      <w:pPr>
+        <w:spacing w:line="276" w:lineRule="auto"/>
+      </w:pPr>
+      <w:r>
+        <w:rPr>
+          <w:rFonts w:ascii="Arial" w:hAnsi="Arial"/>
+          <w:sz w:val="28"/>
+        </w:rPr>
+        <w:t xml:space="preserve">2. A THOROUGH DESIGN SPEC FOR THE APP (Patrick, #52-new). This</w:t>
       </w:r>
     </w:p>
     <w:p>
@@ -638,7 +590,7 @@
           <w:rFonts w:ascii="Arial" w:hAnsi="Arial"/>
           <w:sz w:val="28"/>
         </w:rPr>
-        <w:t xml:space="preserve">5. A USER GUIDE, from that spec or merely after it (Patrick,</w:t>
+        <w:t xml:space="preserve">3. A USER GUIDE, from that spec or merely after it (Patrick,</w:t>
       </w:r>
     </w:p>
     <w:p>
@@ -674,7 +626,7 @@
           <w:rFonts w:ascii="Arial" w:hAnsi="Arial"/>
           <w:sz w:val="28"/>
         </w:rPr>
-        <w:t xml:space="preserve">6. A FEEDBACK BUTTON IN THE APP, similar to Mystery (Patrick,</w:t>
+        <w:t xml:space="preserve">4. A FEEDBACK BUTTON IN THE APP, similar to Mystery (Patrick,</w:t>
       </w:r>
     </w:p>
     <w:p>
@@ -710,31 +662,163 @@
           <w:rFonts w:ascii="Arial" w:hAnsi="Arial"/>
           <w:sz w:val="28"/>
         </w:rPr>
-        <w:t xml:space="preserve">7. A PAGE, SPEC, OR FILE FOR WHAT TESTING HAS COVERED AND</w:t>
-      </w:r>
-    </w:p>
-    <w:p>
-      <w:pPr>
-        <w:spacing w:line="276" w:lineRule="auto"/>
-      </w:pPr>
-      <w:r>
-        <w:rPr>
-          <w:rFonts w:ascii="Arial" w:hAnsi="Arial"/>
-          <w:sz w:val="28"/>
-        </w:rPr>
-        <w:t xml:space="preserve">    WILL COVER (Patrick, #52-new). The during-build tests are</w:t>
-      </w:r>
-    </w:p>
-    <w:p>
-      <w:pPr>
-        <w:spacing w:line="276" w:lineRule="auto"/>
-      </w:pPr>
-      <w:r>
-        <w:rPr>
-          <w:rFonts w:ascii="Arial" w:hAnsi="Arial"/>
-          <w:sz w:val="28"/>
-        </w:rPr>
-        <w:t xml:space="preserve">    thrown away. The run is not kept.</w:t>
+        <w:t xml:space="preserve">5. A PAGE, SPEC, OR FILE FOR WHAT TESTING HAS COVERED AND</w:t>
+      </w:r>
+    </w:p>
+    <w:p>
+      <w:pPr>
+        <w:spacing w:line="276" w:lineRule="auto"/>
+      </w:pPr>
+      <w:r>
+        <w:rPr>
+          <w:rFonts w:ascii="Arial" w:hAnsi="Arial"/>
+          <w:sz w:val="28"/>
+        </w:rPr>
+        <w:t xml:space="preserve">   WILL COVER (Patrick, #52-new). The during-build tests are</w:t>
+      </w:r>
+    </w:p>
+    <w:p>
+      <w:pPr>
+        <w:spacing w:line="276" w:lineRule="auto"/>
+      </w:pPr>
+      <w:r>
+        <w:rPr>
+          <w:rFonts w:ascii="Arial" w:hAnsi="Arial"/>
+          <w:sz w:val="28"/>
+        </w:rPr>
+        <w:t xml:space="preserve">   thrown away. The run is not kept.</w:t>
+      </w:r>
+    </w:p>
+    <w:p>
+      <w:pPr>
+        <w:spacing w:line="276" w:lineRule="auto"/>
+      </w:pPr>
+      <w:r>
+        <w:rPr>
+          <w:rFonts w:ascii="Arial" w:hAnsi="Arial"/>
+          <w:sz w:val="28"/>
+        </w:rPr>
+        <w:t xml:space="preserve">6. THE RUN RECORD ON SCHEDULED REMINDERS. Held back at #15-new</w:t>
+      </w:r>
+    </w:p>
+    <w:p>
+      <w:pPr>
+        <w:spacing w:line="276" w:lineRule="auto"/>
+      </w:pPr>
+      <w:r>
+        <w:rPr>
+          <w:rFonts w:ascii="Arial" w:hAnsi="Arial"/>
+          <w:sz w:val="28"/>
+        </w:rPr>
+        <w:t xml:space="preserve">   and never built. That screen would show whether the last</w:t>
+      </w:r>
+    </w:p>
+    <w:p>
+      <w:pPr>
+        <w:spacing w:line="276" w:lineRule="auto"/>
+      </w:pPr>
+      <w:r>
+        <w:rPr>
+          <w:rFonts w:ascii="Arial" w:hAnsi="Arial"/>
+          <w:sz w:val="28"/>
+        </w:rPr>
+        <w:t xml:space="preserve">   reminder run went well or failed.</w:t>
+      </w:r>
+    </w:p>
+    <w:p>
+      <w:pPr>
+        <w:spacing w:line="276" w:lineRule="auto"/>
+      </w:pPr>
+      <w:r>
+        <w:rPr>
+          <w:rFonts w:ascii="Arial" w:hAnsi="Arial"/>
+          <w:sz w:val="28"/>
+        </w:rPr>
+        <w:t xml:space="preserve">7. CHECK MY REMINDERS, from Still To Do. A set of checks for</w:t>
+      </w:r>
+    </w:p>
+    <w:p>
+      <w:pPr>
+        <w:spacing w:line="276" w:lineRule="auto"/>
+      </w:pPr>
+      <w:r>
+        <w:rPr>
+          <w:rFonts w:ascii="Arial" w:hAnsi="Arial"/>
+          <w:sz w:val="28"/>
+        </w:rPr>
+        <w:t xml:space="preserve">   why the phone stayed quiet. The shape is already settled</w:t>
+      </w:r>
+    </w:p>
+    <w:p>
+      <w:pPr>
+        <w:spacing w:line="276" w:lineRule="auto"/>
+      </w:pPr>
+      <w:r>
+        <w:rPr>
+          <w:rFonts w:ascii="Arial" w:hAnsi="Arial"/>
+          <w:sz w:val="28"/>
+        </w:rPr>
+        <w:t xml:space="preserve">   there. Agreed to come after the reminders themselves are</w:t>
+      </w:r>
+    </w:p>
+    <w:p>
+      <w:pPr>
+        <w:spacing w:line="276" w:lineRule="auto"/>
+      </w:pPr>
+      <w:r>
+        <w:rPr>
+          <w:rFonts w:ascii="Arial" w:hAnsi="Arial"/>
+          <w:sz w:val="28"/>
+        </w:rPr>
+        <w:t xml:space="preserve">   solid (Patrick, #15-new).</w:t>
+      </w:r>
+    </w:p>
+    <w:p>
+      <w:pPr>
+        <w:spacing w:line="276" w:lineRule="auto"/>
+      </w:pPr>
+      <w:r>
+        <w:rPr>
+          <w:rFonts w:ascii="Arial" w:hAnsi="Arial"/>
+          <w:sz w:val="28"/>
+        </w:rPr>
+        <w:t xml:space="preserve">8. A BACKGROUND TASK, so the phone can top the reminder queue</w:t>
+      </w:r>
+    </w:p>
+    <w:p>
+      <w:pPr>
+        <w:spacing w:line="276" w:lineRule="auto"/>
+      </w:pPr>
+      <w:r>
+        <w:rPr>
+          <w:rFonts w:ascii="Arial" w:hAnsi="Arial"/>
+          <w:sz w:val="28"/>
+        </w:rPr>
+        <w:t xml:space="preserve">   up on days the app is not opened. None of it is installed.</w:t>
+      </w:r>
+    </w:p>
+    <w:p>
+      <w:pPr>
+        <w:spacing w:line="276" w:lineRule="auto"/>
+      </w:pPr>
+      <w:r>
+        <w:rPr>
+          <w:rFonts w:ascii="Arial" w:hAnsi="Arial"/>
+          <w:sz w:val="28"/>
+        </w:rPr>
+        <w:t xml:space="preserve">   It can only ever sit on top of arming ahead, never</w:t>
+      </w:r>
+    </w:p>
+    <w:p>
+      <w:pPr>
+        <w:spacing w:line="276" w:lineRule="auto"/>
+      </w:pPr>
+      <w:r>
+        <w:rPr>
+          <w:rFonts w:ascii="Arial" w:hAnsi="Arial"/>
+          <w:sz w:val="28"/>
+        </w:rPr>
+        <w:t xml:space="preserve">   underneath.</w:t>
       </w:r>
     </w:p>
     <w:p>
@@ -975,7 +1059,7 @@
           <w:rFonts w:ascii="Arial" w:hAnsi="Arial"/>
           <w:sz w:val="28"/>
         </w:rPr>
-        <w:t xml:space="preserve">   is called Appointments (#56-new; saved kind stays oneTime).</w:t>
+        <w:t xml:space="preserve">   is called Appointments (#56-new; saved kind appointments, #65-new).</w:t>
       </w:r>
     </w:p>
     <w:p>
@@ -1191,7 +1275,7 @@
           <w:rFonts w:ascii="Arial" w:hAnsi="Arial"/>
           <w:sz w:val="28"/>
         </w:rPr>
-        <w:t xml:space="preserve">   item (saved kind extended) says a thing is not yet done and must</w:t>
+        <w:t xml:space="preserve">   item (saved kind bucketlist) says a thing is not yet done and must</w:t>
       </w:r>
     </w:p>
     <w:p>
@@ -1612,7 +1696,187 @@
           <w:rFonts w:ascii="Arial" w:hAnsi="Arial"/>
           <w:sz w:val="28"/>
         </w:rPr>
-        <w:t xml:space="preserve">1. #59-new — calendar day-list fire time (old Pending 4); useless</w:t>
+        <w:t xml:space="preserve">1. #65-new — saved kinds, routes, page files, and banner sources are</w:t>
+      </w:r>
+    </w:p>
+    <w:p>
+      <w:pPr>
+        <w:spacing w:line="276" w:lineRule="auto"/>
+      </w:pPr>
+      <w:r>
+        <w:rPr>
+          <w:rFonts w:ascii="Arial" w:hAnsi="Arial"/>
+          <w:sz w:val="28"/>
+        </w:rPr>
+        <w:t xml:space="preserve">   appointments and bucketlist. TypeScript is clean: the four errors</w:t>
+      </w:r>
+    </w:p>
+    <w:p>
+      <w:pPr>
+        <w:spacing w:line="276" w:lineRule="auto"/>
+      </w:pPr>
+      <w:r>
+        <w:rPr>
+          <w:rFonts w:ascii="Arial" w:hAnsi="Arial"/>
+          <w:sz w:val="28"/>
+        </w:rPr>
+        <w:t xml:space="preserve">   were the checker, not the running code. Mac 298. Not on the phone.</w:t>
+      </w:r>
+    </w:p>
+    <w:p>
+      <w:pPr>
+        <w:spacing w:line="276" w:lineRule="auto"/>
+      </w:pPr>
+      <w:r>
+        <w:rPr>
+          <w:rFonts w:ascii="Arial" w:hAnsi="Arial"/>
+          <w:sz w:val="28"/>
+        </w:rPr>
+        <w:t xml:space="preserve">2. #64-new — Siri says Daily and Remember. Open-app leftover out.</w:t>
+      </w:r>
+    </w:p>
+    <w:p>
+      <w:pPr>
+        <w:spacing w:line="276" w:lineRule="auto"/>
+      </w:pPr>
+      <w:r>
+        <w:rPr>
+          <w:rFonts w:ascii="Arial" w:hAnsi="Arial"/>
+          <w:sz w:val="28"/>
+        </w:rPr>
+        <w:t xml:space="preserve">   Not on the phone.</w:t>
+      </w:r>
+    </w:p>
+    <w:p>
+      <w:pPr>
+        <w:spacing w:line="276" w:lineRule="auto"/>
+      </w:pPr>
+      <w:r>
+        <w:rPr>
+          <w:rFonts w:ascii="Arial" w:hAnsi="Arial"/>
+          <w:sz w:val="28"/>
+        </w:rPr>
+        <w:t xml:space="preserve">3. #63-new — every page log uses the current page name. The leftover</w:t>
+      </w:r>
+    </w:p>
+    <w:p>
+      <w:pPr>
+        <w:spacing w:line="276" w:lineRule="auto"/>
+      </w:pPr>
+      <w:r>
+        <w:rPr>
+          <w:rFonts w:ascii="Arial" w:hAnsi="Arial"/>
+          <w:sz w:val="28"/>
+        </w:rPr>
+        <w:t xml:space="preserve">   Look Ahead log came out. Sit backup and near-fire-set deleted.</w:t>
+      </w:r>
+    </w:p>
+    <w:p>
+      <w:pPr>
+        <w:spacing w:line="276" w:lineRule="auto"/>
+      </w:pPr>
+      <w:r>
+        <w:rPr>
+          <w:rFonts w:ascii="Arial" w:hAnsi="Arial"/>
+          <w:sz w:val="28"/>
+        </w:rPr>
+        <w:t xml:space="preserve">   Not on the phone. Committed (Patrick, #64-new).</w:t>
+      </w:r>
+    </w:p>
+    <w:p>
+      <w:pPr>
+        <w:spacing w:line="276" w:lineRule="auto"/>
+      </w:pPr>
+      <w:r>
+        <w:rPr>
+          <w:rFonts w:ascii="Arial" w:hAnsi="Arial"/>
+          <w:sz w:val="28"/>
+        </w:rPr>
+        <w:t xml:space="preserve">4. #62-new — current notification names through the live road.</w:t>
+      </w:r>
+    </w:p>
+    <w:p>
+      <w:pPr>
+        <w:spacing w:line="276" w:lineRule="auto"/>
+      </w:pPr>
+      <w:r>
+        <w:rPr>
+          <w:rFonts w:ascii="Arial" w:hAnsi="Arial"/>
+          <w:sz w:val="28"/>
+        </w:rPr>
+        <w:t xml:space="preserve">   Daily, Weekly, Monthly, Quarterly, Yearly, and Appointments each</w:t>
+      </w:r>
+    </w:p>
+    <w:p>
+      <w:pPr>
+        <w:spacing w:line="276" w:lineRule="auto"/>
+      </w:pPr>
+      <w:r>
+        <w:rPr>
+          <w:rFonts w:ascii="Arial" w:hAnsi="Arial"/>
+          <w:sz w:val="28"/>
+        </w:rPr>
+        <w:t xml:space="preserve">   have their own source. A Quarterly or Yearly banner tap opens its</w:t>
+      </w:r>
+    </w:p>
+    <w:p>
+      <w:pPr>
+        <w:spacing w:line="276" w:lineRule="auto"/>
+      </w:pPr>
+      <w:r>
+        <w:rPr>
+          <w:rFonts w:ascii="Arial" w:hAnsi="Arial"/>
+          <w:sz w:val="28"/>
+        </w:rPr>
+        <w:t xml:space="preserve">   own page. Pets and Orders names out of the tests. Mac 298. Not</w:t>
+      </w:r>
+    </w:p>
+    <w:p>
+      <w:pPr>
+        <w:spacing w:line="276" w:lineRule="auto"/>
+      </w:pPr>
+      <w:r>
+        <w:rPr>
+          <w:rFonts w:ascii="Arial" w:hAnsi="Arial"/>
+          <w:sz w:val="28"/>
+        </w:rPr>
+        <w:t xml:space="preserve">   on the phone. Committed (Patrick, #63-new).</w:t>
+      </w:r>
+    </w:p>
+    <w:p>
+      <w:pPr>
+        <w:spacing w:line="276" w:lineRule="auto"/>
+      </w:pPr>
+      <w:r>
+        <w:rPr>
+          <w:rFonts w:ascii="Arial" w:hAnsi="Arial"/>
+          <w:sz w:val="28"/>
+        </w:rPr>
+        <w:t xml:space="preserve">5. #61-new — hidden old pages and dead reader road removed.</w:t>
+      </w:r>
+    </w:p>
+    <w:p>
+      <w:pPr>
+        <w:spacing w:line="276" w:lineRule="auto"/>
+      </w:pPr>
+      <w:r>
+        <w:rPr>
+          <w:rFonts w:ascii="Arial" w:hAnsi="Arial"/>
+          <w:sz w:val="28"/>
+        </w:rPr>
+        <w:t xml:space="preserve">   Notification-name sheet written. Mac 300. Committed (Patrick, #62-new).</w:t>
+      </w:r>
+    </w:p>
+    <w:p>
+      <w:pPr>
+        <w:spacing w:line="276" w:lineRule="auto"/>
+      </w:pPr>
+      <w:r>
+        <w:rPr>
+          <w:rFonts w:ascii="Arial" w:hAnsi="Arial"/>
+          <w:sz w:val="28"/>
+        </w:rPr>
+        <w:t xml:space="preserve">6. #59-new — calendar day-list fire time (old Pending 4); useless</w:t>
       </w:r>
     </w:p>
     <w:p>
@@ -1660,7 +1924,7 @@
           <w:rFonts w:ascii="Arial" w:hAnsi="Arial"/>
           <w:sz w:val="28"/>
         </w:rPr>
-        <w:t xml:space="preserve">2. #58-new — the Where? helper built from its sheet. 🧭 badge after</w:t>
+        <w:t xml:space="preserve">6. #58-new — the Where? helper built from its sheet. 🧭 badge after</w:t>
       </w:r>
     </w:p>
     <w:p>
@@ -1708,7 +1972,7 @@
           <w:rFonts w:ascii="Arial" w:hAnsi="Arial"/>
           <w:sz w:val="28"/>
         </w:rPr>
-        <w:t xml:space="preserve">3. #57-new — the Where? helper settled and its self-contained build</w:t>
+        <w:t xml:space="preserve">6. #57-new — the Where? helper settled and its self-contained build</w:t>
       </w:r>
     </w:p>
     <w:p>
@@ -1744,7 +2008,7 @@
           <w:rFonts w:ascii="Arial" w:hAnsi="Arial"/>
           <w:sz w:val="28"/>
         </w:rPr>
-        <w:t xml:space="preserve">4. #56-new — Appointments and Bucket List on every live screen;</w:t>
+        <w:t xml:space="preserve">7. #56-new — Appointments and Bucket List on every live screen;</w:t>
       </w:r>
     </w:p>
     <w:p>
@@ -1780,7 +2044,7 @@
           <w:rFonts w:ascii="Arial" w:hAnsi="Arial"/>
           <w:sz w:val="28"/>
         </w:rPr>
-        <w:t xml:space="preserve">5. #55-new — missed-firing notice for Weekly, Monthly, Quarterly,</w:t>
+        <w:t xml:space="preserve">8. #55-new — missed-firing notice for Weekly, Monthly, Quarterly,</w:t>
       </w:r>
     </w:p>
     <w:p>
@@ -1828,7 +2092,7 @@
           <w:rFonts w:ascii="Arial" w:hAnsi="Arial"/>
           <w:sz w:val="28"/>
         </w:rPr>
-        <w:t xml:space="preserve">6. #53-new (2026-09-02) — Scheduled Reminders names Daily, Weekly,</w:t>
+        <w:t xml:space="preserve">9. #53-new (2026-09-02) — Scheduled Reminders names Daily, Weekly,</w:t>
       </w:r>
     </w:p>
     <w:p>
@@ -1864,7 +2128,7 @@
           <w:rFonts w:ascii="Arial" w:hAnsi="Arial"/>
           <w:sz w:val="28"/>
         </w:rPr>
-        <w:t xml:space="preserve">7. #53-new (2026-09-02) — one list row for Daily through Extended</w:t>
+        <w:t xml:space="preserve">10. #53-new (2026-09-02) — one list row for Daily through Extended</w:t>
       </w:r>
     </w:p>
     <w:p>
@@ -1888,7 +2152,7 @@
           <w:rFonts w:ascii="Arial" w:hAnsi="Arial"/>
           <w:sz w:val="28"/>
         </w:rPr>
-        <w:t xml:space="preserve">8. #54-new (2026-09-02) — Appointments and Bucket List: one list in</w:t>
+        <w:t xml:space="preserve">11. #54-new (2026-09-02) — Appointments and Bucket List: one list in</w:t>
       </w:r>
     </w:p>
     <w:p>
@@ -1924,7 +2188,7 @@
           <w:rFonts w:ascii="Arial" w:hAnsi="Arial"/>
           <w:sz w:val="28"/>
         </w:rPr>
-        <w:t xml:space="preserve">9. #52-new — landscape 90° counter-clockwise, headers on the left,</w:t>
+        <w:t xml:space="preserve">12. #52-new — landscape 90° counter-clockwise, headers on the left,</w:t>
       </w:r>
     </w:p>
     <w:p>
@@ -1984,7 +2248,7 @@
           <w:rFonts w:ascii="Arial" w:hAnsi="Arial"/>
           <w:sz w:val="28"/>
         </w:rPr>
-        <w:t xml:space="preserve">10. #51-new — display features: header buttons and the Home badge</w:t>
+        <w:t xml:space="preserve">13. #51-new — display features: header buttons and the Home badge</w:t>
       </w:r>
     </w:p>
     <w:p>
@@ -2056,7 +2320,7 @@
           <w:rFonts w:ascii="Arial" w:hAnsi="Arial"/>
           <w:sz w:val="28"/>
         </w:rPr>
-        <w:t xml:space="preserve">11. #50-new — the other pages in landscape. Optional view, 0 and 90</w:t>
+        <w:t xml:space="preserve">14. #50-new — the other pages in landscape. Optional view, 0 and 90</w:t>
       </w:r>
     </w:p>
     <w:p>
@@ -2116,7 +2380,7 @@
           <w:rFonts w:ascii="Arial" w:hAnsi="Arial"/>
           <w:sz w:val="28"/>
         </w:rPr>
-        <w:t xml:space="preserve">12. #49-new — calendar page built from the sheet. Options Calendar</w:t>
+        <w:t xml:space="preserve">15. #49-new — calendar page built from the sheet. Options Calendar</w:t>
       </w:r>
     </w:p>
     <w:p>
@@ -2176,19 +2440,19 @@
           <w:rFonts w:ascii="Arial" w:hAnsi="Arial"/>
           <w:sz w:val="28"/>
         </w:rPr>
-        <w:t xml:space="preserve">13. #48-new — calendar build sheet written. No code.</w:t>
-      </w:r>
-    </w:p>
-    <w:p>
-      <w:pPr>
-        <w:spacing w:line="276" w:lineRule="auto"/>
-      </w:pPr>
-      <w:r>
-        <w:rPr>
-          <w:rFonts w:ascii="Arial" w:hAnsi="Arial"/>
-          <w:sz w:val="28"/>
-        </w:rPr>
-        <w:t xml:space="preserve">14. #47-new — selling description a good start and left. Features</w:t>
+        <w:t xml:space="preserve">16. #48-new — calendar build sheet written. No code.</w:t>
+      </w:r>
+    </w:p>
+    <w:p>
+      <w:pPr>
+        <w:spacing w:line="276" w:lineRule="auto"/>
+      </w:pPr>
+      <w:r>
+        <w:rPr>
+          <w:rFonts w:ascii="Arial" w:hAnsi="Arial"/>
+          <w:sz w:val="28"/>
+        </w:rPr>
+        <w:t xml:space="preserve">17. #47-new — selling description a good start and left. Features</w:t>
       </w:r>
     </w:p>
     <w:p>
@@ -2260,7 +2524,7 @@
           <w:rFonts w:ascii="Arial" w:hAnsi="Arial"/>
           <w:sz w:val="28"/>
         </w:rPr>
-        <w:t xml:space="preserve">15. #46-new — selling description begun, publishing picture written.</w:t>
+        <w:t xml:space="preserve">18. #46-new — selling description begun, publishing picture written.</w:t>
       </w:r>
     </w:p>
     <w:p>
@@ -2296,7 +2560,7 @@
           <w:rFonts w:ascii="Arial" w:hAnsi="Arial"/>
           <w:sz w:val="28"/>
         </w:rPr>
-        <w:t xml:space="preserve">16. App-Docs, 2026-08-31 — working documents stay in docs; history</w:t>
+        <w:t xml:space="preserve">19. App-Docs, 2026-08-31 — working documents stay in docs; history</w:t>
       </w:r>
     </w:p>
     <w:p>
@@ -2332,7 +2596,7 @@
           <w:rFonts w:ascii="Arial" w:hAnsi="Arial"/>
           <w:sz w:val="28"/>
         </w:rPr>
-        <w:t xml:space="preserve">17. #45-new — the two engine Fails from the sitting: Daily after Done</w:t>
+        <w:t xml:space="preserve">20. #45-new — the two engine Fails from the sitting: Daily after Done</w:t>
       </w:r>
     </w:p>
     <w:p>
@@ -2440,7 +2704,7 @@
           <w:rFonts w:ascii="Arial" w:hAnsi="Arial"/>
           <w:sz w:val="28"/>
         </w:rPr>
-        <w:t xml:space="preserve">17. #44-new — the automated load built, and the simulator sitting</w:t>
+        <w:t xml:space="preserve">20. #44-new — the automated load built, and the simulator sitting</w:t>
       </w:r>
     </w:p>
     <w:p>
@@ -2488,7 +2752,7 @@
           <w:rFonts w:ascii="Arial" w:hAnsi="Arial"/>
           <w:sz w:val="28"/>
         </w:rPr>
-        <w:t xml:space="preserve">18. #43-new — the automated-load job sheet and the sitting list.</w:t>
+        <w:t xml:space="preserve">21. #43-new — the automated-load job sheet and the sitting list.</w:t>
       </w:r>
     </w:p>
     <w:p>
@@ -2536,7 +2800,7 @@
           <w:rFonts w:ascii="Arial" w:hAnsi="Arial"/>
           <w:sz w:val="28"/>
         </w:rPr>
-        <w:t xml:space="preserve">19. #42-new — the rest of Options into the engine. Calendar shading</w:t>
+        <w:t xml:space="preserve">22. #42-new — the rest of Options into the engine. Calendar shading</w:t>
       </w:r>
     </w:p>
     <w:p>
@@ -2620,7 +2884,7 @@
           <w:rFonts w:ascii="Arial" w:hAnsi="Arial"/>
           <w:sz w:val="28"/>
         </w:rPr>
-        <w:t xml:space="preserve">20. #41-new — five Options answers, holidays, monthly patterns, and</w:t>
+        <w:t xml:space="preserve">23. #41-new — five Options answers, holidays, monthly patterns, and</w:t>
       </w:r>
     </w:p>
     <w:p>
@@ -2680,7 +2944,7 @@
           <w:rFonts w:ascii="Arial" w:hAnsi="Arial"/>
           <w:sz w:val="28"/>
         </w:rPr>
-        <w:t xml:space="preserve">21. #40-new — five hardening points, and time zone into the engine.</w:t>
+        <w:t xml:space="preserve">24. #40-new — five hardening points, and time zone into the engine.</w:t>
       </w:r>
     </w:p>
     <w:p>
@@ -2752,7 +3016,7 @@
           <w:rFonts w:ascii="Arial" w:hAnsi="Arial"/>
           <w:sz w:val="28"/>
         </w:rPr>
-        <w:t xml:space="preserve">22. #39-new — the live one-store cutover. Pages, banners and Siri write</w:t>
+        <w:t xml:space="preserve">25. #39-new — the live one-store cutover. Pages, banners and Siri write</w:t>
       </w:r>
     </w:p>
     <w:p>
@@ -2788,7 +3052,7 @@
           <w:rFonts w:ascii="Arial" w:hAnsi="Arial"/>
           <w:sz w:val="28"/>
         </w:rPr>
-        <w:t xml:space="preserve">23. #38-new — the engine and Options path read end to end. The core</w:t>
+        <w:t xml:space="preserve">26. #38-new — the engine and Options path read end to end. The core</w:t>
       </w:r>
     </w:p>
     <w:p>
@@ -2836,7 +3100,7 @@
           <w:rFonts w:ascii="Arial" w:hAnsi="Arial"/>
           <w:sz w:val="28"/>
         </w:rPr>
-        <w:t xml:space="preserve">24. #37-new — Options connecting: + OPT writes the cases that apply,</w:t>
+        <w:t xml:space="preserve">27. #37-new — Options connecting: + OPT writes the cases that apply,</w:t>
       </w:r>
     </w:p>
     <w:p>
@@ -2872,7 +3136,7 @@
           <w:rFonts w:ascii="Arial" w:hAnsi="Arial"/>
           <w:sz w:val="28"/>
         </w:rPr>
-        <w:t xml:space="preserve">25. #36-new — logs on Weekly, Monthly, Quarterly, Yearly, One Time,</w:t>
+        <w:t xml:space="preserve">28. #36-new — logs on Weekly, Monthly, Quarterly, Yearly, One Time,</w:t>
       </w:r>
     </w:p>
     <w:p>
@@ -2956,7 +3220,7 @@
           <w:rFonts w:ascii="Arial" w:hAnsi="Arial"/>
           <w:sz w:val="28"/>
         </w:rPr>
-        <w:t xml:space="preserve">26. #35-new — old screens out, including the `/myday` hop. Backup</w:t>
+        <w:t xml:space="preserve">29. #35-new — old screens out, including the `/myday` hop. Backup</w:t>
       </w:r>
     </w:p>
     <w:p>
@@ -2992,7 +3256,7 @@
           <w:rFonts w:ascii="Arial" w:hAnsi="Arial"/>
           <w:sz w:val="28"/>
         </w:rPr>
-        <w:t xml:space="preserve">27. #34-new — Weekly through Options and the + Add popup built.</w:t>
+        <w:t xml:space="preserve">30. #34-new — Weekly through Options and the + Add popup built.</w:t>
       </w:r>
     </w:p>
     <w:p>
@@ -3028,7 +3292,7 @@
           <w:rFonts w:ascii="Arial" w:hAnsi="Arial"/>
           <w:sz w:val="28"/>
         </w:rPr>
-        <w:t xml:space="preserve">28. #33-new — Daily built. Snooze, Done, hold-and-slide reorder, My</w:t>
+        <w:t xml:space="preserve">31. #33-new — Daily built. Snooze, Done, hold-and-slide reorder, My</w:t>
       </w:r>
     </w:p>
     <w:p>
@@ -3064,7 +3328,7 @@
           <w:rFonts w:ascii="Arial" w:hAnsi="Arial"/>
           <w:sz w:val="28"/>
         </w:rPr>
-        <w:t xml:space="preserve">29. #32-new — the pages phase spec, and Daily's first job sheet.</w:t>
+        <w:t xml:space="preserve">32. #32-new — the pages phase spec, and Daily's first job sheet.</w:t>
       </w:r>
     </w:p>
     <w:p>
@@ -3088,7 +3352,7 @@
           <w:rFonts w:ascii="Arial" w:hAnsi="Arial"/>
           <w:sz w:val="28"/>
         </w:rPr>
-        <w:t xml:space="preserve">30. #31-new — the record itself put right. The hand-off file went</w:t>
+        <w:t xml:space="preserve">33. #31-new — the record itself put right. The hand-off file went</w:t>
       </w:r>
     </w:p>
     <w:p>
@@ -3184,7 +3448,7 @@
           <w:rFonts w:ascii="Arial" w:hAnsi="Arial"/>
           <w:sz w:val="28"/>
         </w:rPr>
-        <w:t xml:space="preserve">31. #30-new — the reminder pages named and shaped, and the one Input</w:t>
+        <w:t xml:space="preserve">34. #30-new — the reminder pages named and shaped, and the one Input</w:t>
       </w:r>
     </w:p>
     <w:p>
@@ -3208,7 +3472,7 @@
           <w:rFonts w:ascii="Arial" w:hAnsi="Arial"/>
           <w:sz w:val="28"/>
         </w:rPr>
-        <w:t xml:space="preserve">32. #28-new — the engine gained repeat groups, skip, and time zones</w:t>
+        <w:t xml:space="preserve">35. #28-new — the engine gained repeat groups, skip, and time zones</w:t>
       </w:r>
     </w:p>
     <w:p>
@@ -3232,7 +3496,7 @@
           <w:rFonts w:ascii="Arial" w:hAnsi="Arial"/>
           <w:sz w:val="28"/>
         </w:rPr>
-        <w:t xml:space="preserve">33. #27-new — all five reminder screens went onto the one machine,</w:t>
+        <w:t xml:space="preserve">36. #27-new — all five reminder screens went onto the one machine,</w:t>
       </w:r>
     </w:p>
     <w:p>
@@ -3292,7 +3556,7 @@
           <w:rFonts w:ascii="Arial" w:hAnsi="Arial"/>
           <w:sz w:val="28"/>
         </w:rPr>
-        <w:t xml:space="preserve">34. #26-new — the per-screen translators became one translator and a</w:t>
+        <w:t xml:space="preserve">37. #26-new — the per-screen translators became one translator and a</w:t>
       </w:r>
     </w:p>
     <w:p>
@@ -3316,7 +3580,7 @@
           <w:rFonts w:ascii="Arial" w:hAnsi="Arial"/>
           <w:sz w:val="28"/>
         </w:rPr>
-        <w:t xml:space="preserve">35. #24-new and #25-new — the first two translators, My Day and</w:t>
+        <w:t xml:space="preserve">38. #24-new and #25-new — the first two translators, My Day and</w:t>
       </w:r>
     </w:p>
     <w:p>
@@ -3352,7 +3616,7 @@
           <w:rFonts w:ascii="Arial" w:hAnsi="Arial"/>
           <w:sz w:val="28"/>
         </w:rPr>
-        <w:t xml:space="preserve">36. #23-new — the common shape and the two decision blocks built and</w:t>
+        <w:t xml:space="preserve">39. #23-new — the common shape and the two decision blocks built and</w:t>
       </w:r>
     </w:p>
     <w:p>
@@ -3376,7 +3640,7 @@
           <w:rFonts w:ascii="Arial" w:hAnsi="Arial"/>
           <w:sz w:val="28"/>
         </w:rPr>
-        <w:t xml:space="preserve">37. #22-new — the field names settled, and setting reminders two</w:t>
+        <w:t xml:space="preserve">40. #22-new — the field names settled, and setting reminders two</w:t>
       </w:r>
     </w:p>
     <w:p>
@@ -3400,7 +3664,7 @@
           <w:rFonts w:ascii="Arial" w:hAnsi="Arial"/>
           <w:sz w:val="28"/>
         </w:rPr>
-        <w:t xml:space="preserve">38. #21-new — the common shape settled on paper, all five screens</w:t>
+        <w:t xml:space="preserve">41. #21-new — the common shape settled on paper, all five screens</w:t>
       </w:r>
     </w:p>
     <w:p>
@@ -3424,7 +3688,7 @@
           <w:rFonts w:ascii="Arial" w:hAnsi="Arial"/>
           <w:sz w:val="28"/>
         </w:rPr>
-        <w:t xml:space="preserve">39. #20-new — My Week's Delay written down like the others, and the</w:t>
+        <w:t xml:space="preserve">42. #20-new — My Week's Delay written down like the others, and the</w:t>
       </w:r>
     </w:p>
     <w:p>
@@ -3448,7 +3712,7 @@
           <w:rFonts w:ascii="Arial" w:hAnsi="Arial"/>
           <w:sz w:val="28"/>
         </w:rPr>
-        <w:t xml:space="preserve">40. #19-new — your epiphany: one shape instead of six, the reminder</w:t>
+        <w:t xml:space="preserve">43. #19-new — your epiphany: one shape instead of six, the reminder</w:t>
       </w:r>
     </w:p>
     <w:p>
@@ -3472,7 +3736,7 @@
           <w:rFonts w:ascii="Arial" w:hAnsi="Arial"/>
           <w:sz w:val="28"/>
         </w:rPr>
-        <w:t xml:space="preserve">41. #18-new — the outsider's report checked. The answer was mend</w:t>
+        <w:t xml:space="preserve">44. #18-new — the outsider's report checked. The answer was mend</w:t>
       </w:r>
     </w:p>
     <w:p>
@@ -3508,7 +3772,7 @@
           <w:rFonts w:ascii="Arial" w:hAnsi="Arial"/>
           <w:sz w:val="28"/>
         </w:rPr>
-        <w:t xml:space="preserve">42. #15-new to #17-new — the failure pop-up and the missed-firing</w:t>
+        <w:t xml:space="preserve">45. #15-new to #17-new — the failure pop-up and the missed-firing</w:t>
       </w:r>
     </w:p>
     <w:p>
@@ -3544,7 +3808,7 @@
           <w:rFonts w:ascii="Arial" w:hAnsi="Arial"/>
           <w:sz w:val="28"/>
         </w:rPr>
-        <w:t xml:space="preserve">43. #13-new and #14-new — tapping a reminder lands on its own item</w:t>
+        <w:t xml:space="preserve">46. #13-new and #14-new — tapping a reminder lands on its own item</w:t>
       </w:r>
     </w:p>
     <w:p>
@@ -3568,7 +3832,7 @@
           <w:rFonts w:ascii="Arial" w:hAnsi="Arial"/>
           <w:sz w:val="28"/>
         </w:rPr>
-        <w:t xml:space="preserve">44. #12-new — the Scheduled Reminders screen, showing every</w:t>
+        <w:t xml:space="preserve">47. #12-new — the Scheduled Reminders screen, showing every</w:t>
       </w:r>
     </w:p>
     <w:p>
@@ -3592,7 +3856,7 @@
           <w:rFonts w:ascii="Arial" w:hAnsi="Arial"/>
           <w:sz w:val="28"/>
         </w:rPr>
-        <w:t xml:space="preserve">45. #6-new to #12-new — the scheduler built in eight steps, so one</w:t>
+        <w:t xml:space="preserve">48. #6-new to #12-new — the scheduler built in eight steps, so one</w:t>
       </w:r>
     </w:p>
     <w:p>
@@ -3616,7 +3880,7 @@
           <w:rFonts w:ascii="Arial" w:hAnsi="Arial"/>
           <w:sz w:val="28"/>
         </w:rPr>
-        <w:t xml:space="preserve">46. #4-new — the first notification fixes. Real, and kept, but not</w:t>
+        <w:t xml:space="preserve">49. #4-new — the first notification fixes. Real, and kept, but not</w:t>
       </w:r>
     </w:p>
     <w:p>

</xml_diff>

<commit_message>
#67-new, Memory, The 3 things, all set aside on purpose, reconstructed 7 PARKED again.
</commit_message>
<xml_diff>
--- a/docs/pending.docx
+++ b/docs/pending.docx
@@ -24,7 +24,7 @@
           <w:rFonts w:ascii="Arial" w:hAnsi="Arial"/>
           <w:sz w:val="28"/>
         </w:rPr>
-        <w:t xml:space="preserve">Last updated: 2026-09-03 (#65-new)</w:t>
+        <w:t xml:space="preserve">Last updated: 2026-09-03 (#67-new)</w:t>
       </w:r>
     </w:p>
     <w:p>
@@ -156,7 +156,7 @@
           <w:rFonts w:ascii="Arial" w:hAnsi="Arial"/>
           <w:sz w:val="28"/>
         </w:rPr>
-        <w:t xml:space="preserve">docs/build-history.md, which is the archive to look at when you want</w:t>
+        <w:t xml:space="preserve">docs/handoff-history.md, which is the archive to look at when you want</w:t>
       </w:r>
     </w:p>
     <w:p>
@@ -192,6 +192,18 @@
           <w:rFonts w:ascii="Arial" w:hAnsi="Arial"/>
           <w:sz w:val="28"/>
         </w:rPr>
+        <w:t xml:space="preserve">Timer and Memory Test are not this list.</w:t>
+      </w:r>
+    </w:p>
+    <w:p>
+      <w:pPr>
+        <w:spacing w:line="276" w:lineRule="auto"/>
+      </w:pPr>
+      <w:r>
+        <w:rPr>
+          <w:rFonts w:ascii="Arial" w:hAnsi="Arial"/>
+          <w:sz w:val="28"/>
+        </w:rPr>
         <w:t xml:space="preserve"/>
       </w:r>
     </w:p>
@@ -202,6 +214,18 @@
       <w:r>
         <w:rPr>
           <w:rFonts w:ascii="Arial" w:hAnsi="Arial"/>
+          <w:sz w:val="28"/>
+        </w:rPr>
+        <w:t xml:space="preserve"/>
+      </w:r>
+    </w:p>
+    <w:p>
+      <w:pPr>
+        <w:spacing w:line="276" w:lineRule="auto"/>
+      </w:pPr>
+      <w:r>
+        <w:rPr>
+          <w:rFonts w:ascii="Arial" w:hAnsi="Arial"/>
           <w:b/>
           <w:sz w:val="28"/>
         </w:rPr>
@@ -229,19 +253,31 @@
           <w:rFonts w:ascii="Arial" w:hAnsi="Arial"/>
           <w:sz w:val="28"/>
         </w:rPr>
-        <w:t xml:space="preserve">PHONE LOAD WAITS until the scrub is finished. Paperwork is Pending</w:t>
-      </w:r>
-    </w:p>
-    <w:p>
-      <w:pPr>
-        <w:spacing w:line="276" w:lineRule="auto"/>
-      </w:pPr>
-      <w:r>
-        <w:rPr>
-          <w:rFonts w:ascii="Arial" w:hAnsi="Arial"/>
-          <w:sz w:val="28"/>
-        </w:rPr>
-        <w:t xml:space="preserve">2–5.</w:t>
+        <w:t xml:space="preserve">PHONE LOAD. The name scrub is finished (#61-new through #65-new).</w:t>
+      </w:r>
+    </w:p>
+    <w:p>
+      <w:pPr>
+        <w:spacing w:line="276" w:lineRule="auto"/>
+      </w:pPr>
+      <w:r>
+        <w:rPr>
+          <w:rFonts w:ascii="Arial" w:hAnsi="Arial"/>
+          <w:sz w:val="28"/>
+        </w:rPr>
+        <w:t xml:space="preserve">Nothing is missing before an EAS build and a phone load</w:t>
+      </w:r>
+    </w:p>
+    <w:p>
+      <w:pPr>
+        <w:spacing w:line="276" w:lineRule="auto"/>
+      </w:pPr>
+      <w:r>
+        <w:rPr>
+          <w:rFonts w:ascii="Arial" w:hAnsi="Arial"/>
+          <w:sz w:val="28"/>
+        </w:rPr>
+        <w:t xml:space="preserve">(Patrick, #67-new). Paperwork is Pending 2–5.</w:t>
       </w:r>
     </w:p>
     <w:p>
@@ -698,138 +734,6 @@
           <w:rFonts w:ascii="Arial" w:hAnsi="Arial"/>
           <w:sz w:val="28"/>
         </w:rPr>
-        <w:t xml:space="preserve">6. THE RUN RECORD ON SCHEDULED REMINDERS. Held back at #15-new</w:t>
-      </w:r>
-    </w:p>
-    <w:p>
-      <w:pPr>
-        <w:spacing w:line="276" w:lineRule="auto"/>
-      </w:pPr>
-      <w:r>
-        <w:rPr>
-          <w:rFonts w:ascii="Arial" w:hAnsi="Arial"/>
-          <w:sz w:val="28"/>
-        </w:rPr>
-        <w:t xml:space="preserve">   and never built. That screen would show whether the last</w:t>
-      </w:r>
-    </w:p>
-    <w:p>
-      <w:pPr>
-        <w:spacing w:line="276" w:lineRule="auto"/>
-      </w:pPr>
-      <w:r>
-        <w:rPr>
-          <w:rFonts w:ascii="Arial" w:hAnsi="Arial"/>
-          <w:sz w:val="28"/>
-        </w:rPr>
-        <w:t xml:space="preserve">   reminder run went well or failed.</w:t>
-      </w:r>
-    </w:p>
-    <w:p>
-      <w:pPr>
-        <w:spacing w:line="276" w:lineRule="auto"/>
-      </w:pPr>
-      <w:r>
-        <w:rPr>
-          <w:rFonts w:ascii="Arial" w:hAnsi="Arial"/>
-          <w:sz w:val="28"/>
-        </w:rPr>
-        <w:t xml:space="preserve">7. CHECK MY REMINDERS, from Still To Do. A set of checks for</w:t>
-      </w:r>
-    </w:p>
-    <w:p>
-      <w:pPr>
-        <w:spacing w:line="276" w:lineRule="auto"/>
-      </w:pPr>
-      <w:r>
-        <w:rPr>
-          <w:rFonts w:ascii="Arial" w:hAnsi="Arial"/>
-          <w:sz w:val="28"/>
-        </w:rPr>
-        <w:t xml:space="preserve">   why the phone stayed quiet. The shape is already settled</w:t>
-      </w:r>
-    </w:p>
-    <w:p>
-      <w:pPr>
-        <w:spacing w:line="276" w:lineRule="auto"/>
-      </w:pPr>
-      <w:r>
-        <w:rPr>
-          <w:rFonts w:ascii="Arial" w:hAnsi="Arial"/>
-          <w:sz w:val="28"/>
-        </w:rPr>
-        <w:t xml:space="preserve">   there. Agreed to come after the reminders themselves are</w:t>
-      </w:r>
-    </w:p>
-    <w:p>
-      <w:pPr>
-        <w:spacing w:line="276" w:lineRule="auto"/>
-      </w:pPr>
-      <w:r>
-        <w:rPr>
-          <w:rFonts w:ascii="Arial" w:hAnsi="Arial"/>
-          <w:sz w:val="28"/>
-        </w:rPr>
-        <w:t xml:space="preserve">   solid (Patrick, #15-new).</w:t>
-      </w:r>
-    </w:p>
-    <w:p>
-      <w:pPr>
-        <w:spacing w:line="276" w:lineRule="auto"/>
-      </w:pPr>
-      <w:r>
-        <w:rPr>
-          <w:rFonts w:ascii="Arial" w:hAnsi="Arial"/>
-          <w:sz w:val="28"/>
-        </w:rPr>
-        <w:t xml:space="preserve">8. A BACKGROUND TASK, so the phone can top the reminder queue</w:t>
-      </w:r>
-    </w:p>
-    <w:p>
-      <w:pPr>
-        <w:spacing w:line="276" w:lineRule="auto"/>
-      </w:pPr>
-      <w:r>
-        <w:rPr>
-          <w:rFonts w:ascii="Arial" w:hAnsi="Arial"/>
-          <w:sz w:val="28"/>
-        </w:rPr>
-        <w:t xml:space="preserve">   up on days the app is not opened. None of it is installed.</w:t>
-      </w:r>
-    </w:p>
-    <w:p>
-      <w:pPr>
-        <w:spacing w:line="276" w:lineRule="auto"/>
-      </w:pPr>
-      <w:r>
-        <w:rPr>
-          <w:rFonts w:ascii="Arial" w:hAnsi="Arial"/>
-          <w:sz w:val="28"/>
-        </w:rPr>
-        <w:t xml:space="preserve">   It can only ever sit on top of arming ahead, never</w:t>
-      </w:r>
-    </w:p>
-    <w:p>
-      <w:pPr>
-        <w:spacing w:line="276" w:lineRule="auto"/>
-      </w:pPr>
-      <w:r>
-        <w:rPr>
-          <w:rFonts w:ascii="Arial" w:hAnsi="Arial"/>
-          <w:sz w:val="28"/>
-        </w:rPr>
-        <w:t xml:space="preserve">   underneath.</w:t>
-      </w:r>
-    </w:p>
-    <w:p>
-      <w:pPr>
-        <w:spacing w:line="276" w:lineRule="auto"/>
-      </w:pPr>
-      <w:r>
-        <w:rPr>
-          <w:rFonts w:ascii="Arial" w:hAnsi="Arial"/>
-          <w:sz w:val="28"/>
-        </w:rPr>
         <w:t xml:space="preserve"/>
       </w:r>
     </w:p>
@@ -1323,43 +1227,7 @@
           <w:rFonts w:ascii="Arial" w:hAnsi="Arial"/>
           <w:sz w:val="28"/>
         </w:rPr>
-        <w:t xml:space="preserve">9. THE MEMORY TEST ALLOWS ONE SESSION A DAY. Once the day's score</w:t>
-      </w:r>
-    </w:p>
-    <w:p>
-      <w:pPr>
-        <w:spacing w:line="276" w:lineRule="auto"/>
-      </w:pPr>
-      <w:r>
-        <w:rPr>
-          <w:rFonts w:ascii="Arial" w:hAnsi="Arial"/>
-          <w:sz w:val="28"/>
-        </w:rPr>
-        <w:t xml:space="preserve">   is logged the Start button is replaced by that score and "Come</w:t>
-      </w:r>
-    </w:p>
-    <w:p>
-      <w:pPr>
-        <w:spacing w:line="276" w:lineRule="auto"/>
-      </w:pPr>
-      <w:r>
-        <w:rPr>
-          <w:rFonts w:ascii="Arial" w:hAnsi="Arial"/>
-          <w:sz w:val="28"/>
-        </w:rPr>
-        <w:t xml:space="preserve">   back tomorrow", so it can only be tried on a fresh day.</w:t>
-      </w:r>
-    </w:p>
-    <w:p>
-      <w:pPr>
-        <w:spacing w:line="276" w:lineRule="auto"/>
-      </w:pPr>
-      <w:r>
-        <w:rPr>
-          <w:rFonts w:ascii="Arial" w:hAnsi="Arial"/>
-          <w:sz w:val="28"/>
-        </w:rPr>
-        <w:t xml:space="preserve">10. TIMES SET BY SPINNING THROUGH NOON OR MIDNIGHT BEFORE #27-new</w:t>
+        <w:t xml:space="preserve">9. TIMES SET BY SPINNING THROUGH NOON OR MIDNIGHT BEFORE #27-new</w:t>
       </w:r>
     </w:p>
     <w:p>
@@ -1383,7 +1251,7 @@
           <w:rFonts w:ascii="Arial" w:hAnsi="Arial"/>
           <w:sz w:val="28"/>
         </w:rPr>
-        <w:t xml:space="preserve">11. TASKS SAVED BEFORE THE DATE FIX carry a date they were given</w:t>
+        <w:t xml:space="preserve">10. TASKS SAVED BEFORE THE DATE FIX carry a date they were given</w:t>
       </w:r>
     </w:p>
     <w:p>
@@ -1407,7 +1275,7 @@
           <w:rFonts w:ascii="Arial" w:hAnsi="Arial"/>
           <w:sz w:val="28"/>
         </w:rPr>
-        <w:t xml:space="preserve">12. A BIG PIECE GETS A BUILD SHEET FIRST — self-contained, carrying</w:t>
+        <w:t xml:space="preserve">11. A BIG PIECE GETS A BUILD SHEET FIRST — self-contained, carrying</w:t>
       </w:r>
     </w:p>
     <w:p>
@@ -1443,7 +1311,7 @@
           <w:rFonts w:ascii="Arial" w:hAnsi="Arial"/>
           <w:sz w:val="28"/>
         </w:rPr>
-        <w:t xml:space="preserve">13. BARE SESSION NUMBERS mean the old shared chain. This project's</w:t>
+        <w:t xml:space="preserve">12. BARE SESSION NUMBERS mean the old shared chain. This project's</w:t>
       </w:r>
     </w:p>
     <w:p>
@@ -1467,19 +1335,19 @@
           <w:rFonts w:ascii="Arial" w:hAnsi="Arial"/>
           <w:sz w:val="28"/>
         </w:rPr>
-        <w:t xml:space="preserve">14. WORKING DOCUMENTS LIVE IN docs. History lives in docs-ref, and</w:t>
-      </w:r>
-    </w:p>
-    <w:p>
-      <w:pPr>
-        <w:spacing w:line="276" w:lineRule="auto"/>
-      </w:pPr>
-      <w:r>
-        <w:rPr>
-          <w:rFonts w:ascii="Arial" w:hAnsi="Arial"/>
-          <w:sz w:val="28"/>
-        </w:rPr>
-        <w:t xml:space="preserve">    the twelve build sheets are in docs-ref/build-sheets. The index</w:t>
+        <w:t xml:space="preserve">13. WORKING DOCUMENTS LIVE IN docs. History lives in docs-ref, and</w:t>
+      </w:r>
+    </w:p>
+    <w:p>
+      <w:pPr>
+        <w:spacing w:line="276" w:lineRule="auto"/>
+      </w:pPr>
+      <w:r>
+        <w:rPr>
+          <w:rFonts w:ascii="Arial" w:hAnsi="Arial"/>
+          <w:sz w:val="28"/>
+        </w:rPr>
+        <w:t xml:space="preserve">    the build sheets are in docs-ref/build-sheets. The index</w:t>
       </w:r>
     </w:p>
     <w:p>
@@ -1515,19 +1383,19 @@
           <w:rFonts w:ascii="Arial" w:hAnsi="Arial"/>
           <w:sz w:val="28"/>
         </w:rPr>
-        <w:t xml:space="preserve">15. THE CALENDAR PAGE SHOWS DATED ITEMS. No every-day Daily items,</w:t>
-      </w:r>
-    </w:p>
-    <w:p>
-      <w:pPr>
-        <w:spacing w:line="276" w:lineRule="auto"/>
-      </w:pPr>
-      <w:r>
-        <w:rPr>
-          <w:rFonts w:ascii="Arial" w:hAnsi="Arial"/>
-          <w:sz w:val="28"/>
-        </w:rPr>
-        <w:t xml:space="preserve">    no Extended. No Done or Snooze on the month or the day’s list.</w:t>
+        <w:t xml:space="preserve">14. THE CALENDAR PAGE SHOWS DATED ITEMS. No every-day Daily items,</w:t>
+      </w:r>
+    </w:p>
+    <w:p>
+      <w:pPr>
+        <w:spacing w:line="276" w:lineRule="auto"/>
+      </w:pPr>
+      <w:r>
+        <w:rPr>
+          <w:rFonts w:ascii="Arial" w:hAnsi="Arial"/>
+          <w:sz w:val="28"/>
+        </w:rPr>
+        <w:t xml:space="preserve">    no Bucket List. No Done or Snooze on the month or the day’s list.</w:t>
       </w:r>
     </w:p>
     <w:p>
@@ -1551,31 +1419,55 @@
           <w:rFonts w:ascii="Arial" w:hAnsi="Arial"/>
           <w:sz w:val="28"/>
         </w:rPr>
-        <w:t xml:space="preserve">    Landscape is an optional view, 0 and 90° counter-clockwise</w:t>
-      </w:r>
-    </w:p>
-    <w:p>
-      <w:pPr>
-        <w:spacing w:line="276" w:lineRule="auto"/>
-      </w:pPr>
-      <w:r>
-        <w:rPr>
-          <w:rFonts w:ascii="Arial" w:hAnsi="Arial"/>
-          <w:sz w:val="28"/>
-        </w:rPr>
-        <w:t xml:space="preserve">    only, headers on the left, all pages.</w:t>
-      </w:r>
-    </w:p>
-    <w:p>
-      <w:pPr>
-        <w:spacing w:line="276" w:lineRule="auto"/>
-      </w:pPr>
-      <w:r>
-        <w:rPr>
-          <w:rFonts w:ascii="Arial" w:hAnsi="Arial"/>
-          <w:sz w:val="28"/>
-        </w:rPr>
-        <w:t xml:space="preserve">16. HAVING A GOOD IDEA LEADS TO OVERREACHING (Patrick, #52-new).</w:t>
+        <w:t xml:space="preserve">    Landscape is an optional view: 0°, 90° counter-clockwise, and</w:t>
+      </w:r>
+    </w:p>
+    <w:p>
+      <w:pPr>
+        <w:spacing w:line="276" w:lineRule="auto"/>
+      </w:pPr>
+      <w:r>
+        <w:rPr>
+          <w:rFonts w:ascii="Arial" w:hAnsi="Arial"/>
+          <w:sz w:val="28"/>
+        </w:rPr>
+        <w:t xml:space="preserve">    270° counter-clockwise; 180° upside-down is out. Headers stay</w:t>
+      </w:r>
+    </w:p>
+    <w:p>
+      <w:pPr>
+        <w:spacing w:line="276" w:lineRule="auto"/>
+      </w:pPr>
+      <w:r>
+        <w:rPr>
+          <w:rFonts w:ascii="Arial" w:hAnsi="Arial"/>
+          <w:sz w:val="28"/>
+        </w:rPr>
+        <w:t xml:space="preserve">    at the physical top of the phone, all pages. The calendar month</w:t>
+      </w:r>
+    </w:p>
+    <w:p>
+      <w:pPr>
+        <w:spacing w:line="276" w:lineRule="auto"/>
+      </w:pPr>
+      <w:r>
+        <w:rPr>
+          <w:rFonts w:ascii="Arial" w:hAnsi="Arial"/>
+          <w:sz w:val="28"/>
+        </w:rPr>
+        <w:t xml:space="preserve">    grid was not rebuilt.</w:t>
+      </w:r>
+    </w:p>
+    <w:p>
+      <w:pPr>
+        <w:spacing w:line="276" w:lineRule="auto"/>
+      </w:pPr>
+      <w:r>
+        <w:rPr>
+          <w:rFonts w:ascii="Arial" w:hAnsi="Arial"/>
+          <w:sz w:val="28"/>
+        </w:rPr>
+        <w:t xml:space="preserve">15. HAVING A GOOD IDEA LEADS TO OVERREACHING (Patrick, #52-new).</w:t>
       </w:r>
     </w:p>
     <w:p>
@@ -1672,7 +1564,7 @@
           <w:rFonts w:ascii="Arial" w:hAnsi="Arial"/>
           <w:sz w:val="28"/>
         </w:rPr>
-        <w:t xml:space="preserve">docs/build-history.md.</w:t>
+        <w:t xml:space="preserve">docs/handoff-history.md.</w:t>
       </w:r>
     </w:p>
     <w:p>
@@ -1696,7 +1588,79 @@
           <w:rFonts w:ascii="Arial" w:hAnsi="Arial"/>
           <w:sz w:val="28"/>
         </w:rPr>
-        <w:t xml:space="preserve">1. #65-new — saved kinds, routes, page files, and banner sources are</w:t>
+        <w:t xml:space="preserve">1. #67-new — nothing missing before an EAS phone load. The three</w:t>
+      </w:r>
+    </w:p>
+    <w:p>
+      <w:pPr>
+        <w:spacing w:line="276" w:lineRule="auto"/>
+      </w:pPr>
+      <w:r>
+        <w:rPr>
+          <w:rFonts w:ascii="Arial" w:hAnsi="Arial"/>
+          <w:sz w:val="28"/>
+        </w:rPr>
+        <w:t xml:space="preserve">   held-back items went to Nice-to-have 3; do not raise them in</w:t>
+      </w:r>
+    </w:p>
+    <w:p>
+      <w:pPr>
+        <w:spacing w:line="276" w:lineRule="auto"/>
+      </w:pPr>
+      <w:r>
+        <w:rPr>
+          <w:rFonts w:ascii="Arial" w:hAnsi="Arial"/>
+          <w:sz w:val="28"/>
+        </w:rPr>
+        <w:t xml:space="preserve">   reports. Patrick will commit.</w:t>
+      </w:r>
+    </w:p>
+    <w:p>
+      <w:pPr>
+        <w:spacing w:line="276" w:lineRule="auto"/>
+      </w:pPr>
+      <w:r>
+        <w:rPr>
+          <w:rFonts w:ascii="Arial" w:hAnsi="Arial"/>
+          <w:sz w:val="28"/>
+        </w:rPr>
+        <w:t xml:space="preserve">2. #66-new — the live desk pruned; archive renamed to handoff-history;</w:t>
+      </w:r>
+    </w:p>
+    <w:p>
+      <w:pPr>
+        <w:spacing w:line="276" w:lineRule="auto"/>
+      </w:pPr>
+      <w:r>
+        <w:rPr>
+          <w:rFonts w:ascii="Arial" w:hAnsi="Arial"/>
+          <w:sz w:val="28"/>
+        </w:rPr>
+        <w:t xml:space="preserve">   #65-new written into the archive. Phone load is next.</w:t>
+      </w:r>
+    </w:p>
+    <w:p>
+      <w:pPr>
+        <w:spacing w:line="276" w:lineRule="auto"/>
+      </w:pPr>
+      <w:r>
+        <w:rPr>
+          <w:rFonts w:ascii="Arial" w:hAnsi="Arial"/>
+          <w:sz w:val="28"/>
+        </w:rPr>
+        <w:t xml:space="preserve">   Committed (Patrick, #67-new).</w:t>
+      </w:r>
+    </w:p>
+    <w:p>
+      <w:pPr>
+        <w:spacing w:line="276" w:lineRule="auto"/>
+      </w:pPr>
+      <w:r>
+        <w:rPr>
+          <w:rFonts w:ascii="Arial" w:hAnsi="Arial"/>
+          <w:sz w:val="28"/>
+        </w:rPr>
+        <w:t xml:space="preserve">3. #65-new — saved kinds, routes, page files, and banner sources are</w:t>
       </w:r>
     </w:p>
     <w:p>
@@ -1732,7 +1696,355 @@
           <w:rFonts w:ascii="Arial" w:hAnsi="Arial"/>
           <w:sz w:val="28"/>
         </w:rPr>
-        <w:t xml:space="preserve">2. #64-new — Siri says Daily and Remember. Open-app leftover out.</w:t>
+        <w:t xml:space="preserve">   Committed (Patrick, #66-new).</w:t>
+      </w:r>
+    </w:p>
+    <w:p>
+      <w:pPr>
+        <w:spacing w:line="276" w:lineRule="auto"/>
+      </w:pPr>
+      <w:r>
+        <w:rPr>
+          <w:rFonts w:ascii="Arial" w:hAnsi="Arial"/>
+          <w:sz w:val="28"/>
+        </w:rPr>
+        <w:t xml:space="preserve">3. #64-new — Siri says Daily and Remember. Open-app leftover out.</w:t>
+      </w:r>
+    </w:p>
+    <w:p>
+      <w:pPr>
+        <w:spacing w:line="276" w:lineRule="auto"/>
+      </w:pPr>
+      <w:r>
+        <w:rPr>
+          <w:rFonts w:ascii="Arial" w:hAnsi="Arial"/>
+          <w:sz w:val="28"/>
+        </w:rPr>
+        <w:t xml:space="preserve">   Not on the phone. Committed (Patrick, #65-new).</w:t>
+      </w:r>
+    </w:p>
+    <w:p>
+      <w:pPr>
+        <w:spacing w:line="276" w:lineRule="auto"/>
+      </w:pPr>
+      <w:r>
+        <w:rPr>
+          <w:rFonts w:ascii="Arial" w:hAnsi="Arial"/>
+          <w:sz w:val="28"/>
+        </w:rPr>
+        <w:t xml:space="preserve">3. #63-new — every page log uses the current page name. The leftover</w:t>
+      </w:r>
+    </w:p>
+    <w:p>
+      <w:pPr>
+        <w:spacing w:line="276" w:lineRule="auto"/>
+      </w:pPr>
+      <w:r>
+        <w:rPr>
+          <w:rFonts w:ascii="Arial" w:hAnsi="Arial"/>
+          <w:sz w:val="28"/>
+        </w:rPr>
+        <w:t xml:space="preserve">   Look Ahead log came out. Sit backup and near-fire-set deleted.</w:t>
+      </w:r>
+    </w:p>
+    <w:p>
+      <w:pPr>
+        <w:spacing w:line="276" w:lineRule="auto"/>
+      </w:pPr>
+      <w:r>
+        <w:rPr>
+          <w:rFonts w:ascii="Arial" w:hAnsi="Arial"/>
+          <w:sz w:val="28"/>
+        </w:rPr>
+        <w:t xml:space="preserve">   Not on the phone. Committed (Patrick, #64-new).</w:t>
+      </w:r>
+    </w:p>
+    <w:p>
+      <w:pPr>
+        <w:spacing w:line="276" w:lineRule="auto"/>
+      </w:pPr>
+      <w:r>
+        <w:rPr>
+          <w:rFonts w:ascii="Arial" w:hAnsi="Arial"/>
+          <w:sz w:val="28"/>
+        </w:rPr>
+        <w:t xml:space="preserve">4. #62-new — current notification names through the live road.</w:t>
+      </w:r>
+    </w:p>
+    <w:p>
+      <w:pPr>
+        <w:spacing w:line="276" w:lineRule="auto"/>
+      </w:pPr>
+      <w:r>
+        <w:rPr>
+          <w:rFonts w:ascii="Arial" w:hAnsi="Arial"/>
+          <w:sz w:val="28"/>
+        </w:rPr>
+        <w:t xml:space="preserve">   Daily, Weekly, Monthly, Quarterly, Yearly, and Appointments each</w:t>
+      </w:r>
+    </w:p>
+    <w:p>
+      <w:pPr>
+        <w:spacing w:line="276" w:lineRule="auto"/>
+      </w:pPr>
+      <w:r>
+        <w:rPr>
+          <w:rFonts w:ascii="Arial" w:hAnsi="Arial"/>
+          <w:sz w:val="28"/>
+        </w:rPr>
+        <w:t xml:space="preserve">   have their own source. A Quarterly or Yearly banner tap opens its</w:t>
+      </w:r>
+    </w:p>
+    <w:p>
+      <w:pPr>
+        <w:spacing w:line="276" w:lineRule="auto"/>
+      </w:pPr>
+      <w:r>
+        <w:rPr>
+          <w:rFonts w:ascii="Arial" w:hAnsi="Arial"/>
+          <w:sz w:val="28"/>
+        </w:rPr>
+        <w:t xml:space="preserve">   own page. Pets and Orders names out of the tests. Mac 298. Not</w:t>
+      </w:r>
+    </w:p>
+    <w:p>
+      <w:pPr>
+        <w:spacing w:line="276" w:lineRule="auto"/>
+      </w:pPr>
+      <w:r>
+        <w:rPr>
+          <w:rFonts w:ascii="Arial" w:hAnsi="Arial"/>
+          <w:sz w:val="28"/>
+        </w:rPr>
+        <w:t xml:space="preserve">   on the phone. Committed (Patrick, #63-new).</w:t>
+      </w:r>
+    </w:p>
+    <w:p>
+      <w:pPr>
+        <w:spacing w:line="276" w:lineRule="auto"/>
+      </w:pPr>
+      <w:r>
+        <w:rPr>
+          <w:rFonts w:ascii="Arial" w:hAnsi="Arial"/>
+          <w:sz w:val="28"/>
+        </w:rPr>
+        <w:t xml:space="preserve">5. #61-new — hidden old pages and dead reader road removed.</w:t>
+      </w:r>
+    </w:p>
+    <w:p>
+      <w:pPr>
+        <w:spacing w:line="276" w:lineRule="auto"/>
+      </w:pPr>
+      <w:r>
+        <w:rPr>
+          <w:rFonts w:ascii="Arial" w:hAnsi="Arial"/>
+          <w:sz w:val="28"/>
+        </w:rPr>
+        <w:t xml:space="preserve">   Notification-name sheet written. Mac 300. Committed (Patrick, #62-new).</w:t>
+      </w:r>
+    </w:p>
+    <w:p>
+      <w:pPr>
+        <w:spacing w:line="276" w:lineRule="auto"/>
+      </w:pPr>
+      <w:r>
+        <w:rPr>
+          <w:rFonts w:ascii="Arial" w:hAnsi="Arial"/>
+          <w:sz w:val="28"/>
+        </w:rPr>
+        <w:t xml:space="preserve">6. #59-new — calendar day-list fire time (old Pending 4); useless</w:t>
+      </w:r>
+    </w:p>
+    <w:p>
+      <w:pPr>
+        <w:spacing w:line="276" w:lineRule="auto"/>
+      </w:pPr>
+      <w:r>
+        <w:rPr>
+          <w:rFonts w:ascii="Arial" w:hAnsi="Arial"/>
+          <w:sz w:val="28"/>
+        </w:rPr>
+        <w:t xml:space="preserve">   spinners removed; AM/PM popup on Save when time set on 12-hour row</w:t>
+      </w:r>
+    </w:p>
+    <w:p>
+      <w:pPr>
+        <w:spacing w:line="276" w:lineRule="auto"/>
+      </w:pPr>
+      <w:r>
+        <w:rPr>
+          <w:rFonts w:ascii="Arial" w:hAnsi="Arial"/>
+          <w:sz w:val="28"/>
+        </w:rPr>
+        <w:t xml:space="preserve">   only (24-hour box or digit spinner skips it). Patrick said excellent.</w:t>
+      </w:r>
+    </w:p>
+    <w:p>
+      <w:pPr>
+        <w:spacing w:line="276" w:lineRule="auto"/>
+      </w:pPr>
+      <w:r>
+        <w:rPr>
+          <w:rFonts w:ascii="Arial" w:hAnsi="Arial"/>
+          <w:sz w:val="28"/>
+        </w:rPr>
+        <w:t xml:space="preserve">   Mac 489. Not on the phone. Patrick is committing.</w:t>
+      </w:r>
+    </w:p>
+    <w:p>
+      <w:pPr>
+        <w:spacing w:line="276" w:lineRule="auto"/>
+      </w:pPr>
+      <w:r>
+        <w:rPr>
+          <w:rFonts w:ascii="Arial" w:hAnsi="Arial"/>
+          <w:sz w:val="28"/>
+        </w:rPr>
+        <w:t xml:space="preserve">6. #58-new — the Where? helper built from its sheet. 🧭 badge after</w:t>
+      </w:r>
+    </w:p>
+    <w:p>
+      <w:pPr>
+        <w:spacing w:line="276" w:lineRule="auto"/>
+      </w:pPr>
+      <w:r>
+        <w:rPr>
+          <w:rFonts w:ascii="Arial" w:hAnsi="Arial"/>
+          <w:sz w:val="28"/>
+        </w:rPr>
+        <w:t xml:space="preserve">   Daily, calendar month button, transparent `app/where.tsx`, eight</w:t>
+      </w:r>
+    </w:p>
+    <w:p>
+      <w:pPr>
+        <w:spacing w:line="276" w:lineRule="auto"/>
+      </w:pPr>
+      <w:r>
+        <w:rPr>
+          <w:rFonts w:ascii="Arial" w:hAnsi="Arial"/>
+          <w:sz w:val="28"/>
+        </w:rPr>
+        <w:t xml:space="preserve">   landings on existing New forms, `formContext: oneTimeForToday`</w:t>
+      </w:r>
+    </w:p>
+    <w:p>
+      <w:pPr>
+        <w:spacing w:line="276" w:lineRule="auto"/>
+      </w:pPr>
+      <w:r>
+        <w:rPr>
+          <w:rFonts w:ascii="Arial" w:hAnsi="Arial"/>
+          <w:sz w:val="28"/>
+        </w:rPr>
+        <w:t xml:space="preserve">   split from `returnTo`. Mac 489. Not on the phone. Committed (Patrick, #59-new).</w:t>
+      </w:r>
+    </w:p>
+    <w:p>
+      <w:pPr>
+        <w:spacing w:line="276" w:lineRule="auto"/>
+      </w:pPr>
+      <w:r>
+        <w:rPr>
+          <w:rFonts w:ascii="Arial" w:hAnsi="Arial"/>
+          <w:sz w:val="28"/>
+        </w:rPr>
+        <w:t xml:space="preserve">6. #57-new — the Where? helper settled and its self-contained build</w:t>
+      </w:r>
+    </w:p>
+    <w:p>
+      <w:pPr>
+        <w:spacing w:line="276" w:lineRule="auto"/>
+      </w:pPr>
+      <w:r>
+        <w:rPr>
+          <w:rFonts w:ascii="Arial" w:hAnsi="Arial"/>
+          <w:sz w:val="28"/>
+        </w:rPr>
+        <w:t xml:space="preserve">   sheet written. 🧭 badge after Daily, calendar button, and the</w:t>
+      </w:r>
+    </w:p>
+    <w:p>
+      <w:pPr>
+        <w:spacing w:line="276" w:lineRule="auto"/>
+      </w:pPr>
+      <w:r>
+        <w:rPr>
+          <w:rFonts w:ascii="Arial" w:hAnsi="Arial"/>
+          <w:sz w:val="28"/>
+        </w:rPr>
+        <w:t xml:space="preserve">   Cancel and Save journey decided. No code.</w:t>
+      </w:r>
+    </w:p>
+    <w:p>
+      <w:pPr>
+        <w:spacing w:line="276" w:lineRule="auto"/>
+      </w:pPr>
+      <w:r>
+        <w:rPr>
+          <w:rFonts w:ascii="Arial" w:hAnsi="Arial"/>
+          <w:sz w:val="28"/>
+        </w:rPr>
+        <w:t xml:space="preserve">7. #56-new — Appointments and Bucket List on every live screen;</w:t>
+      </w:r>
+    </w:p>
+    <w:p>
+      <w:pPr>
+        <w:spacing w:line="276" w:lineRule="auto"/>
+      </w:pPr>
+      <w:r>
+        <w:rPr>
+          <w:rFonts w:ascii="Arial" w:hAnsi="Arial"/>
+          <w:sz w:val="28"/>
+        </w:rPr>
+        <w:t xml:space="preserve">   failed daily clear-out now spoken (Pending 2). Mac 489. He said</w:t>
+      </w:r>
+    </w:p>
+    <w:p>
+      <w:pPr>
+        <w:spacing w:line="276" w:lineRule="auto"/>
+      </w:pPr>
+      <w:r>
+        <w:rPr>
+          <w:rFonts w:ascii="Arial" w:hAnsi="Arial"/>
+          <w:sz w:val="28"/>
+        </w:rPr>
+        <w:t xml:space="preserve">   very good. Committed (Patrick, #57-new). Not on the phone.</w:t>
+      </w:r>
+    </w:p>
+    <w:p>
+      <w:pPr>
+        <w:spacing w:line="276" w:lineRule="auto"/>
+      </w:pPr>
+      <w:r>
+        <w:rPr>
+          <w:rFonts w:ascii="Arial" w:hAnsi="Arial"/>
+          <w:sz w:val="28"/>
+        </w:rPr>
+        <w:t xml:space="preserve">8. #55-new — missed-firing notice for Weekly, Monthly, Quarterly,</w:t>
+      </w:r>
+    </w:p>
+    <w:p>
+      <w:pPr>
+        <w:spacing w:line="276" w:lineRule="auto"/>
+      </w:pPr>
+      <w:r>
+        <w:rPr>
+          <w:rFonts w:ascii="Arial" w:hAnsi="Arial"/>
+          <w:sz w:val="28"/>
+        </w:rPr>
+        <w:t xml:space="preserve">   Yearly, and One Time as well as Daily; day-roll writes the miss.</w:t>
+      </w:r>
+    </w:p>
+    <w:p>
+      <w:pPr>
+        <w:spacing w:line="276" w:lineRule="auto"/>
+      </w:pPr>
+      <w:r>
+        <w:rPr>
+          <w:rFonts w:ascii="Arial" w:hAnsi="Arial"/>
+          <w:sz w:val="28"/>
+        </w:rPr>
+        <w:t xml:space="preserve">   Mac 487. He said the work is good. Committed (Patrick, #56-new).</w:t>
       </w:r>
     </w:p>
     <w:p>
@@ -1756,319 +2068,775 @@
           <w:rFonts w:ascii="Arial" w:hAnsi="Arial"/>
           <w:sz w:val="28"/>
         </w:rPr>
-        <w:t xml:space="preserve">3. #63-new — every page log uses the current page name. The leftover</w:t>
-      </w:r>
-    </w:p>
-    <w:p>
-      <w:pPr>
-        <w:spacing w:line="276" w:lineRule="auto"/>
-      </w:pPr>
-      <w:r>
-        <w:rPr>
-          <w:rFonts w:ascii="Arial" w:hAnsi="Arial"/>
-          <w:sz w:val="28"/>
-        </w:rPr>
-        <w:t xml:space="preserve">   Look Ahead log came out. Sit backup and near-fire-set deleted.</w:t>
-      </w:r>
-    </w:p>
-    <w:p>
-      <w:pPr>
-        <w:spacing w:line="276" w:lineRule="auto"/>
-      </w:pPr>
-      <w:r>
-        <w:rPr>
-          <w:rFonts w:ascii="Arial" w:hAnsi="Arial"/>
-          <w:sz w:val="28"/>
-        </w:rPr>
-        <w:t xml:space="preserve">   Not on the phone. Committed (Patrick, #64-new).</w:t>
-      </w:r>
-    </w:p>
-    <w:p>
-      <w:pPr>
-        <w:spacing w:line="276" w:lineRule="auto"/>
-      </w:pPr>
-      <w:r>
-        <w:rPr>
-          <w:rFonts w:ascii="Arial" w:hAnsi="Arial"/>
-          <w:sz w:val="28"/>
-        </w:rPr>
-        <w:t xml:space="preserve">4. #62-new — current notification names through the live road.</w:t>
-      </w:r>
-    </w:p>
-    <w:p>
-      <w:pPr>
-        <w:spacing w:line="276" w:lineRule="auto"/>
-      </w:pPr>
-      <w:r>
-        <w:rPr>
-          <w:rFonts w:ascii="Arial" w:hAnsi="Arial"/>
-          <w:sz w:val="28"/>
-        </w:rPr>
-        <w:t xml:space="preserve">   Daily, Weekly, Monthly, Quarterly, Yearly, and Appointments each</w:t>
-      </w:r>
-    </w:p>
-    <w:p>
-      <w:pPr>
-        <w:spacing w:line="276" w:lineRule="auto"/>
-      </w:pPr>
-      <w:r>
-        <w:rPr>
-          <w:rFonts w:ascii="Arial" w:hAnsi="Arial"/>
-          <w:sz w:val="28"/>
-        </w:rPr>
-        <w:t xml:space="preserve">   have their own source. A Quarterly or Yearly banner tap opens its</w:t>
-      </w:r>
-    </w:p>
-    <w:p>
-      <w:pPr>
-        <w:spacing w:line="276" w:lineRule="auto"/>
-      </w:pPr>
-      <w:r>
-        <w:rPr>
-          <w:rFonts w:ascii="Arial" w:hAnsi="Arial"/>
-          <w:sz w:val="28"/>
-        </w:rPr>
-        <w:t xml:space="preserve">   own page. Pets and Orders names out of the tests. Mac 298. Not</w:t>
-      </w:r>
-    </w:p>
-    <w:p>
-      <w:pPr>
-        <w:spacing w:line="276" w:lineRule="auto"/>
-      </w:pPr>
-      <w:r>
-        <w:rPr>
-          <w:rFonts w:ascii="Arial" w:hAnsi="Arial"/>
-          <w:sz w:val="28"/>
-        </w:rPr>
-        <w:t xml:space="preserve">   on the phone. Committed (Patrick, #63-new).</w:t>
-      </w:r>
-    </w:p>
-    <w:p>
-      <w:pPr>
-        <w:spacing w:line="276" w:lineRule="auto"/>
-      </w:pPr>
-      <w:r>
-        <w:rPr>
-          <w:rFonts w:ascii="Arial" w:hAnsi="Arial"/>
-          <w:sz w:val="28"/>
-        </w:rPr>
-        <w:t xml:space="preserve">5. #61-new — hidden old pages and dead reader road removed.</w:t>
-      </w:r>
-    </w:p>
-    <w:p>
-      <w:pPr>
-        <w:spacing w:line="276" w:lineRule="auto"/>
-      </w:pPr>
-      <w:r>
-        <w:rPr>
-          <w:rFonts w:ascii="Arial" w:hAnsi="Arial"/>
-          <w:sz w:val="28"/>
-        </w:rPr>
-        <w:t xml:space="preserve">   Notification-name sheet written. Mac 300. Committed (Patrick, #62-new).</w:t>
-      </w:r>
-    </w:p>
-    <w:p>
-      <w:pPr>
-        <w:spacing w:line="276" w:lineRule="auto"/>
-      </w:pPr>
-      <w:r>
-        <w:rPr>
-          <w:rFonts w:ascii="Arial" w:hAnsi="Arial"/>
-          <w:sz w:val="28"/>
-        </w:rPr>
-        <w:t xml:space="preserve">6. #59-new — calendar day-list fire time (old Pending 4); useless</w:t>
-      </w:r>
-    </w:p>
-    <w:p>
-      <w:pPr>
-        <w:spacing w:line="276" w:lineRule="auto"/>
-      </w:pPr>
-      <w:r>
-        <w:rPr>
-          <w:rFonts w:ascii="Arial" w:hAnsi="Arial"/>
-          <w:sz w:val="28"/>
-        </w:rPr>
-        <w:t xml:space="preserve">   spinners removed; AM/PM popup on Save when time set on 12-hour row</w:t>
-      </w:r>
-    </w:p>
-    <w:p>
-      <w:pPr>
-        <w:spacing w:line="276" w:lineRule="auto"/>
-      </w:pPr>
-      <w:r>
-        <w:rPr>
-          <w:rFonts w:ascii="Arial" w:hAnsi="Arial"/>
-          <w:sz w:val="28"/>
-        </w:rPr>
-        <w:t xml:space="preserve">   only (24-hour box or digit spinner skips it). Patrick said excellent.</w:t>
-      </w:r>
-    </w:p>
-    <w:p>
-      <w:pPr>
-        <w:spacing w:line="276" w:lineRule="auto"/>
-      </w:pPr>
-      <w:r>
-        <w:rPr>
-          <w:rFonts w:ascii="Arial" w:hAnsi="Arial"/>
-          <w:sz w:val="28"/>
-        </w:rPr>
-        <w:t xml:space="preserve">   Mac 489. Not on the phone. Patrick is committing.</w:t>
-      </w:r>
-    </w:p>
-    <w:p>
-      <w:pPr>
-        <w:spacing w:line="276" w:lineRule="auto"/>
-      </w:pPr>
-      <w:r>
-        <w:rPr>
-          <w:rFonts w:ascii="Arial" w:hAnsi="Arial"/>
-          <w:sz w:val="28"/>
-        </w:rPr>
-        <w:t xml:space="preserve">6. #58-new — the Where? helper built from its sheet. 🧭 badge after</w:t>
-      </w:r>
-    </w:p>
-    <w:p>
-      <w:pPr>
-        <w:spacing w:line="276" w:lineRule="auto"/>
-      </w:pPr>
-      <w:r>
-        <w:rPr>
-          <w:rFonts w:ascii="Arial" w:hAnsi="Arial"/>
-          <w:sz w:val="28"/>
-        </w:rPr>
-        <w:t xml:space="preserve">   Daily, calendar month button, transparent `app/where.tsx`, eight</w:t>
-      </w:r>
-    </w:p>
-    <w:p>
-      <w:pPr>
-        <w:spacing w:line="276" w:lineRule="auto"/>
-      </w:pPr>
-      <w:r>
-        <w:rPr>
-          <w:rFonts w:ascii="Arial" w:hAnsi="Arial"/>
-          <w:sz w:val="28"/>
-        </w:rPr>
-        <w:t xml:space="preserve">   landings on existing New forms, `formContext: oneTimeForToday`</w:t>
-      </w:r>
-    </w:p>
-    <w:p>
-      <w:pPr>
-        <w:spacing w:line="276" w:lineRule="auto"/>
-      </w:pPr>
-      <w:r>
-        <w:rPr>
-          <w:rFonts w:ascii="Arial" w:hAnsi="Arial"/>
-          <w:sz w:val="28"/>
-        </w:rPr>
-        <w:t xml:space="preserve">   split from `returnTo`. Mac 489. Not on the phone. Committed (Patrick, #59-new).</w:t>
-      </w:r>
-    </w:p>
-    <w:p>
-      <w:pPr>
-        <w:spacing w:line="276" w:lineRule="auto"/>
-      </w:pPr>
-      <w:r>
-        <w:rPr>
-          <w:rFonts w:ascii="Arial" w:hAnsi="Arial"/>
-          <w:sz w:val="28"/>
-        </w:rPr>
-        <w:t xml:space="preserve">6. #57-new — the Where? helper settled and its self-contained build</w:t>
-      </w:r>
-    </w:p>
-    <w:p>
-      <w:pPr>
-        <w:spacing w:line="276" w:lineRule="auto"/>
-      </w:pPr>
-      <w:r>
-        <w:rPr>
-          <w:rFonts w:ascii="Arial" w:hAnsi="Arial"/>
-          <w:sz w:val="28"/>
-        </w:rPr>
-        <w:t xml:space="preserve">   sheet written. 🧭 badge after Daily, calendar button, and the</w:t>
-      </w:r>
-    </w:p>
-    <w:p>
-      <w:pPr>
-        <w:spacing w:line="276" w:lineRule="auto"/>
-      </w:pPr>
-      <w:r>
-        <w:rPr>
-          <w:rFonts w:ascii="Arial" w:hAnsi="Arial"/>
-          <w:sz w:val="28"/>
-        </w:rPr>
-        <w:t xml:space="preserve">   Cancel and Save journey decided. No code.</w:t>
-      </w:r>
-    </w:p>
-    <w:p>
-      <w:pPr>
-        <w:spacing w:line="276" w:lineRule="auto"/>
-      </w:pPr>
-      <w:r>
-        <w:rPr>
-          <w:rFonts w:ascii="Arial" w:hAnsi="Arial"/>
-          <w:sz w:val="28"/>
-        </w:rPr>
-        <w:t xml:space="preserve">7. #56-new — Appointments and Bucket List on every live screen;</w:t>
-      </w:r>
-    </w:p>
-    <w:p>
-      <w:pPr>
-        <w:spacing w:line="276" w:lineRule="auto"/>
-      </w:pPr>
-      <w:r>
-        <w:rPr>
-          <w:rFonts w:ascii="Arial" w:hAnsi="Arial"/>
-          <w:sz w:val="28"/>
-        </w:rPr>
-        <w:t xml:space="preserve">   failed daily clear-out now spoken (Pending 2). Mac 489. He said</w:t>
-      </w:r>
-    </w:p>
-    <w:p>
-      <w:pPr>
-        <w:spacing w:line="276" w:lineRule="auto"/>
-      </w:pPr>
-      <w:r>
-        <w:rPr>
-          <w:rFonts w:ascii="Arial" w:hAnsi="Arial"/>
-          <w:sz w:val="28"/>
-        </w:rPr>
-        <w:t xml:space="preserve">   very good. Committed (Patrick, #57-new). Not on the phone.</w:t>
-      </w:r>
-    </w:p>
-    <w:p>
-      <w:pPr>
-        <w:spacing w:line="276" w:lineRule="auto"/>
-      </w:pPr>
-      <w:r>
-        <w:rPr>
-          <w:rFonts w:ascii="Arial" w:hAnsi="Arial"/>
-          <w:sz w:val="28"/>
-        </w:rPr>
-        <w:t xml:space="preserve">8. #55-new — missed-firing notice for Weekly, Monthly, Quarterly,</w:t>
-      </w:r>
-    </w:p>
-    <w:p>
-      <w:pPr>
-        <w:spacing w:line="276" w:lineRule="auto"/>
-      </w:pPr>
-      <w:r>
-        <w:rPr>
-          <w:rFonts w:ascii="Arial" w:hAnsi="Arial"/>
-          <w:sz w:val="28"/>
-        </w:rPr>
-        <w:t xml:space="preserve">   Yearly, and One Time as well as Daily; day-roll writes the miss.</w:t>
-      </w:r>
-    </w:p>
-    <w:p>
-      <w:pPr>
-        <w:spacing w:line="276" w:lineRule="auto"/>
-      </w:pPr>
-      <w:r>
-        <w:rPr>
-          <w:rFonts w:ascii="Arial" w:hAnsi="Arial"/>
-          <w:sz w:val="28"/>
-        </w:rPr>
-        <w:t xml:space="preserve">   Mac 487. He said the work is good. Committed (Patrick, #56-new).</w:t>
+        <w:t xml:space="preserve">9. #53-new (2026-09-02) — Scheduled Reminders names Daily, Weekly,</w:t>
+      </w:r>
+    </w:p>
+    <w:p>
+      <w:pPr>
+        <w:spacing w:line="276" w:lineRule="auto"/>
+      </w:pPr>
+      <w:r>
+        <w:rPr>
+          <w:rFonts w:ascii="Arial" w:hAnsi="Arial"/>
+          <w:sz w:val="28"/>
+        </w:rPr>
+        <w:t xml:space="preserve">   Monthly, Quarterly, Yearly, and One Time; Monthly, Quarterly,</w:t>
+      </w:r>
+    </w:p>
+    <w:p>
+      <w:pPr>
+        <w:spacing w:line="276" w:lineRule="auto"/>
+      </w:pPr>
+      <w:r>
+        <w:rPr>
+          <w:rFonts w:ascii="Arial" w:hAnsi="Arial"/>
+          <w:sz w:val="28"/>
+        </w:rPr>
+        <w:t xml:space="preserve">   and Yearly from the banner heading. Siri still says My Day Item.</w:t>
+      </w:r>
+    </w:p>
+    <w:p>
+      <w:pPr>
+        <w:spacing w:line="276" w:lineRule="auto"/>
+      </w:pPr>
+      <w:r>
+        <w:rPr>
+          <w:rFonts w:ascii="Arial" w:hAnsi="Arial"/>
+          <w:sz w:val="28"/>
+        </w:rPr>
+        <w:t xml:space="preserve">10. #53-new (2026-09-02) — one list row for Daily through Extended</w:t>
+      </w:r>
+    </w:p>
+    <w:p>
+      <w:pPr>
+        <w:spacing w:line="276" w:lineRule="auto"/>
+      </w:pPr>
+      <w:r>
+        <w:rPr>
+          <w:rFonts w:ascii="Arial" w:hAnsi="Arial"/>
+          <w:sz w:val="28"/>
+        </w:rPr>
+        <w:t xml:space="preserve">   (`ReminderItemRow.tsx`). Daily still composes its name and Log.</w:t>
+      </w:r>
+    </w:p>
+    <w:p>
+      <w:pPr>
+        <w:spacing w:line="276" w:lineRule="auto"/>
+      </w:pPr>
+      <w:r>
+        <w:rPr>
+          <w:rFonts w:ascii="Arial" w:hAnsi="Arial"/>
+          <w:sz w:val="28"/>
+        </w:rPr>
+        <w:t xml:space="preserve">11. #54-new (2026-09-02) — Appointments and Bucket List: one list in</w:t>
+      </w:r>
+    </w:p>
+    <w:p>
+      <w:pPr>
+        <w:spacing w:line="276" w:lineRule="auto"/>
+      </w:pPr>
+      <w:r>
+        <w:rPr>
+          <w:rFonts w:ascii="Arial" w:hAnsi="Arial"/>
+          <w:sz w:val="28"/>
+        </w:rPr>
+        <w:t xml:space="preserve">   constants/page-names.ts; Scheduled Reminders reads it. Finished</w:t>
+      </w:r>
+    </w:p>
+    <w:p>
+      <w:pPr>
+        <w:spacing w:line="276" w:lineRule="auto"/>
+      </w:pPr>
+      <w:r>
+        <w:rPr>
+          <w:rFonts w:ascii="Arial" w:hAnsi="Arial"/>
+          <w:sz w:val="28"/>
+        </w:rPr>
+        <w:t xml:space="preserve">   at #56-new. Committed.</w:t>
+      </w:r>
+    </w:p>
+    <w:p>
+      <w:pPr>
+        <w:spacing w:line="276" w:lineRule="auto"/>
+      </w:pPr>
+      <w:r>
+        <w:rPr>
+          <w:rFonts w:ascii="Arial" w:hAnsi="Arial"/>
+          <w:sz w:val="28"/>
+        </w:rPr>
+        <w:t xml:space="preserve">12. #52-new — landscape 90° counter-clockwise, headers on the left,</w:t>
+      </w:r>
+    </w:p>
+    <w:p>
+      <w:pPr>
+        <w:spacing w:line="276" w:lineRule="auto"/>
+      </w:pPr>
+      <w:r>
+        <w:rPr>
+          <w:rFonts w:ascii="Arial" w:hAnsi="Arial"/>
+          <w:sz w:val="28"/>
+        </w:rPr>
+        <w:t xml:space="preserve">   on the phone. Sit set: seven banners Wednesday on sim and phone.</w:t>
+      </w:r>
+    </w:p>
+    <w:p>
+      <w:pPr>
+        <w:spacing w:line="276" w:lineRule="auto"/>
+      </w:pPr>
+      <w:r>
+        <w:rPr>
+          <w:rFonts w:ascii="Arial" w:hAnsi="Arial"/>
+          <w:sz w:val="28"/>
+        </w:rPr>
+        <w:t xml:space="preserve">   No 9:20 by his decision. RFC eval written. Paperwork named:</w:t>
+      </w:r>
+    </w:p>
+    <w:p>
+      <w:pPr>
+        <w:spacing w:line="276" w:lineRule="auto"/>
+      </w:pPr>
+      <w:r>
+        <w:rPr>
+          <w:rFonts w:ascii="Arial" w:hAnsi="Arial"/>
+          <w:sz w:val="28"/>
+        </w:rPr>
+        <w:t xml:space="preserve">   spec, User Guide, website, Feedback, testing file, helper for</w:t>
+      </w:r>
+    </w:p>
+    <w:p>
+      <w:pPr>
+        <w:spacing w:line="276" w:lineRule="auto"/>
+      </w:pPr>
+      <w:r>
+        <w:rPr>
+          <w:rFonts w:ascii="Arial" w:hAnsi="Arial"/>
+          <w:sz w:val="28"/>
+        </w:rPr>
+        <w:t xml:space="preserve">   where.</w:t>
+      </w:r>
+    </w:p>
+    <w:p>
+      <w:pPr>
+        <w:spacing w:line="276" w:lineRule="auto"/>
+      </w:pPr>
+      <w:r>
+        <w:rPr>
+          <w:rFonts w:ascii="Arial" w:hAnsi="Arial"/>
+          <w:sz w:val="28"/>
+        </w:rPr>
+        <w:t xml:space="preserve">13. #51-new — display features: header buttons and the Home badge</w:t>
+      </w:r>
+    </w:p>
+    <w:p>
+      <w:pPr>
+        <w:spacing w:line="276" w:lineRule="auto"/>
+      </w:pPr>
+      <w:r>
+        <w:rPr>
+          <w:rFonts w:ascii="Arial" w:hAnsi="Arial"/>
+          <w:sz w:val="28"/>
+        </w:rPr>
+        <w:t xml:space="preserve">   face sit the right way up in landscape; Home's badges four across</w:t>
+      </w:r>
+    </w:p>
+    <w:p>
+      <w:pPr>
+        <w:spacing w:line="276" w:lineRule="auto"/>
+      </w:pPr>
+      <w:r>
+        <w:rPr>
+          <w:rFonts w:ascii="Arial" w:hAnsi="Arial"/>
+          <w:sz w:val="28"/>
+        </w:rPr>
+        <w:t xml:space="preserve">   and three down; Memory asks at start; Monthly / Quarterly /</w:t>
+      </w:r>
+    </w:p>
+    <w:p>
+      <w:pPr>
+        <w:spacing w:line="276" w:lineRule="auto"/>
+      </w:pPr>
+      <w:r>
+        <w:rPr>
+          <w:rFonts w:ascii="Arial" w:hAnsi="Arial"/>
+          <w:sz w:val="28"/>
+        </w:rPr>
+        <w:t xml:space="preserve">   Yearly banners name their own page; no snooze without a reminder;</w:t>
+      </w:r>
+    </w:p>
+    <w:p>
+      <w:pPr>
+        <w:spacing w:line="276" w:lineRule="auto"/>
+      </w:pPr>
+      <w:r>
+        <w:rPr>
+          <w:rFonts w:ascii="Arial" w:hAnsi="Arial"/>
+          <w:sz w:val="28"/>
+        </w:rPr>
+        <w:t xml:space="preserve">   the row button says Done? until a tap. Pending 2 and 4 checked,</w:t>
+      </w:r>
+    </w:p>
+    <w:p>
+      <w:pPr>
+        <w:spacing w:line="276" w:lineRule="auto"/>
+      </w:pPr>
+      <w:r>
+        <w:rPr>
+          <w:rFonts w:ascii="Arial" w:hAnsi="Arial"/>
+          <w:sz w:val="28"/>
+        </w:rPr>
+        <w:t xml:space="preserve">   not done. Phone not touched.</w:t>
+      </w:r>
+    </w:p>
+    <w:p>
+      <w:pPr>
+        <w:spacing w:line="276" w:lineRule="auto"/>
+      </w:pPr>
+      <w:r>
+        <w:rPr>
+          <w:rFonts w:ascii="Arial" w:hAnsi="Arial"/>
+          <w:sz w:val="28"/>
+        </w:rPr>
+        <w:t xml:space="preserve">14. #50-new — the other pages in landscape. Optional view, 0 and 90</w:t>
+      </w:r>
+    </w:p>
+    <w:p>
+      <w:pPr>
+        <w:spacing w:line="276" w:lineRule="auto"/>
+      </w:pPr>
+      <w:r>
+        <w:rPr>
+          <w:rFonts w:ascii="Arial" w:hAnsi="Arial"/>
+          <w:sz w:val="28"/>
+        </w:rPr>
+        <w:t xml:space="preserve">   only. Header stays the portrait row, Bridge with it, at the top</w:t>
+      </w:r>
+    </w:p>
+    <w:p>
+      <w:pPr>
+        <w:spacing w:line="276" w:lineRule="auto"/>
+      </w:pPr>
+      <w:r>
+        <w:rPr>
+          <w:rFonts w:ascii="Arial" w:hAnsi="Arial"/>
+          <w:sz w:val="28"/>
+        </w:rPr>
+        <w:t xml:space="preserve">   of the phone. Covers turn with the page. Calendar month grid not</w:t>
+      </w:r>
+    </w:p>
+    <w:p>
+      <w:pPr>
+        <w:spacing w:line="276" w:lineRule="auto"/>
+      </w:pPr>
+      <w:r>
+        <w:rPr>
+          <w:rFonts w:ascii="Arial" w:hAnsi="Arial"/>
+          <w:sz w:val="28"/>
+        </w:rPr>
+        <w:t xml:space="preserve">   rebuilt. Simulator still held leftover sitting items; he deleted</w:t>
+      </w:r>
+    </w:p>
+    <w:p>
+      <w:pPr>
+        <w:spacing w:line="276" w:lineRule="auto"/>
+      </w:pPr>
+      <w:r>
+        <w:rPr>
+          <w:rFonts w:ascii="Arial" w:hAnsi="Arial"/>
+          <w:sz w:val="28"/>
+        </w:rPr>
+        <w:t xml:space="preserve">   the Memory app there.    Goal accomplished. Phone not touched.</w:t>
+      </w:r>
+    </w:p>
+    <w:p>
+      <w:pPr>
+        <w:spacing w:line="276" w:lineRule="auto"/>
+      </w:pPr>
+      <w:r>
+        <w:rPr>
+          <w:rFonts w:ascii="Arial" w:hAnsi="Arial"/>
+          <w:sz w:val="28"/>
+        </w:rPr>
+        <w:t xml:space="preserve">15. #49-new — calendar page built from the sheet. Options Calendar</w:t>
+      </w:r>
+    </w:p>
+    <w:p>
+      <w:pPr>
+        <w:spacing w:line="276" w:lineRule="auto"/>
+      </w:pPr>
+      <w:r>
+        <w:rPr>
+          <w:rFonts w:ascii="Arial" w:hAnsi="Arial"/>
+          <w:sz w:val="28"/>
+        </w:rPr>
+        <w:t xml:space="preserve">   shading row out; the saved field stays. Names in a day box scroll</w:t>
+      </w:r>
+    </w:p>
+    <w:p>
+      <w:pPr>
+        <w:spacing w:line="276" w:lineRule="auto"/>
+      </w:pPr>
+      <w:r>
+        <w:rPr>
+          <w:rFonts w:ascii="Arial" w:hAnsi="Arial"/>
+          <w:sz w:val="28"/>
+        </w:rPr>
+        <w:t xml:space="preserve">   vertically only. 460 tests. They need landscape now. Calendar is</w:t>
+      </w:r>
+    </w:p>
+    <w:p>
+      <w:pPr>
+        <w:spacing w:line="276" w:lineRule="auto"/>
+      </w:pPr>
+      <w:r>
+        <w:rPr>
+          <w:rFonts w:ascii="Arial" w:hAnsi="Arial"/>
+          <w:sz w:val="28"/>
+        </w:rPr>
+        <w:t xml:space="preserve">   allowed to turn; other pages still stay upright. Fresh simulator</w:t>
+      </w:r>
+    </w:p>
+    <w:p>
+      <w:pPr>
+        <w:spacing w:line="276" w:lineRule="auto"/>
+      </w:pPr>
+      <w:r>
+        <w:rPr>
+          <w:rFonts w:ascii="Arial" w:hAnsi="Arial"/>
+          <w:sz w:val="28"/>
+        </w:rPr>
+        <w:t xml:space="preserve">   build needed for a turn to take.</w:t>
+      </w:r>
+    </w:p>
+    <w:p>
+      <w:pPr>
+        <w:spacing w:line="276" w:lineRule="auto"/>
+      </w:pPr>
+      <w:r>
+        <w:rPr>
+          <w:rFonts w:ascii="Arial" w:hAnsi="Arial"/>
+          <w:sz w:val="28"/>
+        </w:rPr>
+        <w:t xml:space="preserve">16. #48-new — calendar build sheet written. No code.</w:t>
+      </w:r>
+    </w:p>
+    <w:p>
+      <w:pPr>
+        <w:spacing w:line="276" w:lineRule="auto"/>
+      </w:pPr>
+      <w:r>
+        <w:rPr>
+          <w:rFonts w:ascii="Arial" w:hAnsi="Arial"/>
+          <w:sz w:val="28"/>
+        </w:rPr>
+        <w:t xml:space="preserve">17. #47-new — selling description a good start and left. Features</w:t>
+      </w:r>
+    </w:p>
+    <w:p>
+      <w:pPr>
+        <w:spacing w:line="276" w:lineRule="auto"/>
+      </w:pPr>
+      <w:r>
+        <w:rPr>
+          <w:rFonts w:ascii="Arial" w:hAnsi="Arial"/>
+          <w:sz w:val="28"/>
+        </w:rPr>
+        <w:t xml:space="preserve">   file is the inventory. Comparables from what the app is, not</w:t>
+      </w:r>
+    </w:p>
+    <w:p>
+      <w:pPr>
+        <w:spacing w:line="276" w:lineRule="auto"/>
+      </w:pPr>
+      <w:r>
+        <w:rPr>
+          <w:rFonts w:ascii="Arial" w:hAnsi="Arial"/>
+          <w:sz w:val="28"/>
+        </w:rPr>
+        <w:t xml:space="preserve">   elderly apps: repeating reminders and personal tasks. Apple</w:t>
+      </w:r>
+    </w:p>
+    <w:p>
+      <w:pPr>
+        <w:spacing w:line="276" w:lineRule="auto"/>
+      </w:pPr>
+      <w:r>
+        <w:rPr>
+          <w:rFonts w:ascii="Arial" w:hAnsi="Arial"/>
+          <w:sz w:val="28"/>
+        </w:rPr>
+        <w:t xml:space="preserve">   Reminders is the free default; TickTick, Todoist, Things, and</w:t>
+      </w:r>
+    </w:p>
+    <w:p>
+      <w:pPr>
+        <w:spacing w:line="276" w:lineRule="auto"/>
+      </w:pPr>
+      <w:r>
+        <w:rPr>
+          <w:rFonts w:ascii="Arial" w:hAnsi="Arial"/>
+          <w:sz w:val="28"/>
+        </w:rPr>
+        <w:t xml:space="preserve">   Due exist because it is not enough. He opened Reminders: this</w:t>
+      </w:r>
+    </w:p>
+    <w:p>
+      <w:pPr>
+        <w:spacing w:line="276" w:lineRule="auto"/>
+      </w:pPr>
+      <w:r>
+        <w:rPr>
+          <w:rFonts w:ascii="Arial" w:hAnsi="Arial"/>
+          <w:sz w:val="28"/>
+        </w:rPr>
+        <w:t xml:space="preserve">   one does more, easier. No code.</w:t>
+      </w:r>
+    </w:p>
+    <w:p>
+      <w:pPr>
+        <w:spacing w:line="276" w:lineRule="auto"/>
+      </w:pPr>
+      <w:r>
+        <w:rPr>
+          <w:rFonts w:ascii="Arial" w:hAnsi="Arial"/>
+          <w:sz w:val="28"/>
+        </w:rPr>
+        <w:t xml:space="preserve">18. #46-new — selling description begun, publishing picture written.</w:t>
+      </w:r>
+    </w:p>
+    <w:p>
+      <w:pPr>
+        <w:spacing w:line="276" w:lineRule="auto"/>
+      </w:pPr>
+      <w:r>
+        <w:rPr>
+          <w:rFonts w:ascii="Arial" w:hAnsi="Arial"/>
+          <w:sz w:val="28"/>
+        </w:rPr>
+        <w:t xml:space="preserve">   The session dropped. The wrong-shelf comparables were corrected</w:t>
+      </w:r>
+    </w:p>
+    <w:p>
+      <w:pPr>
+        <w:spacing w:line="276" w:lineRule="auto"/>
+      </w:pPr>
+      <w:r>
+        <w:rPr>
+          <w:rFonts w:ascii="Arial" w:hAnsi="Arial"/>
+          <w:sz w:val="28"/>
+        </w:rPr>
+        <w:t xml:space="preserve">   at #47-new.</w:t>
+      </w:r>
+    </w:p>
+    <w:p>
+      <w:pPr>
+        <w:spacing w:line="276" w:lineRule="auto"/>
+      </w:pPr>
+      <w:r>
+        <w:rPr>
+          <w:rFonts w:ascii="Arial" w:hAnsi="Arial"/>
+          <w:sz w:val="28"/>
+        </w:rPr>
+        <w:t xml:space="preserve">19. App-Docs, 2026-08-31 — working documents stay in docs; history</w:t>
+      </w:r>
+    </w:p>
+    <w:p>
+      <w:pPr>
+        <w:spacing w:line="276" w:lineRule="auto"/>
+      </w:pPr>
+      <w:r>
+        <w:rPr>
+          <w:rFonts w:ascii="Arial" w:hAnsi="Arial"/>
+          <w:sz w:val="28"/>
+        </w:rPr>
+        <w:t xml:space="preserve">   and the eleven build sheets moved to docs-ref. Index tightened to</w:t>
+      </w:r>
+    </w:p>
+    <w:p>
+      <w:pPr>
+        <w:spacing w:line="276" w:lineRule="auto"/>
+      </w:pPr>
+      <w:r>
+        <w:rPr>
+          <w:rFonts w:ascii="Arial" w:hAnsi="Arial"/>
+          <w:sz w:val="28"/>
+        </w:rPr>
+        <w:t xml:space="preserve">   one line per file. Not a Memory chain session.</w:t>
+      </w:r>
+    </w:p>
+    <w:p>
+      <w:pPr>
+        <w:spacing w:line="276" w:lineRule="auto"/>
+      </w:pPr>
+      <w:r>
+        <w:rPr>
+          <w:rFonts w:ascii="Arial" w:hAnsi="Arial"/>
+          <w:sz w:val="28"/>
+        </w:rPr>
+        <w:t xml:space="preserve">20. #45-new — the two engine Fails from the sitting: Daily after Done</w:t>
+      </w:r>
+    </w:p>
+    <w:p>
+      <w:pPr>
+        <w:spacing w:line="276" w:lineRule="auto"/>
+      </w:pPr>
+      <w:r>
+        <w:rPr>
+          <w:rFonts w:ascii="Arial" w:hAnsi="Arial"/>
+          <w:sz w:val="28"/>
+        </w:rPr>
+        <w:t xml:space="preserve">   arms tomorrow, and a named zone moves a One Time's fire. 23 passed,</w:t>
+      </w:r>
+    </w:p>
+    <w:p>
+      <w:pPr>
+        <w:spacing w:line="276" w:lineRule="auto"/>
+      </w:pPr>
+      <w:r>
+        <w:rPr>
+          <w:rFonts w:ascii="Arial" w:hAnsi="Arial"/>
+          <w:sz w:val="28"/>
+        </w:rPr>
+        <w:t xml:space="preserve">   0 failed on the sim and on the phone. 460 tests. Reminder Engine</w:t>
+      </w:r>
+    </w:p>
+    <w:p>
+      <w:pPr>
+        <w:spacing w:line="276" w:lineRule="auto"/>
+      </w:pPr>
+      <w:r>
+        <w:rPr>
+          <w:rFonts w:ascii="Arial" w:hAnsi="Arial"/>
+          <w:sz w:val="28"/>
+        </w:rPr>
+        <w:t xml:space="preserve">   files not touched. The morning after, the automated load, the two</w:t>
+      </w:r>
+    </w:p>
+    <w:p>
+      <w:pPr>
+        <w:spacing w:line="276" w:lineRule="auto"/>
+      </w:pPr>
+      <w:r>
+        <w:rPr>
+          <w:rFonts w:ascii="Arial" w:hAnsi="Arial"/>
+          <w:sz w:val="28"/>
+        </w:rPr>
+        <w:t xml:space="preserve">   type-check nits, and the reminder pages stretch, marked done</w:t>
+      </w:r>
+    </w:p>
+    <w:p>
+      <w:pPr>
+        <w:spacing w:line="276" w:lineRule="auto"/>
+      </w:pPr>
+      <w:r>
+        <w:rPr>
+          <w:rFonts w:ascii="Arial" w:hAnsi="Arial"/>
+          <w:sz w:val="28"/>
+        </w:rPr>
+        <w:t xml:space="preserve">   (Patrick). A banner while Memory is on screen was silent; the app</w:t>
+      </w:r>
+    </w:p>
+    <w:p>
+      <w:pPr>
+        <w:spacing w:line="276" w:lineRule="auto"/>
+      </w:pPr>
+      <w:r>
+        <w:rPr>
+          <w:rFonts w:ascii="Arial" w:hAnsi="Arial"/>
+          <w:sz w:val="28"/>
+        </w:rPr>
+        <w:t xml:space="preserve">   now asks to show it, same as Timer. He will verify that in the code</w:t>
+      </w:r>
+    </w:p>
+    <w:p>
+      <w:pPr>
+        <w:spacing w:line="276" w:lineRule="auto"/>
+      </w:pPr>
+      <w:r>
+        <w:rPr>
+          <w:rFonts w:ascii="Arial" w:hAnsi="Arial"/>
+          <w:sz w:val="28"/>
+        </w:rPr>
+        <w:t xml:space="preserve">   without the test load. The four pieces, the screen, and the Home</w:t>
+      </w:r>
+    </w:p>
+    <w:p>
+      <w:pPr>
+        <w:spacing w:line="276" w:lineRule="auto"/>
+      </w:pPr>
+      <w:r>
+        <w:rPr>
+          <w:rFonts w:ascii="Arial" w:hAnsi="Arial"/>
+          <w:sz w:val="28"/>
+        </w:rPr>
+        <w:t xml:space="preserve">   tile came out of the app after that run.</w:t>
+      </w:r>
+    </w:p>
+    <w:p>
+      <w:pPr>
+        <w:spacing w:line="276" w:lineRule="auto"/>
+      </w:pPr>
+      <w:r>
+        <w:rPr>
+          <w:rFonts w:ascii="Arial" w:hAnsi="Arial"/>
+          <w:sz w:val="28"/>
+        </w:rPr>
+        <w:t xml:space="preserve">20. #44-new — the automated load built, and the simulator sitting</w:t>
+      </w:r>
+    </w:p>
+    <w:p>
+      <w:pPr>
+        <w:spacing w:line="276" w:lineRule="auto"/>
+      </w:pPr>
+      <w:r>
+        <w:rPr>
+          <w:rFonts w:ascii="Arial" w:hAnsi="Arial"/>
+          <w:sz w:val="28"/>
+        </w:rPr>
+        <w:t xml:space="preserve">   finished. Two engine Fails (Daily after Done, named zone) go to</w:t>
+      </w:r>
+    </w:p>
+    <w:p>
+      <w:pPr>
+        <w:spacing w:line="276" w:lineRule="auto"/>
+      </w:pPr>
+      <w:r>
+        <w:rPr>
+          <w:rFonts w:ascii="Arial" w:hAnsi="Arial"/>
+          <w:sz w:val="28"/>
+        </w:rPr>
+        <w:t xml:space="preserve">   #45-new. Reminder Engine files not touched. 459 tests. Two old</w:t>
+      </w:r>
+    </w:p>
+    <w:p>
+      <w:pPr>
+        <w:spacing w:line="276" w:lineRule="auto"/>
+      </w:pPr>
+      <w:r>
+        <w:rPr>
+          <w:rFonts w:ascii="Arial" w:hAnsi="Arial"/>
+          <w:sz w:val="28"/>
+        </w:rPr>
+        <w:t xml:space="preserve">   type-check nits left for later.</w:t>
+      </w:r>
+    </w:p>
+    <w:p>
+      <w:pPr>
+        <w:spacing w:line="276" w:lineRule="auto"/>
+      </w:pPr>
+      <w:r>
+        <w:rPr>
+          <w:rFonts w:ascii="Arial" w:hAnsi="Arial"/>
+          <w:sz w:val="28"/>
+        </w:rPr>
+        <w:t xml:space="preserve">21. #43-new — the automated-load job sheet and the sitting list.</w:t>
+      </w:r>
+    </w:p>
+    <w:p>
+      <w:pPr>
+        <w:spacing w:line="276" w:lineRule="auto"/>
+      </w:pPr>
+      <w:r>
+        <w:rPr>
+          <w:rFonts w:ascii="Arial" w:hAnsi="Arial"/>
+          <w:sz w:val="28"/>
+        </w:rPr>
+        <w:t xml:space="preserve">   Daily now rolls the list before it reads, and the list pages read</w:t>
+      </w:r>
+    </w:p>
+    <w:p>
+      <w:pPr>
+        <w:spacing w:line="276" w:lineRule="auto"/>
+      </w:pPr>
+      <w:r>
+        <w:rPr>
+          <w:rFonts w:ascii="Arial" w:hAnsi="Arial"/>
+          <w:sz w:val="28"/>
+        </w:rPr>
+        <w:t xml:space="preserve">   again when the app comes to the front. The load itself is not</w:t>
+      </w:r>
+    </w:p>
+    <w:p>
+      <w:pPr>
+        <w:spacing w:line="276" w:lineRule="auto"/>
+      </w:pPr>
+      <w:r>
+        <w:rPr>
+          <w:rFonts w:ascii="Arial" w:hAnsi="Arial"/>
+          <w:sz w:val="28"/>
+        </w:rPr>
+        <w:t xml:space="preserve">   built. Not on the phone.</w:t>
+      </w:r>
+    </w:p>
+    <w:p>
+      <w:pPr>
+        <w:spacing w:line="276" w:lineRule="auto"/>
+      </w:pPr>
+      <w:r>
+        <w:rPr>
+          <w:rFonts w:ascii="Arial" w:hAnsi="Arial"/>
+          <w:sz w:val="28"/>
+        </w:rPr>
+        <w:t xml:space="preserve">22. #42-new — the rest of Options into the engine. Calendar shading</w:t>
+      </w:r>
+    </w:p>
+    <w:p>
+      <w:pPr>
+        <w:spacing w:line="276" w:lineRule="auto"/>
+      </w:pPr>
+      <w:r>
+        <w:rPr>
+          <w:rFonts w:ascii="Arial" w:hAnsi="Arial"/>
+          <w:sz w:val="28"/>
+        </w:rPr>
+        <w:t xml:space="preserve">   from the engine, the Float row out, Extended New and Edit as name,</w:t>
+      </w:r>
+    </w:p>
+    <w:p>
+      <w:pPr>
+        <w:spacing w:line="276" w:lineRule="auto"/>
+      </w:pPr>
+      <w:r>
+        <w:rPr>
+          <w:rFonts w:ascii="Arial" w:hAnsi="Arial"/>
+          <w:sz w:val="28"/>
+        </w:rPr>
+        <w:t xml:space="preserve">   optional note and Done, Cancel with no change after + OPT, and</w:t>
+      </w:r>
+    </w:p>
+    <w:p>
+      <w:pPr>
+        <w:spacing w:line="276" w:lineRule="auto"/>
+      </w:pPr>
+      <w:r>
+        <w:rPr>
+          <w:rFonts w:ascii="Arial" w:hAnsi="Arial"/>
+          <w:sz w:val="28"/>
+        </w:rPr>
+        <w:t xml:space="preserve">   Daily's every-day and One Time for today as time zone only. A</w:t>
+      </w:r>
+    </w:p>
+    <w:p>
+      <w:pPr>
+        <w:spacing w:line="276" w:lineRule="auto"/>
+      </w:pPr>
+      <w:r>
+        <w:rPr>
+          <w:rFonts w:ascii="Arial" w:hAnsi="Arial"/>
+          <w:sz w:val="28"/>
+        </w:rPr>
+        <w:t xml:space="preserve">   weekday after a numbered day is the first occurrence after that</w:t>
+      </w:r>
+    </w:p>
+    <w:p>
+      <w:pPr>
+        <w:spacing w:line="276" w:lineRule="auto"/>
+      </w:pPr>
+      <w:r>
+        <w:rPr>
+          <w:rFonts w:ascii="Arial" w:hAnsi="Arial"/>
+          <w:sz w:val="28"/>
+        </w:rPr>
+        <w:t xml:space="preserve">   day only. The Timer is parked as a different effort. 459 tests.</w:t>
       </w:r>
     </w:p>
     <w:p>
@@ -2092,798 +2860,6 @@
           <w:rFonts w:ascii="Arial" w:hAnsi="Arial"/>
           <w:sz w:val="28"/>
         </w:rPr>
-        <w:t xml:space="preserve">9. #53-new (2026-09-02) — Scheduled Reminders names Daily, Weekly,</w:t>
-      </w:r>
-    </w:p>
-    <w:p>
-      <w:pPr>
-        <w:spacing w:line="276" w:lineRule="auto"/>
-      </w:pPr>
-      <w:r>
-        <w:rPr>
-          <w:rFonts w:ascii="Arial" w:hAnsi="Arial"/>
-          <w:sz w:val="28"/>
-        </w:rPr>
-        <w:t xml:space="preserve">   Monthly, Quarterly, Yearly, and One Time; Monthly, Quarterly,</w:t>
-      </w:r>
-    </w:p>
-    <w:p>
-      <w:pPr>
-        <w:spacing w:line="276" w:lineRule="auto"/>
-      </w:pPr>
-      <w:r>
-        <w:rPr>
-          <w:rFonts w:ascii="Arial" w:hAnsi="Arial"/>
-          <w:sz w:val="28"/>
-        </w:rPr>
-        <w:t xml:space="preserve">   and Yearly from the banner heading. Siri still says My Day Item.</w:t>
-      </w:r>
-    </w:p>
-    <w:p>
-      <w:pPr>
-        <w:spacing w:line="276" w:lineRule="auto"/>
-      </w:pPr>
-      <w:r>
-        <w:rPr>
-          <w:rFonts w:ascii="Arial" w:hAnsi="Arial"/>
-          <w:sz w:val="28"/>
-        </w:rPr>
-        <w:t xml:space="preserve">10. #53-new (2026-09-02) — one list row for Daily through Extended</w:t>
-      </w:r>
-    </w:p>
-    <w:p>
-      <w:pPr>
-        <w:spacing w:line="276" w:lineRule="auto"/>
-      </w:pPr>
-      <w:r>
-        <w:rPr>
-          <w:rFonts w:ascii="Arial" w:hAnsi="Arial"/>
-          <w:sz w:val="28"/>
-        </w:rPr>
-        <w:t xml:space="preserve">   (`ReminderItemRow.tsx`). Daily still composes its name and Log.</w:t>
-      </w:r>
-    </w:p>
-    <w:p>
-      <w:pPr>
-        <w:spacing w:line="276" w:lineRule="auto"/>
-      </w:pPr>
-      <w:r>
-        <w:rPr>
-          <w:rFonts w:ascii="Arial" w:hAnsi="Arial"/>
-          <w:sz w:val="28"/>
-        </w:rPr>
-        <w:t xml:space="preserve">11. #54-new (2026-09-02) — Appointments and Bucket List: one list in</w:t>
-      </w:r>
-    </w:p>
-    <w:p>
-      <w:pPr>
-        <w:spacing w:line="276" w:lineRule="auto"/>
-      </w:pPr>
-      <w:r>
-        <w:rPr>
-          <w:rFonts w:ascii="Arial" w:hAnsi="Arial"/>
-          <w:sz w:val="28"/>
-        </w:rPr>
-        <w:t xml:space="preserve">   constants/page-names.ts; Scheduled Reminders reads it. Finished</w:t>
-      </w:r>
-    </w:p>
-    <w:p>
-      <w:pPr>
-        <w:spacing w:line="276" w:lineRule="auto"/>
-      </w:pPr>
-      <w:r>
-        <w:rPr>
-          <w:rFonts w:ascii="Arial" w:hAnsi="Arial"/>
-          <w:sz w:val="28"/>
-        </w:rPr>
-        <w:t xml:space="preserve">   at #56-new. Committed.</w:t>
-      </w:r>
-    </w:p>
-    <w:p>
-      <w:pPr>
-        <w:spacing w:line="276" w:lineRule="auto"/>
-      </w:pPr>
-      <w:r>
-        <w:rPr>
-          <w:rFonts w:ascii="Arial" w:hAnsi="Arial"/>
-          <w:sz w:val="28"/>
-        </w:rPr>
-        <w:t xml:space="preserve">12. #52-new — landscape 90° counter-clockwise, headers on the left,</w:t>
-      </w:r>
-    </w:p>
-    <w:p>
-      <w:pPr>
-        <w:spacing w:line="276" w:lineRule="auto"/>
-      </w:pPr>
-      <w:r>
-        <w:rPr>
-          <w:rFonts w:ascii="Arial" w:hAnsi="Arial"/>
-          <w:sz w:val="28"/>
-        </w:rPr>
-        <w:t xml:space="preserve">   on the phone. Sit set: seven banners Wednesday on sim and phone.</w:t>
-      </w:r>
-    </w:p>
-    <w:p>
-      <w:pPr>
-        <w:spacing w:line="276" w:lineRule="auto"/>
-      </w:pPr>
-      <w:r>
-        <w:rPr>
-          <w:rFonts w:ascii="Arial" w:hAnsi="Arial"/>
-          <w:sz w:val="28"/>
-        </w:rPr>
-        <w:t xml:space="preserve">   No 9:20 by his decision. RFC eval written. Paperwork named:</w:t>
-      </w:r>
-    </w:p>
-    <w:p>
-      <w:pPr>
-        <w:spacing w:line="276" w:lineRule="auto"/>
-      </w:pPr>
-      <w:r>
-        <w:rPr>
-          <w:rFonts w:ascii="Arial" w:hAnsi="Arial"/>
-          <w:sz w:val="28"/>
-        </w:rPr>
-        <w:t xml:space="preserve">   spec, User Guide, website, Feedback, testing file, helper for</w:t>
-      </w:r>
-    </w:p>
-    <w:p>
-      <w:pPr>
-        <w:spacing w:line="276" w:lineRule="auto"/>
-      </w:pPr>
-      <w:r>
-        <w:rPr>
-          <w:rFonts w:ascii="Arial" w:hAnsi="Arial"/>
-          <w:sz w:val="28"/>
-        </w:rPr>
-        <w:t xml:space="preserve">   where.</w:t>
-      </w:r>
-    </w:p>
-    <w:p>
-      <w:pPr>
-        <w:spacing w:line="276" w:lineRule="auto"/>
-      </w:pPr>
-      <w:r>
-        <w:rPr>
-          <w:rFonts w:ascii="Arial" w:hAnsi="Arial"/>
-          <w:sz w:val="28"/>
-        </w:rPr>
-        <w:t xml:space="preserve">13. #51-new — display features: header buttons and the Home badge</w:t>
-      </w:r>
-    </w:p>
-    <w:p>
-      <w:pPr>
-        <w:spacing w:line="276" w:lineRule="auto"/>
-      </w:pPr>
-      <w:r>
-        <w:rPr>
-          <w:rFonts w:ascii="Arial" w:hAnsi="Arial"/>
-          <w:sz w:val="28"/>
-        </w:rPr>
-        <w:t xml:space="preserve">   face sit the right way up in landscape; Home's badges four across</w:t>
-      </w:r>
-    </w:p>
-    <w:p>
-      <w:pPr>
-        <w:spacing w:line="276" w:lineRule="auto"/>
-      </w:pPr>
-      <w:r>
-        <w:rPr>
-          <w:rFonts w:ascii="Arial" w:hAnsi="Arial"/>
-          <w:sz w:val="28"/>
-        </w:rPr>
-        <w:t xml:space="preserve">   and three down; Memory asks at start; Monthly / Quarterly /</w:t>
-      </w:r>
-    </w:p>
-    <w:p>
-      <w:pPr>
-        <w:spacing w:line="276" w:lineRule="auto"/>
-      </w:pPr>
-      <w:r>
-        <w:rPr>
-          <w:rFonts w:ascii="Arial" w:hAnsi="Arial"/>
-          <w:sz w:val="28"/>
-        </w:rPr>
-        <w:t xml:space="preserve">   Yearly banners name their own page; no snooze without a reminder;</w:t>
-      </w:r>
-    </w:p>
-    <w:p>
-      <w:pPr>
-        <w:spacing w:line="276" w:lineRule="auto"/>
-      </w:pPr>
-      <w:r>
-        <w:rPr>
-          <w:rFonts w:ascii="Arial" w:hAnsi="Arial"/>
-          <w:sz w:val="28"/>
-        </w:rPr>
-        <w:t xml:space="preserve">   the row button says Done? until a tap. Pending 2 and 4 checked,</w:t>
-      </w:r>
-    </w:p>
-    <w:p>
-      <w:pPr>
-        <w:spacing w:line="276" w:lineRule="auto"/>
-      </w:pPr>
-      <w:r>
-        <w:rPr>
-          <w:rFonts w:ascii="Arial" w:hAnsi="Arial"/>
-          <w:sz w:val="28"/>
-        </w:rPr>
-        <w:t xml:space="preserve">   not done. Phone not touched.</w:t>
-      </w:r>
-    </w:p>
-    <w:p>
-      <w:pPr>
-        <w:spacing w:line="276" w:lineRule="auto"/>
-      </w:pPr>
-      <w:r>
-        <w:rPr>
-          <w:rFonts w:ascii="Arial" w:hAnsi="Arial"/>
-          <w:sz w:val="28"/>
-        </w:rPr>
-        <w:t xml:space="preserve">14. #50-new — the other pages in landscape. Optional view, 0 and 90</w:t>
-      </w:r>
-    </w:p>
-    <w:p>
-      <w:pPr>
-        <w:spacing w:line="276" w:lineRule="auto"/>
-      </w:pPr>
-      <w:r>
-        <w:rPr>
-          <w:rFonts w:ascii="Arial" w:hAnsi="Arial"/>
-          <w:sz w:val="28"/>
-        </w:rPr>
-        <w:t xml:space="preserve">   only. Header stays the portrait row, Bridge with it, at the top</w:t>
-      </w:r>
-    </w:p>
-    <w:p>
-      <w:pPr>
-        <w:spacing w:line="276" w:lineRule="auto"/>
-      </w:pPr>
-      <w:r>
-        <w:rPr>
-          <w:rFonts w:ascii="Arial" w:hAnsi="Arial"/>
-          <w:sz w:val="28"/>
-        </w:rPr>
-        <w:t xml:space="preserve">   of the phone. Covers turn with the page. Calendar month grid not</w:t>
-      </w:r>
-    </w:p>
-    <w:p>
-      <w:pPr>
-        <w:spacing w:line="276" w:lineRule="auto"/>
-      </w:pPr>
-      <w:r>
-        <w:rPr>
-          <w:rFonts w:ascii="Arial" w:hAnsi="Arial"/>
-          <w:sz w:val="28"/>
-        </w:rPr>
-        <w:t xml:space="preserve">   rebuilt. Simulator still held leftover sitting items; he deleted</w:t>
-      </w:r>
-    </w:p>
-    <w:p>
-      <w:pPr>
-        <w:spacing w:line="276" w:lineRule="auto"/>
-      </w:pPr>
-      <w:r>
-        <w:rPr>
-          <w:rFonts w:ascii="Arial" w:hAnsi="Arial"/>
-          <w:sz w:val="28"/>
-        </w:rPr>
-        <w:t xml:space="preserve">   the Memory app there.    Goal accomplished. Phone not touched.</w:t>
-      </w:r>
-    </w:p>
-    <w:p>
-      <w:pPr>
-        <w:spacing w:line="276" w:lineRule="auto"/>
-      </w:pPr>
-      <w:r>
-        <w:rPr>
-          <w:rFonts w:ascii="Arial" w:hAnsi="Arial"/>
-          <w:sz w:val="28"/>
-        </w:rPr>
-        <w:t xml:space="preserve">15. #49-new — calendar page built from the sheet. Options Calendar</w:t>
-      </w:r>
-    </w:p>
-    <w:p>
-      <w:pPr>
-        <w:spacing w:line="276" w:lineRule="auto"/>
-      </w:pPr>
-      <w:r>
-        <w:rPr>
-          <w:rFonts w:ascii="Arial" w:hAnsi="Arial"/>
-          <w:sz w:val="28"/>
-        </w:rPr>
-        <w:t xml:space="preserve">   shading row out; the saved field stays. Names in a day box scroll</w:t>
-      </w:r>
-    </w:p>
-    <w:p>
-      <w:pPr>
-        <w:spacing w:line="276" w:lineRule="auto"/>
-      </w:pPr>
-      <w:r>
-        <w:rPr>
-          <w:rFonts w:ascii="Arial" w:hAnsi="Arial"/>
-          <w:sz w:val="28"/>
-        </w:rPr>
-        <w:t xml:space="preserve">   vertically only. 460 tests. They need landscape now. Calendar is</w:t>
-      </w:r>
-    </w:p>
-    <w:p>
-      <w:pPr>
-        <w:spacing w:line="276" w:lineRule="auto"/>
-      </w:pPr>
-      <w:r>
-        <w:rPr>
-          <w:rFonts w:ascii="Arial" w:hAnsi="Arial"/>
-          <w:sz w:val="28"/>
-        </w:rPr>
-        <w:t xml:space="preserve">   allowed to turn; other pages still stay upright. Fresh simulator</w:t>
-      </w:r>
-    </w:p>
-    <w:p>
-      <w:pPr>
-        <w:spacing w:line="276" w:lineRule="auto"/>
-      </w:pPr>
-      <w:r>
-        <w:rPr>
-          <w:rFonts w:ascii="Arial" w:hAnsi="Arial"/>
-          <w:sz w:val="28"/>
-        </w:rPr>
-        <w:t xml:space="preserve">   build needed for a turn to take.</w:t>
-      </w:r>
-    </w:p>
-    <w:p>
-      <w:pPr>
-        <w:spacing w:line="276" w:lineRule="auto"/>
-      </w:pPr>
-      <w:r>
-        <w:rPr>
-          <w:rFonts w:ascii="Arial" w:hAnsi="Arial"/>
-          <w:sz w:val="28"/>
-        </w:rPr>
-        <w:t xml:space="preserve">16. #48-new — calendar build sheet written. No code.</w:t>
-      </w:r>
-    </w:p>
-    <w:p>
-      <w:pPr>
-        <w:spacing w:line="276" w:lineRule="auto"/>
-      </w:pPr>
-      <w:r>
-        <w:rPr>
-          <w:rFonts w:ascii="Arial" w:hAnsi="Arial"/>
-          <w:sz w:val="28"/>
-        </w:rPr>
-        <w:t xml:space="preserve">17. #47-new — selling description a good start and left. Features</w:t>
-      </w:r>
-    </w:p>
-    <w:p>
-      <w:pPr>
-        <w:spacing w:line="276" w:lineRule="auto"/>
-      </w:pPr>
-      <w:r>
-        <w:rPr>
-          <w:rFonts w:ascii="Arial" w:hAnsi="Arial"/>
-          <w:sz w:val="28"/>
-        </w:rPr>
-        <w:t xml:space="preserve">   file is the inventory. Comparables from what the app is, not</w:t>
-      </w:r>
-    </w:p>
-    <w:p>
-      <w:pPr>
-        <w:spacing w:line="276" w:lineRule="auto"/>
-      </w:pPr>
-      <w:r>
-        <w:rPr>
-          <w:rFonts w:ascii="Arial" w:hAnsi="Arial"/>
-          <w:sz w:val="28"/>
-        </w:rPr>
-        <w:t xml:space="preserve">   elderly apps: repeating reminders and personal tasks. Apple</w:t>
-      </w:r>
-    </w:p>
-    <w:p>
-      <w:pPr>
-        <w:spacing w:line="276" w:lineRule="auto"/>
-      </w:pPr>
-      <w:r>
-        <w:rPr>
-          <w:rFonts w:ascii="Arial" w:hAnsi="Arial"/>
-          <w:sz w:val="28"/>
-        </w:rPr>
-        <w:t xml:space="preserve">   Reminders is the free default; TickTick, Todoist, Things, and</w:t>
-      </w:r>
-    </w:p>
-    <w:p>
-      <w:pPr>
-        <w:spacing w:line="276" w:lineRule="auto"/>
-      </w:pPr>
-      <w:r>
-        <w:rPr>
-          <w:rFonts w:ascii="Arial" w:hAnsi="Arial"/>
-          <w:sz w:val="28"/>
-        </w:rPr>
-        <w:t xml:space="preserve">   Due exist because it is not enough. He opened Reminders: this</w:t>
-      </w:r>
-    </w:p>
-    <w:p>
-      <w:pPr>
-        <w:spacing w:line="276" w:lineRule="auto"/>
-      </w:pPr>
-      <w:r>
-        <w:rPr>
-          <w:rFonts w:ascii="Arial" w:hAnsi="Arial"/>
-          <w:sz w:val="28"/>
-        </w:rPr>
-        <w:t xml:space="preserve">   one does more, easier. No code.</w:t>
-      </w:r>
-    </w:p>
-    <w:p>
-      <w:pPr>
-        <w:spacing w:line="276" w:lineRule="auto"/>
-      </w:pPr>
-      <w:r>
-        <w:rPr>
-          <w:rFonts w:ascii="Arial" w:hAnsi="Arial"/>
-          <w:sz w:val="28"/>
-        </w:rPr>
-        <w:t xml:space="preserve">18. #46-new — selling description begun, publishing picture written.</w:t>
-      </w:r>
-    </w:p>
-    <w:p>
-      <w:pPr>
-        <w:spacing w:line="276" w:lineRule="auto"/>
-      </w:pPr>
-      <w:r>
-        <w:rPr>
-          <w:rFonts w:ascii="Arial" w:hAnsi="Arial"/>
-          <w:sz w:val="28"/>
-        </w:rPr>
-        <w:t xml:space="preserve">   The session dropped. The wrong-shelf comparables were corrected</w:t>
-      </w:r>
-    </w:p>
-    <w:p>
-      <w:pPr>
-        <w:spacing w:line="276" w:lineRule="auto"/>
-      </w:pPr>
-      <w:r>
-        <w:rPr>
-          <w:rFonts w:ascii="Arial" w:hAnsi="Arial"/>
-          <w:sz w:val="28"/>
-        </w:rPr>
-        <w:t xml:space="preserve">   at #47-new.</w:t>
-      </w:r>
-    </w:p>
-    <w:p>
-      <w:pPr>
-        <w:spacing w:line="276" w:lineRule="auto"/>
-      </w:pPr>
-      <w:r>
-        <w:rPr>
-          <w:rFonts w:ascii="Arial" w:hAnsi="Arial"/>
-          <w:sz w:val="28"/>
-        </w:rPr>
-        <w:t xml:space="preserve">19. App-Docs, 2026-08-31 — working documents stay in docs; history</w:t>
-      </w:r>
-    </w:p>
-    <w:p>
-      <w:pPr>
-        <w:spacing w:line="276" w:lineRule="auto"/>
-      </w:pPr>
-      <w:r>
-        <w:rPr>
-          <w:rFonts w:ascii="Arial" w:hAnsi="Arial"/>
-          <w:sz w:val="28"/>
-        </w:rPr>
-        <w:t xml:space="preserve">   and the eleven build sheets moved to docs-ref. Index tightened to</w:t>
-      </w:r>
-    </w:p>
-    <w:p>
-      <w:pPr>
-        <w:spacing w:line="276" w:lineRule="auto"/>
-      </w:pPr>
-      <w:r>
-        <w:rPr>
-          <w:rFonts w:ascii="Arial" w:hAnsi="Arial"/>
-          <w:sz w:val="28"/>
-        </w:rPr>
-        <w:t xml:space="preserve">   one line per file. Not a Memory chain session.</w:t>
-      </w:r>
-    </w:p>
-    <w:p>
-      <w:pPr>
-        <w:spacing w:line="276" w:lineRule="auto"/>
-      </w:pPr>
-      <w:r>
-        <w:rPr>
-          <w:rFonts w:ascii="Arial" w:hAnsi="Arial"/>
-          <w:sz w:val="28"/>
-        </w:rPr>
-        <w:t xml:space="preserve">20. #45-new — the two engine Fails from the sitting: Daily after Done</w:t>
-      </w:r>
-    </w:p>
-    <w:p>
-      <w:pPr>
-        <w:spacing w:line="276" w:lineRule="auto"/>
-      </w:pPr>
-      <w:r>
-        <w:rPr>
-          <w:rFonts w:ascii="Arial" w:hAnsi="Arial"/>
-          <w:sz w:val="28"/>
-        </w:rPr>
-        <w:t xml:space="preserve">   arms tomorrow, and a named zone moves a One Time's fire. 23 passed,</w:t>
-      </w:r>
-    </w:p>
-    <w:p>
-      <w:pPr>
-        <w:spacing w:line="276" w:lineRule="auto"/>
-      </w:pPr>
-      <w:r>
-        <w:rPr>
-          <w:rFonts w:ascii="Arial" w:hAnsi="Arial"/>
-          <w:sz w:val="28"/>
-        </w:rPr>
-        <w:t xml:space="preserve">   0 failed on the sim and on the phone. 460 tests. Reminder Engine</w:t>
-      </w:r>
-    </w:p>
-    <w:p>
-      <w:pPr>
-        <w:spacing w:line="276" w:lineRule="auto"/>
-      </w:pPr>
-      <w:r>
-        <w:rPr>
-          <w:rFonts w:ascii="Arial" w:hAnsi="Arial"/>
-          <w:sz w:val="28"/>
-        </w:rPr>
-        <w:t xml:space="preserve">   files not touched. The morning after, the automated load, the two</w:t>
-      </w:r>
-    </w:p>
-    <w:p>
-      <w:pPr>
-        <w:spacing w:line="276" w:lineRule="auto"/>
-      </w:pPr>
-      <w:r>
-        <w:rPr>
-          <w:rFonts w:ascii="Arial" w:hAnsi="Arial"/>
-          <w:sz w:val="28"/>
-        </w:rPr>
-        <w:t xml:space="preserve">   type-check nits, and the reminder pages stretch, marked done</w:t>
-      </w:r>
-    </w:p>
-    <w:p>
-      <w:pPr>
-        <w:spacing w:line="276" w:lineRule="auto"/>
-      </w:pPr>
-      <w:r>
-        <w:rPr>
-          <w:rFonts w:ascii="Arial" w:hAnsi="Arial"/>
-          <w:sz w:val="28"/>
-        </w:rPr>
-        <w:t xml:space="preserve">   (Patrick). A banner while Memory is on screen was silent; the app</w:t>
-      </w:r>
-    </w:p>
-    <w:p>
-      <w:pPr>
-        <w:spacing w:line="276" w:lineRule="auto"/>
-      </w:pPr>
-      <w:r>
-        <w:rPr>
-          <w:rFonts w:ascii="Arial" w:hAnsi="Arial"/>
-          <w:sz w:val="28"/>
-        </w:rPr>
-        <w:t xml:space="preserve">   now asks to show it, same as Timer. He will verify that in the code</w:t>
-      </w:r>
-    </w:p>
-    <w:p>
-      <w:pPr>
-        <w:spacing w:line="276" w:lineRule="auto"/>
-      </w:pPr>
-      <w:r>
-        <w:rPr>
-          <w:rFonts w:ascii="Arial" w:hAnsi="Arial"/>
-          <w:sz w:val="28"/>
-        </w:rPr>
-        <w:t xml:space="preserve">   without the test load. The four pieces, the screen, and the Home</w:t>
-      </w:r>
-    </w:p>
-    <w:p>
-      <w:pPr>
-        <w:spacing w:line="276" w:lineRule="auto"/>
-      </w:pPr>
-      <w:r>
-        <w:rPr>
-          <w:rFonts w:ascii="Arial" w:hAnsi="Arial"/>
-          <w:sz w:val="28"/>
-        </w:rPr>
-        <w:t xml:space="preserve">   tile came out of the app after that run.</w:t>
-      </w:r>
-    </w:p>
-    <w:p>
-      <w:pPr>
-        <w:spacing w:line="276" w:lineRule="auto"/>
-      </w:pPr>
-      <w:r>
-        <w:rPr>
-          <w:rFonts w:ascii="Arial" w:hAnsi="Arial"/>
-          <w:sz w:val="28"/>
-        </w:rPr>
-        <w:t xml:space="preserve">20. #44-new — the automated load built, and the simulator sitting</w:t>
-      </w:r>
-    </w:p>
-    <w:p>
-      <w:pPr>
-        <w:spacing w:line="276" w:lineRule="auto"/>
-      </w:pPr>
-      <w:r>
-        <w:rPr>
-          <w:rFonts w:ascii="Arial" w:hAnsi="Arial"/>
-          <w:sz w:val="28"/>
-        </w:rPr>
-        <w:t xml:space="preserve">   finished. Two engine Fails (Daily after Done, named zone) go to</w:t>
-      </w:r>
-    </w:p>
-    <w:p>
-      <w:pPr>
-        <w:spacing w:line="276" w:lineRule="auto"/>
-      </w:pPr>
-      <w:r>
-        <w:rPr>
-          <w:rFonts w:ascii="Arial" w:hAnsi="Arial"/>
-          <w:sz w:val="28"/>
-        </w:rPr>
-        <w:t xml:space="preserve">   #45-new. Reminder Engine files not touched. 459 tests. Two old</w:t>
-      </w:r>
-    </w:p>
-    <w:p>
-      <w:pPr>
-        <w:spacing w:line="276" w:lineRule="auto"/>
-      </w:pPr>
-      <w:r>
-        <w:rPr>
-          <w:rFonts w:ascii="Arial" w:hAnsi="Arial"/>
-          <w:sz w:val="28"/>
-        </w:rPr>
-        <w:t xml:space="preserve">   type-check nits left for later.</w:t>
-      </w:r>
-    </w:p>
-    <w:p>
-      <w:pPr>
-        <w:spacing w:line="276" w:lineRule="auto"/>
-      </w:pPr>
-      <w:r>
-        <w:rPr>
-          <w:rFonts w:ascii="Arial" w:hAnsi="Arial"/>
-          <w:sz w:val="28"/>
-        </w:rPr>
-        <w:t xml:space="preserve">21. #43-new — the automated-load job sheet and the sitting list.</w:t>
-      </w:r>
-    </w:p>
-    <w:p>
-      <w:pPr>
-        <w:spacing w:line="276" w:lineRule="auto"/>
-      </w:pPr>
-      <w:r>
-        <w:rPr>
-          <w:rFonts w:ascii="Arial" w:hAnsi="Arial"/>
-          <w:sz w:val="28"/>
-        </w:rPr>
-        <w:t xml:space="preserve">   Daily now rolls the list before it reads, and the list pages read</w:t>
-      </w:r>
-    </w:p>
-    <w:p>
-      <w:pPr>
-        <w:spacing w:line="276" w:lineRule="auto"/>
-      </w:pPr>
-      <w:r>
-        <w:rPr>
-          <w:rFonts w:ascii="Arial" w:hAnsi="Arial"/>
-          <w:sz w:val="28"/>
-        </w:rPr>
-        <w:t xml:space="preserve">   again when the app comes to the front. The load itself is not</w:t>
-      </w:r>
-    </w:p>
-    <w:p>
-      <w:pPr>
-        <w:spacing w:line="276" w:lineRule="auto"/>
-      </w:pPr>
-      <w:r>
-        <w:rPr>
-          <w:rFonts w:ascii="Arial" w:hAnsi="Arial"/>
-          <w:sz w:val="28"/>
-        </w:rPr>
-        <w:t xml:space="preserve">   built. Not on the phone.</w:t>
-      </w:r>
-    </w:p>
-    <w:p>
-      <w:pPr>
-        <w:spacing w:line="276" w:lineRule="auto"/>
-      </w:pPr>
-      <w:r>
-        <w:rPr>
-          <w:rFonts w:ascii="Arial" w:hAnsi="Arial"/>
-          <w:sz w:val="28"/>
-        </w:rPr>
-        <w:t xml:space="preserve">22. #42-new — the rest of Options into the engine. Calendar shading</w:t>
-      </w:r>
-    </w:p>
-    <w:p>
-      <w:pPr>
-        <w:spacing w:line="276" w:lineRule="auto"/>
-      </w:pPr>
-      <w:r>
-        <w:rPr>
-          <w:rFonts w:ascii="Arial" w:hAnsi="Arial"/>
-          <w:sz w:val="28"/>
-        </w:rPr>
-        <w:t xml:space="preserve">   from the engine, the Float row out, Extended New and Edit as name,</w:t>
-      </w:r>
-    </w:p>
-    <w:p>
-      <w:pPr>
-        <w:spacing w:line="276" w:lineRule="auto"/>
-      </w:pPr>
-      <w:r>
-        <w:rPr>
-          <w:rFonts w:ascii="Arial" w:hAnsi="Arial"/>
-          <w:sz w:val="28"/>
-        </w:rPr>
-        <w:t xml:space="preserve">   optional note and Done, Cancel with no change after + OPT, and</w:t>
-      </w:r>
-    </w:p>
-    <w:p>
-      <w:pPr>
-        <w:spacing w:line="276" w:lineRule="auto"/>
-      </w:pPr>
-      <w:r>
-        <w:rPr>
-          <w:rFonts w:ascii="Arial" w:hAnsi="Arial"/>
-          <w:sz w:val="28"/>
-        </w:rPr>
-        <w:t xml:space="preserve">   Daily's every-day and One Time for today as time zone only. A</w:t>
-      </w:r>
-    </w:p>
-    <w:p>
-      <w:pPr>
-        <w:spacing w:line="276" w:lineRule="auto"/>
-      </w:pPr>
-      <w:r>
-        <w:rPr>
-          <w:rFonts w:ascii="Arial" w:hAnsi="Arial"/>
-          <w:sz w:val="28"/>
-        </w:rPr>
-        <w:t xml:space="preserve">   weekday after a numbered day is the first occurrence after that</w:t>
-      </w:r>
-    </w:p>
-    <w:p>
-      <w:pPr>
-        <w:spacing w:line="276" w:lineRule="auto"/>
-      </w:pPr>
-      <w:r>
-        <w:rPr>
-          <w:rFonts w:ascii="Arial" w:hAnsi="Arial"/>
-          <w:sz w:val="28"/>
-        </w:rPr>
-        <w:t xml:space="preserve">   day only. The Timer is parked as a different effort. 459 tests.</w:t>
-      </w:r>
-    </w:p>
-    <w:p>
-      <w:pPr>
-        <w:spacing w:line="276" w:lineRule="auto"/>
-      </w:pPr>
-      <w:r>
-        <w:rPr>
-          <w:rFonts w:ascii="Arial" w:hAnsi="Arial"/>
-          <w:sz w:val="28"/>
-        </w:rPr>
-        <w:t xml:space="preserve">   Not on the phone.</w:t>
-      </w:r>
-    </w:p>
-    <w:p>
-      <w:pPr>
-        <w:spacing w:line="276" w:lineRule="auto"/>
-      </w:pPr>
-      <w:r>
-        <w:rPr>
-          <w:rFonts w:ascii="Arial" w:hAnsi="Arial"/>
-          <w:sz w:val="28"/>
-        </w:rPr>
         <w:t xml:space="preserve">23. #41-new — five Options answers, holidays, monthly patterns, and</w:t>
       </w:r>
     </w:p>
@@ -4098,6 +4074,42 @@
           <w:rFonts w:ascii="Arial" w:hAnsi="Arial"/>
           <w:sz w:val="28"/>
         </w:rPr>
+        <w:t xml:space="preserve">3. HELP A USER CHECK WHY A REMINDER IS NOT WORKING, and a</w:t>
+      </w:r>
+    </w:p>
+    <w:p>
+      <w:pPr>
+        <w:spacing w:line="276" w:lineRule="auto"/>
+      </w:pPr>
+      <w:r>
+        <w:rPr>
+          <w:rFonts w:ascii="Arial" w:hAnsi="Arial"/>
+          <w:sz w:val="28"/>
+        </w:rPr>
+        <w:t xml:space="preserve">   background task that is not a check (Patrick, #67-new). Not</w:t>
+      </w:r>
+    </w:p>
+    <w:p>
+      <w:pPr>
+        <w:spacing w:line="276" w:lineRule="auto"/>
+      </w:pPr>
+      <w:r>
+        <w:rPr>
+          <w:rFonts w:ascii="Arial" w:hAnsi="Arial"/>
+          <w:sz w:val="28"/>
+        </w:rPr>
+        <w:t xml:space="preserve">   being done now. Do not raise in reports.</w:t>
+      </w:r>
+    </w:p>
+    <w:p>
+      <w:pPr>
+        <w:spacing w:line="276" w:lineRule="auto"/>
+      </w:pPr>
+      <w:r>
+        <w:rPr>
+          <w:rFonts w:ascii="Arial" w:hAnsi="Arial"/>
+          <w:sz w:val="28"/>
+        </w:rPr>
         <w:t xml:space="preserve"/>
       </w:r>
     </w:p>
@@ -4110,6 +4122,102 @@
           <w:rFonts w:ascii="Arial" w:hAnsi="Arial"/>
           <w:sz w:val="28"/>
         </w:rPr>
+        <w:t xml:space="preserve">   The run record on Scheduled Reminders. The last run is already</w:t>
+      </w:r>
+    </w:p>
+    <w:p>
+      <w:pPr>
+        <w:spacing w:line="276" w:lineRule="auto"/>
+      </w:pPr>
+      <w:r>
+        <w:rPr>
+          <w:rFonts w:ascii="Arial" w:hAnsi="Arial"/>
+          <w:sz w:val="28"/>
+        </w:rPr>
+        <w:t xml:space="preserve">   written down, and a failure already speaks in the opening</w:t>
+      </w:r>
+    </w:p>
+    <w:p>
+      <w:pPr>
+        <w:spacing w:line="276" w:lineRule="auto"/>
+      </w:pPr>
+      <w:r>
+        <w:rPr>
+          <w:rFonts w:ascii="Arial" w:hAnsi="Arial"/>
+          <w:sz w:val="28"/>
+        </w:rPr>
+        <w:t xml:space="preserve">   pop-up. That pop-up can be tapped away, and it only talks</w:t>
+      </w:r>
+    </w:p>
+    <w:p>
+      <w:pPr>
+        <w:spacing w:line="276" w:lineRule="auto"/>
+      </w:pPr>
+      <w:r>
+        <w:rPr>
+          <w:rFonts w:ascii="Arial" w:hAnsi="Arial"/>
+          <w:sz w:val="28"/>
+        </w:rPr>
+        <w:t xml:space="preserve">   about the newest run. Scheduled Reminders only shows what the</w:t>
+      </w:r>
+    </w:p>
+    <w:p>
+      <w:pPr>
+        <w:spacing w:line="276" w:lineRule="auto"/>
+      </w:pPr>
+      <w:r>
+        <w:rPr>
+          <w:rFonts w:ascii="Arial" w:hAnsi="Arial"/>
+          <w:sz w:val="28"/>
+        </w:rPr>
+        <w:t xml:space="preserve">   phone is holding now. This would put the record on that screen</w:t>
+      </w:r>
+    </w:p>
+    <w:p>
+      <w:pPr>
+        <w:spacing w:line="276" w:lineRule="auto"/>
+      </w:pPr>
+      <w:r>
+        <w:rPr>
+          <w:rFonts w:ascii="Arial" w:hAnsi="Arial"/>
+          <w:sz w:val="28"/>
+        </w:rPr>
+        <w:t xml:space="preserve">   so you can look later at whether the last run went well or</w:t>
+      </w:r>
+    </w:p>
+    <w:p>
+      <w:pPr>
+        <w:spacing w:line="276" w:lineRule="auto"/>
+      </w:pPr>
+      <w:r>
+        <w:rPr>
+          <w:rFonts w:ascii="Arial" w:hAnsi="Arial"/>
+          <w:sz w:val="28"/>
+        </w:rPr>
+        <w:t xml:space="preserve">   failed, including the quieter faults the pop-up never raises.</w:t>
+      </w:r>
+    </w:p>
+    <w:p>
+      <w:pPr>
+        <w:spacing w:line="276" w:lineRule="auto"/>
+      </w:pPr>
+      <w:r>
+        <w:rPr>
+          <w:rFonts w:ascii="Arial" w:hAnsi="Arial"/>
+          <w:sz w:val="28"/>
+        </w:rPr>
+        <w:t xml:space="preserve">   Held back at #15-new and never built.</w:t>
+      </w:r>
+    </w:p>
+    <w:p>
+      <w:pPr>
+        <w:spacing w:line="276" w:lineRule="auto"/>
+      </w:pPr>
+      <w:r>
+        <w:rPr>
+          <w:rFonts w:ascii="Arial" w:hAnsi="Arial"/>
+          <w:sz w:val="28"/>
+        </w:rPr>
         <w:t xml:space="preserve"/>
       </w:r>
     </w:p>
@@ -4120,6 +4228,198 @@
       <w:r>
         <w:rPr>
           <w:rFonts w:ascii="Arial" w:hAnsi="Arial"/>
+          <w:sz w:val="28"/>
+        </w:rPr>
+        <w:t xml:space="preserve">   Check My Reminders. The pop-up knows when the app itself</w:t>
+      </w:r>
+    </w:p>
+    <w:p>
+      <w:pPr>
+        <w:spacing w:line="276" w:lineRule="auto"/>
+      </w:pPr>
+      <w:r>
+        <w:rPr>
+          <w:rFonts w:ascii="Arial" w:hAnsi="Arial"/>
+          <w:sz w:val="28"/>
+        </w:rPr>
+        <w:t xml:space="preserve">   failed, or when permission is off. It does not know why a</w:t>
+      </w:r>
+    </w:p>
+    <w:p>
+      <w:pPr>
+        <w:spacing w:line="276" w:lineRule="auto"/>
+      </w:pPr>
+      <w:r>
+        <w:rPr>
+          <w:rFonts w:ascii="Arial" w:hAnsi="Arial"/>
+          <w:sz w:val="28"/>
+        </w:rPr>
+        <w:t xml:space="preserve">   banner still never appeared: permission granted quietly,</w:t>
+      </w:r>
+    </w:p>
+    <w:p>
+      <w:pPr>
+        <w:spacing w:line="276" w:lineRule="auto"/>
+      </w:pPr>
+      <w:r>
+        <w:rPr>
+          <w:rFonts w:ascii="Arial" w:hAnsi="Arial"/>
+          <w:sz w:val="28"/>
+        </w:rPr>
+        <w:t xml:space="preserve">   alerts or sound or the lock screen off, Focus, a scheduled</w:t>
+      </w:r>
+    </w:p>
+    <w:p>
+      <w:pPr>
+        <w:spacing w:line="276" w:lineRule="auto"/>
+      </w:pPr>
+      <w:r>
+        <w:rPr>
+          <w:rFonts w:ascii="Arial" w:hAnsi="Arial"/>
+          <w:sz w:val="28"/>
+        </w:rPr>
+        <w:t xml:space="preserve">   summary. A Settings row you tap on purpose: it checks those</w:t>
+      </w:r>
+    </w:p>
+    <w:p>
+      <w:pPr>
+        <w:spacing w:line="276" w:lineRule="auto"/>
+      </w:pPr>
+      <w:r>
+        <w:rPr>
+          <w:rFonts w:ascii="Arial" w:hAnsi="Arial"/>
+          <w:sz w:val="28"/>
+        </w:rPr>
+        <w:t xml:space="preserve">   things, and it can send one test reminder so you can see</w:t>
+      </w:r>
+    </w:p>
+    <w:p>
+      <w:pPr>
+        <w:spacing w:line="276" w:lineRule="auto"/>
+      </w:pPr>
+      <w:r>
+        <w:rPr>
+          <w:rFonts w:ascii="Arial" w:hAnsi="Arial"/>
+          <w:sz w:val="28"/>
+        </w:rPr>
+        <w:t xml:space="preserve">   whether the phone will actually speak. Never built.</w:t>
+      </w:r>
+    </w:p>
+    <w:p>
+      <w:pPr>
+        <w:spacing w:line="276" w:lineRule="auto"/>
+      </w:pPr>
+      <w:r>
+        <w:rPr>
+          <w:rFonts w:ascii="Arial" w:hAnsi="Arial"/>
+          <w:sz w:val="28"/>
+        </w:rPr>
+        <w:t xml:space="preserve"/>
+      </w:r>
+    </w:p>
+    <w:p>
+      <w:pPr>
+        <w:spacing w:line="276" w:lineRule="auto"/>
+      </w:pPr>
+      <w:r>
+        <w:rPr>
+          <w:rFonts w:ascii="Arial" w:hAnsi="Arial"/>
+          <w:sz w:val="28"/>
+        </w:rPr>
+        <w:t xml:space="preserve">   A background task to top the queue. This is not a check. It</w:t>
+      </w:r>
+    </w:p>
+    <w:p>
+      <w:pPr>
+        <w:spacing w:line="276" w:lineRule="auto"/>
+      </w:pPr>
+      <w:r>
+        <w:rPr>
+          <w:rFonts w:ascii="Arial" w:hAnsi="Arial"/>
+          <w:sz w:val="28"/>
+        </w:rPr>
+        <w:t xml:space="preserve">   tries to keep the queue topped up on days the app is not</w:t>
+      </w:r>
+    </w:p>
+    <w:p>
+      <w:pPr>
+        <w:spacing w:line="276" w:lineRule="auto"/>
+      </w:pPr>
+      <w:r>
+        <w:rPr>
+          <w:rFonts w:ascii="Arial" w:hAnsi="Arial"/>
+          <w:sz w:val="28"/>
+        </w:rPr>
+        <w:t xml:space="preserve">   opened. It does not explain a silence. None of it is</w:t>
+      </w:r>
+    </w:p>
+    <w:p>
+      <w:pPr>
+        <w:spacing w:line="276" w:lineRule="auto"/>
+      </w:pPr>
+      <w:r>
+        <w:rPr>
+          <w:rFonts w:ascii="Arial" w:hAnsi="Arial"/>
+          <w:sz w:val="28"/>
+        </w:rPr>
+        <w:t xml:space="preserve">   installed. The phone gives it least to an unused app, and none</w:t>
+      </w:r>
+    </w:p>
+    <w:p>
+      <w:pPr>
+        <w:spacing w:line="276" w:lineRule="auto"/>
+      </w:pPr>
+      <w:r>
+        <w:rPr>
+          <w:rFonts w:ascii="Arial" w:hAnsi="Arial"/>
+          <w:sz w:val="28"/>
+        </w:rPr>
+        <w:t xml:space="preserve">   if the app has been swiped away, so it can only ever sit on</w:t>
+      </w:r>
+    </w:p>
+    <w:p>
+      <w:pPr>
+        <w:spacing w:line="276" w:lineRule="auto"/>
+      </w:pPr>
+      <w:r>
+        <w:rPr>
+          <w:rFonts w:ascii="Arial" w:hAnsi="Arial"/>
+          <w:sz w:val="28"/>
+        </w:rPr>
+        <w:t xml:space="preserve">   top of arming ahead, never underneath.</w:t>
+      </w:r>
+    </w:p>
+    <w:p>
+      <w:pPr>
+        <w:spacing w:line="276" w:lineRule="auto"/>
+      </w:pPr>
+      <w:r>
+        <w:rPr>
+          <w:rFonts w:ascii="Arial" w:hAnsi="Arial"/>
+          <w:sz w:val="28"/>
+        </w:rPr>
+        <w:t xml:space="preserve"/>
+      </w:r>
+    </w:p>
+    <w:p>
+      <w:pPr>
+        <w:spacing w:line="276" w:lineRule="auto"/>
+      </w:pPr>
+      <w:r>
+        <w:rPr>
+          <w:rFonts w:ascii="Arial" w:hAnsi="Arial"/>
+          <w:sz w:val="28"/>
+        </w:rPr>
+        <w:t xml:space="preserve"/>
+      </w:r>
+    </w:p>
+    <w:p>
+      <w:pPr>
+        <w:spacing w:line="276" w:lineRule="auto"/>
+      </w:pPr>
+      <w:r>
+        <w:rPr>
+          <w:rFonts w:ascii="Arial" w:hAnsi="Arial"/>
           <w:b/>
           <w:sz w:val="28"/>
         </w:rPr>
@@ -4171,79 +4471,7 @@
           <w:rFonts w:ascii="Arial" w:hAnsi="Arial"/>
           <w:sz w:val="28"/>
         </w:rPr>
-        <w:t xml:space="preserve">2. THE TIMER is a different effort (Patrick, #42-new), not this</w:t>
-      </w:r>
-    </w:p>
-    <w:p>
-      <w:pPr>
-        <w:spacing w:line="276" w:lineRule="auto"/>
-      </w:pPr>
-      <w:r>
-        <w:rPr>
-          <w:rFonts w:ascii="Arial" w:hAnsi="Arial"/>
-          <w:sz w:val="28"/>
-        </w:rPr>
-        <w:t xml:space="preserve">   reminder stretch. It takes Stop (Pause) / Continue (Go) on the</w:t>
-      </w:r>
-    </w:p>
-    <w:p>
-      <w:pPr>
-        <w:spacing w:line="276" w:lineRule="auto"/>
-      </w:pPr>
-      <w:r>
-        <w:rPr>
-          <w:rFonts w:ascii="Arial" w:hAnsi="Arial"/>
-          <w:sz w:val="28"/>
-        </w:rPr>
-        <w:t xml:space="preserve">   tile, a log, the Timer not working right, the loud alarm that</w:t>
-      </w:r>
-    </w:p>
-    <w:p>
-      <w:pPr>
-        <w:spacing w:line="276" w:lineRule="auto"/>
-      </w:pPr>
-      <w:r>
-        <w:rPr>
-          <w:rFonts w:ascii="Arial" w:hAnsi="Arial"/>
-          <w:sz w:val="28"/>
-        </w:rPr>
-        <w:t xml:space="preserve">   was meant to follow five minutes later, and making Loud alert</w:t>
-      </w:r>
-    </w:p>
-    <w:p>
-      <w:pPr>
-        <w:spacing w:line="276" w:lineRule="auto"/>
-      </w:pPr>
-      <w:r>
-        <w:rPr>
-          <w:rFonts w:ascii="Arial" w:hAnsi="Arial"/>
-          <w:sz w:val="28"/>
-        </w:rPr>
-        <w:t xml:space="preserve">   actually louder (a custom sound and special Apple permission).</w:t>
-      </w:r>
-    </w:p>
-    <w:p>
-      <w:pPr>
-        <w:spacing w:line="276" w:lineRule="auto"/>
-      </w:pPr>
-      <w:r>
-        <w:rPr>
-          <w:rFonts w:ascii="Arial" w:hAnsi="Arial"/>
-          <w:sz w:val="28"/>
-        </w:rPr>
-        <w:t xml:space="preserve">   Revisit only as its own work.</w:t>
-      </w:r>
-    </w:p>
-    <w:p>
-      <w:pPr>
-        <w:spacing w:line="276" w:lineRule="auto"/>
-      </w:pPr>
-      <w:r>
-        <w:rPr>
-          <w:rFonts w:ascii="Arial" w:hAnsi="Arial"/>
-          <w:sz w:val="28"/>
-        </w:rPr>
-        <w:t xml:space="preserve">3. Backup "Merge" option — BACK-MOST BURNER (#67): you are 90% sure</w:t>
+        <w:t xml:space="preserve">2. Backup "Merge" option — BACK-MOST BURNER (#67): you are 90% sure</w:t>
       </w:r>
     </w:p>
     <w:p>
@@ -4291,7 +4519,7 @@
           <w:rFonts w:ascii="Arial" w:hAnsi="Arial"/>
           <w:sz w:val="28"/>
         </w:rPr>
-        <w:t xml:space="preserve">4. Import files/documents into the Vault — PARKED (#69). The idea</w:t>
+        <w:t xml:space="preserve">3. Import files/documents into the Vault — PARKED (#69). The idea</w:t>
       </w:r>
     </w:p>
     <w:p>
@@ -4351,7 +4579,7 @@
           <w:rFonts w:ascii="Arial" w:hAnsi="Arial"/>
           <w:sz w:val="28"/>
         </w:rPr>
-        <w:t xml:space="preserve">5. The Android icon pictures and the splash (startup) image still</w:t>
+        <w:t xml:space="preserve">4. The Android icon pictures and the splash (startup) image still</w:t>
       </w:r>
     </w:p>
     <w:p>

</xml_diff>

<commit_message>
69-new - Memory Scrub per build-sheet-cleanup done.
</commit_message>
<xml_diff>
--- a/docs/pending.docx
+++ b/docs/pending.docx
@@ -24,7 +24,7 @@
           <w:rFonts w:ascii="Arial" w:hAnsi="Arial"/>
           <w:sz w:val="28"/>
         </w:rPr>
-        <w:t xml:space="preserve">Last updated: 2026-09-03 (#67-new)</w:t>
+        <w:t xml:space="preserve">Last updated: 2026-09-04 (#69-new)</w:t>
       </w:r>
     </w:p>
     <w:p>
@@ -253,31 +253,19 @@
           <w:rFonts w:ascii="Arial" w:hAnsi="Arial"/>
           <w:sz w:val="28"/>
         </w:rPr>
-        <w:t xml:space="preserve">PHONE LOAD. The name scrub is finished (#61-new through #65-new).</w:t>
-      </w:r>
-    </w:p>
-    <w:p>
-      <w:pPr>
-        <w:spacing w:line="276" w:lineRule="auto"/>
-      </w:pPr>
-      <w:r>
-        <w:rPr>
-          <w:rFonts w:ascii="Arial" w:hAnsi="Arial"/>
-          <w:sz w:val="28"/>
-        </w:rPr>
-        <w:t xml:space="preserve">Nothing is missing before an EAS build and a phone load</w:t>
-      </w:r>
-    </w:p>
-    <w:p>
-      <w:pPr>
-        <w:spacing w:line="276" w:lineRule="auto"/>
-      </w:pPr>
-      <w:r>
-        <w:rPr>
-          <w:rFonts w:ascii="Arial" w:hAnsi="Arial"/>
-          <w:sz w:val="28"/>
-        </w:rPr>
-        <w:t xml:space="preserve">(Patrick, #67-new). Paperwork is Pending 2–5.</w:t>
+        <w:t xml:space="preserve">PHONE LOAD. The leftover cleanup is built (#69-new) and not on the</w:t>
+      </w:r>
+    </w:p>
+    <w:p>
+      <w:pPr>
+        <w:spacing w:line="276" w:lineRule="auto"/>
+      </w:pPr>
+      <w:r>
+        <w:rPr>
+          <w:rFonts w:ascii="Arial" w:hAnsi="Arial"/>
+          <w:sz w:val="28"/>
+        </w:rPr>
+        <w:t xml:space="preserve">phone yet. Last load is #67-new. Paperwork is Pending 2–5.</w:t>
       </w:r>
     </w:p>
     <w:p>
@@ -362,199 +350,55 @@
           <w:rFonts w:ascii="Arial" w:hAnsi="Arial"/>
           <w:sz w:val="28"/>
         </w:rPr>
-        <w:t xml:space="preserve">1. EVERYTHING BUILT SINCE THE LAST PHONE LOAD. Last load is the Sit</w:t>
-      </w:r>
-    </w:p>
-    <w:p>
-      <w:pPr>
-        <w:spacing w:line="276" w:lineRule="auto"/>
-      </w:pPr>
-      <w:r>
-        <w:rPr>
-          <w:rFonts w:ascii="Arial" w:hAnsi="Arial"/>
-          <w:sz w:val="28"/>
-        </w:rPr>
-        <w:t xml:space="preserve">   load with landscape (#52-new): 90° counter-clockwise, headers on</w:t>
-      </w:r>
-    </w:p>
-    <w:p>
-      <w:pPr>
-        <w:spacing w:line="276" w:lineRule="auto"/>
-      </w:pPr>
-      <w:r>
-        <w:rPr>
-          <w:rFonts w:ascii="Arial" w:hAnsi="Arial"/>
-          <w:sz w:val="28"/>
-        </w:rPr>
-        <w:t xml:space="preserve">   the left. He exported his real list first. Calendar and landscape</w:t>
-      </w:r>
-    </w:p>
-    <w:p>
-      <w:pPr>
-        <w:spacing w:line="276" w:lineRule="auto"/>
-      </w:pPr>
-      <w:r>
-        <w:rPr>
-          <w:rFonts w:ascii="Arial" w:hAnsi="Arial"/>
-          <w:sz w:val="28"/>
-        </w:rPr>
-        <w:t xml:space="preserve">   are on the phone. Built since then and not on the phone: the miss</w:t>
-      </w:r>
-    </w:p>
-    <w:p>
-      <w:pPr>
-        <w:spacing w:line="276" w:lineRule="auto"/>
-      </w:pPr>
-      <w:r>
-        <w:rPr>
-          <w:rFonts w:ascii="Arial" w:hAnsi="Arial"/>
-          <w:sz w:val="28"/>
-        </w:rPr>
-        <w:t xml:space="preserve">   notice for Weekly, Monthly, Quarterly, Yearly, and One Time</w:t>
-      </w:r>
-    </w:p>
-    <w:p>
-      <w:pPr>
-        <w:spacing w:line="276" w:lineRule="auto"/>
-      </w:pPr>
-      <w:r>
-        <w:rPr>
-          <w:rFonts w:ascii="Arial" w:hAnsi="Arial"/>
-          <w:sz w:val="28"/>
-        </w:rPr>
-        <w:t xml:space="preserve">   (#55-new, committed); Appointments and Bucket List on every live</w:t>
-      </w:r>
-    </w:p>
-    <w:p>
-      <w:pPr>
-        <w:spacing w:line="276" w:lineRule="auto"/>
-      </w:pPr>
-      <w:r>
-        <w:rPr>
-          <w:rFonts w:ascii="Arial" w:hAnsi="Arial"/>
-          <w:sz w:val="28"/>
-        </w:rPr>
-        <w:t xml:space="preserve">   screen (#56-new); a failed daily clear-out now spoken in the</w:t>
-      </w:r>
-    </w:p>
-    <w:p>
-      <w:pPr>
-        <w:spacing w:line="276" w:lineRule="auto"/>
-      </w:pPr>
-      <w:r>
-        <w:rPr>
-          <w:rFonts w:ascii="Arial" w:hAnsi="Arial"/>
-          <w:sz w:val="28"/>
-        </w:rPr>
-        <w:t xml:space="preserve">   opening pop-up (#56-new, Pending 2); the Where? helper from Home</w:t>
-      </w:r>
-    </w:p>
-    <w:p>
-      <w:pPr>
-        <w:spacing w:line="276" w:lineRule="auto"/>
-      </w:pPr>
-      <w:r>
-        <w:rPr>
-          <w:rFonts w:ascii="Arial" w:hAnsi="Arial"/>
-          <w:sz w:val="28"/>
-        </w:rPr>
-        <w:t xml:space="preserve">   and the calendar month (#58-new); all of #59-new — calendar day-list</w:t>
-      </w:r>
-    </w:p>
-    <w:p>
-      <w:pPr>
-        <w:spacing w:line="276" w:lineRule="auto"/>
-      </w:pPr>
-      <w:r>
-        <w:rPr>
-          <w:rFonts w:ascii="Arial" w:hAnsi="Arial"/>
-          <w:sz w:val="28"/>
-        </w:rPr>
-        <w:t xml:space="preserve">   fire time, date picker off for weekday patterns and One Time for</w:t>
-      </w:r>
-    </w:p>
-    <w:p>
-      <w:pPr>
-        <w:spacing w:line="276" w:lineRule="auto"/>
-      </w:pPr>
-      <w:r>
-        <w:rPr>
-          <w:rFonts w:ascii="Arial" w:hAnsi="Arial"/>
-          <w:sz w:val="28"/>
-        </w:rPr>
-        <w:t xml:space="preserve">   today, Daily every-day with no clock until Set time, AM/PM check on</w:t>
-      </w:r>
-    </w:p>
-    <w:p>
-      <w:pPr>
-        <w:spacing w:line="276" w:lineRule="auto"/>
-      </w:pPr>
-      <w:r>
-        <w:rPr>
-          <w:rFonts w:ascii="Arial" w:hAnsi="Arial"/>
-          <w:sz w:val="28"/>
-        </w:rPr>
-        <w:t xml:space="preserve">   Save (skipped when time set on 24-hour picker); current notification</w:t>
-      </w:r>
-    </w:p>
-    <w:p>
-      <w:pPr>
-        <w:spacing w:line="276" w:lineRule="auto"/>
-      </w:pPr>
-      <w:r>
-        <w:rPr>
-          <w:rFonts w:ascii="Arial" w:hAnsi="Arial"/>
-          <w:sz w:val="28"/>
-        </w:rPr>
-        <w:t xml:space="preserve">   names through the live road (#62-new); every page log under the</w:t>
-      </w:r>
-    </w:p>
-    <w:p>
-      <w:pPr>
-        <w:spacing w:line="276" w:lineRule="auto"/>
-      </w:pPr>
-      <w:r>
-        <w:rPr>
-          <w:rFonts w:ascii="Arial" w:hAnsi="Arial"/>
-          <w:sz w:val="28"/>
-        </w:rPr>
-        <w:t xml:space="preserve">   current page name (#63-new); Siri says Daily and Remember, and the</w:t>
-      </w:r>
-    </w:p>
-    <w:p>
-      <w:pPr>
-        <w:spacing w:line="276" w:lineRule="auto"/>
-      </w:pPr>
-      <w:r>
-        <w:rPr>
-          <w:rFonts w:ascii="Arial" w:hAnsi="Arial"/>
-          <w:sz w:val="28"/>
-        </w:rPr>
-        <w:t xml:space="preserve">   open-app leftover is out (#64-new); saved kinds and routes are</w:t>
-      </w:r>
-    </w:p>
-    <w:p>
-      <w:pPr>
-        <w:spacing w:line="276" w:lineRule="auto"/>
-      </w:pPr>
-      <w:r>
-        <w:rPr>
-          <w:rFonts w:ascii="Arial" w:hAnsi="Arial"/>
-          <w:sz w:val="28"/>
-        </w:rPr>
-        <w:t xml:space="preserve">   appointments and bucketlist (#65-new). Those later refinements do not</w:t>
-      </w:r>
-    </w:p>
-    <w:p>
-      <w:pPr>
-        <w:spacing w:line="276" w:lineRule="auto"/>
-      </w:pPr>
-      <w:r>
-        <w:rPr>
-          <w:rFonts w:ascii="Arial" w:hAnsi="Arial"/>
-          <w:sz w:val="28"/>
-        </w:rPr>
-        <w:t xml:space="preserve">   reset the replacement pages' phone proof.</w:t>
+        <w:t xml:space="preserve">1. EVERYTHING BUILT SINCE THE LAST PHONE LOAD. Last load is #67-new.</w:t>
+      </w:r>
+    </w:p>
+    <w:p>
+      <w:pPr>
+        <w:spacing w:line="276" w:lineRule="auto"/>
+      </w:pPr>
+      <w:r>
+        <w:rPr>
+          <w:rFonts w:ascii="Arial" w:hAnsi="Arial"/>
+          <w:sz w:val="28"/>
+        </w:rPr>
+        <w:t xml:space="preserve">   Landscape 90° counter-clockwise, headers on the left. Calendar and</w:t>
+      </w:r>
+    </w:p>
+    <w:p>
+      <w:pPr>
+        <w:spacing w:line="276" w:lineRule="auto"/>
+      </w:pPr>
+      <w:r>
+        <w:rPr>
+          <w:rFonts w:ascii="Arial" w:hAnsi="Arial"/>
+          <w:sz w:val="28"/>
+        </w:rPr>
+        <w:t xml:space="preserve">   landscape are on the phone. He has not exhaustively tested it; what</w:t>
+      </w:r>
+    </w:p>
+    <w:p>
+      <w:pPr>
+        <w:spacing w:line="276" w:lineRule="auto"/>
+      </w:pPr>
+      <w:r>
+        <w:rPr>
+          <w:rFonts w:ascii="Arial" w:hAnsi="Arial"/>
+          <w:sz w:val="28"/>
+        </w:rPr>
+        <w:t xml:space="preserve">   he has used is working. Built since then and not on the phone: the</w:t>
+      </w:r>
+    </w:p>
+    <w:p>
+      <w:pPr>
+        <w:spacing w:line="276" w:lineRule="auto"/>
+      </w:pPr>
+      <w:r>
+        <w:rPr>
+          <w:rFonts w:ascii="Arial" w:hAnsi="Arial"/>
+          <w:sz w:val="28"/>
+        </w:rPr>
+        <w:t xml:space="preserve">   leftover cleanup (#69-new).</w:t>
       </w:r>
     </w:p>
     <w:p>
@@ -1588,7 +1432,55 @@
           <w:rFonts w:ascii="Arial" w:hAnsi="Arial"/>
           <w:sz w:val="28"/>
         </w:rPr>
-        <w:t xml:space="preserve">1. #67-new — nothing missing before an EAS phone load. The three</w:t>
+        <w:t xml:space="preserve">1. #69-new — leftover cleanup built. Dead exports, leftover theme</w:t>
+      </w:r>
+    </w:p>
+    <w:p>
+      <w:pPr>
+        <w:spacing w:line="276" w:lineRule="auto"/>
+      </w:pPr>
+      <w:r>
+        <w:rPr>
+          <w:rFonts w:ascii="Arial" w:hAnsi="Arial"/>
+          <w:sz w:val="28"/>
+        </w:rPr>
+        <w:t xml:space="preserve">   tokens, leftover page words in test titles. Mac 298. TypeScript</w:t>
+      </w:r>
+    </w:p>
+    <w:p>
+      <w:pPr>
+        <w:spacing w:line="276" w:lineRule="auto"/>
+      </w:pPr>
+      <w:r>
+        <w:rPr>
+          <w:rFonts w:ascii="Arial" w:hAnsi="Arial"/>
+          <w:sz w:val="28"/>
+        </w:rPr>
+        <w:t xml:space="preserve">   clean. Nothing about how reminders fire changed.</w:t>
+      </w:r>
+    </w:p>
+    <w:p>
+      <w:pPr>
+        <w:spacing w:line="276" w:lineRule="auto"/>
+      </w:pPr>
+      <w:r>
+        <w:rPr>
+          <w:rFonts w:ascii="Arial" w:hAnsi="Arial"/>
+          <w:sz w:val="28"/>
+        </w:rPr>
+        <w:t xml:space="preserve">2. #68-new — leftover cleanup sheet written. No code. Committed.</w:t>
+      </w:r>
+    </w:p>
+    <w:p>
+      <w:pPr>
+        <w:spacing w:line="276" w:lineRule="auto"/>
+      </w:pPr>
+      <w:r>
+        <w:rPr>
+          <w:rFonts w:ascii="Arial" w:hAnsi="Arial"/>
+          <w:sz w:val="28"/>
+        </w:rPr>
+        <w:t xml:space="preserve">3. #67-new — nothing missing before an EAS phone load. The three</w:t>
       </w:r>
     </w:p>
     <w:p>
@@ -1612,7 +1504,7 @@
           <w:rFonts w:ascii="Arial" w:hAnsi="Arial"/>
           <w:sz w:val="28"/>
         </w:rPr>
-        <w:t xml:space="preserve">   reports. Patrick will commit.</w:t>
+        <w:t xml:space="preserve">   reports. Committed.</w:t>
       </w:r>
     </w:p>
     <w:p>

</xml_diff>

<commit_message>
70-new Memory add Whispr Flow & bus found & new features.
</commit_message>
<xml_diff>
--- a/docs/pending.docx
+++ b/docs/pending.docx
@@ -24,7 +24,7 @@
           <w:rFonts w:ascii="Arial" w:hAnsi="Arial"/>
           <w:sz w:val="28"/>
         </w:rPr>
-        <w:t xml:space="preserve">Last updated: 2026-09-04 (#69-new)</w:t>
+        <w:t xml:space="preserve">Last updated: 2026-09-05 (#70-new close)</w:t>
       </w:r>
     </w:p>
     <w:p>
@@ -253,19 +253,55 @@
           <w:rFonts w:ascii="Arial" w:hAnsi="Arial"/>
           <w:sz w:val="28"/>
         </w:rPr>
-        <w:t xml:space="preserve">PHONE LOAD. The leftover cleanup is built (#69-new) and not on the</w:t>
-      </w:r>
-    </w:p>
-    <w:p>
-      <w:pPr>
-        <w:spacing w:line="276" w:lineRule="auto"/>
-      </w:pPr>
-      <w:r>
-        <w:rPr>
-          <w:rFonts w:ascii="Arial" w:hAnsi="Arial"/>
-          <w:sz w:val="28"/>
-        </w:rPr>
-        <w:t xml:space="preserve">phone yet. Last load is #67-new. Paperwork is Pending 2–5.</w:t>
+        <w:t xml:space="preserve">GROK REVIEW FIXES. Phase 1 is three definite fixes (quarterly month,</w:t>
+      </w:r>
+    </w:p>
+    <w:p>
+      <w:pPr>
+        <w:spacing w:line="276" w:lineRule="auto"/>
+      </w:pPr>
+      <w:r>
+        <w:rPr>
+          <w:rFonts w:ascii="Arial" w:hAnsi="Arial"/>
+          <w:sz w:val="28"/>
+        </w:rPr>
+        <w:t xml:space="preserve">Reset All Data banners, banner cold-launch dedupe). Phase 2 is one</w:t>
+      </w:r>
+    </w:p>
+    <w:p>
+      <w:pPr>
+        <w:spacing w:line="276" w:lineRule="auto"/>
+      </w:pPr>
+      <w:r>
+        <w:rPr>
+          <w:rFonts w:ascii="Arial" w:hAnsi="Arial"/>
+          <w:sz w:val="28"/>
+        </w:rPr>
+        <w:t xml:space="preserve">apply-then-schedule door (build sheet first). Phase 3 is UI aligned</w:t>
+      </w:r>
+    </w:p>
+    <w:p>
+      <w:pPr>
+        <w:spacing w:line="276" w:lineRule="auto"/>
+      </w:pPr>
+      <w:r>
+        <w:rPr>
+          <w:rFonts w:ascii="Arial" w:hAnsi="Arial"/>
+          <w:sz w:val="28"/>
+        </w:rPr>
+        <w:t xml:space="preserve">with the translator. BIRTHDAYS PAGE — build sheet first, then build;</w:t>
+      </w:r>
+    </w:p>
+    <w:p>
+      <w:pPr>
+        <w:spacing w:line="276" w:lineRule="auto"/>
+      </w:pPr>
+      <w:r>
+        <w:rPr>
+          <w:rFonts w:ascii="Arial" w:hAnsi="Arial"/>
+          <w:sz w:val="28"/>
+        </w:rPr>
+        <w:t xml:space="preserve">name, date, yearly reminder. See handoff.</w:t>
       </w:r>
     </w:p>
     <w:p>
@@ -289,6 +325,30 @@
           <w:rFonts w:ascii="Arial" w:hAnsi="Arial"/>
           <w:sz w:val="28"/>
         </w:rPr>
+        <w:t xml:space="preserve">PHONE LOAD. #69-new is committed and not on the phone yet. Last load</w:t>
+      </w:r>
+    </w:p>
+    <w:p>
+      <w:pPr>
+        <w:spacing w:line="276" w:lineRule="auto"/>
+      </w:pPr>
+      <w:r>
+        <w:rPr>
+          <w:rFonts w:ascii="Arial" w:hAnsi="Arial"/>
+          <w:sz w:val="28"/>
+        </w:rPr>
+        <w:t xml:space="preserve">is #67-new. Paperwork is Pending 11–14.</w:t>
+      </w:r>
+    </w:p>
+    <w:p>
+      <w:pPr>
+        <w:spacing w:line="276" w:lineRule="auto"/>
+      </w:pPr>
+      <w:r>
+        <w:rPr>
+          <w:rFonts w:ascii="Arial" w:hAnsi="Arial"/>
+          <w:sz w:val="28"/>
+        </w:rPr>
         <w:t xml:space="preserve"/>
       </w:r>
     </w:p>
@@ -299,6 +359,18 @@
       <w:r>
         <w:rPr>
           <w:rFonts w:ascii="Arial" w:hAnsi="Arial"/>
+          <w:sz w:val="28"/>
+        </w:rPr>
+        <w:t xml:space="preserve"/>
+      </w:r>
+    </w:p>
+    <w:p>
+      <w:pPr>
+        <w:spacing w:line="276" w:lineRule="auto"/>
+      </w:pPr>
+      <w:r>
+        <w:rPr>
+          <w:rFonts w:ascii="Arial" w:hAnsi="Arial"/>
           <w:b/>
           <w:sz w:val="28"/>
         </w:rPr>
@@ -326,7 +398,7 @@
           <w:rFonts w:ascii="Arial" w:hAnsi="Arial"/>
           <w:sz w:val="28"/>
         </w:rPr>
-        <w:t xml:space="preserve">Things waiting on something — mostly on the phone.</w:t>
+        <w:t xml:space="preserve">Things waiting on something — mostly on the phone or on a build.</w:t>
       </w:r>
     </w:p>
     <w:p>
@@ -362,55 +434,415 @@
           <w:rFonts w:ascii="Arial" w:hAnsi="Arial"/>
           <w:sz w:val="28"/>
         </w:rPr>
-        <w:t xml:space="preserve">   Landscape 90° counter-clockwise, headers on the left. Calendar and</w:t>
-      </w:r>
-    </w:p>
-    <w:p>
-      <w:pPr>
-        <w:spacing w:line="276" w:lineRule="auto"/>
-      </w:pPr>
-      <w:r>
-        <w:rPr>
-          <w:rFonts w:ascii="Arial" w:hAnsi="Arial"/>
-          <w:sz w:val="28"/>
-        </w:rPr>
-        <w:t xml:space="preserve">   landscape are on the phone. He has not exhaustively tested it; what</w:t>
-      </w:r>
-    </w:p>
-    <w:p>
-      <w:pPr>
-        <w:spacing w:line="276" w:lineRule="auto"/>
-      </w:pPr>
-      <w:r>
-        <w:rPr>
-          <w:rFonts w:ascii="Arial" w:hAnsi="Arial"/>
-          <w:sz w:val="28"/>
-        </w:rPr>
-        <w:t xml:space="preserve">   he has used is working. Built since then and not on the phone: the</w:t>
-      </w:r>
-    </w:p>
-    <w:p>
-      <w:pPr>
-        <w:spacing w:line="276" w:lineRule="auto"/>
-      </w:pPr>
-      <w:r>
-        <w:rPr>
-          <w:rFonts w:ascii="Arial" w:hAnsi="Arial"/>
-          <w:sz w:val="28"/>
-        </w:rPr>
-        <w:t xml:space="preserve">   leftover cleanup (#69-new).</w:t>
-      </w:r>
-    </w:p>
-    <w:p>
-      <w:pPr>
-        <w:spacing w:line="276" w:lineRule="auto"/>
-      </w:pPr>
-      <w:r>
-        <w:rPr>
-          <w:rFonts w:ascii="Arial" w:hAnsi="Arial"/>
-          <w:sz w:val="28"/>
-        </w:rPr>
-        <w:t xml:space="preserve">2. A THOROUGH DESIGN SPEC FOR THE APP (Patrick, #52-new). This</w:t>
+        <w:t xml:space="preserve">   Built since then and not on the phone: the leftover cleanup (#69-new,</w:t>
+      </w:r>
+    </w:p>
+    <w:p>
+      <w:pPr>
+        <w:spacing w:line="276" w:lineRule="auto"/>
+      </w:pPr>
+      <w:r>
+        <w:rPr>
+          <w:rFonts w:ascii="Arial" w:hAnsi="Arial"/>
+          <w:sz w:val="28"/>
+        </w:rPr>
+        <w:t xml:space="preserve">   committed).</w:t>
+      </w:r>
+    </w:p>
+    <w:p>
+      <w:pPr>
+        <w:spacing w:line="276" w:lineRule="auto"/>
+      </w:pPr>
+      <w:r>
+        <w:rPr>
+          <w:rFonts w:ascii="Arial" w:hAnsi="Arial"/>
+          <w:sz w:val="28"/>
+        </w:rPr>
+        <w:t xml:space="preserve">2. GROK REVIEW — PHASE 1 (ACT ON). Three fixes, no design questions:</w:t>
+      </w:r>
+    </w:p>
+    <w:p>
+      <w:pPr>
+        <w:spacing w:line="276" w:lineRule="auto"/>
+      </w:pPr>
+      <w:r>
+        <w:rPr>
+          <w:rFonts w:ascii="Arial" w:hAnsi="Arial"/>
+          <w:sz w:val="28"/>
+        </w:rPr>
+        <w:t xml:space="preserve">   quarterly can land in the wrong month; Reset All Data does not cancel</w:t>
+      </w:r>
+    </w:p>
+    <w:p>
+      <w:pPr>
+        <w:spacing w:line="276" w:lineRule="auto"/>
+      </w:pPr>
+      <w:r>
+        <w:rPr>
+          <w:rFonts w:ascii="Arial" w:hAnsi="Arial"/>
+          <w:sz w:val="28"/>
+        </w:rPr>
+        <w:t xml:space="preserve">   reminders on the phone; banner Done/Skip/Snooze may replay on cold</w:t>
+      </w:r>
+    </w:p>
+    <w:p>
+      <w:pPr>
+        <w:spacing w:line="276" w:lineRule="auto"/>
+      </w:pPr>
+      <w:r>
+        <w:rPr>
+          <w:rFonts w:ascii="Arial" w:hAnsi="Arial"/>
+          <w:sz w:val="28"/>
+        </w:rPr>
+        <w:t xml:space="preserve">   launch (dedupe is memory-only today).</w:t>
+      </w:r>
+    </w:p>
+    <w:p>
+      <w:pPr>
+        <w:spacing w:line="276" w:lineRule="auto"/>
+      </w:pPr>
+      <w:r>
+        <w:rPr>
+          <w:rFonts w:ascii="Arial" w:hAnsi="Arial"/>
+          <w:sz w:val="28"/>
+        </w:rPr>
+        <w:t xml:space="preserve">3. MONTHLY DONE SHOULD ADVANCE THE TILE (Patrick, this session). Done on</w:t>
+      </w:r>
+    </w:p>
+    <w:p>
+      <w:pPr>
+        <w:spacing w:line="276" w:lineRule="auto"/>
+      </w:pPr>
+      <w:r>
+        <w:rPr>
+          <w:rFonts w:ascii="Arial" w:hAnsi="Arial"/>
+          <w:sz w:val="28"/>
+        </w:rPr>
+        <w:t xml:space="preserve">   Monthly, Quarterly, and Yearly should move the saved date so the tile</w:t>
+      </w:r>
+    </w:p>
+    <w:p>
+      <w:pPr>
+        <w:spacing w:line="276" w:lineRule="auto"/>
+      </w:pPr>
+      <w:r>
+        <w:rPr>
+          <w:rFonts w:ascii="Arial" w:hAnsi="Arial"/>
+          <w:sz w:val="28"/>
+        </w:rPr>
+        <w:t xml:space="preserve">   shows the next cycle armed — as before #41-new. Today only ticks and</w:t>
+      </w:r>
+    </w:p>
+    <w:p>
+      <w:pPr>
+        <w:spacing w:line="276" w:lineRule="auto"/>
+      </w:pPr>
+      <w:r>
+        <w:rPr>
+          <w:rFonts w:ascii="Arial" w:hAnsi="Arial"/>
+          <w:sz w:val="28"/>
+        </w:rPr>
+        <w:t xml:space="preserve">   logs; the date on the tile does not move.</w:t>
+      </w:r>
+    </w:p>
+    <w:p>
+      <w:pPr>
+        <w:spacing w:line="276" w:lineRule="auto"/>
+      </w:pPr>
+      <w:r>
+        <w:rPr>
+          <w:rFonts w:ascii="Arial" w:hAnsi="Arial"/>
+          <w:sz w:val="28"/>
+        </w:rPr>
+        <w:t xml:space="preserve">4. OPTIONS — 2ND THURSDAY CHIP DOES NOT UPDATE (Patrick, this session,</w:t>
+      </w:r>
+    </w:p>
+    <w:p>
+      <w:pPr>
+        <w:spacing w:line="276" w:lineRule="auto"/>
+      </w:pPr>
+      <w:r>
+        <w:rPr>
+          <w:rFonts w:ascii="Arial" w:hAnsi="Arial"/>
+          <w:sz w:val="28"/>
+        </w:rPr>
+        <w:t xml:space="preserve">   verified on phone). The pattern saves correctly. The selected chip</w:t>
+      </w:r>
+    </w:p>
+    <w:p>
+      <w:pPr>
+        <w:spacing w:line="276" w:lineRule="auto"/>
+      </w:pPr>
+      <w:r>
+        <w:rPr>
+          <w:rFonts w:ascii="Arial" w:hAnsi="Arial"/>
+          <w:sz w:val="28"/>
+        </w:rPr>
+        <w:t xml:space="preserve">   does not change to show 2nd Thursday is active, so it still looks like</w:t>
+      </w:r>
+    </w:p>
+    <w:p>
+      <w:pPr>
+        <w:spacing w:line="276" w:lineRule="auto"/>
+      </w:pPr>
+      <w:r>
+        <w:rPr>
+          <w:rFonts w:ascii="Arial" w:hAnsi="Arial"/>
+          <w:sz w:val="28"/>
+        </w:rPr>
+        <w:t xml:space="preserve">   the dated choice.</w:t>
+      </w:r>
+    </w:p>
+    <w:p>
+      <w:pPr>
+        <w:spacing w:line="276" w:lineRule="auto"/>
+      </w:pPr>
+      <w:r>
+        <w:rPr>
+          <w:rFonts w:ascii="Arial" w:hAnsi="Arial"/>
+          <w:sz w:val="28"/>
+        </w:rPr>
+        <w:t xml:space="preserve">5. BIRTHDAYS PAGE (Patrick, this session). New Home page. Each item:</w:t>
+      </w:r>
+    </w:p>
+    <w:p>
+      <w:pPr>
+        <w:spacing w:line="276" w:lineRule="auto"/>
+      </w:pPr>
+      <w:r>
+        <w:rPr>
+          <w:rFonts w:ascii="Arial" w:hAnsi="Arial"/>
+          <w:sz w:val="28"/>
+        </w:rPr>
+        <w:t xml:space="preserve">   a name and a date, yearly reminder. Almost like Appointments: Day Before</w:t>
+      </w:r>
+    </w:p>
+    <w:p>
+      <w:pPr>
+        <w:spacing w:line="276" w:lineRule="auto"/>
+      </w:pPr>
+      <w:r>
+        <w:rPr>
+          <w:rFonts w:ascii="Arial" w:hAnsi="Arial"/>
+          <w:sz w:val="28"/>
+        </w:rPr>
+        <w:t xml:space="preserve">   only as the before chip. Unlike Appointments, it reminds on the birthday</w:t>
+      </w:r>
+    </w:p>
+    <w:p>
+      <w:pPr>
+        <w:spacing w:line="276" w:lineRule="auto"/>
+      </w:pPr>
+      <w:r>
+        <w:rPr>
+          <w:rFonts w:ascii="Arial" w:hAnsi="Arial"/>
+          <w:sz w:val="28"/>
+        </w:rPr>
+        <w:t xml:space="preserve">   itself — **On the day** and **Day Before** are both selectable chips.</w:t>
+      </w:r>
+    </w:p>
+    <w:p>
+      <w:pPr>
+        <w:spacing w:line="276" w:lineRule="auto"/>
+      </w:pPr>
+      <w:r>
+        <w:rPr>
+          <w:rFonts w:ascii="Arial" w:hAnsi="Arial"/>
+          <w:sz w:val="28"/>
+        </w:rPr>
+        <w:t xml:space="preserve">   Build sheet first.</w:t>
+      </w:r>
+    </w:p>
+    <w:p>
+      <w:pPr>
+        <w:spacing w:line="276" w:lineRule="auto"/>
+      </w:pPr>
+      <w:r>
+        <w:rPr>
+          <w:rFonts w:ascii="Arial" w:hAnsi="Arial"/>
+          <w:sz w:val="28"/>
+        </w:rPr>
+        <w:t xml:space="preserve">6. HELP PAGE (Patrick, this session — was Where?). Visible name **Help**;</w:t>
+      </w:r>
+    </w:p>
+    <w:p>
+      <w:pPr>
+        <w:spacing w:line="276" w:lineRule="auto"/>
+      </w:pPr>
+      <w:r>
+        <w:rPr>
+          <w:rFonts w:ascii="Arial" w:hAnsi="Arial"/>
+          <w:sz w:val="28"/>
+        </w:rPr>
+        <w:t xml:space="preserve">   Home badge **?** not 🧭.</w:t>
+      </w:r>
+    </w:p>
+    <w:p>
+      <w:pPr>
+        <w:spacing w:line="276" w:lineRule="auto"/>
+      </w:pPr>
+      <w:r>
+        <w:rPr>
+          <w:rFonts w:ascii="Arial" w:hAnsi="Arial"/>
+          <w:sz w:val="28"/>
+        </w:rPr>
+        <w:t xml:space="preserve">7. HELP HELPER — WORDING AND CANCEL (Patrick, this session). Step 1 first</w:t>
+      </w:r>
+    </w:p>
+    <w:p>
+      <w:pPr>
+        <w:spacing w:line="276" w:lineRule="auto"/>
+      </w:pPr>
+      <w:r>
+        <w:rPr>
+          <w:rFonts w:ascii="Arial" w:hAnsi="Arial"/>
+          <w:sz w:val="28"/>
+        </w:rPr>
+        <w:t xml:space="preserve">   choice **Repeats every** only; fix the question that says “every” on a</w:t>
+      </w:r>
+    </w:p>
+    <w:p>
+      <w:pPr>
+        <w:spacing w:line="276" w:lineRule="auto"/>
+      </w:pPr>
+      <w:r>
+        <w:rPr>
+          <w:rFonts w:ascii="Arial" w:hAnsi="Arial"/>
+          <w:sz w:val="28"/>
+        </w:rPr>
+        <w:t xml:space="preserve">   later step. Steps 2 and 3: Cancel back one step, not Home (`where.tsx`).</w:t>
+      </w:r>
+    </w:p>
+    <w:p>
+      <w:pPr>
+        <w:spacing w:line="276" w:lineRule="auto"/>
+      </w:pPr>
+      <w:r>
+        <w:rPr>
+          <w:rFonts w:ascii="Arial" w:hAnsi="Arial"/>
+          <w:sz w:val="28"/>
+        </w:rPr>
+        <w:t xml:space="preserve">8. QUARTERLY ADD — 30, 60, 90 DAYS (Patrick, this session). On + Add</w:t>
+      </w:r>
+    </w:p>
+    <w:p>
+      <w:pPr>
+        <w:spacing w:line="276" w:lineRule="auto"/>
+      </w:pPr>
+      <w:r>
+        <w:rPr>
+          <w:rFonts w:ascii="Arial" w:hAnsi="Arial"/>
+          <w:sz w:val="28"/>
+        </w:rPr>
+        <w:t xml:space="preserve">   for Quarterly, selectable chips for 30, 60, and 90 days. Not a new</w:t>
+      </w:r>
+    </w:p>
+    <w:p>
+      <w:pPr>
+        <w:spacing w:line="276" w:lineRule="auto"/>
+      </w:pPr>
+      <w:r>
+        <w:rPr>
+          <w:rFonts w:ascii="Arial" w:hAnsi="Arial"/>
+          <w:sz w:val="28"/>
+        </w:rPr>
+        <w:t xml:space="preserve">   page. The engine already knows how to take in this data; the work is</w:t>
+      </w:r>
+    </w:p>
+    <w:p>
+      <w:pPr>
+        <w:spacing w:line="276" w:lineRule="auto"/>
+      </w:pPr>
+      <w:r>
+        <w:rPr>
+          <w:rFonts w:ascii="Arial" w:hAnsi="Arial"/>
+          <w:sz w:val="28"/>
+        </w:rPr>
+        <w:t xml:space="preserve">   the Add chips writing it.</w:t>
+      </w:r>
+    </w:p>
+    <w:p>
+      <w:pPr>
+        <w:spacing w:line="276" w:lineRule="auto"/>
+      </w:pPr>
+      <w:r>
+        <w:rPr>
+          <w:rFonts w:ascii="Arial" w:hAnsi="Arial"/>
+          <w:sz w:val="28"/>
+        </w:rPr>
+        <w:t xml:space="preserve">9. GROK REVIEW — PHASE 2 (ONE DOOR). Build sheet, then build: banner,</w:t>
+      </w:r>
+    </w:p>
+    <w:p>
+      <w:pPr>
+        <w:spacing w:line="276" w:lineRule="auto"/>
+      </w:pPr>
+      <w:r>
+        <w:rPr>
+          <w:rFonts w:ascii="Arial" w:hAnsi="Arial"/>
+          <w:sz w:val="28"/>
+        </w:rPr>
+        <w:t xml:space="preserve">   Siri, pages, and Settings all go through one apply-then-schedule</w:t>
+      </w:r>
+    </w:p>
+    <w:p>
+      <w:pPr>
+        <w:spacing w:line="276" w:lineRule="auto"/>
+      </w:pPr>
+      <w:r>
+        <w:rPr>
+          <w:rFonts w:ascii="Arial" w:hAnsi="Arial"/>
+          <w:sz w:val="28"/>
+        </w:rPr>
+        <w:t xml:space="preserve">   path so the queue matches what changed.</w:t>
+      </w:r>
+    </w:p>
+    <w:p>
+      <w:pPr>
+        <w:spacing w:line="276" w:lineRule="auto"/>
+      </w:pPr>
+      <w:r>
+        <w:rPr>
+          <w:rFonts w:ascii="Arial" w:hAnsi="Arial"/>
+          <w:sz w:val="28"/>
+        </w:rPr>
+        <w:t xml:space="preserve">10. GROK REVIEW — PHASE 3 (UI FOLLOWS TRANSLATOR). Rows and banner</w:t>
+      </w:r>
+    </w:p>
+    <w:p>
+      <w:pPr>
+        <w:spacing w:line="276" w:lineRule="auto"/>
+      </w:pPr>
+      <w:r>
+        <w:rPr>
+          <w:rFonts w:ascii="Arial" w:hAnsi="Arial"/>
+          <w:sz w:val="28"/>
+        </w:rPr>
+        <w:t xml:space="preserve">   buttons use what the translator already knows — Snooze, Done, Skip</w:t>
+      </w:r>
+    </w:p>
+    <w:p>
+      <w:pPr>
+        <w:spacing w:line="276" w:lineRule="auto"/>
+      </w:pPr>
+      <w:r>
+        <w:rPr>
+          <w:rFonts w:ascii="Arial" w:hAnsi="Arial"/>
+          <w:sz w:val="28"/>
+        </w:rPr>
+        <w:t xml:space="preserve">   honest for each kind.</w:t>
+      </w:r>
+    </w:p>
+    <w:p>
+      <w:pPr>
+        <w:spacing w:line="276" w:lineRule="auto"/>
+      </w:pPr>
+      <w:r>
+        <w:rPr>
+          <w:rFonts w:ascii="Arial" w:hAnsi="Arial"/>
+          <w:sz w:val="28"/>
+        </w:rPr>
+        <w:t xml:space="preserve">11. A THOROUGH DESIGN SPEC FOR THE APP (Patrick, #52-new). This</w:t>
       </w:r>
     </w:p>
     <w:p>
@@ -470,7 +902,7 @@
           <w:rFonts w:ascii="Arial" w:hAnsi="Arial"/>
           <w:sz w:val="28"/>
         </w:rPr>
-        <w:t xml:space="preserve">3. A USER GUIDE, from that spec or merely after it (Patrick,</w:t>
+        <w:t xml:space="preserve">12. A USER GUIDE, from that spec or merely after it (Patrick,</w:t>
       </w:r>
     </w:p>
     <w:p>
@@ -506,7 +938,7 @@
           <w:rFonts w:ascii="Arial" w:hAnsi="Arial"/>
           <w:sz w:val="28"/>
         </w:rPr>
-        <w:t xml:space="preserve">4. A FEEDBACK BUTTON IN THE APP, similar to Mystery (Patrick,</w:t>
+        <w:t xml:space="preserve">13. A FEEDBACK BUTTON IN THE APP, similar to Mystery (Patrick,</w:t>
       </w:r>
     </w:p>
     <w:p>
@@ -542,7 +974,7 @@
           <w:rFonts w:ascii="Arial" w:hAnsi="Arial"/>
           <w:sz w:val="28"/>
         </w:rPr>
-        <w:t xml:space="preserve">5. A PAGE, SPEC, OR FILE FOR WHAT TESTING HAS COVERED AND</w:t>
+        <w:t xml:space="preserve">14. A PAGE, SPEC, OR FILE FOR WHAT TESTING HAS COVERED AND</w:t>
       </w:r>
     </w:p>
     <w:p>
@@ -1432,31 +1864,43 @@
           <w:rFonts w:ascii="Arial" w:hAnsi="Arial"/>
           <w:sz w:val="28"/>
         </w:rPr>
-        <w:t xml:space="preserve">1. #69-new — leftover cleanup built. Dead exports, leftover theme</w:t>
-      </w:r>
-    </w:p>
-    <w:p>
-      <w:pPr>
-        <w:spacing w:line="276" w:lineRule="auto"/>
-      </w:pPr>
-      <w:r>
-        <w:rPr>
-          <w:rFonts w:ascii="Arial" w:hAnsi="Arial"/>
-          <w:sz w:val="28"/>
-        </w:rPr>
-        <w:t xml:space="preserve">   tokens, leftover page words in test titles. Mac 298. TypeScript</w:t>
-      </w:r>
-    </w:p>
-    <w:p>
-      <w:pPr>
-        <w:spacing w:line="276" w:lineRule="auto"/>
-      </w:pPr>
-      <w:r>
-        <w:rPr>
-          <w:rFonts w:ascii="Arial" w:hAnsi="Arial"/>
-          <w:sz w:val="28"/>
-        </w:rPr>
-        <w:t xml:space="preserve">   clean. Nothing about how reminders fire changed.</w:t>
+        <w:t xml:space="preserve">1. #69-new — leftover cleanup built and committed. Dead exports,</w:t>
+      </w:r>
+    </w:p>
+    <w:p>
+      <w:pPr>
+        <w:spacing w:line="276" w:lineRule="auto"/>
+      </w:pPr>
+      <w:r>
+        <w:rPr>
+          <w:rFonts w:ascii="Arial" w:hAnsi="Arial"/>
+          <w:sz w:val="28"/>
+        </w:rPr>
+        <w:t xml:space="preserve">   leftover theme tokens, leftover page words in test titles. Mac 298.</w:t>
+      </w:r>
+    </w:p>
+    <w:p>
+      <w:pPr>
+        <w:spacing w:line="276" w:lineRule="auto"/>
+      </w:pPr>
+      <w:r>
+        <w:rPr>
+          <w:rFonts w:ascii="Arial" w:hAnsi="Arial"/>
+          <w:sz w:val="28"/>
+        </w:rPr>
+        <w:t xml:space="preserve">   TypeScript clean. Nothing about how reminders fire changed. Not on</w:t>
+      </w:r>
+    </w:p>
+    <w:p>
+      <w:pPr>
+        <w:spacing w:line="276" w:lineRule="auto"/>
+      </w:pPr>
+      <w:r>
+        <w:rPr>
+          <w:rFonts w:ascii="Arial" w:hAnsi="Arial"/>
+          <w:sz w:val="28"/>
+        </w:rPr>
+        <w:t xml:space="preserve">   the phone.</w:t>
       </w:r>
     </w:p>
     <w:p>
@@ -3822,6 +4266,126 @@
           <w:sz w:val="28"/>
         </w:rPr>
         <w:t xml:space="preserve">1. The dark startup flash (moved here from Parked, #1-new).</w:t>
+      </w:r>
+    </w:p>
+    <w:p>
+      <w:pPr>
+        <w:spacing w:line="276" w:lineRule="auto"/>
+      </w:pPr>
+      <w:r>
+        <w:rPr>
+          <w:rFonts w:ascii="Arial" w:hAnsi="Arial"/>
+          <w:sz w:val="28"/>
+        </w:rPr>
+        <w:t xml:space="preserve">2. SKIP — one word, two stories (Grok review). Banner clears a snooze;</w:t>
+      </w:r>
+    </w:p>
+    <w:p>
+      <w:pPr>
+        <w:spacing w:line="276" w:lineRule="auto"/>
+      </w:pPr>
+      <w:r>
+        <w:rPr>
+          <w:rFonts w:ascii="Arial" w:hAnsi="Arial"/>
+          <w:sz w:val="28"/>
+        </w:rPr>
+        <w:t xml:space="preserve">   engine has a skip stamp production never writes. Wire the stamp or</w:t>
+      </w:r>
+    </w:p>
+    <w:p>
+      <w:pPr>
+        <w:spacing w:line="276" w:lineRule="auto"/>
+      </w:pPr>
+      <w:r>
+        <w:rPr>
+          <w:rFonts w:ascii="Arial" w:hAnsi="Arial"/>
+          <w:sz w:val="28"/>
+        </w:rPr>
+        <w:t xml:space="preserve">   drop it?</w:t>
+      </w:r>
+    </w:p>
+    <w:p>
+      <w:pPr>
+        <w:spacing w:line="276" w:lineRule="auto"/>
+      </w:pPr>
+      <w:r>
+        <w:rPr>
+          <w:rFonts w:ascii="Arial" w:hAnsi="Arial"/>
+          <w:sz w:val="28"/>
+        </w:rPr>
+        <w:t xml:space="preserve">3. APPOINTMENTS IN THE MORNING MISS LIST (Grok review). Design says no</w:t>
+      </w:r>
+    </w:p>
+    <w:p>
+      <w:pPr>
+        <w:spacing w:line="276" w:lineRule="auto"/>
+      </w:pPr>
+      <w:r>
+        <w:rPr>
+          <w:rFonts w:ascii="Arial" w:hAnsi="Arial"/>
+          <w:sz w:val="28"/>
+        </w:rPr>
+        <w:t xml:space="preserve">   reminder at appointment time; rollover still lists them as hanging.</w:t>
+      </w:r>
+    </w:p>
+    <w:p>
+      <w:pPr>
+        <w:spacing w:line="276" w:lineRule="auto"/>
+      </w:pPr>
+      <w:r>
+        <w:rPr>
+          <w:rFonts w:ascii="Arial" w:hAnsi="Arial"/>
+          <w:sz w:val="28"/>
+        </w:rPr>
+        <w:t xml:space="preserve">   Intentional or noise?</w:t>
+      </w:r>
+    </w:p>
+    <w:p>
+      <w:pPr>
+        <w:spacing w:line="276" w:lineRule="auto"/>
+      </w:pPr>
+      <w:r>
+        <w:rPr>
+          <w:rFonts w:ascii="Arial" w:hAnsi="Arial"/>
+          <w:sz w:val="28"/>
+        </w:rPr>
+        <w:t xml:space="preserve">4. RESTORE (Grok review). Items come back; previous health and miss</w:t>
+      </w:r>
+    </w:p>
+    <w:p>
+      <w:pPr>
+        <w:spacing w:line="276" w:lineRule="auto"/>
+      </w:pPr>
+      <w:r>
+        <w:rPr>
+          <w:rFonts w:ascii="Arial" w:hAnsi="Arial"/>
+          <w:sz w:val="28"/>
+        </w:rPr>
+        <w:t xml:space="preserve">   lists stay. Clear them or leave them?</w:t>
+      </w:r>
+    </w:p>
+    <w:p>
+      <w:pPr>
+        <w:spacing w:line="276" w:lineRule="auto"/>
+      </w:pPr>
+      <w:r>
+        <w:rPr>
+          <w:rFonts w:ascii="Arial" w:hAnsi="Arial"/>
+          <w:sz w:val="28"/>
+        </w:rPr>
+        <w:t xml:space="preserve">5. CLOCK-STYLE LEADS AND NAMED ZONES (Grok review). "Morning of" uses</w:t>
+      </w:r>
+    </w:p>
+    <w:p>
+      <w:pPr>
+        <w:spacing w:line="276" w:lineRule="auto"/>
+      </w:pPr>
+      <w:r>
+        <w:rPr>
+          <w:rFonts w:ascii="Arial" w:hAnsi="Arial"/>
+          <w:sz w:val="28"/>
+        </w:rPr>
+        <w:t xml:space="preserve">   the phone zone even when the appointment has a named zone.</w:t>
       </w:r>
     </w:p>
     <w:p>

</xml_diff>

<commit_message>
72-new - Memory - The goal is to fixed GROK review phase 1 bugs and erroneous hangings reminders bug.
</commit_message>
<xml_diff>
--- a/docs/pending.docx
+++ b/docs/pending.docx
@@ -24,7 +24,7 @@
           <w:rFonts w:ascii="Arial" w:hAnsi="Arial"/>
           <w:sz w:val="28"/>
         </w:rPr>
-        <w:t xml:space="preserve">Last updated: 2026-09-05 (#70-new close)</w:t>
+        <w:t xml:space="preserve">Last updated: 2026-09-06 (#72-new close)</w:t>
       </w:r>
     </w:p>
     <w:p>
@@ -253,55 +253,31 @@
           <w:rFonts w:ascii="Arial" w:hAnsi="Arial"/>
           <w:sz w:val="28"/>
         </w:rPr>
-        <w:t xml:space="preserve">GROK REVIEW FIXES. Phase 1 is three definite fixes (quarterly month,</w:t>
-      </w:r>
-    </w:p>
-    <w:p>
-      <w:pPr>
-        <w:spacing w:line="276" w:lineRule="auto"/>
-      </w:pPr>
-      <w:r>
-        <w:rPr>
-          <w:rFonts w:ascii="Arial" w:hAnsi="Arial"/>
-          <w:sz w:val="28"/>
-        </w:rPr>
-        <w:t xml:space="preserve">Reset All Data banners, banner cold-launch dedupe). Phase 2 is one</w:t>
-      </w:r>
-    </w:p>
-    <w:p>
-      <w:pPr>
-        <w:spacing w:line="276" w:lineRule="auto"/>
-      </w:pPr>
-      <w:r>
-        <w:rPr>
-          <w:rFonts w:ascii="Arial" w:hAnsi="Arial"/>
-          <w:sz w:val="28"/>
-        </w:rPr>
-        <w:t xml:space="preserve">apply-then-schedule door (build sheet first). Phase 3 is UI aligned</w:t>
-      </w:r>
-    </w:p>
-    <w:p>
-      <w:pPr>
-        <w:spacing w:line="276" w:lineRule="auto"/>
-      </w:pPr>
-      <w:r>
-        <w:rPr>
-          <w:rFonts w:ascii="Arial" w:hAnsi="Arial"/>
-          <w:sz w:val="28"/>
-        </w:rPr>
-        <w:t xml:space="preserve">with the translator. BIRTHDAYS PAGE — build sheet first, then build;</w:t>
-      </w:r>
-    </w:p>
-    <w:p>
-      <w:pPr>
-        <w:spacing w:line="276" w:lineRule="auto"/>
-      </w:pPr>
-      <w:r>
-        <w:rPr>
-          <w:rFonts w:ascii="Arial" w:hAnsi="Arial"/>
-          <w:sz w:val="28"/>
-        </w:rPr>
-        <w:t xml:space="preserve">name, date, yearly reminder. See handoff.</w:t>
+        <w:t xml:space="preserve">NEXT SESSION (#73-new). Grok Phase 2 — one apply-then-schedule door</w:t>
+      </w:r>
+    </w:p>
+    <w:p>
+      <w:pPr>
+        <w:spacing w:line="276" w:lineRule="auto"/>
+      </w:pPr>
+      <w:r>
+        <w:rPr>
+          <w:rFonts w:ascii="Arial" w:hAnsi="Arial"/>
+          <w:sz w:val="28"/>
+        </w:rPr>
+        <w:t xml:space="preserve">(build sheet first). That is the goal. Phase 3 and Birthdays stay on</w:t>
+      </w:r>
+    </w:p>
+    <w:p>
+      <w:pPr>
+        <w:spacing w:line="276" w:lineRule="auto"/>
+      </w:pPr>
+      <w:r>
+        <w:rPr>
+          <w:rFonts w:ascii="Arial" w:hAnsi="Arial"/>
+          <w:sz w:val="28"/>
+        </w:rPr>
+        <w:t xml:space="preserve">the list; they are not that session's goal.</w:t>
       </w:r>
     </w:p>
     <w:p>
@@ -325,19 +301,43 @@
           <w:rFonts w:ascii="Arial" w:hAnsi="Arial"/>
           <w:sz w:val="28"/>
         </w:rPr>
-        <w:t xml:space="preserve">PHONE LOAD. #69-new is committed and not on the phone yet. Last load</w:t>
-      </w:r>
-    </w:p>
-    <w:p>
-      <w:pPr>
-        <w:spacing w:line="276" w:lineRule="auto"/>
-      </w:pPr>
-      <w:r>
-        <w:rPr>
-          <w:rFonts w:ascii="Arial" w:hAnsi="Arial"/>
-          <w:sz w:val="28"/>
-        </w:rPr>
-        <w:t xml:space="preserve">is #67-new. Paperwork is Pending 11–14.</w:t>
+        <w:t xml:space="preserve">PHONE LOAD. #69-new is committed and not on the phone yet. The day-roll</w:t>
+      </w:r>
+    </w:p>
+    <w:p>
+      <w:pPr>
+        <w:spacing w:line="276" w:lineRule="auto"/>
+      </w:pPr>
+      <w:r>
+        <w:rPr>
+          <w:rFonts w:ascii="Arial" w:hAnsi="Arial"/>
+          <w:sz w:val="28"/>
+        </w:rPr>
+        <w:t xml:space="preserve">lock, quarterly month, Reset All Data banners, and banner-tap write-down</w:t>
+      </w:r>
+    </w:p>
+    <w:p>
+      <w:pPr>
+        <w:spacing w:line="276" w:lineRule="auto"/>
+      </w:pPr>
+      <w:r>
+        <w:rPr>
+          <w:rFonts w:ascii="Arial" w:hAnsi="Arial"/>
+          <w:sz w:val="28"/>
+        </w:rPr>
+        <w:t xml:space="preserve">(#72-new) are built and not on the phone. Last load is #67-new.</w:t>
+      </w:r>
+    </w:p>
+    <w:p>
+      <w:pPr>
+        <w:spacing w:line="276" w:lineRule="auto"/>
+      </w:pPr>
+      <w:r>
+        <w:rPr>
+          <w:rFonts w:ascii="Arial" w:hAnsi="Arial"/>
+          <w:sz w:val="28"/>
+        </w:rPr>
+        <w:t xml:space="preserve">Paperwork is Pending 10–13.</w:t>
       </w:r>
     </w:p>
     <w:p>
@@ -458,55 +458,7 @@
           <w:rFonts w:ascii="Arial" w:hAnsi="Arial"/>
           <w:sz w:val="28"/>
         </w:rPr>
-        <w:t xml:space="preserve">2. GROK REVIEW — PHASE 1 (ACT ON). Three fixes, no design questions:</w:t>
-      </w:r>
-    </w:p>
-    <w:p>
-      <w:pPr>
-        <w:spacing w:line="276" w:lineRule="auto"/>
-      </w:pPr>
-      <w:r>
-        <w:rPr>
-          <w:rFonts w:ascii="Arial" w:hAnsi="Arial"/>
-          <w:sz w:val="28"/>
-        </w:rPr>
-        <w:t xml:space="preserve">   quarterly can land in the wrong month; Reset All Data does not cancel</w:t>
-      </w:r>
-    </w:p>
-    <w:p>
-      <w:pPr>
-        <w:spacing w:line="276" w:lineRule="auto"/>
-      </w:pPr>
-      <w:r>
-        <w:rPr>
-          <w:rFonts w:ascii="Arial" w:hAnsi="Arial"/>
-          <w:sz w:val="28"/>
-        </w:rPr>
-        <w:t xml:space="preserve">   reminders on the phone; banner Done/Skip/Snooze may replay on cold</w:t>
-      </w:r>
-    </w:p>
-    <w:p>
-      <w:pPr>
-        <w:spacing w:line="276" w:lineRule="auto"/>
-      </w:pPr>
-      <w:r>
-        <w:rPr>
-          <w:rFonts w:ascii="Arial" w:hAnsi="Arial"/>
-          <w:sz w:val="28"/>
-        </w:rPr>
-        <w:t xml:space="preserve">   launch (dedupe is memory-only today).</w:t>
-      </w:r>
-    </w:p>
-    <w:p>
-      <w:pPr>
-        <w:spacing w:line="276" w:lineRule="auto"/>
-      </w:pPr>
-      <w:r>
-        <w:rPr>
-          <w:rFonts w:ascii="Arial" w:hAnsi="Arial"/>
-          <w:sz w:val="28"/>
-        </w:rPr>
-        <w:t xml:space="preserve">3. MONTHLY DONE SHOULD ADVANCE THE TILE (Patrick, this session). Done on</w:t>
+        <w:t xml:space="preserve">2. MONTHLY DONE SHOULD ADVANCE THE TILE (Patrick, #70-new). Done on</w:t>
       </w:r>
     </w:p>
     <w:p>
@@ -554,7 +506,7 @@
           <w:rFonts w:ascii="Arial" w:hAnsi="Arial"/>
           <w:sz w:val="28"/>
         </w:rPr>
-        <w:t xml:space="preserve">4. OPTIONS — 2ND THURSDAY CHIP DOES NOT UPDATE (Patrick, this session,</w:t>
+        <w:t xml:space="preserve">3. OPTIONS — 2ND THURSDAY CHIP DOES NOT UPDATE (Patrick, #70-new,</w:t>
       </w:r>
     </w:p>
     <w:p>
@@ -602,7 +554,7 @@
           <w:rFonts w:ascii="Arial" w:hAnsi="Arial"/>
           <w:sz w:val="28"/>
         </w:rPr>
-        <w:t xml:space="preserve">5. BIRTHDAYS PAGE (Patrick, this session). New Home page. Each item:</w:t>
+        <w:t xml:space="preserve">4. BIRTHDAYS PAGE (Patrick, #70-new). New Home page. Each item:</w:t>
       </w:r>
     </w:p>
     <w:p>
@@ -662,7 +614,7 @@
           <w:rFonts w:ascii="Arial" w:hAnsi="Arial"/>
           <w:sz w:val="28"/>
         </w:rPr>
-        <w:t xml:space="preserve">6. HELP PAGE (Patrick, this session — was Where?). Visible name **Help**;</w:t>
+        <w:t xml:space="preserve">5. HELP PAGE (Patrick, #70-new — was Where?). Visible name **Help**;</w:t>
       </w:r>
     </w:p>
     <w:p>
@@ -686,7 +638,7 @@
           <w:rFonts w:ascii="Arial" w:hAnsi="Arial"/>
           <w:sz w:val="28"/>
         </w:rPr>
-        <w:t xml:space="preserve">7. HELP HELPER — WORDING AND CANCEL (Patrick, this session). Step 1 first</w:t>
+        <w:t xml:space="preserve">6. HELP HELPER — WORDING AND CANCEL (Patrick, #70-new). Step 1 first</w:t>
       </w:r>
     </w:p>
     <w:p>
@@ -722,7 +674,7 @@
           <w:rFonts w:ascii="Arial" w:hAnsi="Arial"/>
           <w:sz w:val="28"/>
         </w:rPr>
-        <w:t xml:space="preserve">8. QUARTERLY ADD — 30, 60, 90 DAYS (Patrick, this session). On + Add</w:t>
+        <w:t xml:space="preserve">7. QUARTERLY ADD — 30, 60, 90 DAYS (Patrick, #70-new). On + Add</w:t>
       </w:r>
     </w:p>
     <w:p>
@@ -770,7 +722,7 @@
           <w:rFonts w:ascii="Arial" w:hAnsi="Arial"/>
           <w:sz w:val="28"/>
         </w:rPr>
-        <w:t xml:space="preserve">9. GROK REVIEW — PHASE 2 (ONE DOOR). Build sheet, then build: banner,</w:t>
+        <w:t xml:space="preserve">8. GROK REVIEW — PHASE 2 (ONE DOOR). Build sheet, then build: banner,</w:t>
       </w:r>
     </w:p>
     <w:p>
@@ -806,7 +758,7 @@
           <w:rFonts w:ascii="Arial" w:hAnsi="Arial"/>
           <w:sz w:val="28"/>
         </w:rPr>
-        <w:t xml:space="preserve">10. GROK REVIEW — PHASE 3 (UI FOLLOWS TRANSLATOR). Rows and banner</w:t>
+        <w:t xml:space="preserve">9. GROK REVIEW — PHASE 3 (UI FOLLOWS TRANSLATOR). Rows and banner</w:t>
       </w:r>
     </w:p>
     <w:p>
@@ -842,7 +794,7 @@
           <w:rFonts w:ascii="Arial" w:hAnsi="Arial"/>
           <w:sz w:val="28"/>
         </w:rPr>
-        <w:t xml:space="preserve">11. A THOROUGH DESIGN SPEC FOR THE APP (Patrick, #52-new). This</w:t>
+        <w:t xml:space="preserve">10. A THOROUGH DESIGN SPEC FOR THE APP (Patrick, #52-new). This</w:t>
       </w:r>
     </w:p>
     <w:p>
@@ -902,7 +854,7 @@
           <w:rFonts w:ascii="Arial" w:hAnsi="Arial"/>
           <w:sz w:val="28"/>
         </w:rPr>
-        <w:t xml:space="preserve">12. A USER GUIDE, from that spec or merely after it (Patrick,</w:t>
+        <w:t xml:space="preserve">11. A USER GUIDE, from that spec or merely after it (Patrick,</w:t>
       </w:r>
     </w:p>
     <w:p>
@@ -938,7 +890,7 @@
           <w:rFonts w:ascii="Arial" w:hAnsi="Arial"/>
           <w:sz w:val="28"/>
         </w:rPr>
-        <w:t xml:space="preserve">13. A FEEDBACK BUTTON IN THE APP, similar to Mystery (Patrick,</w:t>
+        <w:t xml:space="preserve">12. A FEEDBACK BUTTON IN THE APP, similar to Mystery (Patrick,</w:t>
       </w:r>
     </w:p>
     <w:p>
@@ -974,7 +926,7 @@
           <w:rFonts w:ascii="Arial" w:hAnsi="Arial"/>
           <w:sz w:val="28"/>
         </w:rPr>
-        <w:t xml:space="preserve">14. A PAGE, SPEC, OR FILE FOR WHAT TESTING HAS COVERED AND</w:t>
+        <w:t xml:space="preserve">13. A PAGE, SPEC, OR FILE FOR WHAT TESTING HAS COVERED AND</w:t>
       </w:r>
     </w:p>
     <w:p>
@@ -1864,7 +1816,91 @@
           <w:rFonts w:ascii="Arial" w:hAnsi="Arial"/>
           <w:sz w:val="28"/>
         </w:rPr>
-        <w:t xml:space="preserve">1. #69-new — leftover cleanup built and committed. Dead exports,</w:t>
+        <w:t xml:space="preserve">1. #72-new — day-roll lock for last night's hangings. Two rolls on</w:t>
+      </w:r>
+    </w:p>
+    <w:p>
+      <w:pPr>
+        <w:spacing w:line="276" w:lineRule="auto"/>
+      </w:pPr>
+      <w:r>
+        <w:rPr>
+          <w:rFonts w:ascii="Arial" w:hAnsi="Arial"/>
+          <w:sz w:val="28"/>
+        </w:rPr>
+        <w:t xml:space="preserve">   open could treat cleared ticks as missed. A second call waits.</w:t>
+      </w:r>
+    </w:p>
+    <w:p>
+      <w:pPr>
+        <w:spacing w:line="276" w:lineRule="auto"/>
+      </w:pPr>
+      <w:r>
+        <w:rPr>
+          <w:rFonts w:ascii="Arial" w:hAnsi="Arial"/>
+          <w:sz w:val="28"/>
+        </w:rPr>
+        <w:t xml:space="preserve">   Quarterly now uses the saved month, like yearly. Reset All Data</w:t>
+      </w:r>
+    </w:p>
+    <w:p>
+      <w:pPr>
+        <w:spacing w:line="276" w:lineRule="auto"/>
+      </w:pPr>
+      <w:r>
+        <w:rPr>
+          <w:rFonts w:ascii="Arial" w:hAnsi="Arial"/>
+          <w:sz w:val="28"/>
+        </w:rPr>
+        <w:t xml:space="preserve">   runs the scheduler after the wipe so owned reminders come off the</w:t>
+      </w:r>
+    </w:p>
+    <w:p>
+      <w:pPr>
+        <w:spacing w:line="276" w:lineRule="auto"/>
+      </w:pPr>
+      <w:r>
+        <w:rPr>
+          <w:rFonts w:ascii="Arial" w:hAnsi="Arial"/>
+          <w:sz w:val="28"/>
+        </w:rPr>
+        <w:t xml:space="preserve">   phone. The last banner tap is written down so Done, Skip, or</w:t>
+      </w:r>
+    </w:p>
+    <w:p>
+      <w:pPr>
+        <w:spacing w:line="276" w:lineRule="auto"/>
+      </w:pPr>
+      <w:r>
+        <w:rPr>
+          <w:rFonts w:ascii="Arial" w:hAnsi="Arial"/>
+          <w:sz w:val="28"/>
+        </w:rPr>
+        <w:t xml:space="preserve">   Snooze cannot replay on a cold launch. Mac 302. TypeScript clean.</w:t>
+      </w:r>
+    </w:p>
+    <w:p>
+      <w:pPr>
+        <w:spacing w:line="276" w:lineRule="auto"/>
+      </w:pPr>
+      <w:r>
+        <w:rPr>
+          <w:rFonts w:ascii="Arial" w:hAnsi="Arial"/>
+          <w:sz w:val="28"/>
+        </w:rPr>
+        <w:t xml:space="preserve">   Not on the phone.</w:t>
+      </w:r>
+    </w:p>
+    <w:p>
+      <w:pPr>
+        <w:spacing w:line="276" w:lineRule="auto"/>
+      </w:pPr>
+      <w:r>
+        <w:rPr>
+          <w:rFonts w:ascii="Arial" w:hAnsi="Arial"/>
+          <w:sz w:val="28"/>
+        </w:rPr>
+        <w:t xml:space="preserve">2. #69-new — leftover cleanup built and committed. Dead exports,</w:t>
       </w:r>
     </w:p>
     <w:p>
@@ -1912,19 +1948,19 @@
           <w:rFonts w:ascii="Arial" w:hAnsi="Arial"/>
           <w:sz w:val="28"/>
         </w:rPr>
-        <w:t xml:space="preserve">2. #68-new — leftover cleanup sheet written. No code. Committed.</w:t>
-      </w:r>
-    </w:p>
-    <w:p>
-      <w:pPr>
-        <w:spacing w:line="276" w:lineRule="auto"/>
-      </w:pPr>
-      <w:r>
-        <w:rPr>
-          <w:rFonts w:ascii="Arial" w:hAnsi="Arial"/>
-          <w:sz w:val="28"/>
-        </w:rPr>
-        <w:t xml:space="preserve">3. #67-new — nothing missing before an EAS phone load. The three</w:t>
+        <w:t xml:space="preserve">3. #68-new — leftover cleanup sheet written. No code. Committed.</w:t>
+      </w:r>
+    </w:p>
+    <w:p>
+      <w:pPr>
+        <w:spacing w:line="276" w:lineRule="auto"/>
+      </w:pPr>
+      <w:r>
+        <w:rPr>
+          <w:rFonts w:ascii="Arial" w:hAnsi="Arial"/>
+          <w:sz w:val="28"/>
+        </w:rPr>
+        <w:t xml:space="preserve">4. #67-new — nothing missing before an EAS phone load. The three</w:t>
       </w:r>
     </w:p>
     <w:p>
@@ -1960,7 +1996,7 @@
           <w:rFonts w:ascii="Arial" w:hAnsi="Arial"/>
           <w:sz w:val="28"/>
         </w:rPr>
-        <w:t xml:space="preserve">2. #66-new — the live desk pruned; archive renamed to handoff-history;</w:t>
+        <w:t xml:space="preserve">5. #66-new — the live desk pruned; archive renamed to handoff-history;</w:t>
       </w:r>
     </w:p>
     <w:p>
@@ -1996,7 +2032,7 @@
           <w:rFonts w:ascii="Arial" w:hAnsi="Arial"/>
           <w:sz w:val="28"/>
         </w:rPr>
-        <w:t xml:space="preserve">3. #65-new — saved kinds, routes, page files, and banner sources are</w:t>
+        <w:t xml:space="preserve">6. #65-new — saved kinds, routes, page files, and banner sources are</w:t>
       </w:r>
     </w:p>
     <w:p>
@@ -2044,7 +2080,7 @@
           <w:rFonts w:ascii="Arial" w:hAnsi="Arial"/>
           <w:sz w:val="28"/>
         </w:rPr>
-        <w:t xml:space="preserve">3. #64-new — Siri says Daily and Remember. Open-app leftover out.</w:t>
+        <w:t xml:space="preserve">7. #64-new — Siri says Daily and Remember. Open-app leftover out.</w:t>
       </w:r>
     </w:p>
     <w:p>
@@ -2068,7 +2104,7 @@
           <w:rFonts w:ascii="Arial" w:hAnsi="Arial"/>
           <w:sz w:val="28"/>
         </w:rPr>
-        <w:t xml:space="preserve">3. #63-new — every page log uses the current page name. The leftover</w:t>
+        <w:t xml:space="preserve">8. #63-new — every page log uses the current page name. The leftover</w:t>
       </w:r>
     </w:p>
     <w:p>
@@ -2104,7 +2140,7 @@
           <w:rFonts w:ascii="Arial" w:hAnsi="Arial"/>
           <w:sz w:val="28"/>
         </w:rPr>
-        <w:t xml:space="preserve">4. #62-new — current notification names through the live road.</w:t>
+        <w:t xml:space="preserve">9. #62-new — current notification names through the live road.</w:t>
       </w:r>
     </w:p>
     <w:p>
@@ -2164,7 +2200,7 @@
           <w:rFonts w:ascii="Arial" w:hAnsi="Arial"/>
           <w:sz w:val="28"/>
         </w:rPr>
-        <w:t xml:space="preserve">5. #61-new — hidden old pages and dead reader road removed.</w:t>
+        <w:t xml:space="preserve">10. #61-new — hidden old pages and dead reader road removed.</w:t>
       </w:r>
     </w:p>
     <w:p>
@@ -2188,7 +2224,7 @@
           <w:rFonts w:ascii="Arial" w:hAnsi="Arial"/>
           <w:sz w:val="28"/>
         </w:rPr>
-        <w:t xml:space="preserve">6. #59-new — calendar day-list fire time (old Pending 4); useless</w:t>
+        <w:t xml:space="preserve">11. #59-new — calendar day-list fire time (old Pending 4); useless</w:t>
       </w:r>
     </w:p>
     <w:p>
@@ -2236,7 +2272,7 @@
           <w:rFonts w:ascii="Arial" w:hAnsi="Arial"/>
           <w:sz w:val="28"/>
         </w:rPr>
-        <w:t xml:space="preserve">6. #58-new — the Where? helper built from its sheet. 🧭 badge after</w:t>
+        <w:t xml:space="preserve">12. #58-new — the Where? helper built from its sheet. 🧭 badge after</w:t>
       </w:r>
     </w:p>
     <w:p>
@@ -2284,7 +2320,7 @@
           <w:rFonts w:ascii="Arial" w:hAnsi="Arial"/>
           <w:sz w:val="28"/>
         </w:rPr>
-        <w:t xml:space="preserve">6. #57-new — the Where? helper settled and its self-contained build</w:t>
+        <w:t xml:space="preserve">13. #57-new — the Where? helper settled and its self-contained build</w:t>
       </w:r>
     </w:p>
     <w:p>
@@ -2320,7 +2356,7 @@
           <w:rFonts w:ascii="Arial" w:hAnsi="Arial"/>
           <w:sz w:val="28"/>
         </w:rPr>
-        <w:t xml:space="preserve">7. #56-new — Appointments and Bucket List on every live screen;</w:t>
+        <w:t xml:space="preserve">14. #56-new — Appointments and Bucket List on every live screen;</w:t>
       </w:r>
     </w:p>
     <w:p>
@@ -2356,7 +2392,7 @@
           <w:rFonts w:ascii="Arial" w:hAnsi="Arial"/>
           <w:sz w:val="28"/>
         </w:rPr>
-        <w:t xml:space="preserve">8. #55-new — missed-firing notice for Weekly, Monthly, Quarterly,</w:t>
+        <w:t xml:space="preserve">15. #55-new — missed-firing notice for Weekly, Monthly, Quarterly,</w:t>
       </w:r>
     </w:p>
     <w:p>
@@ -2404,7 +2440,7 @@
           <w:rFonts w:ascii="Arial" w:hAnsi="Arial"/>
           <w:sz w:val="28"/>
         </w:rPr>
-        <w:t xml:space="preserve">9. #53-new (2026-09-02) — Scheduled Reminders names Daily, Weekly,</w:t>
+        <w:t xml:space="preserve">16. #53-new (2026-09-02) — Scheduled Reminders names Daily, Weekly,</w:t>
       </w:r>
     </w:p>
     <w:p>
@@ -2440,7 +2476,7 @@
           <w:rFonts w:ascii="Arial" w:hAnsi="Arial"/>
           <w:sz w:val="28"/>
         </w:rPr>
-        <w:t xml:space="preserve">10. #53-new (2026-09-02) — one list row for Daily through Extended</w:t>
+        <w:t xml:space="preserve">17. #53-new (2026-09-02) — one list row for Daily through Extended</w:t>
       </w:r>
     </w:p>
     <w:p>
@@ -2464,7 +2500,7 @@
           <w:rFonts w:ascii="Arial" w:hAnsi="Arial"/>
           <w:sz w:val="28"/>
         </w:rPr>
-        <w:t xml:space="preserve">11. #54-new (2026-09-02) — Appointments and Bucket List: one list in</w:t>
+        <w:t xml:space="preserve">18. #54-new (2026-09-02) — Appointments and Bucket List: one list in</w:t>
       </w:r>
     </w:p>
     <w:p>
@@ -2500,7 +2536,7 @@
           <w:rFonts w:ascii="Arial" w:hAnsi="Arial"/>
           <w:sz w:val="28"/>
         </w:rPr>
-        <w:t xml:space="preserve">12. #52-new — landscape 90° counter-clockwise, headers on the left,</w:t>
+        <w:t xml:space="preserve">19. #52-new — landscape 90° counter-clockwise, headers on the left,</w:t>
       </w:r>
     </w:p>
     <w:p>
@@ -2560,7 +2596,7 @@
           <w:rFonts w:ascii="Arial" w:hAnsi="Arial"/>
           <w:sz w:val="28"/>
         </w:rPr>
-        <w:t xml:space="preserve">13. #51-new — display features: header buttons and the Home badge</w:t>
+        <w:t xml:space="preserve">20. #51-new — display features: header buttons and the Home badge</w:t>
       </w:r>
     </w:p>
     <w:p>
@@ -2632,7 +2668,7 @@
           <w:rFonts w:ascii="Arial" w:hAnsi="Arial"/>
           <w:sz w:val="28"/>
         </w:rPr>
-        <w:t xml:space="preserve">14. #50-new — the other pages in landscape. Optional view, 0 and 90</w:t>
+        <w:t xml:space="preserve">21. #50-new — the other pages in landscape. Optional view, 0 and 90</w:t>
       </w:r>
     </w:p>
     <w:p>
@@ -2692,7 +2728,7 @@
           <w:rFonts w:ascii="Arial" w:hAnsi="Arial"/>
           <w:sz w:val="28"/>
         </w:rPr>
-        <w:t xml:space="preserve">15. #49-new — calendar page built from the sheet. Options Calendar</w:t>
+        <w:t xml:space="preserve">22. #49-new — calendar page built from the sheet. Options Calendar</w:t>
       </w:r>
     </w:p>
     <w:p>
@@ -2752,19 +2788,19 @@
           <w:rFonts w:ascii="Arial" w:hAnsi="Arial"/>
           <w:sz w:val="28"/>
         </w:rPr>
-        <w:t xml:space="preserve">16. #48-new — calendar build sheet written. No code.</w:t>
-      </w:r>
-    </w:p>
-    <w:p>
-      <w:pPr>
-        <w:spacing w:line="276" w:lineRule="auto"/>
-      </w:pPr>
-      <w:r>
-        <w:rPr>
-          <w:rFonts w:ascii="Arial" w:hAnsi="Arial"/>
-          <w:sz w:val="28"/>
-        </w:rPr>
-        <w:t xml:space="preserve">17. #47-new — selling description a good start and left. Features</w:t>
+        <w:t xml:space="preserve">23. #48-new — calendar build sheet written. No code.</w:t>
+      </w:r>
+    </w:p>
+    <w:p>
+      <w:pPr>
+        <w:spacing w:line="276" w:lineRule="auto"/>
+      </w:pPr>
+      <w:r>
+        <w:rPr>
+          <w:rFonts w:ascii="Arial" w:hAnsi="Arial"/>
+          <w:sz w:val="28"/>
+        </w:rPr>
+        <w:t xml:space="preserve">24. #47-new — selling description a good start and left. Features</w:t>
       </w:r>
     </w:p>
     <w:p>
@@ -2836,7 +2872,7 @@
           <w:rFonts w:ascii="Arial" w:hAnsi="Arial"/>
           <w:sz w:val="28"/>
         </w:rPr>
-        <w:t xml:space="preserve">18. #46-new — selling description begun, publishing picture written.</w:t>
+        <w:t xml:space="preserve">25. #46-new — selling description begun, publishing picture written.</w:t>
       </w:r>
     </w:p>
     <w:p>
@@ -2872,7 +2908,7 @@
           <w:rFonts w:ascii="Arial" w:hAnsi="Arial"/>
           <w:sz w:val="28"/>
         </w:rPr>
-        <w:t xml:space="preserve">19. App-Docs, 2026-08-31 — working documents stay in docs; history</w:t>
+        <w:t xml:space="preserve">26. App-Docs, 2026-08-31 — working documents stay in docs; history</w:t>
       </w:r>
     </w:p>
     <w:p>
@@ -2908,7 +2944,7 @@
           <w:rFonts w:ascii="Arial" w:hAnsi="Arial"/>
           <w:sz w:val="28"/>
         </w:rPr>
-        <w:t xml:space="preserve">20. #45-new — the two engine Fails from the sitting: Daily after Done</w:t>
+        <w:t xml:space="preserve">27. #45-new — the two engine Fails from the sitting: Daily after Done</w:t>
       </w:r>
     </w:p>
     <w:p>
@@ -3016,7 +3052,7 @@
           <w:rFonts w:ascii="Arial" w:hAnsi="Arial"/>
           <w:sz w:val="28"/>
         </w:rPr>
-        <w:t xml:space="preserve">20. #44-new — the automated load built, and the simulator sitting</w:t>
+        <w:t xml:space="preserve">28. #44-new — the automated load built, and the simulator sitting</w:t>
       </w:r>
     </w:p>
     <w:p>
@@ -3064,7 +3100,7 @@
           <w:rFonts w:ascii="Arial" w:hAnsi="Arial"/>
           <w:sz w:val="28"/>
         </w:rPr>
-        <w:t xml:space="preserve">21. #43-new — the automated-load job sheet and the sitting list.</w:t>
+        <w:t xml:space="preserve">29. #43-new — the automated-load job sheet and the sitting list.</w:t>
       </w:r>
     </w:p>
     <w:p>
@@ -3112,7 +3148,7 @@
           <w:rFonts w:ascii="Arial" w:hAnsi="Arial"/>
           <w:sz w:val="28"/>
         </w:rPr>
-        <w:t xml:space="preserve">22. #42-new — the rest of Options into the engine. Calendar shading</w:t>
+        <w:t xml:space="preserve">30. #42-new — the rest of Options into the engine. Calendar shading</w:t>
       </w:r>
     </w:p>
     <w:p>
@@ -3196,7 +3232,7 @@
           <w:rFonts w:ascii="Arial" w:hAnsi="Arial"/>
           <w:sz w:val="28"/>
         </w:rPr>
-        <w:t xml:space="preserve">23. #41-new — five Options answers, holidays, monthly patterns, and</w:t>
+        <w:t xml:space="preserve">31. #41-new — five Options answers, holidays, monthly patterns, and</w:t>
       </w:r>
     </w:p>
     <w:p>
@@ -3256,7 +3292,7 @@
           <w:rFonts w:ascii="Arial" w:hAnsi="Arial"/>
           <w:sz w:val="28"/>
         </w:rPr>
-        <w:t xml:space="preserve">24. #40-new — five hardening points, and time zone into the engine.</w:t>
+        <w:t xml:space="preserve">32. #40-new — five hardening points, and time zone into the engine.</w:t>
       </w:r>
     </w:p>
     <w:p>
@@ -3328,7 +3364,7 @@
           <w:rFonts w:ascii="Arial" w:hAnsi="Arial"/>
           <w:sz w:val="28"/>
         </w:rPr>
-        <w:t xml:space="preserve">25. #39-new — the live one-store cutover. Pages, banners and Siri write</w:t>
+        <w:t xml:space="preserve">33. #39-new — the live one-store cutover. Pages, banners and Siri write</w:t>
       </w:r>
     </w:p>
     <w:p>
@@ -3364,7 +3400,7 @@
           <w:rFonts w:ascii="Arial" w:hAnsi="Arial"/>
           <w:sz w:val="28"/>
         </w:rPr>
-        <w:t xml:space="preserve">26. #38-new — the engine and Options path read end to end. The core</w:t>
+        <w:t xml:space="preserve">34. #38-new — the engine and Options path read end to end. The core</w:t>
       </w:r>
     </w:p>
     <w:p>
@@ -3412,7 +3448,7 @@
           <w:rFonts w:ascii="Arial" w:hAnsi="Arial"/>
           <w:sz w:val="28"/>
         </w:rPr>
-        <w:t xml:space="preserve">27. #37-new — Options connecting: + OPT writes the cases that apply,</w:t>
+        <w:t xml:space="preserve">35. #37-new — Options connecting: + OPT writes the cases that apply,</w:t>
       </w:r>
     </w:p>
     <w:p>
@@ -3448,7 +3484,7 @@
           <w:rFonts w:ascii="Arial" w:hAnsi="Arial"/>
           <w:sz w:val="28"/>
         </w:rPr>
-        <w:t xml:space="preserve">28. #36-new — logs on Weekly, Monthly, Quarterly, Yearly, One Time,</w:t>
+        <w:t xml:space="preserve">36. #36-new — logs on Weekly, Monthly, Quarterly, Yearly, One Time,</w:t>
       </w:r>
     </w:p>
     <w:p>
@@ -3532,7 +3568,7 @@
           <w:rFonts w:ascii="Arial" w:hAnsi="Arial"/>
           <w:sz w:val="28"/>
         </w:rPr>
-        <w:t xml:space="preserve">29. #35-new — old screens out, including the `/myday` hop. Backup</w:t>
+        <w:t xml:space="preserve">37. #35-new — old screens out, including the `/myday` hop. Backup</w:t>
       </w:r>
     </w:p>
     <w:p>
@@ -3568,7 +3604,7 @@
           <w:rFonts w:ascii="Arial" w:hAnsi="Arial"/>
           <w:sz w:val="28"/>
         </w:rPr>
-        <w:t xml:space="preserve">30. #34-new — Weekly through Options and the + Add popup built.</w:t>
+        <w:t xml:space="preserve">38. #34-new — Weekly through Options and the + Add popup built.</w:t>
       </w:r>
     </w:p>
     <w:p>
@@ -3604,7 +3640,7 @@
           <w:rFonts w:ascii="Arial" w:hAnsi="Arial"/>
           <w:sz w:val="28"/>
         </w:rPr>
-        <w:t xml:space="preserve">31. #33-new — Daily built. Snooze, Done, hold-and-slide reorder, My</w:t>
+        <w:t xml:space="preserve">39. #33-new — Daily built. Snooze, Done, hold-and-slide reorder, My</w:t>
       </w:r>
     </w:p>
     <w:p>
@@ -3640,7 +3676,7 @@
           <w:rFonts w:ascii="Arial" w:hAnsi="Arial"/>
           <w:sz w:val="28"/>
         </w:rPr>
-        <w:t xml:space="preserve">32. #32-new — the pages phase spec, and Daily's first job sheet.</w:t>
+        <w:t xml:space="preserve">40. #32-new — the pages phase spec, and Daily's first job sheet.</w:t>
       </w:r>
     </w:p>
     <w:p>
@@ -3664,7 +3700,7 @@
           <w:rFonts w:ascii="Arial" w:hAnsi="Arial"/>
           <w:sz w:val="28"/>
         </w:rPr>
-        <w:t xml:space="preserve">33. #31-new — the record itself put right. The hand-off file went</w:t>
+        <w:t xml:space="preserve">41. #31-new — the record itself put right. The hand-off file went</w:t>
       </w:r>
     </w:p>
     <w:p>
@@ -3760,7 +3796,7 @@
           <w:rFonts w:ascii="Arial" w:hAnsi="Arial"/>
           <w:sz w:val="28"/>
         </w:rPr>
-        <w:t xml:space="preserve">34. #30-new — the reminder pages named and shaped, and the one Input</w:t>
+        <w:t xml:space="preserve">42. #30-new — the reminder pages named and shaped, and the one Input</w:t>
       </w:r>
     </w:p>
     <w:p>
@@ -3784,7 +3820,7 @@
           <w:rFonts w:ascii="Arial" w:hAnsi="Arial"/>
           <w:sz w:val="28"/>
         </w:rPr>
-        <w:t xml:space="preserve">35. #28-new — the engine gained repeat groups, skip, and time zones</w:t>
+        <w:t xml:space="preserve">43. #28-new — the engine gained repeat groups, skip, and time zones</w:t>
       </w:r>
     </w:p>
     <w:p>
@@ -3808,7 +3844,7 @@
           <w:rFonts w:ascii="Arial" w:hAnsi="Arial"/>
           <w:sz w:val="28"/>
         </w:rPr>
-        <w:t xml:space="preserve">36. #27-new — all five reminder screens went onto the one machine,</w:t>
+        <w:t xml:space="preserve">44. #27-new — all five reminder screens went onto the one machine,</w:t>
       </w:r>
     </w:p>
     <w:p>
@@ -3868,7 +3904,7 @@
           <w:rFonts w:ascii="Arial" w:hAnsi="Arial"/>
           <w:sz w:val="28"/>
         </w:rPr>
-        <w:t xml:space="preserve">37. #26-new — the per-screen translators became one translator and a</w:t>
+        <w:t xml:space="preserve">45. #26-new — the per-screen translators became one translator and a</w:t>
       </w:r>
     </w:p>
     <w:p>
@@ -3892,7 +3928,7 @@
           <w:rFonts w:ascii="Arial" w:hAnsi="Arial"/>
           <w:sz w:val="28"/>
         </w:rPr>
-        <w:t xml:space="preserve">38. #24-new and #25-new — the first two translators, My Day and</w:t>
+        <w:t xml:space="preserve">46. #24-new and #25-new — the first two translators, My Day and</w:t>
       </w:r>
     </w:p>
     <w:p>
@@ -3928,7 +3964,7 @@
           <w:rFonts w:ascii="Arial" w:hAnsi="Arial"/>
           <w:sz w:val="28"/>
         </w:rPr>
-        <w:t xml:space="preserve">39. #23-new — the common shape and the two decision blocks built and</w:t>
+        <w:t xml:space="preserve">47. #23-new — the common shape and the two decision blocks built and</w:t>
       </w:r>
     </w:p>
     <w:p>
@@ -3952,7 +3988,7 @@
           <w:rFonts w:ascii="Arial" w:hAnsi="Arial"/>
           <w:sz w:val="28"/>
         </w:rPr>
-        <w:t xml:space="preserve">40. #22-new — the field names settled, and setting reminders two</w:t>
+        <w:t xml:space="preserve">48. #22-new — the field names settled, and setting reminders two</w:t>
       </w:r>
     </w:p>
     <w:p>
@@ -3976,7 +4012,7 @@
           <w:rFonts w:ascii="Arial" w:hAnsi="Arial"/>
           <w:sz w:val="28"/>
         </w:rPr>
-        <w:t xml:space="preserve">41. #21-new — the common shape settled on paper, all five screens</w:t>
+        <w:t xml:space="preserve">49. #21-new — the common shape settled on paper, all five screens</w:t>
       </w:r>
     </w:p>
     <w:p>
@@ -4000,7 +4036,7 @@
           <w:rFonts w:ascii="Arial" w:hAnsi="Arial"/>
           <w:sz w:val="28"/>
         </w:rPr>
-        <w:t xml:space="preserve">42. #20-new — My Week's Delay written down like the others, and the</w:t>
+        <w:t xml:space="preserve">50. #20-new — My Week's Delay written down like the others, and the</w:t>
       </w:r>
     </w:p>
     <w:p>
@@ -4024,7 +4060,7 @@
           <w:rFonts w:ascii="Arial" w:hAnsi="Arial"/>
           <w:sz w:val="28"/>
         </w:rPr>
-        <w:t xml:space="preserve">43. #19-new — your epiphany: one shape instead of six, the reminder</w:t>
+        <w:t xml:space="preserve">51. #19-new — your epiphany: one shape instead of six, the reminder</w:t>
       </w:r>
     </w:p>
     <w:p>
@@ -4048,7 +4084,7 @@
           <w:rFonts w:ascii="Arial" w:hAnsi="Arial"/>
           <w:sz w:val="28"/>
         </w:rPr>
-        <w:t xml:space="preserve">44. #18-new — the outsider's report checked. The answer was mend</w:t>
+        <w:t xml:space="preserve">52. #18-new — the outsider's report checked. The answer was mend</w:t>
       </w:r>
     </w:p>
     <w:p>
@@ -4084,7 +4120,7 @@
           <w:rFonts w:ascii="Arial" w:hAnsi="Arial"/>
           <w:sz w:val="28"/>
         </w:rPr>
-        <w:t xml:space="preserve">45. #15-new to #17-new — the failure pop-up and the missed-firing</w:t>
+        <w:t xml:space="preserve">53. #15-new to #17-new — the failure pop-up and the missed-firing</w:t>
       </w:r>
     </w:p>
     <w:p>
@@ -4120,7 +4156,7 @@
           <w:rFonts w:ascii="Arial" w:hAnsi="Arial"/>
           <w:sz w:val="28"/>
         </w:rPr>
-        <w:t xml:space="preserve">46. #13-new and #14-new — tapping a reminder lands on its own item</w:t>
+        <w:t xml:space="preserve">54. #13-new and #14-new — tapping a reminder lands on its own item</w:t>
       </w:r>
     </w:p>
     <w:p>
@@ -4144,7 +4180,7 @@
           <w:rFonts w:ascii="Arial" w:hAnsi="Arial"/>
           <w:sz w:val="28"/>
         </w:rPr>
-        <w:t xml:space="preserve">47. #12-new — the Scheduled Reminders screen, showing every</w:t>
+        <w:t xml:space="preserve">55. #12-new — the Scheduled Reminders screen, showing every</w:t>
       </w:r>
     </w:p>
     <w:p>
@@ -4168,7 +4204,7 @@
           <w:rFonts w:ascii="Arial" w:hAnsi="Arial"/>
           <w:sz w:val="28"/>
         </w:rPr>
-        <w:t xml:space="preserve">48. #6-new to #12-new — the scheduler built in eight steps, so one</w:t>
+        <w:t xml:space="preserve">56. #6-new to #12-new — the scheduler built in eight steps, so one</w:t>
       </w:r>
     </w:p>
     <w:p>
@@ -4192,7 +4228,7 @@
           <w:rFonts w:ascii="Arial" w:hAnsi="Arial"/>
           <w:sz w:val="28"/>
         </w:rPr>
-        <w:t xml:space="preserve">49. #4-new — the first notification fixes. Real, and kept, but not</w:t>
+        <w:t xml:space="preserve">57. #4-new — the first notification fixes. Real, and kept, but not</w:t>
       </w:r>
     </w:p>
     <w:p>

</xml_diff>

<commit_message>
73-new - Memory - The goal is to fixed GROK review phase2 bugs.
</commit_message>
<xml_diff>
--- a/docs/pending.docx
+++ b/docs/pending.docx
@@ -24,7 +24,7 @@
           <w:rFonts w:ascii="Arial" w:hAnsi="Arial"/>
           <w:sz w:val="28"/>
         </w:rPr>
-        <w:t xml:space="preserve">Last updated: 2026-09-06 (#72-new close)</w:t>
+        <w:t xml:space="preserve">Last updated: 2026-09-06 (#73-new — Grok Phase 2 built)</w:t>
       </w:r>
     </w:p>
     <w:p>
@@ -253,31 +253,19 @@
           <w:rFonts w:ascii="Arial" w:hAnsi="Arial"/>
           <w:sz w:val="28"/>
         </w:rPr>
-        <w:t xml:space="preserve">NEXT SESSION (#73-new). Grok Phase 2 — one apply-then-schedule door</w:t>
-      </w:r>
-    </w:p>
-    <w:p>
-      <w:pPr>
-        <w:spacing w:line="276" w:lineRule="auto"/>
-      </w:pPr>
-      <w:r>
-        <w:rPr>
-          <w:rFonts w:ascii="Arial" w:hAnsi="Arial"/>
-          <w:sz w:val="28"/>
-        </w:rPr>
-        <w:t xml:space="preserve">(build sheet first). That is the goal. Phase 3 and Birthdays stay on</w:t>
-      </w:r>
-    </w:p>
-    <w:p>
-      <w:pPr>
-        <w:spacing w:line="276" w:lineRule="auto"/>
-      </w:pPr>
-      <w:r>
-        <w:rPr>
-          <w:rFonts w:ascii="Arial" w:hAnsi="Arial"/>
-          <w:sz w:val="28"/>
-        </w:rPr>
-        <w:t xml:space="preserve">the list; they are not that session's goal.</w:t>
+        <w:t xml:space="preserve">GROK PHASE 2 BUILT (#73-new). One apply-then-schedule door. Not on the</w:t>
+      </w:r>
+    </w:p>
+    <w:p>
+      <w:pPr>
+        <w:spacing w:line="276" w:lineRule="auto"/>
+      </w:pPr>
+      <w:r>
+        <w:rPr>
+          <w:rFonts w:ascii="Arial" w:hAnsi="Arial"/>
+          <w:sz w:val="28"/>
+        </w:rPr>
+        <w:t xml:space="preserve">phone. Phase 3 remains. Birthdays stay on the list.</w:t>
       </w:r>
     </w:p>
     <w:p>
@@ -313,31 +301,31 @@
           <w:rFonts w:ascii="Arial" w:hAnsi="Arial"/>
           <w:sz w:val="28"/>
         </w:rPr>
-        <w:t xml:space="preserve">lock, quarterly month, Reset All Data banners, and banner-tap write-down</w:t>
-      </w:r>
-    </w:p>
-    <w:p>
-      <w:pPr>
-        <w:spacing w:line="276" w:lineRule="auto"/>
-      </w:pPr>
-      <w:r>
-        <w:rPr>
-          <w:rFonts w:ascii="Arial" w:hAnsi="Arial"/>
-          <w:sz w:val="28"/>
-        </w:rPr>
-        <w:t xml:space="preserve">(#72-new) are built and not on the phone. Last load is #67-new.</w:t>
-      </w:r>
-    </w:p>
-    <w:p>
-      <w:pPr>
-        <w:spacing w:line="276" w:lineRule="auto"/>
-      </w:pPr>
-      <w:r>
-        <w:rPr>
-          <w:rFonts w:ascii="Arial" w:hAnsi="Arial"/>
-          <w:sz w:val="28"/>
-        </w:rPr>
-        <w:t xml:space="preserve">Paperwork is Pending 10–13.</w:t>
+        <w:t xml:space="preserve">lock, quarterly month, Reset All Data banners, banner-tap write-down</w:t>
+      </w:r>
+    </w:p>
+    <w:p>
+      <w:pPr>
+        <w:spacing w:line="276" w:lineRule="auto"/>
+      </w:pPr>
+      <w:r>
+        <w:rPr>
+          <w:rFonts w:ascii="Arial" w:hAnsi="Arial"/>
+          <w:sz w:val="28"/>
+        </w:rPr>
+        <w:t xml:space="preserve">(#72-new, committed), and the one-door (#73-new, built) are not on the</w:t>
+      </w:r>
+    </w:p>
+    <w:p>
+      <w:pPr>
+        <w:spacing w:line="276" w:lineRule="auto"/>
+      </w:pPr>
+      <w:r>
+        <w:rPr>
+          <w:rFonts w:ascii="Arial" w:hAnsi="Arial"/>
+          <w:sz w:val="28"/>
+        </w:rPr>
+        <w:t xml:space="preserve">phone. Last load is #67-new. Paperwork is Pending 9–12.</w:t>
       </w:r>
     </w:p>
     <w:p>
@@ -446,7 +434,19 @@
           <w:rFonts w:ascii="Arial" w:hAnsi="Arial"/>
           <w:sz w:val="28"/>
         </w:rPr>
-        <w:t xml:space="preserve">   committed).</w:t>
+        <w:t xml:space="preserve">   committed), the hangings lock plus Grok Phase 1 (#72-new, committed),</w:t>
+      </w:r>
+    </w:p>
+    <w:p>
+      <w:pPr>
+        <w:spacing w:line="276" w:lineRule="auto"/>
+      </w:pPr>
+      <w:r>
+        <w:rPr>
+          <w:rFonts w:ascii="Arial" w:hAnsi="Arial"/>
+          <w:sz w:val="28"/>
+        </w:rPr>
+        <w:t xml:space="preserve">   and the one-door (#73-new, built).</w:t>
       </w:r>
     </w:p>
     <w:p>
@@ -722,43 +722,7 @@
           <w:rFonts w:ascii="Arial" w:hAnsi="Arial"/>
           <w:sz w:val="28"/>
         </w:rPr>
-        <w:t xml:space="preserve">8. GROK REVIEW — PHASE 2 (ONE DOOR). Build sheet, then build: banner,</w:t>
-      </w:r>
-    </w:p>
-    <w:p>
-      <w:pPr>
-        <w:spacing w:line="276" w:lineRule="auto"/>
-      </w:pPr>
-      <w:r>
-        <w:rPr>
-          <w:rFonts w:ascii="Arial" w:hAnsi="Arial"/>
-          <w:sz w:val="28"/>
-        </w:rPr>
-        <w:t xml:space="preserve">   Siri, pages, and Settings all go through one apply-then-schedule</w:t>
-      </w:r>
-    </w:p>
-    <w:p>
-      <w:pPr>
-        <w:spacing w:line="276" w:lineRule="auto"/>
-      </w:pPr>
-      <w:r>
-        <w:rPr>
-          <w:rFonts w:ascii="Arial" w:hAnsi="Arial"/>
-          <w:sz w:val="28"/>
-        </w:rPr>
-        <w:t xml:space="preserve">   path so the queue matches what changed.</w:t>
-      </w:r>
-    </w:p>
-    <w:p>
-      <w:pPr>
-        <w:spacing w:line="276" w:lineRule="auto"/>
-      </w:pPr>
-      <w:r>
-        <w:rPr>
-          <w:rFonts w:ascii="Arial" w:hAnsi="Arial"/>
-          <w:sz w:val="28"/>
-        </w:rPr>
-        <w:t xml:space="preserve">9. GROK REVIEW — PHASE 3 (UI FOLLOWS TRANSLATOR). Rows and banner</w:t>
+        <w:t xml:space="preserve">8. GROK REVIEW — PHASE 3 (UI FOLLOWS TRANSLATOR). Rows and banner</w:t>
       </w:r>
     </w:p>
     <w:p>
@@ -794,7 +758,7 @@
           <w:rFonts w:ascii="Arial" w:hAnsi="Arial"/>
           <w:sz w:val="28"/>
         </w:rPr>
-        <w:t xml:space="preserve">10. A THOROUGH DESIGN SPEC FOR THE APP (Patrick, #52-new). This</w:t>
+        <w:t xml:space="preserve">9. A THOROUGH DESIGN SPEC FOR THE APP (Patrick, #52-new). This</w:t>
       </w:r>
     </w:p>
     <w:p>
@@ -854,7 +818,7 @@
           <w:rFonts w:ascii="Arial" w:hAnsi="Arial"/>
           <w:sz w:val="28"/>
         </w:rPr>
-        <w:t xml:space="preserve">11. A USER GUIDE, from that spec or merely after it (Patrick,</w:t>
+        <w:t xml:space="preserve">10. A USER GUIDE, from that spec or merely after it (Patrick,</w:t>
       </w:r>
     </w:p>
     <w:p>
@@ -890,7 +854,7 @@
           <w:rFonts w:ascii="Arial" w:hAnsi="Arial"/>
           <w:sz w:val="28"/>
         </w:rPr>
-        <w:t xml:space="preserve">12. A FEEDBACK BUTTON IN THE APP, similar to Mystery (Patrick,</w:t>
+        <w:t xml:space="preserve">11. A FEEDBACK BUTTON IN THE APP, similar to Mystery (Patrick,</w:t>
       </w:r>
     </w:p>
     <w:p>
@@ -926,7 +890,7 @@
           <w:rFonts w:ascii="Arial" w:hAnsi="Arial"/>
           <w:sz w:val="28"/>
         </w:rPr>
-        <w:t xml:space="preserve">13. A PAGE, SPEC, OR FILE FOR WHAT TESTING HAS COVERED AND</w:t>
+        <w:t xml:space="preserve">12. A PAGE, SPEC, OR FILE FOR WHAT TESTING HAS COVERED AND</w:t>
       </w:r>
     </w:p>
     <w:p>
@@ -1816,7 +1780,79 @@
           <w:rFonts w:ascii="Arial" w:hAnsi="Arial"/>
           <w:sz w:val="28"/>
         </w:rPr>
-        <w:t xml:space="preserve">1. #72-new — day-roll lock for last night's hangings. Two rolls on</w:t>
+        <w:t xml:space="preserve">1. #73-new — one apply-then-schedule door. Banner, Siri, pages,</w:t>
+      </w:r>
+    </w:p>
+    <w:p>
+      <w:pPr>
+        <w:spacing w:line="276" w:lineRule="auto"/>
+      </w:pPr>
+      <w:r>
+        <w:rPr>
+          <w:rFonts w:ascii="Arial" w:hAnsi="Arial"/>
+          <w:sz w:val="28"/>
+        </w:rPr>
+        <w:t xml:space="preserve">   Restore, and Settings clock times go through applyReminderChange,</w:t>
+      </w:r>
+    </w:p>
+    <w:p>
+      <w:pPr>
+        <w:spacing w:line="276" w:lineRule="auto"/>
+      </w:pPr>
+      <w:r>
+        <w:rPr>
+          <w:rFonts w:ascii="Arial" w:hAnsi="Arial"/>
+          <w:sz w:val="28"/>
+        </w:rPr>
+        <w:t xml:space="preserve">   so a held page list cannot overwrite a Done, and a new morning,</w:t>
+      </w:r>
+    </w:p>
+    <w:p>
+      <w:pPr>
+        <w:spacing w:line="276" w:lineRule="auto"/>
+      </w:pPr>
+      <w:r>
+        <w:rPr>
+          <w:rFonts w:ascii="Arial" w:hAnsi="Arial"/>
+          <w:sz w:val="28"/>
+        </w:rPr>
+        <w:t xml:space="preserve">   midday, or evening time is used without waiting for the next open.</w:t>
+      </w:r>
+    </w:p>
+    <w:p>
+      <w:pPr>
+        <w:spacing w:line="276" w:lineRule="auto"/>
+      </w:pPr>
+      <w:r>
+        <w:rPr>
+          <w:rFonts w:ascii="Arial" w:hAnsi="Arial"/>
+          <w:sz w:val="28"/>
+        </w:rPr>
+        <w:t xml:space="preserve">   Mac 302. TypeScript clean. Not on the phone.</w:t>
+      </w:r>
+    </w:p>
+    <w:p>
+      <w:pPr>
+        <w:spacing w:line="276" w:lineRule="auto"/>
+      </w:pPr>
+      <w:r>
+        <w:rPr>
+          <w:rFonts w:ascii="Arial" w:hAnsi="Arial"/>
+          <w:sz w:val="28"/>
+        </w:rPr>
+        <w:t xml:space="preserve"/>
+      </w:r>
+    </w:p>
+    <w:p>
+      <w:pPr>
+        <w:spacing w:line="276" w:lineRule="auto"/>
+      </w:pPr>
+      <w:r>
+        <w:rPr>
+          <w:rFonts w:ascii="Arial" w:hAnsi="Arial"/>
+          <w:sz w:val="28"/>
+        </w:rPr>
+        <w:t xml:space="preserve">2. #72-new — day-roll lock for last night's hangings. Two rolls on</w:t>
       </w:r>
     </w:p>
     <w:p>
@@ -1900,7 +1936,7 @@
           <w:rFonts w:ascii="Arial" w:hAnsi="Arial"/>
           <w:sz w:val="28"/>
         </w:rPr>
-        <w:t xml:space="preserve">2. #69-new — leftover cleanup built and committed. Dead exports,</w:t>
+        <w:t xml:space="preserve">3. #69-new — leftover cleanup built and committed. Dead exports,</w:t>
       </w:r>
     </w:p>
     <w:p>
@@ -1948,19 +1984,19 @@
           <w:rFonts w:ascii="Arial" w:hAnsi="Arial"/>
           <w:sz w:val="28"/>
         </w:rPr>
-        <w:t xml:space="preserve">3. #68-new — leftover cleanup sheet written. No code. Committed.</w:t>
-      </w:r>
-    </w:p>
-    <w:p>
-      <w:pPr>
-        <w:spacing w:line="276" w:lineRule="auto"/>
-      </w:pPr>
-      <w:r>
-        <w:rPr>
-          <w:rFonts w:ascii="Arial" w:hAnsi="Arial"/>
-          <w:sz w:val="28"/>
-        </w:rPr>
-        <w:t xml:space="preserve">4. #67-new — nothing missing before an EAS phone load. The three</w:t>
+        <w:t xml:space="preserve">4. #68-new — leftover cleanup sheet written. No code. Committed.</w:t>
+      </w:r>
+    </w:p>
+    <w:p>
+      <w:pPr>
+        <w:spacing w:line="276" w:lineRule="auto"/>
+      </w:pPr>
+      <w:r>
+        <w:rPr>
+          <w:rFonts w:ascii="Arial" w:hAnsi="Arial"/>
+          <w:sz w:val="28"/>
+        </w:rPr>
+        <w:t xml:space="preserve">5. #67-new — nothing missing before an EAS phone load. The three</w:t>
       </w:r>
     </w:p>
     <w:p>
@@ -1996,7 +2032,7 @@
           <w:rFonts w:ascii="Arial" w:hAnsi="Arial"/>
           <w:sz w:val="28"/>
         </w:rPr>
-        <w:t xml:space="preserve">5. #66-new — the live desk pruned; archive renamed to handoff-history;</w:t>
+        <w:t xml:space="preserve">6. #66-new — the live desk pruned; archive renamed to handoff-history;</w:t>
       </w:r>
     </w:p>
     <w:p>
@@ -2032,7 +2068,7 @@
           <w:rFonts w:ascii="Arial" w:hAnsi="Arial"/>
           <w:sz w:val="28"/>
         </w:rPr>
-        <w:t xml:space="preserve">6. #65-new — saved kinds, routes, page files, and banner sources are</w:t>
+        <w:t xml:space="preserve">7. #65-new — saved kinds, routes, page files, and banner sources are</w:t>
       </w:r>
     </w:p>
     <w:p>
@@ -2080,7 +2116,7 @@
           <w:rFonts w:ascii="Arial" w:hAnsi="Arial"/>
           <w:sz w:val="28"/>
         </w:rPr>
-        <w:t xml:space="preserve">7. #64-new — Siri says Daily and Remember. Open-app leftover out.</w:t>
+        <w:t xml:space="preserve">8. #64-new — Siri says Daily and Remember. Open-app leftover out.</w:t>
       </w:r>
     </w:p>
     <w:p>
@@ -2104,7 +2140,7 @@
           <w:rFonts w:ascii="Arial" w:hAnsi="Arial"/>
           <w:sz w:val="28"/>
         </w:rPr>
-        <w:t xml:space="preserve">8. #63-new — every page log uses the current page name. The leftover</w:t>
+        <w:t xml:space="preserve">9. #63-new — every page log uses the current page name. The leftover</w:t>
       </w:r>
     </w:p>
     <w:p>
@@ -2140,7 +2176,7 @@
           <w:rFonts w:ascii="Arial" w:hAnsi="Arial"/>
           <w:sz w:val="28"/>
         </w:rPr>
-        <w:t xml:space="preserve">9. #62-new — current notification names through the live road.</w:t>
+        <w:t xml:space="preserve">10. #62-new — current notification names through the live road.</w:t>
       </w:r>
     </w:p>
     <w:p>
@@ -2200,7 +2236,7 @@
           <w:rFonts w:ascii="Arial" w:hAnsi="Arial"/>
           <w:sz w:val="28"/>
         </w:rPr>
-        <w:t xml:space="preserve">10. #61-new — hidden old pages and dead reader road removed.</w:t>
+        <w:t xml:space="preserve">11. #61-new — hidden old pages and dead reader road removed.</w:t>
       </w:r>
     </w:p>
     <w:p>
@@ -2224,7 +2260,7 @@
           <w:rFonts w:ascii="Arial" w:hAnsi="Arial"/>
           <w:sz w:val="28"/>
         </w:rPr>
-        <w:t xml:space="preserve">11. #59-new — calendar day-list fire time (old Pending 4); useless</w:t>
+        <w:t xml:space="preserve">12. #59-new — calendar day-list fire time (old Pending 4); useless</w:t>
       </w:r>
     </w:p>
     <w:p>
@@ -2272,7 +2308,7 @@
           <w:rFonts w:ascii="Arial" w:hAnsi="Arial"/>
           <w:sz w:val="28"/>
         </w:rPr>
-        <w:t xml:space="preserve">12. #58-new — the Where? helper built from its sheet. 🧭 badge after</w:t>
+        <w:t xml:space="preserve">13. #58-new — the Where? helper built from its sheet. 🧭 badge after</w:t>
       </w:r>
     </w:p>
     <w:p>
@@ -2320,7 +2356,7 @@
           <w:rFonts w:ascii="Arial" w:hAnsi="Arial"/>
           <w:sz w:val="28"/>
         </w:rPr>
-        <w:t xml:space="preserve">13. #57-new — the Where? helper settled and its self-contained build</w:t>
+        <w:t xml:space="preserve">14. #57-new — the Where? helper settled and its self-contained build</w:t>
       </w:r>
     </w:p>
     <w:p>
@@ -2356,7 +2392,7 @@
           <w:rFonts w:ascii="Arial" w:hAnsi="Arial"/>
           <w:sz w:val="28"/>
         </w:rPr>
-        <w:t xml:space="preserve">14. #56-new — Appointments and Bucket List on every live screen;</w:t>
+        <w:t xml:space="preserve">15. #56-new — Appointments and Bucket List on every live screen;</w:t>
       </w:r>
     </w:p>
     <w:p>
@@ -2392,7 +2428,7 @@
           <w:rFonts w:ascii="Arial" w:hAnsi="Arial"/>
           <w:sz w:val="28"/>
         </w:rPr>
-        <w:t xml:space="preserve">15. #55-new — missed-firing notice for Weekly, Monthly, Quarterly,</w:t>
+        <w:t xml:space="preserve">16. #55-new — missed-firing notice for Weekly, Monthly, Quarterly,</w:t>
       </w:r>
     </w:p>
     <w:p>
@@ -2440,7 +2476,7 @@
           <w:rFonts w:ascii="Arial" w:hAnsi="Arial"/>
           <w:sz w:val="28"/>
         </w:rPr>
-        <w:t xml:space="preserve">16. #53-new (2026-09-02) — Scheduled Reminders names Daily, Weekly,</w:t>
+        <w:t xml:space="preserve">17. #53-new (2026-09-02) — Scheduled Reminders names Daily, Weekly,</w:t>
       </w:r>
     </w:p>
     <w:p>
@@ -2476,7 +2512,7 @@
           <w:rFonts w:ascii="Arial" w:hAnsi="Arial"/>
           <w:sz w:val="28"/>
         </w:rPr>
-        <w:t xml:space="preserve">17. #53-new (2026-09-02) — one list row for Daily through Extended</w:t>
+        <w:t xml:space="preserve">18. #53-new (2026-09-02) — one list row for Daily through Extended</w:t>
       </w:r>
     </w:p>
     <w:p>
@@ -2500,7 +2536,7 @@
           <w:rFonts w:ascii="Arial" w:hAnsi="Arial"/>
           <w:sz w:val="28"/>
         </w:rPr>
-        <w:t xml:space="preserve">18. #54-new (2026-09-02) — Appointments and Bucket List: one list in</w:t>
+        <w:t xml:space="preserve">19. #54-new (2026-09-02) — Appointments and Bucket List: one list in</w:t>
       </w:r>
     </w:p>
     <w:p>
@@ -2536,7 +2572,7 @@
           <w:rFonts w:ascii="Arial" w:hAnsi="Arial"/>
           <w:sz w:val="28"/>
         </w:rPr>
-        <w:t xml:space="preserve">19. #52-new — landscape 90° counter-clockwise, headers on the left,</w:t>
+        <w:t xml:space="preserve">20. #52-new — landscape 90° counter-clockwise, headers on the left,</w:t>
       </w:r>
     </w:p>
     <w:p>
@@ -2596,7 +2632,7 @@
           <w:rFonts w:ascii="Arial" w:hAnsi="Arial"/>
           <w:sz w:val="28"/>
         </w:rPr>
-        <w:t xml:space="preserve">20. #51-new — display features: header buttons and the Home badge</w:t>
+        <w:t xml:space="preserve">21. #51-new — display features: header buttons and the Home badge</w:t>
       </w:r>
     </w:p>
     <w:p>
@@ -2668,7 +2704,7 @@
           <w:rFonts w:ascii="Arial" w:hAnsi="Arial"/>
           <w:sz w:val="28"/>
         </w:rPr>
-        <w:t xml:space="preserve">21. #50-new — the other pages in landscape. Optional view, 0 and 90</w:t>
+        <w:t xml:space="preserve">22. #50-new — the other pages in landscape. Optional view, 0 and 90</w:t>
       </w:r>
     </w:p>
     <w:p>
@@ -2728,7 +2764,7 @@
           <w:rFonts w:ascii="Arial" w:hAnsi="Arial"/>
           <w:sz w:val="28"/>
         </w:rPr>
-        <w:t xml:space="preserve">22. #49-new — calendar page built from the sheet. Options Calendar</w:t>
+        <w:t xml:space="preserve">23. #49-new — calendar page built from the sheet. Options Calendar</w:t>
       </w:r>
     </w:p>
     <w:p>
@@ -2788,19 +2824,19 @@
           <w:rFonts w:ascii="Arial" w:hAnsi="Arial"/>
           <w:sz w:val="28"/>
         </w:rPr>
-        <w:t xml:space="preserve">23. #48-new — calendar build sheet written. No code.</w:t>
-      </w:r>
-    </w:p>
-    <w:p>
-      <w:pPr>
-        <w:spacing w:line="276" w:lineRule="auto"/>
-      </w:pPr>
-      <w:r>
-        <w:rPr>
-          <w:rFonts w:ascii="Arial" w:hAnsi="Arial"/>
-          <w:sz w:val="28"/>
-        </w:rPr>
-        <w:t xml:space="preserve">24. #47-new — selling description a good start and left. Features</w:t>
+        <w:t xml:space="preserve">24. #48-new — calendar build sheet written. No code.</w:t>
+      </w:r>
+    </w:p>
+    <w:p>
+      <w:pPr>
+        <w:spacing w:line="276" w:lineRule="auto"/>
+      </w:pPr>
+      <w:r>
+        <w:rPr>
+          <w:rFonts w:ascii="Arial" w:hAnsi="Arial"/>
+          <w:sz w:val="28"/>
+        </w:rPr>
+        <w:t xml:space="preserve">25. #47-new — selling description a good start and left. Features</w:t>
       </w:r>
     </w:p>
     <w:p>
@@ -2872,7 +2908,7 @@
           <w:rFonts w:ascii="Arial" w:hAnsi="Arial"/>
           <w:sz w:val="28"/>
         </w:rPr>
-        <w:t xml:space="preserve">25. #46-new — selling description begun, publishing picture written.</w:t>
+        <w:t xml:space="preserve">26. #46-new — selling description begun, publishing picture written.</w:t>
       </w:r>
     </w:p>
     <w:p>
@@ -2944,7 +2980,7 @@
           <w:rFonts w:ascii="Arial" w:hAnsi="Arial"/>
           <w:sz w:val="28"/>
         </w:rPr>
-        <w:t xml:space="preserve">27. #45-new — the two engine Fails from the sitting: Daily after Done</w:t>
+        <w:t xml:space="preserve">28. #45-new — the two engine Fails from the sitting: Daily after Done</w:t>
       </w:r>
     </w:p>
     <w:p>
@@ -3052,7 +3088,7 @@
           <w:rFonts w:ascii="Arial" w:hAnsi="Arial"/>
           <w:sz w:val="28"/>
         </w:rPr>
-        <w:t xml:space="preserve">28. #44-new — the automated load built, and the simulator sitting</w:t>
+        <w:t xml:space="preserve">29. #44-new — the automated load built, and the simulator sitting</w:t>
       </w:r>
     </w:p>
     <w:p>
@@ -3100,7 +3136,7 @@
           <w:rFonts w:ascii="Arial" w:hAnsi="Arial"/>
           <w:sz w:val="28"/>
         </w:rPr>
-        <w:t xml:space="preserve">29. #43-new — the automated-load job sheet and the sitting list.</w:t>
+        <w:t xml:space="preserve">30. #43-new — the automated-load job sheet and the sitting list.</w:t>
       </w:r>
     </w:p>
     <w:p>
@@ -3148,7 +3184,7 @@
           <w:rFonts w:ascii="Arial" w:hAnsi="Arial"/>
           <w:sz w:val="28"/>
         </w:rPr>
-        <w:t xml:space="preserve">30. #42-new — the rest of Options into the engine. Calendar shading</w:t>
+        <w:t xml:space="preserve">31. #42-new — the rest of Options into the engine. Calendar shading</w:t>
       </w:r>
     </w:p>
     <w:p>
@@ -3232,7 +3268,7 @@
           <w:rFonts w:ascii="Arial" w:hAnsi="Arial"/>
           <w:sz w:val="28"/>
         </w:rPr>
-        <w:t xml:space="preserve">31. #41-new — five Options answers, holidays, monthly patterns, and</w:t>
+        <w:t xml:space="preserve">32. #41-new — five Options answers, holidays, monthly patterns, and</w:t>
       </w:r>
     </w:p>
     <w:p>
@@ -3292,7 +3328,7 @@
           <w:rFonts w:ascii="Arial" w:hAnsi="Arial"/>
           <w:sz w:val="28"/>
         </w:rPr>
-        <w:t xml:space="preserve">32. #40-new — five hardening points, and time zone into the engine.</w:t>
+        <w:t xml:space="preserve">33. #40-new — five hardening points, and time zone into the engine.</w:t>
       </w:r>
     </w:p>
     <w:p>
@@ -3364,7 +3400,7 @@
           <w:rFonts w:ascii="Arial" w:hAnsi="Arial"/>
           <w:sz w:val="28"/>
         </w:rPr>
-        <w:t xml:space="preserve">33. #39-new — the live one-store cutover. Pages, banners and Siri write</w:t>
+        <w:t xml:space="preserve">34. #39-new — the live one-store cutover. Pages, banners and Siri write</w:t>
       </w:r>
     </w:p>
     <w:p>
@@ -3400,7 +3436,7 @@
           <w:rFonts w:ascii="Arial" w:hAnsi="Arial"/>
           <w:sz w:val="28"/>
         </w:rPr>
-        <w:t xml:space="preserve">34. #38-new — the engine and Options path read end to end. The core</w:t>
+        <w:t xml:space="preserve">35. #38-new — the engine and Options path read end to end. The core</w:t>
       </w:r>
     </w:p>
     <w:p>
@@ -3448,7 +3484,7 @@
           <w:rFonts w:ascii="Arial" w:hAnsi="Arial"/>
           <w:sz w:val="28"/>
         </w:rPr>
-        <w:t xml:space="preserve">35. #37-new — Options connecting: + OPT writes the cases that apply,</w:t>
+        <w:t xml:space="preserve">36. #37-new — Options connecting: + OPT writes the cases that apply,</w:t>
       </w:r>
     </w:p>
     <w:p>
@@ -3484,7 +3520,7 @@
           <w:rFonts w:ascii="Arial" w:hAnsi="Arial"/>
           <w:sz w:val="28"/>
         </w:rPr>
-        <w:t xml:space="preserve">36. #36-new — logs on Weekly, Monthly, Quarterly, Yearly, One Time,</w:t>
+        <w:t xml:space="preserve">37. #36-new — logs on Weekly, Monthly, Quarterly, Yearly, One Time,</w:t>
       </w:r>
     </w:p>
     <w:p>
@@ -3568,7 +3604,7 @@
           <w:rFonts w:ascii="Arial" w:hAnsi="Arial"/>
           <w:sz w:val="28"/>
         </w:rPr>
-        <w:t xml:space="preserve">37. #35-new — old screens out, including the `/myday` hop. Backup</w:t>
+        <w:t xml:space="preserve">38. #35-new — old screens out, including the `/myday` hop. Backup</w:t>
       </w:r>
     </w:p>
     <w:p>
@@ -3604,7 +3640,7 @@
           <w:rFonts w:ascii="Arial" w:hAnsi="Arial"/>
           <w:sz w:val="28"/>
         </w:rPr>
-        <w:t xml:space="preserve">38. #34-new — Weekly through Options and the + Add popup built.</w:t>
+        <w:t xml:space="preserve">39. #34-new — Weekly through Options and the + Add popup built.</w:t>
       </w:r>
     </w:p>
     <w:p>
@@ -3640,7 +3676,7 @@
           <w:rFonts w:ascii="Arial" w:hAnsi="Arial"/>
           <w:sz w:val="28"/>
         </w:rPr>
-        <w:t xml:space="preserve">39. #33-new — Daily built. Snooze, Done, hold-and-slide reorder, My</w:t>
+        <w:t xml:space="preserve">40. #33-new — Daily built. Snooze, Done, hold-and-slide reorder, My</w:t>
       </w:r>
     </w:p>
     <w:p>
@@ -3676,7 +3712,7 @@
           <w:rFonts w:ascii="Arial" w:hAnsi="Arial"/>
           <w:sz w:val="28"/>
         </w:rPr>
-        <w:t xml:space="preserve">40. #32-new — the pages phase spec, and Daily's first job sheet.</w:t>
+        <w:t xml:space="preserve">41. #32-new — the pages phase spec, and Daily's first job sheet.</w:t>
       </w:r>
     </w:p>
     <w:p>
@@ -3700,7 +3736,7 @@
           <w:rFonts w:ascii="Arial" w:hAnsi="Arial"/>
           <w:sz w:val="28"/>
         </w:rPr>
-        <w:t xml:space="preserve">41. #31-new — the record itself put right. The hand-off file went</w:t>
+        <w:t xml:space="preserve">42. #31-new — the record itself put right. The hand-off file went</w:t>
       </w:r>
     </w:p>
     <w:p>
@@ -3796,7 +3832,7 @@
           <w:rFonts w:ascii="Arial" w:hAnsi="Arial"/>
           <w:sz w:val="28"/>
         </w:rPr>
-        <w:t xml:space="preserve">42. #30-new — the reminder pages named and shaped, and the one Input</w:t>
+        <w:t xml:space="preserve">43. #30-new — the reminder pages named and shaped, and the one Input</w:t>
       </w:r>
     </w:p>
     <w:p>
@@ -3820,7 +3856,7 @@
           <w:rFonts w:ascii="Arial" w:hAnsi="Arial"/>
           <w:sz w:val="28"/>
         </w:rPr>
-        <w:t xml:space="preserve">43. #28-new — the engine gained repeat groups, skip, and time zones</w:t>
+        <w:t xml:space="preserve">44. #28-new — the engine gained repeat groups, skip, and time zones</w:t>
       </w:r>
     </w:p>
     <w:p>
@@ -3844,7 +3880,7 @@
           <w:rFonts w:ascii="Arial" w:hAnsi="Arial"/>
           <w:sz w:val="28"/>
         </w:rPr>
-        <w:t xml:space="preserve">44. #27-new — all five reminder screens went onto the one machine,</w:t>
+        <w:t xml:space="preserve">45. #27-new — all five reminder screens went onto the one machine,</w:t>
       </w:r>
     </w:p>
     <w:p>
@@ -3904,7 +3940,7 @@
           <w:rFonts w:ascii="Arial" w:hAnsi="Arial"/>
           <w:sz w:val="28"/>
         </w:rPr>
-        <w:t xml:space="preserve">45. #26-new — the per-screen translators became one translator and a</w:t>
+        <w:t xml:space="preserve">46. #26-new — the per-screen translators became one translator and a</w:t>
       </w:r>
     </w:p>
     <w:p>
@@ -3928,7 +3964,7 @@
           <w:rFonts w:ascii="Arial" w:hAnsi="Arial"/>
           <w:sz w:val="28"/>
         </w:rPr>
-        <w:t xml:space="preserve">46. #24-new and #25-new — the first two translators, My Day and</w:t>
+        <w:t xml:space="preserve">47. #24-new and #25-new — the first two translators, My Day and</w:t>
       </w:r>
     </w:p>
     <w:p>
@@ -3964,7 +4000,7 @@
           <w:rFonts w:ascii="Arial" w:hAnsi="Arial"/>
           <w:sz w:val="28"/>
         </w:rPr>
-        <w:t xml:space="preserve">47. #23-new — the common shape and the two decision blocks built and</w:t>
+        <w:t xml:space="preserve">48. #23-new — the common shape and the two decision blocks built and</w:t>
       </w:r>
     </w:p>
     <w:p>
@@ -3988,7 +4024,7 @@
           <w:rFonts w:ascii="Arial" w:hAnsi="Arial"/>
           <w:sz w:val="28"/>
         </w:rPr>
-        <w:t xml:space="preserve">48. #22-new — the field names settled, and setting reminders two</w:t>
+        <w:t xml:space="preserve">49. #22-new — the field names settled, and setting reminders two</w:t>
       </w:r>
     </w:p>
     <w:p>
@@ -4012,7 +4048,7 @@
           <w:rFonts w:ascii="Arial" w:hAnsi="Arial"/>
           <w:sz w:val="28"/>
         </w:rPr>
-        <w:t xml:space="preserve">49. #21-new — the common shape settled on paper, all five screens</w:t>
+        <w:t xml:space="preserve">50. #21-new — the common shape settled on paper, all five screens</w:t>
       </w:r>
     </w:p>
     <w:p>
@@ -4036,7 +4072,7 @@
           <w:rFonts w:ascii="Arial" w:hAnsi="Arial"/>
           <w:sz w:val="28"/>
         </w:rPr>
-        <w:t xml:space="preserve">50. #20-new — My Week's Delay written down like the others, and the</w:t>
+        <w:t xml:space="preserve">51. #20-new — My Week's Delay written down like the others, and the</w:t>
       </w:r>
     </w:p>
     <w:p>
@@ -4060,7 +4096,7 @@
           <w:rFonts w:ascii="Arial" w:hAnsi="Arial"/>
           <w:sz w:val="28"/>
         </w:rPr>
-        <w:t xml:space="preserve">51. #19-new — your epiphany: one shape instead of six, the reminder</w:t>
+        <w:t xml:space="preserve">52. #19-new — your epiphany: one shape instead of six, the reminder</w:t>
       </w:r>
     </w:p>
     <w:p>
@@ -4084,7 +4120,7 @@
           <w:rFonts w:ascii="Arial" w:hAnsi="Arial"/>
           <w:sz w:val="28"/>
         </w:rPr>
-        <w:t xml:space="preserve">52. #18-new — the outsider's report checked. The answer was mend</w:t>
+        <w:t xml:space="preserve">53. #18-new — the outsider's report checked. The answer was mend</w:t>
       </w:r>
     </w:p>
     <w:p>
@@ -4120,7 +4156,7 @@
           <w:rFonts w:ascii="Arial" w:hAnsi="Arial"/>
           <w:sz w:val="28"/>
         </w:rPr>
-        <w:t xml:space="preserve">53. #15-new to #17-new — the failure pop-up and the missed-firing</w:t>
+        <w:t xml:space="preserve">54. #15-new to #17-new — the failure pop-up and the missed-firing</w:t>
       </w:r>
     </w:p>
     <w:p>
@@ -4156,7 +4192,7 @@
           <w:rFonts w:ascii="Arial" w:hAnsi="Arial"/>
           <w:sz w:val="28"/>
         </w:rPr>
-        <w:t xml:space="preserve">54. #13-new and #14-new — tapping a reminder lands on its own item</w:t>
+        <w:t xml:space="preserve">55. #13-new and #14-new — tapping a reminder lands on its own item</w:t>
       </w:r>
     </w:p>
     <w:p>
@@ -4180,7 +4216,7 @@
           <w:rFonts w:ascii="Arial" w:hAnsi="Arial"/>
           <w:sz w:val="28"/>
         </w:rPr>
-        <w:t xml:space="preserve">55. #12-new — the Scheduled Reminders screen, showing every</w:t>
+        <w:t xml:space="preserve">56. #12-new — the Scheduled Reminders screen, showing every</w:t>
       </w:r>
     </w:p>
     <w:p>
@@ -4204,7 +4240,7 @@
           <w:rFonts w:ascii="Arial" w:hAnsi="Arial"/>
           <w:sz w:val="28"/>
         </w:rPr>
-        <w:t xml:space="preserve">56. #6-new to #12-new — the scheduler built in eight steps, so one</w:t>
+        <w:t xml:space="preserve">57. #6-new to #12-new — the scheduler built in eight steps, so one</w:t>
       </w:r>
     </w:p>
     <w:p>
@@ -4228,7 +4264,7 @@
           <w:rFonts w:ascii="Arial" w:hAnsi="Arial"/>
           <w:sz w:val="28"/>
         </w:rPr>
-        <w:t xml:space="preserve">57. #4-new — the first notification fixes. Real, and kept, but not</w:t>
+        <w:t xml:space="preserve">58. #4-new — the first notification fixes. Real, and kept, but not</w:t>
       </w:r>
     </w:p>
     <w:p>

</xml_diff>

<commit_message>
74-new - Memory - The goal is to fixed GROK review phase 3 bugs.
</commit_message>
<xml_diff>
--- a/docs/pending.docx
+++ b/docs/pending.docx
@@ -24,7 +24,7 @@
           <w:rFonts w:ascii="Arial" w:hAnsi="Arial"/>
           <w:sz w:val="28"/>
         </w:rPr>
-        <w:t xml:space="preserve">Last updated: 2026-09-06 (#73-new — Grok Phase 2 built)</w:t>
+        <w:t xml:space="preserve">Last updated: 2026-09-06 (#74-new — Grok Phase 3 built)</w:t>
       </w:r>
     </w:p>
     <w:p>
@@ -253,19 +253,31 @@
           <w:rFonts w:ascii="Arial" w:hAnsi="Arial"/>
           <w:sz w:val="28"/>
         </w:rPr>
-        <w:t xml:space="preserve">GROK PHASE 2 BUILT (#73-new). One apply-then-schedule door. Not on the</w:t>
-      </w:r>
-    </w:p>
-    <w:p>
-      <w:pPr>
-        <w:spacing w:line="276" w:lineRule="auto"/>
-      </w:pPr>
-      <w:r>
-        <w:rPr>
-          <w:rFonts w:ascii="Arial" w:hAnsi="Arial"/>
-          <w:sz w:val="28"/>
-        </w:rPr>
-        <w:t xml:space="preserve">phone. Phase 3 remains. Birthdays stay on the list.</w:t>
+        <w:t xml:space="preserve">GROK PHASE 3 BUILT (#74-new). Appointments do not offer Snooze. Skip</w:t>
+      </w:r>
+    </w:p>
+    <w:p>
+      <w:pPr>
+        <w:spacing w:line="276" w:lineRule="auto"/>
+      </w:pPr>
+      <w:r>
+        <w:rPr>
+          <w:rFonts w:ascii="Arial" w:hAnsi="Arial"/>
+          <w:sz w:val="28"/>
+        </w:rPr>
+        <w:t xml:space="preserve">drops this cycle and arms the next. Not on the phone. Birthdays stay</w:t>
+      </w:r>
+    </w:p>
+    <w:p>
+      <w:pPr>
+        <w:spacing w:line="276" w:lineRule="auto"/>
+      </w:pPr>
+      <w:r>
+        <w:rPr>
+          <w:rFonts w:ascii="Arial" w:hAnsi="Arial"/>
+          <w:sz w:val="28"/>
+        </w:rPr>
+        <w:t xml:space="preserve">on the list.</w:t>
       </w:r>
     </w:p>
     <w:p>
@@ -313,19 +325,31 @@
           <w:rFonts w:ascii="Arial" w:hAnsi="Arial"/>
           <w:sz w:val="28"/>
         </w:rPr>
-        <w:t xml:space="preserve">(#72-new, committed), and the one-door (#73-new, built) are not on the</w:t>
-      </w:r>
-    </w:p>
-    <w:p>
-      <w:pPr>
-        <w:spacing w:line="276" w:lineRule="auto"/>
-      </w:pPr>
-      <w:r>
-        <w:rPr>
-          <w:rFonts w:ascii="Arial" w:hAnsi="Arial"/>
-          <w:sz w:val="28"/>
-        </w:rPr>
-        <w:t xml:space="preserve">phone. Last load is #67-new. Paperwork is Pending 9–12.</w:t>
+        <w:t xml:space="preserve">(#72-new, committed), the one-door (#73-new, committed), and Phase 3</w:t>
+      </w:r>
+    </w:p>
+    <w:p>
+      <w:pPr>
+        <w:spacing w:line="276" w:lineRule="auto"/>
+      </w:pPr>
+      <w:r>
+        <w:rPr>
+          <w:rFonts w:ascii="Arial" w:hAnsi="Arial"/>
+          <w:sz w:val="28"/>
+        </w:rPr>
+        <w:t xml:space="preserve">(#74-new, built) are not on the phone. Last load is #67-new. Paperwork</w:t>
+      </w:r>
+    </w:p>
+    <w:p>
+      <w:pPr>
+        <w:spacing w:line="276" w:lineRule="auto"/>
+      </w:pPr>
+      <w:r>
+        <w:rPr>
+          <w:rFonts w:ascii="Arial" w:hAnsi="Arial"/>
+          <w:sz w:val="28"/>
+        </w:rPr>
+        <w:t xml:space="preserve">is Pending 8–11.</w:t>
       </w:r>
     </w:p>
     <w:p>
@@ -446,7 +470,7 @@
           <w:rFonts w:ascii="Arial" w:hAnsi="Arial"/>
           <w:sz w:val="28"/>
         </w:rPr>
-        <w:t xml:space="preserve">   and the one-door (#73-new, built).</w:t>
+        <w:t xml:space="preserve">   the one-door (#73-new, committed), and Grok Phase 3 (#74-new, built).</w:t>
       </w:r>
     </w:p>
     <w:p>
@@ -722,43 +746,7 @@
           <w:rFonts w:ascii="Arial" w:hAnsi="Arial"/>
           <w:sz w:val="28"/>
         </w:rPr>
-        <w:t xml:space="preserve">8. GROK REVIEW — PHASE 3 (UI FOLLOWS TRANSLATOR). Rows and banner</w:t>
-      </w:r>
-    </w:p>
-    <w:p>
-      <w:pPr>
-        <w:spacing w:line="276" w:lineRule="auto"/>
-      </w:pPr>
-      <w:r>
-        <w:rPr>
-          <w:rFonts w:ascii="Arial" w:hAnsi="Arial"/>
-          <w:sz w:val="28"/>
-        </w:rPr>
-        <w:t xml:space="preserve">   buttons use what the translator already knows — Snooze, Done, Skip</w:t>
-      </w:r>
-    </w:p>
-    <w:p>
-      <w:pPr>
-        <w:spacing w:line="276" w:lineRule="auto"/>
-      </w:pPr>
-      <w:r>
-        <w:rPr>
-          <w:rFonts w:ascii="Arial" w:hAnsi="Arial"/>
-          <w:sz w:val="28"/>
-        </w:rPr>
-        <w:t xml:space="preserve">   honest for each kind.</w:t>
-      </w:r>
-    </w:p>
-    <w:p>
-      <w:pPr>
-        <w:spacing w:line="276" w:lineRule="auto"/>
-      </w:pPr>
-      <w:r>
-        <w:rPr>
-          <w:rFonts w:ascii="Arial" w:hAnsi="Arial"/>
-          <w:sz w:val="28"/>
-        </w:rPr>
-        <w:t xml:space="preserve">9. A THOROUGH DESIGN SPEC FOR THE APP (Patrick, #52-new). This</w:t>
+        <w:t xml:space="preserve">8. A THOROUGH DESIGN SPEC FOR THE APP (Patrick, #52-new). This</w:t>
       </w:r>
     </w:p>
     <w:p>
@@ -818,7 +806,7 @@
           <w:rFonts w:ascii="Arial" w:hAnsi="Arial"/>
           <w:sz w:val="28"/>
         </w:rPr>
-        <w:t xml:space="preserve">10. A USER GUIDE, from that spec or merely after it (Patrick,</w:t>
+        <w:t xml:space="preserve">9. A USER GUIDE, from that spec or merely after it (Patrick,</w:t>
       </w:r>
     </w:p>
     <w:p>
@@ -854,7 +842,7 @@
           <w:rFonts w:ascii="Arial" w:hAnsi="Arial"/>
           <w:sz w:val="28"/>
         </w:rPr>
-        <w:t xml:space="preserve">11. A FEEDBACK BUTTON IN THE APP, similar to Mystery (Patrick,</w:t>
+        <w:t xml:space="preserve">10. A FEEDBACK BUTTON IN THE APP, similar to Mystery (Patrick,</w:t>
       </w:r>
     </w:p>
     <w:p>
@@ -890,7 +878,7 @@
           <w:rFonts w:ascii="Arial" w:hAnsi="Arial"/>
           <w:sz w:val="28"/>
         </w:rPr>
-        <w:t xml:space="preserve">12. A PAGE, SPEC, OR FILE FOR WHAT TESTING HAS COVERED AND</w:t>
+        <w:t xml:space="preserve">11. A PAGE, SPEC, OR FILE FOR WHAT TESTING HAS COVERED AND</w:t>
       </w:r>
     </w:p>
     <w:p>
@@ -1780,7 +1768,55 @@
           <w:rFonts w:ascii="Arial" w:hAnsi="Arial"/>
           <w:sz w:val="28"/>
         </w:rPr>
-        <w:t xml:space="preserve">1. #73-new — one apply-then-schedule door. Banner, Siri, pages,</w:t>
+        <w:t xml:space="preserve">1. #74-new — Grok Phase 3. Appointments do not offer Snooze. Skip</w:t>
+      </w:r>
+    </w:p>
+    <w:p>
+      <w:pPr>
+        <w:spacing w:line="276" w:lineRule="auto"/>
+      </w:pPr>
+      <w:r>
+        <w:rPr>
+          <w:rFonts w:ascii="Arial" w:hAnsi="Arial"/>
+          <w:sz w:val="28"/>
+        </w:rPr>
+        <w:t xml:space="preserve">   writes the engine skip stamp: this cycle is dropped, the next is</w:t>
+      </w:r>
+    </w:p>
+    <w:p>
+      <w:pPr>
+        <w:spacing w:line="276" w:lineRule="auto"/>
+      </w:pPr>
+      <w:r>
+        <w:rPr>
+          <w:rFonts w:ascii="Arial" w:hAnsi="Arial"/>
+          <w:sz w:val="28"/>
+        </w:rPr>
+        <w:t xml:space="preserve">   armed. Mac 304. TypeScript clean. Not on the phone.</w:t>
+      </w:r>
+    </w:p>
+    <w:p>
+      <w:pPr>
+        <w:spacing w:line="276" w:lineRule="auto"/>
+      </w:pPr>
+      <w:r>
+        <w:rPr>
+          <w:rFonts w:ascii="Arial" w:hAnsi="Arial"/>
+          <w:sz w:val="28"/>
+        </w:rPr>
+        <w:t xml:space="preserve"/>
+      </w:r>
+    </w:p>
+    <w:p>
+      <w:pPr>
+        <w:spacing w:line="276" w:lineRule="auto"/>
+      </w:pPr>
+      <w:r>
+        <w:rPr>
+          <w:rFonts w:ascii="Arial" w:hAnsi="Arial"/>
+          <w:sz w:val="28"/>
+        </w:rPr>
+        <w:t xml:space="preserve">2. #73-new — one apply-then-schedule door. Banner, Siri, pages,</w:t>
       </w:r>
     </w:p>
     <w:p>
@@ -1852,7 +1888,7 @@
           <w:rFonts w:ascii="Arial" w:hAnsi="Arial"/>
           <w:sz w:val="28"/>
         </w:rPr>
-        <w:t xml:space="preserve">2. #72-new — day-roll lock for last night's hangings. Two rolls on</w:t>
+        <w:t xml:space="preserve">3. #72-new — day-roll lock for last night's hangings. Two rolls on</w:t>
       </w:r>
     </w:p>
     <w:p>
@@ -1936,7 +1972,7 @@
           <w:rFonts w:ascii="Arial" w:hAnsi="Arial"/>
           <w:sz w:val="28"/>
         </w:rPr>
-        <w:t xml:space="preserve">3. #69-new — leftover cleanup built and committed. Dead exports,</w:t>
+        <w:t xml:space="preserve">4. #69-new — leftover cleanup built and committed. Dead exports,</w:t>
       </w:r>
     </w:p>
     <w:p>
@@ -1984,19 +2020,19 @@
           <w:rFonts w:ascii="Arial" w:hAnsi="Arial"/>
           <w:sz w:val="28"/>
         </w:rPr>
-        <w:t xml:space="preserve">4. #68-new — leftover cleanup sheet written. No code. Committed.</w:t>
-      </w:r>
-    </w:p>
-    <w:p>
-      <w:pPr>
-        <w:spacing w:line="276" w:lineRule="auto"/>
-      </w:pPr>
-      <w:r>
-        <w:rPr>
-          <w:rFonts w:ascii="Arial" w:hAnsi="Arial"/>
-          <w:sz w:val="28"/>
-        </w:rPr>
-        <w:t xml:space="preserve">5. #67-new — nothing missing before an EAS phone load. The three</w:t>
+        <w:t xml:space="preserve">5. #68-new — leftover cleanup sheet written. No code. Committed.</w:t>
+      </w:r>
+    </w:p>
+    <w:p>
+      <w:pPr>
+        <w:spacing w:line="276" w:lineRule="auto"/>
+      </w:pPr>
+      <w:r>
+        <w:rPr>
+          <w:rFonts w:ascii="Arial" w:hAnsi="Arial"/>
+          <w:sz w:val="28"/>
+        </w:rPr>
+        <w:t xml:space="preserve">6. #67-new — nothing missing before an EAS phone load. The three</w:t>
       </w:r>
     </w:p>
     <w:p>
@@ -2032,7 +2068,7 @@
           <w:rFonts w:ascii="Arial" w:hAnsi="Arial"/>
           <w:sz w:val="28"/>
         </w:rPr>
-        <w:t xml:space="preserve">6. #66-new — the live desk pruned; archive renamed to handoff-history;</w:t>
+        <w:t xml:space="preserve">7. #66-new — the live desk pruned; archive renamed to handoff-history;</w:t>
       </w:r>
     </w:p>
     <w:p>
@@ -2068,7 +2104,7 @@
           <w:rFonts w:ascii="Arial" w:hAnsi="Arial"/>
           <w:sz w:val="28"/>
         </w:rPr>
-        <w:t xml:space="preserve">7. #65-new — saved kinds, routes, page files, and banner sources are</w:t>
+        <w:t xml:space="preserve">8. #65-new — saved kinds, routes, page files, and banner sources are</w:t>
       </w:r>
     </w:p>
     <w:p>
@@ -2116,7 +2152,7 @@
           <w:rFonts w:ascii="Arial" w:hAnsi="Arial"/>
           <w:sz w:val="28"/>
         </w:rPr>
-        <w:t xml:space="preserve">8. #64-new — Siri says Daily and Remember. Open-app leftover out.</w:t>
+        <w:t xml:space="preserve">9. #64-new — Siri says Daily and Remember. Open-app leftover out.</w:t>
       </w:r>
     </w:p>
     <w:p>
@@ -2140,7 +2176,7 @@
           <w:rFonts w:ascii="Arial" w:hAnsi="Arial"/>
           <w:sz w:val="28"/>
         </w:rPr>
-        <w:t xml:space="preserve">9. #63-new — every page log uses the current page name. The leftover</w:t>
+        <w:t xml:space="preserve">10. #63-new — every page log uses the current page name. The leftover</w:t>
       </w:r>
     </w:p>
     <w:p>
@@ -2176,7 +2212,7 @@
           <w:rFonts w:ascii="Arial" w:hAnsi="Arial"/>
           <w:sz w:val="28"/>
         </w:rPr>
-        <w:t xml:space="preserve">10. #62-new — current notification names through the live road.</w:t>
+        <w:t xml:space="preserve">11. #62-new — current notification names through the live road.</w:t>
       </w:r>
     </w:p>
     <w:p>
@@ -2236,7 +2272,7 @@
           <w:rFonts w:ascii="Arial" w:hAnsi="Arial"/>
           <w:sz w:val="28"/>
         </w:rPr>
-        <w:t xml:space="preserve">11. #61-new — hidden old pages and dead reader road removed.</w:t>
+        <w:t xml:space="preserve">12. #61-new — hidden old pages and dead reader road removed.</w:t>
       </w:r>
     </w:p>
     <w:p>
@@ -2260,7 +2296,7 @@
           <w:rFonts w:ascii="Arial" w:hAnsi="Arial"/>
           <w:sz w:val="28"/>
         </w:rPr>
-        <w:t xml:space="preserve">12. #59-new — calendar day-list fire time (old Pending 4); useless</w:t>
+        <w:t xml:space="preserve">13. #59-new — calendar day-list fire time (old Pending 4); useless</w:t>
       </w:r>
     </w:p>
     <w:p>
@@ -2308,7 +2344,7 @@
           <w:rFonts w:ascii="Arial" w:hAnsi="Arial"/>
           <w:sz w:val="28"/>
         </w:rPr>
-        <w:t xml:space="preserve">13. #58-new — the Where? helper built from its sheet. 🧭 badge after</w:t>
+        <w:t xml:space="preserve">14. #58-new — the Where? helper built from its sheet. 🧭 badge after</w:t>
       </w:r>
     </w:p>
     <w:p>
@@ -2356,7 +2392,7 @@
           <w:rFonts w:ascii="Arial" w:hAnsi="Arial"/>
           <w:sz w:val="28"/>
         </w:rPr>
-        <w:t xml:space="preserve">14. #57-new — the Where? helper settled and its self-contained build</w:t>
+        <w:t xml:space="preserve">15. #57-new — the Where? helper settled and its self-contained build</w:t>
       </w:r>
     </w:p>
     <w:p>
@@ -2392,7 +2428,7 @@
           <w:rFonts w:ascii="Arial" w:hAnsi="Arial"/>
           <w:sz w:val="28"/>
         </w:rPr>
-        <w:t xml:space="preserve">15. #56-new — Appointments and Bucket List on every live screen;</w:t>
+        <w:t xml:space="preserve">16. #56-new — Appointments and Bucket List on every live screen;</w:t>
       </w:r>
     </w:p>
     <w:p>
@@ -2428,7 +2464,7 @@
           <w:rFonts w:ascii="Arial" w:hAnsi="Arial"/>
           <w:sz w:val="28"/>
         </w:rPr>
-        <w:t xml:space="preserve">16. #55-new — missed-firing notice for Weekly, Monthly, Quarterly,</w:t>
+        <w:t xml:space="preserve">17. #55-new — missed-firing notice for Weekly, Monthly, Quarterly,</w:t>
       </w:r>
     </w:p>
     <w:p>
@@ -2476,7 +2512,7 @@
           <w:rFonts w:ascii="Arial" w:hAnsi="Arial"/>
           <w:sz w:val="28"/>
         </w:rPr>
-        <w:t xml:space="preserve">17. #53-new (2026-09-02) — Scheduled Reminders names Daily, Weekly,</w:t>
+        <w:t xml:space="preserve">18. #53-new (2026-09-02) — Scheduled Reminders names Daily, Weekly,</w:t>
       </w:r>
     </w:p>
     <w:p>
@@ -2512,7 +2548,7 @@
           <w:rFonts w:ascii="Arial" w:hAnsi="Arial"/>
           <w:sz w:val="28"/>
         </w:rPr>
-        <w:t xml:space="preserve">18. #53-new (2026-09-02) — one list row for Daily through Extended</w:t>
+        <w:t xml:space="preserve">19. #53-new (2026-09-02) — one list row for Daily through Extended</w:t>
       </w:r>
     </w:p>
     <w:p>
@@ -2536,7 +2572,7 @@
           <w:rFonts w:ascii="Arial" w:hAnsi="Arial"/>
           <w:sz w:val="28"/>
         </w:rPr>
-        <w:t xml:space="preserve">19. #54-new (2026-09-02) — Appointments and Bucket List: one list in</w:t>
+        <w:t xml:space="preserve">20. #54-new (2026-09-02) — Appointments and Bucket List: one list in</w:t>
       </w:r>
     </w:p>
     <w:p>
@@ -2572,7 +2608,7 @@
           <w:rFonts w:ascii="Arial" w:hAnsi="Arial"/>
           <w:sz w:val="28"/>
         </w:rPr>
-        <w:t xml:space="preserve">20. #52-new — landscape 90° counter-clockwise, headers on the left,</w:t>
+        <w:t xml:space="preserve">21. #52-new — landscape 90° counter-clockwise, headers on the left,</w:t>
       </w:r>
     </w:p>
     <w:p>
@@ -2632,7 +2668,7 @@
           <w:rFonts w:ascii="Arial" w:hAnsi="Arial"/>
           <w:sz w:val="28"/>
         </w:rPr>
-        <w:t xml:space="preserve">21. #51-new — display features: header buttons and the Home badge</w:t>
+        <w:t xml:space="preserve">22. #51-new — display features: header buttons and the Home badge</w:t>
       </w:r>
     </w:p>
     <w:p>
@@ -2704,7 +2740,7 @@
           <w:rFonts w:ascii="Arial" w:hAnsi="Arial"/>
           <w:sz w:val="28"/>
         </w:rPr>
-        <w:t xml:space="preserve">22. #50-new — the other pages in landscape. Optional view, 0 and 90</w:t>
+        <w:t xml:space="preserve">23. #50-new — the other pages in landscape. Optional view, 0 and 90</w:t>
       </w:r>
     </w:p>
     <w:p>
@@ -2764,7 +2800,7 @@
           <w:rFonts w:ascii="Arial" w:hAnsi="Arial"/>
           <w:sz w:val="28"/>
         </w:rPr>
-        <w:t xml:space="preserve">23. #49-new — calendar page built from the sheet. Options Calendar</w:t>
+        <w:t xml:space="preserve">24. #49-new — calendar page built from the sheet. Options Calendar</w:t>
       </w:r>
     </w:p>
     <w:p>
@@ -2824,19 +2860,19 @@
           <w:rFonts w:ascii="Arial" w:hAnsi="Arial"/>
           <w:sz w:val="28"/>
         </w:rPr>
-        <w:t xml:space="preserve">24. #48-new — calendar build sheet written. No code.</w:t>
-      </w:r>
-    </w:p>
-    <w:p>
-      <w:pPr>
-        <w:spacing w:line="276" w:lineRule="auto"/>
-      </w:pPr>
-      <w:r>
-        <w:rPr>
-          <w:rFonts w:ascii="Arial" w:hAnsi="Arial"/>
-          <w:sz w:val="28"/>
-        </w:rPr>
-        <w:t xml:space="preserve">25. #47-new — selling description a good start and left. Features</w:t>
+        <w:t xml:space="preserve">25. #48-new — calendar build sheet written. No code.</w:t>
+      </w:r>
+    </w:p>
+    <w:p>
+      <w:pPr>
+        <w:spacing w:line="276" w:lineRule="auto"/>
+      </w:pPr>
+      <w:r>
+        <w:rPr>
+          <w:rFonts w:ascii="Arial" w:hAnsi="Arial"/>
+          <w:sz w:val="28"/>
+        </w:rPr>
+        <w:t xml:space="preserve">26. #47-new — selling description a good start and left. Features</w:t>
       </w:r>
     </w:p>
     <w:p>
@@ -2908,7 +2944,7 @@
           <w:rFonts w:ascii="Arial" w:hAnsi="Arial"/>
           <w:sz w:val="28"/>
         </w:rPr>
-        <w:t xml:space="preserve">26. #46-new — selling description begun, publishing picture written.</w:t>
+        <w:t xml:space="preserve">27. #46-new — selling description begun, publishing picture written.</w:t>
       </w:r>
     </w:p>
     <w:p>
@@ -2944,7 +2980,7 @@
           <w:rFonts w:ascii="Arial" w:hAnsi="Arial"/>
           <w:sz w:val="28"/>
         </w:rPr>
-        <w:t xml:space="preserve">26. App-Docs, 2026-08-31 — working documents stay in docs; history</w:t>
+        <w:t xml:space="preserve">27. App-Docs, 2026-08-31 — working documents stay in docs; history</w:t>
       </w:r>
     </w:p>
     <w:p>
@@ -2980,7 +3016,7 @@
           <w:rFonts w:ascii="Arial" w:hAnsi="Arial"/>
           <w:sz w:val="28"/>
         </w:rPr>
-        <w:t xml:space="preserve">28. #45-new — the two engine Fails from the sitting: Daily after Done</w:t>
+        <w:t xml:space="preserve">29. #45-new — the two engine Fails from the sitting: Daily after Done</w:t>
       </w:r>
     </w:p>
     <w:p>
@@ -3088,7 +3124,7 @@
           <w:rFonts w:ascii="Arial" w:hAnsi="Arial"/>
           <w:sz w:val="28"/>
         </w:rPr>
-        <w:t xml:space="preserve">29. #44-new — the automated load built, and the simulator sitting</w:t>
+        <w:t xml:space="preserve">30. #44-new — the automated load built, and the simulator sitting</w:t>
       </w:r>
     </w:p>
     <w:p>
@@ -3136,7 +3172,7 @@
           <w:rFonts w:ascii="Arial" w:hAnsi="Arial"/>
           <w:sz w:val="28"/>
         </w:rPr>
-        <w:t xml:space="preserve">30. #43-new — the automated-load job sheet and the sitting list.</w:t>
+        <w:t xml:space="preserve">31. #43-new — the automated-load job sheet and the sitting list.</w:t>
       </w:r>
     </w:p>
     <w:p>
@@ -3184,7 +3220,7 @@
           <w:rFonts w:ascii="Arial" w:hAnsi="Arial"/>
           <w:sz w:val="28"/>
         </w:rPr>
-        <w:t xml:space="preserve">31. #42-new — the rest of Options into the engine. Calendar shading</w:t>
+        <w:t xml:space="preserve">32. #42-new — the rest of Options into the engine. Calendar shading</w:t>
       </w:r>
     </w:p>
     <w:p>
@@ -3268,7 +3304,7 @@
           <w:rFonts w:ascii="Arial" w:hAnsi="Arial"/>
           <w:sz w:val="28"/>
         </w:rPr>
-        <w:t xml:space="preserve">32. #41-new — five Options answers, holidays, monthly patterns, and</w:t>
+        <w:t xml:space="preserve">33. #41-new — five Options answers, holidays, monthly patterns, and</w:t>
       </w:r>
     </w:p>
     <w:p>
@@ -3328,7 +3364,7 @@
           <w:rFonts w:ascii="Arial" w:hAnsi="Arial"/>
           <w:sz w:val="28"/>
         </w:rPr>
-        <w:t xml:space="preserve">33. #40-new — five hardening points, and time zone into the engine.</w:t>
+        <w:t xml:space="preserve">34. #40-new — five hardening points, and time zone into the engine.</w:t>
       </w:r>
     </w:p>
     <w:p>
@@ -3400,7 +3436,7 @@
           <w:rFonts w:ascii="Arial" w:hAnsi="Arial"/>
           <w:sz w:val="28"/>
         </w:rPr>
-        <w:t xml:space="preserve">34. #39-new — the live one-store cutover. Pages, banners and Siri write</w:t>
+        <w:t xml:space="preserve">35. #39-new — the live one-store cutover. Pages, banners and Siri write</w:t>
       </w:r>
     </w:p>
     <w:p>
@@ -3436,7 +3472,7 @@
           <w:rFonts w:ascii="Arial" w:hAnsi="Arial"/>
           <w:sz w:val="28"/>
         </w:rPr>
-        <w:t xml:space="preserve">35. #38-new — the engine and Options path read end to end. The core</w:t>
+        <w:t xml:space="preserve">36. #38-new — the engine and Options path read end to end. The core</w:t>
       </w:r>
     </w:p>
     <w:p>
@@ -3484,7 +3520,7 @@
           <w:rFonts w:ascii="Arial" w:hAnsi="Arial"/>
           <w:sz w:val="28"/>
         </w:rPr>
-        <w:t xml:space="preserve">36. #37-new — Options connecting: + OPT writes the cases that apply,</w:t>
+        <w:t xml:space="preserve">37. #37-new — Options connecting: + OPT writes the cases that apply,</w:t>
       </w:r>
     </w:p>
     <w:p>
@@ -3520,7 +3556,7 @@
           <w:rFonts w:ascii="Arial" w:hAnsi="Arial"/>
           <w:sz w:val="28"/>
         </w:rPr>
-        <w:t xml:space="preserve">37. #36-new — logs on Weekly, Monthly, Quarterly, Yearly, One Time,</w:t>
+        <w:t xml:space="preserve">38. #36-new — logs on Weekly, Monthly, Quarterly, Yearly, One Time,</w:t>
       </w:r>
     </w:p>
     <w:p>
@@ -3604,7 +3640,7 @@
           <w:rFonts w:ascii="Arial" w:hAnsi="Arial"/>
           <w:sz w:val="28"/>
         </w:rPr>
-        <w:t xml:space="preserve">38. #35-new — old screens out, including the `/myday` hop. Backup</w:t>
+        <w:t xml:space="preserve">39. #35-new — old screens out, including the `/myday` hop. Backup</w:t>
       </w:r>
     </w:p>
     <w:p>
@@ -3640,7 +3676,7 @@
           <w:rFonts w:ascii="Arial" w:hAnsi="Arial"/>
           <w:sz w:val="28"/>
         </w:rPr>
-        <w:t xml:space="preserve">39. #34-new — Weekly through Options and the + Add popup built.</w:t>
+        <w:t xml:space="preserve">40. #34-new — Weekly through Options and the + Add popup built.</w:t>
       </w:r>
     </w:p>
     <w:p>
@@ -3676,7 +3712,7 @@
           <w:rFonts w:ascii="Arial" w:hAnsi="Arial"/>
           <w:sz w:val="28"/>
         </w:rPr>
-        <w:t xml:space="preserve">40. #33-new — Daily built. Snooze, Done, hold-and-slide reorder, My</w:t>
+        <w:t xml:space="preserve">41. #33-new — Daily built. Snooze, Done, hold-and-slide reorder, My</w:t>
       </w:r>
     </w:p>
     <w:p>
@@ -3712,7 +3748,7 @@
           <w:rFonts w:ascii="Arial" w:hAnsi="Arial"/>
           <w:sz w:val="28"/>
         </w:rPr>
-        <w:t xml:space="preserve">41. #32-new — the pages phase spec, and Daily's first job sheet.</w:t>
+        <w:t xml:space="preserve">42. #32-new — the pages phase spec, and Daily's first job sheet.</w:t>
       </w:r>
     </w:p>
     <w:p>
@@ -3736,7 +3772,7 @@
           <w:rFonts w:ascii="Arial" w:hAnsi="Arial"/>
           <w:sz w:val="28"/>
         </w:rPr>
-        <w:t xml:space="preserve">42. #31-new — the record itself put right. The hand-off file went</w:t>
+        <w:t xml:space="preserve">43. #31-new — the record itself put right. The hand-off file went</w:t>
       </w:r>
     </w:p>
     <w:p>
@@ -3832,7 +3868,7 @@
           <w:rFonts w:ascii="Arial" w:hAnsi="Arial"/>
           <w:sz w:val="28"/>
         </w:rPr>
-        <w:t xml:space="preserve">43. #30-new — the reminder pages named and shaped, and the one Input</w:t>
+        <w:t xml:space="preserve">44. #30-new — the reminder pages named and shaped, and the one Input</w:t>
       </w:r>
     </w:p>
     <w:p>
@@ -3856,7 +3892,7 @@
           <w:rFonts w:ascii="Arial" w:hAnsi="Arial"/>
           <w:sz w:val="28"/>
         </w:rPr>
-        <w:t xml:space="preserve">44. #28-new — the engine gained repeat groups, skip, and time zones</w:t>
+        <w:t xml:space="preserve">45. #28-new — the engine gained repeat groups, skip, and time zones</w:t>
       </w:r>
     </w:p>
     <w:p>
@@ -3880,7 +3916,7 @@
           <w:rFonts w:ascii="Arial" w:hAnsi="Arial"/>
           <w:sz w:val="28"/>
         </w:rPr>
-        <w:t xml:space="preserve">45. #27-new — all five reminder screens went onto the one machine,</w:t>
+        <w:t xml:space="preserve">46. #27-new — all five reminder screens went onto the one machine,</w:t>
       </w:r>
     </w:p>
     <w:p>
@@ -3940,7 +3976,7 @@
           <w:rFonts w:ascii="Arial" w:hAnsi="Arial"/>
           <w:sz w:val="28"/>
         </w:rPr>
-        <w:t xml:space="preserve">46. #26-new — the per-screen translators became one translator and a</w:t>
+        <w:t xml:space="preserve">47. #26-new — the per-screen translators became one translator and a</w:t>
       </w:r>
     </w:p>
     <w:p>
@@ -3964,7 +4000,7 @@
           <w:rFonts w:ascii="Arial" w:hAnsi="Arial"/>
           <w:sz w:val="28"/>
         </w:rPr>
-        <w:t xml:space="preserve">47. #24-new and #25-new — the first two translators, My Day and</w:t>
+        <w:t xml:space="preserve">48. #24-new and #25-new — the first two translators, My Day and</w:t>
       </w:r>
     </w:p>
     <w:p>
@@ -4000,7 +4036,7 @@
           <w:rFonts w:ascii="Arial" w:hAnsi="Arial"/>
           <w:sz w:val="28"/>
         </w:rPr>
-        <w:t xml:space="preserve">48. #23-new — the common shape and the two decision blocks built and</w:t>
+        <w:t xml:space="preserve">49. #23-new — the common shape and the two decision blocks built and</w:t>
       </w:r>
     </w:p>
     <w:p>
@@ -4024,7 +4060,7 @@
           <w:rFonts w:ascii="Arial" w:hAnsi="Arial"/>
           <w:sz w:val="28"/>
         </w:rPr>
-        <w:t xml:space="preserve">49. #22-new — the field names settled, and setting reminders two</w:t>
+        <w:t xml:space="preserve">50. #22-new — the field names settled, and setting reminders two</w:t>
       </w:r>
     </w:p>
     <w:p>
@@ -4048,7 +4084,7 @@
           <w:rFonts w:ascii="Arial" w:hAnsi="Arial"/>
           <w:sz w:val="28"/>
         </w:rPr>
-        <w:t xml:space="preserve">50. #21-new — the common shape settled on paper, all five screens</w:t>
+        <w:t xml:space="preserve">51. #21-new — the common shape settled on paper, all five screens</w:t>
       </w:r>
     </w:p>
     <w:p>
@@ -4072,7 +4108,7 @@
           <w:rFonts w:ascii="Arial" w:hAnsi="Arial"/>
           <w:sz w:val="28"/>
         </w:rPr>
-        <w:t xml:space="preserve">51. #20-new — My Week's Delay written down like the others, and the</w:t>
+        <w:t xml:space="preserve">52. #20-new — My Week's Delay written down like the others, and the</w:t>
       </w:r>
     </w:p>
     <w:p>
@@ -4096,7 +4132,7 @@
           <w:rFonts w:ascii="Arial" w:hAnsi="Arial"/>
           <w:sz w:val="28"/>
         </w:rPr>
-        <w:t xml:space="preserve">52. #19-new — your epiphany: one shape instead of six, the reminder</w:t>
+        <w:t xml:space="preserve">53. #19-new — your epiphany: one shape instead of six, the reminder</w:t>
       </w:r>
     </w:p>
     <w:p>
@@ -4120,7 +4156,7 @@
           <w:rFonts w:ascii="Arial" w:hAnsi="Arial"/>
           <w:sz w:val="28"/>
         </w:rPr>
-        <w:t xml:space="preserve">53. #18-new — the outsider's report checked. The answer was mend</w:t>
+        <w:t xml:space="preserve">54. #18-new — the outsider's report checked. The answer was mend</w:t>
       </w:r>
     </w:p>
     <w:p>
@@ -4156,7 +4192,7 @@
           <w:rFonts w:ascii="Arial" w:hAnsi="Arial"/>
           <w:sz w:val="28"/>
         </w:rPr>
-        <w:t xml:space="preserve">54. #15-new to #17-new — the failure pop-up and the missed-firing</w:t>
+        <w:t xml:space="preserve">55. #15-new to #17-new — the failure pop-up and the missed-firing</w:t>
       </w:r>
     </w:p>
     <w:p>
@@ -4192,7 +4228,7 @@
           <w:rFonts w:ascii="Arial" w:hAnsi="Arial"/>
           <w:sz w:val="28"/>
         </w:rPr>
-        <w:t xml:space="preserve">55. #13-new and #14-new — tapping a reminder lands on its own item</w:t>
+        <w:t xml:space="preserve">56. #13-new and #14-new — tapping a reminder lands on its own item</w:t>
       </w:r>
     </w:p>
     <w:p>
@@ -4216,7 +4252,7 @@
           <w:rFonts w:ascii="Arial" w:hAnsi="Arial"/>
           <w:sz w:val="28"/>
         </w:rPr>
-        <w:t xml:space="preserve">56. #12-new — the Scheduled Reminders screen, showing every</w:t>
+        <w:t xml:space="preserve">57. #12-new — the Scheduled Reminders screen, showing every</w:t>
       </w:r>
     </w:p>
     <w:p>
@@ -4240,7 +4276,7 @@
           <w:rFonts w:ascii="Arial" w:hAnsi="Arial"/>
           <w:sz w:val="28"/>
         </w:rPr>
-        <w:t xml:space="preserve">57. #6-new to #12-new — the scheduler built in eight steps, so one</w:t>
+        <w:t xml:space="preserve">58. #6-new to #12-new — the scheduler built in eight steps, so one</w:t>
       </w:r>
     </w:p>
     <w:p>
@@ -4264,7 +4300,7 @@
           <w:rFonts w:ascii="Arial" w:hAnsi="Arial"/>
           <w:sz w:val="28"/>
         </w:rPr>
-        <w:t xml:space="preserve">58. #4-new — the first notification fixes. Real, and kept, but not</w:t>
+        <w:t xml:space="preserve">59. #4-new — the first notification fixes. Real, and kept, but not</w:t>
       </w:r>
     </w:p>
     <w:p>
@@ -4349,43 +4385,7 @@
           <w:rFonts w:ascii="Arial" w:hAnsi="Arial"/>
           <w:sz w:val="28"/>
         </w:rPr>
-        <w:t xml:space="preserve">2. SKIP — one word, two stories (Grok review). Banner clears a snooze;</w:t>
-      </w:r>
-    </w:p>
-    <w:p>
-      <w:pPr>
-        <w:spacing w:line="276" w:lineRule="auto"/>
-      </w:pPr>
-      <w:r>
-        <w:rPr>
-          <w:rFonts w:ascii="Arial" w:hAnsi="Arial"/>
-          <w:sz w:val="28"/>
-        </w:rPr>
-        <w:t xml:space="preserve">   engine has a skip stamp production never writes. Wire the stamp or</w:t>
-      </w:r>
-    </w:p>
-    <w:p>
-      <w:pPr>
-        <w:spacing w:line="276" w:lineRule="auto"/>
-      </w:pPr>
-      <w:r>
-        <w:rPr>
-          <w:rFonts w:ascii="Arial" w:hAnsi="Arial"/>
-          <w:sz w:val="28"/>
-        </w:rPr>
-        <w:t xml:space="preserve">   drop it?</w:t>
-      </w:r>
-    </w:p>
-    <w:p>
-      <w:pPr>
-        <w:spacing w:line="276" w:lineRule="auto"/>
-      </w:pPr>
-      <w:r>
-        <w:rPr>
-          <w:rFonts w:ascii="Arial" w:hAnsi="Arial"/>
-          <w:sz w:val="28"/>
-        </w:rPr>
-        <w:t xml:space="preserve">3. APPOINTMENTS IN THE MORNING MISS LIST (Grok review). Design says no</w:t>
+        <w:t xml:space="preserve">2. APPOINTMENTS IN THE MORNING MISS LIST (Grok review). Design says no</w:t>
       </w:r>
     </w:p>
     <w:p>
@@ -4421,7 +4421,7 @@
           <w:rFonts w:ascii="Arial" w:hAnsi="Arial"/>
           <w:sz w:val="28"/>
         </w:rPr>
-        <w:t xml:space="preserve">4. RESTORE (Grok review). Items come back; previous health and miss</w:t>
+        <w:t xml:space="preserve">3. RESTORE (Grok review). Items come back; previous health and miss</w:t>
       </w:r>
     </w:p>
     <w:p>
@@ -4445,7 +4445,7 @@
           <w:rFonts w:ascii="Arial" w:hAnsi="Arial"/>
           <w:sz w:val="28"/>
         </w:rPr>
-        <w:t xml:space="preserve">5. CLOCK-STYLE LEADS AND NAMED ZONES (Grok review). "Morning of" uses</w:t>
+        <w:t xml:space="preserve">4. CLOCK-STYLE LEADS AND NAMED ZONES (Grok review). "Morning of" uses</w:t>
       </w:r>
     </w:p>
     <w:p>

</xml_diff>

<commit_message>
75-new - Memory - Copied stray apps into a separate folder.
</commit_message>
<xml_diff>
--- a/docs/pending.docx
+++ b/docs/pending.docx
@@ -24,7 +24,7 @@
           <w:rFonts w:ascii="Arial" w:hAnsi="Arial"/>
           <w:sz w:val="28"/>
         </w:rPr>
-        <w:t xml:space="preserve">Last updated: 2026-09-06 (#74-new — Grok Phase 3 built)</w:t>
+        <w:t xml:space="preserve">Last updated: 2026-09-06 (#75-new — four pages leaving Memory)</w:t>
       </w:r>
     </w:p>
     <w:p>
@@ -192,7 +192,31 @@
           <w:rFonts w:ascii="Arial" w:hAnsi="Arial"/>
           <w:sz w:val="28"/>
         </w:rPr>
-        <w:t xml:space="preserve">Timer and Memory Test are not this list.</w:t>
+        <w:t xml:space="preserve">Timer Alerts, Vault, Shopping List, and Memory Test are leaving</w:t>
+      </w:r>
+    </w:p>
+    <w:p>
+      <w:pPr>
+        <w:spacing w:line="276" w:lineRule="auto"/>
+      </w:pPr>
+      <w:r>
+        <w:rPr>
+          <w:rFonts w:ascii="Arial" w:hAnsi="Arial"/>
+          <w:sz w:val="28"/>
+        </w:rPr>
+        <w:t xml:space="preserve">Memory (#75-new). Do not raise them as engine work. The sitting that</w:t>
+      </w:r>
+    </w:p>
+    <w:p>
+      <w:pPr>
+        <w:spacing w:line="276" w:lineRule="auto"/>
+      </w:pPr>
+      <w:r>
+        <w:rPr>
+          <w:rFonts w:ascii="Arial" w:hAnsi="Arial"/>
+          <w:sz w:val="28"/>
+        </w:rPr>
+        <w:t xml:space="preserve">takes them out of Memory is Pending 12.</w:t>
       </w:r>
     </w:p>
     <w:p>
@@ -253,31 +277,55 @@
           <w:rFonts w:ascii="Arial" w:hAnsi="Arial"/>
           <w:sz w:val="28"/>
         </w:rPr>
-        <w:t xml:space="preserve">GROK PHASE 3 BUILT (#74-new). Appointments do not offer Snooze. Skip</w:t>
-      </w:r>
-    </w:p>
-    <w:p>
-      <w:pPr>
-        <w:spacing w:line="276" w:lineRule="auto"/>
-      </w:pPr>
-      <w:r>
-        <w:rPr>
-          <w:rFonts w:ascii="Arial" w:hAnsi="Arial"/>
-          <w:sz w:val="28"/>
-        </w:rPr>
-        <w:t xml:space="preserve">drops this cycle and arms the next. Not on the phone. Birthdays stay</w:t>
-      </w:r>
-    </w:p>
-    <w:p>
-      <w:pPr>
-        <w:spacing w:line="276" w:lineRule="auto"/>
-      </w:pPr>
-      <w:r>
-        <w:rPr>
-          <w:rFonts w:ascii="Arial" w:hAnsi="Arial"/>
-          <w:sz w:val="28"/>
-        </w:rPr>
-        <w:t xml:space="preserve">on the list.</w:t>
+        <w:t xml:space="preserve">FOUR PAGES LEAVING MEMORY (#75-new). Timer Alerts, Vault, Shopping</w:t>
+      </w:r>
+    </w:p>
+    <w:p>
+      <w:pPr>
+        <w:spacing w:line="276" w:lineRule="auto"/>
+      </w:pPr>
+      <w:r>
+        <w:rPr>
+          <w:rFonts w:ascii="Arial" w:hAnsi="Arial"/>
+          <w:sz w:val="28"/>
+        </w:rPr>
+        <w:t xml:space="preserve">List, and Memory Test will move. Copies of the four page files are in</w:t>
+      </w:r>
+    </w:p>
+    <w:p>
+      <w:pPr>
+        <w:spacing w:line="276" w:lineRule="auto"/>
+      </w:pPr>
+      <w:r>
+        <w:rPr>
+          <w:rFonts w:ascii="Arial" w:hAnsi="Arial"/>
+          <w:sz w:val="28"/>
+        </w:rPr>
+        <w:t xml:space="preserve">Projects/stray apps, as source, not as a running app. Own apps or one</w:t>
+      </w:r>
+    </w:p>
+    <w:p>
+      <w:pPr>
+        <w:spacing w:line="276" w:lineRule="auto"/>
+      </w:pPr>
+      <w:r>
+        <w:rPr>
+          <w:rFonts w:ascii="Arial" w:hAnsi="Arial"/>
+          <w:sz w:val="28"/>
+        </w:rPr>
+        <w:t xml:space="preserve">group app is still open. The pages are still in Memory. What's coming</w:t>
+      </w:r>
+    </w:p>
+    <w:p>
+      <w:pPr>
+        <w:spacing w:line="276" w:lineRule="auto"/>
+      </w:pPr>
+      <w:r>
+        <w:rPr>
+          <w:rFonts w:ascii="Arial" w:hAnsi="Arial"/>
+          <w:sz w:val="28"/>
+        </w:rPr>
+        <w:t xml:space="preserve">in was not settled. Birthdays stay on the list. Merge still waits.</w:t>
       </w:r>
     </w:p>
     <w:p>
@@ -602,31 +650,19 @@
           <w:rFonts w:ascii="Arial" w:hAnsi="Arial"/>
           <w:sz w:val="28"/>
         </w:rPr>
-        <w:t xml:space="preserve">   only as the before chip. Unlike Appointments, it reminds on the birthday</w:t>
-      </w:r>
-    </w:p>
-    <w:p>
-      <w:pPr>
-        <w:spacing w:line="276" w:lineRule="auto"/>
-      </w:pPr>
-      <w:r>
-        <w:rPr>
-          <w:rFonts w:ascii="Arial" w:hAnsi="Arial"/>
-          <w:sz w:val="28"/>
-        </w:rPr>
-        <w:t xml:space="preserve">   itself — **On the day** and **Day Before** are both selectable chips.</w:t>
-      </w:r>
-    </w:p>
-    <w:p>
-      <w:pPr>
-        <w:spacing w:line="276" w:lineRule="auto"/>
-      </w:pPr>
-      <w:r>
-        <w:rPr>
-          <w:rFonts w:ascii="Arial" w:hAnsi="Arial"/>
-          <w:sz w:val="28"/>
-        </w:rPr>
-        <w:t xml:space="preserve">   Build sheet first.</w:t>
+        <w:t xml:space="preserve">   only as the before chip. **On the day** and **Day Before** are both</w:t>
+      </w:r>
+    </w:p>
+    <w:p>
+      <w:pPr>
+        <w:spacing w:line="276" w:lineRule="auto"/>
+      </w:pPr>
+      <w:r>
+        <w:rPr>
+          <w:rFonts w:ascii="Arial" w:hAnsi="Arial"/>
+          <w:sz w:val="28"/>
+        </w:rPr>
+        <w:t xml:space="preserve">   selectable chips. Build sheet first.</w:t>
       </w:r>
     </w:p>
     <w:p>
@@ -914,6 +950,138 @@
           <w:rFonts w:ascii="Arial" w:hAnsi="Arial"/>
           <w:sz w:val="28"/>
         </w:rPr>
+        <w:t xml:space="preserve">12. TAKE THE FOUR PAGES OUT OF MEMORY (Patrick, #75-new). Timer</w:t>
+      </w:r>
+    </w:p>
+    <w:p>
+      <w:pPr>
+        <w:spacing w:line="276" w:lineRule="auto"/>
+      </w:pPr>
+      <w:r>
+        <w:rPr>
+          <w:rFonts w:ascii="Arial" w:hAnsi="Arial"/>
+          <w:sz w:val="28"/>
+        </w:rPr>
+        <w:t xml:space="preserve">   Alerts, Vault, Shopping List, and Memory Test still run here.</w:t>
+      </w:r>
+    </w:p>
+    <w:p>
+      <w:pPr>
+        <w:spacing w:line="276" w:lineRule="auto"/>
+      </w:pPr>
+      <w:r>
+        <w:rPr>
+          <w:rFonts w:ascii="Arial" w:hAnsi="Arial"/>
+          <w:sz w:val="28"/>
+        </w:rPr>
+        <w:t xml:space="preserve">   Source copies are in Projects/stray apps. When they leave:</w:t>
+      </w:r>
+    </w:p>
+    <w:p>
+      <w:pPr>
+        <w:spacing w:line="276" w:lineRule="auto"/>
+      </w:pPr>
+      <w:r>
+        <w:rPr>
+          <w:rFonts w:ascii="Arial" w:hAnsi="Arial"/>
+          <w:sz w:val="28"/>
+        </w:rPr>
+        <w:t xml:space="preserve">   drop the four Home badges and the landscape Memory Test last-row</w:t>
+      </w:r>
+    </w:p>
+    <w:p>
+      <w:pPr>
+        <w:spacing w:line="276" w:lineRule="auto"/>
+      </w:pPr>
+      <w:r>
+        <w:rPr>
+          <w:rFonts w:ascii="Arial" w:hAnsi="Arial"/>
+          <w:sz w:val="28"/>
+        </w:rPr>
+        <w:t xml:space="preserve">   case; drop the four screens and the Memory Test banner landing</w:t>
+      </w:r>
+    </w:p>
+    <w:p>
+      <w:pPr>
+        <w:spacing w:line="276" w:lineRule="auto"/>
+      </w:pPr>
+      <w:r>
+        <w:rPr>
+          <w:rFonts w:ascii="Arial" w:hAnsi="Arial"/>
+          <w:sz w:val="28"/>
+        </w:rPr>
+        <w:t xml:space="preserve">   (Cover stays); drop Extra Vault Security in Settings; stop Backup</w:t>
+      </w:r>
+    </w:p>
+    <w:p>
+      <w:pPr>
+        <w:spacing w:line="276" w:lineRule="auto"/>
+      </w:pPr>
+      <w:r>
+        <w:rPr>
+          <w:rFonts w:ascii="Arial" w:hAnsi="Arial"/>
+          <w:sz w:val="28"/>
+        </w:rPr>
+        <w:t xml:space="preserve">   carrying shopping, the Vault password lock, and Memory Test; drop</w:t>
+      </w:r>
+    </w:p>
+    <w:p>
+      <w:pPr>
+        <w:spacing w:line="276" w:lineRule="auto"/>
+      </w:pPr>
+      <w:r>
+        <w:rPr>
+          <w:rFonts w:ascii="Arial" w:hAnsi="Arial"/>
+          <w:sz w:val="28"/>
+        </w:rPr>
+        <w:t xml:space="preserve">   the four labels in page-names; take Memory Test out of the</w:t>
+      </w:r>
+    </w:p>
+    <w:p>
+      <w:pPr>
+        <w:spacing w:line="276" w:lineRule="auto"/>
+      </w:pPr>
+      <w:r>
+        <w:rPr>
+          <w:rFonts w:ascii="Arial" w:hAnsi="Arial"/>
+          <w:sz w:val="28"/>
+        </w:rPr>
+        <w:t xml:space="preserve">   scheduler (reader, owned source, session load, health and queue</w:t>
+      </w:r>
+    </w:p>
+    <w:p>
+      <w:pPr>
+        <w:spacing w:line="276" w:lineRule="auto"/>
+      </w:pPr>
+      <w:r>
+        <w:rPr>
+          <w:rFonts w:ascii="Arial" w:hAnsi="Arial"/>
+          <w:sz w:val="28"/>
+        </w:rPr>
+        <w:t xml:space="preserve">   names, tests). Timer was never in the engine. Own apps vs one</w:t>
+      </w:r>
+    </w:p>
+    <w:p>
+      <w:pPr>
+        <w:spacing w:line="276" w:lineRule="auto"/>
+      </w:pPr>
+      <w:r>
+        <w:rPr>
+          <w:rFonts w:ascii="Arial" w:hAnsi="Arial"/>
+          <w:sz w:val="28"/>
+        </w:rPr>
+        <w:t xml:space="preserve">   group app is still open. What's coming in was not settled.</w:t>
+      </w:r>
+    </w:p>
+    <w:p>
+      <w:pPr>
+        <w:spacing w:line="276" w:lineRule="auto"/>
+      </w:pPr>
+      <w:r>
+        <w:rPr>
+          <w:rFonts w:ascii="Arial" w:hAnsi="Arial"/>
+          <w:sz w:val="28"/>
+        </w:rPr>
         <w:t xml:space="preserve"/>
       </w:r>
     </w:p>
@@ -1119,19 +1287,19 @@
           <w:rFonts w:ascii="Arial" w:hAnsi="Arial"/>
           <w:sz w:val="28"/>
         </w:rPr>
-        <w:t xml:space="preserve">   There is no reminder at the set time: that is too late; you</w:t>
-      </w:r>
-    </w:p>
-    <w:p>
-      <w:pPr>
-        <w:spacing w:line="276" w:lineRule="auto"/>
-      </w:pPr>
-      <w:r>
-        <w:rPr>
-          <w:rFonts w:ascii="Arial" w:hAnsi="Arial"/>
-          <w:sz w:val="28"/>
-        </w:rPr>
-        <w:t xml:space="preserve">   are either there or you missed it (Patrick, #52-new). The page</w:t>
+        <w:t xml:space="preserve">   They also remind at the set time, like the rest of the app</w:t>
+      </w:r>
+    </w:p>
+    <w:p>
+      <w:pPr>
+        <w:spacing w:line="276" w:lineRule="auto"/>
+      </w:pPr>
+      <w:r>
+        <w:rPr>
+          <w:rFonts w:ascii="Arial" w:hAnsi="Arial"/>
+          <w:sz w:val="28"/>
+        </w:rPr>
+        <w:t xml:space="preserve">   (Patrick, #74-new; reverses #52-new). The page</w:t>
       </w:r>
     </w:p>
     <w:p>
@@ -1768,31 +1936,43 @@
           <w:rFonts w:ascii="Arial" w:hAnsi="Arial"/>
           <w:sz w:val="28"/>
         </w:rPr>
-        <w:t xml:space="preserve">1. #74-new — Grok Phase 3. Appointments do not offer Snooze. Skip</w:t>
-      </w:r>
-    </w:p>
-    <w:p>
-      <w:pPr>
-        <w:spacing w:line="276" w:lineRule="auto"/>
-      </w:pPr>
-      <w:r>
-        <w:rPr>
-          <w:rFonts w:ascii="Arial" w:hAnsi="Arial"/>
-          <w:sz w:val="28"/>
-        </w:rPr>
-        <w:t xml:space="preserve">   writes the engine skip stamp: this cycle is dropped, the next is</w:t>
-      </w:r>
-    </w:p>
-    <w:p>
-      <w:pPr>
-        <w:spacing w:line="276" w:lineRule="auto"/>
-      </w:pPr>
-      <w:r>
-        <w:rPr>
-          <w:rFonts w:ascii="Arial" w:hAnsi="Arial"/>
-          <w:sz w:val="28"/>
-        </w:rPr>
-        <w:t xml:space="preserve">   armed. Mac 304. TypeScript clean. Not on the phone.</w:t>
+        <w:t xml:space="preserve">1. #75-new — four pages leaving Memory. Timer Alerts, Vault, Shopping</w:t>
+      </w:r>
+    </w:p>
+    <w:p>
+      <w:pPr>
+        <w:spacing w:line="276" w:lineRule="auto"/>
+      </w:pPr>
+      <w:r>
+        <w:rPr>
+          <w:rFonts w:ascii="Arial" w:hAnsi="Arial"/>
+          <w:sz w:val="28"/>
+        </w:rPr>
+        <w:t xml:space="preserve">   List, and Memory Test will move. Copies of the four page files are</w:t>
+      </w:r>
+    </w:p>
+    <w:p>
+      <w:pPr>
+        <w:spacing w:line="276" w:lineRule="auto"/>
+      </w:pPr>
+      <w:r>
+        <w:rPr>
+          <w:rFonts w:ascii="Arial" w:hAnsi="Arial"/>
+          <w:sz w:val="28"/>
+        </w:rPr>
+        <w:t xml:space="preserve">   in Projects/stray apps, as source, not as a running app. Memory was</w:t>
+      </w:r>
+    </w:p>
+    <w:p>
+      <w:pPr>
+        <w:spacing w:line="276" w:lineRule="auto"/>
+      </w:pPr>
+      <w:r>
+        <w:rPr>
+          <w:rFonts w:ascii="Arial" w:hAnsi="Arial"/>
+          <w:sz w:val="28"/>
+        </w:rPr>
+        <w:t xml:space="preserve">   not stripped. What's coming in was not settled. Merge still waits.</w:t>
       </w:r>
     </w:p>
     <w:p>
@@ -1816,7 +1996,67 @@
           <w:rFonts w:ascii="Arial" w:hAnsi="Arial"/>
           <w:sz w:val="28"/>
         </w:rPr>
-        <w:t xml:space="preserve">2. #73-new — one apply-then-schedule door. Banner, Siri, pages,</w:t>
+        <w:t xml:space="preserve">2. #74-new — Grok Phase 3, and Appointments at the set time. Appointments</w:t>
+      </w:r>
+    </w:p>
+    <w:p>
+      <w:pPr>
+        <w:spacing w:line="276" w:lineRule="auto"/>
+      </w:pPr>
+      <w:r>
+        <w:rPr>
+          <w:rFonts w:ascii="Arial" w:hAnsi="Arial"/>
+          <w:sz w:val="28"/>
+        </w:rPr>
+        <w:t xml:space="preserve">   do not offer Snooze. Skip writes the engine skip stamp. Appointments</w:t>
+      </w:r>
+    </w:p>
+    <w:p>
+      <w:pPr>
+        <w:spacing w:line="276" w:lineRule="auto"/>
+      </w:pPr>
+      <w:r>
+        <w:rPr>
+          <w:rFonts w:ascii="Arial" w:hAnsi="Arial"/>
+          <w:sz w:val="28"/>
+        </w:rPr>
+        <w:t xml:space="preserve">   fire at the set time as well as any before chips. Mac 304. TypeScript</w:t>
+      </w:r>
+    </w:p>
+    <w:p>
+      <w:pPr>
+        <w:spacing w:line="276" w:lineRule="auto"/>
+      </w:pPr>
+      <w:r>
+        <w:rPr>
+          <w:rFonts w:ascii="Arial" w:hAnsi="Arial"/>
+          <w:sz w:val="28"/>
+        </w:rPr>
+        <w:t xml:space="preserve">   clean. Not on the phone.</w:t>
+      </w:r>
+    </w:p>
+    <w:p>
+      <w:pPr>
+        <w:spacing w:line="276" w:lineRule="auto"/>
+      </w:pPr>
+      <w:r>
+        <w:rPr>
+          <w:rFonts w:ascii="Arial" w:hAnsi="Arial"/>
+          <w:sz w:val="28"/>
+        </w:rPr>
+        <w:t xml:space="preserve"/>
+      </w:r>
+    </w:p>
+    <w:p>
+      <w:pPr>
+        <w:spacing w:line="276" w:lineRule="auto"/>
+      </w:pPr>
+      <w:r>
+        <w:rPr>
+          <w:rFonts w:ascii="Arial" w:hAnsi="Arial"/>
+          <w:sz w:val="28"/>
+        </w:rPr>
+        <w:t xml:space="preserve">3. #73-new — one apply-then-schedule door. Banner, Siri, pages,</w:t>
       </w:r>
     </w:p>
     <w:p>
@@ -4385,90 +4625,6 @@
           <w:rFonts w:ascii="Arial" w:hAnsi="Arial"/>
           <w:sz w:val="28"/>
         </w:rPr>
-        <w:t xml:space="preserve">2. APPOINTMENTS IN THE MORNING MISS LIST (Grok review). Design says no</w:t>
-      </w:r>
-    </w:p>
-    <w:p>
-      <w:pPr>
-        <w:spacing w:line="276" w:lineRule="auto"/>
-      </w:pPr>
-      <w:r>
-        <w:rPr>
-          <w:rFonts w:ascii="Arial" w:hAnsi="Arial"/>
-          <w:sz w:val="28"/>
-        </w:rPr>
-        <w:t xml:space="preserve">   reminder at appointment time; rollover still lists them as hanging.</w:t>
-      </w:r>
-    </w:p>
-    <w:p>
-      <w:pPr>
-        <w:spacing w:line="276" w:lineRule="auto"/>
-      </w:pPr>
-      <w:r>
-        <w:rPr>
-          <w:rFonts w:ascii="Arial" w:hAnsi="Arial"/>
-          <w:sz w:val="28"/>
-        </w:rPr>
-        <w:t xml:space="preserve">   Intentional or noise?</w:t>
-      </w:r>
-    </w:p>
-    <w:p>
-      <w:pPr>
-        <w:spacing w:line="276" w:lineRule="auto"/>
-      </w:pPr>
-      <w:r>
-        <w:rPr>
-          <w:rFonts w:ascii="Arial" w:hAnsi="Arial"/>
-          <w:sz w:val="28"/>
-        </w:rPr>
-        <w:t xml:space="preserve">3. RESTORE (Grok review). Items come back; previous health and miss</w:t>
-      </w:r>
-    </w:p>
-    <w:p>
-      <w:pPr>
-        <w:spacing w:line="276" w:lineRule="auto"/>
-      </w:pPr>
-      <w:r>
-        <w:rPr>
-          <w:rFonts w:ascii="Arial" w:hAnsi="Arial"/>
-          <w:sz w:val="28"/>
-        </w:rPr>
-        <w:t xml:space="preserve">   lists stay. Clear them or leave them?</w:t>
-      </w:r>
-    </w:p>
-    <w:p>
-      <w:pPr>
-        <w:spacing w:line="276" w:lineRule="auto"/>
-      </w:pPr>
-      <w:r>
-        <w:rPr>
-          <w:rFonts w:ascii="Arial" w:hAnsi="Arial"/>
-          <w:sz w:val="28"/>
-        </w:rPr>
-        <w:t xml:space="preserve">4. CLOCK-STYLE LEADS AND NAMED ZONES (Grok review). "Morning of" uses</w:t>
-      </w:r>
-    </w:p>
-    <w:p>
-      <w:pPr>
-        <w:spacing w:line="276" w:lineRule="auto"/>
-      </w:pPr>
-      <w:r>
-        <w:rPr>
-          <w:rFonts w:ascii="Arial" w:hAnsi="Arial"/>
-          <w:sz w:val="28"/>
-        </w:rPr>
-        <w:t xml:space="preserve">   the phone zone even when the appointment has a named zone.</w:t>
-      </w:r>
-    </w:p>
-    <w:p>
-      <w:pPr>
-        <w:spacing w:line="276" w:lineRule="auto"/>
-      </w:pPr>
-      <w:r>
-        <w:rPr>
-          <w:rFonts w:ascii="Arial" w:hAnsi="Arial"/>
-          <w:sz w:val="28"/>
-        </w:rPr>
         <w:t xml:space="preserve"/>
       </w:r>
     </w:p>
@@ -5023,79 +5179,67 @@
           <w:rFonts w:ascii="Arial" w:hAnsi="Arial"/>
           <w:sz w:val="28"/>
         </w:rPr>
-        <w:t xml:space="preserve">   works fine for your one-device use. Only revisit if you raise</w:t>
-      </w:r>
-    </w:p>
-    <w:p>
-      <w:pPr>
-        <w:spacing w:line="276" w:lineRule="auto"/>
-      </w:pPr>
-      <w:r>
-        <w:rPr>
-          <w:rFonts w:ascii="Arial" w:hAnsi="Arial"/>
-          <w:sz w:val="28"/>
-        </w:rPr>
-        <w:t xml:space="preserve">   it.</w:t>
-      </w:r>
-    </w:p>
-    <w:p>
-      <w:pPr>
-        <w:spacing w:line="276" w:lineRule="auto"/>
-      </w:pPr>
-      <w:r>
-        <w:rPr>
-          <w:rFonts w:ascii="Arial" w:hAnsi="Arial"/>
-          <w:sz w:val="28"/>
-        </w:rPr>
-        <w:t xml:space="preserve">3. Import files/documents into the Vault — PARKED (#69). The idea</w:t>
-      </w:r>
-    </w:p>
-    <w:p>
-      <w:pPr>
-        <w:spacing w:line="276" w:lineRule="auto"/>
-      </w:pPr>
-      <w:r>
-        <w:rPr>
-          <w:rFonts w:ascii="Arial" w:hAnsi="Arial"/>
-          <w:sz w:val="28"/>
-        </w:rPr>
-        <w:t xml:space="preserve">   became "Vault pages" (paste text straight into a Vault item, no</w:t>
-      </w:r>
-    </w:p>
-    <w:p>
-      <w:pPr>
-        <w:spacing w:line="276" w:lineRule="auto"/>
-      </w:pPr>
-      <w:r>
-        <w:rPr>
-          <w:rFonts w:ascii="Arial" w:hAnsi="Arial"/>
-          <w:sz w:val="28"/>
-        </w:rPr>
-        <w:t xml:space="preserve">   files) in the #68 roadmap; in #69 you started the talk-through,</w:t>
-      </w:r>
-    </w:p>
-    <w:p>
-      <w:pPr>
-        <w:spacing w:line="276" w:lineRule="auto"/>
-      </w:pPr>
-      <w:r>
-        <w:rPr>
-          <w:rFonts w:ascii="Arial" w:hAnsi="Arial"/>
-          <w:sz w:val="28"/>
-        </w:rPr>
-        <w:t xml:space="preserve">   weren't ready, and parked the whole thing. The Vault stays as it</w:t>
-      </w:r>
-    </w:p>
-    <w:p>
-      <w:pPr>
-        <w:spacing w:line="276" w:lineRule="auto"/>
-      </w:pPr>
-      <w:r>
-        <w:rPr>
-          <w:rFonts w:ascii="Arial" w:hAnsi="Arial"/>
-          <w:sz w:val="28"/>
-        </w:rPr>
-        <w:t xml:space="preserve">   is until you run into a real need. Not to be re-raised.</w:t>
+        <w:t xml:space="preserve">   works fine for your one-device use. Raised at #75-new, then</w:t>
+      </w:r>
+    </w:p>
+    <w:p>
+      <w:pPr>
+        <w:spacing w:line="276" w:lineRule="auto"/>
+      </w:pPr>
+      <w:r>
+        <w:rPr>
+          <w:rFonts w:ascii="Arial" w:hAnsi="Arial"/>
+          <w:sz w:val="28"/>
+        </w:rPr>
+        <w:t xml:space="preserve">   deferred so pages in and out could be settled first. Leftover</w:t>
+      </w:r>
+    </w:p>
+    <w:p>
+      <w:pPr>
+        <w:spacing w:line="276" w:lineRule="auto"/>
+      </w:pPr>
+      <w:r>
+        <w:rPr>
+          <w:rFonts w:ascii="Arial" w:hAnsi="Arial"/>
+          <w:sz w:val="28"/>
+        </w:rPr>
+        <w:t xml:space="preserve">   health and miss lists after a restore wait for that same sitting</w:t>
+      </w:r>
+    </w:p>
+    <w:p>
+      <w:pPr>
+        <w:spacing w:line="276" w:lineRule="auto"/>
+      </w:pPr>
+      <w:r>
+        <w:rPr>
+          <w:rFonts w:ascii="Arial" w:hAnsi="Arial"/>
+          <w:sz w:val="28"/>
+        </w:rPr>
+        <w:t xml:space="preserve">   (Patrick, #74-new).</w:t>
+      </w:r>
+    </w:p>
+    <w:p>
+      <w:pPr>
+        <w:spacing w:line="276" w:lineRule="auto"/>
+      </w:pPr>
+      <w:r>
+        <w:rPr>
+          <w:rFonts w:ascii="Arial" w:hAnsi="Arial"/>
+          <w:sz w:val="28"/>
+        </w:rPr>
+        <w:t xml:space="preserve">3. Import files/documents into the Vault — PARKED (#69). Travels with</w:t>
+      </w:r>
+    </w:p>
+    <w:p>
+      <w:pPr>
+        <w:spacing w:line="276" w:lineRule="auto"/>
+      </w:pPr>
+      <w:r>
+        <w:rPr>
+          <w:rFonts w:ascii="Arial" w:hAnsi="Arial"/>
+          <w:sz w:val="28"/>
+        </w:rPr>
+        <w:t xml:space="preserve">   Vault to stray apps (#75-new). Not to be re-raised in Memory.</w:t>
       </w:r>
     </w:p>
     <w:p>

</xml_diff>

<commit_message>
76-new - Memory stray apps removed.
</commit_message>
<xml_diff>
--- a/docs/pending.docx
+++ b/docs/pending.docx
@@ -24,7 +24,7 @@
           <w:rFonts w:ascii="Arial" w:hAnsi="Arial"/>
           <w:sz w:val="28"/>
         </w:rPr>
-        <w:t xml:space="preserve">Last updated: 2026-09-06 (#75-new — four pages leaving Memory)</w:t>
+        <w:t xml:space="preserve">Last updated: 2026-09-06 (#76-new — four pages out of Memory)</w:t>
       </w:r>
     </w:p>
     <w:p>
@@ -192,31 +192,43 @@
           <w:rFonts w:ascii="Arial" w:hAnsi="Arial"/>
           <w:sz w:val="28"/>
         </w:rPr>
-        <w:t xml:space="preserve">Timer Alerts, Vault, Shopping List, and Memory Test are leaving</w:t>
-      </w:r>
-    </w:p>
-    <w:p>
-      <w:pPr>
-        <w:spacing w:line="276" w:lineRule="auto"/>
-      </w:pPr>
-      <w:r>
-        <w:rPr>
-          <w:rFonts w:ascii="Arial" w:hAnsi="Arial"/>
-          <w:sz w:val="28"/>
-        </w:rPr>
-        <w:t xml:space="preserve">Memory (#75-new). Do not raise them as engine work. The sitting that</w:t>
-      </w:r>
-    </w:p>
-    <w:p>
-      <w:pPr>
-        <w:spacing w:line="276" w:lineRule="auto"/>
-      </w:pPr>
-      <w:r>
-        <w:rPr>
-          <w:rFonts w:ascii="Arial" w:hAnsi="Arial"/>
-          <w:sz w:val="28"/>
-        </w:rPr>
-        <w:t xml:space="preserve">takes them out of Memory is Pending 12.</w:t>
+        <w:t xml:space="preserve">Timer Alerts, Vault, Shopping List, and Memory Test left Memory at</w:t>
+      </w:r>
+    </w:p>
+    <w:p>
+      <w:pPr>
+        <w:spacing w:line="276" w:lineRule="auto"/>
+      </w:pPr>
+      <w:r>
+        <w:rPr>
+          <w:rFonts w:ascii="Arial" w:hAnsi="Arial"/>
+          <w:sz w:val="28"/>
+        </w:rPr>
+        <w:t xml:space="preserve">#76-new. Copies stay in Projects/stray apps. Do not raise them as</w:t>
+      </w:r>
+    </w:p>
+    <w:p>
+      <w:pPr>
+        <w:spacing w:line="276" w:lineRule="auto"/>
+      </w:pPr>
+      <w:r>
+        <w:rPr>
+          <w:rFonts w:ascii="Arial" w:hAnsi="Arial"/>
+          <w:sz w:val="28"/>
+        </w:rPr>
+        <w:t xml:space="preserve">engine work. The shopping list is wanted later, with a backup of its</w:t>
+      </w:r>
+    </w:p>
+    <w:p>
+      <w:pPr>
+        <w:spacing w:line="276" w:lineRule="auto"/>
+      </w:pPr>
+      <w:r>
+        <w:rPr>
+          <w:rFonts w:ascii="Arial" w:hAnsi="Arial"/>
+          <w:sz w:val="28"/>
+        </w:rPr>
+        <w:t xml:space="preserve">own.</w:t>
       </w:r>
     </w:p>
     <w:p>
@@ -277,55 +289,19 @@
           <w:rFonts w:ascii="Arial" w:hAnsi="Arial"/>
           <w:sz w:val="28"/>
         </w:rPr>
-        <w:t xml:space="preserve">FOUR PAGES LEAVING MEMORY (#75-new). Timer Alerts, Vault, Shopping</w:t>
-      </w:r>
-    </w:p>
-    <w:p>
-      <w:pPr>
-        <w:spacing w:line="276" w:lineRule="auto"/>
-      </w:pPr>
-      <w:r>
-        <w:rPr>
-          <w:rFonts w:ascii="Arial" w:hAnsi="Arial"/>
-          <w:sz w:val="28"/>
-        </w:rPr>
-        <w:t xml:space="preserve">List, and Memory Test will move. Copies of the four page files are in</w:t>
-      </w:r>
-    </w:p>
-    <w:p>
-      <w:pPr>
-        <w:spacing w:line="276" w:lineRule="auto"/>
-      </w:pPr>
-      <w:r>
-        <w:rPr>
-          <w:rFonts w:ascii="Arial" w:hAnsi="Arial"/>
-          <w:sz w:val="28"/>
-        </w:rPr>
-        <w:t xml:space="preserve">Projects/stray apps, as source, not as a running app. Own apps or one</w:t>
-      </w:r>
-    </w:p>
-    <w:p>
-      <w:pPr>
-        <w:spacing w:line="276" w:lineRule="auto"/>
-      </w:pPr>
-      <w:r>
-        <w:rPr>
-          <w:rFonts w:ascii="Arial" w:hAnsi="Arial"/>
-          <w:sz w:val="28"/>
-        </w:rPr>
-        <w:t xml:space="preserve">group app is still open. The pages are still in Memory. What's coming</w:t>
-      </w:r>
-    </w:p>
-    <w:p>
-      <w:pPr>
-        <w:spacing w:line="276" w:lineRule="auto"/>
-      </w:pPr>
-      <w:r>
-        <w:rPr>
-          <w:rFonts w:ascii="Arial" w:hAnsi="Arial"/>
-          <w:sz w:val="28"/>
-        </w:rPr>
-        <w:t xml:space="preserve">in was not settled. Birthdays stay on the list. Merge still waits.</w:t>
+        <w:t xml:space="preserve">MERGE AND RESTORE LEFTOVERS. Restore still leaves the old health and</w:t>
+      </w:r>
+    </w:p>
+    <w:p>
+      <w:pPr>
+        <w:spacing w:line="276" w:lineRule="auto"/>
+      </w:pPr>
+      <w:r>
+        <w:rPr>
+          <w:rFonts w:ascii="Arial" w:hAnsi="Arial"/>
+          <w:sz w:val="28"/>
+        </w:rPr>
+        <w:t xml:space="preserve">miss lists standing. Pages in and out is done.</w:t>
       </w:r>
     </w:p>
     <w:p>
@@ -950,138 +926,6 @@
           <w:rFonts w:ascii="Arial" w:hAnsi="Arial"/>
           <w:sz w:val="28"/>
         </w:rPr>
-        <w:t xml:space="preserve">12. TAKE THE FOUR PAGES OUT OF MEMORY (Patrick, #75-new). Timer</w:t>
-      </w:r>
-    </w:p>
-    <w:p>
-      <w:pPr>
-        <w:spacing w:line="276" w:lineRule="auto"/>
-      </w:pPr>
-      <w:r>
-        <w:rPr>
-          <w:rFonts w:ascii="Arial" w:hAnsi="Arial"/>
-          <w:sz w:val="28"/>
-        </w:rPr>
-        <w:t xml:space="preserve">   Alerts, Vault, Shopping List, and Memory Test still run here.</w:t>
-      </w:r>
-    </w:p>
-    <w:p>
-      <w:pPr>
-        <w:spacing w:line="276" w:lineRule="auto"/>
-      </w:pPr>
-      <w:r>
-        <w:rPr>
-          <w:rFonts w:ascii="Arial" w:hAnsi="Arial"/>
-          <w:sz w:val="28"/>
-        </w:rPr>
-        <w:t xml:space="preserve">   Source copies are in Projects/stray apps. When they leave:</w:t>
-      </w:r>
-    </w:p>
-    <w:p>
-      <w:pPr>
-        <w:spacing w:line="276" w:lineRule="auto"/>
-      </w:pPr>
-      <w:r>
-        <w:rPr>
-          <w:rFonts w:ascii="Arial" w:hAnsi="Arial"/>
-          <w:sz w:val="28"/>
-        </w:rPr>
-        <w:t xml:space="preserve">   drop the four Home badges and the landscape Memory Test last-row</w:t>
-      </w:r>
-    </w:p>
-    <w:p>
-      <w:pPr>
-        <w:spacing w:line="276" w:lineRule="auto"/>
-      </w:pPr>
-      <w:r>
-        <w:rPr>
-          <w:rFonts w:ascii="Arial" w:hAnsi="Arial"/>
-          <w:sz w:val="28"/>
-        </w:rPr>
-        <w:t xml:space="preserve">   case; drop the four screens and the Memory Test banner landing</w:t>
-      </w:r>
-    </w:p>
-    <w:p>
-      <w:pPr>
-        <w:spacing w:line="276" w:lineRule="auto"/>
-      </w:pPr>
-      <w:r>
-        <w:rPr>
-          <w:rFonts w:ascii="Arial" w:hAnsi="Arial"/>
-          <w:sz w:val="28"/>
-        </w:rPr>
-        <w:t xml:space="preserve">   (Cover stays); drop Extra Vault Security in Settings; stop Backup</w:t>
-      </w:r>
-    </w:p>
-    <w:p>
-      <w:pPr>
-        <w:spacing w:line="276" w:lineRule="auto"/>
-      </w:pPr>
-      <w:r>
-        <w:rPr>
-          <w:rFonts w:ascii="Arial" w:hAnsi="Arial"/>
-          <w:sz w:val="28"/>
-        </w:rPr>
-        <w:t xml:space="preserve">   carrying shopping, the Vault password lock, and Memory Test; drop</w:t>
-      </w:r>
-    </w:p>
-    <w:p>
-      <w:pPr>
-        <w:spacing w:line="276" w:lineRule="auto"/>
-      </w:pPr>
-      <w:r>
-        <w:rPr>
-          <w:rFonts w:ascii="Arial" w:hAnsi="Arial"/>
-          <w:sz w:val="28"/>
-        </w:rPr>
-        <w:t xml:space="preserve">   the four labels in page-names; take Memory Test out of the</w:t>
-      </w:r>
-    </w:p>
-    <w:p>
-      <w:pPr>
-        <w:spacing w:line="276" w:lineRule="auto"/>
-      </w:pPr>
-      <w:r>
-        <w:rPr>
-          <w:rFonts w:ascii="Arial" w:hAnsi="Arial"/>
-          <w:sz w:val="28"/>
-        </w:rPr>
-        <w:t xml:space="preserve">   scheduler (reader, owned source, session load, health and queue</w:t>
-      </w:r>
-    </w:p>
-    <w:p>
-      <w:pPr>
-        <w:spacing w:line="276" w:lineRule="auto"/>
-      </w:pPr>
-      <w:r>
-        <w:rPr>
-          <w:rFonts w:ascii="Arial" w:hAnsi="Arial"/>
-          <w:sz w:val="28"/>
-        </w:rPr>
-        <w:t xml:space="preserve">   names, tests). Timer was never in the engine. Own apps vs one</w:t>
-      </w:r>
-    </w:p>
-    <w:p>
-      <w:pPr>
-        <w:spacing w:line="276" w:lineRule="auto"/>
-      </w:pPr>
-      <w:r>
-        <w:rPr>
-          <w:rFonts w:ascii="Arial" w:hAnsi="Arial"/>
-          <w:sz w:val="28"/>
-        </w:rPr>
-        <w:t xml:space="preserve">   group app is still open. What's coming in was not settled.</w:t>
-      </w:r>
-    </w:p>
-    <w:p>
-      <w:pPr>
-        <w:spacing w:line="276" w:lineRule="auto"/>
-      </w:pPr>
-      <w:r>
-        <w:rPr>
-          <w:rFonts w:ascii="Arial" w:hAnsi="Arial"/>
-          <w:sz w:val="28"/>
-        </w:rPr>
         <w:t xml:space="preserve"/>
       </w:r>
     </w:p>
@@ -1936,7 +1780,91 @@
           <w:rFonts w:ascii="Arial" w:hAnsi="Arial"/>
           <w:sz w:val="28"/>
         </w:rPr>
-        <w:t xml:space="preserve">1. #75-new — four pages leaving Memory. Timer Alerts, Vault, Shopping</w:t>
+        <w:t xml:space="preserve">1. #76-new — four pages out of Memory. Timer Alerts, Vault, Shopping</w:t>
+      </w:r>
+    </w:p>
+    <w:p>
+      <w:pPr>
+        <w:spacing w:line="276" w:lineRule="auto"/>
+      </w:pPr>
+      <w:r>
+        <w:rPr>
+          <w:rFonts w:ascii="Arial" w:hAnsi="Arial"/>
+          <w:sz w:val="28"/>
+        </w:rPr>
+        <w:t xml:space="preserve">   List, and Memory Test are gone from the live app. Copies remain in</w:t>
+      </w:r>
+    </w:p>
+    <w:p>
+      <w:pPr>
+        <w:spacing w:line="276" w:lineRule="auto"/>
+      </w:pPr>
+      <w:r>
+        <w:rPr>
+          <w:rFonts w:ascii="Arial" w:hAnsi="Arial"/>
+          <w:sz w:val="28"/>
+        </w:rPr>
+        <w:t xml:space="preserve">   Projects/stray apps. Shopping list wanted later with its own backup;</w:t>
+      </w:r>
+    </w:p>
+    <w:p>
+      <w:pPr>
+        <w:spacing w:line="276" w:lineRule="auto"/>
+      </w:pPr>
+      <w:r>
+        <w:rPr>
+          <w:rFonts w:ascii="Arial" w:hAnsi="Arial"/>
+          <w:sz w:val="28"/>
+        </w:rPr>
+        <w:t xml:space="preserve">   the list on the phone was dropped. Vault was empty. Memory Test data</w:t>
+      </w:r>
+    </w:p>
+    <w:p>
+      <w:pPr>
+        <w:spacing w:line="276" w:lineRule="auto"/>
+      </w:pPr>
+      <w:r>
+        <w:rPr>
+          <w:rFonts w:ascii="Arial" w:hAnsi="Arial"/>
+          <w:sz w:val="28"/>
+        </w:rPr>
+        <w:t xml:space="preserve">   and engine pieces were dropped. Backup no longer carries them. Mac 298.</w:t>
+      </w:r>
+    </w:p>
+    <w:p>
+      <w:pPr>
+        <w:spacing w:line="276" w:lineRule="auto"/>
+      </w:pPr>
+      <w:r>
+        <w:rPr>
+          <w:rFonts w:ascii="Arial" w:hAnsi="Arial"/>
+          <w:sz w:val="28"/>
+        </w:rPr>
+        <w:t xml:space="preserve">   TypeScript clean.</w:t>
+      </w:r>
+    </w:p>
+    <w:p>
+      <w:pPr>
+        <w:spacing w:line="276" w:lineRule="auto"/>
+      </w:pPr>
+      <w:r>
+        <w:rPr>
+          <w:rFonts w:ascii="Arial" w:hAnsi="Arial"/>
+          <w:sz w:val="28"/>
+        </w:rPr>
+        <w:t xml:space="preserve"/>
+      </w:r>
+    </w:p>
+    <w:p>
+      <w:pPr>
+        <w:spacing w:line="276" w:lineRule="auto"/>
+      </w:pPr>
+      <w:r>
+        <w:rPr>
+          <w:rFonts w:ascii="Arial" w:hAnsi="Arial"/>
+          <w:sz w:val="28"/>
+        </w:rPr>
+        <w:t xml:space="preserve">2. #75-new — four pages leaving Memory. Timer Alerts, Vault, Shopping</w:t>
       </w:r>
     </w:p>
     <w:p>
@@ -1996,7 +1924,7 @@
           <w:rFonts w:ascii="Arial" w:hAnsi="Arial"/>
           <w:sz w:val="28"/>
         </w:rPr>
-        <w:t xml:space="preserve">2. #74-new — Grok Phase 3, and Appointments at the set time. Appointments</w:t>
+        <w:t xml:space="preserve">3. #74-new — Grok Phase 3, and Appointments at the set time. Appointments</w:t>
       </w:r>
     </w:p>
     <w:p>

</xml_diff>

<commit_message>
77-new - Memory document Add Merge to Restore
</commit_message>
<xml_diff>
--- a/docs/pending.docx
+++ b/docs/pending.docx
@@ -24,7 +24,7 @@
           <w:rFonts w:ascii="Arial" w:hAnsi="Arial"/>
           <w:sz w:val="28"/>
         </w:rPr>
-        <w:t xml:space="preserve">Last updated: 2026-09-06 (#76-new — four pages out of Memory)</w:t>
+        <w:t xml:space="preserve">Last updated: 2026-09-06 (#77-new — Restore with Merge done)</w:t>
       </w:r>
     </w:p>
     <w:p>
@@ -289,19 +289,31 @@
           <w:rFonts w:ascii="Arial" w:hAnsi="Arial"/>
           <w:sz w:val="28"/>
         </w:rPr>
-        <w:t xml:space="preserve">MERGE AND RESTORE LEFTOVERS. Restore still leaves the old health and</w:t>
-      </w:r>
-    </w:p>
-    <w:p>
-      <w:pPr>
-        <w:spacing w:line="276" w:lineRule="auto"/>
-      </w:pPr>
-      <w:r>
-        <w:rPr>
-          <w:rFonts w:ascii="Arial" w:hAnsi="Arial"/>
-          <w:sz w:val="28"/>
-        </w:rPr>
-        <w:t xml:space="preserve">miss lists standing. Pages in and out is done.</w:t>
+        <w:t xml:space="preserve">DAILY SAVE LANDS ON APPOINTMENTS (Patrick, #77-new). New items entered</w:t>
+      </w:r>
+    </w:p>
+    <w:p>
+      <w:pPr>
+        <w:spacing w:line="276" w:lineRule="auto"/>
+      </w:pPr>
+      <w:r>
+        <w:rPr>
+          <w:rFonts w:ascii="Arial" w:hAnsi="Arial"/>
+          <w:sz w:val="28"/>
+        </w:rPr>
+        <w:t xml:space="preserve">on Daily, then Save, drop him in Appointments with those items, not</w:t>
+      </w:r>
+    </w:p>
+    <w:p>
+      <w:pPr>
+        <w:spacing w:line="276" w:lineRule="auto"/>
+      </w:pPr>
+      <w:r>
+        <w:rPr>
+          <w:rFonts w:ascii="Arial" w:hAnsi="Arial"/>
+          <w:sz w:val="28"/>
+        </w:rPr>
+        <w:t xml:space="preserve">Daily. Next bug to fix.</w:t>
       </w:r>
     </w:p>
     <w:p>
@@ -349,31 +361,31 @@
           <w:rFonts w:ascii="Arial" w:hAnsi="Arial"/>
           <w:sz w:val="28"/>
         </w:rPr>
-        <w:t xml:space="preserve">(#72-new, committed), the one-door (#73-new, committed), and Phase 3</w:t>
-      </w:r>
-    </w:p>
-    <w:p>
-      <w:pPr>
-        <w:spacing w:line="276" w:lineRule="auto"/>
-      </w:pPr>
-      <w:r>
-        <w:rPr>
-          <w:rFonts w:ascii="Arial" w:hAnsi="Arial"/>
-          <w:sz w:val="28"/>
-        </w:rPr>
-        <w:t xml:space="preserve">(#74-new, built) are not on the phone. Last load is #67-new. Paperwork</w:t>
-      </w:r>
-    </w:p>
-    <w:p>
-      <w:pPr>
-        <w:spacing w:line="276" w:lineRule="auto"/>
-      </w:pPr>
-      <w:r>
-        <w:rPr>
-          <w:rFonts w:ascii="Arial" w:hAnsi="Arial"/>
-          <w:sz w:val="28"/>
-        </w:rPr>
-        <w:t xml:space="preserve">is Pending 8–11.</w:t>
+        <w:t xml:space="preserve">(#72-new, committed), the one-door (#73-new, committed), Phase 3</w:t>
+      </w:r>
+    </w:p>
+    <w:p>
+      <w:pPr>
+        <w:spacing w:line="276" w:lineRule="auto"/>
+      </w:pPr>
+      <w:r>
+        <w:rPr>
+          <w:rFonts w:ascii="Arial" w:hAnsi="Arial"/>
+          <w:sz w:val="28"/>
+        </w:rPr>
+        <w:t xml:space="preserve">(#74-new, built), and Restore with Merge (#77-new, done) are not on the</w:t>
+      </w:r>
+    </w:p>
+    <w:p>
+      <w:pPr>
+        <w:spacing w:line="276" w:lineRule="auto"/>
+      </w:pPr>
+      <w:r>
+        <w:rPr>
+          <w:rFonts w:ascii="Arial" w:hAnsi="Arial"/>
+          <w:sz w:val="28"/>
+        </w:rPr>
+        <w:t xml:space="preserve">phone. Last load is #67-new. Paperwork is Pending 8–11.</w:t>
       </w:r>
     </w:p>
     <w:p>
@@ -494,7 +506,7 @@
           <w:rFonts w:ascii="Arial" w:hAnsi="Arial"/>
           <w:sz w:val="28"/>
         </w:rPr>
-        <w:t xml:space="preserve">   the one-door (#73-new, committed), and Grok Phase 3 (#74-new, built).</w:t>
+        <w:t xml:space="preserve">   the one-door (#73-new, committed),    Grok Phase 3 (#74-new, built), and Restore with Merge (#77-new, done).</w:t>
       </w:r>
     </w:p>
     <w:p>
@@ -926,6 +938,42 @@
           <w:rFonts w:ascii="Arial" w:hAnsi="Arial"/>
           <w:sz w:val="28"/>
         </w:rPr>
+        <w:t xml:space="preserve">12. DAILY SAVE LANDS ON APPOINTMENTS (Patrick, #77-new). New items</w:t>
+      </w:r>
+    </w:p>
+    <w:p>
+      <w:pPr>
+        <w:spacing w:line="276" w:lineRule="auto"/>
+      </w:pPr>
+      <w:r>
+        <w:rPr>
+          <w:rFonts w:ascii="Arial" w:hAnsi="Arial"/>
+          <w:sz w:val="28"/>
+        </w:rPr>
+        <w:t xml:space="preserve">   entered on Daily, then Save, drop him in Appointments with those</w:t>
+      </w:r>
+    </w:p>
+    <w:p>
+      <w:pPr>
+        <w:spacing w:line="276" w:lineRule="auto"/>
+      </w:pPr>
+      <w:r>
+        <w:rPr>
+          <w:rFonts w:ascii="Arial" w:hAnsi="Arial"/>
+          <w:sz w:val="28"/>
+        </w:rPr>
+        <w:t xml:space="preserve">   items, not Daily.</w:t>
+      </w:r>
+    </w:p>
+    <w:p>
+      <w:pPr>
+        <w:spacing w:line="276" w:lineRule="auto"/>
+      </w:pPr>
+      <w:r>
+        <w:rPr>
+          <w:rFonts w:ascii="Arial" w:hAnsi="Arial"/>
+          <w:sz w:val="28"/>
+        </w:rPr>
         <w:t xml:space="preserve"/>
       </w:r>
     </w:p>
@@ -1780,7 +1828,79 @@
           <w:rFonts w:ascii="Arial" w:hAnsi="Arial"/>
           <w:sz w:val="28"/>
         </w:rPr>
-        <w:t xml:space="preserve">1. #76-new — four pages out of Memory. Timer Alerts, Vault, Shopping</w:t>
+        <w:t xml:space="preserve">1. #77-new — Restore with Merge. Choose Replace or Merge before picking</w:t>
+      </w:r>
+    </w:p>
+    <w:p>
+      <w:pPr>
+        <w:spacing w:line="276" w:lineRule="auto"/>
+      </w:pPr>
+      <w:r>
+        <w:rPr>
+          <w:rFonts w:ascii="Arial" w:hAnsi="Arial"/>
+          <w:sz w:val="28"/>
+        </w:rPr>
+        <w:t xml:space="preserve">   a file, then confirm. Merge keeps what is already in the app and adds</w:t>
+      </w:r>
+    </w:p>
+    <w:p>
+      <w:pPr>
+        <w:spacing w:line="276" w:lineRule="auto"/>
+      </w:pPr>
+      <w:r>
+        <w:rPr>
+          <w:rFonts w:ascii="Arial" w:hAnsi="Arial"/>
+          <w:sz w:val="28"/>
+        </w:rPr>
+        <w:t xml:space="preserve">   what is not. Replace takes off the old health, miss, and already-told</w:t>
+      </w:r>
+    </w:p>
+    <w:p>
+      <w:pPr>
+        <w:spacing w:line="276" w:lineRule="auto"/>
+      </w:pPr>
+      <w:r>
+        <w:rPr>
+          <w:rFonts w:ascii="Arial" w:hAnsi="Arial"/>
+          <w:sz w:val="28"/>
+        </w:rPr>
+        <w:t xml:space="preserve">   notes. The backup no longer carries settings or page logs. Checked on</w:t>
+      </w:r>
+    </w:p>
+    <w:p>
+      <w:pPr>
+        <w:spacing w:line="276" w:lineRule="auto"/>
+      </w:pPr>
+      <w:r>
+        <w:rPr>
+          <w:rFonts w:ascii="Arial" w:hAnsi="Arial"/>
+          <w:sz w:val="28"/>
+        </w:rPr>
+        <w:t xml:space="preserve">   the simulator. Mac 298. TypeScript clean. Not on the phone.</w:t>
+      </w:r>
+    </w:p>
+    <w:p>
+      <w:pPr>
+        <w:spacing w:line="276" w:lineRule="auto"/>
+      </w:pPr>
+      <w:r>
+        <w:rPr>
+          <w:rFonts w:ascii="Arial" w:hAnsi="Arial"/>
+          <w:sz w:val="28"/>
+        </w:rPr>
+        <w:t xml:space="preserve"/>
+      </w:r>
+    </w:p>
+    <w:p>
+      <w:pPr>
+        <w:spacing w:line="276" w:lineRule="auto"/>
+      </w:pPr>
+      <w:r>
+        <w:rPr>
+          <w:rFonts w:ascii="Arial" w:hAnsi="Arial"/>
+          <w:sz w:val="28"/>
+        </w:rPr>
+        <w:t xml:space="preserve">2. #76-new — four pages out of Memory. Timer Alerts, Vault, Shopping</w:t>
       </w:r>
     </w:p>
     <w:p>
@@ -5083,79 +5203,7 @@
           <w:rFonts w:ascii="Arial" w:hAnsi="Arial"/>
           <w:sz w:val="28"/>
         </w:rPr>
-        <w:t xml:space="preserve">2. Backup "Merge" option — BACK-MOST BURNER (#67): you are 90% sure</w:t>
-      </w:r>
-    </w:p>
-    <w:p>
-      <w:pPr>
-        <w:spacing w:line="276" w:lineRule="auto"/>
-      </w:pPr>
-      <w:r>
-        <w:rPr>
-          <w:rFonts w:ascii="Arial" w:hAnsi="Arial"/>
-          <w:sz w:val="28"/>
-        </w:rPr>
-        <w:t xml:space="preserve">   you are dropping it. Restore keeps REPLACING everything, which</w:t>
-      </w:r>
-    </w:p>
-    <w:p>
-      <w:pPr>
-        <w:spacing w:line="276" w:lineRule="auto"/>
-      </w:pPr>
-      <w:r>
-        <w:rPr>
-          <w:rFonts w:ascii="Arial" w:hAnsi="Arial"/>
-          <w:sz w:val="28"/>
-        </w:rPr>
-        <w:t xml:space="preserve">   works fine for your one-device use. Raised at #75-new, then</w:t>
-      </w:r>
-    </w:p>
-    <w:p>
-      <w:pPr>
-        <w:spacing w:line="276" w:lineRule="auto"/>
-      </w:pPr>
-      <w:r>
-        <w:rPr>
-          <w:rFonts w:ascii="Arial" w:hAnsi="Arial"/>
-          <w:sz w:val="28"/>
-        </w:rPr>
-        <w:t xml:space="preserve">   deferred so pages in and out could be settled first. Leftover</w:t>
-      </w:r>
-    </w:p>
-    <w:p>
-      <w:pPr>
-        <w:spacing w:line="276" w:lineRule="auto"/>
-      </w:pPr>
-      <w:r>
-        <w:rPr>
-          <w:rFonts w:ascii="Arial" w:hAnsi="Arial"/>
-          <w:sz w:val="28"/>
-        </w:rPr>
-        <w:t xml:space="preserve">   health and miss lists after a restore wait for that same sitting</w:t>
-      </w:r>
-    </w:p>
-    <w:p>
-      <w:pPr>
-        <w:spacing w:line="276" w:lineRule="auto"/>
-      </w:pPr>
-      <w:r>
-        <w:rPr>
-          <w:rFonts w:ascii="Arial" w:hAnsi="Arial"/>
-          <w:sz w:val="28"/>
-        </w:rPr>
-        <w:t xml:space="preserve">   (Patrick, #74-new).</w:t>
-      </w:r>
-    </w:p>
-    <w:p>
-      <w:pPr>
-        <w:spacing w:line="276" w:lineRule="auto"/>
-      </w:pPr>
-      <w:r>
-        <w:rPr>
-          <w:rFonts w:ascii="Arial" w:hAnsi="Arial"/>
-          <w:sz w:val="28"/>
-        </w:rPr>
-        <w:t xml:space="preserve">3. Import files/documents into the Vault — PARKED (#69). Travels with</w:t>
+        <w:t xml:space="preserve">2. Import files/documents into the Vault — PARKED (#69). Travels with</w:t>
       </w:r>
     </w:p>
     <w:p>
@@ -5179,7 +5227,7 @@
           <w:rFonts w:ascii="Arial" w:hAnsi="Arial"/>
           <w:sz w:val="28"/>
         </w:rPr>
-        <w:t xml:space="preserve">4. The Android icon pictures and the splash (startup) image still</w:t>
+        <w:t xml:space="preserve">3. The Android icon pictures and the splash (startup) image still</w:t>
       </w:r>
     </w:p>
     <w:p>
@@ -5216,6 +5264,307 @@
           <w:sz w:val="28"/>
         </w:rPr>
         <w:t xml:space="preserve">   Nice-to-have, #1-new.)</w:t>
+      </w:r>
+    </w:p>
+    <w:p>
+      <w:pPr>
+        <w:spacing w:line="276" w:lineRule="auto"/>
+      </w:pPr>
+      <w:r>
+        <w:rPr>
+          <w:rFonts w:ascii="Arial" w:hAnsi="Arial"/>
+          <w:sz w:val="28"/>
+        </w:rPr>
+        <w:t xml:space="preserve"/>
+      </w:r>
+    </w:p>
+    <w:p>
+      <w:pPr>
+        <w:spacing w:line="276" w:lineRule="auto"/>
+      </w:pPr>
+      <w:r>
+        <w:rPr>
+          <w:rFonts w:ascii="Arial" w:hAnsi="Arial"/>
+          <w:sz w:val="28"/>
+        </w:rPr>
+        <w:t xml:space="preserve"/>
+      </w:r>
+    </w:p>
+    <w:p>
+      <w:pPr>
+        <w:spacing w:line="276" w:lineRule="auto"/>
+      </w:pPr>
+      <w:r>
+        <w:rPr>
+          <w:rFonts w:ascii="Arial" w:hAnsi="Arial"/>
+          <w:b/>
+          <w:sz w:val="28"/>
+        </w:rPr>
+        <w:t xml:space="preserve">RESTORE MERGE</w:t>
+      </w:r>
+    </w:p>
+    <w:p>
+      <w:pPr>
+        <w:spacing w:line="276" w:lineRule="auto"/>
+      </w:pPr>
+      <w:r>
+        <w:rPr>
+          <w:rFonts w:ascii="Arial" w:hAnsi="Arial"/>
+          <w:sz w:val="28"/>
+        </w:rPr>
+        <w:t xml:space="preserve">------------------------------------------------------------------</w:t>
+      </w:r>
+    </w:p>
+    <w:p>
+      <w:pPr>
+        <w:spacing w:line="276" w:lineRule="auto"/>
+      </w:pPr>
+      <w:r>
+        <w:rPr>
+          <w:rFonts w:ascii="Arial" w:hAnsi="Arial"/>
+          <w:sz w:val="28"/>
+        </w:rPr>
+        <w:t xml:space="preserve">The one store for this sitting's Restore decisions (#77-new). Done.</w:t>
+      </w:r>
+    </w:p>
+    <w:p>
+      <w:pPr>
+        <w:spacing w:line="276" w:lineRule="auto"/>
+      </w:pPr>
+      <w:r>
+        <w:rPr>
+          <w:rFonts w:ascii="Arial" w:hAnsi="Arial"/>
+          <w:sz w:val="28"/>
+        </w:rPr>
+        <w:t xml:space="preserve">Checked on the simulator. Not on the phone.</w:t>
+      </w:r>
+    </w:p>
+    <w:p>
+      <w:pPr>
+        <w:spacing w:line="276" w:lineRule="auto"/>
+      </w:pPr>
+      <w:r>
+        <w:rPr>
+          <w:rFonts w:ascii="Arial" w:hAnsi="Arial"/>
+          <w:sz w:val="28"/>
+        </w:rPr>
+        <w:t xml:space="preserve"/>
+      </w:r>
+    </w:p>
+    <w:p>
+      <w:pPr>
+        <w:spacing w:line="276" w:lineRule="auto"/>
+      </w:pPr>
+      <w:r>
+        <w:rPr>
+          <w:rFonts w:ascii="Arial" w:hAnsi="Arial"/>
+          <w:sz w:val="28"/>
+        </w:rPr>
+        <w:t xml:space="preserve">1. Restore will get a Merge choice. Merge is no longer parked.</w:t>
+      </w:r>
+    </w:p>
+    <w:p>
+      <w:pPr>
+        <w:spacing w:line="276" w:lineRule="auto"/>
+      </w:pPr>
+      <w:r>
+        <w:rPr>
+          <w:rFonts w:ascii="Arial" w:hAnsi="Arial"/>
+          <w:sz w:val="28"/>
+        </w:rPr>
+        <w:t xml:space="preserve">2. Merge keeps what is already in the app, and adds from the backup</w:t>
+      </w:r>
+    </w:p>
+    <w:p>
+      <w:pPr>
+        <w:spacing w:line="276" w:lineRule="auto"/>
+      </w:pPr>
+      <w:r>
+        <w:rPr>
+          <w:rFonts w:ascii="Arial" w:hAnsi="Arial"/>
+          <w:sz w:val="28"/>
+        </w:rPr>
+        <w:t xml:space="preserve">   only what is not already there.</w:t>
+      </w:r>
+    </w:p>
+    <w:p>
+      <w:pPr>
+        <w:spacing w:line="276" w:lineRule="auto"/>
+      </w:pPr>
+      <w:r>
+        <w:rPr>
+          <w:rFonts w:ascii="Arial" w:hAnsi="Arial"/>
+          <w:sz w:val="28"/>
+        </w:rPr>
+        <w:t xml:space="preserve">3. A backup reminder is already in the app when it has the same</w:t>
+      </w:r>
+    </w:p>
+    <w:p>
+      <w:pPr>
+        <w:spacing w:line="276" w:lineRule="auto"/>
+      </w:pPr>
+      <w:r>
+        <w:rPr>
+          <w:rFonts w:ascii="Arial" w:hAnsi="Arial"/>
+          <w:sz w:val="28"/>
+        </w:rPr>
+        <w:t xml:space="preserve">   identity the app wrote into the backup file.</w:t>
+      </w:r>
+    </w:p>
+    <w:p>
+      <w:pPr>
+        <w:spacing w:line="276" w:lineRule="auto"/>
+      </w:pPr>
+      <w:r>
+        <w:rPr>
+          <w:rFonts w:ascii="Arial" w:hAnsi="Arial"/>
+          <w:sz w:val="28"/>
+        </w:rPr>
+        <w:t xml:space="preserve">4. People choose Merge or Replace before they pick a file.</w:t>
+      </w:r>
+    </w:p>
+    <w:p>
+      <w:pPr>
+        <w:spacing w:line="276" w:lineRule="auto"/>
+      </w:pPr>
+      <w:r>
+        <w:rPr>
+          <w:rFonts w:ascii="Arial" w:hAnsi="Arial"/>
+          <w:sz w:val="28"/>
+        </w:rPr>
+        <w:t xml:space="preserve">5. After they pick the file, the app still asks them to confirm</w:t>
+      </w:r>
+    </w:p>
+    <w:p>
+      <w:pPr>
+        <w:spacing w:line="276" w:lineRule="auto"/>
+      </w:pPr>
+      <w:r>
+        <w:rPr>
+          <w:rFonts w:ascii="Arial" w:hAnsi="Arial"/>
+          <w:sz w:val="28"/>
+        </w:rPr>
+        <w:t xml:space="preserve">   before it changes anything.</w:t>
+      </w:r>
+    </w:p>
+    <w:p>
+      <w:pPr>
+        <w:spacing w:line="276" w:lineRule="auto"/>
+      </w:pPr>
+      <w:r>
+        <w:rPr>
+          <w:rFonts w:ascii="Arial" w:hAnsi="Arial"/>
+          <w:sz w:val="28"/>
+        </w:rPr>
+        <w:t xml:space="preserve">6. Replace takes off the old health, miss, and already-told notes.</w:t>
+      </w:r>
+    </w:p>
+    <w:p>
+      <w:pPr>
+        <w:spacing w:line="276" w:lineRule="auto"/>
+      </w:pPr>
+      <w:r>
+        <w:rPr>
+          <w:rFonts w:ascii="Arial" w:hAnsi="Arial"/>
+          <w:sz w:val="28"/>
+        </w:rPr>
+        <w:t xml:space="preserve">   Merge leaves them.</w:t>
+      </w:r>
+    </w:p>
+    <w:p>
+      <w:pPr>
+        <w:spacing w:line="276" w:lineRule="auto"/>
+      </w:pPr>
+      <w:r>
+        <w:rPr>
+          <w:rFonts w:ascii="Arial" w:hAnsi="Arial"/>
+          <w:sz w:val="28"/>
+        </w:rPr>
+        <w:t xml:space="preserve">7. Settings and page logs do not need to be saved or restored. The</w:t>
+      </w:r>
+    </w:p>
+    <w:p>
+      <w:pPr>
+        <w:spacing w:line="276" w:lineRule="auto"/>
+      </w:pPr>
+      <w:r>
+        <w:rPr>
+          <w:rFonts w:ascii="Arial" w:hAnsi="Arial"/>
+          <w:sz w:val="28"/>
+        </w:rPr>
+        <w:t xml:space="preserve">   backup does not carry them.</w:t>
+      </w:r>
+    </w:p>
+    <w:p>
+      <w:pPr>
+        <w:spacing w:line="276" w:lineRule="auto"/>
+      </w:pPr>
+      <w:r>
+        <w:rPr>
+          <w:rFonts w:ascii="Arial" w:hAnsi="Arial"/>
+          <w:sz w:val="28"/>
+        </w:rPr>
+        <w:t xml:space="preserve">8. There are no existing backup files. We are not keeping an older</w:t>
+      </w:r>
+    </w:p>
+    <w:p>
+      <w:pPr>
+        <w:spacing w:line="276" w:lineRule="auto"/>
+      </w:pPr>
+      <w:r>
+        <w:rPr>
+          <w:rFonts w:ascii="Arial" w:hAnsi="Arial"/>
+          <w:sz w:val="28"/>
+        </w:rPr>
+        <w:t xml:space="preserve">   backup shape.</w:t>
+      </w:r>
+    </w:p>
+    <w:p>
+      <w:pPr>
+        <w:spacing w:line="276" w:lineRule="auto"/>
+      </w:pPr>
+      <w:r>
+        <w:rPr>
+          <w:rFonts w:ascii="Arial" w:hAnsi="Arial"/>
+          <w:sz w:val="28"/>
+        </w:rPr>
+        <w:t xml:space="preserve">9. The Backup page says: Choose, replace, or merge to pick a file.</w:t>
+      </w:r>
+    </w:p>
+    <w:p>
+      <w:pPr>
+        <w:spacing w:line="276" w:lineRule="auto"/>
+      </w:pPr>
+      <w:r>
+        <w:rPr>
+          <w:rFonts w:ascii="Arial" w:hAnsi="Arial"/>
+          <w:sz w:val="28"/>
+        </w:rPr>
+        <w:t xml:space="preserve">10. Checked on the simulator (#77-new). Export a full file, delete three</w:t>
+      </w:r>
+    </w:p>
+    <w:p>
+      <w:pPr>
+        <w:spacing w:line="276" w:lineRule="auto"/>
+      </w:pPr>
+      <w:r>
+        <w:rPr>
+          <w:rFonts w:ascii="Arial" w:hAnsi="Arial"/>
+          <w:sz w:val="28"/>
+        </w:rPr>
+        <w:t xml:space="preserve">    items, export that, Merge with the first file: the three items came</w:t>
+      </w:r>
+    </w:p>
+    <w:p>
+      <w:pPr>
+        <w:spacing w:line="276" w:lineRule="auto"/>
+      </w:pPr>
+      <w:r>
+        <w:rPr>
+          <w:rFonts w:ascii="Arial" w:hAnsi="Arial"/>
+          <w:sz w:val="28"/>
+        </w:rPr>
+        <w:t xml:space="preserve">    back. Replace with the second file: those three items were gone.</w:t>
       </w:r>
     </w:p>
     <w:sectPr/>

</xml_diff>

<commit_message>
82-new - Memory - Added 30/60/90 days to Quaretly
</commit_message>
<xml_diff>
--- a/docs/pending.docx
+++ b/docs/pending.docx
@@ -24,7 +24,7 @@
           <w:rFonts w:ascii="Arial" w:hAnsi="Arial"/>
           <w:sz w:val="28"/>
         </w:rPr>
-        <w:t xml:space="preserve">Last updated: 2026-09-06 (#77-new — Restore with Merge done)</w:t>
+        <w:t xml:space="preserve">Last updated: 2026-09-07 (#82-new — Quarterly 30 / 60 / 90 chips on the phone)</w:t>
       </w:r>
     </w:p>
     <w:p>
@@ -120,7 +120,43 @@
           <w:rFonts w:ascii="Arial" w:hAnsi="Arial"/>
           <w:sz w:val="28"/>
         </w:rPr>
-        <w:t xml:space="preserve">each one, so they will shift as things are added and finished.</w:t>
+        <w:t xml:space="preserve">each one. Live headings (What's Next, Pending, Facts) shift as</w:t>
+      </w:r>
+    </w:p>
+    <w:p>
+      <w:pPr>
+        <w:spacing w:line="276" w:lineRule="auto"/>
+      </w:pPr>
+      <w:r>
+        <w:rPr>
+          <w:rFonts w:ascii="Arial" w:hAnsi="Arial"/>
+          <w:sz w:val="28"/>
+        </w:rPr>
+        <w:t xml:space="preserve">things are added and finished. **Done does not:** newest at the</w:t>
+      </w:r>
+    </w:p>
+    <w:p>
+      <w:pPr>
+        <w:spacing w:line="276" w:lineRule="auto"/>
+      </w:pPr>
+      <w:r>
+        <w:rPr>
+          <w:rFonts w:ascii="Arial" w:hAnsi="Arial"/>
+          <w:sz w:val="28"/>
+        </w:rPr>
+        <w:t xml:space="preserve">top, number 1 on the oldest line at the bottom, so a new sitting</w:t>
+      </w:r>
+    </w:p>
+    <w:p>
+      <w:pPr>
+        <w:spacing w:line="276" w:lineRule="auto"/>
+      </w:pPr>
+      <w:r>
+        <w:rPr>
+          <w:rFonts w:ascii="Arial" w:hAnsi="Arial"/>
+          <w:sz w:val="28"/>
+        </w:rPr>
+        <w:t xml:space="preserve">is the next number and nothing else is renumbered.</w:t>
       </w:r>
     </w:p>
     <w:p>
@@ -289,31 +325,19 @@
           <w:rFonts w:ascii="Arial" w:hAnsi="Arial"/>
           <w:sz w:val="28"/>
         </w:rPr>
-        <w:t xml:space="preserve">DAILY SAVE LANDS ON APPOINTMENTS (Patrick, #77-new). New items entered</w:t>
-      </w:r>
-    </w:p>
-    <w:p>
-      <w:pPr>
-        <w:spacing w:line="276" w:lineRule="auto"/>
-      </w:pPr>
-      <w:r>
-        <w:rPr>
-          <w:rFonts w:ascii="Arial" w:hAnsi="Arial"/>
-          <w:sz w:val="28"/>
-        </w:rPr>
-        <w:t xml:space="preserve">on Daily, then Save, drop him in Appointments with those items, not</w:t>
-      </w:r>
-    </w:p>
-    <w:p>
-      <w:pPr>
-        <w:spacing w:line="276" w:lineRule="auto"/>
-      </w:pPr>
-      <w:r>
-        <w:rPr>
-          <w:rFonts w:ascii="Arial" w:hAnsi="Arial"/>
-          <w:sz w:val="28"/>
-        </w:rPr>
-        <w:t xml:space="preserve">Daily. Next bug to fix.</w:t>
+        <w:t xml:space="preserve">The second new page is not yet named. Day-roll lock still wants a</w:t>
+      </w:r>
+    </w:p>
+    <w:p>
+      <w:pPr>
+        <w:spacing w:line="276" w:lineRule="auto"/>
+      </w:pPr>
+      <w:r>
+        <w:rPr>
+          <w:rFonts w:ascii="Arial" w:hAnsi="Arial"/>
+          <w:sz w:val="28"/>
+        </w:rPr>
+        <w:t xml:space="preserve">night of all-green Daily on this load.</w:t>
       </w:r>
     </w:p>
     <w:p>
@@ -337,55 +361,19 @@
           <w:rFonts w:ascii="Arial" w:hAnsi="Arial"/>
           <w:sz w:val="28"/>
         </w:rPr>
-        <w:t xml:space="preserve">PHONE LOAD. #69-new is committed and not on the phone yet. The day-roll</w:t>
-      </w:r>
-    </w:p>
-    <w:p>
-      <w:pPr>
-        <w:spacing w:line="276" w:lineRule="auto"/>
-      </w:pPr>
-      <w:r>
-        <w:rPr>
-          <w:rFonts w:ascii="Arial" w:hAnsi="Arial"/>
-          <w:sz w:val="28"/>
-        </w:rPr>
-        <w:t xml:space="preserve">lock, quarterly month, Reset All Data banners, banner-tap write-down</w:t>
-      </w:r>
-    </w:p>
-    <w:p>
-      <w:pPr>
-        <w:spacing w:line="276" w:lineRule="auto"/>
-      </w:pPr>
-      <w:r>
-        <w:rPr>
-          <w:rFonts w:ascii="Arial" w:hAnsi="Arial"/>
-          <w:sz w:val="28"/>
-        </w:rPr>
-        <w:t xml:space="preserve">(#72-new, committed), the one-door (#73-new, committed), Phase 3</w:t>
-      </w:r>
-    </w:p>
-    <w:p>
-      <w:pPr>
-        <w:spacing w:line="276" w:lineRule="auto"/>
-      </w:pPr>
-      <w:r>
-        <w:rPr>
-          <w:rFonts w:ascii="Arial" w:hAnsi="Arial"/>
-          <w:sz w:val="28"/>
-        </w:rPr>
-        <w:t xml:space="preserve">(#74-new, built), and Restore with Merge (#77-new, done) are not on the</w:t>
-      </w:r>
-    </w:p>
-    <w:p>
-      <w:pPr>
-        <w:spacing w:line="276" w:lineRule="auto"/>
-      </w:pPr>
-      <w:r>
-        <w:rPr>
-          <w:rFonts w:ascii="Arial" w:hAnsi="Arial"/>
-          <w:sz w:val="28"/>
-        </w:rPr>
-        <w:t xml:space="preserve">phone. Last load is #67-new. Paperwork is Pending 8–11.</w:t>
+        <w:t xml:space="preserve">The phone is on the #82-new load. Spec, user guide, feedback button,</w:t>
+      </w:r>
+    </w:p>
+    <w:p>
+      <w:pPr>
+        <w:spacing w:line="276" w:lineRule="auto"/>
+      </w:pPr>
+      <w:r>
+        <w:rPr>
+          <w:rFonts w:ascii="Arial" w:hAnsi="Arial"/>
+          <w:sz w:val="28"/>
+        </w:rPr>
+        <w:t xml:space="preserve">and testing file are Pending 1–4.</w:t>
       </w:r>
     </w:p>
     <w:p>
@@ -446,7 +434,7 @@
           <w:rFonts w:ascii="Arial" w:hAnsi="Arial"/>
           <w:sz w:val="28"/>
         </w:rPr>
-        <w:t xml:space="preserve">Things waiting on something — mostly on the phone or on a build.</w:t>
+        <w:t xml:space="preserve">Things waiting on something — mostly on a build.</w:t>
       </w:r>
     </w:p>
     <w:p>
@@ -470,307 +458,7 @@
           <w:rFonts w:ascii="Arial" w:hAnsi="Arial"/>
           <w:sz w:val="28"/>
         </w:rPr>
-        <w:t xml:space="preserve">1. EVERYTHING BUILT SINCE THE LAST PHONE LOAD. Last load is #67-new.</w:t>
-      </w:r>
-    </w:p>
-    <w:p>
-      <w:pPr>
-        <w:spacing w:line="276" w:lineRule="auto"/>
-      </w:pPr>
-      <w:r>
-        <w:rPr>
-          <w:rFonts w:ascii="Arial" w:hAnsi="Arial"/>
-          <w:sz w:val="28"/>
-        </w:rPr>
-        <w:t xml:space="preserve">   Built since then and not on the phone: the leftover cleanup (#69-new,</w:t>
-      </w:r>
-    </w:p>
-    <w:p>
-      <w:pPr>
-        <w:spacing w:line="276" w:lineRule="auto"/>
-      </w:pPr>
-      <w:r>
-        <w:rPr>
-          <w:rFonts w:ascii="Arial" w:hAnsi="Arial"/>
-          <w:sz w:val="28"/>
-        </w:rPr>
-        <w:t xml:space="preserve">   committed), the hangings lock plus Grok Phase 1 (#72-new, committed),</w:t>
-      </w:r>
-    </w:p>
-    <w:p>
-      <w:pPr>
-        <w:spacing w:line="276" w:lineRule="auto"/>
-      </w:pPr>
-      <w:r>
-        <w:rPr>
-          <w:rFonts w:ascii="Arial" w:hAnsi="Arial"/>
-          <w:sz w:val="28"/>
-        </w:rPr>
-        <w:t xml:space="preserve">   the one-door (#73-new, committed),    Grok Phase 3 (#74-new, built), and Restore with Merge (#77-new, done).</w:t>
-      </w:r>
-    </w:p>
-    <w:p>
-      <w:pPr>
-        <w:spacing w:line="276" w:lineRule="auto"/>
-      </w:pPr>
-      <w:r>
-        <w:rPr>
-          <w:rFonts w:ascii="Arial" w:hAnsi="Arial"/>
-          <w:sz w:val="28"/>
-        </w:rPr>
-        <w:t xml:space="preserve">2. MONTHLY DONE SHOULD ADVANCE THE TILE (Patrick, #70-new). Done on</w:t>
-      </w:r>
-    </w:p>
-    <w:p>
-      <w:pPr>
-        <w:spacing w:line="276" w:lineRule="auto"/>
-      </w:pPr>
-      <w:r>
-        <w:rPr>
-          <w:rFonts w:ascii="Arial" w:hAnsi="Arial"/>
-          <w:sz w:val="28"/>
-        </w:rPr>
-        <w:t xml:space="preserve">   Monthly, Quarterly, and Yearly should move the saved date so the tile</w:t>
-      </w:r>
-    </w:p>
-    <w:p>
-      <w:pPr>
-        <w:spacing w:line="276" w:lineRule="auto"/>
-      </w:pPr>
-      <w:r>
-        <w:rPr>
-          <w:rFonts w:ascii="Arial" w:hAnsi="Arial"/>
-          <w:sz w:val="28"/>
-        </w:rPr>
-        <w:t xml:space="preserve">   shows the next cycle armed — as before #41-new. Today only ticks and</w:t>
-      </w:r>
-    </w:p>
-    <w:p>
-      <w:pPr>
-        <w:spacing w:line="276" w:lineRule="auto"/>
-      </w:pPr>
-      <w:r>
-        <w:rPr>
-          <w:rFonts w:ascii="Arial" w:hAnsi="Arial"/>
-          <w:sz w:val="28"/>
-        </w:rPr>
-        <w:t xml:space="preserve">   logs; the date on the tile does not move.</w:t>
-      </w:r>
-    </w:p>
-    <w:p>
-      <w:pPr>
-        <w:spacing w:line="276" w:lineRule="auto"/>
-      </w:pPr>
-      <w:r>
-        <w:rPr>
-          <w:rFonts w:ascii="Arial" w:hAnsi="Arial"/>
-          <w:sz w:val="28"/>
-        </w:rPr>
-        <w:t xml:space="preserve">3. OPTIONS — 2ND THURSDAY CHIP DOES NOT UPDATE (Patrick, #70-new,</w:t>
-      </w:r>
-    </w:p>
-    <w:p>
-      <w:pPr>
-        <w:spacing w:line="276" w:lineRule="auto"/>
-      </w:pPr>
-      <w:r>
-        <w:rPr>
-          <w:rFonts w:ascii="Arial" w:hAnsi="Arial"/>
-          <w:sz w:val="28"/>
-        </w:rPr>
-        <w:t xml:space="preserve">   verified on phone). The pattern saves correctly. The selected chip</w:t>
-      </w:r>
-    </w:p>
-    <w:p>
-      <w:pPr>
-        <w:spacing w:line="276" w:lineRule="auto"/>
-      </w:pPr>
-      <w:r>
-        <w:rPr>
-          <w:rFonts w:ascii="Arial" w:hAnsi="Arial"/>
-          <w:sz w:val="28"/>
-        </w:rPr>
-        <w:t xml:space="preserve">   does not change to show 2nd Thursday is active, so it still looks like</w:t>
-      </w:r>
-    </w:p>
-    <w:p>
-      <w:pPr>
-        <w:spacing w:line="276" w:lineRule="auto"/>
-      </w:pPr>
-      <w:r>
-        <w:rPr>
-          <w:rFonts w:ascii="Arial" w:hAnsi="Arial"/>
-          <w:sz w:val="28"/>
-        </w:rPr>
-        <w:t xml:space="preserve">   the dated choice.</w:t>
-      </w:r>
-    </w:p>
-    <w:p>
-      <w:pPr>
-        <w:spacing w:line="276" w:lineRule="auto"/>
-      </w:pPr>
-      <w:r>
-        <w:rPr>
-          <w:rFonts w:ascii="Arial" w:hAnsi="Arial"/>
-          <w:sz w:val="28"/>
-        </w:rPr>
-        <w:t xml:space="preserve">4. BIRTHDAYS PAGE (Patrick, #70-new). New Home page. Each item:</w:t>
-      </w:r>
-    </w:p>
-    <w:p>
-      <w:pPr>
-        <w:spacing w:line="276" w:lineRule="auto"/>
-      </w:pPr>
-      <w:r>
-        <w:rPr>
-          <w:rFonts w:ascii="Arial" w:hAnsi="Arial"/>
-          <w:sz w:val="28"/>
-        </w:rPr>
-        <w:t xml:space="preserve">   a name and a date, yearly reminder. Almost like Appointments: Day Before</w:t>
-      </w:r>
-    </w:p>
-    <w:p>
-      <w:pPr>
-        <w:spacing w:line="276" w:lineRule="auto"/>
-      </w:pPr>
-      <w:r>
-        <w:rPr>
-          <w:rFonts w:ascii="Arial" w:hAnsi="Arial"/>
-          <w:sz w:val="28"/>
-        </w:rPr>
-        <w:t xml:space="preserve">   only as the before chip. **On the day** and **Day Before** are both</w:t>
-      </w:r>
-    </w:p>
-    <w:p>
-      <w:pPr>
-        <w:spacing w:line="276" w:lineRule="auto"/>
-      </w:pPr>
-      <w:r>
-        <w:rPr>
-          <w:rFonts w:ascii="Arial" w:hAnsi="Arial"/>
-          <w:sz w:val="28"/>
-        </w:rPr>
-        <w:t xml:space="preserve">   selectable chips. Build sheet first.</w:t>
-      </w:r>
-    </w:p>
-    <w:p>
-      <w:pPr>
-        <w:spacing w:line="276" w:lineRule="auto"/>
-      </w:pPr>
-      <w:r>
-        <w:rPr>
-          <w:rFonts w:ascii="Arial" w:hAnsi="Arial"/>
-          <w:sz w:val="28"/>
-        </w:rPr>
-        <w:t xml:space="preserve">5. HELP PAGE (Patrick, #70-new — was Where?). Visible name **Help**;</w:t>
-      </w:r>
-    </w:p>
-    <w:p>
-      <w:pPr>
-        <w:spacing w:line="276" w:lineRule="auto"/>
-      </w:pPr>
-      <w:r>
-        <w:rPr>
-          <w:rFonts w:ascii="Arial" w:hAnsi="Arial"/>
-          <w:sz w:val="28"/>
-        </w:rPr>
-        <w:t xml:space="preserve">   Home badge **?** not 🧭.</w:t>
-      </w:r>
-    </w:p>
-    <w:p>
-      <w:pPr>
-        <w:spacing w:line="276" w:lineRule="auto"/>
-      </w:pPr>
-      <w:r>
-        <w:rPr>
-          <w:rFonts w:ascii="Arial" w:hAnsi="Arial"/>
-          <w:sz w:val="28"/>
-        </w:rPr>
-        <w:t xml:space="preserve">6. HELP HELPER — WORDING AND CANCEL (Patrick, #70-new). Step 1 first</w:t>
-      </w:r>
-    </w:p>
-    <w:p>
-      <w:pPr>
-        <w:spacing w:line="276" w:lineRule="auto"/>
-      </w:pPr>
-      <w:r>
-        <w:rPr>
-          <w:rFonts w:ascii="Arial" w:hAnsi="Arial"/>
-          <w:sz w:val="28"/>
-        </w:rPr>
-        <w:t xml:space="preserve">   choice **Repeats every** only; fix the question that says “every” on a</w:t>
-      </w:r>
-    </w:p>
-    <w:p>
-      <w:pPr>
-        <w:spacing w:line="276" w:lineRule="auto"/>
-      </w:pPr>
-      <w:r>
-        <w:rPr>
-          <w:rFonts w:ascii="Arial" w:hAnsi="Arial"/>
-          <w:sz w:val="28"/>
-        </w:rPr>
-        <w:t xml:space="preserve">   later step. Steps 2 and 3: Cancel back one step, not Home (`where.tsx`).</w:t>
-      </w:r>
-    </w:p>
-    <w:p>
-      <w:pPr>
-        <w:spacing w:line="276" w:lineRule="auto"/>
-      </w:pPr>
-      <w:r>
-        <w:rPr>
-          <w:rFonts w:ascii="Arial" w:hAnsi="Arial"/>
-          <w:sz w:val="28"/>
-        </w:rPr>
-        <w:t xml:space="preserve">7. QUARTERLY ADD — 30, 60, 90 DAYS (Patrick, #70-new). On + Add</w:t>
-      </w:r>
-    </w:p>
-    <w:p>
-      <w:pPr>
-        <w:spacing w:line="276" w:lineRule="auto"/>
-      </w:pPr>
-      <w:r>
-        <w:rPr>
-          <w:rFonts w:ascii="Arial" w:hAnsi="Arial"/>
-          <w:sz w:val="28"/>
-        </w:rPr>
-        <w:t xml:space="preserve">   for Quarterly, selectable chips for 30, 60, and 90 days. Not a new</w:t>
-      </w:r>
-    </w:p>
-    <w:p>
-      <w:pPr>
-        <w:spacing w:line="276" w:lineRule="auto"/>
-      </w:pPr>
-      <w:r>
-        <w:rPr>
-          <w:rFonts w:ascii="Arial" w:hAnsi="Arial"/>
-          <w:sz w:val="28"/>
-        </w:rPr>
-        <w:t xml:space="preserve">   page. The engine already knows how to take in this data; the work is</w:t>
-      </w:r>
-    </w:p>
-    <w:p>
-      <w:pPr>
-        <w:spacing w:line="276" w:lineRule="auto"/>
-      </w:pPr>
-      <w:r>
-        <w:rPr>
-          <w:rFonts w:ascii="Arial" w:hAnsi="Arial"/>
-          <w:sz w:val="28"/>
-        </w:rPr>
-        <w:t xml:space="preserve">   the Add chips writing it.</w:t>
-      </w:r>
-    </w:p>
-    <w:p>
-      <w:pPr>
-        <w:spacing w:line="276" w:lineRule="auto"/>
-      </w:pPr>
-      <w:r>
-        <w:rPr>
-          <w:rFonts w:ascii="Arial" w:hAnsi="Arial"/>
-          <w:sz w:val="28"/>
-        </w:rPr>
-        <w:t xml:space="preserve">8. A THOROUGH DESIGN SPEC FOR THE APP (Patrick, #52-new). This</w:t>
+        <w:t xml:space="preserve">1. A THOROUGH DESIGN SPEC FOR THE APP (Patrick, #52-new). This</w:t>
       </w:r>
     </w:p>
     <w:p>
@@ -830,7 +518,7 @@
           <w:rFonts w:ascii="Arial" w:hAnsi="Arial"/>
           <w:sz w:val="28"/>
         </w:rPr>
-        <w:t xml:space="preserve">9. A USER GUIDE, from that spec or merely after it (Patrick,</w:t>
+        <w:t xml:space="preserve">2. A USER GUIDE, from that spec or merely after it (Patrick,</w:t>
       </w:r>
     </w:p>
     <w:p>
@@ -866,7 +554,7 @@
           <w:rFonts w:ascii="Arial" w:hAnsi="Arial"/>
           <w:sz w:val="28"/>
         </w:rPr>
-        <w:t xml:space="preserve">10. A FEEDBACK BUTTON IN THE APP, similar to Mystery (Patrick,</w:t>
+        <w:t xml:space="preserve">3. A FEEDBACK BUTTON IN THE APP, similar to Mystery (Patrick,</w:t>
       </w:r>
     </w:p>
     <w:p>
@@ -902,7 +590,7 @@
           <w:rFonts w:ascii="Arial" w:hAnsi="Arial"/>
           <w:sz w:val="28"/>
         </w:rPr>
-        <w:t xml:space="preserve">11. A PAGE, SPEC, OR FILE FOR WHAT TESTING HAS COVERED AND</w:t>
+        <w:t xml:space="preserve">4. A PAGE, SPEC, OR FILE FOR WHAT TESTING HAS COVERED AND</w:t>
       </w:r>
     </w:p>
     <w:p>
@@ -938,42 +626,6 @@
           <w:rFonts w:ascii="Arial" w:hAnsi="Arial"/>
           <w:sz w:val="28"/>
         </w:rPr>
-        <w:t xml:space="preserve">12. DAILY SAVE LANDS ON APPOINTMENTS (Patrick, #77-new). New items</w:t>
-      </w:r>
-    </w:p>
-    <w:p>
-      <w:pPr>
-        <w:spacing w:line="276" w:lineRule="auto"/>
-      </w:pPr>
-      <w:r>
-        <w:rPr>
-          <w:rFonts w:ascii="Arial" w:hAnsi="Arial"/>
-          <w:sz w:val="28"/>
-        </w:rPr>
-        <w:t xml:space="preserve">   entered on Daily, then Save, drop him in Appointments with those</w:t>
-      </w:r>
-    </w:p>
-    <w:p>
-      <w:pPr>
-        <w:spacing w:line="276" w:lineRule="auto"/>
-      </w:pPr>
-      <w:r>
-        <w:rPr>
-          <w:rFonts w:ascii="Arial" w:hAnsi="Arial"/>
-          <w:sz w:val="28"/>
-        </w:rPr>
-        <w:t xml:space="preserve">   items, not Daily.</w:t>
-      </w:r>
-    </w:p>
-    <w:p>
-      <w:pPr>
-        <w:spacing w:line="276" w:lineRule="auto"/>
-      </w:pPr>
-      <w:r>
-        <w:rPr>
-          <w:rFonts w:ascii="Arial" w:hAnsi="Arial"/>
-          <w:sz w:val="28"/>
-        </w:rPr>
         <w:t xml:space="preserve"/>
       </w:r>
     </w:p>
@@ -1263,7 +915,31 @@
           <w:rFonts w:ascii="Arial" w:hAnsi="Arial"/>
           <w:sz w:val="28"/>
         </w:rPr>
-        <w:t xml:space="preserve">   Appointments, which has the Log, not Daily. The other pages keep their</w:t>
+        <w:t xml:space="preserve">   Daily. It is Daily's own one-shot, not an Appointment. An</w:t>
+      </w:r>
+    </w:p>
+    <w:p>
+      <w:pPr>
+        <w:spacing w:line="276" w:lineRule="auto"/>
+      </w:pPr>
+      <w:r>
+        <w:rPr>
+          <w:rFonts w:ascii="Arial" w:hAnsi="Arial"/>
+          <w:sz w:val="28"/>
+        </w:rPr>
+        <w:t xml:space="preserve">   Appointment that falls today still shows on Daily as from</w:t>
+      </w:r>
+    </w:p>
+    <w:p>
+      <w:pPr>
+        <w:spacing w:line="276" w:lineRule="auto"/>
+      </w:pPr>
+      <w:r>
+        <w:rPr>
+          <w:rFonts w:ascii="Arial" w:hAnsi="Arial"/>
+          <w:sz w:val="28"/>
+        </w:rPr>
+        <w:t xml:space="preserve">   Appointments, and still lives on Appointments. The other pages keep their</w:t>
       </w:r>
     </w:p>
     <w:p>
@@ -1287,6 +963,18 @@
           <w:rFonts w:ascii="Arial" w:hAnsi="Arial"/>
           <w:sz w:val="28"/>
         </w:rPr>
+        <w:t xml:space="preserve">   (#78-new)</w:t>
+      </w:r>
+    </w:p>
+    <w:p>
+      <w:pPr>
+        <w:spacing w:line="276" w:lineRule="auto"/>
+      </w:pPr>
+      <w:r>
+        <w:rPr>
+          <w:rFonts w:ascii="Arial" w:hAnsi="Arial"/>
+          <w:sz w:val="28"/>
+        </w:rPr>
         <w:t xml:space="preserve">5. ONE REMINDER PER ITEM, NOT TWO, and the app puts itself right</w:t>
       </w:r>
     </w:p>
@@ -1792,7 +1480,31 @@
           <w:rFonts w:ascii="Arial" w:hAnsi="Arial"/>
           <w:sz w:val="28"/>
         </w:rPr>
-        <w:t xml:space="preserve">One line each. The full story of any of them is in</w:t>
+        <w:t xml:space="preserve">Newest at the top. Number 1 is the oldest line, at the bottom.</w:t>
+      </w:r>
+    </w:p>
+    <w:p>
+      <w:pPr>
+        <w:spacing w:line="276" w:lineRule="auto"/>
+      </w:pPr>
+      <w:r>
+        <w:rPr>
+          <w:rFonts w:ascii="Arial" w:hAnsi="Arial"/>
+          <w:sz w:val="28"/>
+        </w:rPr>
+        <w:t xml:space="preserve">A new sitting gets the next number on top; nothing else is</w:t>
+      </w:r>
+    </w:p>
+    <w:p>
+      <w:pPr>
+        <w:spacing w:line="276" w:lineRule="auto"/>
+      </w:pPr>
+      <w:r>
+        <w:rPr>
+          <w:rFonts w:ascii="Arial" w:hAnsi="Arial"/>
+          <w:sz w:val="28"/>
+        </w:rPr>
+        <w:t xml:space="preserve">renumbered. One line each. The full story is in</w:t>
       </w:r>
     </w:p>
     <w:p>
@@ -1828,7 +1540,307 @@
           <w:rFonts w:ascii="Arial" w:hAnsi="Arial"/>
           <w:sz w:val="28"/>
         </w:rPr>
-        <w:t xml:space="preserve">1. #77-new — Restore with Merge. Choose Replace or Merge before picking</w:t>
+        <w:t xml:space="preserve">67. #82-new — Quarterly 30 / 60 / 90 chips on Add. No chip stays</w:t>
+      </w:r>
+    </w:p>
+    <w:p>
+      <w:pPr>
+        <w:spacing w:line="276" w:lineRule="auto"/>
+      </w:pPr>
+      <w:r>
+        <w:rPr>
+          <w:rFonts w:ascii="Arial" w:hAnsi="Arial"/>
+          <w:sz w:val="28"/>
+        </w:rPr>
+        <w:t xml:space="preserve">   every three months. A chip counts from the date entered when it</w:t>
+      </w:r>
+    </w:p>
+    <w:p>
+      <w:pPr>
+        <w:spacing w:line="276" w:lineRule="auto"/>
+      </w:pPr>
+      <w:r>
+        <w:rPr>
+          <w:rFonts w:ascii="Arial" w:hAnsi="Arial"/>
+          <w:sz w:val="28"/>
+        </w:rPr>
+        <w:t xml:space="preserve">   is set. Done on a 90-day item moved to December 6. Mac 310.</w:t>
+      </w:r>
+    </w:p>
+    <w:p>
+      <w:pPr>
+        <w:spacing w:line="276" w:lineRule="auto"/>
+      </w:pPr>
+      <w:r>
+        <w:rPr>
+          <w:rFonts w:ascii="Arial" w:hAnsi="Arial"/>
+          <w:sz w:val="28"/>
+        </w:rPr>
+        <w:t xml:space="preserve">   TypeScript clean. On the phone.</w:t>
+      </w:r>
+    </w:p>
+    <w:p>
+      <w:pPr>
+        <w:spacing w:line="276" w:lineRule="auto"/>
+      </w:pPr>
+      <w:r>
+        <w:rPr>
+          <w:rFonts w:ascii="Arial" w:hAnsi="Arial"/>
+          <w:sz w:val="28"/>
+        </w:rPr>
+        <w:t xml:space="preserve"/>
+      </w:r>
+    </w:p>
+    <w:p>
+      <w:pPr>
+        <w:spacing w:line="276" w:lineRule="auto"/>
+      </w:pPr>
+      <w:r>
+        <w:rPr>
+          <w:rFonts w:ascii="Arial" w:hAnsi="Arial"/>
+          <w:sz w:val="28"/>
+        </w:rPr>
+        <w:t xml:space="preserve">66. #81-new — Birthdays page. Own kind on the one list. Copy of</w:t>
+      </w:r>
+    </w:p>
+    <w:p>
+      <w:pPr>
+        <w:spacing w:line="276" w:lineRule="auto"/>
+      </w:pPr>
+      <w:r>
+        <w:rPr>
+          <w:rFonts w:ascii="Arial" w:hAnsi="Arial"/>
+          <w:sz w:val="28"/>
+        </w:rPr>
+        <w:t xml:space="preserve">   Appointments, yearly Done. Help has Birthday. Forty-six birthdays</w:t>
+      </w:r>
+    </w:p>
+    <w:p>
+      <w:pPr>
+        <w:spacing w:line="276" w:lineRule="auto"/>
+      </w:pPr>
+      <w:r>
+        <w:rPr>
+          <w:rFonts w:ascii="Arial" w:hAnsi="Arial"/>
+          <w:sz w:val="28"/>
+        </w:rPr>
+        <w:t xml:space="preserve">   merged on the phone. iOS back-to-previous-app confirmed correct on</w:t>
+      </w:r>
+    </w:p>
+    <w:p>
+      <w:pPr>
+        <w:spacing w:line="276" w:lineRule="auto"/>
+      </w:pPr>
+      <w:r>
+        <w:rPr>
+          <w:rFonts w:ascii="Arial" w:hAnsi="Arial"/>
+          <w:sz w:val="28"/>
+        </w:rPr>
+        <w:t xml:space="preserve">   the phone. Mac 305. TypeScript clean. On the phone.</w:t>
+      </w:r>
+    </w:p>
+    <w:p>
+      <w:pPr>
+        <w:spacing w:line="276" w:lineRule="auto"/>
+      </w:pPr>
+      <w:r>
+        <w:rPr>
+          <w:rFonts w:ascii="Arial" w:hAnsi="Arial"/>
+          <w:sz w:val="28"/>
+        </w:rPr>
+        <w:t xml:space="preserve"/>
+      </w:r>
+    </w:p>
+    <w:p>
+      <w:pPr>
+        <w:spacing w:line="276" w:lineRule="auto"/>
+      </w:pPr>
+      <w:r>
+        <w:rPr>
+          <w:rFonts w:ascii="Arial" w:hAnsi="Arial"/>
+          <w:sz w:val="28"/>
+        </w:rPr>
+        <w:t xml:space="preserve">65. #80-new — Duplicate miss warning on open (one pop-up, right theme).</w:t>
+      </w:r>
+    </w:p>
+    <w:p>
+      <w:pPr>
+        <w:spacing w:line="276" w:lineRule="auto"/>
+      </w:pPr>
+      <w:r>
+        <w:rPr>
+          <w:rFonts w:ascii="Arial" w:hAnsi="Arial"/>
+          <w:sz w:val="28"/>
+        </w:rPr>
+        <w:t xml:space="preserve">   iOS back link — status bar from orientation; plist stays no for RCT.</w:t>
+      </w:r>
+    </w:p>
+    <w:p>
+      <w:pPr>
+        <w:spacing w:line="276" w:lineRule="auto"/>
+      </w:pPr>
+      <w:r>
+        <w:rPr>
+          <w:rFonts w:ascii="Arial" w:hAnsi="Arial"/>
+          <w:sz w:val="28"/>
+        </w:rPr>
+        <w:t xml:space="preserve">   Confirmed correct on the phone at #81-new. Help page (**Help**, **?**</w:t>
+      </w:r>
+    </w:p>
+    <w:p>
+      <w:pPr>
+        <w:spacing w:line="276" w:lineRule="auto"/>
+      </w:pPr>
+      <w:r>
+        <w:rPr>
+          <w:rFonts w:ascii="Arial" w:hAnsi="Arial"/>
+          <w:sz w:val="28"/>
+        </w:rPr>
+        <w:t xml:space="preserve">   badge) and helper (Repeats / Does not, Cancel back one step).</w:t>
+      </w:r>
+    </w:p>
+    <w:p>
+      <w:pPr>
+        <w:spacing w:line="276" w:lineRule="auto"/>
+      </w:pPr>
+      <w:r>
+        <w:rPr>
+          <w:rFonts w:ascii="Arial" w:hAnsi="Arial"/>
+          <w:sz w:val="28"/>
+        </w:rPr>
+        <w:t xml:space="preserve">   Checked on the simulator. Mac 301. TypeScript clean.</w:t>
+      </w:r>
+    </w:p>
+    <w:p>
+      <w:pPr>
+        <w:spacing w:line="276" w:lineRule="auto"/>
+      </w:pPr>
+      <w:r>
+        <w:rPr>
+          <w:rFonts w:ascii="Arial" w:hAnsi="Arial"/>
+          <w:sz w:val="28"/>
+        </w:rPr>
+        <w:t xml:space="preserve"/>
+      </w:r>
+    </w:p>
+    <w:p>
+      <w:pPr>
+        <w:spacing w:line="276" w:lineRule="auto"/>
+      </w:pPr>
+      <w:r>
+        <w:rPr>
+          <w:rFonts w:ascii="Arial" w:hAnsi="Arial"/>
+          <w:sz w:val="28"/>
+        </w:rPr>
+        <w:t xml:space="preserve">64. #79-new — Monthly Done advances the tile; Options chip picks stay</w:t>
+      </w:r>
+    </w:p>
+    <w:p>
+      <w:pPr>
+        <w:spacing w:line="276" w:lineRule="auto"/>
+      </w:pPr>
+      <w:r>
+        <w:rPr>
+          <w:rFonts w:ascii="Arial" w:hAnsi="Arial"/>
+          <w:sz w:val="28"/>
+        </w:rPr>
+        <w:t xml:space="preserve">   lit on Monthly, Quarterly, and Yearly while you set a second Thursday</w:t>
+      </w:r>
+    </w:p>
+    <w:p>
+      <w:pPr>
+        <w:spacing w:line="276" w:lineRule="auto"/>
+      </w:pPr>
+      <w:r>
+        <w:rPr>
+          <w:rFonts w:ascii="Arial" w:hAnsi="Arial"/>
+          <w:sz w:val="28"/>
+        </w:rPr>
+        <w:t xml:space="preserve">   or Wednesday after the 6th. Checked on the simulator. Mac 301.</w:t>
+      </w:r>
+    </w:p>
+    <w:p>
+      <w:pPr>
+        <w:spacing w:line="276" w:lineRule="auto"/>
+      </w:pPr>
+      <w:r>
+        <w:rPr>
+          <w:rFonts w:ascii="Arial" w:hAnsi="Arial"/>
+          <w:sz w:val="28"/>
+        </w:rPr>
+        <w:t xml:space="preserve">   TypeScript clean. Not on the phone.</w:t>
+      </w:r>
+    </w:p>
+    <w:p>
+      <w:pPr>
+        <w:spacing w:line="276" w:lineRule="auto"/>
+      </w:pPr>
+      <w:r>
+        <w:rPr>
+          <w:rFonts w:ascii="Arial" w:hAnsi="Arial"/>
+          <w:sz w:val="28"/>
+        </w:rPr>
+        <w:t xml:space="preserve"/>
+      </w:r>
+    </w:p>
+    <w:p>
+      <w:pPr>
+        <w:spacing w:line="276" w:lineRule="auto"/>
+      </w:pPr>
+      <w:r>
+        <w:rPr>
+          <w:rFonts w:ascii="Arial" w:hAnsi="Arial"/>
+          <w:sz w:val="28"/>
+        </w:rPr>
+        <w:t xml:space="preserve">63. #78-new — Daily One Time for today. Save stays on Daily. The item</w:t>
+      </w:r>
+    </w:p>
+    <w:p>
+      <w:pPr>
+        <w:spacing w:line="276" w:lineRule="auto"/>
+      </w:pPr>
+      <w:r>
+        <w:rPr>
+          <w:rFonts w:ascii="Arial" w:hAnsi="Arial"/>
+          <w:sz w:val="28"/>
+        </w:rPr>
+        <w:t xml:space="preserve">   is Daily's own one-shot, not an Appointment. Help's "for today? Yes"</w:t>
+      </w:r>
+    </w:p>
+    <w:p>
+      <w:pPr>
+        <w:spacing w:line="276" w:lineRule="auto"/>
+      </w:pPr>
+      <w:r>
+        <w:rPr>
+          <w:rFonts w:ascii="Arial" w:hAnsi="Arial"/>
+          <w:sz w:val="28"/>
+        </w:rPr>
+        <w:t xml:space="preserve">   opens the same one-shot. Mac 300. TypeScript clean. Not on the phone.</w:t>
+      </w:r>
+    </w:p>
+    <w:p>
+      <w:pPr>
+        <w:spacing w:line="276" w:lineRule="auto"/>
+      </w:pPr>
+      <w:r>
+        <w:rPr>
+          <w:rFonts w:ascii="Arial" w:hAnsi="Arial"/>
+          <w:sz w:val="28"/>
+        </w:rPr>
+        <w:t xml:space="preserve"/>
+      </w:r>
+    </w:p>
+    <w:p>
+      <w:pPr>
+        <w:spacing w:line="276" w:lineRule="auto"/>
+      </w:pPr>
+      <w:r>
+        <w:rPr>
+          <w:rFonts w:ascii="Arial" w:hAnsi="Arial"/>
+          <w:sz w:val="28"/>
+        </w:rPr>
+        <w:t xml:space="preserve">62. #77-new — Restore with Merge. Choose Replace or Merge before picking</w:t>
       </w:r>
     </w:p>
     <w:p>
@@ -1900,7 +1912,7 @@
           <w:rFonts w:ascii="Arial" w:hAnsi="Arial"/>
           <w:sz w:val="28"/>
         </w:rPr>
-        <w:t xml:space="preserve">2. #76-new — four pages out of Memory. Timer Alerts, Vault, Shopping</w:t>
+        <w:t xml:space="preserve">61. #76-new — four pages out of Memory. Timer Alerts, Vault, Shopping</w:t>
       </w:r>
     </w:p>
     <w:p>
@@ -1984,7 +1996,7 @@
           <w:rFonts w:ascii="Arial" w:hAnsi="Arial"/>
           <w:sz w:val="28"/>
         </w:rPr>
-        <w:t xml:space="preserve">2. #75-new — four pages leaving Memory. Timer Alerts, Vault, Shopping</w:t>
+        <w:t xml:space="preserve">60. #75-new — four pages leaving Memory. Timer Alerts, Vault, Shopping</w:t>
       </w:r>
     </w:p>
     <w:p>
@@ -2044,7 +2056,7 @@
           <w:rFonts w:ascii="Arial" w:hAnsi="Arial"/>
           <w:sz w:val="28"/>
         </w:rPr>
-        <w:t xml:space="preserve">3. #74-new — Grok Phase 3, and Appointments at the set time. Appointments</w:t>
+        <w:t xml:space="preserve">59. #74-new — Grok Phase 3, and Appointments at the set time. Appointments</w:t>
       </w:r>
     </w:p>
     <w:p>
@@ -2104,7 +2116,7 @@
           <w:rFonts w:ascii="Arial" w:hAnsi="Arial"/>
           <w:sz w:val="28"/>
         </w:rPr>
-        <w:t xml:space="preserve">3. #73-new — one apply-then-schedule door. Banner, Siri, pages,</w:t>
+        <w:t xml:space="preserve">58. #73-new — one apply-then-schedule door. Banner, Siri, pages,</w:t>
       </w:r>
     </w:p>
     <w:p>
@@ -2176,7 +2188,7 @@
           <w:rFonts w:ascii="Arial" w:hAnsi="Arial"/>
           <w:sz w:val="28"/>
         </w:rPr>
-        <w:t xml:space="preserve">3. #72-new — day-roll lock for last night's hangings. Two rolls on</w:t>
+        <w:t xml:space="preserve">57. #72-new — day-roll lock for last night's hangings. Two rolls on</w:t>
       </w:r>
     </w:p>
     <w:p>
@@ -2260,7 +2272,7 @@
           <w:rFonts w:ascii="Arial" w:hAnsi="Arial"/>
           <w:sz w:val="28"/>
         </w:rPr>
-        <w:t xml:space="preserve">4. #69-new — leftover cleanup built and committed. Dead exports,</w:t>
+        <w:t xml:space="preserve">56. #69-new — leftover cleanup built and committed. Dead exports,</w:t>
       </w:r>
     </w:p>
     <w:p>
@@ -2308,19 +2320,19 @@
           <w:rFonts w:ascii="Arial" w:hAnsi="Arial"/>
           <w:sz w:val="28"/>
         </w:rPr>
-        <w:t xml:space="preserve">5. #68-new — leftover cleanup sheet written. No code. Committed.</w:t>
-      </w:r>
-    </w:p>
-    <w:p>
-      <w:pPr>
-        <w:spacing w:line="276" w:lineRule="auto"/>
-      </w:pPr>
-      <w:r>
-        <w:rPr>
-          <w:rFonts w:ascii="Arial" w:hAnsi="Arial"/>
-          <w:sz w:val="28"/>
-        </w:rPr>
-        <w:t xml:space="preserve">6. #67-new — nothing missing before an EAS phone load. The three</w:t>
+        <w:t xml:space="preserve">55. #68-new — leftover cleanup sheet written. No code. Committed.</w:t>
+      </w:r>
+    </w:p>
+    <w:p>
+      <w:pPr>
+        <w:spacing w:line="276" w:lineRule="auto"/>
+      </w:pPr>
+      <w:r>
+        <w:rPr>
+          <w:rFonts w:ascii="Arial" w:hAnsi="Arial"/>
+          <w:sz w:val="28"/>
+        </w:rPr>
+        <w:t xml:space="preserve">54. #67-new — nothing missing before an EAS phone load. The three</w:t>
       </w:r>
     </w:p>
     <w:p>
@@ -2356,7 +2368,7 @@
           <w:rFonts w:ascii="Arial" w:hAnsi="Arial"/>
           <w:sz w:val="28"/>
         </w:rPr>
-        <w:t xml:space="preserve">7. #66-new — the live desk pruned; archive renamed to handoff-history;</w:t>
+        <w:t xml:space="preserve">53. #66-new — the live desk pruned; archive renamed to handoff-history;</w:t>
       </w:r>
     </w:p>
     <w:p>
@@ -2392,7 +2404,7 @@
           <w:rFonts w:ascii="Arial" w:hAnsi="Arial"/>
           <w:sz w:val="28"/>
         </w:rPr>
-        <w:t xml:space="preserve">8. #65-new — saved kinds, routes, page files, and banner sources are</w:t>
+        <w:t xml:space="preserve">52. #65-new — saved kinds, routes, page files, and banner sources are</w:t>
       </w:r>
     </w:p>
     <w:p>
@@ -2440,7 +2452,7 @@
           <w:rFonts w:ascii="Arial" w:hAnsi="Arial"/>
           <w:sz w:val="28"/>
         </w:rPr>
-        <w:t xml:space="preserve">9. #64-new — Siri says Daily and Remember. Open-app leftover out.</w:t>
+        <w:t xml:space="preserve">51. #64-new — Siri says Daily and Remember. Open-app leftover out.</w:t>
       </w:r>
     </w:p>
     <w:p>
@@ -2464,7 +2476,7 @@
           <w:rFonts w:ascii="Arial" w:hAnsi="Arial"/>
           <w:sz w:val="28"/>
         </w:rPr>
-        <w:t xml:space="preserve">10. #63-new — every page log uses the current page name. The leftover</w:t>
+        <w:t xml:space="preserve">50. #63-new — every page log uses the current page name. The leftover</w:t>
       </w:r>
     </w:p>
     <w:p>
@@ -2500,7 +2512,7 @@
           <w:rFonts w:ascii="Arial" w:hAnsi="Arial"/>
           <w:sz w:val="28"/>
         </w:rPr>
-        <w:t xml:space="preserve">11. #62-new — current notification names through the live road.</w:t>
+        <w:t xml:space="preserve">49. #62-new — current notification names through the live road.</w:t>
       </w:r>
     </w:p>
     <w:p>
@@ -2560,7 +2572,7 @@
           <w:rFonts w:ascii="Arial" w:hAnsi="Arial"/>
           <w:sz w:val="28"/>
         </w:rPr>
-        <w:t xml:space="preserve">12. #61-new — hidden old pages and dead reader road removed.</w:t>
+        <w:t xml:space="preserve">48. #61-new — hidden old pages and dead reader road removed.</w:t>
       </w:r>
     </w:p>
     <w:p>
@@ -2584,7 +2596,7 @@
           <w:rFonts w:ascii="Arial" w:hAnsi="Arial"/>
           <w:sz w:val="28"/>
         </w:rPr>
-        <w:t xml:space="preserve">13. #59-new — calendar day-list fire time (old Pending 4); useless</w:t>
+        <w:t xml:space="preserve">47. #59-new — calendar day-list fire time (old Pending 4); useless</w:t>
       </w:r>
     </w:p>
     <w:p>
@@ -2632,7 +2644,7 @@
           <w:rFonts w:ascii="Arial" w:hAnsi="Arial"/>
           <w:sz w:val="28"/>
         </w:rPr>
-        <w:t xml:space="preserve">14. #58-new — the Where? helper built from its sheet. 🧭 badge after</w:t>
+        <w:t xml:space="preserve">46. #58-new — the Where? helper built from its sheet. 🧭 badge after</w:t>
       </w:r>
     </w:p>
     <w:p>
@@ -2680,7 +2692,7 @@
           <w:rFonts w:ascii="Arial" w:hAnsi="Arial"/>
           <w:sz w:val="28"/>
         </w:rPr>
-        <w:t xml:space="preserve">15. #57-new — the Where? helper settled and its self-contained build</w:t>
+        <w:t xml:space="preserve">45. #57-new — the Where? helper settled and its self-contained build</w:t>
       </w:r>
     </w:p>
     <w:p>
@@ -2716,7 +2728,7 @@
           <w:rFonts w:ascii="Arial" w:hAnsi="Arial"/>
           <w:sz w:val="28"/>
         </w:rPr>
-        <w:t xml:space="preserve">16. #56-new — Appointments and Bucket List on every live screen;</w:t>
+        <w:t xml:space="preserve">44. #56-new — Appointments and Bucket List on every live screen;</w:t>
       </w:r>
     </w:p>
     <w:p>
@@ -2752,7 +2764,7 @@
           <w:rFonts w:ascii="Arial" w:hAnsi="Arial"/>
           <w:sz w:val="28"/>
         </w:rPr>
-        <w:t xml:space="preserve">17. #55-new — missed-firing notice for Weekly, Monthly, Quarterly,</w:t>
+        <w:t xml:space="preserve">43. #55-new — missed-firing notice for Weekly, Monthly, Quarterly,</w:t>
       </w:r>
     </w:p>
     <w:p>
@@ -2800,7 +2812,7 @@
           <w:rFonts w:ascii="Arial" w:hAnsi="Arial"/>
           <w:sz w:val="28"/>
         </w:rPr>
-        <w:t xml:space="preserve">18. #53-new (2026-09-02) — Scheduled Reminders names Daily, Weekly,</w:t>
+        <w:t xml:space="preserve">42. #53-new (2026-09-02) — Scheduled Reminders names Daily, Weekly,</w:t>
       </w:r>
     </w:p>
     <w:p>
@@ -2836,7 +2848,7 @@
           <w:rFonts w:ascii="Arial" w:hAnsi="Arial"/>
           <w:sz w:val="28"/>
         </w:rPr>
-        <w:t xml:space="preserve">19. #53-new (2026-09-02) — one list row for Daily through Extended</w:t>
+        <w:t xml:space="preserve">41. #53-new (2026-09-02) — one list row for Daily through Extended</w:t>
       </w:r>
     </w:p>
     <w:p>
@@ -2860,7 +2872,7 @@
           <w:rFonts w:ascii="Arial" w:hAnsi="Arial"/>
           <w:sz w:val="28"/>
         </w:rPr>
-        <w:t xml:space="preserve">20. #54-new (2026-09-02) — Appointments and Bucket List: one list in</w:t>
+        <w:t xml:space="preserve">40. #54-new (2026-09-02) — Appointments and Bucket List: one list in</w:t>
       </w:r>
     </w:p>
     <w:p>
@@ -2896,7 +2908,7 @@
           <w:rFonts w:ascii="Arial" w:hAnsi="Arial"/>
           <w:sz w:val="28"/>
         </w:rPr>
-        <w:t xml:space="preserve">21. #52-new — landscape 90° counter-clockwise, headers on the left,</w:t>
+        <w:t xml:space="preserve">39. #52-new — landscape 90° counter-clockwise, headers on the left,</w:t>
       </w:r>
     </w:p>
     <w:p>
@@ -2956,7 +2968,7 @@
           <w:rFonts w:ascii="Arial" w:hAnsi="Arial"/>
           <w:sz w:val="28"/>
         </w:rPr>
-        <w:t xml:space="preserve">22. #51-new — display features: header buttons and the Home badge</w:t>
+        <w:t xml:space="preserve">38. #51-new — display features: header buttons and the Home badge</w:t>
       </w:r>
     </w:p>
     <w:p>
@@ -3028,7 +3040,7 @@
           <w:rFonts w:ascii="Arial" w:hAnsi="Arial"/>
           <w:sz w:val="28"/>
         </w:rPr>
-        <w:t xml:space="preserve">23. #50-new — the other pages in landscape. Optional view, 0 and 90</w:t>
+        <w:t xml:space="preserve">37. #50-new — the other pages in landscape. Optional view, 0 and 90</w:t>
       </w:r>
     </w:p>
     <w:p>
@@ -3088,7 +3100,7 @@
           <w:rFonts w:ascii="Arial" w:hAnsi="Arial"/>
           <w:sz w:val="28"/>
         </w:rPr>
-        <w:t xml:space="preserve">24. #49-new — calendar page built from the sheet. Options Calendar</w:t>
+        <w:t xml:space="preserve">36. #49-new — calendar page built from the sheet. Options Calendar</w:t>
       </w:r>
     </w:p>
     <w:p>
@@ -3148,19 +3160,19 @@
           <w:rFonts w:ascii="Arial" w:hAnsi="Arial"/>
           <w:sz w:val="28"/>
         </w:rPr>
-        <w:t xml:space="preserve">25. #48-new — calendar build sheet written. No code.</w:t>
-      </w:r>
-    </w:p>
-    <w:p>
-      <w:pPr>
-        <w:spacing w:line="276" w:lineRule="auto"/>
-      </w:pPr>
-      <w:r>
-        <w:rPr>
-          <w:rFonts w:ascii="Arial" w:hAnsi="Arial"/>
-          <w:sz w:val="28"/>
-        </w:rPr>
-        <w:t xml:space="preserve">26. #47-new — selling description a good start and left. Features</w:t>
+        <w:t xml:space="preserve">35. #48-new — calendar build sheet written. No code.</w:t>
+      </w:r>
+    </w:p>
+    <w:p>
+      <w:pPr>
+        <w:spacing w:line="276" w:lineRule="auto"/>
+      </w:pPr>
+      <w:r>
+        <w:rPr>
+          <w:rFonts w:ascii="Arial" w:hAnsi="Arial"/>
+          <w:sz w:val="28"/>
+        </w:rPr>
+        <w:t xml:space="preserve">34. #47-new — selling description a good start and left. Features</w:t>
       </w:r>
     </w:p>
     <w:p>
@@ -3232,7 +3244,7 @@
           <w:rFonts w:ascii="Arial" w:hAnsi="Arial"/>
           <w:sz w:val="28"/>
         </w:rPr>
-        <w:t xml:space="preserve">27. #46-new — selling description begun, publishing picture written.</w:t>
+        <w:t xml:space="preserve">33. #46-new — selling description begun, publishing picture written.</w:t>
       </w:r>
     </w:p>
     <w:p>
@@ -3268,7 +3280,7 @@
           <w:rFonts w:ascii="Arial" w:hAnsi="Arial"/>
           <w:sz w:val="28"/>
         </w:rPr>
-        <w:t xml:space="preserve">27. App-Docs, 2026-08-31 — working documents stay in docs; history</w:t>
+        <w:t xml:space="preserve">32. App-Docs, 2026-08-31 — working documents stay in docs; history</w:t>
       </w:r>
     </w:p>
     <w:p>
@@ -3304,7 +3316,7 @@
           <w:rFonts w:ascii="Arial" w:hAnsi="Arial"/>
           <w:sz w:val="28"/>
         </w:rPr>
-        <w:t xml:space="preserve">29. #45-new — the two engine Fails from the sitting: Daily after Done</w:t>
+        <w:t xml:space="preserve">31. #45-new — the two engine Fails from the sitting: Daily after Done</w:t>
       </w:r>
     </w:p>
     <w:p>
@@ -3460,7 +3472,7 @@
           <w:rFonts w:ascii="Arial" w:hAnsi="Arial"/>
           <w:sz w:val="28"/>
         </w:rPr>
-        <w:t xml:space="preserve">31. #43-new — the automated-load job sheet and the sitting list.</w:t>
+        <w:t xml:space="preserve">29. #43-new — the automated-load job sheet and the sitting list.</w:t>
       </w:r>
     </w:p>
     <w:p>
@@ -3508,7 +3520,7 @@
           <w:rFonts w:ascii="Arial" w:hAnsi="Arial"/>
           <w:sz w:val="28"/>
         </w:rPr>
-        <w:t xml:space="preserve">32. #42-new — the rest of Options into the engine. Calendar shading</w:t>
+        <w:t xml:space="preserve">28. #42-new — the rest of Options into the engine. Calendar shading</w:t>
       </w:r>
     </w:p>
     <w:p>
@@ -3592,7 +3604,7 @@
           <w:rFonts w:ascii="Arial" w:hAnsi="Arial"/>
           <w:sz w:val="28"/>
         </w:rPr>
-        <w:t xml:space="preserve">33. #41-new — five Options answers, holidays, monthly patterns, and</w:t>
+        <w:t xml:space="preserve">27. #41-new — five Options answers, holidays, monthly patterns, and</w:t>
       </w:r>
     </w:p>
     <w:p>
@@ -3652,7 +3664,7 @@
           <w:rFonts w:ascii="Arial" w:hAnsi="Arial"/>
           <w:sz w:val="28"/>
         </w:rPr>
-        <w:t xml:space="preserve">34. #40-new — five hardening points, and time zone into the engine.</w:t>
+        <w:t xml:space="preserve">26. #40-new — five hardening points, and time zone into the engine.</w:t>
       </w:r>
     </w:p>
     <w:p>
@@ -3724,7 +3736,7 @@
           <w:rFonts w:ascii="Arial" w:hAnsi="Arial"/>
           <w:sz w:val="28"/>
         </w:rPr>
-        <w:t xml:space="preserve">35. #39-new — the live one-store cutover. Pages, banners and Siri write</w:t>
+        <w:t xml:space="preserve">25. #39-new — the live one-store cutover. Pages, banners and Siri write</w:t>
       </w:r>
     </w:p>
     <w:p>
@@ -3760,7 +3772,7 @@
           <w:rFonts w:ascii="Arial" w:hAnsi="Arial"/>
           <w:sz w:val="28"/>
         </w:rPr>
-        <w:t xml:space="preserve">36. #38-new — the engine and Options path read end to end. The core</w:t>
+        <w:t xml:space="preserve">24. #38-new — the engine and Options path read end to end. The core</w:t>
       </w:r>
     </w:p>
     <w:p>
@@ -3808,7 +3820,7 @@
           <w:rFonts w:ascii="Arial" w:hAnsi="Arial"/>
           <w:sz w:val="28"/>
         </w:rPr>
-        <w:t xml:space="preserve">37. #37-new — Options connecting: + OPT writes the cases that apply,</w:t>
+        <w:t xml:space="preserve">23. #37-new — Options connecting: + OPT writes the cases that apply,</w:t>
       </w:r>
     </w:p>
     <w:p>
@@ -3844,7 +3856,7 @@
           <w:rFonts w:ascii="Arial" w:hAnsi="Arial"/>
           <w:sz w:val="28"/>
         </w:rPr>
-        <w:t xml:space="preserve">38. #36-new — logs on Weekly, Monthly, Quarterly, Yearly, One Time,</w:t>
+        <w:t xml:space="preserve">22. #36-new — logs on Weekly, Monthly, Quarterly, Yearly, One Time,</w:t>
       </w:r>
     </w:p>
     <w:p>
@@ -3928,7 +3940,7 @@
           <w:rFonts w:ascii="Arial" w:hAnsi="Arial"/>
           <w:sz w:val="28"/>
         </w:rPr>
-        <w:t xml:space="preserve">39. #35-new — old screens out, including the `/myday` hop. Backup</w:t>
+        <w:t xml:space="preserve">21. #35-new — old screens out, including the `/myday` hop. Backup</w:t>
       </w:r>
     </w:p>
     <w:p>
@@ -3964,7 +3976,7 @@
           <w:rFonts w:ascii="Arial" w:hAnsi="Arial"/>
           <w:sz w:val="28"/>
         </w:rPr>
-        <w:t xml:space="preserve">40. #34-new — Weekly through Options and the + Add popup built.</w:t>
+        <w:t xml:space="preserve">20. #34-new — Weekly through Options and the + Add popup built.</w:t>
       </w:r>
     </w:p>
     <w:p>
@@ -4000,7 +4012,7 @@
           <w:rFonts w:ascii="Arial" w:hAnsi="Arial"/>
           <w:sz w:val="28"/>
         </w:rPr>
-        <w:t xml:space="preserve">41. #33-new — Daily built. Snooze, Done, hold-and-slide reorder, My</w:t>
+        <w:t xml:space="preserve">19. #33-new — Daily built. Snooze, Done, hold-and-slide reorder, My</w:t>
       </w:r>
     </w:p>
     <w:p>
@@ -4036,7 +4048,7 @@
           <w:rFonts w:ascii="Arial" w:hAnsi="Arial"/>
           <w:sz w:val="28"/>
         </w:rPr>
-        <w:t xml:space="preserve">42. #32-new — the pages phase spec, and Daily's first job sheet.</w:t>
+        <w:t xml:space="preserve">18. #32-new — the pages phase spec, and Daily's first job sheet.</w:t>
       </w:r>
     </w:p>
     <w:p>
@@ -4060,7 +4072,7 @@
           <w:rFonts w:ascii="Arial" w:hAnsi="Arial"/>
           <w:sz w:val="28"/>
         </w:rPr>
-        <w:t xml:space="preserve">43. #31-new — the record itself put right. The hand-off file went</w:t>
+        <w:t xml:space="preserve">17. #31-new — the record itself put right. The hand-off file went</w:t>
       </w:r>
     </w:p>
     <w:p>
@@ -4156,7 +4168,7 @@
           <w:rFonts w:ascii="Arial" w:hAnsi="Arial"/>
           <w:sz w:val="28"/>
         </w:rPr>
-        <w:t xml:space="preserve">44. #30-new — the reminder pages named and shaped, and the one Input</w:t>
+        <w:t xml:space="preserve">16. #30-new — the reminder pages named and shaped, and the one Input</w:t>
       </w:r>
     </w:p>
     <w:p>
@@ -4180,7 +4192,7 @@
           <w:rFonts w:ascii="Arial" w:hAnsi="Arial"/>
           <w:sz w:val="28"/>
         </w:rPr>
-        <w:t xml:space="preserve">45. #28-new — the engine gained repeat groups, skip, and time zones</w:t>
+        <w:t xml:space="preserve">15. #28-new — the engine gained repeat groups, skip, and time zones</w:t>
       </w:r>
     </w:p>
     <w:p>
@@ -4204,7 +4216,7 @@
           <w:rFonts w:ascii="Arial" w:hAnsi="Arial"/>
           <w:sz w:val="28"/>
         </w:rPr>
-        <w:t xml:space="preserve">46. #27-new — all five reminder screens went onto the one machine,</w:t>
+        <w:t xml:space="preserve">14. #27-new — all five reminder screens went onto the one machine,</w:t>
       </w:r>
     </w:p>
     <w:p>
@@ -4264,7 +4276,7 @@
           <w:rFonts w:ascii="Arial" w:hAnsi="Arial"/>
           <w:sz w:val="28"/>
         </w:rPr>
-        <w:t xml:space="preserve">47. #26-new — the per-screen translators became one translator and a</w:t>
+        <w:t xml:space="preserve">13. #26-new — the per-screen translators became one translator and a</w:t>
       </w:r>
     </w:p>
     <w:p>
@@ -4288,7 +4300,7 @@
           <w:rFonts w:ascii="Arial" w:hAnsi="Arial"/>
           <w:sz w:val="28"/>
         </w:rPr>
-        <w:t xml:space="preserve">48. #24-new and #25-new — the first two translators, My Day and</w:t>
+        <w:t xml:space="preserve">12. #24-new and #25-new — the first two translators, My Day and</w:t>
       </w:r>
     </w:p>
     <w:p>
@@ -4324,7 +4336,7 @@
           <w:rFonts w:ascii="Arial" w:hAnsi="Arial"/>
           <w:sz w:val="28"/>
         </w:rPr>
-        <w:t xml:space="preserve">49. #23-new — the common shape and the two decision blocks built and</w:t>
+        <w:t xml:space="preserve">11. #23-new — the common shape and the two decision blocks built and</w:t>
       </w:r>
     </w:p>
     <w:p>
@@ -4348,7 +4360,7 @@
           <w:rFonts w:ascii="Arial" w:hAnsi="Arial"/>
           <w:sz w:val="28"/>
         </w:rPr>
-        <w:t xml:space="preserve">50. #22-new — the field names settled, and setting reminders two</w:t>
+        <w:t xml:space="preserve">10. #22-new — the field names settled, and setting reminders two</w:t>
       </w:r>
     </w:p>
     <w:p>
@@ -4372,7 +4384,7 @@
           <w:rFonts w:ascii="Arial" w:hAnsi="Arial"/>
           <w:sz w:val="28"/>
         </w:rPr>
-        <w:t xml:space="preserve">51. #21-new — the common shape settled on paper, all five screens</w:t>
+        <w:t xml:space="preserve">9. #21-new — the common shape settled on paper, all five screens</w:t>
       </w:r>
     </w:p>
     <w:p>
@@ -4396,7 +4408,7 @@
           <w:rFonts w:ascii="Arial" w:hAnsi="Arial"/>
           <w:sz w:val="28"/>
         </w:rPr>
-        <w:t xml:space="preserve">52. #20-new — My Week's Delay written down like the others, and the</w:t>
+        <w:t xml:space="preserve">8. #20-new — My Week's Delay written down like the others, and the</w:t>
       </w:r>
     </w:p>
     <w:p>
@@ -4420,7 +4432,7 @@
           <w:rFonts w:ascii="Arial" w:hAnsi="Arial"/>
           <w:sz w:val="28"/>
         </w:rPr>
-        <w:t xml:space="preserve">53. #19-new — your epiphany: one shape instead of six, the reminder</w:t>
+        <w:t xml:space="preserve">7. #19-new — your epiphany: one shape instead of six, the reminder</w:t>
       </w:r>
     </w:p>
     <w:p>
@@ -4444,7 +4456,7 @@
           <w:rFonts w:ascii="Arial" w:hAnsi="Arial"/>
           <w:sz w:val="28"/>
         </w:rPr>
-        <w:t xml:space="preserve">54. #18-new — the outsider's report checked. The answer was mend</w:t>
+        <w:t xml:space="preserve">6. #18-new — the outsider's report checked. The answer was mend</w:t>
       </w:r>
     </w:p>
     <w:p>
@@ -4480,7 +4492,7 @@
           <w:rFonts w:ascii="Arial" w:hAnsi="Arial"/>
           <w:sz w:val="28"/>
         </w:rPr>
-        <w:t xml:space="preserve">55. #15-new to #17-new — the failure pop-up and the missed-firing</w:t>
+        <w:t xml:space="preserve">5. #15-new to #17-new — the failure pop-up and the missed-firing</w:t>
       </w:r>
     </w:p>
     <w:p>
@@ -4516,7 +4528,7 @@
           <w:rFonts w:ascii="Arial" w:hAnsi="Arial"/>
           <w:sz w:val="28"/>
         </w:rPr>
-        <w:t xml:space="preserve">56. #13-new and #14-new — tapping a reminder lands on its own item</w:t>
+        <w:t xml:space="preserve">4. #13-new and #14-new — tapping a reminder lands on its own item</w:t>
       </w:r>
     </w:p>
     <w:p>
@@ -4540,7 +4552,7 @@
           <w:rFonts w:ascii="Arial" w:hAnsi="Arial"/>
           <w:sz w:val="28"/>
         </w:rPr>
-        <w:t xml:space="preserve">57. #12-new — the Scheduled Reminders screen, showing every</w:t>
+        <w:t xml:space="preserve">3. #12-new — the Scheduled Reminders screen, showing every</w:t>
       </w:r>
     </w:p>
     <w:p>
@@ -4564,7 +4576,7 @@
           <w:rFonts w:ascii="Arial" w:hAnsi="Arial"/>
           <w:sz w:val="28"/>
         </w:rPr>
-        <w:t xml:space="preserve">58. #6-new to #12-new — the scheduler built in eight steps, so one</w:t>
+        <w:t xml:space="preserve">2. #6-new to #12-new — the scheduler built in eight steps, so one</w:t>
       </w:r>
     </w:p>
     <w:p>
@@ -4588,7 +4600,7 @@
           <w:rFonts w:ascii="Arial" w:hAnsi="Arial"/>
           <w:sz w:val="28"/>
         </w:rPr>
-        <w:t xml:space="preserve">59. #4-new — the first notification fixes. Real, and kept, but not</w:t>
+        <w:t xml:space="preserve">1. #4-new — the first notification fixes. Real, and kept, but not</w:t>
       </w:r>
     </w:p>
     <w:p>
@@ -5336,7 +5348,7 @@
           <w:rFonts w:ascii="Arial" w:hAnsi="Arial"/>
           <w:sz w:val="28"/>
         </w:rPr>
-        <w:t xml:space="preserve">Checked on the simulator. Not on the phone.</w:t>
+        <w:t xml:space="preserve">Checked on the simulator. Merge checked on the phone at #81-new.</w:t>
       </w:r>
     </w:p>
     <w:p>

</xml_diff>

<commit_message>
86-new - Banner housing implementation build sheet done.
</commit_message>
<xml_diff>
--- a/docs/pending.docx
+++ b/docs/pending.docx
@@ -24,7 +24,7 @@
           <w:rFonts w:ascii="Arial" w:hAnsi="Arial"/>
           <w:sz w:val="28"/>
         </w:rPr>
-        <w:t xml:space="preserve">Last updated: 2026-09-07 (#82-new — Quarterly 30 / 60 / 90 chips on the phone)</w:t>
+        <w:t xml:space="preserve">Last updated: 2026-09-08 (#85-new)</w:t>
       </w:r>
     </w:p>
     <w:p>
@@ -325,6 +325,210 @@
           <w:rFonts w:ascii="Arial" w:hAnsi="Arial"/>
           <w:sz w:val="28"/>
         </w:rPr>
+        <w:t xml:space="preserve">The design description of the whole app is the designed</w:t>
+      </w:r>
+    </w:p>
+    <w:p>
+      <w:pPr>
+        <w:spacing w:line="276" w:lineRule="auto"/>
+      </w:pPr>
+      <w:r>
+        <w:rPr>
+          <w:rFonts w:ascii="Arial" w:hAnsi="Arial"/>
+          <w:sz w:val="28"/>
+        </w:rPr>
+        <w:t xml:space="preserve">implementation (Patrick, #84-new). It is the guide. A sitting builds</w:t>
+      </w:r>
+    </w:p>
+    <w:p>
+      <w:pPr>
+        <w:spacing w:line="276" w:lineRule="auto"/>
+      </w:pPr>
+      <w:r>
+        <w:rPr>
+          <w:rFonts w:ascii="Arial" w:hAnsi="Arial"/>
+          <w:sz w:val="28"/>
+        </w:rPr>
+        <w:t xml:space="preserve">from docs/designed-implementation.md and does not ask Patrick a</w:t>
+      </w:r>
+    </w:p>
+    <w:p>
+      <w:pPr>
+        <w:spacing w:line="276" w:lineRule="auto"/>
+      </w:pPr>
+      <w:r>
+        <w:rPr>
+          <w:rFonts w:ascii="Arial" w:hAnsi="Arial"/>
+          <w:sz w:val="28"/>
+        </w:rPr>
+        <w:t xml:space="preserve">design question.</w:t>
+      </w:r>
+    </w:p>
+    <w:p>
+      <w:pPr>
+        <w:spacing w:line="276" w:lineRule="auto"/>
+      </w:pPr>
+      <w:r>
+        <w:rPr>
+          <w:rFonts w:ascii="Arial" w:hAnsi="Arial"/>
+          <w:sz w:val="28"/>
+        </w:rPr>
+        <w:t xml:space="preserve"/>
+      </w:r>
+    </w:p>
+    <w:p>
+      <w:pPr>
+        <w:spacing w:line="276" w:lineRule="auto"/>
+      </w:pPr>
+      <w:r>
+        <w:rPr>
+          <w:rFonts w:ascii="Arial" w:hAnsi="Arial"/>
+          <w:sz w:val="28"/>
+        </w:rPr>
+        <w:t xml:space="preserve">Next sitting: banner housing onto the bits, from</w:t>
+      </w:r>
+    </w:p>
+    <w:p>
+      <w:pPr>
+        <w:spacing w:line="276" w:lineRule="auto"/>
+      </w:pPr>
+      <w:r>
+        <w:rPr>
+          <w:rFonts w:ascii="Arial" w:hAnsi="Arial"/>
+          <w:sz w:val="28"/>
+        </w:rPr>
+        <w:t xml:space="preserve">docs-ref/build-sheets/build-sheet-banner-housing.md. Two pieces: the</w:t>
+      </w:r>
+    </w:p>
+    <w:p>
+      <w:pPr>
+        <w:spacing w:line="276" w:lineRule="auto"/>
+      </w:pPr>
+      <w:r>
+        <w:rPr>
+          <w:rFonts w:ascii="Arial" w:hAnsi="Arial"/>
+          <w:sz w:val="28"/>
+        </w:rPr>
+        <w:t xml:space="preserve">door, then the housing. Stop between them. #85-new wrote the sheet</w:t>
+      </w:r>
+    </w:p>
+    <w:p>
+      <w:pPr>
+        <w:spacing w:line="276" w:lineRule="auto"/>
+      </w:pPr>
+      <w:r>
+        <w:rPr>
+          <w:rFonts w:ascii="Arial" w:hAnsi="Arial"/>
+          <w:sz w:val="28"/>
+        </w:rPr>
+        <w:t xml:space="preserve">and did not build. Do not change the engine.</w:t>
+      </w:r>
+    </w:p>
+    <w:p>
+      <w:pPr>
+        <w:spacing w:line="276" w:lineRule="auto"/>
+      </w:pPr>
+      <w:r>
+        <w:rPr>
+          <w:rFonts w:ascii="Arial" w:hAnsi="Arial"/>
+          <w:sz w:val="28"/>
+        </w:rPr>
+        <w:t xml:space="preserve"/>
+      </w:r>
+    </w:p>
+    <w:p>
+      <w:pPr>
+        <w:spacing w:line="276" w:lineRule="auto"/>
+      </w:pPr>
+      <w:r>
+        <w:rPr>
+          <w:rFonts w:ascii="Arial" w:hAnsi="Arial"/>
+          <w:sz w:val="28"/>
+        </w:rPr>
+        <w:t xml:space="preserve">Two leftovers, one at a time: banner housing onto the bits; Siri out</w:t>
+      </w:r>
+    </w:p>
+    <w:p>
+      <w:pPr>
+        <w:spacing w:line="276" w:lineRule="auto"/>
+      </w:pPr>
+      <w:r>
+        <w:rPr>
+          <w:rFonts w:ascii="Arial" w:hAnsi="Arial"/>
+          <w:sz w:val="28"/>
+        </w:rPr>
+        <w:t xml:space="preserve">of sight.</w:t>
+      </w:r>
+    </w:p>
+    <w:p>
+      <w:pPr>
+        <w:spacing w:line="276" w:lineRule="auto"/>
+      </w:pPr>
+      <w:r>
+        <w:rPr>
+          <w:rFonts w:ascii="Arial" w:hAnsi="Arial"/>
+          <w:sz w:val="28"/>
+        </w:rPr>
+        <w:t xml:space="preserve"/>
+      </w:r>
+    </w:p>
+    <w:p>
+      <w:pPr>
+        <w:spacing w:line="276" w:lineRule="auto"/>
+      </w:pPr>
+      <w:r>
+        <w:rPr>
+          <w:rFonts w:ascii="Arial" w:hAnsi="Arial"/>
+          <w:sz w:val="28"/>
+        </w:rPr>
+        <w:t xml:space="preserve">#84-new ideas, a separate issue from those sheets: Home badges</w:t>
+      </w:r>
+    </w:p>
+    <w:p>
+      <w:pPr>
+        <w:spacing w:line="276" w:lineRule="auto"/>
+      </w:pPr>
+      <w:r>
+        <w:rPr>
+          <w:rFonts w:ascii="Arial" w:hAnsi="Arial"/>
+          <w:sz w:val="28"/>
+        </w:rPr>
+        <w:t xml:space="preserve">movable on Home; Option no longer reachable as a Home badge;</w:t>
+      </w:r>
+    </w:p>
+    <w:p>
+      <w:pPr>
+        <w:spacing w:line="276" w:lineRule="auto"/>
+      </w:pPr>
+      <w:r>
+        <w:rPr>
+          <w:rFonts w:ascii="Arial" w:hAnsi="Arial"/>
+          <w:sz w:val="28"/>
+        </w:rPr>
+        <w:t xml:space="preserve">Settings needs password protection.</w:t>
+      </w:r>
+    </w:p>
+    <w:p>
+      <w:pPr>
+        <w:spacing w:line="276" w:lineRule="auto"/>
+      </w:pPr>
+      <w:r>
+        <w:rPr>
+          <w:rFonts w:ascii="Arial" w:hAnsi="Arial"/>
+          <w:sz w:val="28"/>
+        </w:rPr>
+        <w:t xml:space="preserve"/>
+      </w:r>
+    </w:p>
+    <w:p>
+      <w:pPr>
+        <w:spacing w:line="276" w:lineRule="auto"/>
+      </w:pPr>
+      <w:r>
+        <w:rPr>
+          <w:rFonts w:ascii="Arial" w:hAnsi="Arial"/>
+          <w:sz w:val="28"/>
+        </w:rPr>
         <w:t xml:space="preserve">The second new page is not yet named. Day-roll lock still wants a</w:t>
       </w:r>
     </w:p>
@@ -506,7 +710,67 @@
           <w:rFonts w:ascii="Arial" w:hAnsi="Arial"/>
           <w:sz w:val="28"/>
         </w:rPr>
-        <w:t xml:space="preserve">    that spec, and Extended to Bucket List.</w:t>
+        <w:t xml:space="preserve">    that spec, and Extended to Bucket List. At #84-new the spec</w:t>
+      </w:r>
+    </w:p>
+    <w:p>
+      <w:pPr>
+        <w:spacing w:line="276" w:lineRule="auto"/>
+      </w:pPr>
+      <w:r>
+        <w:rPr>
+          <w:rFonts w:ascii="Arial" w:hAnsi="Arial"/>
+          <w:sz w:val="28"/>
+        </w:rPr>
+        <w:t xml:space="preserve">    is the designed implementation of the whole app: it is the</w:t>
+      </w:r>
+    </w:p>
+    <w:p>
+      <w:pPr>
+        <w:spacing w:line="276" w:lineRule="auto"/>
+      </w:pPr>
+      <w:r>
+        <w:rPr>
+          <w:rFonts w:ascii="Arial" w:hAnsi="Arial"/>
+          <w:sz w:val="28"/>
+        </w:rPr>
+        <w:t xml:space="preserve">    guide, and it replaces a separate layer of decisions and rules.</w:t>
+      </w:r>
+    </w:p>
+    <w:p>
+      <w:pPr>
+        <w:spacing w:line="276" w:lineRule="auto"/>
+      </w:pPr>
+      <w:r>
+        <w:rPr>
+          <w:rFonts w:ascii="Arial" w:hAnsi="Arial"/>
+          <w:sz w:val="28"/>
+        </w:rPr>
+        <w:t xml:space="preserve">    The first piece is docs/designed-implementation.md. This sitting</w:t>
+      </w:r>
+    </w:p>
+    <w:p>
+      <w:pPr>
+        <w:spacing w:line="276" w:lineRule="auto"/>
+      </w:pPr>
+      <w:r>
+        <w:rPr>
+          <w:rFonts w:ascii="Arial" w:hAnsi="Arial"/>
+          <w:sz w:val="28"/>
+        </w:rPr>
+        <w:t xml:space="preserve">    wrote the machinery, each kind, Daily on the shared list, and the</w:t>
+      </w:r>
+    </w:p>
+    <w:p>
+      <w:pPr>
+        <w:spacing w:line="276" w:lineRule="auto"/>
+      </w:pPr>
+      <w:r>
+        <w:rPr>
+          <w:rFonts w:ascii="Arial" w:hAnsi="Arial"/>
+          <w:sz w:val="28"/>
+        </w:rPr>
+        <w:t xml:space="preserve">    banner housing. Home and Settings are not in that piece.</w:t>
       </w:r>
     </w:p>
     <w:p>
@@ -1431,6 +1695,66 @@
           <w:rFonts w:ascii="Arial" w:hAnsi="Arial"/>
           <w:sz w:val="28"/>
         </w:rPr>
+        <w:t xml:space="preserve">16. THE DESIGN DESCRIPTION IS THE DESIGNED IMPLEMENTATION</w:t>
+      </w:r>
+    </w:p>
+    <w:p>
+      <w:pPr>
+        <w:spacing w:line="276" w:lineRule="auto"/>
+      </w:pPr>
+      <w:r>
+        <w:rPr>
+          <w:rFonts w:ascii="Arial" w:hAnsi="Arial"/>
+          <w:sz w:val="28"/>
+        </w:rPr>
+        <w:t xml:space="preserve">    (Patrick, #84-new). It is the guide for the whole app. A sitting</w:t>
+      </w:r>
+    </w:p>
+    <w:p>
+      <w:pPr>
+        <w:spacing w:line="276" w:lineRule="auto"/>
+      </w:pPr>
+      <w:r>
+        <w:rPr>
+          <w:rFonts w:ascii="Arial" w:hAnsi="Arial"/>
+          <w:sz w:val="28"/>
+        </w:rPr>
+        <w:t xml:space="preserve">    builds from docs/designed-implementation.md and does not ask</w:t>
+      </w:r>
+    </w:p>
+    <w:p>
+      <w:pPr>
+        <w:spacing w:line="276" w:lineRule="auto"/>
+      </w:pPr>
+      <w:r>
+        <w:rPr>
+          <w:rFonts w:ascii="Arial" w:hAnsi="Arial"/>
+          <w:sz w:val="28"/>
+        </w:rPr>
+        <w:t xml:space="preserve">    Patrick a design question. This sitting wrote the machinery, each</w:t>
+      </w:r>
+    </w:p>
+    <w:p>
+      <w:pPr>
+        <w:spacing w:line="276" w:lineRule="auto"/>
+      </w:pPr>
+      <w:r>
+        <w:rPr>
+          <w:rFonts w:ascii="Arial" w:hAnsi="Arial"/>
+          <w:sz w:val="28"/>
+        </w:rPr>
+        <w:t xml:space="preserve">    kind, Daily on the shared list, and the banner housing.</w:t>
+      </w:r>
+    </w:p>
+    <w:p>
+      <w:pPr>
+        <w:spacing w:line="276" w:lineRule="auto"/>
+      </w:pPr>
+      <w:r>
+        <w:rPr>
+          <w:rFonts w:ascii="Arial" w:hAnsi="Arial"/>
+          <w:sz w:val="28"/>
+        </w:rPr>
         <w:t xml:space="preserve"/>
       </w:r>
     </w:p>
@@ -1540,6 +1864,234 @@
           <w:rFonts w:ascii="Arial" w:hAnsi="Arial"/>
           <w:sz w:val="28"/>
         </w:rPr>
+        <w:t xml:space="preserve">72. #84-new — Daily onto the shared list. app/daily.tsx is the same</w:t>
+      </w:r>
+    </w:p>
+    <w:p>
+      <w:pPr>
+        <w:spacing w:line="276" w:lineRule="auto"/>
+      </w:pPr>
+      <w:r>
+        <w:rPr>
+          <w:rFonts w:ascii="Arial" w:hAnsi="Arial"/>
+          <w:sz w:val="28"/>
+        </w:rPr>
+        <w:t xml:space="preserve">   thin route as Weekly. Extras live on the shared list page.</w:t>
+      </w:r>
+    </w:p>
+    <w:p>
+      <w:pPr>
+        <w:spacing w:line="276" w:lineRule="auto"/>
+      </w:pPr>
+      <w:r>
+        <w:rPr>
+          <w:rFonts w:ascii="Arial" w:hAnsi="Arial"/>
+          <w:sz w:val="28"/>
+        </w:rPr>
+        <w:t xml:space="preserve">   TypeScript clean. Engine not touched. Not on the phone.</w:t>
+      </w:r>
+    </w:p>
+    <w:p>
+      <w:pPr>
+        <w:spacing w:line="276" w:lineRule="auto"/>
+      </w:pPr>
+      <w:r>
+        <w:rPr>
+          <w:rFonts w:ascii="Arial" w:hAnsi="Arial"/>
+          <w:sz w:val="28"/>
+        </w:rPr>
+        <w:t xml:space="preserve"/>
+      </w:r>
+    </w:p>
+    <w:p>
+      <w:pPr>
+        <w:spacing w:line="276" w:lineRule="auto"/>
+      </w:pPr>
+      <w:r>
+        <w:rPr>
+          <w:rFonts w:ascii="Arial" w:hAnsi="Arial"/>
+          <w:sz w:val="28"/>
+        </w:rPr>
+        <w:t xml:space="preserve">71. #84-new — design guide. Whole-app designed implementation in</w:t>
+      </w:r>
+    </w:p>
+    <w:p>
+      <w:pPr>
+        <w:spacing w:line="276" w:lineRule="auto"/>
+      </w:pPr>
+      <w:r>
+        <w:rPr>
+          <w:rFonts w:ascii="Arial" w:hAnsi="Arial"/>
+          <w:sz w:val="28"/>
+        </w:rPr>
+        <w:t xml:space="preserve">   docs/designed-implementation.md. Next sitting implements Daily from</w:t>
+      </w:r>
+    </w:p>
+    <w:p>
+      <w:pPr>
+        <w:spacing w:line="276" w:lineRule="auto"/>
+      </w:pPr>
+      <w:r>
+        <w:rPr>
+          <w:rFonts w:ascii="Arial" w:hAnsi="Arial"/>
+          <w:sz w:val="28"/>
+        </w:rPr>
+        <w:t xml:space="preserve">   it. Engine stays. No code.</w:t>
+      </w:r>
+    </w:p>
+    <w:p>
+      <w:pPr>
+        <w:spacing w:line="276" w:lineRule="auto"/>
+      </w:pPr>
+      <w:r>
+        <w:rPr>
+          <w:rFonts w:ascii="Arial" w:hAnsi="Arial"/>
+          <w:sz w:val="28"/>
+        </w:rPr>
+        <w:t xml:space="preserve"/>
+      </w:r>
+    </w:p>
+    <w:p>
+      <w:pPr>
+        <w:spacing w:line="276" w:lineRule="auto"/>
+      </w:pPr>
+      <w:r>
+        <w:rPr>
+          <w:rFonts w:ascii="Arial" w:hAnsi="Arial"/>
+          <w:sz w:val="28"/>
+        </w:rPr>
+        <w:t xml:space="preserve">70. #83-new — pages like the engine. Rebuild what does not fit. Daily,</w:t>
+      </w:r>
+    </w:p>
+    <w:p>
+      <w:pPr>
+        <w:spacing w:line="276" w:lineRule="auto"/>
+      </w:pPr>
+      <w:r>
+        <w:rPr>
+          <w:rFonts w:ascii="Arial" w:hAnsi="Arial"/>
+          <w:sz w:val="28"/>
+        </w:rPr>
+        <w:t xml:space="preserve">   banner housing, and Siri-out-of-sight are the three sheets. Banner</w:t>
+      </w:r>
+    </w:p>
+    <w:p>
+      <w:pPr>
+        <w:spacing w:line="276" w:lineRule="auto"/>
+      </w:pPr>
+      <w:r>
+        <w:rPr>
+          <w:rFonts w:ascii="Arial" w:hAnsi="Arial"/>
+          <w:sz w:val="28"/>
+        </w:rPr>
+        <w:t xml:space="preserve">   buttons on the bit field. Siri out of sight. No sheets written.</w:t>
+      </w:r>
+    </w:p>
+    <w:p>
+      <w:pPr>
+        <w:spacing w:line="276" w:lineRule="auto"/>
+      </w:pPr>
+      <w:r>
+        <w:rPr>
+          <w:rFonts w:ascii="Arial" w:hAnsi="Arial"/>
+          <w:sz w:val="28"/>
+        </w:rPr>
+        <w:t xml:space="preserve"/>
+      </w:r>
+    </w:p>
+    <w:p>
+      <w:pPr>
+        <w:spacing w:line="276" w:lineRule="auto"/>
+      </w:pPr>
+      <w:r>
+        <w:rPr>
+          <w:rFonts w:ascii="Arial" w:hAnsi="Arial"/>
+          <w:sz w:val="28"/>
+        </w:rPr>
+        <w:t xml:space="preserve">69. #83-new — dated Done-tick morning clear. Birthdays included. Past</w:t>
+      </w:r>
+    </w:p>
+    <w:p>
+      <w:pPr>
+        <w:spacing w:line="276" w:lineRule="auto"/>
+      </w:pPr>
+      <w:r>
+        <w:rPr>
+          <w:rFonts w:ascii="Arial" w:hAnsi="Arial"/>
+          <w:sz w:val="28"/>
+        </w:rPr>
+        <w:t xml:space="preserve">   due date clears. Appointments stay done. Mac 313. TypeScript clean.</w:t>
+      </w:r>
+    </w:p>
+    <w:p>
+      <w:pPr>
+        <w:spacing w:line="276" w:lineRule="auto"/>
+      </w:pPr>
+      <w:r>
+        <w:rPr>
+          <w:rFonts w:ascii="Arial" w:hAnsi="Arial"/>
+          <w:sz w:val="28"/>
+        </w:rPr>
+        <w:t xml:space="preserve">   Not on the phone.</w:t>
+      </w:r>
+    </w:p>
+    <w:p>
+      <w:pPr>
+        <w:spacing w:line="276" w:lineRule="auto"/>
+      </w:pPr>
+      <w:r>
+        <w:rPr>
+          <w:rFonts w:ascii="Arial" w:hAnsi="Arial"/>
+          <w:sz w:val="28"/>
+        </w:rPr>
+        <w:t xml:space="preserve"/>
+      </w:r>
+    </w:p>
+    <w:p>
+      <w:pPr>
+        <w:spacing w:line="276" w:lineRule="auto"/>
+      </w:pPr>
+      <w:r>
+        <w:rPr>
+          <w:rFonts w:ascii="Arial" w:hAnsi="Arial"/>
+          <w:sz w:val="28"/>
+        </w:rPr>
+        <w:t xml:space="preserve">68. #82-new — first Connect trip. Testers on TestFlight. Journey in</w:t>
+      </w:r>
+    </w:p>
+    <w:p>
+      <w:pPr>
+        <w:spacing w:line="276" w:lineRule="auto"/>
+      </w:pPr>
+      <w:r>
+        <w:rPr>
+          <w:rFonts w:ascii="Arial" w:hAnsi="Arial"/>
+          <w:sz w:val="28"/>
+        </w:rPr>
+        <w:t xml:space="preserve">   docs/connect-submit.md. Committed (Patrick, #83-new).</w:t>
+      </w:r>
+    </w:p>
+    <w:p>
+      <w:pPr>
+        <w:spacing w:line="276" w:lineRule="auto"/>
+      </w:pPr>
+      <w:r>
+        <w:rPr>
+          <w:rFonts w:ascii="Arial" w:hAnsi="Arial"/>
+          <w:sz w:val="28"/>
+        </w:rPr>
+        <w:t xml:space="preserve"/>
+      </w:r>
+    </w:p>
+    <w:p>
+      <w:pPr>
+        <w:spacing w:line="276" w:lineRule="auto"/>
+      </w:pPr>
+      <w:r>
+        <w:rPr>
+          <w:rFonts w:ascii="Arial" w:hAnsi="Arial"/>
+          <w:sz w:val="28"/>
+        </w:rPr>
         <w:t xml:space="preserve">67. #82-new — Quarterly 30 / 60 / 90 chips on Add. No chip stays</w:t>
       </w:r>
     </w:p>
@@ -1576,7 +2128,7 @@
           <w:rFonts w:ascii="Arial" w:hAnsi="Arial"/>
           <w:sz w:val="28"/>
         </w:rPr>
-        <w:t xml:space="preserve">   TypeScript clean. On the phone.</w:t>
+        <w:t xml:space="preserve">   TypeScript clean. On the phone. Committed (Patrick, #83-new).</w:t>
       </w:r>
     </w:p>
     <w:p>
@@ -5191,19 +5743,31 @@
           <w:rFonts w:ascii="Arial" w:hAnsi="Arial"/>
           <w:sz w:val="28"/>
         </w:rPr>
-        <w:t xml:space="preserve">1. Voice control through Siri. Set aside after much effort; revisit</w:t>
-      </w:r>
-    </w:p>
-    <w:p>
-      <w:pPr>
-        <w:spacing w:line="276" w:lineRule="auto"/>
-      </w:pPr>
-      <w:r>
-        <w:rPr>
-          <w:rFonts w:ascii="Arial" w:hAnsi="Arial"/>
-          <w:sz w:val="28"/>
-        </w:rPr>
-        <w:t xml:space="preserve">   only if a future iPhone update fixes the name-matching.</w:t>
+        <w:t xml:space="preserve">1. Voice control through Siri. Taken out of what a person can see</w:t>
+      </w:r>
+    </w:p>
+    <w:p>
+      <w:pPr>
+        <w:spacing w:line="276" w:lineRule="auto"/>
+      </w:pPr>
+      <w:r>
+        <w:rPr>
+          <w:rFonts w:ascii="Arial" w:hAnsi="Arial"/>
+          <w:sz w:val="28"/>
+        </w:rPr>
+        <w:t xml:space="preserve">   (#83-new). Keep in the back of the design. Do not raise. Research</w:t>
+      </w:r>
+    </w:p>
+    <w:p>
+      <w:pPr>
+        <w:spacing w:line="276" w:lineRule="auto"/>
+      </w:pPr>
+      <w:r>
+        <w:rPr>
+          <w:rFonts w:ascii="Arial" w:hAnsi="Arial"/>
+          <w:sz w:val="28"/>
+        </w:rPr>
+        <w:t xml:space="preserve">   where Apple is headed is later.</w:t>
       </w:r>
     </w:p>
     <w:p>

</xml_diff>

<commit_message>
88-new - Home page changes done.
</commit_message>
<xml_diff>
--- a/docs/pending.docx
+++ b/docs/pending.docx
@@ -24,7 +24,7 @@
           <w:rFonts w:ascii="Arial" w:hAnsi="Arial"/>
           <w:sz w:val="28"/>
         </w:rPr>
-        <w:t xml:space="preserve">Last updated: 2026-09-08 (#85-new)</w:t>
+        <w:t xml:space="preserve">Last updated: 2026-09-08 (#88-new)</w:t>
       </w:r>
     </w:p>
     <w:p>
@@ -385,43 +385,31 @@
           <w:rFonts w:ascii="Arial" w:hAnsi="Arial"/>
           <w:sz w:val="28"/>
         </w:rPr>
-        <w:t xml:space="preserve">Next sitting: banner housing onto the bits, from</w:t>
-      </w:r>
-    </w:p>
-    <w:p>
-      <w:pPr>
-        <w:spacing w:line="276" w:lineRule="auto"/>
-      </w:pPr>
-      <w:r>
-        <w:rPr>
-          <w:rFonts w:ascii="Arial" w:hAnsi="Arial"/>
-          <w:sz w:val="28"/>
-        </w:rPr>
-        <w:t xml:space="preserve">docs-ref/build-sheets/build-sheet-banner-housing.md. Two pieces: the</w:t>
-      </w:r>
-    </w:p>
-    <w:p>
-      <w:pPr>
-        <w:spacing w:line="276" w:lineRule="auto"/>
-      </w:pPr>
-      <w:r>
-        <w:rPr>
-          <w:rFonts w:ascii="Arial" w:hAnsi="Arial"/>
-          <w:sz w:val="28"/>
-        </w:rPr>
-        <w:t xml:space="preserve">door, then the housing. Stop between them. #85-new wrote the sheet</w:t>
-      </w:r>
-    </w:p>
-    <w:p>
-      <w:pPr>
-        <w:spacing w:line="276" w:lineRule="auto"/>
-      </w:pPr>
-      <w:r>
-        <w:rPr>
-          <w:rFonts w:ascii="Arial" w:hAnsi="Arial"/>
-          <w:sz w:val="28"/>
-        </w:rPr>
-        <w:t xml:space="preserve">and did not build. Do not change the engine.</w:t>
+        <w:t xml:space="preserve">Next sitting: the next bite of the designed implementation</w:t>
+      </w:r>
+    </w:p>
+    <w:p>
+      <w:pPr>
+        <w:spacing w:line="276" w:lineRule="auto"/>
+      </w:pPr>
+      <w:r>
+        <w:rPr>
+          <w:rFonts w:ascii="Arial" w:hAnsi="Arial"/>
+          <w:sz w:val="28"/>
+        </w:rPr>
+        <w:t xml:space="preserve">(Patrick, #88-new close). One bite at a time. Home and Help are in</w:t>
+      </w:r>
+    </w:p>
+    <w:p>
+      <w:pPr>
+        <w:spacing w:line="276" w:lineRule="auto"/>
+      </w:pPr>
+      <w:r>
+        <w:rPr>
+          <w:rFonts w:ascii="Arial" w:hAnsi="Arial"/>
+          <w:sz w:val="28"/>
+        </w:rPr>
+        <w:t xml:space="preserve">docs/designed-implementation.md. Do not change the engine.</w:t>
       </w:r>
     </w:p>
     <w:p>
@@ -445,19 +433,19 @@
           <w:rFonts w:ascii="Arial" w:hAnsi="Arial"/>
           <w:sz w:val="28"/>
         </w:rPr>
-        <w:t xml:space="preserve">Two leftovers, one at a time: banner housing onto the bits; Siri out</w:t>
-      </w:r>
-    </w:p>
-    <w:p>
-      <w:pPr>
-        <w:spacing w:line="276" w:lineRule="auto"/>
-      </w:pPr>
-      <w:r>
-        <w:rPr>
-          <w:rFonts w:ascii="Arial" w:hAnsi="Arial"/>
-          <w:sz w:val="28"/>
-        </w:rPr>
-        <w:t xml:space="preserve">of sight.</w:t>
+        <w:t xml:space="preserve">Home was built at #88-new: badges move the iOS way; Options is not on</w:t>
+      </w:r>
+    </w:p>
+    <w:p>
+      <w:pPr>
+        <w:spacing w:line="276" w:lineRule="auto"/>
+      </w:pPr>
+      <w:r>
+        <w:rPr>
+          <w:rFonts w:ascii="Arial" w:hAnsi="Arial"/>
+          <w:sz w:val="28"/>
+        </w:rPr>
+        <w:t xml:space="preserve">the grid. Help is in the spec. Not on the phone.</w:t>
       </w:r>
     </w:p>
     <w:p>
@@ -481,31 +469,19 @@
           <w:rFonts w:ascii="Arial" w:hAnsi="Arial"/>
           <w:sz w:val="28"/>
         </w:rPr>
-        <w:t xml:space="preserve">#84-new ideas, a separate issue from those sheets: Home badges</w:t>
-      </w:r>
-    </w:p>
-    <w:p>
-      <w:pPr>
-        <w:spacing w:line="276" w:lineRule="auto"/>
-      </w:pPr>
-      <w:r>
-        <w:rPr>
-          <w:rFonts w:ascii="Arial" w:hAnsi="Arial"/>
-          <w:sz w:val="28"/>
-        </w:rPr>
-        <w:t xml:space="preserve">movable on Home; Option no longer reachable as a Home badge;</w:t>
-      </w:r>
-    </w:p>
-    <w:p>
-      <w:pPr>
-        <w:spacing w:line="276" w:lineRule="auto"/>
-      </w:pPr>
-      <w:r>
-        <w:rPr>
-          <w:rFonts w:ascii="Arial" w:hAnsi="Arial"/>
-          <w:sz w:val="28"/>
-        </w:rPr>
-        <w:t xml:space="preserve">Settings needs password protection.</w:t>
+        <w:t xml:space="preserve">Banner housing onto the bits, both pieces, and Siri out of sight,</w:t>
+      </w:r>
+    </w:p>
+    <w:p>
+      <w:pPr>
+        <w:spacing w:line="276" w:lineRule="auto"/>
+      </w:pPr>
+      <w:r>
+        <w:rPr>
+          <w:rFonts w:ascii="Arial" w:hAnsi="Arial"/>
+          <w:sz w:val="28"/>
+        </w:rPr>
+        <w:t xml:space="preserve">were built at #87-new. Not on the phone.</w:t>
       </w:r>
     </w:p>
     <w:p>
@@ -529,19 +505,7 @@
           <w:rFonts w:ascii="Arial" w:hAnsi="Arial"/>
           <w:sz w:val="28"/>
         </w:rPr>
-        <w:t xml:space="preserve">The second new page is not yet named. Day-roll lock still wants a</w:t>
-      </w:r>
-    </w:p>
-    <w:p>
-      <w:pPr>
-        <w:spacing w:line="276" w:lineRule="auto"/>
-      </w:pPr>
-      <w:r>
-        <w:rPr>
-          <w:rFonts w:ascii="Arial" w:hAnsi="Arial"/>
-          <w:sz w:val="28"/>
-        </w:rPr>
-        <w:t xml:space="preserve">night of all-green Daily on this load.</w:t>
+        <w:t xml:space="preserve">Day-roll lock still wants a night of all-green Daily on this load.</w:t>
       </w:r>
     </w:p>
     <w:p>
@@ -770,7 +734,7 @@
           <w:rFonts w:ascii="Arial" w:hAnsi="Arial"/>
           <w:sz w:val="28"/>
         </w:rPr>
-        <w:t xml:space="preserve">    banner housing. Home and Settings are not in that piece.</w:t>
+        <w:t xml:space="preserve">    banner housing. Home and Help are in that piece. Settings is not.</w:t>
       </w:r>
     </w:p>
     <w:p>
@@ -1731,19 +1695,7 @@
           <w:rFonts w:ascii="Arial" w:hAnsi="Arial"/>
           <w:sz w:val="28"/>
         </w:rPr>
-        <w:t xml:space="preserve">    Patrick a design question. This sitting wrote the machinery, each</w:t>
-      </w:r>
-    </w:p>
-    <w:p>
-      <w:pPr>
-        <w:spacing w:line="276" w:lineRule="auto"/>
-      </w:pPr>
-      <w:r>
-        <w:rPr>
-          <w:rFonts w:ascii="Arial" w:hAnsi="Arial"/>
-          <w:sz w:val="28"/>
-        </w:rPr>
-        <w:t xml:space="preserve">    kind, Daily on the shared list, and the banner housing.</w:t>
+        <w:t xml:space="preserve">    Patrick a design question. Home and Help are in that file.</w:t>
       </w:r>
     </w:p>
     <w:p>
@@ -1864,6 +1816,270 @@
           <w:rFonts w:ascii="Arial" w:hAnsi="Arial"/>
           <w:sz w:val="28"/>
         </w:rPr>
+        <w:t xml:space="preserve">77. #88-new — Help in the designed implementation. No sheet. The</w:t>
+      </w:r>
+    </w:p>
+    <w:p>
+      <w:pPr>
+        <w:spacing w:line="276" w:lineRule="auto"/>
+      </w:pPr>
+      <w:r>
+        <w:rPr>
+          <w:rFonts w:ascii="Arial" w:hAnsi="Arial"/>
+          <w:sz w:val="28"/>
+        </w:rPr>
+        <w:t xml:space="preserve">   “does not” lines stay: a sitting that built Help would need them.</w:t>
+      </w:r>
+    </w:p>
+    <w:p>
+      <w:pPr>
+        <w:spacing w:line="276" w:lineRule="auto"/>
+      </w:pPr>
+      <w:r>
+        <w:rPr>
+          <w:rFonts w:ascii="Arial" w:hAnsi="Arial"/>
+          <w:sz w:val="28"/>
+        </w:rPr>
+        <w:t xml:space="preserve">   Engine not touched.</w:t>
+      </w:r>
+    </w:p>
+    <w:p>
+      <w:pPr>
+        <w:spacing w:line="276" w:lineRule="auto"/>
+      </w:pPr>
+      <w:r>
+        <w:rPr>
+          <w:rFonts w:ascii="Arial" w:hAnsi="Arial"/>
+          <w:sz w:val="28"/>
+        </w:rPr>
+        <w:t xml:space="preserve"/>
+      </w:r>
+    </w:p>
+    <w:p>
+      <w:pPr>
+        <w:spacing w:line="276" w:lineRule="auto"/>
+      </w:pPr>
+      <w:r>
+        <w:rPr>
+          <w:rFonts w:ascii="Arial" w:hAnsi="Arial"/>
+          <w:sz w:val="28"/>
+        </w:rPr>
+        <w:t xml:space="preserve">76. #88-new — Home. Badges move the iOS way (hold, Edit Home Screen,</w:t>
+      </w:r>
+    </w:p>
+    <w:p>
+      <w:pPr>
+        <w:spacing w:line="276" w:lineRule="auto"/>
+      </w:pPr>
+      <w:r>
+        <w:rPr>
+          <w:rFonts w:ascii="Arial" w:hAnsi="Arial"/>
+          <w:sz w:val="28"/>
+        </w:rPr>
+        <w:t xml:space="preserve">   slide, Done). Options is not on the grid; + OPT on an item is the</w:t>
+      </w:r>
+    </w:p>
+    <w:p>
+      <w:pPr>
+        <w:spacing w:line="276" w:lineRule="auto"/>
+      </w:pPr>
+      <w:r>
+        <w:rPr>
+          <w:rFonts w:ascii="Arial" w:hAnsi="Arial"/>
+          <w:sz w:val="28"/>
+        </w:rPr>
+        <w:t xml:space="preserve">   door. Gear stays. TypeScript clean. Engine not touched. Not on the</w:t>
+      </w:r>
+    </w:p>
+    <w:p>
+      <w:pPr>
+        <w:spacing w:line="276" w:lineRule="auto"/>
+      </w:pPr>
+      <w:r>
+        <w:rPr>
+          <w:rFonts w:ascii="Arial" w:hAnsi="Arial"/>
+          <w:sz w:val="28"/>
+        </w:rPr>
+        <w:t xml:space="preserve">   phone.</w:t>
+      </w:r>
+    </w:p>
+    <w:p>
+      <w:pPr>
+        <w:spacing w:line="276" w:lineRule="auto"/>
+      </w:pPr>
+      <w:r>
+        <w:rPr>
+          <w:rFonts w:ascii="Arial" w:hAnsi="Arial"/>
+          <w:sz w:val="28"/>
+        </w:rPr>
+        <w:t xml:space="preserve"/>
+      </w:r>
+    </w:p>
+    <w:p>
+      <w:pPr>
+        <w:spacing w:line="276" w:lineRule="auto"/>
+      </w:pPr>
+      <w:r>
+        <w:rPr>
+          <w:rFonts w:ascii="Arial" w:hAnsi="Arial"/>
+          <w:sz w:val="28"/>
+        </w:rPr>
+        <w:t xml:space="preserve">75. #87-new — Siri out of sight. Shortcuts and Siri phrases offered</w:t>
+      </w:r>
+    </w:p>
+    <w:p>
+      <w:pPr>
+        <w:spacing w:line="276" w:lineRule="auto"/>
+      </w:pPr>
+      <w:r>
+        <w:rPr>
+          <w:rFonts w:ascii="Arial" w:hAnsi="Arial"/>
+          <w:sz w:val="28"/>
+        </w:rPr>
+        <w:t xml:space="preserve">   no more. Intent, plugin, shared box, and note path stay. Native</w:t>
+      </w:r>
+    </w:p>
+    <w:p>
+      <w:pPr>
+        <w:spacing w:line="276" w:lineRule="auto"/>
+      </w:pPr>
+      <w:r>
+        <w:rPr>
+          <w:rFonts w:ascii="Arial" w:hAnsi="Arial"/>
+          <w:sz w:val="28"/>
+        </w:rPr>
+        <w:t xml:space="preserve">   rebuild needed. TypeScript clean. Engine not touched. Not on the</w:t>
+      </w:r>
+    </w:p>
+    <w:p>
+      <w:pPr>
+        <w:spacing w:line="276" w:lineRule="auto"/>
+      </w:pPr>
+      <w:r>
+        <w:rPr>
+          <w:rFonts w:ascii="Arial" w:hAnsi="Arial"/>
+          <w:sz w:val="28"/>
+        </w:rPr>
+        <w:t xml:space="preserve">   phone.</w:t>
+      </w:r>
+    </w:p>
+    <w:p>
+      <w:pPr>
+        <w:spacing w:line="276" w:lineRule="auto"/>
+      </w:pPr>
+      <w:r>
+        <w:rPr>
+          <w:rFonts w:ascii="Arial" w:hAnsi="Arial"/>
+          <w:sz w:val="28"/>
+        </w:rPr>
+        <w:t xml:space="preserve"/>
+      </w:r>
+    </w:p>
+    <w:p>
+      <w:pPr>
+        <w:spacing w:line="276" w:lineRule="auto"/>
+      </w:pPr>
+      <w:r>
+        <w:rPr>
+          <w:rFonts w:ascii="Arial" w:hAnsi="Arial"/>
+          <w:sz w:val="28"/>
+        </w:rPr>
+        <w:t xml:space="preserve">74. #87-new — banner-housing housing. Done, Skip, delay, and tap load</w:t>
+      </w:r>
+    </w:p>
+    <w:p>
+      <w:pPr>
+        <w:spacing w:line="276" w:lineRule="auto"/>
+      </w:pPr>
+      <w:r>
+        <w:rPr>
+          <w:rFonts w:ascii="Arial" w:hAnsi="Arial"/>
+          <w:sz w:val="28"/>
+        </w:rPr>
+        <w:t xml:space="preserve">   by id. One Time has Daily's buttons. TypeScript clean. Engine not</w:t>
+      </w:r>
+    </w:p>
+    <w:p>
+      <w:pPr>
+        <w:spacing w:line="276" w:lineRule="auto"/>
+      </w:pPr>
+      <w:r>
+        <w:rPr>
+          <w:rFonts w:ascii="Arial" w:hAnsi="Arial"/>
+          <w:sz w:val="28"/>
+        </w:rPr>
+        <w:t xml:space="preserve">   touched. Not on the phone.</w:t>
+      </w:r>
+    </w:p>
+    <w:p>
+      <w:pPr>
+        <w:spacing w:line="276" w:lineRule="auto"/>
+      </w:pPr>
+      <w:r>
+        <w:rPr>
+          <w:rFonts w:ascii="Arial" w:hAnsi="Arial"/>
+          <w:sz w:val="28"/>
+        </w:rPr>
+        <w:t xml:space="preserve"/>
+      </w:r>
+    </w:p>
+    <w:p>
+      <w:pPr>
+        <w:spacing w:line="276" w:lineRule="auto"/>
+      </w:pPr>
+      <w:r>
+        <w:rPr>
+          <w:rFonts w:ascii="Arial" w:hAnsi="Arial"/>
+          <w:sz w:val="28"/>
+        </w:rPr>
+        <w:t xml:space="preserve">73. #87-new — banner-housing door. Done and the log write live in</w:t>
+      </w:r>
+    </w:p>
+    <w:p>
+      <w:pPr>
+        <w:spacing w:line="276" w:lineRule="auto"/>
+      </w:pPr>
+      <w:r>
+        <w:rPr>
+          <w:rFonts w:ascii="Arial" w:hAnsi="Arial"/>
+          <w:sz w:val="28"/>
+        </w:rPr>
+        <w:t xml:space="preserve">   reminder-items. The shared list calls that door. Housing waits.</w:t>
+      </w:r>
+    </w:p>
+    <w:p>
+      <w:pPr>
+        <w:spacing w:line="276" w:lineRule="auto"/>
+      </w:pPr>
+      <w:r>
+        <w:rPr>
+          <w:rFonts w:ascii="Arial" w:hAnsi="Arial"/>
+          <w:sz w:val="28"/>
+        </w:rPr>
+        <w:t xml:space="preserve">   TypeScript clean. Engine not touched. Not on the phone.</w:t>
+      </w:r>
+    </w:p>
+    <w:p>
+      <w:pPr>
+        <w:spacing w:line="276" w:lineRule="auto"/>
+      </w:pPr>
+      <w:r>
+        <w:rPr>
+          <w:rFonts w:ascii="Arial" w:hAnsi="Arial"/>
+          <w:sz w:val="28"/>
+        </w:rPr>
+        <w:t xml:space="preserve"/>
+      </w:r>
+    </w:p>
+    <w:p>
+      <w:pPr>
+        <w:spacing w:line="276" w:lineRule="auto"/>
+      </w:pPr>
+      <w:r>
+        <w:rPr>
+          <w:rFonts w:ascii="Arial" w:hAnsi="Arial"/>
+          <w:sz w:val="28"/>
+        </w:rPr>
         <w:t xml:space="preserve">72. #84-new — Daily onto the shared list. app/daily.tsx is the same</w:t>
       </w:r>
     </w:p>
@@ -5683,6 +5899,30 @@
           <w:sz w:val="28"/>
         </w:rPr>
         <w:t xml:space="preserve">   top of arming ahead, never underneath.</w:t>
+      </w:r>
+    </w:p>
+    <w:p>
+      <w:pPr>
+        <w:spacing w:line="276" w:lineRule="auto"/>
+      </w:pPr>
+      <w:r>
+        <w:rPr>
+          <w:rFonts w:ascii="Arial" w:hAnsi="Arial"/>
+          <w:sz w:val="28"/>
+        </w:rPr>
+        <w:t xml:space="preserve">4. Settings password protection — moved here at #88-new (was with</w:t>
+      </w:r>
+    </w:p>
+    <w:p>
+      <w:pPr>
+        <w:spacing w:line="276" w:lineRule="auto"/>
+      </w:pPr>
+      <w:r>
+        <w:rPr>
+          <w:rFonts w:ascii="Arial" w:hAnsi="Arial"/>
+          <w:sz w:val="28"/>
+        </w:rPr>
+        <w:t xml:space="preserve">   the #84-new Home ideas). Not being done now.</w:t>
       </w:r>
     </w:p>
     <w:p>

</xml_diff>

<commit_message>
90-new - Memory - The exclusive groups are in.
</commit_message>
<xml_diff>
--- a/docs/pending.docx
+++ b/docs/pending.docx
@@ -24,7 +24,7 @@
           <w:rFonts w:ascii="Arial" w:hAnsi="Arial"/>
           <w:sz w:val="28"/>
         </w:rPr>
-        <w:t xml:space="preserve">Last updated: 2026-09-08 (#88-new)</w:t>
+        <w:t xml:space="preserve">Last updated: 2026-09-08 (#90-new)</w:t>
       </w:r>
     </w:p>
     <w:p>
@@ -385,31 +385,67 @@
           <w:rFonts w:ascii="Arial" w:hAnsi="Arial"/>
           <w:sz w:val="28"/>
         </w:rPr>
-        <w:t xml:space="preserve">Next sitting: the next bite of the designed implementation</w:t>
-      </w:r>
-    </w:p>
-    <w:p>
-      <w:pPr>
-        <w:spacing w:line="276" w:lineRule="auto"/>
-      </w:pPr>
-      <w:r>
-        <w:rPr>
-          <w:rFonts w:ascii="Arial" w:hAnsi="Arial"/>
-          <w:sz w:val="28"/>
-        </w:rPr>
-        <w:t xml:space="preserve">(Patrick, #88-new close). One bite at a time. Home and Help are in</w:t>
-      </w:r>
-    </w:p>
-    <w:p>
-      <w:pPr>
-        <w:spacing w:line="276" w:lineRule="auto"/>
-      </w:pPr>
-      <w:r>
-        <w:rPr>
-          <w:rFonts w:ascii="Arial" w:hAnsi="Arial"/>
-          <w:sz w:val="28"/>
-        </w:rPr>
-        <w:t xml:space="preserve">docs/designed-implementation.md. Do not change the engine.</w:t>
+        <w:t xml:space="preserve">#90-new is closed. Exclusive groups, Done's three-word code, and</w:t>
+      </w:r>
+    </w:p>
+    <w:p>
+      <w:pPr>
+        <w:spacing w:line="276" w:lineRule="auto"/>
+      </w:pPr>
+      <w:r>
+        <w:rPr>
+          <w:rFonts w:ascii="Arial" w:hAnsi="Arial"/>
+          <w:sz w:val="28"/>
+        </w:rPr>
+        <w:t xml:space="preserve">the Quarterly step are on the translator's table. Next sitting is</w:t>
+      </w:r>
+    </w:p>
+    <w:p>
+      <w:pPr>
+        <w:spacing w:line="276" w:lineRule="auto"/>
+      </w:pPr>
+      <w:r>
+        <w:rPr>
+          <w:rFonts w:ascii="Arial" w:hAnsi="Arial"/>
+          <w:sz w:val="28"/>
+        </w:rPr>
+        <w:t xml:space="preserve">not named. Do not change the scheduler's decisions.</w:t>
+      </w:r>
+    </w:p>
+    <w:p>
+      <w:pPr>
+        <w:spacing w:line="276" w:lineRule="auto"/>
+      </w:pPr>
+      <w:r>
+        <w:rPr>
+          <w:rFonts w:ascii="Arial" w:hAnsi="Arial"/>
+          <w:sz w:val="28"/>
+        </w:rPr>
+        <w:t xml:space="preserve">Home, Help, Calendar, Settings, Backup, Scheduled Reminders,</w:t>
+      </w:r>
+    </w:p>
+    <w:p>
+      <w:pPr>
+        <w:spacing w:line="276" w:lineRule="auto"/>
+      </w:pPr>
+      <w:r>
+        <w:rPr>
+          <w:rFonts w:ascii="Arial" w:hAnsi="Arial"/>
+          <w:sz w:val="28"/>
+        </w:rPr>
+        <w:t xml:space="preserve">and Options are in docs/designed-implementation.md. A</w:t>
+      </w:r>
+    </w:p>
+    <w:p>
+      <w:pPr>
+        <w:spacing w:line="276" w:lineRule="auto"/>
+      </w:pPr>
+      <w:r>
+        <w:rPr>
+          <w:rFonts w:ascii="Arial" w:hAnsi="Arial"/>
+          <w:sz w:val="28"/>
+        </w:rPr>
+        <w:t xml:space="preserve">Settings password stays nice-to-have.</w:t>
       </w:r>
     </w:p>
     <w:p>
@@ -734,7 +770,31 @@
           <w:rFonts w:ascii="Arial" w:hAnsi="Arial"/>
           <w:sz w:val="28"/>
         </w:rPr>
-        <w:t xml:space="preserve">    banner housing. Home and Help are in that piece. Settings is not.</w:t>
+        <w:t xml:space="preserve">    banner housing. Home, Help, Calendar, Settings, Backup, Scheduled</w:t>
+      </w:r>
+    </w:p>
+    <w:p>
+      <w:pPr>
+        <w:spacing w:line="276" w:lineRule="auto"/>
+      </w:pPr>
+      <w:r>
+        <w:rPr>
+          <w:rFonts w:ascii="Arial" w:hAnsi="Arial"/>
+          <w:sz w:val="28"/>
+        </w:rPr>
+        <w:t xml:space="preserve">    Reminders, and Options are in that piece. A Settings password is</w:t>
+      </w:r>
+    </w:p>
+    <w:p>
+      <w:pPr>
+        <w:spacing w:line="276" w:lineRule="auto"/>
+      </w:pPr>
+      <w:r>
+        <w:rPr>
+          <w:rFonts w:ascii="Arial" w:hAnsi="Arial"/>
+          <w:sz w:val="28"/>
+        </w:rPr>
+        <w:t xml:space="preserve">    not.</w:t>
       </w:r>
     </w:p>
     <w:p>
@@ -1695,7 +1755,19 @@
           <w:rFonts w:ascii="Arial" w:hAnsi="Arial"/>
           <w:sz w:val="28"/>
         </w:rPr>
-        <w:t xml:space="preserve">    Patrick a design question. Home and Help are in that file.</w:t>
+        <w:t xml:space="preserve">    Patrick a design question. Home, Help, Calendar, Settings, Backup,</w:t>
+      </w:r>
+    </w:p>
+    <w:p>
+      <w:pPr>
+        <w:spacing w:line="276" w:lineRule="auto"/>
+      </w:pPr>
+      <w:r>
+        <w:rPr>
+          <w:rFonts w:ascii="Arial" w:hAnsi="Arial"/>
+          <w:sz w:val="28"/>
+        </w:rPr>
+        <w:t xml:space="preserve">    Scheduled Reminders, and Options are in that file.</w:t>
       </w:r>
     </w:p>
     <w:p>
@@ -1793,6 +1865,366 @@
           <w:sz w:val="28"/>
         </w:rPr>
         <w:t xml:space="preserve">docs/handoff-history.md.</w:t>
+      </w:r>
+    </w:p>
+    <w:p>
+      <w:pPr>
+        <w:spacing w:line="276" w:lineRule="auto"/>
+      </w:pPr>
+      <w:r>
+        <w:rPr>
+          <w:rFonts w:ascii="Arial" w:hAnsi="Arial"/>
+          <w:sz w:val="28"/>
+        </w:rPr>
+        <w:t xml:space="preserve"/>
+      </w:r>
+    </w:p>
+    <w:p>
+      <w:pPr>
+        <w:spacing w:line="276" w:lineRule="auto"/>
+      </w:pPr>
+      <w:r>
+        <w:rPr>
+          <w:rFonts w:ascii="Arial" w:hAnsi="Arial"/>
+          <w:sz w:val="28"/>
+        </w:rPr>
+        <w:t xml:space="preserve">85. #90-new — Quarterly step on the translator's table. none, days30,</w:t>
+      </w:r>
+    </w:p>
+    <w:p>
+      <w:pPr>
+        <w:spacing w:line="276" w:lineRule="auto"/>
+      </w:pPr>
+      <w:r>
+        <w:rPr>
+          <w:rFonts w:ascii="Arial" w:hAnsi="Arial"/>
+          <w:sz w:val="28"/>
+        </w:rPr>
+        <w:t xml:space="preserve">   days60, days90. Chips and Done read the named set. Scheduler</w:t>
+      </w:r>
+    </w:p>
+    <w:p>
+      <w:pPr>
+        <w:spacing w:line="276" w:lineRule="auto"/>
+      </w:pPr>
+      <w:r>
+        <w:rPr>
+          <w:rFonts w:ascii="Arial" w:hAnsi="Arial"/>
+          <w:sz w:val="28"/>
+        </w:rPr>
+        <w:t xml:space="preserve">   decisions unchanged.</w:t>
+      </w:r>
+    </w:p>
+    <w:p>
+      <w:pPr>
+        <w:spacing w:line="276" w:lineRule="auto"/>
+      </w:pPr>
+      <w:r>
+        <w:rPr>
+          <w:rFonts w:ascii="Arial" w:hAnsi="Arial"/>
+          <w:sz w:val="28"/>
+        </w:rPr>
+        <w:t xml:space="preserve"/>
+      </w:r>
+    </w:p>
+    <w:p>
+      <w:pPr>
+        <w:spacing w:line="276" w:lineRule="auto"/>
+      </w:pPr>
+      <w:r>
+        <w:rPr>
+          <w:rFonts w:ascii="Arial" w:hAnsi="Arial"/>
+          <w:sz w:val="28"/>
+        </w:rPr>
+        <w:t xml:space="preserve">84. #90-new — exclusive groups and Done's three words on the translator's</w:t>
+      </w:r>
+    </w:p>
+    <w:p>
+      <w:pPr>
+        <w:spacing w:line="276" w:lineRule="auto"/>
+      </w:pPr>
+      <w:r>
+        <w:rPr>
+          <w:rFonts w:ascii="Arial" w:hAnsi="Arial"/>
+          <w:sz w:val="28"/>
+        </w:rPr>
+        <w:t xml:space="preserve">   table. Second Thursday / Wednesday after: only one true. Done is</w:t>
+      </w:r>
+    </w:p>
+    <w:p>
+      <w:pPr>
+        <w:spacing w:line="276" w:lineRule="auto"/>
+      </w:pPr>
+      <w:r>
+        <w:rPr>
+          <w:rFonts w:ascii="Arial" w:hAnsi="Arial"/>
+          <w:sz w:val="28"/>
+        </w:rPr>
+        <w:t xml:space="preserve">   thisCycle, advanceDate, endItem. Scheduler decisions unchanged.</w:t>
+      </w:r>
+    </w:p>
+    <w:p>
+      <w:pPr>
+        <w:spacing w:line="276" w:lineRule="auto"/>
+      </w:pPr>
+      <w:r>
+        <w:rPr>
+          <w:rFonts w:ascii="Arial" w:hAnsi="Arial"/>
+          <w:sz w:val="28"/>
+        </w:rPr>
+        <w:t xml:space="preserve"/>
+      </w:r>
+    </w:p>
+    <w:p>
+      <w:pPr>
+        <w:spacing w:line="276" w:lineRule="auto"/>
+      </w:pPr>
+      <w:r>
+        <w:rPr>
+          <w:rFonts w:ascii="Arial" w:hAnsi="Arial"/>
+          <w:sz w:val="28"/>
+        </w:rPr>
+        <w:t xml:space="preserve">83. #90-new — banner instruction already once at the top of the app.</w:t>
+      </w:r>
+    </w:p>
+    <w:p>
+      <w:pPr>
+        <w:spacing w:line="276" w:lineRule="auto"/>
+      </w:pPr>
+      <w:r>
+        <w:rPr>
+          <w:rFonts w:ascii="Arial" w:hAnsi="Arial"/>
+          <w:sz w:val="28"/>
+        </w:rPr>
+        <w:t xml:space="preserve">   The eight old page copies are gone. The leftover open line came off.</w:t>
+      </w:r>
+    </w:p>
+    <w:p>
+      <w:pPr>
+        <w:spacing w:line="276" w:lineRule="auto"/>
+      </w:pPr>
+      <w:r>
+        <w:rPr>
+          <w:rFonts w:ascii="Arial" w:hAnsi="Arial"/>
+          <w:sz w:val="28"/>
+        </w:rPr>
+        <w:t xml:space="preserve"/>
+      </w:r>
+    </w:p>
+    <w:p>
+      <w:pPr>
+        <w:spacing w:line="276" w:lineRule="auto"/>
+      </w:pPr>
+      <w:r>
+        <w:rPr>
+          <w:rFonts w:ascii="Arial" w:hAnsi="Arial"/>
+          <w:sz w:val="28"/>
+        </w:rPr>
+        <w:t xml:space="preserve">82. #89-new — Options in the designed implementation. + OPT on the</w:t>
+      </w:r>
+    </w:p>
+    <w:p>
+      <w:pPr>
+        <w:spacing w:line="276" w:lineRule="auto"/>
+      </w:pPr>
+      <w:r>
+        <w:rPr>
+          <w:rFonts w:ascii="Arial" w:hAnsi="Arial"/>
+          <w:sz w:val="28"/>
+        </w:rPr>
+        <w:t xml:space="preserve">   item form. Last monthly pattern stays. Spec only. Engine not</w:t>
+      </w:r>
+    </w:p>
+    <w:p>
+      <w:pPr>
+        <w:spacing w:line="276" w:lineRule="auto"/>
+      </w:pPr>
+      <w:r>
+        <w:rPr>
+          <w:rFonts w:ascii="Arial" w:hAnsi="Arial"/>
+          <w:sz w:val="28"/>
+        </w:rPr>
+        <w:t xml:space="preserve">   touched.</w:t>
+      </w:r>
+    </w:p>
+    <w:p>
+      <w:pPr>
+        <w:spacing w:line="276" w:lineRule="auto"/>
+      </w:pPr>
+      <w:r>
+        <w:rPr>
+          <w:rFonts w:ascii="Arial" w:hAnsi="Arial"/>
+          <w:sz w:val="28"/>
+        </w:rPr>
+        <w:t xml:space="preserve"/>
+      </w:r>
+    </w:p>
+    <w:p>
+      <w:pPr>
+        <w:spacing w:line="276" w:lineRule="auto"/>
+      </w:pPr>
+      <w:r>
+        <w:rPr>
+          <w:rFonts w:ascii="Arial" w:hAnsi="Arial"/>
+          <w:sz w:val="28"/>
+        </w:rPr>
+        <w:t xml:space="preserve">81. #89-new — Scheduled Reminders in the designed implementation.</w:t>
+      </w:r>
+    </w:p>
+    <w:p>
+      <w:pPr>
+        <w:spacing w:line="276" w:lineRule="auto"/>
+      </w:pPr>
+      <w:r>
+        <w:rPr>
+          <w:rFonts w:ascii="Arial" w:hAnsi="Arial"/>
+          <w:sz w:val="28"/>
+        </w:rPr>
+        <w:t xml:space="preserve">   Phone holding, not the saved list. Time not known stays. Spec only.</w:t>
+      </w:r>
+    </w:p>
+    <w:p>
+      <w:pPr>
+        <w:spacing w:line="276" w:lineRule="auto"/>
+      </w:pPr>
+      <w:r>
+        <w:rPr>
+          <w:rFonts w:ascii="Arial" w:hAnsi="Arial"/>
+          <w:sz w:val="28"/>
+        </w:rPr>
+        <w:t xml:space="preserve">   Engine not touched.</w:t>
+      </w:r>
+    </w:p>
+    <w:p>
+      <w:pPr>
+        <w:spacing w:line="276" w:lineRule="auto"/>
+      </w:pPr>
+      <w:r>
+        <w:rPr>
+          <w:rFonts w:ascii="Arial" w:hAnsi="Arial"/>
+          <w:sz w:val="28"/>
+        </w:rPr>
+        <w:t xml:space="preserve"/>
+      </w:r>
+    </w:p>
+    <w:p>
+      <w:pPr>
+        <w:spacing w:line="276" w:lineRule="auto"/>
+      </w:pPr>
+      <w:r>
+        <w:rPr>
+          <w:rFonts w:ascii="Arial" w:hAnsi="Arial"/>
+          <w:sz w:val="28"/>
+        </w:rPr>
+        <w:t xml:space="preserve">80. #89-new — Backup in the designed implementation. Choose Replace</w:t>
+      </w:r>
+    </w:p>
+    <w:p>
+      <w:pPr>
+        <w:spacing w:line="276" w:lineRule="auto"/>
+      </w:pPr>
+      <w:r>
+        <w:rPr>
+          <w:rFonts w:ascii="Arial" w:hAnsi="Arial"/>
+          <w:sz w:val="28"/>
+        </w:rPr>
+        <w:t xml:space="preserve">   or Merge first, then pick a file, then confirm. Spec only. Engine</w:t>
+      </w:r>
+    </w:p>
+    <w:p>
+      <w:pPr>
+        <w:spacing w:line="276" w:lineRule="auto"/>
+      </w:pPr>
+      <w:r>
+        <w:rPr>
+          <w:rFonts w:ascii="Arial" w:hAnsi="Arial"/>
+          <w:sz w:val="28"/>
+        </w:rPr>
+        <w:t xml:space="preserve">   not touched.</w:t>
+      </w:r>
+    </w:p>
+    <w:p>
+      <w:pPr>
+        <w:spacing w:line="276" w:lineRule="auto"/>
+      </w:pPr>
+      <w:r>
+        <w:rPr>
+          <w:rFonts w:ascii="Arial" w:hAnsi="Arial"/>
+          <w:sz w:val="28"/>
+        </w:rPr>
+        <w:t xml:space="preserve"/>
+      </w:r>
+    </w:p>
+    <w:p>
+      <w:pPr>
+        <w:spacing w:line="276" w:lineRule="auto"/>
+      </w:pPr>
+      <w:r>
+        <w:rPr>
+          <w:rFonts w:ascii="Arial" w:hAnsi="Arial"/>
+          <w:sz w:val="28"/>
+        </w:rPr>
+        <w:t xml:space="preserve">79. #89-new — Settings in the designed implementation. Gear from Home,</w:t>
+      </w:r>
+    </w:p>
+    <w:p>
+      <w:pPr>
+        <w:spacing w:line="276" w:lineRule="auto"/>
+      </w:pPr>
+      <w:r>
+        <w:rPr>
+          <w:rFonts w:ascii="Arial" w:hAnsi="Arial"/>
+          <w:sz w:val="28"/>
+        </w:rPr>
+        <w:t xml:space="preserve">   not a badge. Scheduled Reminders and Backup are doors off it. Spec</w:t>
+      </w:r>
+    </w:p>
+    <w:p>
+      <w:pPr>
+        <w:spacing w:line="276" w:lineRule="auto"/>
+      </w:pPr>
+      <w:r>
+        <w:rPr>
+          <w:rFonts w:ascii="Arial" w:hAnsi="Arial"/>
+          <w:sz w:val="28"/>
+        </w:rPr>
+        <w:t xml:space="preserve">   only. Engine not touched.</w:t>
+      </w:r>
+    </w:p>
+    <w:p>
+      <w:pPr>
+        <w:spacing w:line="276" w:lineRule="auto"/>
+      </w:pPr>
+      <w:r>
+        <w:rPr>
+          <w:rFonts w:ascii="Arial" w:hAnsi="Arial"/>
+          <w:sz w:val="28"/>
+        </w:rPr>
+        <w:t xml:space="preserve"/>
+      </w:r>
+    </w:p>
+    <w:p>
+      <w:pPr>
+        <w:spacing w:line="276" w:lineRule="auto"/>
+      </w:pPr>
+      <w:r>
+        <w:rPr>
+          <w:rFonts w:ascii="Arial" w:hAnsi="Arial"/>
+          <w:sz w:val="28"/>
+        </w:rPr>
+        <w:t xml:space="preserve">78. #89-new — Calendar in the designed implementation. Month view of</w:t>
+      </w:r>
+    </w:p>
+    <w:p>
+      <w:pPr>
+        <w:spacing w:line="276" w:lineRule="auto"/>
+      </w:pPr>
+      <w:r>
+        <w:rPr>
+          <w:rFonts w:ascii="Arial" w:hAnsi="Arial"/>
+          <w:sz w:val="28"/>
+        </w:rPr>
+        <w:t xml:space="preserve">   the one list, not a kind. Spec only. Engine not touched.</w:t>
       </w:r>
     </w:p>
     <w:p>

</xml_diff>

<commit_message>
97-new - Fixed remaining bugs found in the 4th evaluation, except 2. Also add Feedback and User Guide, and move Reset All Data to the header in Settings.
</commit_message>
<xml_diff>
--- a/docs/pending.docx
+++ b/docs/pending.docx
@@ -24,7 +24,7 @@
           <w:rFonts w:ascii="Arial" w:hAnsi="Arial"/>
           <w:sz w:val="28"/>
         </w:rPr>
-        <w:t xml:space="preserve">Last updated: 2026-09-08 (#90-new)</w:t>
+        <w:t xml:space="preserve">Last updated: 2026-09-09 (#97-new)</w:t>
       </w:r>
     </w:p>
     <w:p>
@@ -325,43 +325,67 @@
           <w:rFonts w:ascii="Arial" w:hAnsi="Arial"/>
           <w:sz w:val="28"/>
         </w:rPr>
-        <w:t xml:space="preserve">The design description of the whole app is the designed</w:t>
-      </w:r>
-    </w:p>
-    <w:p>
-      <w:pPr>
-        <w:spacing w:line="276" w:lineRule="auto"/>
-      </w:pPr>
-      <w:r>
-        <w:rPr>
-          <w:rFonts w:ascii="Arial" w:hAnsi="Arial"/>
-          <w:sz w:val="28"/>
-        </w:rPr>
-        <w:t xml:space="preserve">implementation (Patrick, #84-new). It is the guide. A sitting builds</w:t>
-      </w:r>
-    </w:p>
-    <w:p>
-      <w:pPr>
-        <w:spacing w:line="276" w:lineRule="auto"/>
-      </w:pPr>
-      <w:r>
-        <w:rPr>
-          <w:rFonts w:ascii="Arial" w:hAnsi="Arial"/>
-          <w:sz w:val="28"/>
-        </w:rPr>
-        <w:t xml:space="preserve">from docs/designed-implementation.md and does not ask Patrick a</w:t>
-      </w:r>
-    </w:p>
-    <w:p>
-      <w:pPr>
-        <w:spacing w:line="276" w:lineRule="auto"/>
-      </w:pPr>
-      <w:r>
-        <w:rPr>
-          <w:rFonts w:ascii="Arial" w:hAnsi="Arial"/>
-          <w:sz w:val="28"/>
-        </w:rPr>
-        <w:t xml:space="preserve">design question.</w:t>
+        <w:t xml:space="preserve">1. A BRIEF USER'S GUIDE IN THE APP (Patrick, #97-new). It is a tile</w:t>
+      </w:r>
+    </w:p>
+    <w:p>
+      <w:pPr>
+        <w:spacing w:line="276" w:lineRule="auto"/>
+      </w:pPr>
+      <w:r>
+        <w:rPr>
+          <w:rFonts w:ascii="Arial" w:hAnsi="Arial"/>
+          <w:sz w:val="28"/>
+        </w:rPr>
+        <w:t xml:space="preserve">   on Settings. A tap opens a brief guide that lives in the app. It</w:t>
+      </w:r>
+    </w:p>
+    <w:p>
+      <w:pPr>
+        <w:spacing w:line="276" w:lineRule="auto"/>
+      </w:pPr>
+      <w:r>
+        <w:rPr>
+          <w:rFonts w:ascii="Arial" w:hAnsi="Arial"/>
+          <w:sz w:val="28"/>
+        </w:rPr>
+        <w:t xml:space="preserve">   does not go on a website. The app is self-contained. A person's</w:t>
+      </w:r>
+    </w:p>
+    <w:p>
+      <w:pPr>
+        <w:spacing w:line="276" w:lineRule="auto"/>
+      </w:pPr>
+      <w:r>
+        <w:rPr>
+          <w:rFonts w:ascii="Arial" w:hAnsi="Arial"/>
+          <w:sz w:val="28"/>
+        </w:rPr>
+        <w:t xml:space="preserve">   data stays on the phone. The app does not reach out to read or</w:t>
+      </w:r>
+    </w:p>
+    <w:p>
+      <w:pPr>
+        <w:spacing w:line="276" w:lineRule="auto"/>
+      </w:pPr>
+      <w:r>
+        <w:rPr>
+          <w:rFonts w:ascii="Arial" w:hAnsi="Arial"/>
+          <w:sz w:val="28"/>
+        </w:rPr>
+        <w:t xml:space="preserve">   write from the outside world. What is already in App Store</w:t>
+      </w:r>
+    </w:p>
+    <w:p>
+      <w:pPr>
+        <w:spacing w:line="276" w:lineRule="auto"/>
+      </w:pPr>
+      <w:r>
+        <w:rPr>
+          <w:rFonts w:ascii="Arial" w:hAnsi="Arial"/>
+          <w:sz w:val="28"/>
+        </w:rPr>
+        <w:t xml:space="preserve">   Connect stays there. Not built.</w:t>
       </w:r>
     </w:p>
     <w:p>
@@ -385,67 +409,31 @@
           <w:rFonts w:ascii="Arial" w:hAnsi="Arial"/>
           <w:sz w:val="28"/>
         </w:rPr>
-        <w:t xml:space="preserve">#90-new is closed. Exclusive groups, Done's three-word code, and</w:t>
-      </w:r>
-    </w:p>
-    <w:p>
-      <w:pPr>
-        <w:spacing w:line="276" w:lineRule="auto"/>
-      </w:pPr>
-      <w:r>
-        <w:rPr>
-          <w:rFonts w:ascii="Arial" w:hAnsi="Arial"/>
-          <w:sz w:val="28"/>
-        </w:rPr>
-        <w:t xml:space="preserve">the Quarterly step are on the translator's table. Next sitting is</w:t>
-      </w:r>
-    </w:p>
-    <w:p>
-      <w:pPr>
-        <w:spacing w:line="276" w:lineRule="auto"/>
-      </w:pPr>
-      <w:r>
-        <w:rPr>
-          <w:rFonts w:ascii="Arial" w:hAnsi="Arial"/>
-          <w:sz w:val="28"/>
-        </w:rPr>
-        <w:t xml:space="preserve">not named. Do not change the scheduler's decisions.</w:t>
-      </w:r>
-    </w:p>
-    <w:p>
-      <w:pPr>
-        <w:spacing w:line="276" w:lineRule="auto"/>
-      </w:pPr>
-      <w:r>
-        <w:rPr>
-          <w:rFonts w:ascii="Arial" w:hAnsi="Arial"/>
-          <w:sz w:val="28"/>
-        </w:rPr>
-        <w:t xml:space="preserve">Home, Help, Calendar, Settings, Backup, Scheduled Reminders,</w:t>
-      </w:r>
-    </w:p>
-    <w:p>
-      <w:pPr>
-        <w:spacing w:line="276" w:lineRule="auto"/>
-      </w:pPr>
-      <w:r>
-        <w:rPr>
-          <w:rFonts w:ascii="Arial" w:hAnsi="Arial"/>
-          <w:sz w:val="28"/>
-        </w:rPr>
-        <w:t xml:space="preserve">and Options are in docs/designed-implementation.md. A</w:t>
-      </w:r>
-    </w:p>
-    <w:p>
-      <w:pPr>
-        <w:spacing w:line="276" w:lineRule="auto"/>
-      </w:pPr>
-      <w:r>
-        <w:rPr>
-          <w:rFonts w:ascii="Arial" w:hAnsi="Arial"/>
-          <w:sz w:val="28"/>
-        </w:rPr>
-        <w:t xml:space="preserve">Settings password stays nice-to-have.</w:t>
+        <w:t xml:space="preserve">2. DAY-ROLL LOCK still wants a night of all-green Daily on this</w:t>
+      </w:r>
+    </w:p>
+    <w:p>
+      <w:pPr>
+        <w:spacing w:line="276" w:lineRule="auto"/>
+      </w:pPr>
+      <w:r>
+        <w:rPr>
+          <w:rFonts w:ascii="Arial" w:hAnsi="Arial"/>
+          <w:sz w:val="28"/>
+        </w:rPr>
+        <w:t xml:space="preserve">   load, then a morning open on a new load, to confirm the pop-up</w:t>
+      </w:r>
+    </w:p>
+    <w:p>
+      <w:pPr>
+        <w:spacing w:line="276" w:lineRule="auto"/>
+      </w:pPr>
+      <w:r>
+        <w:rPr>
+          <w:rFonts w:ascii="Arial" w:hAnsi="Arial"/>
+          <w:sz w:val="28"/>
+        </w:rPr>
+        <w:t xml:space="preserve">   stays quiet.</w:t>
       </w:r>
     </w:p>
     <w:p>
@@ -469,30 +457,6 @@
           <w:rFonts w:ascii="Arial" w:hAnsi="Arial"/>
           <w:sz w:val="28"/>
         </w:rPr>
-        <w:t xml:space="preserve">Home was built at #88-new: badges move the iOS way; Options is not on</w:t>
-      </w:r>
-    </w:p>
-    <w:p>
-      <w:pPr>
-        <w:spacing w:line="276" w:lineRule="auto"/>
-      </w:pPr>
-      <w:r>
-        <w:rPr>
-          <w:rFonts w:ascii="Arial" w:hAnsi="Arial"/>
-          <w:sz w:val="28"/>
-        </w:rPr>
-        <w:t xml:space="preserve">the grid. Help is in the spec. Not on the phone.</w:t>
-      </w:r>
-    </w:p>
-    <w:p>
-      <w:pPr>
-        <w:spacing w:line="276" w:lineRule="auto"/>
-      </w:pPr>
-      <w:r>
-        <w:rPr>
-          <w:rFonts w:ascii="Arial" w:hAnsi="Arial"/>
-          <w:sz w:val="28"/>
-        </w:rPr>
         <w:t xml:space="preserve"/>
       </w:r>
     </w:p>
@@ -503,21 +467,34 @@
       <w:r>
         <w:rPr>
           <w:rFonts w:ascii="Arial" w:hAnsi="Arial"/>
-          <w:sz w:val="28"/>
-        </w:rPr>
-        <w:t xml:space="preserve">Banner housing onto the bits, both pieces, and Siri out of sight,</w:t>
-      </w:r>
-    </w:p>
-    <w:p>
-      <w:pPr>
-        <w:spacing w:line="276" w:lineRule="auto"/>
-      </w:pPr>
-      <w:r>
-        <w:rPr>
-          <w:rFonts w:ascii="Arial" w:hAnsi="Arial"/>
-          <w:sz w:val="28"/>
-        </w:rPr>
-        <w:t xml:space="preserve">were built at #87-new. Not on the phone.</w:t>
+          <w:b/>
+          <w:sz w:val="28"/>
+        </w:rPr>
+        <w:t xml:space="preserve">PENDING</w:t>
+      </w:r>
+    </w:p>
+    <w:p>
+      <w:pPr>
+        <w:spacing w:line="276" w:lineRule="auto"/>
+      </w:pPr>
+      <w:r>
+        <w:rPr>
+          <w:rFonts w:ascii="Arial" w:hAnsi="Arial"/>
+          <w:sz w:val="28"/>
+        </w:rPr>
+        <w:t xml:space="preserve">------------------------------------------------------------------</w:t>
+      </w:r>
+    </w:p>
+    <w:p>
+      <w:pPr>
+        <w:spacing w:line="276" w:lineRule="auto"/>
+      </w:pPr>
+      <w:r>
+        <w:rPr>
+          <w:rFonts w:ascii="Arial" w:hAnsi="Arial"/>
+          <w:sz w:val="28"/>
+        </w:rPr>
+        <w:t xml:space="preserve">Things waiting on something — mostly on a build.</w:t>
       </w:r>
     </w:p>
     <w:p>
@@ -541,7 +518,199 @@
           <w:rFonts w:ascii="Arial" w:hAnsi="Arial"/>
           <w:sz w:val="28"/>
         </w:rPr>
-        <w:t xml:space="preserve">Day-roll lock still wants a night of all-green Daily on this load.</w:t>
+        <w:t xml:space="preserve">1. A THOROUGH DESIGN SPEC FOR THE APP (Patrick, #52-new). This</w:t>
+      </w:r>
+    </w:p>
+    <w:p>
+      <w:pPr>
+        <w:spacing w:line="276" w:lineRule="auto"/>
+      </w:pPr>
+      <w:r>
+        <w:rPr>
+          <w:rFonts w:ascii="Arial" w:hAnsi="Arial"/>
+          <w:sz w:val="28"/>
+        </w:rPr>
+        <w:t xml:space="preserve">    sitting treated One Time's missing notice at the set time as</w:t>
+      </w:r>
+    </w:p>
+    <w:p>
+      <w:pPr>
+        <w:spacing w:line="276" w:lineRule="auto"/>
+      </w:pPr>
+      <w:r>
+        <w:rPr>
+          <w:rFonts w:ascii="Arial" w:hAnsi="Arial"/>
+          <w:sz w:val="28"/>
+        </w:rPr>
+        <w:t xml:space="preserve">    a bug. He had decided it that way. A spec would have said so.</w:t>
+      </w:r>
+    </w:p>
+    <w:p>
+      <w:pPr>
+        <w:spacing w:line="276" w:lineRule="auto"/>
+      </w:pPr>
+      <w:r>
+        <w:rPr>
+          <w:rFonts w:ascii="Arial" w:hAnsi="Arial"/>
+          <w:sz w:val="28"/>
+        </w:rPr>
+        <w:t xml:space="preserve">    Changing the name of One Time to Appointments belongs in</w:t>
+      </w:r>
+    </w:p>
+    <w:p>
+      <w:pPr>
+        <w:spacing w:line="276" w:lineRule="auto"/>
+      </w:pPr>
+      <w:r>
+        <w:rPr>
+          <w:rFonts w:ascii="Arial" w:hAnsi="Arial"/>
+          <w:sz w:val="28"/>
+        </w:rPr>
+        <w:t xml:space="preserve">    that spec, and Extended to Bucket List. At #84-new the spec</w:t>
+      </w:r>
+    </w:p>
+    <w:p>
+      <w:pPr>
+        <w:spacing w:line="276" w:lineRule="auto"/>
+      </w:pPr>
+      <w:r>
+        <w:rPr>
+          <w:rFonts w:ascii="Arial" w:hAnsi="Arial"/>
+          <w:sz w:val="28"/>
+        </w:rPr>
+        <w:t xml:space="preserve">    is the designed implementation of the whole app: it is the</w:t>
+      </w:r>
+    </w:p>
+    <w:p>
+      <w:pPr>
+        <w:spacing w:line="276" w:lineRule="auto"/>
+      </w:pPr>
+      <w:r>
+        <w:rPr>
+          <w:rFonts w:ascii="Arial" w:hAnsi="Arial"/>
+          <w:sz w:val="28"/>
+        </w:rPr>
+        <w:t xml:space="preserve">    guide, and it replaces a separate layer of decisions and rules.</w:t>
+      </w:r>
+    </w:p>
+    <w:p>
+      <w:pPr>
+        <w:spacing w:line="276" w:lineRule="auto"/>
+      </w:pPr>
+      <w:r>
+        <w:rPr>
+          <w:rFonts w:ascii="Arial" w:hAnsi="Arial"/>
+          <w:sz w:val="28"/>
+        </w:rPr>
+        <w:t xml:space="preserve">    The first piece is docs/designed-implementation.md. This sitting</w:t>
+      </w:r>
+    </w:p>
+    <w:p>
+      <w:pPr>
+        <w:spacing w:line="276" w:lineRule="auto"/>
+      </w:pPr>
+      <w:r>
+        <w:rPr>
+          <w:rFonts w:ascii="Arial" w:hAnsi="Arial"/>
+          <w:sz w:val="28"/>
+        </w:rPr>
+        <w:t xml:space="preserve">    wrote the machinery, each kind, Daily on the shared list, and the</w:t>
+      </w:r>
+    </w:p>
+    <w:p>
+      <w:pPr>
+        <w:spacing w:line="276" w:lineRule="auto"/>
+      </w:pPr>
+      <w:r>
+        <w:rPr>
+          <w:rFonts w:ascii="Arial" w:hAnsi="Arial"/>
+          <w:sz w:val="28"/>
+        </w:rPr>
+        <w:t xml:space="preserve">    banner housing. Home, Help, Calendar, Settings, Backup, Scheduled</w:t>
+      </w:r>
+    </w:p>
+    <w:p>
+      <w:pPr>
+        <w:spacing w:line="276" w:lineRule="auto"/>
+      </w:pPr>
+      <w:r>
+        <w:rPr>
+          <w:rFonts w:ascii="Arial" w:hAnsi="Arial"/>
+          <w:sz w:val="28"/>
+        </w:rPr>
+        <w:t xml:space="preserve">    Reminders, Options, and Log are in that piece. A Settings password is</w:t>
+      </w:r>
+    </w:p>
+    <w:p>
+      <w:pPr>
+        <w:spacing w:line="276" w:lineRule="auto"/>
+      </w:pPr>
+      <w:r>
+        <w:rPr>
+          <w:rFonts w:ascii="Arial" w:hAnsi="Arial"/>
+          <w:sz w:val="28"/>
+        </w:rPr>
+        <w:t xml:space="preserve">    not.</w:t>
+      </w:r>
+    </w:p>
+    <w:p>
+      <w:pPr>
+        <w:spacing w:line="276" w:lineRule="auto"/>
+      </w:pPr>
+      <w:r>
+        <w:rPr>
+          <w:rFonts w:ascii="Arial" w:hAnsi="Arial"/>
+          <w:sz w:val="28"/>
+        </w:rPr>
+        <w:t xml:space="preserve">2. A FEEDBACK BUTTON IN THE APP, similar to Mystery (Patrick,</w:t>
+      </w:r>
+    </w:p>
+    <w:p>
+      <w:pPr>
+        <w:spacing w:line="276" w:lineRule="auto"/>
+      </w:pPr>
+      <w:r>
+        <w:rPr>
+          <w:rFonts w:ascii="Arial" w:hAnsi="Arial"/>
+          <w:sz w:val="28"/>
+        </w:rPr>
+        <w:t xml:space="preserve">    #52-new).</w:t>
+      </w:r>
+    </w:p>
+    <w:p>
+      <w:pPr>
+        <w:spacing w:line="276" w:lineRule="auto"/>
+      </w:pPr>
+      <w:r>
+        <w:rPr>
+          <w:rFonts w:ascii="Arial" w:hAnsi="Arial"/>
+          <w:sz w:val="28"/>
+        </w:rPr>
+        <w:t xml:space="preserve">3. A PAGE, SPEC, OR FILE FOR WHAT TESTING HAS COVERED AND</w:t>
+      </w:r>
+    </w:p>
+    <w:p>
+      <w:pPr>
+        <w:spacing w:line="276" w:lineRule="auto"/>
+      </w:pPr>
+      <w:r>
+        <w:rPr>
+          <w:rFonts w:ascii="Arial" w:hAnsi="Arial"/>
+          <w:sz w:val="28"/>
+        </w:rPr>
+        <w:t xml:space="preserve">   WILL COVER (Patrick, #52-new). The during-build tests are</w:t>
+      </w:r>
+    </w:p>
+    <w:p>
+      <w:pPr>
+        <w:spacing w:line="276" w:lineRule="auto"/>
+      </w:pPr>
+      <w:r>
+        <w:rPr>
+          <w:rFonts w:ascii="Arial" w:hAnsi="Arial"/>
+          <w:sz w:val="28"/>
+        </w:rPr>
+        <w:t xml:space="preserve">   thrown away. The run is not kept.</w:t>
       </w:r>
     </w:p>
     <w:p>
@@ -565,30 +734,6 @@
           <w:rFonts w:ascii="Arial" w:hAnsi="Arial"/>
           <w:sz w:val="28"/>
         </w:rPr>
-        <w:t xml:space="preserve">The phone is on the #82-new load. Spec, user guide, feedback button,</w:t>
-      </w:r>
-    </w:p>
-    <w:p>
-      <w:pPr>
-        <w:spacing w:line="276" w:lineRule="auto"/>
-      </w:pPr>
-      <w:r>
-        <w:rPr>
-          <w:rFonts w:ascii="Arial" w:hAnsi="Arial"/>
-          <w:sz w:val="28"/>
-        </w:rPr>
-        <w:t xml:space="preserve">and testing file are Pending 1–4.</w:t>
-      </w:r>
-    </w:p>
-    <w:p>
-      <w:pPr>
-        <w:spacing w:line="276" w:lineRule="auto"/>
-      </w:pPr>
-      <w:r>
-        <w:rPr>
-          <w:rFonts w:ascii="Arial" w:hAnsi="Arial"/>
-          <w:sz w:val="28"/>
-        </w:rPr>
         <w:t xml:space="preserve"/>
       </w:r>
     </w:p>
@@ -599,6 +744,55 @@
       <w:r>
         <w:rPr>
           <w:rFonts w:ascii="Arial" w:hAnsi="Arial"/>
+          <w:b/>
+          <w:sz w:val="28"/>
+        </w:rPr>
+        <w:t xml:space="preserve">FACTS THAT APPLY TO THE ONGOING WORK</w:t>
+      </w:r>
+    </w:p>
+    <w:p>
+      <w:pPr>
+        <w:spacing w:line="276" w:lineRule="auto"/>
+      </w:pPr>
+      <w:r>
+        <w:rPr>
+          <w:rFonts w:ascii="Arial" w:hAnsi="Arial"/>
+          <w:sz w:val="28"/>
+        </w:rPr>
+        <w:t xml:space="preserve">------------------------------------------------------------------</w:t>
+      </w:r>
+    </w:p>
+    <w:p>
+      <w:pPr>
+        <w:spacing w:line="276" w:lineRule="auto"/>
+      </w:pPr>
+      <w:r>
+        <w:rPr>
+          <w:rFonts w:ascii="Arial" w:hAnsi="Arial"/>
+          <w:sz w:val="28"/>
+        </w:rPr>
+        <w:t xml:space="preserve">Settled things worth having in front of you while the pages are</w:t>
+      </w:r>
+    </w:p>
+    <w:p>
+      <w:pPr>
+        <w:spacing w:line="276" w:lineRule="auto"/>
+      </w:pPr>
+      <w:r>
+        <w:rPr>
+          <w:rFonts w:ascii="Arial" w:hAnsi="Arial"/>
+          <w:sz w:val="28"/>
+        </w:rPr>
+        <w:t xml:space="preserve">built. None of these is a job to do.</w:t>
+      </w:r>
+    </w:p>
+    <w:p>
+      <w:pPr>
+        <w:spacing w:line="276" w:lineRule="auto"/>
+      </w:pPr>
+      <w:r>
+        <w:rPr>
+          <w:rFonts w:ascii="Arial" w:hAnsi="Arial"/>
           <w:sz w:val="28"/>
         </w:rPr>
         <w:t xml:space="preserve"/>
@@ -611,10 +805,814 @@
       <w:r>
         <w:rPr>
           <w:rFonts w:ascii="Arial" w:hAnsi="Arial"/>
+          <w:sz w:val="28"/>
+        </w:rPr>
+        <w:t xml:space="preserve">1. THE PAGES ARE NOT A REPLACEMENT FOR THE INPUT PAGE. The Input</w:t>
+      </w:r>
+    </w:p>
+    <w:p>
+      <w:pPr>
+        <w:spacing w:line="276" w:lineRule="auto"/>
+      </w:pPr>
+      <w:r>
+        <w:rPr>
+          <w:rFonts w:ascii="Arial" w:hAnsi="Arial"/>
+          <w:sz w:val="28"/>
+        </w:rPr>
+        <w:t xml:space="preserve">   page goes away and nothing replaces it — and the + Add popup in</w:t>
+      </w:r>
+    </w:p>
+    <w:p>
+      <w:pPr>
+        <w:spacing w:line="276" w:lineRule="auto"/>
+      </w:pPr>
+      <w:r>
+        <w:rPr>
+          <w:rFonts w:ascii="Arial" w:hAnsi="Arial"/>
+          <w:sz w:val="28"/>
+        </w:rPr>
+        <w:t xml:space="preserve">   particular is not its replacement. This is your own reminder</w:t>
+      </w:r>
+    </w:p>
+    <w:p>
+      <w:pPr>
+        <w:spacing w:line="276" w:lineRule="auto"/>
+      </w:pPr>
+      <w:r>
+        <w:rPr>
+          <w:rFonts w:ascii="Arial" w:hAnsi="Arial"/>
+          <w:sz w:val="28"/>
+        </w:rPr>
+        <w:t xml:space="preserve">   pages being reshaped by how often a thing comes round.</w:t>
+      </w:r>
+    </w:p>
+    <w:p>
+      <w:pPr>
+        <w:spacing w:line="276" w:lineRule="auto"/>
+      </w:pPr>
+      <w:r>
+        <w:rPr>
+          <w:rFonts w:ascii="Arial" w:hAnsi="Arial"/>
+          <w:sz w:val="28"/>
+        </w:rPr>
+        <w:t xml:space="preserve">2. + ADD ON A PAGE GOES TO THAT PAGE'S OWN NEW. Where does it</w:t>
+      </w:r>
+    </w:p>
+    <w:p>
+      <w:pPr>
+        <w:spacing w:line="276" w:lineRule="auto"/>
+      </w:pPr>
+      <w:r>
+        <w:rPr>
+          <w:rFonts w:ascii="Arial" w:hAnsi="Arial"/>
+          <w:sz w:val="28"/>
+        </w:rPr>
+        <w:t xml:space="preserve">   belong? is only on Options, from + Screen. You do not set</w:t>
+      </w:r>
+    </w:p>
+    <w:p>
+      <w:pPr>
+        <w:spacing w:line="276" w:lineRule="auto"/>
+      </w:pPr>
+      <w:r>
+        <w:rPr>
+          <w:rFonts w:ascii="Arial" w:hAnsi="Arial"/>
+          <w:sz w:val="28"/>
+        </w:rPr>
+        <w:t xml:space="preserve">   another page from a different page (#36-new).</w:t>
+      </w:r>
+    </w:p>
+    <w:p>
+      <w:pPr>
+        <w:spacing w:line="276" w:lineRule="auto"/>
+      </w:pPr>
+      <w:r>
+        <w:rPr>
+          <w:rFonts w:ascii="Arial" w:hAnsi="Arial"/>
+          <w:sz w:val="28"/>
+        </w:rPr>
+        <w:t xml:space="preserve">3. APPOINTMENTS CARRIES THE REMINDERS BEFORE CHIPS — 30 min., 1</w:t>
+      </w:r>
+    </w:p>
+    <w:p>
+      <w:pPr>
+        <w:spacing w:line="276" w:lineRule="auto"/>
+      </w:pPr>
+      <w:r>
+        <w:rPr>
+          <w:rFonts w:ascii="Arial" w:hAnsi="Arial"/>
+          <w:sz w:val="28"/>
+        </w:rPr>
+        <w:t xml:space="preserve">   hour, 2 hours, Morning of, Day Before, Night Before, 2 Days</w:t>
+      </w:r>
+    </w:p>
+    <w:p>
+      <w:pPr>
+        <w:spacing w:line="276" w:lineRule="auto"/>
+      </w:pPr>
+      <w:r>
+        <w:rPr>
+          <w:rFonts w:ascii="Arial" w:hAnsi="Arial"/>
+          <w:sz w:val="28"/>
+        </w:rPr>
+        <w:t xml:space="preserve">   Before, Week, Month — and any and all of them can be on at once.</w:t>
+      </w:r>
+    </w:p>
+    <w:p>
+      <w:pPr>
+        <w:spacing w:line="276" w:lineRule="auto"/>
+      </w:pPr>
+      <w:r>
+        <w:rPr>
+          <w:rFonts w:ascii="Arial" w:hAnsi="Arial"/>
+          <w:sz w:val="28"/>
+        </w:rPr>
+        <w:t xml:space="preserve">   They also remind at the set time, like the rest of the app</w:t>
+      </w:r>
+    </w:p>
+    <w:p>
+      <w:pPr>
+        <w:spacing w:line="276" w:lineRule="auto"/>
+      </w:pPr>
+      <w:r>
+        <w:rPr>
+          <w:rFonts w:ascii="Arial" w:hAnsi="Arial"/>
+          <w:sz w:val="28"/>
+        </w:rPr>
+        <w:t xml:space="preserve">   (Patrick, #74-new; reverses #52-new). The page</w:t>
+      </w:r>
+    </w:p>
+    <w:p>
+      <w:pPr>
+        <w:spacing w:line="276" w:lineRule="auto"/>
+      </w:pPr>
+      <w:r>
+        <w:rPr>
+          <w:rFonts w:ascii="Arial" w:hAnsi="Arial"/>
+          <w:sz w:val="28"/>
+        </w:rPr>
+        <w:t xml:space="preserve">   is called Appointments (#56-new; saved kind appointments, #65-new).</w:t>
+      </w:r>
+    </w:p>
+    <w:p>
+      <w:pPr>
+        <w:spacing w:line="276" w:lineRule="auto"/>
+      </w:pPr>
+      <w:r>
+        <w:rPr>
+          <w:rFonts w:ascii="Arial" w:hAnsi="Arial"/>
+          <w:sz w:val="28"/>
+        </w:rPr>
+        <w:t xml:space="preserve">4. DAILY'S OWN ADD IS ONLY ABOUT TODAY. Two kinds: an every-day</w:t>
+      </w:r>
+    </w:p>
+    <w:p>
+      <w:pPr>
+        <w:spacing w:line="276" w:lineRule="auto"/>
+      </w:pPr>
+      <w:r>
+        <w:rPr>
+          <w:rFonts w:ascii="Arial" w:hAnsi="Arial"/>
+          <w:sz w:val="28"/>
+        </w:rPr>
+        <w:t xml:space="preserve">   item, or a One Time for today. On One Time for today the</w:t>
+      </w:r>
+    </w:p>
+    <w:p>
+      <w:pPr>
+        <w:spacing w:line="276" w:lineRule="auto"/>
+      </w:pPr>
+      <w:r>
+        <w:rPr>
+          <w:rFonts w:ascii="Arial" w:hAnsi="Arial"/>
+          <w:sz w:val="28"/>
+        </w:rPr>
+        <w:t xml:space="preserve">   Reminders before chips are only 30 min., 1 hour, 2 hours, and</w:t>
+      </w:r>
+    </w:p>
+    <w:p>
+      <w:pPr>
+        <w:spacing w:line="276" w:lineRule="auto"/>
+      </w:pPr>
+      <w:r>
+        <w:rPr>
+          <w:rFonts w:ascii="Arial" w:hAnsi="Arial"/>
+          <w:sz w:val="28"/>
+        </w:rPr>
+        <w:t xml:space="preserve">   Time of (the item's own time). Save on that kind comes back on</w:t>
+      </w:r>
+    </w:p>
+    <w:p>
+      <w:pPr>
+        <w:spacing w:line="276" w:lineRule="auto"/>
+      </w:pPr>
+      <w:r>
+        <w:rPr>
+          <w:rFonts w:ascii="Arial" w:hAnsi="Arial"/>
+          <w:sz w:val="28"/>
+        </w:rPr>
+        <w:t xml:space="preserve">   Daily. It is Daily's own one-shot, not an Appointment. An</w:t>
+      </w:r>
+    </w:p>
+    <w:p>
+      <w:pPr>
+        <w:spacing w:line="276" w:lineRule="auto"/>
+      </w:pPr>
+      <w:r>
+        <w:rPr>
+          <w:rFonts w:ascii="Arial" w:hAnsi="Arial"/>
+          <w:sz w:val="28"/>
+        </w:rPr>
+        <w:t xml:space="preserve">   Appointment that falls today still shows on Daily as from</w:t>
+      </w:r>
+    </w:p>
+    <w:p>
+      <w:pPr>
+        <w:spacing w:line="276" w:lineRule="auto"/>
+      </w:pPr>
+      <w:r>
+        <w:rPr>
+          <w:rFonts w:ascii="Arial" w:hAnsi="Arial"/>
+          <w:sz w:val="28"/>
+        </w:rPr>
+        <w:t xml:space="preserve">   Appointments, and still lives on Appointments. The other pages keep their</w:t>
+      </w:r>
+    </w:p>
+    <w:p>
+      <w:pPr>
+        <w:spacing w:line="276" w:lineRule="auto"/>
+      </w:pPr>
+      <w:r>
+        <w:rPr>
+          <w:rFonts w:ascii="Arial" w:hAnsi="Arial"/>
+          <w:sz w:val="28"/>
+        </w:rPr>
+        <w:t xml:space="preserve">   own adds, because on those the page is the whole meaning of Repeat.</w:t>
+      </w:r>
+    </w:p>
+    <w:p>
+      <w:pPr>
+        <w:spacing w:line="276" w:lineRule="auto"/>
+      </w:pPr>
+      <w:r>
+        <w:rPr>
+          <w:rFonts w:ascii="Arial" w:hAnsi="Arial"/>
+          <w:sz w:val="28"/>
+        </w:rPr>
+        <w:t xml:space="preserve">   (#78-new)</w:t>
+      </w:r>
+    </w:p>
+    <w:p>
+      <w:pPr>
+        <w:spacing w:line="276" w:lineRule="auto"/>
+      </w:pPr>
+      <w:r>
+        <w:rPr>
+          <w:rFonts w:ascii="Arial" w:hAnsi="Arial"/>
+          <w:sz w:val="28"/>
+        </w:rPr>
+        <w:t xml:space="preserve">5. ONE REMINDER PER ITEM, NOT TWO, and the app puts itself right</w:t>
+      </w:r>
+    </w:p>
+    <w:p>
+      <w:pPr>
+        <w:spacing w:line="276" w:lineRule="auto"/>
+      </w:pPr>
+      <w:r>
+        <w:rPr>
+          <w:rFonts w:ascii="Arial" w:hAnsi="Arial"/>
+          <w:sz w:val="28"/>
+        </w:rPr>
+        <w:t xml:space="preserve">   when you open it: it tells you what you missed, then sets the</w:t>
+      </w:r>
+    </w:p>
+    <w:p>
+      <w:pPr>
+        <w:spacing w:line="276" w:lineRule="auto"/>
+      </w:pPr>
+      <w:r>
+        <w:rPr>
+          <w:rFonts w:ascii="Arial" w:hAnsi="Arial"/>
+          <w:sz w:val="28"/>
+        </w:rPr>
+        <w:t xml:space="preserve">   reminders again. That is your own reasoning and it replaced the</w:t>
+      </w:r>
+    </w:p>
+    <w:p>
+      <w:pPr>
+        <w:spacing w:line="276" w:lineRule="auto"/>
+      </w:pPr>
+      <w:r>
+        <w:rPr>
+          <w:rFonts w:ascii="Arial" w:hAnsi="Arial"/>
+          <w:sz w:val="28"/>
+        </w:rPr>
+        <w:t xml:space="preserve">   old two-days-ahead rule. A Daily item still arms for tomorrow</w:t>
+      </w:r>
+    </w:p>
+    <w:p>
+      <w:pPr>
+        <w:spacing w:line="276" w:lineRule="auto"/>
+      </w:pPr>
+      <w:r>
+        <w:rPr>
+          <w:rFonts w:ascii="Arial" w:hAnsi="Arial"/>
+          <w:sz w:val="28"/>
+        </w:rPr>
+        <w:t xml:space="preserve">   after Done; that is still one reminder, not two (Patrick, #44-new).</w:t>
+      </w:r>
+    </w:p>
+    <w:p>
+      <w:pPr>
+        <w:spacing w:line="276" w:lineRule="auto"/>
+      </w:pPr>
+      <w:r>
+        <w:rPr>
+          <w:rFonts w:ascii="Arial" w:hAnsi="Arial"/>
+          <w:sz w:val="28"/>
+        </w:rPr>
+        <w:t xml:space="preserve">6. ROCK SOLID IS THE TOP GOAL BUT NOT THE ONLY ONE. Consistency</w:t>
+      </w:r>
+    </w:p>
+    <w:p>
+      <w:pPr>
+        <w:spacing w:line="276" w:lineRule="auto"/>
+      </w:pPr>
+      <w:r>
+        <w:rPr>
+          <w:rFonts w:ascii="Arial" w:hAnsi="Arial"/>
+          <w:sz w:val="28"/>
+        </w:rPr>
+        <w:t xml:space="preserve">   stands beside it. That correction is yours, from #17-new.</w:t>
+      </w:r>
+    </w:p>
+    <w:p>
+      <w:pPr>
+        <w:spacing w:line="276" w:lineRule="auto"/>
+      </w:pPr>
+      <w:r>
+        <w:rPr>
+          <w:rFonts w:ascii="Arial" w:hAnsi="Arial"/>
+          <w:sz w:val="28"/>
+        </w:rPr>
+        <w:t xml:space="preserve">7. ROCK SOLID IS FOR WHEN YOU USE IT. An app that is not being</w:t>
+      </w:r>
+    </w:p>
+    <w:p>
+      <w:pPr>
+        <w:spacing w:line="276" w:lineRule="auto"/>
+      </w:pPr>
+      <w:r>
+        <w:rPr>
+          <w:rFonts w:ascii="Arial" w:hAnsi="Arial"/>
+          <w:sz w:val="28"/>
+        </w:rPr>
+        <w:t xml:space="preserve">   opened is not being used, and what the old second copy protected</w:t>
+      </w:r>
+    </w:p>
+    <w:p>
+      <w:pPr>
+        <w:spacing w:line="276" w:lineRule="auto"/>
+      </w:pPr>
+      <w:r>
+        <w:rPr>
+          <w:rFonts w:ascii="Arial" w:hAnsi="Arial"/>
+          <w:sz w:val="28"/>
+        </w:rPr>
+        <w:t xml:space="preserve">   was one day and no more.</w:t>
+      </w:r>
+    </w:p>
+    <w:p>
+      <w:pPr>
+        <w:spacing w:line="276" w:lineRule="auto"/>
+      </w:pPr>
+      <w:r>
+        <w:rPr>
+          <w:rFonts w:ascii="Arial" w:hAnsi="Arial"/>
+          <w:sz w:val="28"/>
+        </w:rPr>
+        <w:t xml:space="preserve">8. AN EXTENDED ITEM AND A DAILY TICK ARE OPPOSITES. A Bucket List</w:t>
+      </w:r>
+    </w:p>
+    <w:p>
+      <w:pPr>
+        <w:spacing w:line="276" w:lineRule="auto"/>
+      </w:pPr>
+      <w:r>
+        <w:rPr>
+          <w:rFonts w:ascii="Arial" w:hAnsi="Arial"/>
+          <w:sz w:val="28"/>
+        </w:rPr>
+        <w:t xml:space="preserve">   item (saved kind bucketlist) says a thing is not yet done and must</w:t>
+      </w:r>
+    </w:p>
+    <w:p>
+      <w:pPr>
+        <w:spacing w:line="276" w:lineRule="auto"/>
+      </w:pPr>
+      <w:r>
+        <w:rPr>
+          <w:rFonts w:ascii="Arial" w:hAnsi="Arial"/>
+          <w:sz w:val="28"/>
+        </w:rPr>
+        <w:t xml:space="preserve">   survive the night. The coffee-and-water sort says a thing was</w:t>
+      </w:r>
+    </w:p>
+    <w:p>
+      <w:pPr>
+        <w:spacing w:line="276" w:lineRule="auto"/>
+      </w:pPr>
+      <w:r>
+        <w:rPr>
+          <w:rFonts w:ascii="Arial" w:hAnsi="Arial"/>
+          <w:sz w:val="28"/>
+        </w:rPr>
+        <w:t xml:space="preserve">   done today and is meaningless the morning after. They must never</w:t>
+      </w:r>
+    </w:p>
+    <w:p>
+      <w:pPr>
+        <w:spacing w:line="276" w:lineRule="auto"/>
+      </w:pPr>
+      <w:r>
+        <w:rPr>
+          <w:rFonts w:ascii="Arial" w:hAnsi="Arial"/>
+          <w:sz w:val="28"/>
+        </w:rPr>
+        <w:t xml:space="preserve">   be merged.</w:t>
+      </w:r>
+    </w:p>
+    <w:p>
+      <w:pPr>
+        <w:spacing w:line="276" w:lineRule="auto"/>
+      </w:pPr>
+      <w:r>
+        <w:rPr>
+          <w:rFonts w:ascii="Arial" w:hAnsi="Arial"/>
+          <w:sz w:val="28"/>
+        </w:rPr>
+        <w:t xml:space="preserve">9. TIMES SET BY SPINNING THROUGH NOON OR MIDNIGHT BEFORE #27-new</w:t>
+      </w:r>
+    </w:p>
+    <w:p>
+      <w:pPr>
+        <w:spacing w:line="276" w:lineRule="auto"/>
+      </w:pPr>
+      <w:r>
+        <w:rPr>
+          <w:rFonts w:ascii="Arial" w:hAnsi="Arial"/>
+          <w:sz w:val="28"/>
+        </w:rPr>
+        <w:t xml:space="preserve">    are stored in the wrong half of the day and want re-setting.</w:t>
+      </w:r>
+    </w:p>
+    <w:p>
+      <w:pPr>
+        <w:spacing w:line="276" w:lineRule="auto"/>
+      </w:pPr>
+      <w:r>
+        <w:rPr>
+          <w:rFonts w:ascii="Arial" w:hAnsi="Arial"/>
+          <w:sz w:val="28"/>
+        </w:rPr>
+        <w:t xml:space="preserve">10. TASKS SAVED BEFORE THE DATE FIX carry a date they were given</w:t>
+      </w:r>
+    </w:p>
+    <w:p>
+      <w:pPr>
+        <w:spacing w:line="276" w:lineRule="auto"/>
+      </w:pPr>
+      <w:r>
+        <w:rPr>
+          <w:rFonts w:ascii="Arial" w:hAnsi="Arial"/>
+          <w:sz w:val="28"/>
+        </w:rPr>
+        <w:t xml:space="preserve">    rather than one you chose.</w:t>
+      </w:r>
+    </w:p>
+    <w:p>
+      <w:pPr>
+        <w:spacing w:line="276" w:lineRule="auto"/>
+      </w:pPr>
+      <w:r>
+        <w:rPr>
+          <w:rFonts w:ascii="Arial" w:hAnsi="Arial"/>
+          <w:sz w:val="28"/>
+        </w:rPr>
+        <w:t xml:space="preserve">11. A BIG PIECE GETS A BUILD SHEET FIRST — self-contained, carrying</w:t>
+      </w:r>
+    </w:p>
+    <w:p>
+      <w:pPr>
+        <w:spacing w:line="276" w:lineRule="auto"/>
+      </w:pPr>
+      <w:r>
+        <w:rPr>
+          <w:rFonts w:ascii="Arial" w:hAnsi="Arial"/>
+          <w:sz w:val="28"/>
+        </w:rPr>
+        <w:t xml:space="preserve">    every answer, so whoever builds it never has to ask you a</w:t>
+      </w:r>
+    </w:p>
+    <w:p>
+      <w:pPr>
+        <w:spacing w:line="276" w:lineRule="auto"/>
+      </w:pPr>
+      <w:r>
+        <w:rPr>
+          <w:rFonts w:ascii="Arial" w:hAnsi="Arial"/>
+          <w:sz w:val="28"/>
+        </w:rPr>
+        <w:t xml:space="preserve">    design question.</w:t>
+      </w:r>
+    </w:p>
+    <w:p>
+      <w:pPr>
+        <w:spacing w:line="276" w:lineRule="auto"/>
+      </w:pPr>
+      <w:r>
+        <w:rPr>
+          <w:rFonts w:ascii="Arial" w:hAnsi="Arial"/>
+          <w:sz w:val="28"/>
+        </w:rPr>
+        <w:t xml:space="preserve">12. BARE SESSION NUMBERS mean the old shared chain. This project's</w:t>
+      </w:r>
+    </w:p>
+    <w:p>
+      <w:pPr>
+        <w:spacing w:line="276" w:lineRule="auto"/>
+      </w:pPr>
+      <w:r>
+        <w:rPr>
+          <w:rFonts w:ascii="Arial" w:hAnsi="Arial"/>
+          <w:sz w:val="28"/>
+        </w:rPr>
+        <w:t xml:space="preserve">    own chain is written #1-new, #2-new, and so on.</w:t>
+      </w:r>
+    </w:p>
+    <w:p>
+      <w:pPr>
+        <w:spacing w:line="276" w:lineRule="auto"/>
+      </w:pPr>
+      <w:r>
+        <w:rPr>
+          <w:rFonts w:ascii="Arial" w:hAnsi="Arial"/>
+          <w:sz w:val="28"/>
+        </w:rPr>
+        <w:t xml:space="preserve">13. WORKING DOCUMENTS LIVE IN docs. History lives in docs-ref, and</w:t>
+      </w:r>
+    </w:p>
+    <w:p>
+      <w:pPr>
+        <w:spacing w:line="276" w:lineRule="auto"/>
+      </w:pPr>
+      <w:r>
+        <w:rPr>
+          <w:rFonts w:ascii="Arial" w:hAnsi="Arial"/>
+          <w:sz w:val="28"/>
+        </w:rPr>
+        <w:t xml:space="preserve">    the build sheets are in docs-ref/build-sheets. The index</w:t>
+      </w:r>
+    </w:p>
+    <w:p>
+      <w:pPr>
+        <w:spacing w:line="276" w:lineRule="auto"/>
+      </w:pPr>
+      <w:r>
+        <w:rPr>
+          <w:rFonts w:ascii="Arial" w:hAnsi="Arial"/>
+          <w:sz w:val="28"/>
+        </w:rPr>
+        <w:t xml:space="preserve">    says which file is the home. He calls them working documents;</w:t>
+      </w:r>
+    </w:p>
+    <w:p>
+      <w:pPr>
+        <w:spacing w:line="276" w:lineRule="auto"/>
+      </w:pPr>
+      <w:r>
+        <w:rPr>
+          <w:rFonts w:ascii="Arial" w:hAnsi="Arial"/>
+          <w:sz w:val="28"/>
+        </w:rPr>
+        <w:t xml:space="preserve">    live desk means the same thing. (App-Docs, 2026-08-31)</w:t>
+      </w:r>
+    </w:p>
+    <w:p>
+      <w:pPr>
+        <w:spacing w:line="276" w:lineRule="auto"/>
+      </w:pPr>
+      <w:r>
+        <w:rPr>
+          <w:rFonts w:ascii="Arial" w:hAnsi="Arial"/>
+          <w:sz w:val="28"/>
+        </w:rPr>
+        <w:t xml:space="preserve">14. THE CALENDAR PAGE SHOWS DATED ITEMS. No every-day Daily items,</w:t>
+      </w:r>
+    </w:p>
+    <w:p>
+      <w:pPr>
+        <w:spacing w:line="276" w:lineRule="auto"/>
+      </w:pPr>
+      <w:r>
+        <w:rPr>
+          <w:rFonts w:ascii="Arial" w:hAnsi="Arial"/>
+          <w:sz w:val="28"/>
+        </w:rPr>
+        <w:t xml:space="preserve">    no Bucket List. No Done or Snooze on the month or the day’s list.</w:t>
+      </w:r>
+    </w:p>
+    <w:p>
+      <w:pPr>
+        <w:spacing w:line="276" w:lineRule="auto"/>
+      </w:pPr>
+      <w:r>
+        <w:rPr>
+          <w:rFonts w:ascii="Arial" w:hAnsi="Arial"/>
+          <w:sz w:val="28"/>
+        </w:rPr>
+        <w:t xml:space="preserve">    Names in a day box are one line and scroll vertically.</w:t>
+      </w:r>
+    </w:p>
+    <w:p>
+      <w:pPr>
+        <w:spacing w:line="276" w:lineRule="auto"/>
+      </w:pPr>
+      <w:r>
+        <w:rPr>
+          <w:rFonts w:ascii="Arial" w:hAnsi="Arial"/>
+          <w:sz w:val="28"/>
+        </w:rPr>
+        <w:t xml:space="preserve">    Landscape is an optional view: 0°, 90° counter-clockwise, and</w:t>
+      </w:r>
+    </w:p>
+    <w:p>
+      <w:pPr>
+        <w:spacing w:line="276" w:lineRule="auto"/>
+      </w:pPr>
+      <w:r>
+        <w:rPr>
+          <w:rFonts w:ascii="Arial" w:hAnsi="Arial"/>
+          <w:sz w:val="28"/>
+        </w:rPr>
+        <w:t xml:space="preserve">    270° counter-clockwise; 180° upside-down is out. Headers stay</w:t>
+      </w:r>
+    </w:p>
+    <w:p>
+      <w:pPr>
+        <w:spacing w:line="276" w:lineRule="auto"/>
+      </w:pPr>
+      <w:r>
+        <w:rPr>
+          <w:rFonts w:ascii="Arial" w:hAnsi="Arial"/>
+          <w:sz w:val="28"/>
+        </w:rPr>
+        <w:t xml:space="preserve">    at the physical top of the phone, all pages. The calendar month</w:t>
+      </w:r>
+    </w:p>
+    <w:p>
+      <w:pPr>
+        <w:spacing w:line="276" w:lineRule="auto"/>
+      </w:pPr>
+      <w:r>
+        <w:rPr>
+          <w:rFonts w:ascii="Arial" w:hAnsi="Arial"/>
+          <w:sz w:val="28"/>
+        </w:rPr>
+        <w:t xml:space="preserve">    grid was not rebuilt.</w:t>
+      </w:r>
+    </w:p>
+    <w:p>
+      <w:pPr>
+        <w:spacing w:line="276" w:lineRule="auto"/>
+      </w:pPr>
+      <w:r>
+        <w:rPr>
+          <w:rFonts w:ascii="Arial" w:hAnsi="Arial"/>
+          <w:sz w:val="28"/>
+        </w:rPr>
+        <w:t xml:space="preserve">15. HAVING A GOOD IDEA LEADS TO OVERREACHING (Patrick, #52-new).</w:t>
+      </w:r>
+    </w:p>
+    <w:p>
+      <w:pPr>
+        <w:spacing w:line="276" w:lineRule="auto"/>
+      </w:pPr>
+      <w:r>
+        <w:rPr>
+          <w:rFonts w:ascii="Arial" w:hAnsi="Arial"/>
+          <w:sz w:val="28"/>
+        </w:rPr>
+        <w:t xml:space="preserve">    The feedback he needs is the trim: what part is worth it,</w:t>
+      </w:r>
+    </w:p>
+    <w:p>
+      <w:pPr>
+        <w:spacing w:line="276" w:lineRule="auto"/>
+      </w:pPr>
+      <w:r>
+        <w:rPr>
+          <w:rFonts w:ascii="Arial" w:hAnsi="Arial"/>
+          <w:sz w:val="28"/>
+        </w:rPr>
+        <w:t xml:space="preserve">    and what is more than is there.</w:t>
+      </w:r>
+    </w:p>
+    <w:p>
+      <w:pPr>
+        <w:spacing w:line="276" w:lineRule="auto"/>
+      </w:pPr>
+      <w:r>
+        <w:rPr>
+          <w:rFonts w:ascii="Arial" w:hAnsi="Arial"/>
+          <w:sz w:val="28"/>
+        </w:rPr>
+        <w:t xml:space="preserve">16. THE DESIGN DESCRIPTION IS THE DESIGNED IMPLEMENTATION</w:t>
+      </w:r>
+    </w:p>
+    <w:p>
+      <w:pPr>
+        <w:spacing w:line="276" w:lineRule="auto"/>
+      </w:pPr>
+      <w:r>
+        <w:rPr>
+          <w:rFonts w:ascii="Arial" w:hAnsi="Arial"/>
+          <w:sz w:val="28"/>
+        </w:rPr>
+        <w:t xml:space="preserve">    (Patrick, #84-new). It is the guide for the whole app. A sitting</w:t>
+      </w:r>
+    </w:p>
+    <w:p>
+      <w:pPr>
+        <w:spacing w:line="276" w:lineRule="auto"/>
+      </w:pPr>
+      <w:r>
+        <w:rPr>
+          <w:rFonts w:ascii="Arial" w:hAnsi="Arial"/>
+          <w:sz w:val="28"/>
+        </w:rPr>
+        <w:t xml:space="preserve">    builds from docs/designed-implementation.md and does not ask</w:t>
+      </w:r>
+    </w:p>
+    <w:p>
+      <w:pPr>
+        <w:spacing w:line="276" w:lineRule="auto"/>
+      </w:pPr>
+      <w:r>
+        <w:rPr>
+          <w:rFonts w:ascii="Arial" w:hAnsi="Arial"/>
+          <w:sz w:val="28"/>
+        </w:rPr>
+        <w:t xml:space="preserve">    Patrick a design question. Home, Help, Calendar, Settings, Backup,</w:t>
+      </w:r>
+    </w:p>
+    <w:p>
+      <w:pPr>
+        <w:spacing w:line="276" w:lineRule="auto"/>
+      </w:pPr>
+      <w:r>
+        <w:rPr>
+          <w:rFonts w:ascii="Arial" w:hAnsi="Arial"/>
+          <w:sz w:val="28"/>
+        </w:rPr>
+        <w:t xml:space="preserve">    Scheduled Reminders, Options, and Log are in that file.</w:t>
+      </w:r>
+    </w:p>
+    <w:p>
+      <w:pPr>
+        <w:spacing w:line="276" w:lineRule="auto"/>
+      </w:pPr>
+      <w:r>
+        <w:rPr>
+          <w:rFonts w:ascii="Arial" w:hAnsi="Arial"/>
+          <w:sz w:val="28"/>
+        </w:rPr>
+        <w:t xml:space="preserve"/>
+      </w:r>
+    </w:p>
+    <w:p>
+      <w:pPr>
+        <w:spacing w:line="276" w:lineRule="auto"/>
+      </w:pPr>
+      <w:r>
+        <w:rPr>
+          <w:rFonts w:ascii="Arial" w:hAnsi="Arial"/>
+          <w:sz w:val="28"/>
+        </w:rPr>
+        <w:t xml:space="preserve"/>
+      </w:r>
+    </w:p>
+    <w:p>
+      <w:pPr>
+        <w:spacing w:line="276" w:lineRule="auto"/>
+      </w:pPr>
+      <w:r>
+        <w:rPr>
+          <w:rFonts w:ascii="Arial" w:hAnsi="Arial"/>
           <w:b/>
           <w:sz w:val="28"/>
         </w:rPr>
-        <w:t xml:space="preserve">PENDING</w:t>
+        <w:t xml:space="preserve">WHAT IS DONE, NEWEST FIRST</w:t>
       </w:r>
     </w:p>
     <w:p>
@@ -638,7 +1636,43 @@
           <w:rFonts w:ascii="Arial" w:hAnsi="Arial"/>
           <w:sz w:val="28"/>
         </w:rPr>
-        <w:t xml:space="preserve">Things waiting on something — mostly on a build.</w:t>
+        <w:t xml:space="preserve">Newest at the top. Number 1 is the oldest line, at the bottom.</w:t>
+      </w:r>
+    </w:p>
+    <w:p>
+      <w:pPr>
+        <w:spacing w:line="276" w:lineRule="auto"/>
+      </w:pPr>
+      <w:r>
+        <w:rPr>
+          <w:rFonts w:ascii="Arial" w:hAnsi="Arial"/>
+          <w:sz w:val="28"/>
+        </w:rPr>
+        <w:t xml:space="preserve">A new sitting gets the next number on top; nothing else is</w:t>
+      </w:r>
+    </w:p>
+    <w:p>
+      <w:pPr>
+        <w:spacing w:line="276" w:lineRule="auto"/>
+      </w:pPr>
+      <w:r>
+        <w:rPr>
+          <w:rFonts w:ascii="Arial" w:hAnsi="Arial"/>
+          <w:sz w:val="28"/>
+        </w:rPr>
+        <w:t xml:space="preserve">renumbered. One line each. The full story is in</w:t>
+      </w:r>
+    </w:p>
+    <w:p>
+      <w:pPr>
+        <w:spacing w:line="276" w:lineRule="auto"/>
+      </w:pPr>
+      <w:r>
+        <w:rPr>
+          <w:rFonts w:ascii="Arial" w:hAnsi="Arial"/>
+          <w:sz w:val="28"/>
+        </w:rPr>
+        <w:t xml:space="preserve">docs/handoff-history.md.</w:t>
       </w:r>
     </w:p>
     <w:p>
@@ -662,247 +1696,31 @@
           <w:rFonts w:ascii="Arial" w:hAnsi="Arial"/>
           <w:sz w:val="28"/>
         </w:rPr>
-        <w:t xml:space="preserve">1. A THOROUGH DESIGN SPEC FOR THE APP (Patrick, #52-new). This</w:t>
-      </w:r>
-    </w:p>
-    <w:p>
-      <w:pPr>
-        <w:spacing w:line="276" w:lineRule="auto"/>
-      </w:pPr>
-      <w:r>
-        <w:rPr>
-          <w:rFonts w:ascii="Arial" w:hAnsi="Arial"/>
-          <w:sz w:val="28"/>
-        </w:rPr>
-        <w:t xml:space="preserve">    sitting treated One Time's missing notice at the set time as</w:t>
-      </w:r>
-    </w:p>
-    <w:p>
-      <w:pPr>
-        <w:spacing w:line="276" w:lineRule="auto"/>
-      </w:pPr>
-      <w:r>
-        <w:rPr>
-          <w:rFonts w:ascii="Arial" w:hAnsi="Arial"/>
-          <w:sz w:val="28"/>
-        </w:rPr>
-        <w:t xml:space="preserve">    a bug. He had decided it that way. A spec would have said so.</w:t>
-      </w:r>
-    </w:p>
-    <w:p>
-      <w:pPr>
-        <w:spacing w:line="276" w:lineRule="auto"/>
-      </w:pPr>
-      <w:r>
-        <w:rPr>
-          <w:rFonts w:ascii="Arial" w:hAnsi="Arial"/>
-          <w:sz w:val="28"/>
-        </w:rPr>
-        <w:t xml:space="preserve">    Changing the name of One Time to Appointments belongs in</w:t>
-      </w:r>
-    </w:p>
-    <w:p>
-      <w:pPr>
-        <w:spacing w:line="276" w:lineRule="auto"/>
-      </w:pPr>
-      <w:r>
-        <w:rPr>
-          <w:rFonts w:ascii="Arial" w:hAnsi="Arial"/>
-          <w:sz w:val="28"/>
-        </w:rPr>
-        <w:t xml:space="preserve">    that spec, and Extended to Bucket List. At #84-new the spec</w:t>
-      </w:r>
-    </w:p>
-    <w:p>
-      <w:pPr>
-        <w:spacing w:line="276" w:lineRule="auto"/>
-      </w:pPr>
-      <w:r>
-        <w:rPr>
-          <w:rFonts w:ascii="Arial" w:hAnsi="Arial"/>
-          <w:sz w:val="28"/>
-        </w:rPr>
-        <w:t xml:space="preserve">    is the designed implementation of the whole app: it is the</w:t>
-      </w:r>
-    </w:p>
-    <w:p>
-      <w:pPr>
-        <w:spacing w:line="276" w:lineRule="auto"/>
-      </w:pPr>
-      <w:r>
-        <w:rPr>
-          <w:rFonts w:ascii="Arial" w:hAnsi="Arial"/>
-          <w:sz w:val="28"/>
-        </w:rPr>
-        <w:t xml:space="preserve">    guide, and it replaces a separate layer of decisions and rules.</w:t>
-      </w:r>
-    </w:p>
-    <w:p>
-      <w:pPr>
-        <w:spacing w:line="276" w:lineRule="auto"/>
-      </w:pPr>
-      <w:r>
-        <w:rPr>
-          <w:rFonts w:ascii="Arial" w:hAnsi="Arial"/>
-          <w:sz w:val="28"/>
-        </w:rPr>
-        <w:t xml:space="preserve">    The first piece is docs/designed-implementation.md. This sitting</w:t>
-      </w:r>
-    </w:p>
-    <w:p>
-      <w:pPr>
-        <w:spacing w:line="276" w:lineRule="auto"/>
-      </w:pPr>
-      <w:r>
-        <w:rPr>
-          <w:rFonts w:ascii="Arial" w:hAnsi="Arial"/>
-          <w:sz w:val="28"/>
-        </w:rPr>
-        <w:t xml:space="preserve">    wrote the machinery, each kind, Daily on the shared list, and the</w:t>
-      </w:r>
-    </w:p>
-    <w:p>
-      <w:pPr>
-        <w:spacing w:line="276" w:lineRule="auto"/>
-      </w:pPr>
-      <w:r>
-        <w:rPr>
-          <w:rFonts w:ascii="Arial" w:hAnsi="Arial"/>
-          <w:sz w:val="28"/>
-        </w:rPr>
-        <w:t xml:space="preserve">    banner housing. Home, Help, Calendar, Settings, Backup, Scheduled</w:t>
-      </w:r>
-    </w:p>
-    <w:p>
-      <w:pPr>
-        <w:spacing w:line="276" w:lineRule="auto"/>
-      </w:pPr>
-      <w:r>
-        <w:rPr>
-          <w:rFonts w:ascii="Arial" w:hAnsi="Arial"/>
-          <w:sz w:val="28"/>
-        </w:rPr>
-        <w:t xml:space="preserve">    Reminders, and Options are in that piece. A Settings password is</w:t>
-      </w:r>
-    </w:p>
-    <w:p>
-      <w:pPr>
-        <w:spacing w:line="276" w:lineRule="auto"/>
-      </w:pPr>
-      <w:r>
-        <w:rPr>
-          <w:rFonts w:ascii="Arial" w:hAnsi="Arial"/>
-          <w:sz w:val="28"/>
-        </w:rPr>
-        <w:t xml:space="preserve">    not.</w:t>
-      </w:r>
-    </w:p>
-    <w:p>
-      <w:pPr>
-        <w:spacing w:line="276" w:lineRule="auto"/>
-      </w:pPr>
-      <w:r>
-        <w:rPr>
-          <w:rFonts w:ascii="Arial" w:hAnsi="Arial"/>
-          <w:sz w:val="28"/>
-        </w:rPr>
-        <w:t xml:space="preserve">2. A USER GUIDE, from that spec or merely after it (Patrick,</w:t>
-      </w:r>
-    </w:p>
-    <w:p>
-      <w:pPr>
-        <w:spacing w:line="276" w:lineRule="auto"/>
-      </w:pPr>
-      <w:r>
-        <w:rPr>
-          <w:rFonts w:ascii="Arial" w:hAnsi="Arial"/>
-          <w:sz w:val="28"/>
-        </w:rPr>
-        <w:t xml:space="preserve">    #52-new). He needs to provide it on his website, and a way</w:t>
-      </w:r>
-    </w:p>
-    <w:p>
-      <w:pPr>
-        <w:spacing w:line="276" w:lineRule="auto"/>
-      </w:pPr>
-      <w:r>
-        <w:rPr>
-          <w:rFonts w:ascii="Arial" w:hAnsi="Arial"/>
-          <w:sz w:val="28"/>
-        </w:rPr>
-        <w:t xml:space="preserve">    in the app to find it or get it.</w:t>
-      </w:r>
-    </w:p>
-    <w:p>
-      <w:pPr>
-        <w:spacing w:line="276" w:lineRule="auto"/>
-      </w:pPr>
-      <w:r>
-        <w:rPr>
-          <w:rFonts w:ascii="Arial" w:hAnsi="Arial"/>
-          <w:sz w:val="28"/>
-        </w:rPr>
-        <w:t xml:space="preserve">3. A FEEDBACK BUTTON IN THE APP, similar to Mystery (Patrick,</w:t>
-      </w:r>
-    </w:p>
-    <w:p>
-      <w:pPr>
-        <w:spacing w:line="276" w:lineRule="auto"/>
-      </w:pPr>
-      <w:r>
-        <w:rPr>
-          <w:rFonts w:ascii="Arial" w:hAnsi="Arial"/>
-          <w:sz w:val="28"/>
-        </w:rPr>
-        <w:t xml:space="preserve">    #52-new). That is how the app lets you find or get the</w:t>
-      </w:r>
-    </w:p>
-    <w:p>
-      <w:pPr>
-        <w:spacing w:line="276" w:lineRule="auto"/>
-      </w:pPr>
-      <w:r>
-        <w:rPr>
-          <w:rFonts w:ascii="Arial" w:hAnsi="Arial"/>
-          <w:sz w:val="28"/>
-        </w:rPr>
-        <w:t xml:space="preserve">    User Guide.</w:t>
-      </w:r>
-    </w:p>
-    <w:p>
-      <w:pPr>
-        <w:spacing w:line="276" w:lineRule="auto"/>
-      </w:pPr>
-      <w:r>
-        <w:rPr>
-          <w:rFonts w:ascii="Arial" w:hAnsi="Arial"/>
-          <w:sz w:val="28"/>
-        </w:rPr>
-        <w:t xml:space="preserve">4. A PAGE, SPEC, OR FILE FOR WHAT TESTING HAS COVERED AND</w:t>
-      </w:r>
-    </w:p>
-    <w:p>
-      <w:pPr>
-        <w:spacing w:line="276" w:lineRule="auto"/>
-      </w:pPr>
-      <w:r>
-        <w:rPr>
-          <w:rFonts w:ascii="Arial" w:hAnsi="Arial"/>
-          <w:sz w:val="28"/>
-        </w:rPr>
-        <w:t xml:space="preserve">   WILL COVER (Patrick, #52-new). The during-build tests are</w:t>
-      </w:r>
-    </w:p>
-    <w:p>
-      <w:pPr>
-        <w:spacing w:line="276" w:lineRule="auto"/>
-      </w:pPr>
-      <w:r>
-        <w:rPr>
-          <w:rFonts w:ascii="Arial" w:hAnsi="Arial"/>
-          <w:sz w:val="28"/>
-        </w:rPr>
-        <w:t xml:space="preserve">   thrown away. The run is not kept.</w:t>
+        <w:t xml:space="preserve">93. #97-new — Bucket List Home badge is a rainbow. No time is the</w:t>
+      </w:r>
+    </w:p>
+    <w:p>
+      <w:pPr>
+        <w:spacing w:line="276" w:lineRule="auto"/>
+      </w:pPr>
+      <w:r>
+        <w:rPr>
+          <w:rFonts w:ascii="Arial" w:hAnsi="Arial"/>
+          <w:sz w:val="28"/>
+        </w:rPr>
+        <w:t xml:space="preserve">    way back when a time does not have to be picked. Not on the</w:t>
+      </w:r>
+    </w:p>
+    <w:p>
+      <w:pPr>
+        <w:spacing w:line="276" w:lineRule="auto"/>
+      </w:pPr>
+      <w:r>
+        <w:rPr>
+          <w:rFonts w:ascii="Arial" w:hAnsi="Arial"/>
+          <w:sz w:val="28"/>
+        </w:rPr>
+        <w:t xml:space="preserve">    phone.</w:t>
       </w:r>
     </w:p>
     <w:p>
@@ -926,6 +1744,30 @@
           <w:rFonts w:ascii="Arial" w:hAnsi="Arial"/>
           <w:sz w:val="28"/>
         </w:rPr>
+        <w:t xml:space="preserve">92. #96-new — Log off the list. Each reminder page carries Log</w:t>
+      </w:r>
+    </w:p>
+    <w:p>
+      <w:pPr>
+        <w:spacing w:line="276" w:lineRule="auto"/>
+      </w:pPr>
+      <w:r>
+        <w:rPr>
+          <w:rFonts w:ascii="Arial" w:hAnsi="Arial"/>
+          <w:sz w:val="28"/>
+        </w:rPr>
+        <w:t xml:space="preserve">    beside + Add and opens that page’s log only. Not on the phone.</w:t>
+      </w:r>
+    </w:p>
+    <w:p>
+      <w:pPr>
+        <w:spacing w:line="276" w:lineRule="auto"/>
+      </w:pPr>
+      <w:r>
+        <w:rPr>
+          <w:rFonts w:ascii="Arial" w:hAnsi="Arial"/>
+          <w:sz w:val="28"/>
+        </w:rPr>
         <w:t xml:space="preserve"/>
       </w:r>
     </w:p>
@@ -936,46 +1778,21 @@
       <w:r>
         <w:rPr>
           <w:rFonts w:ascii="Arial" w:hAnsi="Arial"/>
-          <w:b/>
-          <w:sz w:val="28"/>
-        </w:rPr>
-        <w:t xml:space="preserve">FACTS THAT APPLY TO THE ONGOING WORK</w:t>
-      </w:r>
-    </w:p>
-    <w:p>
-      <w:pPr>
-        <w:spacing w:line="276" w:lineRule="auto"/>
-      </w:pPr>
-      <w:r>
-        <w:rPr>
-          <w:rFonts w:ascii="Arial" w:hAnsi="Arial"/>
-          <w:sz w:val="28"/>
-        </w:rPr>
-        <w:t xml:space="preserve">------------------------------------------------------------------</w:t>
-      </w:r>
-    </w:p>
-    <w:p>
-      <w:pPr>
-        <w:spacing w:line="276" w:lineRule="auto"/>
-      </w:pPr>
-      <w:r>
-        <w:rPr>
-          <w:rFonts w:ascii="Arial" w:hAnsi="Arial"/>
-          <w:sz w:val="28"/>
-        </w:rPr>
-        <w:t xml:space="preserve">Settled things worth having in front of you while the pages are</w:t>
-      </w:r>
-    </w:p>
-    <w:p>
-      <w:pPr>
-        <w:spacing w:line="276" w:lineRule="auto"/>
-      </w:pPr>
-      <w:r>
-        <w:rPr>
-          <w:rFonts w:ascii="Arial" w:hAnsi="Arial"/>
-          <w:sz w:val="28"/>
-        </w:rPr>
-        <w:t xml:space="preserve">built. None of these is a job to do.</w:t>
+          <w:sz w:val="28"/>
+        </w:rPr>
+        <w:t xml:space="preserve">91. #95-new — New and Edit: Cancel and Save stay at the top while</w:t>
+      </w:r>
+    </w:p>
+    <w:p>
+      <w:pPr>
+        <w:spacing w:line="276" w:lineRule="auto"/>
+      </w:pPr>
+      <w:r>
+        <w:rPr>
+          <w:rFonts w:ascii="Arial" w:hAnsi="Arial"/>
+          <w:sz w:val="28"/>
+        </w:rPr>
+        <w:t xml:space="preserve">   the form scrolls. Checked on Weekly in the simulator.</w:t>
       </w:r>
     </w:p>
     <w:p>
@@ -999,775 +1816,19 @@
           <w:rFonts w:ascii="Arial" w:hAnsi="Arial"/>
           <w:sz w:val="28"/>
         </w:rPr>
-        <w:t xml:space="preserve">1. THE PAGES ARE NOT A REPLACEMENT FOR THE INPUT PAGE. The Input</w:t>
-      </w:r>
-    </w:p>
-    <w:p>
-      <w:pPr>
-        <w:spacing w:line="276" w:lineRule="auto"/>
-      </w:pPr>
-      <w:r>
-        <w:rPr>
-          <w:rFonts w:ascii="Arial" w:hAnsi="Arial"/>
-          <w:sz w:val="28"/>
-        </w:rPr>
-        <w:t xml:space="preserve">   page goes away and nothing replaces it — and the + Add popup in</w:t>
-      </w:r>
-    </w:p>
-    <w:p>
-      <w:pPr>
-        <w:spacing w:line="276" w:lineRule="auto"/>
-      </w:pPr>
-      <w:r>
-        <w:rPr>
-          <w:rFonts w:ascii="Arial" w:hAnsi="Arial"/>
-          <w:sz w:val="28"/>
-        </w:rPr>
-        <w:t xml:space="preserve">   particular is not its replacement. This is your own reminder</w:t>
-      </w:r>
-    </w:p>
-    <w:p>
-      <w:pPr>
-        <w:spacing w:line="276" w:lineRule="auto"/>
-      </w:pPr>
-      <w:r>
-        <w:rPr>
-          <w:rFonts w:ascii="Arial" w:hAnsi="Arial"/>
-          <w:sz w:val="28"/>
-        </w:rPr>
-        <w:t xml:space="preserve">   pages being reshaped by how often a thing comes round.</w:t>
-      </w:r>
-    </w:p>
-    <w:p>
-      <w:pPr>
-        <w:spacing w:line="276" w:lineRule="auto"/>
-      </w:pPr>
-      <w:r>
-        <w:rPr>
-          <w:rFonts w:ascii="Arial" w:hAnsi="Arial"/>
-          <w:sz w:val="28"/>
-        </w:rPr>
-        <w:t xml:space="preserve">2. + ADD ON A PAGE GOES TO THAT PAGE'S OWN NEW. Where does it</w:t>
-      </w:r>
-    </w:p>
-    <w:p>
-      <w:pPr>
-        <w:spacing w:line="276" w:lineRule="auto"/>
-      </w:pPr>
-      <w:r>
-        <w:rPr>
-          <w:rFonts w:ascii="Arial" w:hAnsi="Arial"/>
-          <w:sz w:val="28"/>
-        </w:rPr>
-        <w:t xml:space="preserve">   belong? is only on Options, from + Screen. You do not set</w:t>
-      </w:r>
-    </w:p>
-    <w:p>
-      <w:pPr>
-        <w:spacing w:line="276" w:lineRule="auto"/>
-      </w:pPr>
-      <w:r>
-        <w:rPr>
-          <w:rFonts w:ascii="Arial" w:hAnsi="Arial"/>
-          <w:sz w:val="28"/>
-        </w:rPr>
-        <w:t xml:space="preserve">   another page from a different page (#36-new).</w:t>
-      </w:r>
-    </w:p>
-    <w:p>
-      <w:pPr>
-        <w:spacing w:line="276" w:lineRule="auto"/>
-      </w:pPr>
-      <w:r>
-        <w:rPr>
-          <w:rFonts w:ascii="Arial" w:hAnsi="Arial"/>
-          <w:sz w:val="28"/>
-        </w:rPr>
-        <w:t xml:space="preserve">3. APPOINTMENTS CARRIES THE REMINDERS BEFORE CHIPS — 30 min., 1</w:t>
-      </w:r>
-    </w:p>
-    <w:p>
-      <w:pPr>
-        <w:spacing w:line="276" w:lineRule="auto"/>
-      </w:pPr>
-      <w:r>
-        <w:rPr>
-          <w:rFonts w:ascii="Arial" w:hAnsi="Arial"/>
-          <w:sz w:val="28"/>
-        </w:rPr>
-        <w:t xml:space="preserve">   hour, 2 hours, Morning of, Day Before, Night Before, 2 Days</w:t>
-      </w:r>
-    </w:p>
-    <w:p>
-      <w:pPr>
-        <w:spacing w:line="276" w:lineRule="auto"/>
-      </w:pPr>
-      <w:r>
-        <w:rPr>
-          <w:rFonts w:ascii="Arial" w:hAnsi="Arial"/>
-          <w:sz w:val="28"/>
-        </w:rPr>
-        <w:t xml:space="preserve">   Before, Week, Month — and any and all of them can be on at once.</w:t>
-      </w:r>
-    </w:p>
-    <w:p>
-      <w:pPr>
-        <w:spacing w:line="276" w:lineRule="auto"/>
-      </w:pPr>
-      <w:r>
-        <w:rPr>
-          <w:rFonts w:ascii="Arial" w:hAnsi="Arial"/>
-          <w:sz w:val="28"/>
-        </w:rPr>
-        <w:t xml:space="preserve">   They also remind at the set time, like the rest of the app</w:t>
-      </w:r>
-    </w:p>
-    <w:p>
-      <w:pPr>
-        <w:spacing w:line="276" w:lineRule="auto"/>
-      </w:pPr>
-      <w:r>
-        <w:rPr>
-          <w:rFonts w:ascii="Arial" w:hAnsi="Arial"/>
-          <w:sz w:val="28"/>
-        </w:rPr>
-        <w:t xml:space="preserve">   (Patrick, #74-new; reverses #52-new). The page</w:t>
-      </w:r>
-    </w:p>
-    <w:p>
-      <w:pPr>
-        <w:spacing w:line="276" w:lineRule="auto"/>
-      </w:pPr>
-      <w:r>
-        <w:rPr>
-          <w:rFonts w:ascii="Arial" w:hAnsi="Arial"/>
-          <w:sz w:val="28"/>
-        </w:rPr>
-        <w:t xml:space="preserve">   is called Appointments (#56-new; saved kind appointments, #65-new).</w:t>
-      </w:r>
-    </w:p>
-    <w:p>
-      <w:pPr>
-        <w:spacing w:line="276" w:lineRule="auto"/>
-      </w:pPr>
-      <w:r>
-        <w:rPr>
-          <w:rFonts w:ascii="Arial" w:hAnsi="Arial"/>
-          <w:sz w:val="28"/>
-        </w:rPr>
-        <w:t xml:space="preserve">4. DAILY'S OWN ADD IS ONLY ABOUT TODAY. Two kinds: an every-day</w:t>
-      </w:r>
-    </w:p>
-    <w:p>
-      <w:pPr>
-        <w:spacing w:line="276" w:lineRule="auto"/>
-      </w:pPr>
-      <w:r>
-        <w:rPr>
-          <w:rFonts w:ascii="Arial" w:hAnsi="Arial"/>
-          <w:sz w:val="28"/>
-        </w:rPr>
-        <w:t xml:space="preserve">   item, or a One Time for today. On One Time for today the</w:t>
-      </w:r>
-    </w:p>
-    <w:p>
-      <w:pPr>
-        <w:spacing w:line="276" w:lineRule="auto"/>
-      </w:pPr>
-      <w:r>
-        <w:rPr>
-          <w:rFonts w:ascii="Arial" w:hAnsi="Arial"/>
-          <w:sz w:val="28"/>
-        </w:rPr>
-        <w:t xml:space="preserve">   Reminders before chips are only 30 min., 1 hour, 2 hours, and</w:t>
-      </w:r>
-    </w:p>
-    <w:p>
-      <w:pPr>
-        <w:spacing w:line="276" w:lineRule="auto"/>
-      </w:pPr>
-      <w:r>
-        <w:rPr>
-          <w:rFonts w:ascii="Arial" w:hAnsi="Arial"/>
-          <w:sz w:val="28"/>
-        </w:rPr>
-        <w:t xml:space="preserve">   Time of (the item's own time). Save on that kind comes back on</w:t>
-      </w:r>
-    </w:p>
-    <w:p>
-      <w:pPr>
-        <w:spacing w:line="276" w:lineRule="auto"/>
-      </w:pPr>
-      <w:r>
-        <w:rPr>
-          <w:rFonts w:ascii="Arial" w:hAnsi="Arial"/>
-          <w:sz w:val="28"/>
-        </w:rPr>
-        <w:t xml:space="preserve">   Daily. It is Daily's own one-shot, not an Appointment. An</w:t>
-      </w:r>
-    </w:p>
-    <w:p>
-      <w:pPr>
-        <w:spacing w:line="276" w:lineRule="auto"/>
-      </w:pPr>
-      <w:r>
-        <w:rPr>
-          <w:rFonts w:ascii="Arial" w:hAnsi="Arial"/>
-          <w:sz w:val="28"/>
-        </w:rPr>
-        <w:t xml:space="preserve">   Appointment that falls today still shows on Daily as from</w:t>
-      </w:r>
-    </w:p>
-    <w:p>
-      <w:pPr>
-        <w:spacing w:line="276" w:lineRule="auto"/>
-      </w:pPr>
-      <w:r>
-        <w:rPr>
-          <w:rFonts w:ascii="Arial" w:hAnsi="Arial"/>
-          <w:sz w:val="28"/>
-        </w:rPr>
-        <w:t xml:space="preserve">   Appointments, and still lives on Appointments. The other pages keep their</w:t>
-      </w:r>
-    </w:p>
-    <w:p>
-      <w:pPr>
-        <w:spacing w:line="276" w:lineRule="auto"/>
-      </w:pPr>
-      <w:r>
-        <w:rPr>
-          <w:rFonts w:ascii="Arial" w:hAnsi="Arial"/>
-          <w:sz w:val="28"/>
-        </w:rPr>
-        <w:t xml:space="preserve">   own adds, because on those the page is the whole meaning of Repeat.</w:t>
-      </w:r>
-    </w:p>
-    <w:p>
-      <w:pPr>
-        <w:spacing w:line="276" w:lineRule="auto"/>
-      </w:pPr>
-      <w:r>
-        <w:rPr>
-          <w:rFonts w:ascii="Arial" w:hAnsi="Arial"/>
-          <w:sz w:val="28"/>
-        </w:rPr>
-        <w:t xml:space="preserve">   (#78-new)</w:t>
-      </w:r>
-    </w:p>
-    <w:p>
-      <w:pPr>
-        <w:spacing w:line="276" w:lineRule="auto"/>
-      </w:pPr>
-      <w:r>
-        <w:rPr>
-          <w:rFonts w:ascii="Arial" w:hAnsi="Arial"/>
-          <w:sz w:val="28"/>
-        </w:rPr>
-        <w:t xml:space="preserve">5. ONE REMINDER PER ITEM, NOT TWO, and the app puts itself right</w:t>
-      </w:r>
-    </w:p>
-    <w:p>
-      <w:pPr>
-        <w:spacing w:line="276" w:lineRule="auto"/>
-      </w:pPr>
-      <w:r>
-        <w:rPr>
-          <w:rFonts w:ascii="Arial" w:hAnsi="Arial"/>
-          <w:sz w:val="28"/>
-        </w:rPr>
-        <w:t xml:space="preserve">   when you open it: it tells you what you missed, then sets the</w:t>
-      </w:r>
-    </w:p>
-    <w:p>
-      <w:pPr>
-        <w:spacing w:line="276" w:lineRule="auto"/>
-      </w:pPr>
-      <w:r>
-        <w:rPr>
-          <w:rFonts w:ascii="Arial" w:hAnsi="Arial"/>
-          <w:sz w:val="28"/>
-        </w:rPr>
-        <w:t xml:space="preserve">   reminders again. That is your own reasoning and it replaced the</w:t>
-      </w:r>
-    </w:p>
-    <w:p>
-      <w:pPr>
-        <w:spacing w:line="276" w:lineRule="auto"/>
-      </w:pPr>
-      <w:r>
-        <w:rPr>
-          <w:rFonts w:ascii="Arial" w:hAnsi="Arial"/>
-          <w:sz w:val="28"/>
-        </w:rPr>
-        <w:t xml:space="preserve">   old two-days-ahead rule. A Daily item still arms for tomorrow</w:t>
-      </w:r>
-    </w:p>
-    <w:p>
-      <w:pPr>
-        <w:spacing w:line="276" w:lineRule="auto"/>
-      </w:pPr>
-      <w:r>
-        <w:rPr>
-          <w:rFonts w:ascii="Arial" w:hAnsi="Arial"/>
-          <w:sz w:val="28"/>
-        </w:rPr>
-        <w:t xml:space="preserve">   after Done; that is still one reminder, not two (Patrick, #44-new).</w:t>
-      </w:r>
-    </w:p>
-    <w:p>
-      <w:pPr>
-        <w:spacing w:line="276" w:lineRule="auto"/>
-      </w:pPr>
-      <w:r>
-        <w:rPr>
-          <w:rFonts w:ascii="Arial" w:hAnsi="Arial"/>
-          <w:sz w:val="28"/>
-        </w:rPr>
-        <w:t xml:space="preserve">6. ROCK SOLID IS THE TOP GOAL BUT NOT THE ONLY ONE. Consistency</w:t>
-      </w:r>
-    </w:p>
-    <w:p>
-      <w:pPr>
-        <w:spacing w:line="276" w:lineRule="auto"/>
-      </w:pPr>
-      <w:r>
-        <w:rPr>
-          <w:rFonts w:ascii="Arial" w:hAnsi="Arial"/>
-          <w:sz w:val="28"/>
-        </w:rPr>
-        <w:t xml:space="preserve">   stands beside it. That correction is yours, from #17-new.</w:t>
-      </w:r>
-    </w:p>
-    <w:p>
-      <w:pPr>
-        <w:spacing w:line="276" w:lineRule="auto"/>
-      </w:pPr>
-      <w:r>
-        <w:rPr>
-          <w:rFonts w:ascii="Arial" w:hAnsi="Arial"/>
-          <w:sz w:val="28"/>
-        </w:rPr>
-        <w:t xml:space="preserve">7. ROCK SOLID IS FOR WHEN YOU USE IT. An app that is not being</w:t>
-      </w:r>
-    </w:p>
-    <w:p>
-      <w:pPr>
-        <w:spacing w:line="276" w:lineRule="auto"/>
-      </w:pPr>
-      <w:r>
-        <w:rPr>
-          <w:rFonts w:ascii="Arial" w:hAnsi="Arial"/>
-          <w:sz w:val="28"/>
-        </w:rPr>
-        <w:t xml:space="preserve">   opened is not being used, and what the old second copy protected</w:t>
-      </w:r>
-    </w:p>
-    <w:p>
-      <w:pPr>
-        <w:spacing w:line="276" w:lineRule="auto"/>
-      </w:pPr>
-      <w:r>
-        <w:rPr>
-          <w:rFonts w:ascii="Arial" w:hAnsi="Arial"/>
-          <w:sz w:val="28"/>
-        </w:rPr>
-        <w:t xml:space="preserve">   was one day and no more.</w:t>
-      </w:r>
-    </w:p>
-    <w:p>
-      <w:pPr>
-        <w:spacing w:line="276" w:lineRule="auto"/>
-      </w:pPr>
-      <w:r>
-        <w:rPr>
-          <w:rFonts w:ascii="Arial" w:hAnsi="Arial"/>
-          <w:sz w:val="28"/>
-        </w:rPr>
-        <w:t xml:space="preserve">8. AN EXTENDED ITEM AND A DAILY TICK ARE OPPOSITES. A Bucket List</w:t>
-      </w:r>
-    </w:p>
-    <w:p>
-      <w:pPr>
-        <w:spacing w:line="276" w:lineRule="auto"/>
-      </w:pPr>
-      <w:r>
-        <w:rPr>
-          <w:rFonts w:ascii="Arial" w:hAnsi="Arial"/>
-          <w:sz w:val="28"/>
-        </w:rPr>
-        <w:t xml:space="preserve">   item (saved kind bucketlist) says a thing is not yet done and must</w:t>
-      </w:r>
-    </w:p>
-    <w:p>
-      <w:pPr>
-        <w:spacing w:line="276" w:lineRule="auto"/>
-      </w:pPr>
-      <w:r>
-        <w:rPr>
-          <w:rFonts w:ascii="Arial" w:hAnsi="Arial"/>
-          <w:sz w:val="28"/>
-        </w:rPr>
-        <w:t xml:space="preserve">   survive the night. The coffee-and-water sort says a thing was</w:t>
-      </w:r>
-    </w:p>
-    <w:p>
-      <w:pPr>
-        <w:spacing w:line="276" w:lineRule="auto"/>
-      </w:pPr>
-      <w:r>
-        <w:rPr>
-          <w:rFonts w:ascii="Arial" w:hAnsi="Arial"/>
-          <w:sz w:val="28"/>
-        </w:rPr>
-        <w:t xml:space="preserve">   done today and is meaningless the morning after. They must never</w:t>
-      </w:r>
-    </w:p>
-    <w:p>
-      <w:pPr>
-        <w:spacing w:line="276" w:lineRule="auto"/>
-      </w:pPr>
-      <w:r>
-        <w:rPr>
-          <w:rFonts w:ascii="Arial" w:hAnsi="Arial"/>
-          <w:sz w:val="28"/>
-        </w:rPr>
-        <w:t xml:space="preserve">   be merged.</w:t>
-      </w:r>
-    </w:p>
-    <w:p>
-      <w:pPr>
-        <w:spacing w:line="276" w:lineRule="auto"/>
-      </w:pPr>
-      <w:r>
-        <w:rPr>
-          <w:rFonts w:ascii="Arial" w:hAnsi="Arial"/>
-          <w:sz w:val="28"/>
-        </w:rPr>
-        <w:t xml:space="preserve">9. TIMES SET BY SPINNING THROUGH NOON OR MIDNIGHT BEFORE #27-new</w:t>
-      </w:r>
-    </w:p>
-    <w:p>
-      <w:pPr>
-        <w:spacing w:line="276" w:lineRule="auto"/>
-      </w:pPr>
-      <w:r>
-        <w:rPr>
-          <w:rFonts w:ascii="Arial" w:hAnsi="Arial"/>
-          <w:sz w:val="28"/>
-        </w:rPr>
-        <w:t xml:space="preserve">    are stored in the wrong half of the day and want re-setting.</w:t>
-      </w:r>
-    </w:p>
-    <w:p>
-      <w:pPr>
-        <w:spacing w:line="276" w:lineRule="auto"/>
-      </w:pPr>
-      <w:r>
-        <w:rPr>
-          <w:rFonts w:ascii="Arial" w:hAnsi="Arial"/>
-          <w:sz w:val="28"/>
-        </w:rPr>
-        <w:t xml:space="preserve">10. TASKS SAVED BEFORE THE DATE FIX carry a date they were given</w:t>
-      </w:r>
-    </w:p>
-    <w:p>
-      <w:pPr>
-        <w:spacing w:line="276" w:lineRule="auto"/>
-      </w:pPr>
-      <w:r>
-        <w:rPr>
-          <w:rFonts w:ascii="Arial" w:hAnsi="Arial"/>
-          <w:sz w:val="28"/>
-        </w:rPr>
-        <w:t xml:space="preserve">    rather than one you chose.</w:t>
-      </w:r>
-    </w:p>
-    <w:p>
-      <w:pPr>
-        <w:spacing w:line="276" w:lineRule="auto"/>
-      </w:pPr>
-      <w:r>
-        <w:rPr>
-          <w:rFonts w:ascii="Arial" w:hAnsi="Arial"/>
-          <w:sz w:val="28"/>
-        </w:rPr>
-        <w:t xml:space="preserve">11. A BIG PIECE GETS A BUILD SHEET FIRST — self-contained, carrying</w:t>
-      </w:r>
-    </w:p>
-    <w:p>
-      <w:pPr>
-        <w:spacing w:line="276" w:lineRule="auto"/>
-      </w:pPr>
-      <w:r>
-        <w:rPr>
-          <w:rFonts w:ascii="Arial" w:hAnsi="Arial"/>
-          <w:sz w:val="28"/>
-        </w:rPr>
-        <w:t xml:space="preserve">    every answer, so whoever builds it never has to ask you a</w:t>
-      </w:r>
-    </w:p>
-    <w:p>
-      <w:pPr>
-        <w:spacing w:line="276" w:lineRule="auto"/>
-      </w:pPr>
-      <w:r>
-        <w:rPr>
-          <w:rFonts w:ascii="Arial" w:hAnsi="Arial"/>
-          <w:sz w:val="28"/>
-        </w:rPr>
-        <w:t xml:space="preserve">    design question.</w:t>
-      </w:r>
-    </w:p>
-    <w:p>
-      <w:pPr>
-        <w:spacing w:line="276" w:lineRule="auto"/>
-      </w:pPr>
-      <w:r>
-        <w:rPr>
-          <w:rFonts w:ascii="Arial" w:hAnsi="Arial"/>
-          <w:sz w:val="28"/>
-        </w:rPr>
-        <w:t xml:space="preserve">12. BARE SESSION NUMBERS mean the old shared chain. This project's</w:t>
-      </w:r>
-    </w:p>
-    <w:p>
-      <w:pPr>
-        <w:spacing w:line="276" w:lineRule="auto"/>
-      </w:pPr>
-      <w:r>
-        <w:rPr>
-          <w:rFonts w:ascii="Arial" w:hAnsi="Arial"/>
-          <w:sz w:val="28"/>
-        </w:rPr>
-        <w:t xml:space="preserve">    own chain is written #1-new, #2-new, and so on.</w:t>
-      </w:r>
-    </w:p>
-    <w:p>
-      <w:pPr>
-        <w:spacing w:line="276" w:lineRule="auto"/>
-      </w:pPr>
-      <w:r>
-        <w:rPr>
-          <w:rFonts w:ascii="Arial" w:hAnsi="Arial"/>
-          <w:sz w:val="28"/>
-        </w:rPr>
-        <w:t xml:space="preserve">13. WORKING DOCUMENTS LIVE IN docs. History lives in docs-ref, and</w:t>
-      </w:r>
-    </w:p>
-    <w:p>
-      <w:pPr>
-        <w:spacing w:line="276" w:lineRule="auto"/>
-      </w:pPr>
-      <w:r>
-        <w:rPr>
-          <w:rFonts w:ascii="Arial" w:hAnsi="Arial"/>
-          <w:sz w:val="28"/>
-        </w:rPr>
-        <w:t xml:space="preserve">    the build sheets are in docs-ref/build-sheets. The index</w:t>
-      </w:r>
-    </w:p>
-    <w:p>
-      <w:pPr>
-        <w:spacing w:line="276" w:lineRule="auto"/>
-      </w:pPr>
-      <w:r>
-        <w:rPr>
-          <w:rFonts w:ascii="Arial" w:hAnsi="Arial"/>
-          <w:sz w:val="28"/>
-        </w:rPr>
-        <w:t xml:space="preserve">    says which file is the home. He calls them working documents;</w:t>
-      </w:r>
-    </w:p>
-    <w:p>
-      <w:pPr>
-        <w:spacing w:line="276" w:lineRule="auto"/>
-      </w:pPr>
-      <w:r>
-        <w:rPr>
-          <w:rFonts w:ascii="Arial" w:hAnsi="Arial"/>
-          <w:sz w:val="28"/>
-        </w:rPr>
-        <w:t xml:space="preserve">    live desk means the same thing. (App-Docs, 2026-08-31)</w:t>
-      </w:r>
-    </w:p>
-    <w:p>
-      <w:pPr>
-        <w:spacing w:line="276" w:lineRule="auto"/>
-      </w:pPr>
-      <w:r>
-        <w:rPr>
-          <w:rFonts w:ascii="Arial" w:hAnsi="Arial"/>
-          <w:sz w:val="28"/>
-        </w:rPr>
-        <w:t xml:space="preserve">14. THE CALENDAR PAGE SHOWS DATED ITEMS. No every-day Daily items,</w:t>
-      </w:r>
-    </w:p>
-    <w:p>
-      <w:pPr>
-        <w:spacing w:line="276" w:lineRule="auto"/>
-      </w:pPr>
-      <w:r>
-        <w:rPr>
-          <w:rFonts w:ascii="Arial" w:hAnsi="Arial"/>
-          <w:sz w:val="28"/>
-        </w:rPr>
-        <w:t xml:space="preserve">    no Bucket List. No Done or Snooze on the month or the day’s list.</w:t>
-      </w:r>
-    </w:p>
-    <w:p>
-      <w:pPr>
-        <w:spacing w:line="276" w:lineRule="auto"/>
-      </w:pPr>
-      <w:r>
-        <w:rPr>
-          <w:rFonts w:ascii="Arial" w:hAnsi="Arial"/>
-          <w:sz w:val="28"/>
-        </w:rPr>
-        <w:t xml:space="preserve">    Names in a day box are one line and scroll vertically.</w:t>
-      </w:r>
-    </w:p>
-    <w:p>
-      <w:pPr>
-        <w:spacing w:line="276" w:lineRule="auto"/>
-      </w:pPr>
-      <w:r>
-        <w:rPr>
-          <w:rFonts w:ascii="Arial" w:hAnsi="Arial"/>
-          <w:sz w:val="28"/>
-        </w:rPr>
-        <w:t xml:space="preserve">    Landscape is an optional view: 0°, 90° counter-clockwise, and</w:t>
-      </w:r>
-    </w:p>
-    <w:p>
-      <w:pPr>
-        <w:spacing w:line="276" w:lineRule="auto"/>
-      </w:pPr>
-      <w:r>
-        <w:rPr>
-          <w:rFonts w:ascii="Arial" w:hAnsi="Arial"/>
-          <w:sz w:val="28"/>
-        </w:rPr>
-        <w:t xml:space="preserve">    270° counter-clockwise; 180° upside-down is out. Headers stay</w:t>
-      </w:r>
-    </w:p>
-    <w:p>
-      <w:pPr>
-        <w:spacing w:line="276" w:lineRule="auto"/>
-      </w:pPr>
-      <w:r>
-        <w:rPr>
-          <w:rFonts w:ascii="Arial" w:hAnsi="Arial"/>
-          <w:sz w:val="28"/>
-        </w:rPr>
-        <w:t xml:space="preserve">    at the physical top of the phone, all pages. The calendar month</w:t>
-      </w:r>
-    </w:p>
-    <w:p>
-      <w:pPr>
-        <w:spacing w:line="276" w:lineRule="auto"/>
-      </w:pPr>
-      <w:r>
-        <w:rPr>
-          <w:rFonts w:ascii="Arial" w:hAnsi="Arial"/>
-          <w:sz w:val="28"/>
-        </w:rPr>
-        <w:t xml:space="preserve">    grid was not rebuilt.</w:t>
-      </w:r>
-    </w:p>
-    <w:p>
-      <w:pPr>
-        <w:spacing w:line="276" w:lineRule="auto"/>
-      </w:pPr>
-      <w:r>
-        <w:rPr>
-          <w:rFonts w:ascii="Arial" w:hAnsi="Arial"/>
-          <w:sz w:val="28"/>
-        </w:rPr>
-        <w:t xml:space="preserve">15. HAVING A GOOD IDEA LEADS TO OVERREACHING (Patrick, #52-new).</w:t>
-      </w:r>
-    </w:p>
-    <w:p>
-      <w:pPr>
-        <w:spacing w:line="276" w:lineRule="auto"/>
-      </w:pPr>
-      <w:r>
-        <w:rPr>
-          <w:rFonts w:ascii="Arial" w:hAnsi="Arial"/>
-          <w:sz w:val="28"/>
-        </w:rPr>
-        <w:t xml:space="preserve">    The feedback he needs is the trim: what part is worth it,</w:t>
-      </w:r>
-    </w:p>
-    <w:p>
-      <w:pPr>
-        <w:spacing w:line="276" w:lineRule="auto"/>
-      </w:pPr>
-      <w:r>
-        <w:rPr>
-          <w:rFonts w:ascii="Arial" w:hAnsi="Arial"/>
-          <w:sz w:val="28"/>
-        </w:rPr>
-        <w:t xml:space="preserve">    and what is more than is there.</w:t>
-      </w:r>
-    </w:p>
-    <w:p>
-      <w:pPr>
-        <w:spacing w:line="276" w:lineRule="auto"/>
-      </w:pPr>
-      <w:r>
-        <w:rPr>
-          <w:rFonts w:ascii="Arial" w:hAnsi="Arial"/>
-          <w:sz w:val="28"/>
-        </w:rPr>
-        <w:t xml:space="preserve">16. THE DESIGN DESCRIPTION IS THE DESIGNED IMPLEMENTATION</w:t>
-      </w:r>
-    </w:p>
-    <w:p>
-      <w:pPr>
-        <w:spacing w:line="276" w:lineRule="auto"/>
-      </w:pPr>
-      <w:r>
-        <w:rPr>
-          <w:rFonts w:ascii="Arial" w:hAnsi="Arial"/>
-          <w:sz w:val="28"/>
-        </w:rPr>
-        <w:t xml:space="preserve">    (Patrick, #84-new). It is the guide for the whole app. A sitting</w:t>
-      </w:r>
-    </w:p>
-    <w:p>
-      <w:pPr>
-        <w:spacing w:line="276" w:lineRule="auto"/>
-      </w:pPr>
-      <w:r>
-        <w:rPr>
-          <w:rFonts w:ascii="Arial" w:hAnsi="Arial"/>
-          <w:sz w:val="28"/>
-        </w:rPr>
-        <w:t xml:space="preserve">    builds from docs/designed-implementation.md and does not ask</w:t>
-      </w:r>
-    </w:p>
-    <w:p>
-      <w:pPr>
-        <w:spacing w:line="276" w:lineRule="auto"/>
-      </w:pPr>
-      <w:r>
-        <w:rPr>
-          <w:rFonts w:ascii="Arial" w:hAnsi="Arial"/>
-          <w:sz w:val="28"/>
-        </w:rPr>
-        <w:t xml:space="preserve">    Patrick a design question. Home, Help, Calendar, Settings, Backup,</w:t>
-      </w:r>
-    </w:p>
-    <w:p>
-      <w:pPr>
-        <w:spacing w:line="276" w:lineRule="auto"/>
-      </w:pPr>
-      <w:r>
-        <w:rPr>
-          <w:rFonts w:ascii="Arial" w:hAnsi="Arial"/>
-          <w:sz w:val="28"/>
-        </w:rPr>
-        <w:t xml:space="preserve">    Scheduled Reminders, and Options are in that file.</w:t>
+        <w:t xml:space="preserve">90. #95-new — morning dated Done tick reads that Done moves the</w:t>
+      </w:r>
+    </w:p>
+    <w:p>
+      <w:pPr>
+        <w:spacing w:line="276" w:lineRule="auto"/>
+      </w:pPr>
+      <w:r>
+        <w:rPr>
+          <w:rFonts w:ascii="Arial" w:hAnsi="Arial"/>
+          <w:sz w:val="28"/>
+        </w:rPr>
+        <w:t xml:space="preserve">   date. Old Options page gone.</w:t>
       </w:r>
     </w:p>
     <w:p>
@@ -1791,6 +1852,42 @@
           <w:rFonts w:ascii="Arial" w:hAnsi="Arial"/>
           <w:sz w:val="28"/>
         </w:rPr>
+        <w:t xml:space="preserve">89. #94-new — missing-day banner on the dated rows. Options chips</w:t>
+      </w:r>
+    </w:p>
+    <w:p>
+      <w:pPr>
+        <w:spacing w:line="276" w:lineRule="auto"/>
+      </w:pPr>
+      <w:r>
+        <w:rPr>
+          <w:rFonts w:ascii="Arial" w:hAnsi="Arial"/>
+          <w:sz w:val="28"/>
+        </w:rPr>
+        <w:t xml:space="preserve">   off. Done and Save keep a 31st as the 31st. February still uses</w:t>
+      </w:r>
+    </w:p>
+    <w:p>
+      <w:pPr>
+        <w:spacing w:line="276" w:lineRule="auto"/>
+      </w:pPr>
+      <w:r>
+        <w:rPr>
+          <w:rFonts w:ascii="Arial" w:hAnsi="Arial"/>
+          <w:sz w:val="28"/>
+        </w:rPr>
+        <w:t xml:space="preserve">   the 28th that month. Not a remembered rule. Not on the phone.</w:t>
+      </w:r>
+    </w:p>
+    <w:p>
+      <w:pPr>
+        <w:spacing w:line="276" w:lineRule="auto"/>
+      </w:pPr>
+      <w:r>
+        <w:rPr>
+          <w:rFonts w:ascii="Arial" w:hAnsi="Arial"/>
+          <w:sz w:val="28"/>
+        </w:rPr>
         <w:t xml:space="preserve"/>
       </w:r>
     </w:p>
@@ -1801,70 +1898,141 @@
       <w:r>
         <w:rPr>
           <w:rFonts w:ascii="Arial" w:hAnsi="Arial"/>
-          <w:b/>
-          <w:sz w:val="28"/>
-        </w:rPr>
-        <w:t xml:space="preserve">WHAT IS DONE, NEWEST FIRST</w:t>
-      </w:r>
-    </w:p>
-    <w:p>
-      <w:pPr>
-        <w:spacing w:line="276" w:lineRule="auto"/>
-      </w:pPr>
-      <w:r>
-        <w:rPr>
-          <w:rFonts w:ascii="Arial" w:hAnsi="Arial"/>
-          <w:sz w:val="28"/>
-        </w:rPr>
-        <w:t xml:space="preserve">------------------------------------------------------------------</w:t>
-      </w:r>
-    </w:p>
-    <w:p>
-      <w:pPr>
-        <w:spacing w:line="276" w:lineRule="auto"/>
-      </w:pPr>
-      <w:r>
-        <w:rPr>
-          <w:rFonts w:ascii="Arial" w:hAnsi="Arial"/>
-          <w:sz w:val="28"/>
-        </w:rPr>
-        <w:t xml:space="preserve">Newest at the top. Number 1 is the oldest line, at the bottom.</w:t>
-      </w:r>
-    </w:p>
-    <w:p>
-      <w:pPr>
-        <w:spacing w:line="276" w:lineRule="auto"/>
-      </w:pPr>
-      <w:r>
-        <w:rPr>
-          <w:rFonts w:ascii="Arial" w:hAnsi="Arial"/>
-          <w:sz w:val="28"/>
-        </w:rPr>
-        <w:t xml:space="preserve">A new sitting gets the next number on top; nothing else is</w:t>
-      </w:r>
-    </w:p>
-    <w:p>
-      <w:pPr>
-        <w:spacing w:line="276" w:lineRule="auto"/>
-      </w:pPr>
-      <w:r>
-        <w:rPr>
-          <w:rFonts w:ascii="Arial" w:hAnsi="Arial"/>
-          <w:sz w:val="28"/>
-        </w:rPr>
-        <w:t xml:space="preserve">renumbered. One line each. The full story is in</w:t>
-      </w:r>
-    </w:p>
-    <w:p>
-      <w:pPr>
-        <w:spacing w:line="276" w:lineRule="auto"/>
-      </w:pPr>
-      <w:r>
-        <w:rPr>
-          <w:rFonts w:ascii="Arial" w:hAnsi="Arial"/>
-          <w:sz w:val="28"/>
-        </w:rPr>
-        <w:t xml:space="preserve">docs/handoff-history.md.</w:t>
+          <w:sz w:val="28"/>
+        </w:rPr>
+        <w:t xml:space="preserve">88. #93-new — Daily One Time snooze. It was missing because One</w:t>
+      </w:r>
+    </w:p>
+    <w:p>
+      <w:pPr>
+        <w:spacing w:line="276" w:lineRule="auto"/>
+      </w:pPr>
+      <w:r>
+        <w:rPr>
+          <w:rFonts w:ascii="Arial" w:hAnsi="Arial"/>
+          <w:sz w:val="28"/>
+        </w:rPr>
+        <w:t xml:space="preserve">   Time starts as Appointments. The table turns push-back on and</w:t>
+      </w:r>
+    </w:p>
+    <w:p>
+      <w:pPr>
+        <w:spacing w:line="276" w:lineRule="auto"/>
+      </w:pPr>
+      <w:r>
+        <w:rPr>
+          <w:rFonts w:ascii="Arial" w:hAnsi="Arial"/>
+          <w:sz w:val="28"/>
+        </w:rPr>
+        <w:t xml:space="preserve">   uses Daily's banner buttons. Snooze is there. Both fire.</w:t>
+      </w:r>
+    </w:p>
+    <w:p>
+      <w:pPr>
+        <w:spacing w:line="276" w:lineRule="auto"/>
+      </w:pPr>
+      <w:r>
+        <w:rPr>
+          <w:rFonts w:ascii="Arial" w:hAnsi="Arial"/>
+          <w:sz w:val="28"/>
+        </w:rPr>
+        <w:t xml:space="preserve">   Snoozes work from the edit page and from the banner. Not on</w:t>
+      </w:r>
+    </w:p>
+    <w:p>
+      <w:pPr>
+        <w:spacing w:line="276" w:lineRule="auto"/>
+      </w:pPr>
+      <w:r>
+        <w:rPr>
+          <w:rFonts w:ascii="Arial" w:hAnsi="Arial"/>
+          <w:sz w:val="28"/>
+        </w:rPr>
+        <w:t xml:space="preserve">   the phone.</w:t>
+      </w:r>
+    </w:p>
+    <w:p>
+      <w:pPr>
+        <w:spacing w:line="276" w:lineRule="auto"/>
+      </w:pPr>
+      <w:r>
+        <w:rPr>
+          <w:rFonts w:ascii="Arial" w:hAnsi="Arial"/>
+          <w:sz w:val="28"/>
+        </w:rPr>
+        <w:t xml:space="preserve"/>
+      </w:r>
+    </w:p>
+    <w:p>
+      <w:pPr>
+        <w:spacing w:line="276" w:lineRule="auto"/>
+      </w:pPr>
+      <w:r>
+        <w:rPr>
+          <w:rFonts w:ascii="Arial" w:hAnsi="Arial"/>
+          <w:sz w:val="28"/>
+        </w:rPr>
+        <w:t xml:space="preserve">87. #92-new — save form writes from the table. Both pieces.</w:t>
+      </w:r>
+    </w:p>
+    <w:p>
+      <w:pPr>
+        <w:spacing w:line="276" w:lineRule="auto"/>
+      </w:pPr>
+      <w:r>
+        <w:rPr>
+          <w:rFonts w:ascii="Arial" w:hAnsi="Arial"/>
+          <w:sz w:val="28"/>
+        </w:rPr>
+        <w:t xml:space="preserve">   Not on the phone.</w:t>
+      </w:r>
+    </w:p>
+    <w:p>
+      <w:pPr>
+        <w:spacing w:line="276" w:lineRule="auto"/>
+      </w:pPr>
+      <w:r>
+        <w:rPr>
+          <w:rFonts w:ascii="Arial" w:hAnsi="Arial"/>
+          <w:sz w:val="28"/>
+        </w:rPr>
+        <w:t xml:space="preserve"/>
+      </w:r>
+    </w:p>
+    <w:p>
+      <w:pPr>
+        <w:spacing w:line="276" w:lineRule="auto"/>
+      </w:pPr>
+      <w:r>
+        <w:rPr>
+          <w:rFonts w:ascii="Arial" w:hAnsi="Arial"/>
+          <w:sz w:val="28"/>
+        </w:rPr>
+        <w:t xml:space="preserve">86. #91-new — four table-door pieces. Done as the three-word code,</w:t>
+      </w:r>
+    </w:p>
+    <w:p>
+      <w:pPr>
+        <w:spacing w:line="276" w:lineRule="auto"/>
+      </w:pPr>
+      <w:r>
+        <w:rPr>
+          <w:rFonts w:ascii="Arial" w:hAnsi="Arial"/>
+          <w:sz w:val="28"/>
+        </w:rPr>
+        <w:t xml:space="preserve">   exclusive groups as one group, Quarterly step, list Snooze from</w:t>
+      </w:r>
+    </w:p>
+    <w:p>
+      <w:pPr>
+        <w:spacing w:line="276" w:lineRule="auto"/>
+      </w:pPr>
+      <w:r>
+        <w:rPr>
+          <w:rFonts w:ascii="Arial" w:hAnsi="Arial"/>
+          <w:sz w:val="28"/>
+        </w:rPr>
+        <w:t xml:space="preserve">   the banner set. Not on the phone.</w:t>
       </w:r>
     </w:p>
     <w:p>

</xml_diff>

<commit_message>
98-new - The Users Guide is written and in the app.
</commit_message>
<xml_diff>
--- a/docs/pending.docx
+++ b/docs/pending.docx
@@ -24,7 +24,7 @@
           <w:rFonts w:ascii="Arial" w:hAnsi="Arial"/>
           <w:sz w:val="28"/>
         </w:rPr>
-        <w:t xml:space="preserve">Last updated: 2026-09-09 (#97-new)</w:t>
+        <w:t xml:space="preserve">Last updated: 2026-09-09 (#98-new)</w:t>
       </w:r>
     </w:p>
     <w:p>
@@ -325,67 +325,31 @@
           <w:rFonts w:ascii="Arial" w:hAnsi="Arial"/>
           <w:sz w:val="28"/>
         </w:rPr>
-        <w:t xml:space="preserve">1. A BRIEF USER'S GUIDE IN THE APP (Patrick, #97-new). It is a tile</w:t>
-      </w:r>
-    </w:p>
-    <w:p>
-      <w:pPr>
-        <w:spacing w:line="276" w:lineRule="auto"/>
-      </w:pPr>
-      <w:r>
-        <w:rPr>
-          <w:rFonts w:ascii="Arial" w:hAnsi="Arial"/>
-          <w:sz w:val="28"/>
-        </w:rPr>
-        <w:t xml:space="preserve">   on Settings. A tap opens a brief guide that lives in the app. It</w:t>
-      </w:r>
-    </w:p>
-    <w:p>
-      <w:pPr>
-        <w:spacing w:line="276" w:lineRule="auto"/>
-      </w:pPr>
-      <w:r>
-        <w:rPr>
-          <w:rFonts w:ascii="Arial" w:hAnsi="Arial"/>
-          <w:sz w:val="28"/>
-        </w:rPr>
-        <w:t xml:space="preserve">   does not go on a website. The app is self-contained. A person's</w:t>
-      </w:r>
-    </w:p>
-    <w:p>
-      <w:pPr>
-        <w:spacing w:line="276" w:lineRule="auto"/>
-      </w:pPr>
-      <w:r>
-        <w:rPr>
-          <w:rFonts w:ascii="Arial" w:hAnsi="Arial"/>
-          <w:sz w:val="28"/>
-        </w:rPr>
-        <w:t xml:space="preserve">   data stays on the phone. The app does not reach out to read or</w:t>
-      </w:r>
-    </w:p>
-    <w:p>
-      <w:pPr>
-        <w:spacing w:line="276" w:lineRule="auto"/>
-      </w:pPr>
-      <w:r>
-        <w:rPr>
-          <w:rFonts w:ascii="Arial" w:hAnsi="Arial"/>
-          <w:sz w:val="28"/>
-        </w:rPr>
-        <w:t xml:space="preserve">   write from the outside world. What is already in App Store</w:t>
-      </w:r>
-    </w:p>
-    <w:p>
-      <w:pPr>
-        <w:spacing w:line="276" w:lineRule="auto"/>
-      </w:pPr>
-      <w:r>
-        <w:rPr>
-          <w:rFonts w:ascii="Arial" w:hAnsi="Arial"/>
-          <w:sz w:val="28"/>
-        </w:rPr>
-        <w:t xml:space="preserve">   Connect stays there. Not built.</w:t>
+        <w:t xml:space="preserve">1. DAY-ROLL LOCK still wants a night of all-green Daily on this</w:t>
+      </w:r>
+    </w:p>
+    <w:p>
+      <w:pPr>
+        <w:spacing w:line="276" w:lineRule="auto"/>
+      </w:pPr>
+      <w:r>
+        <w:rPr>
+          <w:rFonts w:ascii="Arial" w:hAnsi="Arial"/>
+          <w:sz w:val="28"/>
+        </w:rPr>
+        <w:t xml:space="preserve">   load, then a morning open on a new load, to confirm the pop-up</w:t>
+      </w:r>
+    </w:p>
+    <w:p>
+      <w:pPr>
+        <w:spacing w:line="276" w:lineRule="auto"/>
+      </w:pPr>
+      <w:r>
+        <w:rPr>
+          <w:rFonts w:ascii="Arial" w:hAnsi="Arial"/>
+          <w:sz w:val="28"/>
+        </w:rPr>
+        <w:t xml:space="preserve">   stays quiet.</w:t>
       </w:r>
     </w:p>
     <w:p>
@@ -409,42 +373,6 @@
           <w:rFonts w:ascii="Arial" w:hAnsi="Arial"/>
           <w:sz w:val="28"/>
         </w:rPr>
-        <w:t xml:space="preserve">2. DAY-ROLL LOCK still wants a night of all-green Daily on this</w:t>
-      </w:r>
-    </w:p>
-    <w:p>
-      <w:pPr>
-        <w:spacing w:line="276" w:lineRule="auto"/>
-      </w:pPr>
-      <w:r>
-        <w:rPr>
-          <w:rFonts w:ascii="Arial" w:hAnsi="Arial"/>
-          <w:sz w:val="28"/>
-        </w:rPr>
-        <w:t xml:space="preserve">   load, then a morning open on a new load, to confirm the pop-up</w:t>
-      </w:r>
-    </w:p>
-    <w:p>
-      <w:pPr>
-        <w:spacing w:line="276" w:lineRule="auto"/>
-      </w:pPr>
-      <w:r>
-        <w:rPr>
-          <w:rFonts w:ascii="Arial" w:hAnsi="Arial"/>
-          <w:sz w:val="28"/>
-        </w:rPr>
-        <w:t xml:space="preserve">   stays quiet.</w:t>
-      </w:r>
-    </w:p>
-    <w:p>
-      <w:pPr>
-        <w:spacing w:line="276" w:lineRule="auto"/>
-      </w:pPr>
-      <w:r>
-        <w:rPr>
-          <w:rFonts w:ascii="Arial" w:hAnsi="Arial"/>
-          <w:sz w:val="28"/>
-        </w:rPr>
         <w:t xml:space="preserve"/>
       </w:r>
     </w:p>
@@ -455,6 +383,43 @@
       <w:r>
         <w:rPr>
           <w:rFonts w:ascii="Arial" w:hAnsi="Arial"/>
+          <w:b/>
+          <w:sz w:val="28"/>
+        </w:rPr>
+        <w:t xml:space="preserve">PENDING</w:t>
+      </w:r>
+    </w:p>
+    <w:p>
+      <w:pPr>
+        <w:spacing w:line="276" w:lineRule="auto"/>
+      </w:pPr>
+      <w:r>
+        <w:rPr>
+          <w:rFonts w:ascii="Arial" w:hAnsi="Arial"/>
+          <w:sz w:val="28"/>
+        </w:rPr>
+        <w:t xml:space="preserve">------------------------------------------------------------------</w:t>
+      </w:r>
+    </w:p>
+    <w:p>
+      <w:pPr>
+        <w:spacing w:line="276" w:lineRule="auto"/>
+      </w:pPr>
+      <w:r>
+        <w:rPr>
+          <w:rFonts w:ascii="Arial" w:hAnsi="Arial"/>
+          <w:sz w:val="28"/>
+        </w:rPr>
+        <w:t xml:space="preserve">Things waiting on something — mostly on a build.</w:t>
+      </w:r>
+    </w:p>
+    <w:p>
+      <w:pPr>
+        <w:spacing w:line="276" w:lineRule="auto"/>
+      </w:pPr>
+      <w:r>
+        <w:rPr>
+          <w:rFonts w:ascii="Arial" w:hAnsi="Arial"/>
           <w:sz w:val="28"/>
         </w:rPr>
         <w:t xml:space="preserve"/>
@@ -467,10 +432,214 @@
       <w:r>
         <w:rPr>
           <w:rFonts w:ascii="Arial" w:hAnsi="Arial"/>
+          <w:sz w:val="28"/>
+        </w:rPr>
+        <w:t xml:space="preserve">1. A THOROUGH DESIGN SPEC FOR THE APP (Patrick, #52-new). This</w:t>
+      </w:r>
+    </w:p>
+    <w:p>
+      <w:pPr>
+        <w:spacing w:line="276" w:lineRule="auto"/>
+      </w:pPr>
+      <w:r>
+        <w:rPr>
+          <w:rFonts w:ascii="Arial" w:hAnsi="Arial"/>
+          <w:sz w:val="28"/>
+        </w:rPr>
+        <w:t xml:space="preserve">    sitting treated One Time's missing notice at the set time as</w:t>
+      </w:r>
+    </w:p>
+    <w:p>
+      <w:pPr>
+        <w:spacing w:line="276" w:lineRule="auto"/>
+      </w:pPr>
+      <w:r>
+        <w:rPr>
+          <w:rFonts w:ascii="Arial" w:hAnsi="Arial"/>
+          <w:sz w:val="28"/>
+        </w:rPr>
+        <w:t xml:space="preserve">    a bug. He had decided it that way. A spec would have said so.</w:t>
+      </w:r>
+    </w:p>
+    <w:p>
+      <w:pPr>
+        <w:spacing w:line="276" w:lineRule="auto"/>
+      </w:pPr>
+      <w:r>
+        <w:rPr>
+          <w:rFonts w:ascii="Arial" w:hAnsi="Arial"/>
+          <w:sz w:val="28"/>
+        </w:rPr>
+        <w:t xml:space="preserve">    Changing the name of One Time to Appointments belongs in</w:t>
+      </w:r>
+    </w:p>
+    <w:p>
+      <w:pPr>
+        <w:spacing w:line="276" w:lineRule="auto"/>
+      </w:pPr>
+      <w:r>
+        <w:rPr>
+          <w:rFonts w:ascii="Arial" w:hAnsi="Arial"/>
+          <w:sz w:val="28"/>
+        </w:rPr>
+        <w:t xml:space="preserve">    that spec, and Extended to Bucket List. At #84-new the spec</w:t>
+      </w:r>
+    </w:p>
+    <w:p>
+      <w:pPr>
+        <w:spacing w:line="276" w:lineRule="auto"/>
+      </w:pPr>
+      <w:r>
+        <w:rPr>
+          <w:rFonts w:ascii="Arial" w:hAnsi="Arial"/>
+          <w:sz w:val="28"/>
+        </w:rPr>
+        <w:t xml:space="preserve">    is the designed implementation of the whole app: it is the</w:t>
+      </w:r>
+    </w:p>
+    <w:p>
+      <w:pPr>
+        <w:spacing w:line="276" w:lineRule="auto"/>
+      </w:pPr>
+      <w:r>
+        <w:rPr>
+          <w:rFonts w:ascii="Arial" w:hAnsi="Arial"/>
+          <w:sz w:val="28"/>
+        </w:rPr>
+        <w:t xml:space="preserve">    guide, and it replaces a separate layer of decisions and rules.</w:t>
+      </w:r>
+    </w:p>
+    <w:p>
+      <w:pPr>
+        <w:spacing w:line="276" w:lineRule="auto"/>
+      </w:pPr>
+      <w:r>
+        <w:rPr>
+          <w:rFonts w:ascii="Arial" w:hAnsi="Arial"/>
+          <w:sz w:val="28"/>
+        </w:rPr>
+        <w:t xml:space="preserve">    The first piece is docs/designed-implementation.md. This sitting</w:t>
+      </w:r>
+    </w:p>
+    <w:p>
+      <w:pPr>
+        <w:spacing w:line="276" w:lineRule="auto"/>
+      </w:pPr>
+      <w:r>
+        <w:rPr>
+          <w:rFonts w:ascii="Arial" w:hAnsi="Arial"/>
+          <w:sz w:val="28"/>
+        </w:rPr>
+        <w:t xml:space="preserve">    wrote the machinery, each kind, Daily on the shared list, and the</w:t>
+      </w:r>
+    </w:p>
+    <w:p>
+      <w:pPr>
+        <w:spacing w:line="276" w:lineRule="auto"/>
+      </w:pPr>
+      <w:r>
+        <w:rPr>
+          <w:rFonts w:ascii="Arial" w:hAnsi="Arial"/>
+          <w:sz w:val="28"/>
+        </w:rPr>
+        <w:t xml:space="preserve">    banner housing. Home, Help, Calendar, Settings, Backup, Scheduled</w:t>
+      </w:r>
+    </w:p>
+    <w:p>
+      <w:pPr>
+        <w:spacing w:line="276" w:lineRule="auto"/>
+      </w:pPr>
+      <w:r>
+        <w:rPr>
+          <w:rFonts w:ascii="Arial" w:hAnsi="Arial"/>
+          <w:sz w:val="28"/>
+        </w:rPr>
+        <w:t xml:space="preserve">    Reminders, Options, and Log are in that piece. A Settings password is</w:t>
+      </w:r>
+    </w:p>
+    <w:p>
+      <w:pPr>
+        <w:spacing w:line="276" w:lineRule="auto"/>
+      </w:pPr>
+      <w:r>
+        <w:rPr>
+          <w:rFonts w:ascii="Arial" w:hAnsi="Arial"/>
+          <w:sz w:val="28"/>
+        </w:rPr>
+        <w:t xml:space="preserve">    not.</w:t>
+      </w:r>
+    </w:p>
+    <w:p>
+      <w:pPr>
+        <w:spacing w:line="276" w:lineRule="auto"/>
+      </w:pPr>
+      <w:r>
+        <w:rPr>
+          <w:rFonts w:ascii="Arial" w:hAnsi="Arial"/>
+          <w:sz w:val="28"/>
+        </w:rPr>
+        <w:t xml:space="preserve">2. A PAGE, SPEC, OR FILE FOR WHAT TESTING HAS COVERED AND</w:t>
+      </w:r>
+    </w:p>
+    <w:p>
+      <w:pPr>
+        <w:spacing w:line="276" w:lineRule="auto"/>
+      </w:pPr>
+      <w:r>
+        <w:rPr>
+          <w:rFonts w:ascii="Arial" w:hAnsi="Arial"/>
+          <w:sz w:val="28"/>
+        </w:rPr>
+        <w:t xml:space="preserve">   WILL COVER (Patrick, #52-new). The during-build tests are</w:t>
+      </w:r>
+    </w:p>
+    <w:p>
+      <w:pPr>
+        <w:spacing w:line="276" w:lineRule="auto"/>
+      </w:pPr>
+      <w:r>
+        <w:rPr>
+          <w:rFonts w:ascii="Arial" w:hAnsi="Arial"/>
+          <w:sz w:val="28"/>
+        </w:rPr>
+        <w:t xml:space="preserve">   thrown away. The run is not kept.</w:t>
+      </w:r>
+    </w:p>
+    <w:p>
+      <w:pPr>
+        <w:spacing w:line="276" w:lineRule="auto"/>
+      </w:pPr>
+      <w:r>
+        <w:rPr>
+          <w:rFonts w:ascii="Arial" w:hAnsi="Arial"/>
+          <w:sz w:val="28"/>
+        </w:rPr>
+        <w:t xml:space="preserve"/>
+      </w:r>
+    </w:p>
+    <w:p>
+      <w:pPr>
+        <w:spacing w:line="276" w:lineRule="auto"/>
+      </w:pPr>
+      <w:r>
+        <w:rPr>
+          <w:rFonts w:ascii="Arial" w:hAnsi="Arial"/>
+          <w:sz w:val="28"/>
+        </w:rPr>
+        <w:t xml:space="preserve"/>
+      </w:r>
+    </w:p>
+    <w:p>
+      <w:pPr>
+        <w:spacing w:line="276" w:lineRule="auto"/>
+      </w:pPr>
+      <w:r>
+        <w:rPr>
+          <w:rFonts w:ascii="Arial" w:hAnsi="Arial"/>
           <w:b/>
           <w:sz w:val="28"/>
         </w:rPr>
-        <w:t xml:space="preserve">PENDING</w:t>
+        <w:t xml:space="preserve">FACTS THAT APPLY TO THE ONGOING WORK</w:t>
       </w:r>
     </w:p>
     <w:p>
@@ -494,7 +663,19 @@
           <w:rFonts w:ascii="Arial" w:hAnsi="Arial"/>
           <w:sz w:val="28"/>
         </w:rPr>
-        <w:t xml:space="preserve">Things waiting on something — mostly on a build.</w:t>
+        <w:t xml:space="preserve">Settled things worth having in front of you while the pages are</w:t>
+      </w:r>
+    </w:p>
+    <w:p>
+      <w:pPr>
+        <w:spacing w:line="276" w:lineRule="auto"/>
+      </w:pPr>
+      <w:r>
+        <w:rPr>
+          <w:rFonts w:ascii="Arial" w:hAnsi="Arial"/>
+          <w:sz w:val="28"/>
+        </w:rPr>
+        <w:t xml:space="preserve">built. None of these is a job to do.</w:t>
       </w:r>
     </w:p>
     <w:p>
@@ -518,199 +699,775 @@
           <w:rFonts w:ascii="Arial" w:hAnsi="Arial"/>
           <w:sz w:val="28"/>
         </w:rPr>
-        <w:t xml:space="preserve">1. A THOROUGH DESIGN SPEC FOR THE APP (Patrick, #52-new). This</w:t>
-      </w:r>
-    </w:p>
-    <w:p>
-      <w:pPr>
-        <w:spacing w:line="276" w:lineRule="auto"/>
-      </w:pPr>
-      <w:r>
-        <w:rPr>
-          <w:rFonts w:ascii="Arial" w:hAnsi="Arial"/>
-          <w:sz w:val="28"/>
-        </w:rPr>
-        <w:t xml:space="preserve">    sitting treated One Time's missing notice at the set time as</w:t>
-      </w:r>
-    </w:p>
-    <w:p>
-      <w:pPr>
-        <w:spacing w:line="276" w:lineRule="auto"/>
-      </w:pPr>
-      <w:r>
-        <w:rPr>
-          <w:rFonts w:ascii="Arial" w:hAnsi="Arial"/>
-          <w:sz w:val="28"/>
-        </w:rPr>
-        <w:t xml:space="preserve">    a bug. He had decided it that way. A spec would have said so.</w:t>
-      </w:r>
-    </w:p>
-    <w:p>
-      <w:pPr>
-        <w:spacing w:line="276" w:lineRule="auto"/>
-      </w:pPr>
-      <w:r>
-        <w:rPr>
-          <w:rFonts w:ascii="Arial" w:hAnsi="Arial"/>
-          <w:sz w:val="28"/>
-        </w:rPr>
-        <w:t xml:space="preserve">    Changing the name of One Time to Appointments belongs in</w:t>
-      </w:r>
-    </w:p>
-    <w:p>
-      <w:pPr>
-        <w:spacing w:line="276" w:lineRule="auto"/>
-      </w:pPr>
-      <w:r>
-        <w:rPr>
-          <w:rFonts w:ascii="Arial" w:hAnsi="Arial"/>
-          <w:sz w:val="28"/>
-        </w:rPr>
-        <w:t xml:space="preserve">    that spec, and Extended to Bucket List. At #84-new the spec</w:t>
-      </w:r>
-    </w:p>
-    <w:p>
-      <w:pPr>
-        <w:spacing w:line="276" w:lineRule="auto"/>
-      </w:pPr>
-      <w:r>
-        <w:rPr>
-          <w:rFonts w:ascii="Arial" w:hAnsi="Arial"/>
-          <w:sz w:val="28"/>
-        </w:rPr>
-        <w:t xml:space="preserve">    is the designed implementation of the whole app: it is the</w:t>
-      </w:r>
-    </w:p>
-    <w:p>
-      <w:pPr>
-        <w:spacing w:line="276" w:lineRule="auto"/>
-      </w:pPr>
-      <w:r>
-        <w:rPr>
-          <w:rFonts w:ascii="Arial" w:hAnsi="Arial"/>
-          <w:sz w:val="28"/>
-        </w:rPr>
-        <w:t xml:space="preserve">    guide, and it replaces a separate layer of decisions and rules.</w:t>
-      </w:r>
-    </w:p>
-    <w:p>
-      <w:pPr>
-        <w:spacing w:line="276" w:lineRule="auto"/>
-      </w:pPr>
-      <w:r>
-        <w:rPr>
-          <w:rFonts w:ascii="Arial" w:hAnsi="Arial"/>
-          <w:sz w:val="28"/>
-        </w:rPr>
-        <w:t xml:space="preserve">    The first piece is docs/designed-implementation.md. This sitting</w:t>
-      </w:r>
-    </w:p>
-    <w:p>
-      <w:pPr>
-        <w:spacing w:line="276" w:lineRule="auto"/>
-      </w:pPr>
-      <w:r>
-        <w:rPr>
-          <w:rFonts w:ascii="Arial" w:hAnsi="Arial"/>
-          <w:sz w:val="28"/>
-        </w:rPr>
-        <w:t xml:space="preserve">    wrote the machinery, each kind, Daily on the shared list, and the</w:t>
-      </w:r>
-    </w:p>
-    <w:p>
-      <w:pPr>
-        <w:spacing w:line="276" w:lineRule="auto"/>
-      </w:pPr>
-      <w:r>
-        <w:rPr>
-          <w:rFonts w:ascii="Arial" w:hAnsi="Arial"/>
-          <w:sz w:val="28"/>
-        </w:rPr>
-        <w:t xml:space="preserve">    banner housing. Home, Help, Calendar, Settings, Backup, Scheduled</w:t>
-      </w:r>
-    </w:p>
-    <w:p>
-      <w:pPr>
-        <w:spacing w:line="276" w:lineRule="auto"/>
-      </w:pPr>
-      <w:r>
-        <w:rPr>
-          <w:rFonts w:ascii="Arial" w:hAnsi="Arial"/>
-          <w:sz w:val="28"/>
-        </w:rPr>
-        <w:t xml:space="preserve">    Reminders, Options, and Log are in that piece. A Settings password is</w:t>
-      </w:r>
-    </w:p>
-    <w:p>
-      <w:pPr>
-        <w:spacing w:line="276" w:lineRule="auto"/>
-      </w:pPr>
-      <w:r>
-        <w:rPr>
-          <w:rFonts w:ascii="Arial" w:hAnsi="Arial"/>
-          <w:sz w:val="28"/>
-        </w:rPr>
-        <w:t xml:space="preserve">    not.</w:t>
-      </w:r>
-    </w:p>
-    <w:p>
-      <w:pPr>
-        <w:spacing w:line="276" w:lineRule="auto"/>
-      </w:pPr>
-      <w:r>
-        <w:rPr>
-          <w:rFonts w:ascii="Arial" w:hAnsi="Arial"/>
-          <w:sz w:val="28"/>
-        </w:rPr>
-        <w:t xml:space="preserve">2. A FEEDBACK BUTTON IN THE APP, similar to Mystery (Patrick,</w:t>
-      </w:r>
-    </w:p>
-    <w:p>
-      <w:pPr>
-        <w:spacing w:line="276" w:lineRule="auto"/>
-      </w:pPr>
-      <w:r>
-        <w:rPr>
-          <w:rFonts w:ascii="Arial" w:hAnsi="Arial"/>
-          <w:sz w:val="28"/>
-        </w:rPr>
-        <w:t xml:space="preserve">    #52-new).</w:t>
-      </w:r>
-    </w:p>
-    <w:p>
-      <w:pPr>
-        <w:spacing w:line="276" w:lineRule="auto"/>
-      </w:pPr>
-      <w:r>
-        <w:rPr>
-          <w:rFonts w:ascii="Arial" w:hAnsi="Arial"/>
-          <w:sz w:val="28"/>
-        </w:rPr>
-        <w:t xml:space="preserve">3. A PAGE, SPEC, OR FILE FOR WHAT TESTING HAS COVERED AND</w:t>
-      </w:r>
-    </w:p>
-    <w:p>
-      <w:pPr>
-        <w:spacing w:line="276" w:lineRule="auto"/>
-      </w:pPr>
-      <w:r>
-        <w:rPr>
-          <w:rFonts w:ascii="Arial" w:hAnsi="Arial"/>
-          <w:sz w:val="28"/>
-        </w:rPr>
-        <w:t xml:space="preserve">   WILL COVER (Patrick, #52-new). The during-build tests are</w:t>
-      </w:r>
-    </w:p>
-    <w:p>
-      <w:pPr>
-        <w:spacing w:line="276" w:lineRule="auto"/>
-      </w:pPr>
-      <w:r>
-        <w:rPr>
-          <w:rFonts w:ascii="Arial" w:hAnsi="Arial"/>
-          <w:sz w:val="28"/>
-        </w:rPr>
-        <w:t xml:space="preserve">   thrown away. The run is not kept.</w:t>
+        <w:t xml:space="preserve">1. THE PAGES ARE NOT A REPLACEMENT FOR THE INPUT PAGE. The Input</w:t>
+      </w:r>
+    </w:p>
+    <w:p>
+      <w:pPr>
+        <w:spacing w:line="276" w:lineRule="auto"/>
+      </w:pPr>
+      <w:r>
+        <w:rPr>
+          <w:rFonts w:ascii="Arial" w:hAnsi="Arial"/>
+          <w:sz w:val="28"/>
+        </w:rPr>
+        <w:t xml:space="preserve">   page goes away and nothing replaces it — and the + Add popup in</w:t>
+      </w:r>
+    </w:p>
+    <w:p>
+      <w:pPr>
+        <w:spacing w:line="276" w:lineRule="auto"/>
+      </w:pPr>
+      <w:r>
+        <w:rPr>
+          <w:rFonts w:ascii="Arial" w:hAnsi="Arial"/>
+          <w:sz w:val="28"/>
+        </w:rPr>
+        <w:t xml:space="preserve">   particular is not its replacement. This is your own reminder</w:t>
+      </w:r>
+    </w:p>
+    <w:p>
+      <w:pPr>
+        <w:spacing w:line="276" w:lineRule="auto"/>
+      </w:pPr>
+      <w:r>
+        <w:rPr>
+          <w:rFonts w:ascii="Arial" w:hAnsi="Arial"/>
+          <w:sz w:val="28"/>
+        </w:rPr>
+        <w:t xml:space="preserve">   pages being reshaped by how often a thing comes round.</w:t>
+      </w:r>
+    </w:p>
+    <w:p>
+      <w:pPr>
+        <w:spacing w:line="276" w:lineRule="auto"/>
+      </w:pPr>
+      <w:r>
+        <w:rPr>
+          <w:rFonts w:ascii="Arial" w:hAnsi="Arial"/>
+          <w:sz w:val="28"/>
+        </w:rPr>
+        <w:t xml:space="preserve">2. + ADD ON A PAGE GOES TO THAT PAGE'S OWN NEW. Where does it</w:t>
+      </w:r>
+    </w:p>
+    <w:p>
+      <w:pPr>
+        <w:spacing w:line="276" w:lineRule="auto"/>
+      </w:pPr>
+      <w:r>
+        <w:rPr>
+          <w:rFonts w:ascii="Arial" w:hAnsi="Arial"/>
+          <w:sz w:val="28"/>
+        </w:rPr>
+        <w:t xml:space="preserve">   belong? is only on Options, from + Screen. You do not set</w:t>
+      </w:r>
+    </w:p>
+    <w:p>
+      <w:pPr>
+        <w:spacing w:line="276" w:lineRule="auto"/>
+      </w:pPr>
+      <w:r>
+        <w:rPr>
+          <w:rFonts w:ascii="Arial" w:hAnsi="Arial"/>
+          <w:sz w:val="28"/>
+        </w:rPr>
+        <w:t xml:space="preserve">   another page from a different page (#36-new).</w:t>
+      </w:r>
+    </w:p>
+    <w:p>
+      <w:pPr>
+        <w:spacing w:line="276" w:lineRule="auto"/>
+      </w:pPr>
+      <w:r>
+        <w:rPr>
+          <w:rFonts w:ascii="Arial" w:hAnsi="Arial"/>
+          <w:sz w:val="28"/>
+        </w:rPr>
+        <w:t xml:space="preserve">3. APPOINTMENTS CARRIES THE REMINDERS BEFORE CHIPS — 30 min., 1</w:t>
+      </w:r>
+    </w:p>
+    <w:p>
+      <w:pPr>
+        <w:spacing w:line="276" w:lineRule="auto"/>
+      </w:pPr>
+      <w:r>
+        <w:rPr>
+          <w:rFonts w:ascii="Arial" w:hAnsi="Arial"/>
+          <w:sz w:val="28"/>
+        </w:rPr>
+        <w:t xml:space="preserve">   hour, 2 hours, Morning of, Day Before, Night Before, 2 Days</w:t>
+      </w:r>
+    </w:p>
+    <w:p>
+      <w:pPr>
+        <w:spacing w:line="276" w:lineRule="auto"/>
+      </w:pPr>
+      <w:r>
+        <w:rPr>
+          <w:rFonts w:ascii="Arial" w:hAnsi="Arial"/>
+          <w:sz w:val="28"/>
+        </w:rPr>
+        <w:t xml:space="preserve">   Before, Week, Month — and any and all of them can be on at once.</w:t>
+      </w:r>
+    </w:p>
+    <w:p>
+      <w:pPr>
+        <w:spacing w:line="276" w:lineRule="auto"/>
+      </w:pPr>
+      <w:r>
+        <w:rPr>
+          <w:rFonts w:ascii="Arial" w:hAnsi="Arial"/>
+          <w:sz w:val="28"/>
+        </w:rPr>
+        <w:t xml:space="preserve">   They also remind at the set time, like the rest of the app</w:t>
+      </w:r>
+    </w:p>
+    <w:p>
+      <w:pPr>
+        <w:spacing w:line="276" w:lineRule="auto"/>
+      </w:pPr>
+      <w:r>
+        <w:rPr>
+          <w:rFonts w:ascii="Arial" w:hAnsi="Arial"/>
+          <w:sz w:val="28"/>
+        </w:rPr>
+        <w:t xml:space="preserve">   (Patrick, #74-new; reverses #52-new). The page</w:t>
+      </w:r>
+    </w:p>
+    <w:p>
+      <w:pPr>
+        <w:spacing w:line="276" w:lineRule="auto"/>
+      </w:pPr>
+      <w:r>
+        <w:rPr>
+          <w:rFonts w:ascii="Arial" w:hAnsi="Arial"/>
+          <w:sz w:val="28"/>
+        </w:rPr>
+        <w:t xml:space="preserve">   is called Appointments (#56-new; saved kind appointments, #65-new).</w:t>
+      </w:r>
+    </w:p>
+    <w:p>
+      <w:pPr>
+        <w:spacing w:line="276" w:lineRule="auto"/>
+      </w:pPr>
+      <w:r>
+        <w:rPr>
+          <w:rFonts w:ascii="Arial" w:hAnsi="Arial"/>
+          <w:sz w:val="28"/>
+        </w:rPr>
+        <w:t xml:space="preserve">4. DAILY'S OWN ADD IS ONLY ABOUT TODAY. Two kinds: an every-day</w:t>
+      </w:r>
+    </w:p>
+    <w:p>
+      <w:pPr>
+        <w:spacing w:line="276" w:lineRule="auto"/>
+      </w:pPr>
+      <w:r>
+        <w:rPr>
+          <w:rFonts w:ascii="Arial" w:hAnsi="Arial"/>
+          <w:sz w:val="28"/>
+        </w:rPr>
+        <w:t xml:space="preserve">   item, or a One Time for today. On One Time for today the</w:t>
+      </w:r>
+    </w:p>
+    <w:p>
+      <w:pPr>
+        <w:spacing w:line="276" w:lineRule="auto"/>
+      </w:pPr>
+      <w:r>
+        <w:rPr>
+          <w:rFonts w:ascii="Arial" w:hAnsi="Arial"/>
+          <w:sz w:val="28"/>
+        </w:rPr>
+        <w:t xml:space="preserve">   Reminders before chips are only 30 min., 1 hour, 2 hours, and</w:t>
+      </w:r>
+    </w:p>
+    <w:p>
+      <w:pPr>
+        <w:spacing w:line="276" w:lineRule="auto"/>
+      </w:pPr>
+      <w:r>
+        <w:rPr>
+          <w:rFonts w:ascii="Arial" w:hAnsi="Arial"/>
+          <w:sz w:val="28"/>
+        </w:rPr>
+        <w:t xml:space="preserve">   Time of (the item's own time). Save on that kind comes back on</w:t>
+      </w:r>
+    </w:p>
+    <w:p>
+      <w:pPr>
+        <w:spacing w:line="276" w:lineRule="auto"/>
+      </w:pPr>
+      <w:r>
+        <w:rPr>
+          <w:rFonts w:ascii="Arial" w:hAnsi="Arial"/>
+          <w:sz w:val="28"/>
+        </w:rPr>
+        <w:t xml:space="preserve">   Daily. It is Daily's own one-shot, not an Appointment. An</w:t>
+      </w:r>
+    </w:p>
+    <w:p>
+      <w:pPr>
+        <w:spacing w:line="276" w:lineRule="auto"/>
+      </w:pPr>
+      <w:r>
+        <w:rPr>
+          <w:rFonts w:ascii="Arial" w:hAnsi="Arial"/>
+          <w:sz w:val="28"/>
+        </w:rPr>
+        <w:t xml:space="preserve">   Appointment that falls today still shows on Daily as from</w:t>
+      </w:r>
+    </w:p>
+    <w:p>
+      <w:pPr>
+        <w:spacing w:line="276" w:lineRule="auto"/>
+      </w:pPr>
+      <w:r>
+        <w:rPr>
+          <w:rFonts w:ascii="Arial" w:hAnsi="Arial"/>
+          <w:sz w:val="28"/>
+        </w:rPr>
+        <w:t xml:space="preserve">   Appointments, and still lives on Appointments. The other pages keep their</w:t>
+      </w:r>
+    </w:p>
+    <w:p>
+      <w:pPr>
+        <w:spacing w:line="276" w:lineRule="auto"/>
+      </w:pPr>
+      <w:r>
+        <w:rPr>
+          <w:rFonts w:ascii="Arial" w:hAnsi="Arial"/>
+          <w:sz w:val="28"/>
+        </w:rPr>
+        <w:t xml:space="preserve">   own adds, because on those the page is the whole meaning of Repeat.</w:t>
+      </w:r>
+    </w:p>
+    <w:p>
+      <w:pPr>
+        <w:spacing w:line="276" w:lineRule="auto"/>
+      </w:pPr>
+      <w:r>
+        <w:rPr>
+          <w:rFonts w:ascii="Arial" w:hAnsi="Arial"/>
+          <w:sz w:val="28"/>
+        </w:rPr>
+        <w:t xml:space="preserve">   (#78-new)</w:t>
+      </w:r>
+    </w:p>
+    <w:p>
+      <w:pPr>
+        <w:spacing w:line="276" w:lineRule="auto"/>
+      </w:pPr>
+      <w:r>
+        <w:rPr>
+          <w:rFonts w:ascii="Arial" w:hAnsi="Arial"/>
+          <w:sz w:val="28"/>
+        </w:rPr>
+        <w:t xml:space="preserve">5. ONE REMINDER PER ITEM, NOT TWO, and the app puts itself right</w:t>
+      </w:r>
+    </w:p>
+    <w:p>
+      <w:pPr>
+        <w:spacing w:line="276" w:lineRule="auto"/>
+      </w:pPr>
+      <w:r>
+        <w:rPr>
+          <w:rFonts w:ascii="Arial" w:hAnsi="Arial"/>
+          <w:sz w:val="28"/>
+        </w:rPr>
+        <w:t xml:space="preserve">   when you open it: it tells you what you missed, then sets the</w:t>
+      </w:r>
+    </w:p>
+    <w:p>
+      <w:pPr>
+        <w:spacing w:line="276" w:lineRule="auto"/>
+      </w:pPr>
+      <w:r>
+        <w:rPr>
+          <w:rFonts w:ascii="Arial" w:hAnsi="Arial"/>
+          <w:sz w:val="28"/>
+        </w:rPr>
+        <w:t xml:space="preserve">   reminders again. That is your own reasoning and it replaced the</w:t>
+      </w:r>
+    </w:p>
+    <w:p>
+      <w:pPr>
+        <w:spacing w:line="276" w:lineRule="auto"/>
+      </w:pPr>
+      <w:r>
+        <w:rPr>
+          <w:rFonts w:ascii="Arial" w:hAnsi="Arial"/>
+          <w:sz w:val="28"/>
+        </w:rPr>
+        <w:t xml:space="preserve">   old two-days-ahead rule. A Daily item still arms for tomorrow</w:t>
+      </w:r>
+    </w:p>
+    <w:p>
+      <w:pPr>
+        <w:spacing w:line="276" w:lineRule="auto"/>
+      </w:pPr>
+      <w:r>
+        <w:rPr>
+          <w:rFonts w:ascii="Arial" w:hAnsi="Arial"/>
+          <w:sz w:val="28"/>
+        </w:rPr>
+        <w:t xml:space="preserve">   after Done; that is still one reminder, not two (Patrick, #44-new).</w:t>
+      </w:r>
+    </w:p>
+    <w:p>
+      <w:pPr>
+        <w:spacing w:line="276" w:lineRule="auto"/>
+      </w:pPr>
+      <w:r>
+        <w:rPr>
+          <w:rFonts w:ascii="Arial" w:hAnsi="Arial"/>
+          <w:sz w:val="28"/>
+        </w:rPr>
+        <w:t xml:space="preserve">6. ROCK SOLID IS THE TOP GOAL BUT NOT THE ONLY ONE. Consistency</w:t>
+      </w:r>
+    </w:p>
+    <w:p>
+      <w:pPr>
+        <w:spacing w:line="276" w:lineRule="auto"/>
+      </w:pPr>
+      <w:r>
+        <w:rPr>
+          <w:rFonts w:ascii="Arial" w:hAnsi="Arial"/>
+          <w:sz w:val="28"/>
+        </w:rPr>
+        <w:t xml:space="preserve">   stands beside it. That correction is yours, from #17-new.</w:t>
+      </w:r>
+    </w:p>
+    <w:p>
+      <w:pPr>
+        <w:spacing w:line="276" w:lineRule="auto"/>
+      </w:pPr>
+      <w:r>
+        <w:rPr>
+          <w:rFonts w:ascii="Arial" w:hAnsi="Arial"/>
+          <w:sz w:val="28"/>
+        </w:rPr>
+        <w:t xml:space="preserve">7. ROCK SOLID IS FOR WHEN YOU USE IT. An app that is not being</w:t>
+      </w:r>
+    </w:p>
+    <w:p>
+      <w:pPr>
+        <w:spacing w:line="276" w:lineRule="auto"/>
+      </w:pPr>
+      <w:r>
+        <w:rPr>
+          <w:rFonts w:ascii="Arial" w:hAnsi="Arial"/>
+          <w:sz w:val="28"/>
+        </w:rPr>
+        <w:t xml:space="preserve">   opened is not being used, and what the old second copy protected</w:t>
+      </w:r>
+    </w:p>
+    <w:p>
+      <w:pPr>
+        <w:spacing w:line="276" w:lineRule="auto"/>
+      </w:pPr>
+      <w:r>
+        <w:rPr>
+          <w:rFonts w:ascii="Arial" w:hAnsi="Arial"/>
+          <w:sz w:val="28"/>
+        </w:rPr>
+        <w:t xml:space="preserve">   was one day and no more.</w:t>
+      </w:r>
+    </w:p>
+    <w:p>
+      <w:pPr>
+        <w:spacing w:line="276" w:lineRule="auto"/>
+      </w:pPr>
+      <w:r>
+        <w:rPr>
+          <w:rFonts w:ascii="Arial" w:hAnsi="Arial"/>
+          <w:sz w:val="28"/>
+        </w:rPr>
+        <w:t xml:space="preserve">8. AN EXTENDED ITEM AND A DAILY TICK ARE OPPOSITES. A Bucket List</w:t>
+      </w:r>
+    </w:p>
+    <w:p>
+      <w:pPr>
+        <w:spacing w:line="276" w:lineRule="auto"/>
+      </w:pPr>
+      <w:r>
+        <w:rPr>
+          <w:rFonts w:ascii="Arial" w:hAnsi="Arial"/>
+          <w:sz w:val="28"/>
+        </w:rPr>
+        <w:t xml:space="preserve">   item (saved kind bucketlist) says a thing is not yet done and must</w:t>
+      </w:r>
+    </w:p>
+    <w:p>
+      <w:pPr>
+        <w:spacing w:line="276" w:lineRule="auto"/>
+      </w:pPr>
+      <w:r>
+        <w:rPr>
+          <w:rFonts w:ascii="Arial" w:hAnsi="Arial"/>
+          <w:sz w:val="28"/>
+        </w:rPr>
+        <w:t xml:space="preserve">   survive the night. The coffee-and-water sort says a thing was</w:t>
+      </w:r>
+    </w:p>
+    <w:p>
+      <w:pPr>
+        <w:spacing w:line="276" w:lineRule="auto"/>
+      </w:pPr>
+      <w:r>
+        <w:rPr>
+          <w:rFonts w:ascii="Arial" w:hAnsi="Arial"/>
+          <w:sz w:val="28"/>
+        </w:rPr>
+        <w:t xml:space="preserve">   done today and is meaningless the morning after. They must never</w:t>
+      </w:r>
+    </w:p>
+    <w:p>
+      <w:pPr>
+        <w:spacing w:line="276" w:lineRule="auto"/>
+      </w:pPr>
+      <w:r>
+        <w:rPr>
+          <w:rFonts w:ascii="Arial" w:hAnsi="Arial"/>
+          <w:sz w:val="28"/>
+        </w:rPr>
+        <w:t xml:space="preserve">   be merged.</w:t>
+      </w:r>
+    </w:p>
+    <w:p>
+      <w:pPr>
+        <w:spacing w:line="276" w:lineRule="auto"/>
+      </w:pPr>
+      <w:r>
+        <w:rPr>
+          <w:rFonts w:ascii="Arial" w:hAnsi="Arial"/>
+          <w:sz w:val="28"/>
+        </w:rPr>
+        <w:t xml:space="preserve">9. TIMES SET BY SPINNING THROUGH NOON OR MIDNIGHT BEFORE #27-new</w:t>
+      </w:r>
+    </w:p>
+    <w:p>
+      <w:pPr>
+        <w:spacing w:line="276" w:lineRule="auto"/>
+      </w:pPr>
+      <w:r>
+        <w:rPr>
+          <w:rFonts w:ascii="Arial" w:hAnsi="Arial"/>
+          <w:sz w:val="28"/>
+        </w:rPr>
+        <w:t xml:space="preserve">    are stored in the wrong half of the day and want re-setting.</w:t>
+      </w:r>
+    </w:p>
+    <w:p>
+      <w:pPr>
+        <w:spacing w:line="276" w:lineRule="auto"/>
+      </w:pPr>
+      <w:r>
+        <w:rPr>
+          <w:rFonts w:ascii="Arial" w:hAnsi="Arial"/>
+          <w:sz w:val="28"/>
+        </w:rPr>
+        <w:t xml:space="preserve">10. TASKS SAVED BEFORE THE DATE FIX carry a date they were given</w:t>
+      </w:r>
+    </w:p>
+    <w:p>
+      <w:pPr>
+        <w:spacing w:line="276" w:lineRule="auto"/>
+      </w:pPr>
+      <w:r>
+        <w:rPr>
+          <w:rFonts w:ascii="Arial" w:hAnsi="Arial"/>
+          <w:sz w:val="28"/>
+        </w:rPr>
+        <w:t xml:space="preserve">    rather than one you chose.</w:t>
+      </w:r>
+    </w:p>
+    <w:p>
+      <w:pPr>
+        <w:spacing w:line="276" w:lineRule="auto"/>
+      </w:pPr>
+      <w:r>
+        <w:rPr>
+          <w:rFonts w:ascii="Arial" w:hAnsi="Arial"/>
+          <w:sz w:val="28"/>
+        </w:rPr>
+        <w:t xml:space="preserve">11. A BIG PIECE GETS A BUILD SHEET FIRST — self-contained, carrying</w:t>
+      </w:r>
+    </w:p>
+    <w:p>
+      <w:pPr>
+        <w:spacing w:line="276" w:lineRule="auto"/>
+      </w:pPr>
+      <w:r>
+        <w:rPr>
+          <w:rFonts w:ascii="Arial" w:hAnsi="Arial"/>
+          <w:sz w:val="28"/>
+        </w:rPr>
+        <w:t xml:space="preserve">    every answer, so whoever builds it never has to ask you a</w:t>
+      </w:r>
+    </w:p>
+    <w:p>
+      <w:pPr>
+        <w:spacing w:line="276" w:lineRule="auto"/>
+      </w:pPr>
+      <w:r>
+        <w:rPr>
+          <w:rFonts w:ascii="Arial" w:hAnsi="Arial"/>
+          <w:sz w:val="28"/>
+        </w:rPr>
+        <w:t xml:space="preserve">    design question.</w:t>
+      </w:r>
+    </w:p>
+    <w:p>
+      <w:pPr>
+        <w:spacing w:line="276" w:lineRule="auto"/>
+      </w:pPr>
+      <w:r>
+        <w:rPr>
+          <w:rFonts w:ascii="Arial" w:hAnsi="Arial"/>
+          <w:sz w:val="28"/>
+        </w:rPr>
+        <w:t xml:space="preserve">12. BARE SESSION NUMBERS mean the old shared chain. This project's</w:t>
+      </w:r>
+    </w:p>
+    <w:p>
+      <w:pPr>
+        <w:spacing w:line="276" w:lineRule="auto"/>
+      </w:pPr>
+      <w:r>
+        <w:rPr>
+          <w:rFonts w:ascii="Arial" w:hAnsi="Arial"/>
+          <w:sz w:val="28"/>
+        </w:rPr>
+        <w:t xml:space="preserve">    own chain is written #1-new, #2-new, and so on.</w:t>
+      </w:r>
+    </w:p>
+    <w:p>
+      <w:pPr>
+        <w:spacing w:line="276" w:lineRule="auto"/>
+      </w:pPr>
+      <w:r>
+        <w:rPr>
+          <w:rFonts w:ascii="Arial" w:hAnsi="Arial"/>
+          <w:sz w:val="28"/>
+        </w:rPr>
+        <w:t xml:space="preserve">13. WORKING DOCUMENTS LIVE IN docs. History lives in docs-ref, and</w:t>
+      </w:r>
+    </w:p>
+    <w:p>
+      <w:pPr>
+        <w:spacing w:line="276" w:lineRule="auto"/>
+      </w:pPr>
+      <w:r>
+        <w:rPr>
+          <w:rFonts w:ascii="Arial" w:hAnsi="Arial"/>
+          <w:sz w:val="28"/>
+        </w:rPr>
+        <w:t xml:space="preserve">    the build sheets are in docs-ref/build-sheets. The index</w:t>
+      </w:r>
+    </w:p>
+    <w:p>
+      <w:pPr>
+        <w:spacing w:line="276" w:lineRule="auto"/>
+      </w:pPr>
+      <w:r>
+        <w:rPr>
+          <w:rFonts w:ascii="Arial" w:hAnsi="Arial"/>
+          <w:sz w:val="28"/>
+        </w:rPr>
+        <w:t xml:space="preserve">    says which file is the home. He calls them working documents;</w:t>
+      </w:r>
+    </w:p>
+    <w:p>
+      <w:pPr>
+        <w:spacing w:line="276" w:lineRule="auto"/>
+      </w:pPr>
+      <w:r>
+        <w:rPr>
+          <w:rFonts w:ascii="Arial" w:hAnsi="Arial"/>
+          <w:sz w:val="28"/>
+        </w:rPr>
+        <w:t xml:space="preserve">    live desk means the same thing. (App-Docs, 2026-08-31)</w:t>
+      </w:r>
+    </w:p>
+    <w:p>
+      <w:pPr>
+        <w:spacing w:line="276" w:lineRule="auto"/>
+      </w:pPr>
+      <w:r>
+        <w:rPr>
+          <w:rFonts w:ascii="Arial" w:hAnsi="Arial"/>
+          <w:sz w:val="28"/>
+        </w:rPr>
+        <w:t xml:space="preserve">14. THE CALENDAR PAGE SHOWS DATED ITEMS. No every-day Daily items,</w:t>
+      </w:r>
+    </w:p>
+    <w:p>
+      <w:pPr>
+        <w:spacing w:line="276" w:lineRule="auto"/>
+      </w:pPr>
+      <w:r>
+        <w:rPr>
+          <w:rFonts w:ascii="Arial" w:hAnsi="Arial"/>
+          <w:sz w:val="28"/>
+        </w:rPr>
+        <w:t xml:space="preserve">    no Bucket List. No Done or Snooze on the month or the day’s list.</w:t>
+      </w:r>
+    </w:p>
+    <w:p>
+      <w:pPr>
+        <w:spacing w:line="276" w:lineRule="auto"/>
+      </w:pPr>
+      <w:r>
+        <w:rPr>
+          <w:rFonts w:ascii="Arial" w:hAnsi="Arial"/>
+          <w:sz w:val="28"/>
+        </w:rPr>
+        <w:t xml:space="preserve">    Names in a day box are one line and scroll vertically.</w:t>
+      </w:r>
+    </w:p>
+    <w:p>
+      <w:pPr>
+        <w:spacing w:line="276" w:lineRule="auto"/>
+      </w:pPr>
+      <w:r>
+        <w:rPr>
+          <w:rFonts w:ascii="Arial" w:hAnsi="Arial"/>
+          <w:sz w:val="28"/>
+        </w:rPr>
+        <w:t xml:space="preserve">    Landscape is an optional view: 0°, 90° counter-clockwise, and</w:t>
+      </w:r>
+    </w:p>
+    <w:p>
+      <w:pPr>
+        <w:spacing w:line="276" w:lineRule="auto"/>
+      </w:pPr>
+      <w:r>
+        <w:rPr>
+          <w:rFonts w:ascii="Arial" w:hAnsi="Arial"/>
+          <w:sz w:val="28"/>
+        </w:rPr>
+        <w:t xml:space="preserve">    270° counter-clockwise; 180° upside-down is out. Headers stay</w:t>
+      </w:r>
+    </w:p>
+    <w:p>
+      <w:pPr>
+        <w:spacing w:line="276" w:lineRule="auto"/>
+      </w:pPr>
+      <w:r>
+        <w:rPr>
+          <w:rFonts w:ascii="Arial" w:hAnsi="Arial"/>
+          <w:sz w:val="28"/>
+        </w:rPr>
+        <w:t xml:space="preserve">    at the physical top of the phone, all pages. The calendar month</w:t>
+      </w:r>
+    </w:p>
+    <w:p>
+      <w:pPr>
+        <w:spacing w:line="276" w:lineRule="auto"/>
+      </w:pPr>
+      <w:r>
+        <w:rPr>
+          <w:rFonts w:ascii="Arial" w:hAnsi="Arial"/>
+          <w:sz w:val="28"/>
+        </w:rPr>
+        <w:t xml:space="preserve">    grid was not rebuilt.</w:t>
+      </w:r>
+    </w:p>
+    <w:p>
+      <w:pPr>
+        <w:spacing w:line="276" w:lineRule="auto"/>
+      </w:pPr>
+      <w:r>
+        <w:rPr>
+          <w:rFonts w:ascii="Arial" w:hAnsi="Arial"/>
+          <w:sz w:val="28"/>
+        </w:rPr>
+        <w:t xml:space="preserve">15. HAVING A GOOD IDEA LEADS TO OVERREACHING (Patrick, #52-new).</w:t>
+      </w:r>
+    </w:p>
+    <w:p>
+      <w:pPr>
+        <w:spacing w:line="276" w:lineRule="auto"/>
+      </w:pPr>
+      <w:r>
+        <w:rPr>
+          <w:rFonts w:ascii="Arial" w:hAnsi="Arial"/>
+          <w:sz w:val="28"/>
+        </w:rPr>
+        <w:t xml:space="preserve">    The feedback he needs is the trim: what part is worth it,</w:t>
+      </w:r>
+    </w:p>
+    <w:p>
+      <w:pPr>
+        <w:spacing w:line="276" w:lineRule="auto"/>
+      </w:pPr>
+      <w:r>
+        <w:rPr>
+          <w:rFonts w:ascii="Arial" w:hAnsi="Arial"/>
+          <w:sz w:val="28"/>
+        </w:rPr>
+        <w:t xml:space="preserve">    and what is more than is there.</w:t>
+      </w:r>
+    </w:p>
+    <w:p>
+      <w:pPr>
+        <w:spacing w:line="276" w:lineRule="auto"/>
+      </w:pPr>
+      <w:r>
+        <w:rPr>
+          <w:rFonts w:ascii="Arial" w:hAnsi="Arial"/>
+          <w:sz w:val="28"/>
+        </w:rPr>
+        <w:t xml:space="preserve">16. THE DESIGN DESCRIPTION IS THE DESIGNED IMPLEMENTATION</w:t>
+      </w:r>
+    </w:p>
+    <w:p>
+      <w:pPr>
+        <w:spacing w:line="276" w:lineRule="auto"/>
+      </w:pPr>
+      <w:r>
+        <w:rPr>
+          <w:rFonts w:ascii="Arial" w:hAnsi="Arial"/>
+          <w:sz w:val="28"/>
+        </w:rPr>
+        <w:t xml:space="preserve">    (Patrick, #84-new). It is the guide for the whole app. A sitting</w:t>
+      </w:r>
+    </w:p>
+    <w:p>
+      <w:pPr>
+        <w:spacing w:line="276" w:lineRule="auto"/>
+      </w:pPr>
+      <w:r>
+        <w:rPr>
+          <w:rFonts w:ascii="Arial" w:hAnsi="Arial"/>
+          <w:sz w:val="28"/>
+        </w:rPr>
+        <w:t xml:space="preserve">    builds from docs/designed-implementation.md and does not ask</w:t>
+      </w:r>
+    </w:p>
+    <w:p>
+      <w:pPr>
+        <w:spacing w:line="276" w:lineRule="auto"/>
+      </w:pPr>
+      <w:r>
+        <w:rPr>
+          <w:rFonts w:ascii="Arial" w:hAnsi="Arial"/>
+          <w:sz w:val="28"/>
+        </w:rPr>
+        <w:t xml:space="preserve">    Patrick a design question. Home, Help, Calendar, Settings, Backup,</w:t>
+      </w:r>
+    </w:p>
+    <w:p>
+      <w:pPr>
+        <w:spacing w:line="276" w:lineRule="auto"/>
+      </w:pPr>
+      <w:r>
+        <w:rPr>
+          <w:rFonts w:ascii="Arial" w:hAnsi="Arial"/>
+          <w:sz w:val="28"/>
+        </w:rPr>
+        <w:t xml:space="preserve">    Scheduled Reminders, Options, and Log are in that file.</w:t>
       </w:r>
     </w:p>
     <w:p>
@@ -747,7 +1504,7 @@
           <w:b/>
           <w:sz w:val="28"/>
         </w:rPr>
-        <w:t xml:space="preserve">FACTS THAT APPLY TO THE ONGOING WORK</w:t>
+        <w:t xml:space="preserve">WHAT IS DONE, NEWEST FIRST</w:t>
       </w:r>
     </w:p>
     <w:p>
@@ -771,19 +1528,43 @@
           <w:rFonts w:ascii="Arial" w:hAnsi="Arial"/>
           <w:sz w:val="28"/>
         </w:rPr>
-        <w:t xml:space="preserve">Settled things worth having in front of you while the pages are</w:t>
-      </w:r>
-    </w:p>
-    <w:p>
-      <w:pPr>
-        <w:spacing w:line="276" w:lineRule="auto"/>
-      </w:pPr>
-      <w:r>
-        <w:rPr>
-          <w:rFonts w:ascii="Arial" w:hAnsi="Arial"/>
-          <w:sz w:val="28"/>
-        </w:rPr>
-        <w:t xml:space="preserve">built. None of these is a job to do.</w:t>
+        <w:t xml:space="preserve">Newest at the top. Number 1 is the oldest line, at the bottom.</w:t>
+      </w:r>
+    </w:p>
+    <w:p>
+      <w:pPr>
+        <w:spacing w:line="276" w:lineRule="auto"/>
+      </w:pPr>
+      <w:r>
+        <w:rPr>
+          <w:rFonts w:ascii="Arial" w:hAnsi="Arial"/>
+          <w:sz w:val="28"/>
+        </w:rPr>
+        <w:t xml:space="preserve">A new sitting gets the next number on top; nothing else is</w:t>
+      </w:r>
+    </w:p>
+    <w:p>
+      <w:pPr>
+        <w:spacing w:line="276" w:lineRule="auto"/>
+      </w:pPr>
+      <w:r>
+        <w:rPr>
+          <w:rFonts w:ascii="Arial" w:hAnsi="Arial"/>
+          <w:sz w:val="28"/>
+        </w:rPr>
+        <w:t xml:space="preserve">renumbered. One line each. The full story is in</w:t>
+      </w:r>
+    </w:p>
+    <w:p>
+      <w:pPr>
+        <w:spacing w:line="276" w:lineRule="auto"/>
+      </w:pPr>
+      <w:r>
+        <w:rPr>
+          <w:rFonts w:ascii="Arial" w:hAnsi="Arial"/>
+          <w:sz w:val="28"/>
+        </w:rPr>
+        <w:t xml:space="preserve">docs/handoff-history.md.</w:t>
       </w:r>
     </w:p>
     <w:p>
@@ -807,775 +1588,19 @@
           <w:rFonts w:ascii="Arial" w:hAnsi="Arial"/>
           <w:sz w:val="28"/>
         </w:rPr>
-        <w:t xml:space="preserve">1. THE PAGES ARE NOT A REPLACEMENT FOR THE INPUT PAGE. The Input</w:t>
-      </w:r>
-    </w:p>
-    <w:p>
-      <w:pPr>
-        <w:spacing w:line="276" w:lineRule="auto"/>
-      </w:pPr>
-      <w:r>
-        <w:rPr>
-          <w:rFonts w:ascii="Arial" w:hAnsi="Arial"/>
-          <w:sz w:val="28"/>
-        </w:rPr>
-        <w:t xml:space="preserve">   page goes away and nothing replaces it — and the + Add popup in</w:t>
-      </w:r>
-    </w:p>
-    <w:p>
-      <w:pPr>
-        <w:spacing w:line="276" w:lineRule="auto"/>
-      </w:pPr>
-      <w:r>
-        <w:rPr>
-          <w:rFonts w:ascii="Arial" w:hAnsi="Arial"/>
-          <w:sz w:val="28"/>
-        </w:rPr>
-        <w:t xml:space="preserve">   particular is not its replacement. This is your own reminder</w:t>
-      </w:r>
-    </w:p>
-    <w:p>
-      <w:pPr>
-        <w:spacing w:line="276" w:lineRule="auto"/>
-      </w:pPr>
-      <w:r>
-        <w:rPr>
-          <w:rFonts w:ascii="Arial" w:hAnsi="Arial"/>
-          <w:sz w:val="28"/>
-        </w:rPr>
-        <w:t xml:space="preserve">   pages being reshaped by how often a thing comes round.</w:t>
-      </w:r>
-    </w:p>
-    <w:p>
-      <w:pPr>
-        <w:spacing w:line="276" w:lineRule="auto"/>
-      </w:pPr>
-      <w:r>
-        <w:rPr>
-          <w:rFonts w:ascii="Arial" w:hAnsi="Arial"/>
-          <w:sz w:val="28"/>
-        </w:rPr>
-        <w:t xml:space="preserve">2. + ADD ON A PAGE GOES TO THAT PAGE'S OWN NEW. Where does it</w:t>
-      </w:r>
-    </w:p>
-    <w:p>
-      <w:pPr>
-        <w:spacing w:line="276" w:lineRule="auto"/>
-      </w:pPr>
-      <w:r>
-        <w:rPr>
-          <w:rFonts w:ascii="Arial" w:hAnsi="Arial"/>
-          <w:sz w:val="28"/>
-        </w:rPr>
-        <w:t xml:space="preserve">   belong? is only on Options, from + Screen. You do not set</w:t>
-      </w:r>
-    </w:p>
-    <w:p>
-      <w:pPr>
-        <w:spacing w:line="276" w:lineRule="auto"/>
-      </w:pPr>
-      <w:r>
-        <w:rPr>
-          <w:rFonts w:ascii="Arial" w:hAnsi="Arial"/>
-          <w:sz w:val="28"/>
-        </w:rPr>
-        <w:t xml:space="preserve">   another page from a different page (#36-new).</w:t>
-      </w:r>
-    </w:p>
-    <w:p>
-      <w:pPr>
-        <w:spacing w:line="276" w:lineRule="auto"/>
-      </w:pPr>
-      <w:r>
-        <w:rPr>
-          <w:rFonts w:ascii="Arial" w:hAnsi="Arial"/>
-          <w:sz w:val="28"/>
-        </w:rPr>
-        <w:t xml:space="preserve">3. APPOINTMENTS CARRIES THE REMINDERS BEFORE CHIPS — 30 min., 1</w:t>
-      </w:r>
-    </w:p>
-    <w:p>
-      <w:pPr>
-        <w:spacing w:line="276" w:lineRule="auto"/>
-      </w:pPr>
-      <w:r>
-        <w:rPr>
-          <w:rFonts w:ascii="Arial" w:hAnsi="Arial"/>
-          <w:sz w:val="28"/>
-        </w:rPr>
-        <w:t xml:space="preserve">   hour, 2 hours, Morning of, Day Before, Night Before, 2 Days</w:t>
-      </w:r>
-    </w:p>
-    <w:p>
-      <w:pPr>
-        <w:spacing w:line="276" w:lineRule="auto"/>
-      </w:pPr>
-      <w:r>
-        <w:rPr>
-          <w:rFonts w:ascii="Arial" w:hAnsi="Arial"/>
-          <w:sz w:val="28"/>
-        </w:rPr>
-        <w:t xml:space="preserve">   Before, Week, Month — and any and all of them can be on at once.</w:t>
-      </w:r>
-    </w:p>
-    <w:p>
-      <w:pPr>
-        <w:spacing w:line="276" w:lineRule="auto"/>
-      </w:pPr>
-      <w:r>
-        <w:rPr>
-          <w:rFonts w:ascii="Arial" w:hAnsi="Arial"/>
-          <w:sz w:val="28"/>
-        </w:rPr>
-        <w:t xml:space="preserve">   They also remind at the set time, like the rest of the app</w:t>
-      </w:r>
-    </w:p>
-    <w:p>
-      <w:pPr>
-        <w:spacing w:line="276" w:lineRule="auto"/>
-      </w:pPr>
-      <w:r>
-        <w:rPr>
-          <w:rFonts w:ascii="Arial" w:hAnsi="Arial"/>
-          <w:sz w:val="28"/>
-        </w:rPr>
-        <w:t xml:space="preserve">   (Patrick, #74-new; reverses #52-new). The page</w:t>
-      </w:r>
-    </w:p>
-    <w:p>
-      <w:pPr>
-        <w:spacing w:line="276" w:lineRule="auto"/>
-      </w:pPr>
-      <w:r>
-        <w:rPr>
-          <w:rFonts w:ascii="Arial" w:hAnsi="Arial"/>
-          <w:sz w:val="28"/>
-        </w:rPr>
-        <w:t xml:space="preserve">   is called Appointments (#56-new; saved kind appointments, #65-new).</w:t>
-      </w:r>
-    </w:p>
-    <w:p>
-      <w:pPr>
-        <w:spacing w:line="276" w:lineRule="auto"/>
-      </w:pPr>
-      <w:r>
-        <w:rPr>
-          <w:rFonts w:ascii="Arial" w:hAnsi="Arial"/>
-          <w:sz w:val="28"/>
-        </w:rPr>
-        <w:t xml:space="preserve">4. DAILY'S OWN ADD IS ONLY ABOUT TODAY. Two kinds: an every-day</w:t>
-      </w:r>
-    </w:p>
-    <w:p>
-      <w:pPr>
-        <w:spacing w:line="276" w:lineRule="auto"/>
-      </w:pPr>
-      <w:r>
-        <w:rPr>
-          <w:rFonts w:ascii="Arial" w:hAnsi="Arial"/>
-          <w:sz w:val="28"/>
-        </w:rPr>
-        <w:t xml:space="preserve">   item, or a One Time for today. On One Time for today the</w:t>
-      </w:r>
-    </w:p>
-    <w:p>
-      <w:pPr>
-        <w:spacing w:line="276" w:lineRule="auto"/>
-      </w:pPr>
-      <w:r>
-        <w:rPr>
-          <w:rFonts w:ascii="Arial" w:hAnsi="Arial"/>
-          <w:sz w:val="28"/>
-        </w:rPr>
-        <w:t xml:space="preserve">   Reminders before chips are only 30 min., 1 hour, 2 hours, and</w:t>
-      </w:r>
-    </w:p>
-    <w:p>
-      <w:pPr>
-        <w:spacing w:line="276" w:lineRule="auto"/>
-      </w:pPr>
-      <w:r>
-        <w:rPr>
-          <w:rFonts w:ascii="Arial" w:hAnsi="Arial"/>
-          <w:sz w:val="28"/>
-        </w:rPr>
-        <w:t xml:space="preserve">   Time of (the item's own time). Save on that kind comes back on</w:t>
-      </w:r>
-    </w:p>
-    <w:p>
-      <w:pPr>
-        <w:spacing w:line="276" w:lineRule="auto"/>
-      </w:pPr>
-      <w:r>
-        <w:rPr>
-          <w:rFonts w:ascii="Arial" w:hAnsi="Arial"/>
-          <w:sz w:val="28"/>
-        </w:rPr>
-        <w:t xml:space="preserve">   Daily. It is Daily's own one-shot, not an Appointment. An</w:t>
-      </w:r>
-    </w:p>
-    <w:p>
-      <w:pPr>
-        <w:spacing w:line="276" w:lineRule="auto"/>
-      </w:pPr>
-      <w:r>
-        <w:rPr>
-          <w:rFonts w:ascii="Arial" w:hAnsi="Arial"/>
-          <w:sz w:val="28"/>
-        </w:rPr>
-        <w:t xml:space="preserve">   Appointment that falls today still shows on Daily as from</w:t>
-      </w:r>
-    </w:p>
-    <w:p>
-      <w:pPr>
-        <w:spacing w:line="276" w:lineRule="auto"/>
-      </w:pPr>
-      <w:r>
-        <w:rPr>
-          <w:rFonts w:ascii="Arial" w:hAnsi="Arial"/>
-          <w:sz w:val="28"/>
-        </w:rPr>
-        <w:t xml:space="preserve">   Appointments, and still lives on Appointments. The other pages keep their</w:t>
-      </w:r>
-    </w:p>
-    <w:p>
-      <w:pPr>
-        <w:spacing w:line="276" w:lineRule="auto"/>
-      </w:pPr>
-      <w:r>
-        <w:rPr>
-          <w:rFonts w:ascii="Arial" w:hAnsi="Arial"/>
-          <w:sz w:val="28"/>
-        </w:rPr>
-        <w:t xml:space="preserve">   own adds, because on those the page is the whole meaning of Repeat.</w:t>
-      </w:r>
-    </w:p>
-    <w:p>
-      <w:pPr>
-        <w:spacing w:line="276" w:lineRule="auto"/>
-      </w:pPr>
-      <w:r>
-        <w:rPr>
-          <w:rFonts w:ascii="Arial" w:hAnsi="Arial"/>
-          <w:sz w:val="28"/>
-        </w:rPr>
-        <w:t xml:space="preserve">   (#78-new)</w:t>
-      </w:r>
-    </w:p>
-    <w:p>
-      <w:pPr>
-        <w:spacing w:line="276" w:lineRule="auto"/>
-      </w:pPr>
-      <w:r>
-        <w:rPr>
-          <w:rFonts w:ascii="Arial" w:hAnsi="Arial"/>
-          <w:sz w:val="28"/>
-        </w:rPr>
-        <w:t xml:space="preserve">5. ONE REMINDER PER ITEM, NOT TWO, and the app puts itself right</w:t>
-      </w:r>
-    </w:p>
-    <w:p>
-      <w:pPr>
-        <w:spacing w:line="276" w:lineRule="auto"/>
-      </w:pPr>
-      <w:r>
-        <w:rPr>
-          <w:rFonts w:ascii="Arial" w:hAnsi="Arial"/>
-          <w:sz w:val="28"/>
-        </w:rPr>
-        <w:t xml:space="preserve">   when you open it: it tells you what you missed, then sets the</w:t>
-      </w:r>
-    </w:p>
-    <w:p>
-      <w:pPr>
-        <w:spacing w:line="276" w:lineRule="auto"/>
-      </w:pPr>
-      <w:r>
-        <w:rPr>
-          <w:rFonts w:ascii="Arial" w:hAnsi="Arial"/>
-          <w:sz w:val="28"/>
-        </w:rPr>
-        <w:t xml:space="preserve">   reminders again. That is your own reasoning and it replaced the</w:t>
-      </w:r>
-    </w:p>
-    <w:p>
-      <w:pPr>
-        <w:spacing w:line="276" w:lineRule="auto"/>
-      </w:pPr>
-      <w:r>
-        <w:rPr>
-          <w:rFonts w:ascii="Arial" w:hAnsi="Arial"/>
-          <w:sz w:val="28"/>
-        </w:rPr>
-        <w:t xml:space="preserve">   old two-days-ahead rule. A Daily item still arms for tomorrow</w:t>
-      </w:r>
-    </w:p>
-    <w:p>
-      <w:pPr>
-        <w:spacing w:line="276" w:lineRule="auto"/>
-      </w:pPr>
-      <w:r>
-        <w:rPr>
-          <w:rFonts w:ascii="Arial" w:hAnsi="Arial"/>
-          <w:sz w:val="28"/>
-        </w:rPr>
-        <w:t xml:space="preserve">   after Done; that is still one reminder, not two (Patrick, #44-new).</w:t>
-      </w:r>
-    </w:p>
-    <w:p>
-      <w:pPr>
-        <w:spacing w:line="276" w:lineRule="auto"/>
-      </w:pPr>
-      <w:r>
-        <w:rPr>
-          <w:rFonts w:ascii="Arial" w:hAnsi="Arial"/>
-          <w:sz w:val="28"/>
-        </w:rPr>
-        <w:t xml:space="preserve">6. ROCK SOLID IS THE TOP GOAL BUT NOT THE ONLY ONE. Consistency</w:t>
-      </w:r>
-    </w:p>
-    <w:p>
-      <w:pPr>
-        <w:spacing w:line="276" w:lineRule="auto"/>
-      </w:pPr>
-      <w:r>
-        <w:rPr>
-          <w:rFonts w:ascii="Arial" w:hAnsi="Arial"/>
-          <w:sz w:val="28"/>
-        </w:rPr>
-        <w:t xml:space="preserve">   stands beside it. That correction is yours, from #17-new.</w:t>
-      </w:r>
-    </w:p>
-    <w:p>
-      <w:pPr>
-        <w:spacing w:line="276" w:lineRule="auto"/>
-      </w:pPr>
-      <w:r>
-        <w:rPr>
-          <w:rFonts w:ascii="Arial" w:hAnsi="Arial"/>
-          <w:sz w:val="28"/>
-        </w:rPr>
-        <w:t xml:space="preserve">7. ROCK SOLID IS FOR WHEN YOU USE IT. An app that is not being</w:t>
-      </w:r>
-    </w:p>
-    <w:p>
-      <w:pPr>
-        <w:spacing w:line="276" w:lineRule="auto"/>
-      </w:pPr>
-      <w:r>
-        <w:rPr>
-          <w:rFonts w:ascii="Arial" w:hAnsi="Arial"/>
-          <w:sz w:val="28"/>
-        </w:rPr>
-        <w:t xml:space="preserve">   opened is not being used, and what the old second copy protected</w:t>
-      </w:r>
-    </w:p>
-    <w:p>
-      <w:pPr>
-        <w:spacing w:line="276" w:lineRule="auto"/>
-      </w:pPr>
-      <w:r>
-        <w:rPr>
-          <w:rFonts w:ascii="Arial" w:hAnsi="Arial"/>
-          <w:sz w:val="28"/>
-        </w:rPr>
-        <w:t xml:space="preserve">   was one day and no more.</w:t>
-      </w:r>
-    </w:p>
-    <w:p>
-      <w:pPr>
-        <w:spacing w:line="276" w:lineRule="auto"/>
-      </w:pPr>
-      <w:r>
-        <w:rPr>
-          <w:rFonts w:ascii="Arial" w:hAnsi="Arial"/>
-          <w:sz w:val="28"/>
-        </w:rPr>
-        <w:t xml:space="preserve">8. AN EXTENDED ITEM AND A DAILY TICK ARE OPPOSITES. A Bucket List</w:t>
-      </w:r>
-    </w:p>
-    <w:p>
-      <w:pPr>
-        <w:spacing w:line="276" w:lineRule="auto"/>
-      </w:pPr>
-      <w:r>
-        <w:rPr>
-          <w:rFonts w:ascii="Arial" w:hAnsi="Arial"/>
-          <w:sz w:val="28"/>
-        </w:rPr>
-        <w:t xml:space="preserve">   item (saved kind bucketlist) says a thing is not yet done and must</w:t>
-      </w:r>
-    </w:p>
-    <w:p>
-      <w:pPr>
-        <w:spacing w:line="276" w:lineRule="auto"/>
-      </w:pPr>
-      <w:r>
-        <w:rPr>
-          <w:rFonts w:ascii="Arial" w:hAnsi="Arial"/>
-          <w:sz w:val="28"/>
-        </w:rPr>
-        <w:t xml:space="preserve">   survive the night. The coffee-and-water sort says a thing was</w:t>
-      </w:r>
-    </w:p>
-    <w:p>
-      <w:pPr>
-        <w:spacing w:line="276" w:lineRule="auto"/>
-      </w:pPr>
-      <w:r>
-        <w:rPr>
-          <w:rFonts w:ascii="Arial" w:hAnsi="Arial"/>
-          <w:sz w:val="28"/>
-        </w:rPr>
-        <w:t xml:space="preserve">   done today and is meaningless the morning after. They must never</w:t>
-      </w:r>
-    </w:p>
-    <w:p>
-      <w:pPr>
-        <w:spacing w:line="276" w:lineRule="auto"/>
-      </w:pPr>
-      <w:r>
-        <w:rPr>
-          <w:rFonts w:ascii="Arial" w:hAnsi="Arial"/>
-          <w:sz w:val="28"/>
-        </w:rPr>
-        <w:t xml:space="preserve">   be merged.</w:t>
-      </w:r>
-    </w:p>
-    <w:p>
-      <w:pPr>
-        <w:spacing w:line="276" w:lineRule="auto"/>
-      </w:pPr>
-      <w:r>
-        <w:rPr>
-          <w:rFonts w:ascii="Arial" w:hAnsi="Arial"/>
-          <w:sz w:val="28"/>
-        </w:rPr>
-        <w:t xml:space="preserve">9. TIMES SET BY SPINNING THROUGH NOON OR MIDNIGHT BEFORE #27-new</w:t>
-      </w:r>
-    </w:p>
-    <w:p>
-      <w:pPr>
-        <w:spacing w:line="276" w:lineRule="auto"/>
-      </w:pPr>
-      <w:r>
-        <w:rPr>
-          <w:rFonts w:ascii="Arial" w:hAnsi="Arial"/>
-          <w:sz w:val="28"/>
-        </w:rPr>
-        <w:t xml:space="preserve">    are stored in the wrong half of the day and want re-setting.</w:t>
-      </w:r>
-    </w:p>
-    <w:p>
-      <w:pPr>
-        <w:spacing w:line="276" w:lineRule="auto"/>
-      </w:pPr>
-      <w:r>
-        <w:rPr>
-          <w:rFonts w:ascii="Arial" w:hAnsi="Arial"/>
-          <w:sz w:val="28"/>
-        </w:rPr>
-        <w:t xml:space="preserve">10. TASKS SAVED BEFORE THE DATE FIX carry a date they were given</w:t>
-      </w:r>
-    </w:p>
-    <w:p>
-      <w:pPr>
-        <w:spacing w:line="276" w:lineRule="auto"/>
-      </w:pPr>
-      <w:r>
-        <w:rPr>
-          <w:rFonts w:ascii="Arial" w:hAnsi="Arial"/>
-          <w:sz w:val="28"/>
-        </w:rPr>
-        <w:t xml:space="preserve">    rather than one you chose.</w:t>
-      </w:r>
-    </w:p>
-    <w:p>
-      <w:pPr>
-        <w:spacing w:line="276" w:lineRule="auto"/>
-      </w:pPr>
-      <w:r>
-        <w:rPr>
-          <w:rFonts w:ascii="Arial" w:hAnsi="Arial"/>
-          <w:sz w:val="28"/>
-        </w:rPr>
-        <w:t xml:space="preserve">11. A BIG PIECE GETS A BUILD SHEET FIRST — self-contained, carrying</w:t>
-      </w:r>
-    </w:p>
-    <w:p>
-      <w:pPr>
-        <w:spacing w:line="276" w:lineRule="auto"/>
-      </w:pPr>
-      <w:r>
-        <w:rPr>
-          <w:rFonts w:ascii="Arial" w:hAnsi="Arial"/>
-          <w:sz w:val="28"/>
-        </w:rPr>
-        <w:t xml:space="preserve">    every answer, so whoever builds it never has to ask you a</w:t>
-      </w:r>
-    </w:p>
-    <w:p>
-      <w:pPr>
-        <w:spacing w:line="276" w:lineRule="auto"/>
-      </w:pPr>
-      <w:r>
-        <w:rPr>
-          <w:rFonts w:ascii="Arial" w:hAnsi="Arial"/>
-          <w:sz w:val="28"/>
-        </w:rPr>
-        <w:t xml:space="preserve">    design question.</w:t>
-      </w:r>
-    </w:p>
-    <w:p>
-      <w:pPr>
-        <w:spacing w:line="276" w:lineRule="auto"/>
-      </w:pPr>
-      <w:r>
-        <w:rPr>
-          <w:rFonts w:ascii="Arial" w:hAnsi="Arial"/>
-          <w:sz w:val="28"/>
-        </w:rPr>
-        <w:t xml:space="preserve">12. BARE SESSION NUMBERS mean the old shared chain. This project's</w:t>
-      </w:r>
-    </w:p>
-    <w:p>
-      <w:pPr>
-        <w:spacing w:line="276" w:lineRule="auto"/>
-      </w:pPr>
-      <w:r>
-        <w:rPr>
-          <w:rFonts w:ascii="Arial" w:hAnsi="Arial"/>
-          <w:sz w:val="28"/>
-        </w:rPr>
-        <w:t xml:space="preserve">    own chain is written #1-new, #2-new, and so on.</w:t>
-      </w:r>
-    </w:p>
-    <w:p>
-      <w:pPr>
-        <w:spacing w:line="276" w:lineRule="auto"/>
-      </w:pPr>
-      <w:r>
-        <w:rPr>
-          <w:rFonts w:ascii="Arial" w:hAnsi="Arial"/>
-          <w:sz w:val="28"/>
-        </w:rPr>
-        <w:t xml:space="preserve">13. WORKING DOCUMENTS LIVE IN docs. History lives in docs-ref, and</w:t>
-      </w:r>
-    </w:p>
-    <w:p>
-      <w:pPr>
-        <w:spacing w:line="276" w:lineRule="auto"/>
-      </w:pPr>
-      <w:r>
-        <w:rPr>
-          <w:rFonts w:ascii="Arial" w:hAnsi="Arial"/>
-          <w:sz w:val="28"/>
-        </w:rPr>
-        <w:t xml:space="preserve">    the build sheets are in docs-ref/build-sheets. The index</w:t>
-      </w:r>
-    </w:p>
-    <w:p>
-      <w:pPr>
-        <w:spacing w:line="276" w:lineRule="auto"/>
-      </w:pPr>
-      <w:r>
-        <w:rPr>
-          <w:rFonts w:ascii="Arial" w:hAnsi="Arial"/>
-          <w:sz w:val="28"/>
-        </w:rPr>
-        <w:t xml:space="preserve">    says which file is the home. He calls them working documents;</w:t>
-      </w:r>
-    </w:p>
-    <w:p>
-      <w:pPr>
-        <w:spacing w:line="276" w:lineRule="auto"/>
-      </w:pPr>
-      <w:r>
-        <w:rPr>
-          <w:rFonts w:ascii="Arial" w:hAnsi="Arial"/>
-          <w:sz w:val="28"/>
-        </w:rPr>
-        <w:t xml:space="preserve">    live desk means the same thing. (App-Docs, 2026-08-31)</w:t>
-      </w:r>
-    </w:p>
-    <w:p>
-      <w:pPr>
-        <w:spacing w:line="276" w:lineRule="auto"/>
-      </w:pPr>
-      <w:r>
-        <w:rPr>
-          <w:rFonts w:ascii="Arial" w:hAnsi="Arial"/>
-          <w:sz w:val="28"/>
-        </w:rPr>
-        <w:t xml:space="preserve">14. THE CALENDAR PAGE SHOWS DATED ITEMS. No every-day Daily items,</w:t>
-      </w:r>
-    </w:p>
-    <w:p>
-      <w:pPr>
-        <w:spacing w:line="276" w:lineRule="auto"/>
-      </w:pPr>
-      <w:r>
-        <w:rPr>
-          <w:rFonts w:ascii="Arial" w:hAnsi="Arial"/>
-          <w:sz w:val="28"/>
-        </w:rPr>
-        <w:t xml:space="preserve">    no Bucket List. No Done or Snooze on the month or the day’s list.</w:t>
-      </w:r>
-    </w:p>
-    <w:p>
-      <w:pPr>
-        <w:spacing w:line="276" w:lineRule="auto"/>
-      </w:pPr>
-      <w:r>
-        <w:rPr>
-          <w:rFonts w:ascii="Arial" w:hAnsi="Arial"/>
-          <w:sz w:val="28"/>
-        </w:rPr>
-        <w:t xml:space="preserve">    Names in a day box are one line and scroll vertically.</w:t>
-      </w:r>
-    </w:p>
-    <w:p>
-      <w:pPr>
-        <w:spacing w:line="276" w:lineRule="auto"/>
-      </w:pPr>
-      <w:r>
-        <w:rPr>
-          <w:rFonts w:ascii="Arial" w:hAnsi="Arial"/>
-          <w:sz w:val="28"/>
-        </w:rPr>
-        <w:t xml:space="preserve">    Landscape is an optional view: 0°, 90° counter-clockwise, and</w:t>
-      </w:r>
-    </w:p>
-    <w:p>
-      <w:pPr>
-        <w:spacing w:line="276" w:lineRule="auto"/>
-      </w:pPr>
-      <w:r>
-        <w:rPr>
-          <w:rFonts w:ascii="Arial" w:hAnsi="Arial"/>
-          <w:sz w:val="28"/>
-        </w:rPr>
-        <w:t xml:space="preserve">    270° counter-clockwise; 180° upside-down is out. Headers stay</w:t>
-      </w:r>
-    </w:p>
-    <w:p>
-      <w:pPr>
-        <w:spacing w:line="276" w:lineRule="auto"/>
-      </w:pPr>
-      <w:r>
-        <w:rPr>
-          <w:rFonts w:ascii="Arial" w:hAnsi="Arial"/>
-          <w:sz w:val="28"/>
-        </w:rPr>
-        <w:t xml:space="preserve">    at the physical top of the phone, all pages. The calendar month</w:t>
-      </w:r>
-    </w:p>
-    <w:p>
-      <w:pPr>
-        <w:spacing w:line="276" w:lineRule="auto"/>
-      </w:pPr>
-      <w:r>
-        <w:rPr>
-          <w:rFonts w:ascii="Arial" w:hAnsi="Arial"/>
-          <w:sz w:val="28"/>
-        </w:rPr>
-        <w:t xml:space="preserve">    grid was not rebuilt.</w:t>
-      </w:r>
-    </w:p>
-    <w:p>
-      <w:pPr>
-        <w:spacing w:line="276" w:lineRule="auto"/>
-      </w:pPr>
-      <w:r>
-        <w:rPr>
-          <w:rFonts w:ascii="Arial" w:hAnsi="Arial"/>
-          <w:sz w:val="28"/>
-        </w:rPr>
-        <w:t xml:space="preserve">15. HAVING A GOOD IDEA LEADS TO OVERREACHING (Patrick, #52-new).</w:t>
-      </w:r>
-    </w:p>
-    <w:p>
-      <w:pPr>
-        <w:spacing w:line="276" w:lineRule="auto"/>
-      </w:pPr>
-      <w:r>
-        <w:rPr>
-          <w:rFonts w:ascii="Arial" w:hAnsi="Arial"/>
-          <w:sz w:val="28"/>
-        </w:rPr>
-        <w:t xml:space="preserve">    The feedback he needs is the trim: what part is worth it,</w:t>
-      </w:r>
-    </w:p>
-    <w:p>
-      <w:pPr>
-        <w:spacing w:line="276" w:lineRule="auto"/>
-      </w:pPr>
-      <w:r>
-        <w:rPr>
-          <w:rFonts w:ascii="Arial" w:hAnsi="Arial"/>
-          <w:sz w:val="28"/>
-        </w:rPr>
-        <w:t xml:space="preserve">    and what is more than is there.</w:t>
-      </w:r>
-    </w:p>
-    <w:p>
-      <w:pPr>
-        <w:spacing w:line="276" w:lineRule="auto"/>
-      </w:pPr>
-      <w:r>
-        <w:rPr>
-          <w:rFonts w:ascii="Arial" w:hAnsi="Arial"/>
-          <w:sz w:val="28"/>
-        </w:rPr>
-        <w:t xml:space="preserve">16. THE DESIGN DESCRIPTION IS THE DESIGNED IMPLEMENTATION</w:t>
-      </w:r>
-    </w:p>
-    <w:p>
-      <w:pPr>
-        <w:spacing w:line="276" w:lineRule="auto"/>
-      </w:pPr>
-      <w:r>
-        <w:rPr>
-          <w:rFonts w:ascii="Arial" w:hAnsi="Arial"/>
-          <w:sz w:val="28"/>
-        </w:rPr>
-        <w:t xml:space="preserve">    (Patrick, #84-new). It is the guide for the whole app. A sitting</w:t>
-      </w:r>
-    </w:p>
-    <w:p>
-      <w:pPr>
-        <w:spacing w:line="276" w:lineRule="auto"/>
-      </w:pPr>
-      <w:r>
-        <w:rPr>
-          <w:rFonts w:ascii="Arial" w:hAnsi="Arial"/>
-          <w:sz w:val="28"/>
-        </w:rPr>
-        <w:t xml:space="preserve">    builds from docs/designed-implementation.md and does not ask</w:t>
-      </w:r>
-    </w:p>
-    <w:p>
-      <w:pPr>
-        <w:spacing w:line="276" w:lineRule="auto"/>
-      </w:pPr>
-      <w:r>
-        <w:rPr>
-          <w:rFonts w:ascii="Arial" w:hAnsi="Arial"/>
-          <w:sz w:val="28"/>
-        </w:rPr>
-        <w:t xml:space="preserve">    Patrick a design question. Home, Help, Calendar, Settings, Backup,</w:t>
-      </w:r>
-    </w:p>
-    <w:p>
-      <w:pPr>
-        <w:spacing w:line="276" w:lineRule="auto"/>
-      </w:pPr>
-      <w:r>
-        <w:rPr>
-          <w:rFonts w:ascii="Arial" w:hAnsi="Arial"/>
-          <w:sz w:val="28"/>
-        </w:rPr>
-        <w:t xml:space="preserve">    Scheduled Reminders, Options, and Log are in that file.</w:t>
+        <w:t xml:space="preserve">97. #98-new — User's Guide words. First-load popup on Home with the</w:t>
+      </w:r>
+    </w:p>
+    <w:p>
+      <w:pPr>
+        <w:spacing w:line="276" w:lineRule="auto"/>
+      </w:pPr>
+      <w:r>
+        <w:rPr>
+          <w:rFonts w:ascii="Arial" w:hAnsi="Arial"/>
+          <w:sz w:val="28"/>
+        </w:rPr>
+        <w:t xml:space="preserve">    same four paragraphs. Got it remembers. Checked on the simulator.</w:t>
       </w:r>
     </w:p>
     <w:p>
@@ -1599,6 +1624,30 @@
           <w:rFonts w:ascii="Arial" w:hAnsi="Arial"/>
           <w:sz w:val="28"/>
         </w:rPr>
+        <w:t xml:space="preserve">96. #97-new — User's Guide tile on Settings. Empty page, Back to</w:t>
+      </w:r>
+    </w:p>
+    <w:p>
+      <w:pPr>
+        <w:spacing w:line="276" w:lineRule="auto"/>
+      </w:pPr>
+      <w:r>
+        <w:rPr>
+          <w:rFonts w:ascii="Arial" w:hAnsi="Arial"/>
+          <w:sz w:val="28"/>
+        </w:rPr>
+        <w:t xml:space="preserve">    Settings. Words wait for a later sitting. Not on the phone.</w:t>
+      </w:r>
+    </w:p>
+    <w:p>
+      <w:pPr>
+        <w:spacing w:line="276" w:lineRule="auto"/>
+      </w:pPr>
+      <w:r>
+        <w:rPr>
+          <w:rFonts w:ascii="Arial" w:hAnsi="Arial"/>
+          <w:sz w:val="28"/>
+        </w:rPr>
         <w:t xml:space="preserve"/>
       </w:r>
     </w:p>
@@ -1609,70 +1658,57 @@
       <w:r>
         <w:rPr>
           <w:rFonts w:ascii="Arial" w:hAnsi="Arial"/>
-          <w:b/>
-          <w:sz w:val="28"/>
-        </w:rPr>
-        <w:t xml:space="preserve">WHAT IS DONE, NEWEST FIRST</w:t>
-      </w:r>
-    </w:p>
-    <w:p>
-      <w:pPr>
-        <w:spacing w:line="276" w:lineRule="auto"/>
-      </w:pPr>
-      <w:r>
-        <w:rPr>
-          <w:rFonts w:ascii="Arial" w:hAnsi="Arial"/>
-          <w:sz w:val="28"/>
-        </w:rPr>
-        <w:t xml:space="preserve">------------------------------------------------------------------</w:t>
-      </w:r>
-    </w:p>
-    <w:p>
-      <w:pPr>
-        <w:spacing w:line="276" w:lineRule="auto"/>
-      </w:pPr>
-      <w:r>
-        <w:rPr>
-          <w:rFonts w:ascii="Arial" w:hAnsi="Arial"/>
-          <w:sz w:val="28"/>
-        </w:rPr>
-        <w:t xml:space="preserve">Newest at the top. Number 1 is the oldest line, at the bottom.</w:t>
-      </w:r>
-    </w:p>
-    <w:p>
-      <w:pPr>
-        <w:spacing w:line="276" w:lineRule="auto"/>
-      </w:pPr>
-      <w:r>
-        <w:rPr>
-          <w:rFonts w:ascii="Arial" w:hAnsi="Arial"/>
-          <w:sz w:val="28"/>
-        </w:rPr>
-        <w:t xml:space="preserve">A new sitting gets the next number on top; nothing else is</w:t>
-      </w:r>
-    </w:p>
-    <w:p>
-      <w:pPr>
-        <w:spacing w:line="276" w:lineRule="auto"/>
-      </w:pPr>
-      <w:r>
-        <w:rPr>
-          <w:rFonts w:ascii="Arial" w:hAnsi="Arial"/>
-          <w:sz w:val="28"/>
-        </w:rPr>
-        <w:t xml:space="preserve">renumbered. One line each. The full story is in</w:t>
-      </w:r>
-    </w:p>
-    <w:p>
-      <w:pPr>
-        <w:spacing w:line="276" w:lineRule="auto"/>
-      </w:pPr>
-      <w:r>
-        <w:rPr>
-          <w:rFonts w:ascii="Arial" w:hAnsi="Arial"/>
-          <w:sz w:val="28"/>
-        </w:rPr>
-        <w:t xml:space="preserve">docs/handoff-history.md.</w:t>
+          <w:sz w:val="28"/>
+        </w:rPr>
+        <w:t xml:space="preserve">95. #97-new — Reset All Data in the Settings header. After Face ID</w:t>
+      </w:r>
+    </w:p>
+    <w:p>
+      <w:pPr>
+        <w:spacing w:line="276" w:lineRule="auto"/>
+      </w:pPr>
+      <w:r>
+        <w:rPr>
+          <w:rFonts w:ascii="Arial" w:hAnsi="Arial"/>
+          <w:sz w:val="28"/>
+        </w:rPr>
+        <w:t xml:space="preserve">    or passcode, Are you sure? Cancel backs out. Not on the phone.</w:t>
+      </w:r>
+    </w:p>
+    <w:p>
+      <w:pPr>
+        <w:spacing w:line="276" w:lineRule="auto"/>
+      </w:pPr>
+      <w:r>
+        <w:rPr>
+          <w:rFonts w:ascii="Arial" w:hAnsi="Arial"/>
+          <w:sz w:val="28"/>
+        </w:rPr>
+        <w:t xml:space="preserve"/>
+      </w:r>
+    </w:p>
+    <w:p>
+      <w:pPr>
+        <w:spacing w:line="276" w:lineRule="auto"/>
+      </w:pPr>
+      <w:r>
+        <w:rPr>
+          <w:rFonts w:ascii="Arial" w:hAnsi="Arial"/>
+          <w:sz w:val="28"/>
+        </w:rPr>
+        <w:t xml:space="preserve">94. #97-new — Feedback tile on Settings. Same popup as Mystery.</w:t>
+      </w:r>
+    </w:p>
+    <w:p>
+      <w:pPr>
+        <w:spacing w:line="276" w:lineRule="auto"/>
+      </w:pPr>
+      <w:r>
+        <w:rPr>
+          <w:rFonts w:ascii="Arial" w:hAnsi="Arial"/>
+          <w:sz w:val="28"/>
+        </w:rPr>
+        <w:t xml:space="preserve">    Send opens Mail. Not on the phone.</w:t>
       </w:r>
     </w:p>
     <w:p>

</xml_diff>

<commit_message>
100-new - Memory - Changed the duplicate Home page badge pictures before the App Store.
</commit_message>
<xml_diff>
--- a/docs/pending.docx
+++ b/docs/pending.docx
@@ -24,7 +24,7 @@
           <w:rFonts w:ascii="Arial" w:hAnsi="Arial"/>
           <w:sz w:val="28"/>
         </w:rPr>
-        <w:t xml:space="preserve">Last updated: 2026-09-09 (#98-new)</w:t>
+        <w:t xml:space="preserve">Last updated: 2026-09-09 (#100-new)</w:t>
       </w:r>
     </w:p>
     <w:p>
@@ -361,6 +361,66 @@
           <w:rFonts w:ascii="Arial" w:hAnsi="Arial"/>
           <w:sz w:val="28"/>
         </w:rPr>
+        <w:t xml:space="preserve">2. LAST REVIEW BEFORE THE APP STORE (#99-new). Three lenses: bugs;</w:t>
+      </w:r>
+    </w:p>
+    <w:p>
+      <w:pPr>
+        <w:spacing w:line="276" w:lineRule="auto"/>
+      </w:pPr>
+      <w:r>
+        <w:rPr>
+          <w:rFonts w:ascii="Arial" w:hAnsi="Arial"/>
+          <w:sz w:val="28"/>
+        </w:rPr>
+        <w:t xml:space="preserve">   whether it is coming out as one of the better reminder apps and</w:t>
+      </w:r>
+    </w:p>
+    <w:p>
+      <w:pPr>
+        <w:spacing w:line="276" w:lineRule="auto"/>
+      </w:pPr>
+      <w:r>
+        <w:rPr>
+          <w:rFonts w:ascii="Arial" w:hAnsi="Arial"/>
+          <w:sz w:val="28"/>
+        </w:rPr>
+        <w:t xml:space="preserve">   one of the easier; leftover special rules on top of a kind, not</w:t>
+      </w:r>
+    </w:p>
+    <w:p>
+      <w:pPr>
+        <w:spacing w:line="276" w:lineRule="auto"/>
+      </w:pPr>
+      <w:r>
+        <w:rPr>
+          <w:rFonts w:ascii="Arial" w:hAnsi="Arial"/>
+          <w:sz w:val="28"/>
+        </w:rPr>
+        <w:t xml:space="preserve">   the ordinary kind-per-page that software does. The designed</w:t>
+      </w:r>
+    </w:p>
+    <w:p>
+      <w:pPr>
+        <w:spacing w:line="276" w:lineRule="auto"/>
+      </w:pPr>
+      <w:r>
+        <w:rPr>
+          <w:rFonts w:ascii="Arial" w:hAnsi="Arial"/>
+          <w:sz w:val="28"/>
+        </w:rPr>
+        <w:t xml:space="preserve">   implementation is not the last word.</w:t>
+      </w:r>
+    </w:p>
+    <w:p>
+      <w:pPr>
+        <w:spacing w:line="276" w:lineRule="auto"/>
+      </w:pPr>
+      <w:r>
+        <w:rPr>
+          <w:rFonts w:ascii="Arial" w:hAnsi="Arial"/>
+          <w:sz w:val="28"/>
+        </w:rPr>
         <w:t xml:space="preserve"/>
       </w:r>
     </w:p>
@@ -1565,6 +1625,54 @@
           <w:sz w:val="28"/>
         </w:rPr>
         <w:t xml:space="preserve">docs/handoff-history.md.</w:t>
+      </w:r>
+    </w:p>
+    <w:p>
+      <w:pPr>
+        <w:spacing w:line="276" w:lineRule="auto"/>
+      </w:pPr>
+      <w:r>
+        <w:rPr>
+          <w:rFonts w:ascii="Arial" w:hAnsi="Arial"/>
+          <w:sz w:val="28"/>
+        </w:rPr>
+        <w:t xml:space="preserve"/>
+      </w:r>
+    </w:p>
+    <w:p>
+      <w:pPr>
+        <w:spacing w:line="276" w:lineRule="auto"/>
+      </w:pPr>
+      <w:r>
+        <w:rPr>
+          <w:rFonts w:ascii="Arial" w:hAnsi="Arial"/>
+          <w:sz w:val="28"/>
+        </w:rPr>
+        <w:t xml:space="preserve">98. #100-new — Yearly, Quarterly, and Monthly Home badges no longer</w:t>
+      </w:r>
+    </w:p>
+    <w:p>
+      <w:pPr>
+        <w:spacing w:line="276" w:lineRule="auto"/>
+      </w:pPr>
+      <w:r>
+        <w:rPr>
+          <w:rFonts w:ascii="Arial" w:hAnsi="Arial"/>
+          <w:sz w:val="28"/>
+        </w:rPr>
+        <w:t xml:space="preserve">    share a telescope. Yearly keeps it. Quarterly is a fallen leaf.</w:t>
+      </w:r>
+    </w:p>
+    <w:p>
+      <w:pPr>
+        <w:spacing w:line="276" w:lineRule="auto"/>
+      </w:pPr>
+      <w:r>
+        <w:rPr>
+          <w:rFonts w:ascii="Arial" w:hAnsi="Arial"/>
+          <w:sz w:val="28"/>
+        </w:rPr>
+        <w:t xml:space="preserve">    Monthly is a first-quarter moon. Checked on the simulator.</w:t>
       </w:r>
     </w:p>
     <w:p>

</xml_diff>

<commit_message>
100.1-new - Home page badge update
</commit_message>
<xml_diff>
--- a/docs/pending.docx
+++ b/docs/pending.docx
@@ -1539,6 +1539,90 @@
           <w:rFonts w:ascii="Arial" w:hAnsi="Arial"/>
           <w:sz w:val="28"/>
         </w:rPr>
+        <w:t xml:space="preserve">17. DATED ITEMS WAIT ABOUT A MONTH (Patrick, 2026-09-09). That wait is</w:t>
+      </w:r>
+    </w:p>
+    <w:p>
+      <w:pPr>
+        <w:spacing w:line="276" w:lineRule="auto"/>
+      </w:pPr>
+      <w:r>
+        <w:rPr>
+          <w:rFonts w:ascii="Arial" w:hAnsi="Arial"/>
+          <w:sz w:val="28"/>
+        </w:rPr>
+        <w:t xml:space="preserve">    a bit on the table. Monthly, Quarterly, Yearly, and Birthdays have</w:t>
+      </w:r>
+    </w:p>
+    <w:p>
+      <w:pPr>
+        <w:spacing w:line="276" w:lineRule="auto"/>
+      </w:pPr>
+      <w:r>
+        <w:rPr>
+          <w:rFonts w:ascii="Arial" w:hAnsi="Arial"/>
+          <w:sz w:val="28"/>
+        </w:rPr>
+        <w:t xml:space="preserve">    it on. Daily, Weekly, Appointments, and the rest have it off. The</w:t>
+      </w:r>
+    </w:p>
+    <w:p>
+      <w:pPr>
+        <w:spacing w:line="276" w:lineRule="auto"/>
+      </w:pPr>
+      <w:r>
+        <w:rPr>
+          <w:rFonts w:ascii="Arial" w:hAnsi="Arial"/>
+          <w:sz w:val="28"/>
+        </w:rPr>
+        <w:t xml:space="preserve">    join reads the bit. Depth stays one. Opening the app arms a waiting</w:t>
+      </w:r>
+    </w:p>
+    <w:p>
+      <w:pPr>
+        <w:spacing w:line="276" w:lineRule="auto"/>
+      </w:pPr>
+      <w:r>
+        <w:rPr>
+          <w:rFonts w:ascii="Arial" w:hAnsi="Arial"/>
+          <w:sz w:val="28"/>
+        </w:rPr>
+        <w:t xml:space="preserve">    item when it has come close enough. Several lead times on one item</w:t>
+      </w:r>
+    </w:p>
+    <w:p>
+      <w:pPr>
+        <w:spacing w:line="276" w:lineRule="auto"/>
+      </w:pPr>
+      <w:r>
+        <w:rPr>
+          <w:rFonts w:ascii="Arial" w:hAnsi="Arial"/>
+          <w:sz w:val="28"/>
+        </w:rPr>
+        <w:t xml:space="preserve">    also use that depth: only the soonest still ahead is armed. When it</w:t>
+      </w:r>
+    </w:p>
+    <w:p>
+      <w:pPr>
+        <w:spacing w:line="276" w:lineRule="auto"/>
+      </w:pPr>
+      <w:r>
+        <w:rPr>
+          <w:rFonts w:ascii="Arial" w:hAnsi="Arial"/>
+          <w:sz w:val="28"/>
+        </w:rPr>
+        <w:t xml:space="preserve">    has fired, the next run arms the next.</w:t>
+      </w:r>
+    </w:p>
+    <w:p>
+      <w:pPr>
+        <w:spacing w:line="276" w:lineRule="auto"/>
+      </w:pPr>
+      <w:r>
+        <w:rPr>
+          <w:rFonts w:ascii="Arial" w:hAnsi="Arial"/>
+          <w:sz w:val="28"/>
+        </w:rPr>
         <w:t xml:space="preserve"/>
       </w:r>
     </w:p>
@@ -1625,6 +1709,126 @@
           <w:sz w:val="28"/>
         </w:rPr>
         <w:t xml:space="preserve">docs/handoff-history.md.</w:t>
+      </w:r>
+    </w:p>
+    <w:p>
+      <w:pPr>
+        <w:spacing w:line="276" w:lineRule="auto"/>
+      </w:pPr>
+      <w:r>
+        <w:rPr>
+          <w:rFonts w:ascii="Arial" w:hAnsi="Arial"/>
+          <w:sz w:val="28"/>
+        </w:rPr>
+        <w:t xml:space="preserve"/>
+      </w:r>
+    </w:p>
+    <w:p>
+      <w:pPr>
+        <w:spacing w:line="276" w:lineRule="auto"/>
+      </w:pPr>
+      <w:r>
+        <w:rPr>
+          <w:rFonts w:ascii="Arial" w:hAnsi="Arial"/>
+          <w:sz w:val="28"/>
+        </w:rPr>
+        <w:t xml:space="preserve">101. #100-new — A weekday monthly looks from the saved date, so Done</w:t>
+      </w:r>
+    </w:p>
+    <w:p>
+      <w:pPr>
+        <w:spacing w:line="276" w:lineRule="auto"/>
+      </w:pPr>
+      <w:r>
+        <w:rPr>
+          <w:rFonts w:ascii="Arial" w:hAnsi="Arial"/>
+          <w:sz w:val="28"/>
+        </w:rPr>
+        <w:t xml:space="preserve">    takes it off Daily. 351 tests. Not on the phone.</w:t>
+      </w:r>
+    </w:p>
+    <w:p>
+      <w:pPr>
+        <w:spacing w:line="276" w:lineRule="auto"/>
+      </w:pPr>
+      <w:r>
+        <w:rPr>
+          <w:rFonts w:ascii="Arial" w:hAnsi="Arial"/>
+          <w:sz w:val="28"/>
+        </w:rPr>
+        <w:t xml:space="preserve"/>
+      </w:r>
+    </w:p>
+    <w:p>
+      <w:pPr>
+        <w:spacing w:line="276" w:lineRule="auto"/>
+      </w:pPr>
+      <w:r>
+        <w:rPr>
+          <w:rFonts w:ascii="Arial" w:hAnsi="Arial"/>
+          <w:sz w:val="28"/>
+        </w:rPr>
+        <w:t xml:space="preserve">100. #100-new — Yearly and Birthdays write year on the table. How near</w:t>
+      </w:r>
+    </w:p>
+    <w:p>
+      <w:pPr>
+        <w:spacing w:line="276" w:lineRule="auto"/>
+      </w:pPr>
+      <w:r>
+        <w:rPr>
+          <w:rFonts w:ascii="Arial" w:hAnsi="Arial"/>
+          <w:sz w:val="28"/>
+        </w:rPr>
+        <w:t xml:space="preserve">    is a number: Monthly thirty days; Quarterly, Yearly, and Birthdays</w:t>
+      </w:r>
+    </w:p>
+    <w:p>
+      <w:pPr>
+        <w:spacing w:line="276" w:lineRule="auto"/>
+      </w:pPr>
+      <w:r>
+        <w:rPr>
+          <w:rFonts w:ascii="Arial" w:hAnsi="Arial"/>
+          <w:sz w:val="28"/>
+        </w:rPr>
+        <w:t xml:space="preserve">    sixty days, from the date. 350 tests. Not on the phone.</w:t>
+      </w:r>
+    </w:p>
+    <w:p>
+      <w:pPr>
+        <w:spacing w:line="276" w:lineRule="auto"/>
+      </w:pPr>
+      <w:r>
+        <w:rPr>
+          <w:rFonts w:ascii="Arial" w:hAnsi="Arial"/>
+          <w:sz w:val="28"/>
+        </w:rPr>
+        <w:t xml:space="preserve"/>
+      </w:r>
+    </w:p>
+    <w:p>
+      <w:pPr>
+        <w:spacing w:line="276" w:lineRule="auto"/>
+      </w:pPr>
+      <w:r>
+        <w:rPr>
+          <w:rFonts w:ascii="Arial" w:hAnsi="Arial"/>
+          <w:sz w:val="28"/>
+        </w:rPr>
+        <w:t xml:space="preserve">99. 2026-09-09 — month wait as a table bit; soonest lead only.</w:t>
+      </w:r>
+    </w:p>
+    <w:p>
+      <w:pPr>
+        <w:spacing w:line="276" w:lineRule="auto"/>
+      </w:pPr>
+      <w:r>
+        <w:rPr>
+          <w:rFonts w:ascii="Arial" w:hAnsi="Arial"/>
+          <w:sz w:val="28"/>
+        </w:rPr>
+        <w:t xml:space="preserve">    Build 78 on the phone. Scheduled Reminders down to 14. 347 tests.</w:t>
       </w:r>
     </w:p>
     <w:p>

</xml_diff>

<commit_message>
102-new - Memory - The goal is to fix Time Set back-out, & B-day updates.
</commit_message>
<xml_diff>
--- a/docs/pending.docx
+++ b/docs/pending.docx
@@ -24,7 +24,7 @@
           <w:rFonts w:ascii="Arial" w:hAnsi="Arial"/>
           <w:sz w:val="28"/>
         </w:rPr>
-        <w:t xml:space="preserve">Last updated: 2026-09-09 (#100-new)</w:t>
+        <w:t xml:space="preserve">Last updated: 2026-09-10 (#101-new)</w:t>
       </w:r>
     </w:p>
     <w:p>
@@ -361,66 +361,6 @@
           <w:rFonts w:ascii="Arial" w:hAnsi="Arial"/>
           <w:sz w:val="28"/>
         </w:rPr>
-        <w:t xml:space="preserve">2. LAST REVIEW BEFORE THE APP STORE (#99-new). Three lenses: bugs;</w:t>
-      </w:r>
-    </w:p>
-    <w:p>
-      <w:pPr>
-        <w:spacing w:line="276" w:lineRule="auto"/>
-      </w:pPr>
-      <w:r>
-        <w:rPr>
-          <w:rFonts w:ascii="Arial" w:hAnsi="Arial"/>
-          <w:sz w:val="28"/>
-        </w:rPr>
-        <w:t xml:space="preserve">   whether it is coming out as one of the better reminder apps and</w:t>
-      </w:r>
-    </w:p>
-    <w:p>
-      <w:pPr>
-        <w:spacing w:line="276" w:lineRule="auto"/>
-      </w:pPr>
-      <w:r>
-        <w:rPr>
-          <w:rFonts w:ascii="Arial" w:hAnsi="Arial"/>
-          <w:sz w:val="28"/>
-        </w:rPr>
-        <w:t xml:space="preserve">   one of the easier; leftover special rules on top of a kind, not</w:t>
-      </w:r>
-    </w:p>
-    <w:p>
-      <w:pPr>
-        <w:spacing w:line="276" w:lineRule="auto"/>
-      </w:pPr>
-      <w:r>
-        <w:rPr>
-          <w:rFonts w:ascii="Arial" w:hAnsi="Arial"/>
-          <w:sz w:val="28"/>
-        </w:rPr>
-        <w:t xml:space="preserve">   the ordinary kind-per-page that software does. The designed</w:t>
-      </w:r>
-    </w:p>
-    <w:p>
-      <w:pPr>
-        <w:spacing w:line="276" w:lineRule="auto"/>
-      </w:pPr>
-      <w:r>
-        <w:rPr>
-          <w:rFonts w:ascii="Arial" w:hAnsi="Arial"/>
-          <w:sz w:val="28"/>
-        </w:rPr>
-        <w:t xml:space="preserve">   implementation is not the last word.</w:t>
-      </w:r>
-    </w:p>
-    <w:p>
-      <w:pPr>
-        <w:spacing w:line="276" w:lineRule="auto"/>
-      </w:pPr>
-      <w:r>
-        <w:rPr>
-          <w:rFonts w:ascii="Arial" w:hAnsi="Arial"/>
-          <w:sz w:val="28"/>
-        </w:rPr>
         <w:t xml:space="preserve"/>
       </w:r>
     </w:p>
@@ -494,151 +434,7 @@
           <w:rFonts w:ascii="Arial" w:hAnsi="Arial"/>
           <w:sz w:val="28"/>
         </w:rPr>
-        <w:t xml:space="preserve">1. A THOROUGH DESIGN SPEC FOR THE APP (Patrick, #52-new). This</w:t>
-      </w:r>
-    </w:p>
-    <w:p>
-      <w:pPr>
-        <w:spacing w:line="276" w:lineRule="auto"/>
-      </w:pPr>
-      <w:r>
-        <w:rPr>
-          <w:rFonts w:ascii="Arial" w:hAnsi="Arial"/>
-          <w:sz w:val="28"/>
-        </w:rPr>
-        <w:t xml:space="preserve">    sitting treated One Time's missing notice at the set time as</w:t>
-      </w:r>
-    </w:p>
-    <w:p>
-      <w:pPr>
-        <w:spacing w:line="276" w:lineRule="auto"/>
-      </w:pPr>
-      <w:r>
-        <w:rPr>
-          <w:rFonts w:ascii="Arial" w:hAnsi="Arial"/>
-          <w:sz w:val="28"/>
-        </w:rPr>
-        <w:t xml:space="preserve">    a bug. He had decided it that way. A spec would have said so.</w:t>
-      </w:r>
-    </w:p>
-    <w:p>
-      <w:pPr>
-        <w:spacing w:line="276" w:lineRule="auto"/>
-      </w:pPr>
-      <w:r>
-        <w:rPr>
-          <w:rFonts w:ascii="Arial" w:hAnsi="Arial"/>
-          <w:sz w:val="28"/>
-        </w:rPr>
-        <w:t xml:space="preserve">    Changing the name of One Time to Appointments belongs in</w:t>
-      </w:r>
-    </w:p>
-    <w:p>
-      <w:pPr>
-        <w:spacing w:line="276" w:lineRule="auto"/>
-      </w:pPr>
-      <w:r>
-        <w:rPr>
-          <w:rFonts w:ascii="Arial" w:hAnsi="Arial"/>
-          <w:sz w:val="28"/>
-        </w:rPr>
-        <w:t xml:space="preserve">    that spec, and Extended to Bucket List. At #84-new the spec</w:t>
-      </w:r>
-    </w:p>
-    <w:p>
-      <w:pPr>
-        <w:spacing w:line="276" w:lineRule="auto"/>
-      </w:pPr>
-      <w:r>
-        <w:rPr>
-          <w:rFonts w:ascii="Arial" w:hAnsi="Arial"/>
-          <w:sz w:val="28"/>
-        </w:rPr>
-        <w:t xml:space="preserve">    is the designed implementation of the whole app: it is the</w:t>
-      </w:r>
-    </w:p>
-    <w:p>
-      <w:pPr>
-        <w:spacing w:line="276" w:lineRule="auto"/>
-      </w:pPr>
-      <w:r>
-        <w:rPr>
-          <w:rFonts w:ascii="Arial" w:hAnsi="Arial"/>
-          <w:sz w:val="28"/>
-        </w:rPr>
-        <w:t xml:space="preserve">    guide, and it replaces a separate layer of decisions and rules.</w:t>
-      </w:r>
-    </w:p>
-    <w:p>
-      <w:pPr>
-        <w:spacing w:line="276" w:lineRule="auto"/>
-      </w:pPr>
-      <w:r>
-        <w:rPr>
-          <w:rFonts w:ascii="Arial" w:hAnsi="Arial"/>
-          <w:sz w:val="28"/>
-        </w:rPr>
-        <w:t xml:space="preserve">    The first piece is docs/designed-implementation.md. This sitting</w:t>
-      </w:r>
-    </w:p>
-    <w:p>
-      <w:pPr>
-        <w:spacing w:line="276" w:lineRule="auto"/>
-      </w:pPr>
-      <w:r>
-        <w:rPr>
-          <w:rFonts w:ascii="Arial" w:hAnsi="Arial"/>
-          <w:sz w:val="28"/>
-        </w:rPr>
-        <w:t xml:space="preserve">    wrote the machinery, each kind, Daily on the shared list, and the</w:t>
-      </w:r>
-    </w:p>
-    <w:p>
-      <w:pPr>
-        <w:spacing w:line="276" w:lineRule="auto"/>
-      </w:pPr>
-      <w:r>
-        <w:rPr>
-          <w:rFonts w:ascii="Arial" w:hAnsi="Arial"/>
-          <w:sz w:val="28"/>
-        </w:rPr>
-        <w:t xml:space="preserve">    banner housing. Home, Help, Calendar, Settings, Backup, Scheduled</w:t>
-      </w:r>
-    </w:p>
-    <w:p>
-      <w:pPr>
-        <w:spacing w:line="276" w:lineRule="auto"/>
-      </w:pPr>
-      <w:r>
-        <w:rPr>
-          <w:rFonts w:ascii="Arial" w:hAnsi="Arial"/>
-          <w:sz w:val="28"/>
-        </w:rPr>
-        <w:t xml:space="preserve">    Reminders, Options, and Log are in that piece. A Settings password is</w:t>
-      </w:r>
-    </w:p>
-    <w:p>
-      <w:pPr>
-        <w:spacing w:line="276" w:lineRule="auto"/>
-      </w:pPr>
-      <w:r>
-        <w:rPr>
-          <w:rFonts w:ascii="Arial" w:hAnsi="Arial"/>
-          <w:sz w:val="28"/>
-        </w:rPr>
-        <w:t xml:space="preserve">    not.</w:t>
-      </w:r>
-    </w:p>
-    <w:p>
-      <w:pPr>
-        <w:spacing w:line="276" w:lineRule="auto"/>
-      </w:pPr>
-      <w:r>
-        <w:rPr>
-          <w:rFonts w:ascii="Arial" w:hAnsi="Arial"/>
-          <w:sz w:val="28"/>
-        </w:rPr>
-        <w:t xml:space="preserve">2. A PAGE, SPEC, OR FILE FOR WHAT TESTING HAS COVERED AND</w:t>
+        <w:t xml:space="preserve">1. A PAGE, SPEC, OR FILE FOR WHAT TESTING HAS COVERED AND</w:t>
       </w:r>
     </w:p>
     <w:p>
@@ -1732,6 +1528,66 @@
           <w:rFonts w:ascii="Arial" w:hAnsi="Arial"/>
           <w:sz w:val="28"/>
         </w:rPr>
+        <w:t xml:space="preserve">104. #101-new — Calendar month arrows sit by the month name. Daily</w:t>
+      </w:r>
+    </w:p>
+    <w:p>
+      <w:pPr>
+        <w:spacing w:line="276" w:lineRule="auto"/>
+      </w:pPr>
+      <w:r>
+        <w:rPr>
+          <w:rFonts w:ascii="Arial" w:hAnsi="Arial"/>
+          <w:sz w:val="28"/>
+        </w:rPr>
+        <w:t xml:space="preserve">    every-day New has room between Name, time, and Note.</w:t>
+      </w:r>
+    </w:p>
+    <w:p>
+      <w:pPr>
+        <w:spacing w:line="276" w:lineRule="auto"/>
+      </w:pPr>
+      <w:r>
+        <w:rPr>
+          <w:rFonts w:ascii="Arial" w:hAnsi="Arial"/>
+          <w:sz w:val="28"/>
+        </w:rPr>
+        <w:t xml:space="preserve"/>
+      </w:r>
+    </w:p>
+    <w:p>
+      <w:pPr>
+        <w:spacing w:line="276" w:lineRule="auto"/>
+      </w:pPr>
+      <w:r>
+        <w:rPr>
+          <w:rFonts w:ascii="Arial" w:hAnsi="Arial"/>
+          <w:sz w:val="28"/>
+        </w:rPr>
+        <w:t xml:space="preserve">103. #101-new — Design guide filled from the app and the table.</w:t>
+      </w:r>
+    </w:p>
+    <w:p>
+      <w:pPr>
+        <w:spacing w:line="276" w:lineRule="auto"/>
+      </w:pPr>
+      <w:r>
+        <w:rPr>
+          <w:rFonts w:ascii="Arial" w:hAnsi="Arial"/>
+          <w:sz w:val="28"/>
+        </w:rPr>
+        <w:t xml:space="preserve"/>
+      </w:r>
+    </w:p>
+    <w:p>
+      <w:pPr>
+        <w:spacing w:line="276" w:lineRule="auto"/>
+      </w:pPr>
+      <w:r>
+        <w:rPr>
+          <w:rFonts w:ascii="Arial" w:hAnsi="Arial"/>
+          <w:sz w:val="28"/>
+        </w:rPr>
         <w:t xml:space="preserve">101. #100-new — A weekday monthly looks from the saved date, so Done</w:t>
       </w:r>
     </w:p>
@@ -6847,30 +6703,6 @@
           <w:sz w:val="28"/>
         </w:rPr>
         <w:t xml:space="preserve">   top of arming ahead, never underneath.</w:t>
-      </w:r>
-    </w:p>
-    <w:p>
-      <w:pPr>
-        <w:spacing w:line="276" w:lineRule="auto"/>
-      </w:pPr>
-      <w:r>
-        <w:rPr>
-          <w:rFonts w:ascii="Arial" w:hAnsi="Arial"/>
-          <w:sz w:val="28"/>
-        </w:rPr>
-        <w:t xml:space="preserve">4. Settings password protection — moved here at #88-new (was with</w:t>
-      </w:r>
-    </w:p>
-    <w:p>
-      <w:pPr>
-        <w:spacing w:line="276" w:lineRule="auto"/>
-      </w:pPr>
-      <w:r>
-        <w:rPr>
-          <w:rFonts w:ascii="Arial" w:hAnsi="Arial"/>
-          <w:sz w:val="28"/>
-        </w:rPr>
-        <w:t xml:space="preserve">   the #84-new Home ideas). Not being done now.</w:t>
       </w:r>
     </w:p>
     <w:p>

</xml_diff>

<commit_message>
105-new - Memory - Updated the Users Guide & Fixed  issue.
</commit_message>
<xml_diff>
--- a/docs/pending.docx
+++ b/docs/pending.docx
@@ -24,7 +24,7 @@
           <w:rFonts w:ascii="Arial" w:hAnsi="Arial"/>
           <w:sz w:val="28"/>
         </w:rPr>
-        <w:t xml:space="preserve">Last updated: 2026-09-10 (#101-new)</w:t>
+        <w:t xml:space="preserve">Last updated: 2026-09-11 (#105-new)</w:t>
       </w:r>
     </w:p>
     <w:p>
@@ -325,7 +325,31 @@
           <w:rFonts w:ascii="Arial" w:hAnsi="Arial"/>
           <w:sz w:val="28"/>
         </w:rPr>
-        <w:t xml:space="preserve">1. DAY-ROLL LOCK still wants a night of all-green Daily on this</w:t>
+        <w:t xml:space="preserve">1. USER'S GUIDE HEADINGS for Options, Delete, Save, Done, Snooze,</w:t>
+      </w:r>
+    </w:p>
+    <w:p>
+      <w:pPr>
+        <w:spacing w:line="276" w:lineRule="auto"/>
+      </w:pPr>
+      <w:r>
+        <w:rPr>
+          <w:rFonts w:ascii="Arial" w:hAnsi="Arial"/>
+          <w:sz w:val="28"/>
+        </w:rPr>
+        <w:t xml:space="preserve">   and Banners. All six together, next session (Patrick, #105-new).</w:t>
+      </w:r>
+    </w:p>
+    <w:p>
+      <w:pPr>
+        <w:spacing w:line="276" w:lineRule="auto"/>
+      </w:pPr>
+      <w:r>
+        <w:rPr>
+          <w:rFonts w:ascii="Arial" w:hAnsi="Arial"/>
+          <w:sz w:val="28"/>
+        </w:rPr>
+        <w:t xml:space="preserve">2. DAY-ROLL LOCK still wants a night of all-green Daily on this</w:t>
       </w:r>
     </w:p>
     <w:p>
@@ -1419,6 +1443,54 @@
           <w:rFonts w:ascii="Arial" w:hAnsi="Arial"/>
           <w:sz w:val="28"/>
         </w:rPr>
+        <w:t xml:space="preserve">18. EACH CLOSED-APP NOTICE HAS ITS OWN THREAD NAME (Patrick, #105-new).</w:t>
+      </w:r>
+    </w:p>
+    <w:p>
+      <w:pPr>
+        <w:spacing w:line="276" w:lineRule="auto"/>
+      </w:pPr>
+      <w:r>
+        <w:rPr>
+          <w:rFonts w:ascii="Arial" w:hAnsi="Arial"/>
+          <w:sz w:val="28"/>
+        </w:rPr>
+        <w:t xml:space="preserve">    The name is the reminder's key. This Expo does not yet hand that</w:t>
+      </w:r>
+    </w:p>
+    <w:p>
+      <w:pPr>
+        <w:spacing w:line="276" w:lineRule="auto"/>
+      </w:pPr>
+      <w:r>
+        <w:rPr>
+          <w:rFonts w:ascii="Arial" w:hAnsi="Arial"/>
+          <w:sz w:val="28"/>
+        </w:rPr>
+        <w:t xml:space="preserve">    name to the phone, so the listing-down-the-page will wait until</w:t>
+      </w:r>
+    </w:p>
+    <w:p>
+      <w:pPr>
+        <w:spacing w:line="276" w:lineRule="auto"/>
+      </w:pPr>
+      <w:r>
+        <w:rPr>
+          <w:rFonts w:ascii="Arial" w:hAnsi="Arial"/>
+          <w:sz w:val="28"/>
+        </w:rPr>
+        <w:t xml:space="preserve">    Expo is upgraded. The notification library was not poked.</w:t>
+      </w:r>
+    </w:p>
+    <w:p>
+      <w:pPr>
+        <w:spacing w:line="276" w:lineRule="auto"/>
+      </w:pPr>
+      <w:r>
+        <w:rPr>
+          <w:rFonts w:ascii="Arial" w:hAnsi="Arial"/>
+          <w:sz w:val="28"/>
+        </w:rPr>
         <w:t xml:space="preserve"/>
       </w:r>
     </w:p>
@@ -1505,6 +1577,330 @@
           <w:sz w:val="28"/>
         </w:rPr>
         <w:t xml:space="preserve">docs/handoff-history.md.</w:t>
+      </w:r>
+    </w:p>
+    <w:p>
+      <w:pPr>
+        <w:spacing w:line="276" w:lineRule="auto"/>
+      </w:pPr>
+      <w:r>
+        <w:rPr>
+          <w:rFonts w:ascii="Arial" w:hAnsi="Arial"/>
+          <w:sz w:val="28"/>
+        </w:rPr>
+        <w:t xml:space="preserve"/>
+      </w:r>
+    </w:p>
+    <w:p>
+      <w:pPr>
+        <w:spacing w:line="276" w:lineRule="auto"/>
+      </w:pPr>
+      <w:r>
+        <w:rPr>
+          <w:rFonts w:ascii="Arial" w:hAnsi="Arial"/>
+          <w:sz w:val="28"/>
+        </w:rPr>
+        <w:t xml:space="preserve">113. #105-new — Weekly delay includes one day, on the banner and the</w:t>
+      </w:r>
+    </w:p>
+    <w:p>
+      <w:pPr>
+        <w:spacing w:line="276" w:lineRule="auto"/>
+      </w:pPr>
+      <w:r>
+        <w:rPr>
+          <w:rFonts w:ascii="Arial" w:hAnsi="Arial"/>
+          <w:sz w:val="28"/>
+        </w:rPr>
+        <w:t xml:space="preserve">    tile popup. Daily keeps 15 / 30 / 60 minutes.</w:t>
+      </w:r>
+    </w:p>
+    <w:p>
+      <w:pPr>
+        <w:spacing w:line="276" w:lineRule="auto"/>
+      </w:pPr>
+      <w:r>
+        <w:rPr>
+          <w:rFonts w:ascii="Arial" w:hAnsi="Arial"/>
+          <w:sz w:val="28"/>
+        </w:rPr>
+        <w:t xml:space="preserve"/>
+      </w:r>
+    </w:p>
+    <w:p>
+      <w:pPr>
+        <w:spacing w:line="276" w:lineRule="auto"/>
+      </w:pPr>
+      <w:r>
+        <w:rPr>
+          <w:rFonts w:ascii="Arial" w:hAnsi="Arial"/>
+          <w:sz w:val="28"/>
+        </w:rPr>
+        <w:t xml:space="preserve">112. #105-new — Yearly and Birthdays look from the saved date. Done an</w:t>
+      </w:r>
+    </w:p>
+    <w:p>
+      <w:pPr>
+        <w:spacing w:line="276" w:lineRule="auto"/>
+      </w:pPr>
+      <w:r>
+        <w:rPr>
+          <w:rFonts w:ascii="Arial" w:hAnsi="Arial"/>
+          <w:sz w:val="28"/>
+        </w:rPr>
+        <w:t xml:space="preserve">    hour or two before the time no longer lets today's notice still fire.</w:t>
+      </w:r>
+    </w:p>
+    <w:p>
+      <w:pPr>
+        <w:spacing w:line="276" w:lineRule="auto"/>
+      </w:pPr>
+      <w:r>
+        <w:rPr>
+          <w:rFonts w:ascii="Arial" w:hAnsi="Arial"/>
+          <w:sz w:val="28"/>
+        </w:rPr>
+        <w:t xml:space="preserve"/>
+      </w:r>
+    </w:p>
+    <w:p>
+      <w:pPr>
+        <w:spacing w:line="276" w:lineRule="auto"/>
+      </w:pPr>
+      <w:r>
+        <w:rPr>
+          <w:rFonts w:ascii="Arial" w:hAnsi="Arial"/>
+          <w:sz w:val="28"/>
+        </w:rPr>
+        <w:t xml:space="preserve">111. #105-new — Help Home badge is the thinking face, not the question</w:t>
+      </w:r>
+    </w:p>
+    <w:p>
+      <w:pPr>
+        <w:spacing w:line="276" w:lineRule="auto"/>
+      </w:pPr>
+      <w:r>
+        <w:rPr>
+          <w:rFonts w:ascii="Arial" w:hAnsi="Arial"/>
+          <w:sz w:val="28"/>
+        </w:rPr>
+        <w:t xml:space="preserve">    mark.</w:t>
+      </w:r>
+    </w:p>
+    <w:p>
+      <w:pPr>
+        <w:spacing w:line="276" w:lineRule="auto"/>
+      </w:pPr>
+      <w:r>
+        <w:rPr>
+          <w:rFonts w:ascii="Arial" w:hAnsi="Arial"/>
+          <w:sz w:val="28"/>
+        </w:rPr>
+        <w:t xml:space="preserve"/>
+      </w:r>
+    </w:p>
+    <w:p>
+      <w:pPr>
+        <w:spacing w:line="276" w:lineRule="auto"/>
+      </w:pPr>
+      <w:r>
+        <w:rPr>
+          <w:rFonts w:ascii="Arial" w:hAnsi="Arial"/>
+          <w:sz w:val="28"/>
+        </w:rPr>
+        <w:t xml:space="preserve">110. #104-new — User's Guide on the Settings page, Help pop-up words</w:t>
+      </w:r>
+    </w:p>
+    <w:p>
+      <w:pPr>
+        <w:spacing w:line="276" w:lineRule="auto"/>
+      </w:pPr>
+      <w:r>
+        <w:rPr>
+          <w:rFonts w:ascii="Arial" w:hAnsi="Arial"/>
+          <w:sz w:val="28"/>
+        </w:rPr>
+        <w:t xml:space="preserve">    in Help. Settings section of the Guide. Simulator. Not on 79.</w:t>
+      </w:r>
+    </w:p>
+    <w:p>
+      <w:pPr>
+        <w:spacing w:line="276" w:lineRule="auto"/>
+      </w:pPr>
+      <w:r>
+        <w:rPr>
+          <w:rFonts w:ascii="Arial" w:hAnsi="Arial"/>
+          <w:sz w:val="28"/>
+        </w:rPr>
+        <w:t xml:space="preserve"/>
+      </w:r>
+    </w:p>
+    <w:p>
+      <w:pPr>
+        <w:spacing w:line="276" w:lineRule="auto"/>
+      </w:pPr>
+      <w:r>
+        <w:rPr>
+          <w:rFonts w:ascii="Arial" w:hAnsi="Arial"/>
+          <w:sz w:val="28"/>
+        </w:rPr>
+        <w:t xml:space="preserve">109. #103-new — first-open fifth paragraph, no scroll. Longer User's</w:t>
+      </w:r>
+    </w:p>
+    <w:p>
+      <w:pPr>
+        <w:spacing w:line="276" w:lineRule="auto"/>
+      </w:pPr>
+      <w:r>
+        <w:rPr>
+          <w:rFonts w:ascii="Arial" w:hAnsi="Arial"/>
+          <w:sz w:val="28"/>
+        </w:rPr>
+        <w:t xml:space="preserve">    Guide and Help words in docs/user-guide.md, not in the app.</w:t>
+      </w:r>
+    </w:p>
+    <w:p>
+      <w:pPr>
+        <w:spacing w:line="276" w:lineRule="auto"/>
+      </w:pPr>
+      <w:r>
+        <w:rPr>
+          <w:rFonts w:ascii="Arial" w:hAnsi="Arial"/>
+          <w:sz w:val="28"/>
+        </w:rPr>
+        <w:t xml:space="preserve"/>
+      </w:r>
+    </w:p>
+    <w:p>
+      <w:pPr>
+        <w:spacing w:line="276" w:lineRule="auto"/>
+      </w:pPr>
+      <w:r>
+        <w:rPr>
+          <w:rFonts w:ascii="Arial" w:hAnsi="Arial"/>
+          <w:sz w:val="28"/>
+        </w:rPr>
+        <w:t xml:space="preserve">108. #102-new — Birthdays’ date line is Birthdate.</w:t>
+      </w:r>
+    </w:p>
+    <w:p>
+      <w:pPr>
+        <w:spacing w:line="276" w:lineRule="auto"/>
+      </w:pPr>
+      <w:r>
+        <w:rPr>
+          <w:rFonts w:ascii="Arial" w:hAnsi="Arial"/>
+          <w:sz w:val="28"/>
+        </w:rPr>
+        <w:t xml:space="preserve"/>
+      </w:r>
+    </w:p>
+    <w:p>
+      <w:pPr>
+        <w:spacing w:line="276" w:lineRule="auto"/>
+      </w:pPr>
+      <w:r>
+        <w:rPr>
+          <w:rFonts w:ascii="Arial" w:hAnsi="Arial"/>
+          <w:sz w:val="28"/>
+        </w:rPr>
+        <w:t xml:space="preserve">107. #102-new — Birthday year of birth. Calendar month: B-day and the</w:t>
+      </w:r>
+    </w:p>
+    <w:p>
+      <w:pPr>
+        <w:spacing w:line="276" w:lineRule="auto"/>
+      </w:pPr>
+      <w:r>
+        <w:rPr>
+          <w:rFonts w:ascii="Arial" w:hAnsi="Arial"/>
+          <w:sz w:val="28"/>
+        </w:rPr>
+        <w:t xml:space="preserve">    first name. Day list and Daily: Birthday, first name, and age.</w:t>
+      </w:r>
+    </w:p>
+    <w:p>
+      <w:pPr>
+        <w:spacing w:line="276" w:lineRule="auto"/>
+      </w:pPr>
+      <w:r>
+        <w:rPr>
+          <w:rFonts w:ascii="Arial" w:hAnsi="Arial"/>
+          <w:sz w:val="28"/>
+        </w:rPr>
+        <w:t xml:space="preserve">    Birthdays page does not say Birthday. 359 tests. Not on the phone.</w:t>
+      </w:r>
+    </w:p>
+    <w:p>
+      <w:pPr>
+        <w:spacing w:line="276" w:lineRule="auto"/>
+      </w:pPr>
+      <w:r>
+        <w:rPr>
+          <w:rFonts w:ascii="Arial" w:hAnsi="Arial"/>
+          <w:sz w:val="28"/>
+        </w:rPr>
+        <w:t xml:space="preserve"/>
+      </w:r>
+    </w:p>
+    <w:p>
+      <w:pPr>
+        <w:spacing w:line="276" w:lineRule="auto"/>
+      </w:pPr>
+      <w:r>
+        <w:rPr>
+          <w:rFonts w:ascii="Arial" w:hAnsi="Arial"/>
+          <w:sz w:val="28"/>
+        </w:rPr>
+        <w:t xml:space="preserve">106. #102-new — Offset before chips mute when there is no time. The</w:t>
+      </w:r>
+    </w:p>
+    <w:p>
+      <w:pPr>
+        <w:spacing w:line="276" w:lineRule="auto"/>
+      </w:pPr>
+      <w:r>
+        <w:rPr>
+          <w:rFonts w:ascii="Arial" w:hAnsi="Arial"/>
+          <w:sz w:val="28"/>
+        </w:rPr>
+        <w:t xml:space="preserve">    form reads ifTimeSet and offset, not Birthdays.</w:t>
+      </w:r>
+    </w:p>
+    <w:p>
+      <w:pPr>
+        <w:spacing w:line="276" w:lineRule="auto"/>
+      </w:pPr>
+      <w:r>
+        <w:rPr>
+          <w:rFonts w:ascii="Arial" w:hAnsi="Arial"/>
+          <w:sz w:val="28"/>
+        </w:rPr>
+        <w:t xml:space="preserve"/>
+      </w:r>
+    </w:p>
+    <w:p>
+      <w:pPr>
+        <w:spacing w:line="276" w:lineRule="auto"/>
+      </w:pPr>
+      <w:r>
+        <w:rPr>
+          <w:rFonts w:ascii="Arial" w:hAnsi="Arial"/>
+          <w:sz w:val="28"/>
+        </w:rPr>
+        <w:t xml:space="preserve">105. #102-new — 12-hour and 24-hour time spinners are popups with</w:t>
+      </w:r>
+    </w:p>
+    <w:p>
+      <w:pPr>
+        <w:spacing w:line="276" w:lineRule="auto"/>
+      </w:pPr>
+      <w:r>
+        <w:rPr>
+          <w:rFonts w:ascii="Arial" w:hAnsi="Arial"/>
+          <w:sz w:val="28"/>
+        </w:rPr>
+        <w:t xml:space="preserve">    Cancel and Done. You stay on New or Edit.</w:t>
       </w:r>
     </w:p>
     <w:p>

</xml_diff>